<commit_message>
Unifica Abordaje+Introducción en sección única, renumera secciones 1-10, corrige frases contradictorias
</commit_message>
<xml_diff>
--- a/Plan_Trabajo_Jefatura_Software_Version_Director.docx
+++ b/Plan_Trabajo_Jefatura_Software_Version_Director.docx
@@ -27,7 +27,7 @@
           <w:sz w:val="22"/>
           <w:szCs w:val="22"/>
         </w:rPr>
-        <w:t xml:space="preserve">SECRETARÍA DE PARTICIPACIÓN CIUDADANA Y DESCENTRALIZACIÓN</w:t>
+        <w:t xml:space="preserve">SECRETARÃA DE PARTICIPACIÃ“N CIUDADANA Y DESCENTRALIZACIÃ“N</w:t>
       </w:r>
     </w:p>
     <w:p>
@@ -41,7 +41,7 @@
           <w:sz w:val="22"/>
           <w:szCs w:val="22"/>
         </w:rPr>
-        <w:t xml:space="preserve">SUBSECRETARÍA DE GOBIERNO DIGITAL Y MEJORA DE PROCESOS</w:t>
+        <w:t xml:space="preserve">SUBSECRETARÃA DE GOBIERNO DIGITAL Y MEJORA DE PROCESOS</w:t>
       </w:r>
     </w:p>
     <w:p/>
@@ -54,7 +54,7 @@
           <w:sz w:val="22"/>
           <w:szCs w:val="22"/>
         </w:rPr>
-        <w:t xml:space="preserve">Concurso Interno de Oposición y Antecedentes</w:t>
+        <w:t xml:space="preserve">Concurso Interno de OposiciÃ³n y Antecedentes</w:t>
       </w:r>
     </w:p>
     <w:p>
@@ -68,7 +68,7 @@
           <w:sz w:val="22"/>
           <w:szCs w:val="22"/>
         </w:rPr>
-        <w:t xml:space="preserve">Cargo: Jefe de Departamento de Gestión, Desarrollo e Innovación en Sistemas de Software</w:t>
+        <w:t xml:space="preserve">Cargo: Jefe de Departamento de GestiÃ³n, Desarrollo e InnovaciÃ³n en Sistemas de Software</w:t>
       </w:r>
     </w:p>
     <w:p>
@@ -80,7 +80,7 @@
           <w:sz w:val="22"/>
           <w:szCs w:val="22"/>
         </w:rPr>
-        <w:t xml:space="preserve">C.F. 1-31-00-01 – Nº de Orden 6733</w:t>
+        <w:t xml:space="preserve">C.F. 1-31-00-01 â€“ NÂº de Orden 6733</w:t>
       </w:r>
     </w:p>
     <w:p/>
@@ -110,7 +110,7 @@
           <w:sz w:val="22"/>
           <w:szCs w:val="22"/>
         </w:rPr>
-        <w:t xml:space="preserve">Diagnóstico Integral y Propuesta de Mejora para el Funcionamiento del Departamento de Gestión, Desarrollo e Innovación en Sistemas de Software: Optimización con Recursos Actuales y Proyección con Incorporación de Recursos</w:t>
+        <w:t xml:space="preserve">DiagnÃ³stico Integral y Propuesta de Mejora para el Funcionamiento del Departamento de GestiÃ³n, Desarrollo e InnovaciÃ³n en Sistemas de Software: OptimizaciÃ³n con Recursos Actuales y ProyecciÃ³n con IncorporaciÃ³n de Recursos</w:t>
       </w:r>
     </w:p>
     <w:p/>
@@ -125,7 +125,7 @@
           <w:sz w:val="22"/>
           <w:szCs w:val="22"/>
         </w:rPr>
-        <w:t xml:space="preserve">"Fortaleciendo la gestión del Departamento mediante la organización, el desarrollo de las personas, la estandarización de procesos y la innovación tecnológica al servicio de la Municipalidad."</w:t>
+        <w:t xml:space="preserve">"Fortaleciendo la gestiÃ³n del Departamento mediante la organizaciÃ³n, el desarrollo de las personas, la estandarizaciÃ³n de procesos y la innovaciÃ³n tecnolÃ³gica al servicio de la Municipalidad."</w:t>
       </w:r>
     </w:p>
     <w:p/>
@@ -175,7 +175,7 @@
           <w:i/>
           <w:iCs/>
         </w:rPr>
-        <w:t xml:space="preserve">Mar del Plata – Julio 2026</w:t>
+        <w:t xml:space="preserve">Mar del Plata â€“ Julio 2026</w:t>
       </w:r>
     </w:p>
     <w:p/>
@@ -188,50 +188,42 @@
           <w:b/>
           <w:bCs/>
         </w:rPr>
-        <w:t xml:space="preserve">1. ABORDAJE</w:t>
-      </w:r>
-    </w:p>
-    <w:p>
-      <w:r>
-        <w:t xml:space="preserve">El presente Plan de Trabajo parte de una premisa construida desde adentro del Departamento: la calidad de un área de desarrollo de software no depende exclusivamente de la capacidad técnica de sus integrantes, sino de cómo se organizan las personas, se gestionan los procesos y se administra el conocimiento institucional.</w:t>
-      </w:r>
-    </w:p>
-    <w:p>
-      <w:r>
-        <w:t xml:space="preserve">Desde mi posición como integrante del Departamento, he podido observar de manera directa sus fortalezas, sus procesos cotidianos y los desafíos estructurales que limitan su potencial. Esta perspectiva interna es el punto de partida de la propuesta: no se trata de diagnosticar el área desde afuera, sino de conducirla hacia una mejora real, aprovechando lo que ya funciona y resolviendo lo que hoy frena el desarrollo institucional.</w:t>
-      </w:r>
-    </w:p>
-    <w:p>
-      <w:r>
-        <w:t xml:space="preserve">La conducción del Departamento requiere combinar liderazgo participativo, organización por procesos, gobierno técnico y gestión del conocimiento, diferenciando claramente las acciones implementables con los recursos actuales de las que requieren inversión presupuestaria. El objetivo es consolidar un Departamento previsible, colaborativo y sostenible, capaz de trascender a las personas y a los cambios de gestión.</w:t>
-      </w:r>
-    </w:p>
-    <w:p/>
-    <w:p>
-      <w:pPr>
-        <w:pStyle w:val="Heading1"/>
-      </w:pPr>
-      <w:r>
-        <w:rPr>
-          <w:b/>
-          <w:bCs/>
-        </w:rPr>
-        <w:t xml:space="preserve">2. INTRODUCCIÓN</w:t>
-      </w:r>
-    </w:p>
-    <w:p>
-      <w:r>
-        <w:t xml:space="preserve">El Departamento de Gestión, Desarrollo e Innovación en Sistemas de Software es el área técnica responsable de diseñar, desarrollar, mantener e implementar las soluciones informáticas que sustentan la actividad diaria de la Municipalidad de General Pueyrredon. Su misión va más allá del desarrollo de aplicaciones: es preservar la soberanía tecnológica del Municipio, garantizar la continuidad operativa de sus sistemas y acompañar la transformación digital de la Administración Pública con criterio, calidad y responsabilidad institucional.</w:t>
-      </w:r>
-    </w:p>
-    <w:p>
-      <w:r>
-        <w:t xml:space="preserve">El Departamento opera en un entorno de alta complejidad: conviven aplicaciones de distintas generaciones tecnológicas, múltiples requerimientos simultáneos de diversas Secretarías y una creciente demanda de soluciones digitales. Gestionar esta realidad exige que la Jefatura asuma un rol integrador: no solo coordinar técnicos, sino planificar, estandarizar, preservar el conocimiento y asegurar que cada decisión tecnológica esté alineada con los objetivos institucionales del Municipio.</w:t>
-      </w:r>
-    </w:p>
-    <w:p>
-      <w:r>
-        <w:t xml:space="preserve">En ese marco, el presente Plan propone una estrategia articulada en cinco pilares:</w:t>
+        <w:t xml:space="preserve">1. INTRODUCCIÃ“N</w:t>
+      </w:r>
+    </w:p>
+    <w:p>
+      <w:r>
+        <w:t xml:space="preserve">El presente proyecto tiene como finalidad realizar un diagnÃ³stico integral del Departamento de GestiÃ³n, Desarrollo e InnovaciÃ³n en Sistemas de Software, identificar las problemÃ¡ticas que afectan su funcionamiento y presentar propuestas concretas para optimizar su funcionamiento y de esta manera mejorar la calidad del servicio brindado a las dependencias municipales y por lo tanto, tambiÃ©n al ciudadano.</w:t>
+      </w:r>
+    </w:p>
+    <w:p>
+      <w:r>
+        <w:t xml:space="preserve">El Departamento de GestiÃ³n, Desarrollo e InnovaciÃ³n en Sistemas de Software constituye un Ã¡rea estratÃ©gica dentro de la SubsecretarÃ­a de Gobierno Digital y Mejora de Procesos, siendo responsable de diseÃ±ar, desarrollar, mantener e implementar las soluciones informÃ¡ticas que respaldan la actividad diaria de la Municipalidad de General Pueyrredon.</w:t>
+      </w:r>
+    </w:p>
+    <w:p>
+      <w:r>
+        <w:t xml:space="preserve">Su funciÃ³n excede el desarrollo de aplicaciones informÃ¡ticas. El Departamento interviene en el relevamiento y anÃ¡lisis de requerimientos funcionales, la planificaciÃ³n y coordinaciÃ³n de proyectos, la definiciÃ³n de estÃ¡ndares de desarrollo, la evaluaciÃ³n de nuevas tecnologÃ­as, el control tÃ©cnico de proveedores externos, la integraciÃ³n entre sistemas municipales y el mantenimiento evolutivo de aplicaciones crÃ­ticas para el funcionamiento de la AdministraciÃ³n.</w:t>
+      </w:r>
+    </w:p>
+    <w:p>
+      <w:r>
+        <w:t xml:space="preserve">La Jefatura del Departamento debe desempeÃ±ar un rol integrador que va mÃ¡s allÃ¡ de la coordinaciÃ³n tÃ©cnica de proyectos. Su responsabilidad central consiste en combinar conocimientos tÃ©cnicos con planificaciÃ³n, conducciÃ³n de equipos y administraciÃ³n de recursos, generando las condiciones organizacionales que permitan al equipo desarrollar software de manera previsible, colaborativa y sostenible, promoviendo la integraciÃ³n entre personas, la reutilizaciÃ³n del conocimiento, la adopciÃ³n responsable de nuevas tecnologÃ­as y la mejora permanente de los procedimientos internos, con decisiones tecnolÃ³gicas alineadas a los objetivos institucionales del Municipio.</w:t>
+      </w:r>
+    </w:p>
+    <w:p>
+      <w:r>
+        <w:t xml:space="preserve">La propuesta reconoce que el Departamento desarrolla su actividad en un entorno dinÃ¡mico, caracterizado por la coexistencia de sistemas de distinta antigÃ¼edad, mÃºltiples requerimientos simultÃ¡neos, recursos limitados y una creciente demanda de soluciones digitales por parte de las distintas dependencias municipales. Frente a esta realidad, la respuesta no puede limitarse a incorporar nuevas herramientas tecnolÃ³gicas sin antes fortalecer la organizaciÃ³n del trabajo, establecer criterios comunes y consolidar una cultura de mejora continua.</w:t>
+      </w:r>
+    </w:p>
+    <w:p>
+      <w:r>
+        <w:t xml:space="preserve">En consecuencia, este Plan de Trabajo propone un modelo de gestiÃ³n que combina liderazgo participativo, organizaciÃ³n por procesos, gobierno tÃ©cnico, gestiÃ³n del conocimiento e innovaciÃ³n tecnolÃ³gica, diferenciando claramente aquellas acciones implementables con los recursos actuales de aquellas que requieren inversiÃ³n presupuestaria, con el objetivo de consolidar un Departamento capaz de responder a las necesidades presentes y garantizar la continuidad y sostenibilidad de sus sistemas mÃ¡s allÃ¡ de las personas o los cambios de gestiÃ³n.</w:t>
+      </w:r>
+    </w:p>
+    <w:p>
+      <w:r>
+        <w:t xml:space="preserve">Por ello, el presente Plan propone una estrategia articulada en cinco pilares fundamentales:</w:t>
       </w:r>
     </w:p>
     <w:p>
@@ -255,7 +247,7 @@
         </w:numPr>
       </w:pPr>
       <w:r>
-        <w:t xml:space="preserve">Gestión y preservación del conocimiento institucional.</w:t>
+        <w:t xml:space="preserve">GestiÃ³n y preservaciÃ³n del conocimiento institucional.</w:t>
       </w:r>
     </w:p>
     <w:p>
@@ -267,7 +259,7 @@
         </w:numPr>
       </w:pPr>
       <w:r>
-        <w:t xml:space="preserve">Estandarización de procesos y gobierno técnico.</w:t>
+        <w:t xml:space="preserve">EstandarizaciÃ³n de procesos y gobierno tÃ©cnico.</w:t>
       </w:r>
     </w:p>
     <w:p>
@@ -279,7 +271,7 @@
         </w:numPr>
       </w:pPr>
       <w:r>
-        <w:t xml:space="preserve">Mejora continua e innovación tecnológica.</w:t>
+        <w:t xml:space="preserve">Mejora continua e innovaciÃ³n tecnolÃ³gica.</w:t>
       </w:r>
     </w:p>
     <w:p>
@@ -291,7 +283,12 @@
         </w:numPr>
       </w:pPr>
       <w:r>
-        <w:t xml:space="preserve">Planificación estratégica orientada a resultados.</w:t>
+        <w:t xml:space="preserve">PlanificaciÃ³n estratÃ©gica orientada a resultados.</w:t>
+      </w:r>
+    </w:p>
+    <w:p>
+      <w:r>
+        <w:t xml:space="preserve">A partir de estos ejes se desarrolla el diagnÃ³stico de la situaciÃ³n actual y se presentan propuestas de mejora diferenciadas entre las que pueden implementarse con los recursos existentes y las que requieren inversiÃ³n futura.</w:t>
       </w:r>
     </w:p>
     <w:p/>
@@ -304,7 +301,7 @@
           <w:b/>
           <w:bCs/>
         </w:rPr>
-        <w:t xml:space="preserve">3. DIAGNÓSTICO INSTITUCIONAL</w:t>
+        <w:t xml:space="preserve">3. DIAGNÃ“STICO INSTITUCIONAL</w:t>
       </w:r>
     </w:p>
     <w:p>
@@ -316,22 +313,22 @@
           <w:b/>
           <w:bCs/>
         </w:rPr>
-        <w:t xml:space="preserve">3.1 Situación actual del Departamento</w:t>
-      </w:r>
-    </w:p>
-    <w:p>
-      <w:r>
-        <w:t xml:space="preserve">El Departamento constituye un área transversal para el funcionamiento de la Municipalidad, brindando soporte tecnológico a las distintas Secretarías y organismos mediante el análisis, desarrollo, mantenimiento e integración de los sistemas que sustentan los procesos administrativos y la prestación de servicios a la ciudadanía.</w:t>
-      </w:r>
-    </w:p>
-    <w:p>
-      <w:r>
-        <w:t xml:space="preserve">En los últimos años la demanda de soluciones informáticas ha crecido de manera sostenida, tanto por el avance de la transformación digital como por la incorporación permanente de nuevas necesidades funcionales. Actualmente conviven aplicaciones desarrolladas en distintos momentos históricos, con tecnologías diversas, junto con la atención simultánea de requerimientos evolutivos, mantenimiento correctivo, proyectos nuevos, asistencia técnica a usuarios y coordinación con proveedores externos.</w:t>
-      </w:r>
-    </w:p>
-    <w:p>
-      <w:r>
-        <w:t xml:space="preserve">Este contexto exige una conducción que tenga visión integral del Departamento: fortalecer la organización interna, promover el trabajo colaborativo y establecer procedimientos comunes que permitan administrar adecuadamente los recursos disponibles.</w:t>
+        <w:t xml:space="preserve">3.1 SituaciÃ³n actual del Departamento</w:t>
+      </w:r>
+    </w:p>
+    <w:p>
+      <w:r>
+        <w:t xml:space="preserve">El Departamento constituye un Ã¡rea transversal para el funcionamiento de la Municipalidad, brindando soporte tecnolÃ³gico a las distintas SecretarÃ­as y organismos mediante el anÃ¡lisis, desarrollo, mantenimiento e integraciÃ³n de los sistemas que sustentan los procesos administrativos y la prestaciÃ³n de servicios a la ciudadanÃ­a.</w:t>
+      </w:r>
+    </w:p>
+    <w:p>
+      <w:r>
+        <w:t xml:space="preserve">En los Ãºltimos aÃ±os la demanda de soluciones informÃ¡ticas ha crecido de manera sostenida, tanto por el avance de la transformaciÃ³n digital como por la incorporaciÃ³n permanente de nuevas necesidades funcionales. Actualmente conviven aplicaciones desarrolladas en distintos momentos histÃ³ricos, con tecnologÃ­as diversas, junto con la atenciÃ³n simultÃ¡nea de requerimientos evolutivos, mantenimiento correctivo, proyectos nuevos, asistencia tÃ©cnica a usuarios y coordinaciÃ³n con proveedores externos.</w:t>
+      </w:r>
+    </w:p>
+    <w:p>
+      <w:r>
+        <w:t xml:space="preserve">Este contexto exige una conducciÃ³n que tenga visiÃ³n integral del Departamento: fortalecer la organizaciÃ³n interna, promover el trabajo colaborativo y establecer procedimientos comunes que permitan administrar adecuadamente los recursos disponibles.</w:t>
       </w:r>
     </w:p>
     <w:p/>
@@ -344,7 +341,7 @@
           <w:b/>
           <w:bCs/>
         </w:rPr>
-        <w:t xml:space="preserve">3.2 Análisis FODA</w:t>
+        <w:t xml:space="preserve">3.2 AnÃ¡lisis FODA</w:t>
       </w:r>
     </w:p>
     <w:p>
@@ -365,46 +362,46 @@
           <w:b/>
           <w:bCs/>
         </w:rPr>
-        <w:t xml:space="preserve">• Capital humano con alto conocimiento del negocio municipal:</w:t>
-      </w:r>
-      <w:r>
-        <w:t xml:space="preserve"> El Departamento cuenta con profesionales y técnicos que poseen una valiosa experiencia en el funcionamiento de la Administración Pública Municipal, combinando conocimientos tecnológicos con una profunda comprensión de los procedimientos administrativos, la normativa vigente y las necesidades particulares de las distintas áreas usuarias. Este conocimiento constituye uno de los principales activos institucionales y representa una base sólida para impulsar procesos de mejora e innovación.</w:t>
-      </w:r>
-    </w:p>
-    <w:p>
-      <w:r>
-        <w:rPr>
-          <w:b/>
-          <w:bCs/>
-        </w:rPr>
-        <w:t xml:space="preserve">• Compromiso y capacidad de adaptación:</w:t>
-      </w:r>
-      <w:r>
-        <w:t xml:space="preserve"> A pesar del incremento permanente de requerimientos y de la coexistencia de sistemas con distintos niveles de complejidad tecnológica, el equipo ha demostrado capacidad para sostener la continuidad operativa de los servicios informáticos municipales, adaptándose a nuevos desafíos y prioridades institucionales.</w:t>
-      </w:r>
-    </w:p>
-    <w:p>
-      <w:r>
-        <w:rPr>
-          <w:b/>
-          <w:bCs/>
-        </w:rPr>
-        <w:t xml:space="preserve">• Experiencia acumulada en múltiples tecnologías:</w:t>
-      </w:r>
-      <w:r>
-        <w:t xml:space="preserve"> La evolución histórica de los sistemas municipales ha permitido que el Departamento adquiera experiencia sobre diferentes plataformas, lenguajes y herramientas de desarrollo, generando un importante capital técnico que facilita la evolución gradual de las aplicaciones existentes.</w:t>
-      </w:r>
-    </w:p>
-    <w:p>
-      <w:r>
-        <w:rPr>
-          <w:b/>
-          <w:bCs/>
-        </w:rPr>
-        <w:t xml:space="preserve">• Infraestructura y herramientas disponibles:</w:t>
-      </w:r>
-      <w:r>
-        <w:t xml:space="preserve"> El Departamento dispone de repositorios en GitLab para versionado, plataforma Redmine para gestión de proyectos, ambientes diferenciados de Desarrollo, Prueba y Producción, y equipamiento básico adecuado, constituyendo una base previa sólida para implementar mejoras organizacionales.</w:t>
+        <w:t xml:space="preserve">â€¢ Capital humano con alto conocimiento del negocio municipal:</w:t>
+      </w:r>
+      <w:r>
+        <w:t xml:space="preserve"> El Departamento cuenta con profesionales y tÃ©cnicos que poseen una valiosa experiencia en el funcionamiento de la AdministraciÃ³n PÃºblica Municipal, combinando conocimientos tecnolÃ³gicos con una profunda comprensiÃ³n de los procedimientos administrativos, la normativa vigente y las necesidades particulares de las distintas Ã¡reas usuarias. Este conocimiento constituye uno de los principales activos institucionales y representa una base sÃ³lida para impulsar procesos de mejora e innovaciÃ³n.</w:t>
+      </w:r>
+    </w:p>
+    <w:p>
+      <w:r>
+        <w:rPr>
+          <w:b/>
+          <w:bCs/>
+        </w:rPr>
+        <w:t xml:space="preserve">â€¢ Compromiso y capacidad de adaptaciÃ³n:</w:t>
+      </w:r>
+      <w:r>
+        <w:t xml:space="preserve"> A pesar del incremento permanente de requerimientos y de la coexistencia de sistemas con distintos niveles de complejidad tecnolÃ³gica, el equipo ha demostrado capacidad para sostener la continuidad operativa de los servicios informÃ¡ticos municipales, adaptÃ¡ndose a nuevos desafÃ­os y prioridades institucionales.</w:t>
+      </w:r>
+    </w:p>
+    <w:p>
+      <w:r>
+        <w:rPr>
+          <w:b/>
+          <w:bCs/>
+        </w:rPr>
+        <w:t xml:space="preserve">â€¢ Experiencia acumulada en mÃºltiples tecnologÃ­as:</w:t>
+      </w:r>
+      <w:r>
+        <w:t xml:space="preserve"> La evoluciÃ³n histÃ³rica de los sistemas municipales ha permitido que el Departamento adquiera experiencia sobre diferentes plataformas, lenguajes y herramientas de desarrollo, generando un importante capital tÃ©cnico que facilita la evoluciÃ³n gradual de las aplicaciones existentes.</w:t>
+      </w:r>
+    </w:p>
+    <w:p>
+      <w:r>
+        <w:rPr>
+          <w:b/>
+          <w:bCs/>
+        </w:rPr>
+        <w:t xml:space="preserve">â€¢ Infraestructura y herramientas disponibles:</w:t>
+      </w:r>
+      <w:r>
+        <w:t xml:space="preserve"> El Departamento dispone de repositorios en GitLab para versionado, plataforma Redmine para gestiÃ³n de proyectos, ambientes diferenciados de Desarrollo, Prueba y ProducciÃ³n, y equipamiento bÃ¡sico adecuado, constituyendo una base previa sÃ³lida para implementar mejoras organizacionales.</w:t>
       </w:r>
     </w:p>
     <w:p/>
@@ -426,10 +423,10 @@
           <w:b/>
           <w:bCs/>
         </w:rPr>
-        <w:t xml:space="preserve">• Concentración del conocimiento:</w:t>
-      </w:r>
-      <w:r>
-        <w:t xml:space="preserve"> Una parte significativa del conocimiento funcional y técnico de determinados sistemas críticos se encuentra concentrada en un número reducido de agentes.</w:t>
+        <w:t xml:space="preserve">â€¢ ConcentraciÃ³n del conocimiento:</w:t>
+      </w:r>
+      <w:r>
+        <w:t xml:space="preserve"> Una parte significativa del conocimiento funcional y tÃ©cnico de determinados sistemas crÃ­ticos se encuentra concentrada en un nÃºmero reducido de agentes.</w:t>
       </w:r>
     </w:p>
     <w:p>
@@ -447,19 +444,19 @@
           <w:i/>
           <w:iCs/>
         </w:rPr>
-        <w:t xml:space="preserve"> Esta situación incrementa significativamente el riesgo operacional, dificulta la planificación de tareas, genera cuellos de botella y limita la flexibilidad del Departamento para reasignar recursos ante imprevistos o prioridades institucionales.</w:t>
-      </w:r>
-    </w:p>
-    <w:p>
-      <w:r>
-        <w:rPr>
-          <w:b/>
-          <w:bCs/>
-        </w:rPr>
-        <w:t xml:space="preserve">• Ausencia de procedimientos homogéneos:</w:t>
-      </w:r>
-      <w:r>
-        <w:t xml:space="preserve"> Si bien existen buenas prácticas individuales, actualmente no todos los proyectos siguen criterios comunes respecto de documentación, planificación, estimación, arquitectura, pruebas o seguimiento.</w:t>
+        <w:t xml:space="preserve"> Esta situaciÃ³n incrementa significativamente el riesgo operacional, dificulta la planificaciÃ³n de tareas, genera cuellos de botella y limita la flexibilidad del Departamento para reasignar recursos ante imprevistos o prioridades institucionales.</w:t>
+      </w:r>
+    </w:p>
+    <w:p>
+      <w:r>
+        <w:rPr>
+          <w:b/>
+          <w:bCs/>
+        </w:rPr>
+        <w:t xml:space="preserve">â€¢ Ausencia de procedimientos homogÃ©neos:</w:t>
+      </w:r>
+      <w:r>
+        <w:t xml:space="preserve"> Si bien existen buenas prÃ¡cticas individuales, actualmente no todos los proyectos siguen criterios comunes respecto de documentaciÃ³n, planificaciÃ³n, estimaciÃ³n, arquitectura, pruebas o seguimiento.</w:t>
       </w:r>
     </w:p>
     <w:p>
@@ -477,19 +474,19 @@
           <w:i/>
           <w:iCs/>
         </w:rPr>
-        <w:t xml:space="preserve"> Esta heterogeneidad genera variabilidad en la calidad del código, dificulta la incorporación e inducción de nuevos agentes, reduce la reutilización del trabajo existente y encarece el mantenimiento a largo plazo.</w:t>
-      </w:r>
-    </w:p>
-    <w:p>
-      <w:r>
-        <w:rPr>
-          <w:b/>
-          <w:bCs/>
-        </w:rPr>
-        <w:t xml:space="preserve">• Gestión fragmentada de proyectos:</w:t>
-      </w:r>
-      <w:r>
-        <w:t xml:space="preserve"> El seguimiento de proyectos se realiza utilizando diferentes herramientas y metodologías, lo que dificulta obtener una visión integral de la carga de trabajo del Departamento.</w:t>
+        <w:t xml:space="preserve"> Esta heterogeneidad genera variabilidad en la calidad del cÃ³digo, dificulta la incorporaciÃ³n e inducciÃ³n de nuevos agentes, reduce la reutilizaciÃ³n del trabajo existente y encarece el mantenimiento a largo plazo.</w:t>
+      </w:r>
+    </w:p>
+    <w:p>
+      <w:r>
+        <w:rPr>
+          <w:b/>
+          <w:bCs/>
+        </w:rPr>
+        <w:t xml:space="preserve">â€¢ GestiÃ³n fragmentada de proyectos:</w:t>
+      </w:r>
+      <w:r>
+        <w:t xml:space="preserve"> El seguimiento de proyectos se realiza utilizando diferentes herramientas y metodologÃ­as, lo que dificulta obtener una visiÃ³n integral de la carga de trabajo del Departamento.</w:t>
       </w:r>
     </w:p>
     <w:p>
@@ -507,19 +504,19 @@
           <w:i/>
           <w:iCs/>
         </w:rPr>
-        <w:t xml:space="preserve"> Impide conocer la capacidad operativa real del área, dificulta la priorización transparente de solicitudes entre Secretarías y genera desajustes en las estimaciones de tiempos de entrega.</w:t>
-      </w:r>
-    </w:p>
-    <w:p>
-      <w:r>
-        <w:rPr>
-          <w:b/>
-          <w:bCs/>
-        </w:rPr>
-        <w:t xml:space="preserve">• Comunicación y coordinación entre equipos:</w:t>
-      </w:r>
-      <w:r>
-        <w:t xml:space="preserve"> La distribución física del personal en distintas dependencias requiere fortalecer los mecanismos de coordinación interna para asegurar que la información circule oportunamente.</w:t>
+        <w:t xml:space="preserve"> Impide conocer la capacidad operativa real del Ã¡rea, dificulta la priorizaciÃ³n transparente de solicitudes entre SecretarÃ­as y genera desajustes en las estimaciones de tiempos de entrega.</w:t>
+      </w:r>
+    </w:p>
+    <w:p>
+      <w:r>
+        <w:rPr>
+          <w:b/>
+          <w:bCs/>
+        </w:rPr>
+        <w:t xml:space="preserve">â€¢ ComunicaciÃ³n y coordinaciÃ³n entre equipos:</w:t>
+      </w:r>
+      <w:r>
+        <w:t xml:space="preserve"> La distribuciÃ³n fÃ­sica del personal en distintas dependencias requiere fortalecer los mecanismos de coordinaciÃ³n interna para asegurar que la informaciÃ³n circule oportunamente.</w:t>
       </w:r>
     </w:p>
     <w:p>
@@ -537,19 +534,19 @@
           <w:i/>
           <w:iCs/>
         </w:rPr>
-        <w:t xml:space="preserve"> Favorece el aislamiento en silos informáticos, incrementa el riesgo de desarrollar soluciones o módulos duplicados y resiente la cohesión y sentido de pertenencia a un equipo único.</w:t>
-      </w:r>
-    </w:p>
-    <w:p>
-      <w:r>
-        <w:rPr>
-          <w:b/>
-          <w:bCs/>
-        </w:rPr>
-        <w:t xml:space="preserve">• Dependencia del mantenimiento reactivo:</w:t>
-      </w:r>
-      <w:r>
-        <w:t xml:space="preserve"> La atención permanente de incidencias y requerimientos urgentes reduce el tiempo disponible para actividades de planificación y mejora continua.</w:t>
+        <w:t xml:space="preserve"> Favorece el aislamiento en silos informÃ¡ticos, incrementa el riesgo de desarrollar soluciones o mÃ³dulos duplicados y resiente la cohesiÃ³n y sentido de pertenencia a un equipo Ãºnico.</w:t>
+      </w:r>
+    </w:p>
+    <w:p>
+      <w:r>
+        <w:rPr>
+          <w:b/>
+          <w:bCs/>
+        </w:rPr>
+        <w:t xml:space="preserve">â€¢ Dependencia del mantenimiento reactivo:</w:t>
+      </w:r>
+      <w:r>
+        <w:t xml:space="preserve"> La atenciÃ³n permanente de incidencias y requerimientos urgentes reduce el tiempo disponible para actividades de planificaciÃ³n y mejora continua.</w:t>
       </w:r>
     </w:p>
     <w:p>
@@ -567,19 +564,19 @@
           <w:i/>
           <w:iCs/>
         </w:rPr>
-        <w:t xml:space="preserve"> Consume la capacidad técnica en la atención de emergencias cotidianas, impidiendo dedicar tiempo a la documentación, la deuda técnica y la modernización planificada de sistemas.</w:t>
-      </w:r>
-    </w:p>
-    <w:p>
-      <w:r>
-        <w:rPr>
-          <w:b/>
-          <w:bCs/>
-        </w:rPr>
-        <w:t xml:space="preserve">• Gestión del conocimiento insuficiente:</w:t>
-      </w:r>
-      <w:r>
-        <w:t xml:space="preserve"> La documentación técnica, funcional y de arquitectura presenta distintos niveles de desarrollo según el proyecto.</w:t>
+        <w:t xml:space="preserve"> Consume la capacidad tÃ©cnica en la atenciÃ³n de emergencias cotidianas, impidiendo dedicar tiempo a la documentaciÃ³n, la deuda tÃ©cnica y la modernizaciÃ³n planificada de sistemas.</w:t>
+      </w:r>
+    </w:p>
+    <w:p>
+      <w:r>
+        <w:rPr>
+          <w:b/>
+          <w:bCs/>
+        </w:rPr>
+        <w:t xml:space="preserve">â€¢ GestiÃ³n del conocimiento insuficiente:</w:t>
+      </w:r>
+      <w:r>
+        <w:t xml:space="preserve"> La documentaciÃ³n tÃ©cnica, funcional y de arquitectura presenta distintos niveles de desarrollo segÃºn el proyecto.</w:t>
       </w:r>
     </w:p>
     <w:p>
@@ -597,7 +594,7 @@
           <w:i/>
           <w:iCs/>
         </w:rPr>
-        <w:t xml:space="preserve"> Aumenta la dependencia del conocimiento tácito individual, encarece la curva de aprendizaje y pone en riesgo la continuidad de los aplicativos frente a licencias, traslados o bajas de personal.</w:t>
+        <w:t xml:space="preserve"> Aumenta la dependencia del conocimiento tÃ¡cito individual, encarece la curva de aprendizaje y pone en riesgo la continuidad de los aplicativos frente a licencias, traslados o bajas de personal.</w:t>
       </w:r>
     </w:p>
     <w:p/>
@@ -619,46 +616,46 @@
           <w:b/>
           <w:bCs/>
         </w:rPr>
-        <w:t xml:space="preserve">• Consolidación del proceso de transformación digital:</w:t>
-      </w:r>
-      <w:r>
-        <w:t xml:space="preserve"> La creciente incorporación de herramientas digitales en la Administración Pública representa una oportunidad para fortalecer el rol estratégico del Departamento como impulsor de la modernización institucional.</w:t>
-      </w:r>
-    </w:p>
-    <w:p>
-      <w:r>
-        <w:rPr>
-          <w:b/>
-          <w:bCs/>
-        </w:rPr>
-        <w:t xml:space="preserve">• Adopción asistida de Inteligencia Artificial:</w:t>
-      </w:r>
-      <w:r>
-        <w:t xml:space="preserve"> La integración de herramientas asistidas por IA en los entornos de desarrollo (IDEs) permite acelerar la codificación, automatizar tareas repetitivas de documentación y elevar la productividad técnica del equipo dentro de un marco de uso seguro.</w:t>
-      </w:r>
-    </w:p>
-    <w:p>
-      <w:r>
-        <w:rPr>
-          <w:b/>
-          <w:bCs/>
-        </w:rPr>
-        <w:t xml:space="preserve">• Implementación de marcos ágiles híbridos:</w:t>
-      </w:r>
-      <w:r>
-        <w:t xml:space="preserve"> La adopción de dinámicas ágiles (Kanban para mantenimiento e iteraciones cortas para nuevos desarrollos) a costo cero permite optimizar la comunicación interna y clarificar prioridades.</w:t>
-      </w:r>
-    </w:p>
-    <w:p>
-      <w:r>
-        <w:rPr>
-          <w:b/>
-          <w:bCs/>
-        </w:rPr>
-        <w:t xml:space="preserve">• Gestión política favorable y capacitaciones accesibles:</w:t>
-      </w:r>
-      <w:r>
-        <w:t xml:space="preserve"> Intención clara de las autoridades por optimizar el área, sumada a la amplia oferta de formación técnica online y talleres internos para actualizar competencias sin impacto presupuestario.</w:t>
+        <w:t xml:space="preserve">â€¢ ConsolidaciÃ³n del proceso de transformaciÃ³n digital:</w:t>
+      </w:r>
+      <w:r>
+        <w:t xml:space="preserve"> La creciente incorporaciÃ³n de herramientas digitales en la AdministraciÃ³n PÃºblica representa una oportunidad para fortalecer el rol estratÃ©gico del Departamento como impulsor de la modernizaciÃ³n institucional.</w:t>
+      </w:r>
+    </w:p>
+    <w:p>
+      <w:r>
+        <w:rPr>
+          <w:b/>
+          <w:bCs/>
+        </w:rPr>
+        <w:t xml:space="preserve">â€¢ AdopciÃ³n asistida de Inteligencia Artificial:</w:t>
+      </w:r>
+      <w:r>
+        <w:t xml:space="preserve"> La integraciÃ³n de herramientas asistidas por IA en los entornos de desarrollo (IDEs) permite acelerar la codificaciÃ³n, automatizar tareas repetitivas de documentaciÃ³n y elevar la productividad tÃ©cnica del equipo dentro de un marco de uso seguro.</w:t>
+      </w:r>
+    </w:p>
+    <w:p>
+      <w:r>
+        <w:rPr>
+          <w:b/>
+          <w:bCs/>
+        </w:rPr>
+        <w:t xml:space="preserve">â€¢ ImplementaciÃ³n de marcos Ã¡giles hÃ­bridos:</w:t>
+      </w:r>
+      <w:r>
+        <w:t xml:space="preserve"> La adopciÃ³n de dinÃ¡micas Ã¡giles (Kanban para mantenimiento e iteraciones cortas para nuevos desarrollos) a costo cero permite optimizar la comunicaciÃ³n interna y clarificar prioridades.</w:t>
+      </w:r>
+    </w:p>
+    <w:p>
+      <w:r>
+        <w:rPr>
+          <w:b/>
+          <w:bCs/>
+        </w:rPr>
+        <w:t xml:space="preserve">â€¢ GestiÃ³n polÃ­tica favorable y capacitaciones accesibles:</w:t>
+      </w:r>
+      <w:r>
+        <w:t xml:space="preserve"> IntenciÃ³n clara de las autoridades por optimizar el Ã¡rea, sumada a la amplia oferta de formaciÃ³n tÃ©cnica online y talleres internos para actualizar competencias sin impacto presupuestario.</w:t>
       </w:r>
     </w:p>
     <w:p/>
@@ -671,135 +668,135 @@
           <w:b/>
           <w:bCs/>
         </w:rPr>
-        <w:t xml:space="preserve">Amenazas y su Mitigación</w:t>
-      </w:r>
-    </w:p>
-    <w:p>
-      <w:r>
-        <w:rPr>
-          <w:b/>
-          <w:bCs/>
-        </w:rPr>
-        <w:t xml:space="preserve">1. Incremento sostenido de la demanda e indefinición de áreas usuarias:</w:t>
-      </w:r>
-    </w:p>
-    <w:p>
-      <w:r>
-        <w:t xml:space="preserve">La demanda creciente sumada a dilaciones o falta de certeza por parte de las dependencias solicitantes al definir circuitos administrativos puede superar la capacidad operativa si no se formaliza un circuito único de demandas.</w:t>
-      </w:r>
-    </w:p>
-    <w:p>
-      <w:r>
-        <w:rPr>
-          <w:b/>
-          <w:bCs/>
-          <w:i/>
-          <w:iCs/>
-        </w:rPr>
-        <w:t xml:space="preserve">Mitigación:</w:t>
-      </w:r>
-      <w:r>
-        <w:rPr>
-          <w:i/>
-          <w:iCs/>
-        </w:rPr>
-        <w:t xml:space="preserve"> Implementación de una Cartera Única de Proyectos en Redmine con circuito formal de ingreso, priorización objetiva y comunicación sistematizada con las áreas usuarias.</w:t>
-      </w:r>
-    </w:p>
-    <w:p>
-      <w:r>
-        <w:rPr>
-          <w:b/>
-          <w:bCs/>
-        </w:rPr>
-        <w:t xml:space="preserve">2. Obsolescencia e integración con sistemas legacy:</w:t>
-      </w:r>
-    </w:p>
-    <w:p>
-      <w:r>
-        <w:t xml:space="preserve">La coexistencia de aplicaciones sobre tecnologías antiguas que carecen de APIs unificadas incrementa el riesgo operativo y dificulta su integración con nuevos desarrollos web o móviles.</w:t>
-      </w:r>
-    </w:p>
-    <w:p>
-      <w:r>
-        <w:rPr>
-          <w:b/>
-          <w:bCs/>
-          <w:i/>
-          <w:iCs/>
-        </w:rPr>
-        <w:t xml:space="preserve">Mitigación:</w:t>
-      </w:r>
-      <w:r>
-        <w:rPr>
-          <w:i/>
-          <w:iCs/>
-        </w:rPr>
-        <w:t xml:space="preserve"> Creación de una capa de integración mediante APIs (middlewares) para aislar los sistemas antiguos y exponer servicios seguros, con modernización progresiva planificada por etapas.</w:t>
-      </w:r>
-    </w:p>
-    <w:p>
-      <w:r>
-        <w:rPr>
-          <w:b/>
-          <w:bCs/>
-        </w:rPr>
-        <w:t xml:space="preserve">3. Riesgo de dependencia técnica sobre proveedores externos:</w:t>
-      </w:r>
-    </w:p>
-    <w:p>
-      <w:r>
-        <w:t xml:space="preserve">La entrega de soluciones por terceros sin un canal fluido de comunicación técnica ni una contraparte municipal que participe activamente del seguimiento puede generar dependencia total de la empresa y pérdida del conocimiento institucional.</w:t>
-      </w:r>
-    </w:p>
-    <w:p>
-      <w:r>
-        <w:rPr>
-          <w:b/>
-          <w:bCs/>
-          <w:i/>
-          <w:iCs/>
-        </w:rPr>
-        <w:t xml:space="preserve">Mitigación:</w:t>
-      </w:r>
-      <w:r>
-        <w:rPr>
-          <w:i/>
-          <w:iCs/>
-        </w:rPr>
-        <w:t xml:space="preserve"> Gobierno técnico de proveedores: exigencia de código fuente, documentación técnica y pruebas de recepción validadas por el Departamento antes de la aceptación formal de cualquier entregable.</w:t>
-      </w:r>
-    </w:p>
-    <w:p>
-      <w:r>
-        <w:rPr>
-          <w:b/>
-          <w:bCs/>
-        </w:rPr>
-        <w:t xml:space="preserve">4. Requerimientos normativos e imprevistos de gestión:</w:t>
-      </w:r>
-    </w:p>
-    <w:p>
-      <w:r>
-        <w:t xml:space="preserve">Surgimiento de necesidades imprevistas derivadas de cambios normativos o resoluciones urgentes que fuerzan la reorganización del cronograma establecido.</w:t>
-      </w:r>
-    </w:p>
-    <w:p>
-      <w:r>
-        <w:rPr>
-          <w:b/>
-          <w:bCs/>
-          <w:i/>
-          <w:iCs/>
-        </w:rPr>
-        <w:t xml:space="preserve">Mitigación:</w:t>
-      </w:r>
-      <w:r>
-        <w:rPr>
-          <w:i/>
-          <w:iCs/>
-        </w:rPr>
-        <w:t xml:space="preserve"> Backlog priorizado con capacidad de reserva planificada para atender urgencias sin desarticular los proyectos en curso, gestionado mediante el circuito de Cartera Única.</w:t>
+        <w:t xml:space="preserve">Amenazas y su MitigaciÃ³n</w:t>
+      </w:r>
+    </w:p>
+    <w:p>
+      <w:r>
+        <w:rPr>
+          <w:b/>
+          <w:bCs/>
+        </w:rPr>
+        <w:t xml:space="preserve">1. Incremento sostenido de la demanda e indefiniciÃ³n de Ã¡reas usuarias:</w:t>
+      </w:r>
+    </w:p>
+    <w:p>
+      <w:r>
+        <w:t xml:space="preserve">La demanda creciente sumada a dilaciones o falta de certeza por parte de las dependencias solicitantes al definir circuitos administrativos puede superar la capacidad operativa si no se formaliza un circuito Ãºnico de demandas.</w:t>
+      </w:r>
+    </w:p>
+    <w:p>
+      <w:r>
+        <w:rPr>
+          <w:b/>
+          <w:bCs/>
+          <w:i/>
+          <w:iCs/>
+        </w:rPr>
+        <w:t xml:space="preserve">MitigaciÃ³n:</w:t>
+      </w:r>
+      <w:r>
+        <w:rPr>
+          <w:i/>
+          <w:iCs/>
+        </w:rPr>
+        <w:t xml:space="preserve"> ImplementaciÃ³n de una Cartera Ãšnica de Proyectos en Redmine con circuito formal de ingreso, priorizaciÃ³n objetiva y comunicaciÃ³n sistematizada con las Ã¡reas usuarias.</w:t>
+      </w:r>
+    </w:p>
+    <w:p>
+      <w:r>
+        <w:rPr>
+          <w:b/>
+          <w:bCs/>
+        </w:rPr>
+        <w:t xml:space="preserve">2. Obsolescencia e integraciÃ³n con sistemas legacy:</w:t>
+      </w:r>
+    </w:p>
+    <w:p>
+      <w:r>
+        <w:t xml:space="preserve">La coexistencia de aplicaciones sobre tecnologÃ­as antiguas que carecen de APIs unificadas incrementa el riesgo operativo y dificulta su integraciÃ³n con nuevos desarrollos web o mÃ³viles.</w:t>
+      </w:r>
+    </w:p>
+    <w:p>
+      <w:r>
+        <w:rPr>
+          <w:b/>
+          <w:bCs/>
+          <w:i/>
+          <w:iCs/>
+        </w:rPr>
+        <w:t xml:space="preserve">MitigaciÃ³n:</w:t>
+      </w:r>
+      <w:r>
+        <w:rPr>
+          <w:i/>
+          <w:iCs/>
+        </w:rPr>
+        <w:t xml:space="preserve"> CreaciÃ³n de una capa de integraciÃ³n mediante APIs (middlewares) para aislar los sistemas antiguos y exponer servicios seguros, con modernizaciÃ³n progresiva planificada por etapas.</w:t>
+      </w:r>
+    </w:p>
+    <w:p>
+      <w:r>
+        <w:rPr>
+          <w:b/>
+          <w:bCs/>
+        </w:rPr>
+        <w:t xml:space="preserve">3. Riesgo de dependencia tÃ©cnica sobre proveedores externos:</w:t>
+      </w:r>
+    </w:p>
+    <w:p>
+      <w:r>
+        <w:t xml:space="preserve">La entrega de soluciones por terceros sin un canal fluido de comunicaciÃ³n tÃ©cnica ni una contraparte municipal que participe activamente del seguimiento puede generar dependencia total de la empresa y pÃ©rdida del conocimiento institucional.</w:t>
+      </w:r>
+    </w:p>
+    <w:p>
+      <w:r>
+        <w:rPr>
+          <w:b/>
+          <w:bCs/>
+          <w:i/>
+          <w:iCs/>
+        </w:rPr>
+        <w:t xml:space="preserve">MitigaciÃ³n:</w:t>
+      </w:r>
+      <w:r>
+        <w:rPr>
+          <w:i/>
+          <w:iCs/>
+        </w:rPr>
+        <w:t xml:space="preserve"> Gobierno tÃ©cnico de proveedores: exigencia de cÃ³digo fuente, documentaciÃ³n tÃ©cnica y pruebas de recepciÃ³n validadas por el Departamento antes de la aceptaciÃ³n formal de cualquier entregable.</w:t>
+      </w:r>
+    </w:p>
+    <w:p>
+      <w:r>
+        <w:rPr>
+          <w:b/>
+          <w:bCs/>
+        </w:rPr>
+        <w:t xml:space="preserve">4. Requerimientos normativos e imprevistos de gestiÃ³n:</w:t>
+      </w:r>
+    </w:p>
+    <w:p>
+      <w:r>
+        <w:t xml:space="preserve">Surgimiento de necesidades imprevistas derivadas de cambios normativos o resoluciones urgentes que fuerzan la reorganizaciÃ³n del cronograma establecido.</w:t>
+      </w:r>
+    </w:p>
+    <w:p>
+      <w:r>
+        <w:rPr>
+          <w:b/>
+          <w:bCs/>
+          <w:i/>
+          <w:iCs/>
+        </w:rPr>
+        <w:t xml:space="preserve">MitigaciÃ³n:</w:t>
+      </w:r>
+      <w:r>
+        <w:rPr>
+          <w:i/>
+          <w:iCs/>
+        </w:rPr>
+        <w:t xml:space="preserve"> Backlog priorizado con capacidad de reserva planificada para atender urgencias sin desarticular los proyectos en curso, gestionado mediante el circuito de Cartera Ãšnica.</w:t>
       </w:r>
     </w:p>
     <w:p>
@@ -813,25 +810,25 @@
     </w:p>
     <w:p>
       <w:r>
-        <w:t xml:space="preserve">La prolongada falta de una conducción formal en el Departamento puede generar inercia inicial a la hora de adoptar nuevas pautas organizativas y estándares técnicos.</w:t>
-      </w:r>
-    </w:p>
-    <w:p>
-      <w:r>
-        <w:rPr>
-          <w:b/>
-          <w:bCs/>
-          <w:i/>
-          <w:iCs/>
-        </w:rPr>
-        <w:t xml:space="preserve">Mitigación:</w:t>
-      </w:r>
-      <w:r>
-        <w:rPr>
-          <w:i/>
-          <w:iCs/>
-        </w:rPr>
-        <w:t xml:space="preserve"> Liderazgo firme pero empático, incorporación progresiva y participativa de las nuevas pautas comunes, y reuniones periódicas de trabajo colaborativo para construir consenso y cohesión de equipo.</w:t>
+        <w:t xml:space="preserve">La prolongada falta de una conducciÃ³n formal en el Departamento puede generar inercia inicial a la hora de adoptar nuevas pautas organizativas y estÃ¡ndares tÃ©cnicos.</w:t>
+      </w:r>
+    </w:p>
+    <w:p>
+      <w:r>
+        <w:rPr>
+          <w:b/>
+          <w:bCs/>
+          <w:i/>
+          <w:iCs/>
+        </w:rPr>
+        <w:t xml:space="preserve">MitigaciÃ³n:</w:t>
+      </w:r>
+      <w:r>
+        <w:rPr>
+          <w:i/>
+          <w:iCs/>
+        </w:rPr>
+        <w:t xml:space="preserve"> Liderazgo firme pero empÃ¡tico, incorporaciÃ³n progresiva y participativa de las nuevas pautas comunes, y reuniones periÃ³dicas de trabajo colaborativo para construir consenso y cohesiÃ³n de equipo.</w:t>
       </w:r>
     </w:p>
     <w:p/>
@@ -844,17 +841,17 @@
           <w:b/>
           <w:bCs/>
         </w:rPr>
-        <w:t xml:space="preserve">3.3 Conclusión del diagnóstico</w:t>
-      </w:r>
-    </w:p>
-    <w:p>
-      <w:r>
-        <w:t xml:space="preserve">Del análisis realizado surge que el principal desafío del Departamento no radica exclusivamente en la incorporación de nuevas tecnologías, sino en fortalecer su capacidad organizacional para gestionar de manera eficiente el conocimiento, coordinar los recursos disponibles y establecer procedimientos comunes que permitan responder con mayor previsibilidad a las necesidades de la Administración Municipal.</w:t>
-      </w:r>
-    </w:p>
-    <w:p>
-      <w:r>
-        <w:t xml:space="preserve">En consecuencia, la propuesta prioriza la consolidación de un modelo de gestión orientado a las personas, la mejora de los procesos y la planificación estratégica del trabajo, utilizando la innovación tecnológica como un medio para potenciar la capacidad institucional del Departamento y no como un fin en sí mismo.</w:t>
+        <w:t xml:space="preserve">3.3 ConclusiÃ³n del diagnÃ³stico</w:t>
+      </w:r>
+    </w:p>
+    <w:p>
+      <w:r>
+        <w:t xml:space="preserve">Del anÃ¡lisis realizado surge que el principal desafÃ­o del Departamento no radica exclusivamente en la incorporaciÃ³n de nuevas tecnologÃ­as, sino en fortalecer su capacidad organizacional para gestionar de manera eficiente el conocimiento, coordinar los recursos disponibles y establecer procedimientos comunes que permitan responder con mayor previsibilidad a las necesidades de la AdministraciÃ³n Municipal.</w:t>
+      </w:r>
+    </w:p>
+    <w:p>
+      <w:r>
+        <w:t xml:space="preserve">En consecuencia, la propuesta prioriza la consolidaciÃ³n de un modelo de gestiÃ³n orientado a las personas, la mejora de los procesos y la planificaciÃ³n estratÃ©gica del trabajo, utilizando la innovaciÃ³n tecnolÃ³gica como un medio para potenciar la capacidad institucional del Departamento y no como un fin en sÃ­ mismo.</w:t>
       </w:r>
     </w:p>
     <w:p/>
@@ -867,12 +864,12 @@
           <w:b/>
           <w:bCs/>
         </w:rPr>
-        <w:t xml:space="preserve">4. PRINCIPIOS DE GESTIÓN</w:t>
-      </w:r>
-    </w:p>
-    <w:p>
-      <w:r>
-        <w:t xml:space="preserve">El ejercicio de la Jefatura del Departamento requiere combinar capacidades técnicas con habilidades de conducción, planificación y coordinación. En consecuencia, las decisiones organizacionales y técnicas deberán sustentarse sobre principios de gestión que otorguen coherencia a las acciones del Departamento.</w:t>
+        <w:t xml:space="preserve">4. PRINCIPIOS DE GESTIÃ“N</w:t>
+      </w:r>
+    </w:p>
+    <w:p>
+      <w:r>
+        <w:t xml:space="preserve">El ejercicio de la Jefatura del Departamento requiere combinar capacidades tÃ©cnicas con habilidades de conducciÃ³n, planificaciÃ³n y coordinaciÃ³n. En consecuencia, las decisiones organizacionales y tÃ©cnicas deberÃ¡n sustentarse sobre principios de gestiÃ³n que otorguen coherencia a las acciones del Departamento.</w:t>
       </w:r>
     </w:p>
     <w:p>
@@ -884,12 +881,12 @@
           <w:b/>
           <w:bCs/>
         </w:rPr>
-        <w:t xml:space="preserve">4.1 Liderazgo basado en la colaboración</w:t>
-      </w:r>
-    </w:p>
-    <w:p>
-      <w:r>
-        <w:t xml:space="preserve">La conducción del Departamento promoverá un ambiente de trabajo participativo, donde la comunicación, el intercambio de conocimientos y la construcción colectiva de soluciones sean parte de la cultura organizacional. La función de la Jefatura consistirá en facilitar el trabajo de los equipos, remover obstáculos, promover acuerdos y generar las condiciones necesarias para que cada integrante pueda desarrollar sus capacidades profesionales.</w:t>
+        <w:t xml:space="preserve">4.1 Liderazgo basado en la colaboraciÃ³n</w:t>
+      </w:r>
+    </w:p>
+    <w:p>
+      <w:r>
+        <w:t xml:space="preserve">La conducciÃ³n del Departamento promoverÃ¡ un ambiente de trabajo participativo, donde la comunicaciÃ³n, el intercambio de conocimientos y la construcciÃ³n colectiva de soluciones sean parte de la cultura organizacional. La funciÃ³n de la Jefatura consistirÃ¡ en facilitar el trabajo de los equipos, remover obstÃ¡culos, promover acuerdos y generar las condiciones necesarias para que cada integrante pueda desarrollar sus capacidades profesionales.</w:t>
       </w:r>
     </w:p>
     <w:p>
@@ -901,12 +898,12 @@
           <w:b/>
           <w:bCs/>
         </w:rPr>
-        <w:t xml:space="preserve">4.2 Gestión orientada a procesos</w:t>
-      </w:r>
-    </w:p>
-    <w:p>
-      <w:r>
-        <w:t xml:space="preserve">El crecimiento sostenido del Departamento hace necesario reducir la dependencia de prácticas individuales y avanzar hacia procedimientos institucionales homogéneos. Toda actividad recurrente deberá encontrarse respaldada por procedimientos claros que permitan garantizar continuidad, previsibilidad y calidad, simplificando el trabajo cotidiano y asegurando la continuidad operativa.</w:t>
+        <w:t xml:space="preserve">4.2 GestiÃ³n orientada a procesos</w:t>
+      </w:r>
+    </w:p>
+    <w:p>
+      <w:r>
+        <w:t xml:space="preserve">El crecimiento sostenido del Departamento hace necesario reducir la dependencia de prÃ¡cticas individuales y avanzar hacia procedimientos institucionales homogÃ©neos. Toda actividad recurrente deberÃ¡ encontrarse respaldada por procedimientos claros que permitan garantizar continuidad, previsibilidad y calidad, simplificando el trabajo cotidiano y asegurando la continuidad operativa.</w:t>
       </w:r>
     </w:p>
     <w:p>
@@ -918,12 +915,12 @@
           <w:b/>
           <w:bCs/>
         </w:rPr>
-        <w:t xml:space="preserve">4.3 Gestión del conocimiento institucional</w:t>
-      </w:r>
-    </w:p>
-    <w:p>
-      <w:r>
-        <w:t xml:space="preserve">El conocimiento generado durante el desarrollo y mantenimiento de los sistemas constituye un activo estratégico de la Municipalidad. Por ello, la Jefatura impulsará mecanismos que favorezcan la documentación, la transferencia de conocimientos y la capacitación interna, procurando que la información crítica permanezca en la organización.</w:t>
+        <w:t xml:space="preserve">4.3 GestiÃ³n del conocimiento institucional</w:t>
+      </w:r>
+    </w:p>
+    <w:p>
+      <w:r>
+        <w:t xml:space="preserve">El conocimiento generado durante el desarrollo y mantenimiento de los sistemas constituye un activo estratÃ©gico de la Municipalidad. Por ello, la Jefatura impulsarÃ¡ mecanismos que favorezcan la documentaciÃ³n, la transferencia de conocimientos y la capacitaciÃ³n interna, procurando que la informaciÃ³n crÃ­tica permanezca en la organizaciÃ³n.</w:t>
       </w:r>
     </w:p>
     <w:p>
@@ -940,7 +937,7 @@
     </w:p>
     <w:p>
       <w:r>
-        <w:t xml:space="preserve">Los procedimientos, metodologías y herramientas deberán revisarse periódicamente para identificar oportunidades de mejora sobre la base de evidencias objetivas, indicadores de gestión y resultados observables.</w:t>
+        <w:t xml:space="preserve">Los procedimientos, metodologÃ­as y herramientas deberÃ¡n revisarse periÃ³dicamente para identificar oportunidades de mejora sobre la base de evidencias objetivas, indicadores de gestiÃ³n y resultados observables.</w:t>
       </w:r>
     </w:p>
     <w:p>
@@ -952,12 +949,12 @@
           <w:b/>
           <w:bCs/>
         </w:rPr>
-        <w:t xml:space="preserve">4.5 Innovación responsable</w:t>
-      </w:r>
-    </w:p>
-    <w:p>
-      <w:r>
-        <w:t xml:space="preserve">Antes de adoptar una herramienta, metodología o plataforma tecnológica se evaluarán aspectos tales como compatibilidad con la arquitectura existente, sostenibilidad en el tiempo, costos de implementación, impacto sobre los procesos, requerimientos de capacitación y seguridad de la información.</w:t>
+        <w:t xml:space="preserve">4.5 InnovaciÃ³n responsable</w:t>
+      </w:r>
+    </w:p>
+    <w:p>
+      <w:r>
+        <w:t xml:space="preserve">Antes de adoptar una herramienta, metodologÃ­a o plataforma tecnolÃ³gica se evaluarÃ¡n aspectos tales como compatibilidad con la arquitectura existente, sostenibilidad en el tiempo, costos de implementaciÃ³n, impacto sobre los procesos, requerimientos de capacitaciÃ³n y seguridad de la informaciÃ³n.</w:t>
       </w:r>
     </w:p>
     <w:p>
@@ -969,12 +966,12 @@
           <w:b/>
           <w:bCs/>
         </w:rPr>
-        <w:t xml:space="preserve">4.6 Orientación al servicio</w:t>
-      </w:r>
-    </w:p>
-    <w:p>
-      <w:r>
-        <w:t xml:space="preserve">El Departamento presta servicios a las distintas áreas municipales y, de manera indirecta, a toda la comunidad. Las decisiones priorizarán el valor que los sistemas aportan a los procesos administrativos, sustentándose en un diálogo permanente y una definición clara de prioridades.</w:t>
+        <w:t xml:space="preserve">4.6 OrientaciÃ³n al servicio</w:t>
+      </w:r>
+    </w:p>
+    <w:p>
+      <w:r>
+        <w:t xml:space="preserve">El Departamento presta servicios a las distintas Ã¡reas municipales y, de manera indirecta, a toda la comunidad. Las decisiones priorizarÃ¡n el valor que los sistemas aportan a los procesos administrativos, sustentÃ¡ndose en un diÃ¡logo permanente y una definiciÃ³n clara de prioridades.</w:t>
       </w:r>
     </w:p>
     <w:p>
@@ -991,7 +988,7 @@
     </w:p>
     <w:p>
       <w:r>
-        <w:t xml:space="preserve">La planificación y administración del Departamento se apoyará en información objetiva proveniente de indicadores que midan la capacidad operativa, la evolución de proyectos y los cuellos de botella.</w:t>
+        <w:t xml:space="preserve">La planificaciÃ³n y administraciÃ³n del Departamento se apoyarÃ¡ en informaciÃ³n objetiva proveniente de indicadores que midan la capacidad operativa, la evoluciÃ³n de proyectos y los cuellos de botella.</w:t>
       </w:r>
     </w:p>
     <w:p/>
@@ -1004,7 +1001,7 @@
           <w:b/>
           <w:bCs/>
         </w:rPr>
-        <w:t xml:space="preserve">5. OBJETIVOS</w:t>
+        <w:t xml:space="preserve">4. OBJETIVOS</w:t>
       </w:r>
     </w:p>
     <w:p>
@@ -1021,7 +1018,7 @@
     </w:p>
     <w:p>
       <w:r>
-        <w:t xml:space="preserve">Fortalecer la capacidad institucional del Departamento de Gestión, Desarrollo e Innovación en Sistemas de Software mediante un modelo de gestión orientado a las personas, la organización de los procesos, la estandarización técnica y la mejora continua, asegurando el desarrollo de soluciones tecnológicas sostenibles, seguras y alineadas con los objetivos estratégicos de la Municipalidad de General Pueyrredon.</w:t>
+        <w:t xml:space="preserve">Fortalecer la capacidad institucional del Departamento de GestiÃ³n, Desarrollo e InnovaciÃ³n en Sistemas de Software mediante un modelo de gestiÃ³n orientado a las personas, la organizaciÃ³n de los procesos, la estandarizaciÃ³n tÃ©cnica y la mejora continua, asegurando el desarrollo de soluciones tecnolÃ³gicas sostenibles, seguras y alineadas con los objetivos estratÃ©gicos de la Municipalidad de General Pueyrredon.</w:t>
       </w:r>
     </w:p>
     <w:p>
@@ -1033,19 +1030,19 @@
           <w:b/>
           <w:bCs/>
         </w:rPr>
-        <w:t xml:space="preserve">5.2 Objetivos Específicos</w:t>
-      </w:r>
-    </w:p>
-    <w:p>
-      <w:r>
-        <w:rPr>
-          <w:b/>
-          <w:bCs/>
-        </w:rPr>
-        <w:t xml:space="preserve">1. Fortalecer la organización interna:</w:t>
-      </w:r>
-      <w:r>
-        <w:t xml:space="preserve"> Promover una estructura colaborativa basada en planificación, comunicación transversal entre oficinas y liderazgo activo de la Jefatura.</w:t>
+        <w:t xml:space="preserve">5.2 Objetivos EspecÃ­ficos</w:t>
+      </w:r>
+    </w:p>
+    <w:p>
+      <w:r>
+        <w:rPr>
+          <w:b/>
+          <w:bCs/>
+        </w:rPr>
+        <w:t xml:space="preserve">1. Fortalecer la organizaciÃ³n interna:</w:t>
+      </w:r>
+      <w:r>
+        <w:t xml:space="preserve"> Promover una estructura colaborativa basada en planificaciÃ³n, comunicaciÃ³n transversal entre oficinas y liderazgo activo de la Jefatura.</w:t>
       </w:r>
     </w:p>
     <w:p>
@@ -1057,52 +1054,52 @@
         <w:t xml:space="preserve">2. Preservar el conocimiento institucional:</w:t>
       </w:r>
       <w:r>
-        <w:t xml:space="preserve"> Eliminar puntos únicos de falla mediante la asignación de Referentes Secundarios y documentación sistemática.</w:t>
-      </w:r>
-    </w:p>
-    <w:p>
-      <w:r>
-        <w:rPr>
-          <w:b/>
-          <w:bCs/>
-        </w:rPr>
-        <w:t xml:space="preserve">3. Estandarizar procesos y código:</w:t>
-      </w:r>
-      <w:r>
-        <w:t xml:space="preserve"> Institucionalizar la obligatoriedad del template de Arquitectura Base Municipal y guías de buenas prácticas.</w:t>
-      </w:r>
-    </w:p>
-    <w:p>
-      <w:r>
-        <w:rPr>
-          <w:b/>
-          <w:bCs/>
-        </w:rPr>
-        <w:t xml:space="preserve">4. Optimizar la gestión de proyectos:</w:t>
-      </w:r>
-      <w:r>
-        <w:t xml:space="preserve"> Consolidar una Cartera Única de Proyectos gestionada homogéneamente en Redmine.</w:t>
-      </w:r>
-    </w:p>
-    <w:p>
-      <w:r>
-        <w:rPr>
-          <w:b/>
-          <w:bCs/>
-        </w:rPr>
-        <w:t xml:space="preserve">5. Consolidar el Gobierno Técnico:</w:t>
-      </w:r>
-      <w:r>
-        <w:t xml:space="preserve"> Establecer protocolos de auditoría y recepción técnica para desarrollos internos y de proveedores externos.</w:t>
-      </w:r>
-    </w:p>
-    <w:p>
-      <w:r>
-        <w:rPr>
-          <w:b/>
-          <w:bCs/>
-        </w:rPr>
-        <w:t xml:space="preserve">6. Promover la innovación tecnológica responsable:</w:t>
+        <w:t xml:space="preserve"> Eliminar puntos Ãºnicos de falla mediante la asignaciÃ³n de Referentes Secundarios y documentaciÃ³n sistemÃ¡tica.</w:t>
+      </w:r>
+    </w:p>
+    <w:p>
+      <w:r>
+        <w:rPr>
+          <w:b/>
+          <w:bCs/>
+        </w:rPr>
+        <w:t xml:space="preserve">3. Estandarizar procesos y cÃ³digo:</w:t>
+      </w:r>
+      <w:r>
+        <w:t xml:space="preserve"> Institucionalizar la obligatoriedad del template de Arquitectura Base Municipal y guÃ­as de buenas prÃ¡cticas.</w:t>
+      </w:r>
+    </w:p>
+    <w:p>
+      <w:r>
+        <w:rPr>
+          <w:b/>
+          <w:bCs/>
+        </w:rPr>
+        <w:t xml:space="preserve">4. Optimizar la gestiÃ³n de proyectos:</w:t>
+      </w:r>
+      <w:r>
+        <w:t xml:space="preserve"> Consolidar una Cartera Ãšnica de Proyectos gestionada homogÃ©neamente en Redmine.</w:t>
+      </w:r>
+    </w:p>
+    <w:p>
+      <w:r>
+        <w:rPr>
+          <w:b/>
+          <w:bCs/>
+        </w:rPr>
+        <w:t xml:space="preserve">5. Consolidar el Gobierno TÃ©cnico:</w:t>
+      </w:r>
+      <w:r>
+        <w:t xml:space="preserve"> Establecer protocolos de auditorÃ­a y recepciÃ³n tÃ©cnica para desarrollos internos y de proveedores externos.</w:t>
+      </w:r>
+    </w:p>
+    <w:p>
+      <w:r>
+        <w:rPr>
+          <w:b/>
+          <w:bCs/>
+        </w:rPr>
+        <w:t xml:space="preserve">6. Promover la innovaciÃ³n tecnolÃ³gica responsable:</w:t>
       </w:r>
       <w:r>
         <w:t xml:space="preserve"> Regular el uso asistido de Inteligencia Artificial garantizando la seguridad de los datos municipales.</w:t>
@@ -1114,10 +1111,10 @@
           <w:b/>
           <w:bCs/>
         </w:rPr>
-        <w:t xml:space="preserve">7. Fortalecer la articulación institucional:</w:t>
-      </w:r>
-      <w:r>
-        <w:t xml:space="preserve"> Mejorar los canales de relevamiento, validación y gestión de expectativas con las áreas usuarias.</w:t>
+        <w:t xml:space="preserve">7. Fortalecer la articulaciÃ³n institucional:</w:t>
+      </w:r>
+      <w:r>
+        <w:t xml:space="preserve"> Mejorar los canales de relevamiento, validaciÃ³n y gestiÃ³n de expectativas con las Ã¡reas usuarias.</w:t>
       </w:r>
     </w:p>
     <w:p/>
@@ -1130,7 +1127,7 @@
           <w:b/>
           <w:bCs/>
         </w:rPr>
-        <w:t xml:space="preserve">6. EJES ESTRATÉGICOS DE LA GESTIÓN</w:t>
+        <w:t xml:space="preserve">6. EJES ESTRATÃ‰GICOS DE LA GESTIÃ“N</w:t>
       </w:r>
     </w:p>
     <w:p>
@@ -1142,60 +1139,60 @@
           <w:b/>
           <w:bCs/>
         </w:rPr>
-        <w:t xml:space="preserve">EJE I: Gestión del Capital Humano y Desarrollo del Equipo</w:t>
-      </w:r>
-    </w:p>
-    <w:p>
-      <w:r>
-        <w:t xml:space="preserve">Las personas constituyen el principal activo del Departamento. La función de la Jefatura será generar un entorno de trabajo que favorezca la colaboración y el crecimiento profesional.</w:t>
-      </w:r>
-    </w:p>
-    <w:p>
-      <w:r>
-        <w:rPr>
-          <w:b/>
-          <w:bCs/>
-        </w:rPr>
-        <w:t xml:space="preserve">• 6.1 Comunicación y coordinación permanente:</w:t>
-      </w:r>
-      <w:r>
-        <w:t xml:space="preserve"> Reuniones breves de coordinación transversal entre ambas sedes físicas y uso de herramientas comunes para mantener la visibilidad del trabajo.</w:t>
-      </w:r>
-    </w:p>
-    <w:p>
-      <w:r>
-        <w:rPr>
-          <w:b/>
-          <w:bCs/>
-        </w:rPr>
-        <w:t xml:space="preserve">• 6.2 Desarrollo de competencias y Matriz de Competencias:</w:t>
-      </w:r>
-      <w:r>
-        <w:t xml:space="preserve"> Relevamiento integral del personal para construir una Matriz de Competencias que distinga entre capacidad técnica y conocimiento funcional del trámite municipal, planificando capacitaciones en servicio.</w:t>
-      </w:r>
-    </w:p>
-    <w:p>
-      <w:r>
-        <w:rPr>
-          <w:b/>
-          <w:bCs/>
-        </w:rPr>
-        <w:t xml:space="preserve">• 6.3 Transferencia del conocimiento (Referentes Secundarios):</w:t>
-      </w:r>
-      <w:r>
-        <w:t xml:space="preserve"> Designación de un Referente Secundario en sistemas críticos que acompañe al responsable principal (shadowing), garantizando continuidad operativa sin tocar el escalafón.</w:t>
-      </w:r>
-    </w:p>
-    <w:p>
-      <w:r>
-        <w:rPr>
-          <w:b/>
-          <w:bCs/>
-        </w:rPr>
-        <w:t xml:space="preserve">• 6.4 Cultura de trabajo colaborativo:</w:t>
-      </w:r>
-      <w:r>
-        <w:t xml:space="preserve"> Espacios de participación para que los desarrolladores propongan mejoras operativas y técnicas.</w:t>
+        <w:t xml:space="preserve">EJE I: GestiÃ³n del Capital Humano y Desarrollo del Equipo</w:t>
+      </w:r>
+    </w:p>
+    <w:p>
+      <w:r>
+        <w:t xml:space="preserve">Las personas constituyen el principal activo del Departamento. La funciÃ³n de la Jefatura serÃ¡ generar un entorno de trabajo que favorezca la colaboraciÃ³n y el crecimiento profesional.</w:t>
+      </w:r>
+    </w:p>
+    <w:p>
+      <w:r>
+        <w:rPr>
+          <w:b/>
+          <w:bCs/>
+        </w:rPr>
+        <w:t xml:space="preserve">â€¢ 6.1 ComunicaciÃ³n y coordinaciÃ³n permanente:</w:t>
+      </w:r>
+      <w:r>
+        <w:t xml:space="preserve"> Reuniones breves de coordinaciÃ³n transversal entre ambas sedes fÃ­sicas y uso de herramientas comunes para mantener la visibilidad del trabajo.</w:t>
+      </w:r>
+    </w:p>
+    <w:p>
+      <w:r>
+        <w:rPr>
+          <w:b/>
+          <w:bCs/>
+        </w:rPr>
+        <w:t xml:space="preserve">â€¢ 6.2 Desarrollo de competencias y Matriz de Competencias:</w:t>
+      </w:r>
+      <w:r>
+        <w:t xml:space="preserve"> Relevamiento integral del personal para construir una Matriz de Competencias que distinga entre capacidad tÃ©cnica y conocimiento funcional del trÃ¡mite municipal, planificando capacitaciones en servicio.</w:t>
+      </w:r>
+    </w:p>
+    <w:p>
+      <w:r>
+        <w:rPr>
+          <w:b/>
+          <w:bCs/>
+        </w:rPr>
+        <w:t xml:space="preserve">â€¢ 6.3 Transferencia del conocimiento (Referentes Secundarios):</w:t>
+      </w:r>
+      <w:r>
+        <w:t xml:space="preserve"> DesignaciÃ³n de un Referente Secundario en sistemas crÃ­ticos que acompaÃ±e al responsable principal (shadowing), garantizando continuidad operativa sin tocar el escalafÃ³n.</w:t>
+      </w:r>
+    </w:p>
+    <w:p>
+      <w:r>
+        <w:rPr>
+          <w:b/>
+          <w:bCs/>
+        </w:rPr>
+        <w:t xml:space="preserve">â€¢ 6.4 Cultura de trabajo colaborativo:</w:t>
+      </w:r>
+      <w:r>
+        <w:t xml:space="preserve"> Espacios de participaciÃ³n para que los desarrolladores propongan mejoras operativas y tÃ©cnicas.</w:t>
       </w:r>
     </w:p>
     <w:p/>
@@ -1208,43 +1205,43 @@
           <w:b/>
           <w:bCs/>
         </w:rPr>
-        <w:t xml:space="preserve">EJE II: Gestión del Conocimiento y Organización del Trabajo</w:t>
-      </w:r>
-    </w:p>
-    <w:p>
-      <w:r>
-        <w:rPr>
-          <w:b/>
-          <w:bCs/>
-        </w:rPr>
-        <w:t xml:space="preserve">• 6.5 Documentación Mínima y Útil:</w:t>
-      </w:r>
-      <w:r>
-        <w:t xml:space="preserve"> Definición de un estándar de documentación funcional, técnica y de despliegue proporcional a la criticidad del sistema, integrado al proceso normal de entrega (Definition of Done).</w:t>
-      </w:r>
-    </w:p>
-    <w:p>
-      <w:r>
-        <w:rPr>
-          <w:b/>
-          <w:bCs/>
-        </w:rPr>
-        <w:t xml:space="preserve">• 6.6 Arquitectura Base Institucional:</w:t>
-      </w:r>
-      <w:r>
-        <w:t xml:space="preserve"> Institucionalización obligatoria de un template de arquitectura en capas (APIs, acceso a datos, manejo de errores, seguridad) para todos los desarrollos nuevos.</w:t>
-      </w:r>
-    </w:p>
-    <w:p>
-      <w:r>
-        <w:rPr>
-          <w:b/>
-          <w:bCs/>
-        </w:rPr>
-        <w:t xml:space="preserve">• 6.7 Cartera Única de Proyectos en Redmine:</w:t>
-      </w:r>
-      <w:r>
-        <w:t xml:space="preserve"> Registro centralizado de todas las solicitudes, desarrollos y mantenimientos para visibilizar la carga real de trabajo y priorizar estratégicamente.</w:t>
+        <w:t xml:space="preserve">EJE II: GestiÃ³n del Conocimiento y OrganizaciÃ³n del Trabajo</w:t>
+      </w:r>
+    </w:p>
+    <w:p>
+      <w:r>
+        <w:rPr>
+          <w:b/>
+          <w:bCs/>
+        </w:rPr>
+        <w:t xml:space="preserve">â€¢ 6.5 DocumentaciÃ³n MÃ­nima y Ãštil:</w:t>
+      </w:r>
+      <w:r>
+        <w:t xml:space="preserve"> DefiniciÃ³n de un estÃ¡ndar de documentaciÃ³n funcional, tÃ©cnica y de despliegue proporcional a la criticidad del sistema, integrado al proceso normal de entrega (Definition of Done).</w:t>
+      </w:r>
+    </w:p>
+    <w:p>
+      <w:r>
+        <w:rPr>
+          <w:b/>
+          <w:bCs/>
+        </w:rPr>
+        <w:t xml:space="preserve">â€¢ 6.6 Arquitectura Base Institucional:</w:t>
+      </w:r>
+      <w:r>
+        <w:t xml:space="preserve"> InstitucionalizaciÃ³n obligatoria de un template de arquitectura en capas (APIs, acceso a datos, manejo de errores, seguridad) para todos los desarrollos nuevos.</w:t>
+      </w:r>
+    </w:p>
+    <w:p>
+      <w:r>
+        <w:rPr>
+          <w:b/>
+          <w:bCs/>
+        </w:rPr>
+        <w:t xml:space="preserve">â€¢ 6.7 Cartera Ãšnica de Proyectos en Redmine:</w:t>
+      </w:r>
+      <w:r>
+        <w:t xml:space="preserve"> Registro centralizado de todas las solicitudes, desarrollos y mantenimientos para visibilizar la carga real de trabajo y priorizar estratÃ©gicamente.</w:t>
       </w:r>
     </w:p>
     <w:p/>
@@ -1257,64 +1254,64 @@
           <w:b/>
           <w:bCs/>
         </w:rPr>
-        <w:t xml:space="preserve">EJE III: Gobierno Técnico y Calidad del Software</w:t>
-      </w:r>
-    </w:p>
-    <w:p>
-      <w:r>
-        <w:rPr>
-          <w:i/>
-          <w:iCs/>
-        </w:rPr>
-        <w:t xml:space="preserve">La responsabilidad de la Jefatura no consiste únicamente en coordinar personas, sino también en establecer el marco técnico que permita que los distintos equipos desarrollen soluciones homogéneas, seguras y sostenibles. El gobierno técnico constituye el conjunto de políticas, estándares y procedimientos que aseguran que las decisiones tecnológicas respondan a criterios institucionales y no exclusivamente a preferencias individuales.</w:t>
-      </w:r>
-    </w:p>
-    <w:p>
-      <w:r>
-        <w:rPr>
-          <w:b/>
-          <w:bCs/>
-        </w:rPr>
-        <w:t xml:space="preserve">• 6.8 Estandarización del ciclo de desarrollo:</w:t>
-      </w:r>
-      <w:r>
-        <w:t xml:space="preserve"> Definición clara de etapas: relevamiento, análisis, estimación, desarrollo, testing, implementación y mantenimiento.</w:t>
-      </w:r>
-    </w:p>
-    <w:p>
-      <w:r>
-        <w:rPr>
-          <w:b/>
-          <w:bCs/>
-        </w:rPr>
-        <w:t xml:space="preserve">• 6.9 Estándares de codificación y buenas prácticas:</w:t>
-      </w:r>
-      <w:r>
-        <w:t xml:space="preserve"> Guías institucionales de estilo de código, convenciones de nomenclatura y estructura de proyectos.</w:t>
-      </w:r>
-    </w:p>
-    <w:p>
-      <w:r>
-        <w:rPr>
-          <w:b/>
-          <w:bCs/>
-        </w:rPr>
-        <w:t xml:space="preserve">• 6.10 Calidad incorporada y revisión entre pares:</w:t>
-      </w:r>
-      <w:r>
-        <w:t xml:space="preserve"> Revisiones cruzadas (peer reviews) en GitLab para cambios críticos y validaciones funcionales antes de producción.</w:t>
-      </w:r>
-    </w:p>
-    <w:p>
-      <w:r>
-        <w:rPr>
-          <w:b/>
-          <w:bCs/>
-        </w:rPr>
-        <w:t xml:space="preserve">• 6.11 Seguridad desde el análisis (Security by Design):</w:t>
-      </w:r>
-      <w:r>
-        <w:t xml:space="preserve"> Protección de datos, autenticación, gestión de permisos y tratamiento seguro de credenciales.</w:t>
+        <w:t xml:space="preserve">EJE III: Gobierno TÃ©cnico y Calidad del Software</w:t>
+      </w:r>
+    </w:p>
+    <w:p>
+      <w:r>
+        <w:rPr>
+          <w:i/>
+          <w:iCs/>
+        </w:rPr>
+        <w:t xml:space="preserve">La responsabilidad de la Jefatura no consiste Ãºnicamente en coordinar personas, sino tambiÃ©n en establecer el marco tÃ©cnico que permita que los distintos equipos desarrollen soluciones homogÃ©neas, seguras y sostenibles. El gobierno tÃ©cnico constituye el conjunto de polÃ­ticas, estÃ¡ndares y procedimientos que aseguran que las decisiones tecnolÃ³gicas respondan a criterios institucionales y no exclusivamente a preferencias individuales.</w:t>
+      </w:r>
+    </w:p>
+    <w:p>
+      <w:r>
+        <w:rPr>
+          <w:b/>
+          <w:bCs/>
+        </w:rPr>
+        <w:t xml:space="preserve">â€¢ 6.8 EstandarizaciÃ³n del ciclo de desarrollo:</w:t>
+      </w:r>
+      <w:r>
+        <w:t xml:space="preserve"> DefiniciÃ³n clara de etapas: relevamiento, anÃ¡lisis, estimaciÃ³n, desarrollo, testing, implementaciÃ³n y mantenimiento.</w:t>
+      </w:r>
+    </w:p>
+    <w:p>
+      <w:r>
+        <w:rPr>
+          <w:b/>
+          <w:bCs/>
+        </w:rPr>
+        <w:t xml:space="preserve">â€¢ 6.9 EstÃ¡ndares de codificaciÃ³n y buenas prÃ¡cticas:</w:t>
+      </w:r>
+      <w:r>
+        <w:t xml:space="preserve"> GuÃ­as institucionales de estilo de cÃ³digo, convenciones de nomenclatura y estructura de proyectos.</w:t>
+      </w:r>
+    </w:p>
+    <w:p>
+      <w:r>
+        <w:rPr>
+          <w:b/>
+          <w:bCs/>
+        </w:rPr>
+        <w:t xml:space="preserve">â€¢ 6.10 Calidad incorporada y revisiÃ³n entre pares:</w:t>
+      </w:r>
+      <w:r>
+        <w:t xml:space="preserve"> Revisiones cruzadas (peer reviews) en GitLab para cambios crÃ­ticos y validaciones funcionales antes de producciÃ³n.</w:t>
+      </w:r>
+    </w:p>
+    <w:p>
+      <w:r>
+        <w:rPr>
+          <w:b/>
+          <w:bCs/>
+        </w:rPr>
+        <w:t xml:space="preserve">â€¢ 6.11 Seguridad desde el anÃ¡lisis (Security by Design):</w:t>
+      </w:r>
+      <w:r>
+        <w:t xml:space="preserve"> ProtecciÃ³n de datos, autenticaciÃ³n, gestiÃ³n de permisos y tratamiento seguro de credenciales.</w:t>
       </w:r>
     </w:p>
     <w:p/>
@@ -1327,55 +1324,55 @@
           <w:b/>
           <w:bCs/>
         </w:rPr>
-        <w:t xml:space="preserve">EJE IV: Gestión de Proyectos, Articulación Institucional y Control de Proveedores</w:t>
-      </w:r>
-    </w:p>
-    <w:p>
-      <w:r>
-        <w:rPr>
-          <w:b/>
-          <w:bCs/>
-        </w:rPr>
-        <w:t xml:space="preserve">• 6.12 Relevamiento integral y viabilidad:</w:t>
-      </w:r>
-      <w:r>
-        <w:t xml:space="preserve"> Análisis de factibilidad técnica e impacto institucional antes de autorizar un desarrollo.</w:t>
-      </w:r>
-    </w:p>
-    <w:p>
-      <w:r>
-        <w:rPr>
-          <w:b/>
-          <w:bCs/>
-        </w:rPr>
-        <w:t xml:space="preserve">• 6.13 Priorización objetiva de demandas:</w:t>
-      </w:r>
-      <w:r>
-        <w:t xml:space="preserve"> Asignación de recursos basada en criticidad, urgencia, normativas y capacidad real.</w:t>
-      </w:r>
-    </w:p>
-    <w:p>
-      <w:r>
-        <w:rPr>
-          <w:b/>
-          <w:bCs/>
-        </w:rPr>
-        <w:t xml:space="preserve">• 6.14 Gobierno técnico de proveedores externos:</w:t>
-      </w:r>
-      <w:r>
-        <w:t xml:space="preserve"> Auditoría de entregables, exigencia de código fuente, documentación y pruebas de recepción validadas por el Municipio.</w:t>
-      </w:r>
-    </w:p>
-    <w:p>
-      <w:r>
-        <w:rPr>
-          <w:b/>
-          <w:bCs/>
-        </w:rPr>
-        <w:t xml:space="preserve">• 6.15 Gestión de la relación con las áreas usuarias:</w:t>
-      </w:r>
-      <w:r>
-        <w:t xml:space="preserve"> Fortalecimiento del rol de la Jefatura como nexo institucional con las Secretarías solicitantes mediante entrevistas funcionales, priorización conjunta, validaciones parciales y gestión compartida de expectativas.</w:t>
+        <w:t xml:space="preserve">EJE IV: GestiÃ³n de Proyectos, ArticulaciÃ³n Institucional y Control de Proveedores</w:t>
+      </w:r>
+    </w:p>
+    <w:p>
+      <w:r>
+        <w:rPr>
+          <w:b/>
+          <w:bCs/>
+        </w:rPr>
+        <w:t xml:space="preserve">â€¢ 6.12 Relevamiento integral y viabilidad:</w:t>
+      </w:r>
+      <w:r>
+        <w:t xml:space="preserve"> AnÃ¡lisis de factibilidad tÃ©cnica e impacto institucional antes de autorizar un desarrollo.</w:t>
+      </w:r>
+    </w:p>
+    <w:p>
+      <w:r>
+        <w:rPr>
+          <w:b/>
+          <w:bCs/>
+        </w:rPr>
+        <w:t xml:space="preserve">â€¢ 6.13 PriorizaciÃ³n objetiva de demandas:</w:t>
+      </w:r>
+      <w:r>
+        <w:t xml:space="preserve"> AsignaciÃ³n de recursos basada en criticidad, urgencia, normativas y capacidad real.</w:t>
+      </w:r>
+    </w:p>
+    <w:p>
+      <w:r>
+        <w:rPr>
+          <w:b/>
+          <w:bCs/>
+        </w:rPr>
+        <w:t xml:space="preserve">â€¢ 6.14 Gobierno tÃ©cnico de proveedores externos:</w:t>
+      </w:r>
+      <w:r>
+        <w:t xml:space="preserve"> AuditorÃ­a de entregables, exigencia de cÃ³digo fuente, documentaciÃ³n y pruebas de recepciÃ³n validadas por el Municipio.</w:t>
+      </w:r>
+    </w:p>
+    <w:p>
+      <w:r>
+        <w:rPr>
+          <w:b/>
+          <w:bCs/>
+        </w:rPr>
+        <w:t xml:space="preserve">â€¢ 6.15 GestiÃ³n de la relaciÃ³n con las Ã¡reas usuarias:</w:t>
+      </w:r>
+      <w:r>
+        <w:t xml:space="preserve"> Fortalecimiento del rol de la Jefatura como nexo institucional con las SecretarÃ­as solicitantes mediante entrevistas funcionales, priorizaciÃ³n conjunta, validaciones parciales y gestiÃ³n compartida de expectativas.</w:t>
       </w:r>
     </w:p>
     <w:p/>
@@ -1388,43 +1385,43 @@
           <w:b/>
           <w:bCs/>
         </w:rPr>
-        <w:t xml:space="preserve">EJE V: Innovación Tecnológica Responsable e Inteligencia Artificial</w:t>
-      </w:r>
-    </w:p>
-    <w:p>
-      <w:r>
-        <w:rPr>
-          <w:b/>
-          <w:bCs/>
-        </w:rPr>
-        <w:t xml:space="preserve">• 6.16 Pautas de seguridad para asistentes de IA:</w:t>
-      </w:r>
-      <w:r>
-        <w:t xml:space="preserve"> Guía de uso responsable de herramientas asistidas por IA como apoyo a la programación y documentación, prohibiendo estrictamente la carga de credenciales, claves de bases de datos o datos personales de ciudadanos en plataformas públicas.</w:t>
-      </w:r>
-    </w:p>
-    <w:p>
-      <w:r>
-        <w:rPr>
-          <w:b/>
-          <w:bCs/>
-        </w:rPr>
-        <w:t xml:space="preserve">• 6.17 Contenerización y modernización progresiva:</w:t>
-      </w:r>
-      <w:r>
-        <w:t xml:space="preserve"> Introducción gradual de paquetes estandarizados (Docker) en sinergia con el área de Infraestructura/Redes para simplificar los despliegues.</w:t>
-      </w:r>
-    </w:p>
-    <w:p>
-      <w:r>
-        <w:rPr>
-          <w:b/>
-          <w:bCs/>
-        </w:rPr>
-        <w:t xml:space="preserve">• 6.18 Evaluación de licencias corporativas e innovación:</w:t>
-      </w:r>
-      <w:r>
-        <w:t xml:space="preserve"> Análisis fundamentado de la incorporación futura de herramientas avanzadas según el valor real aportado al Municipio.</w:t>
+        <w:t xml:space="preserve">EJE V: InnovaciÃ³n TecnolÃ³gica Responsable e Inteligencia Artificial</w:t>
+      </w:r>
+    </w:p>
+    <w:p>
+      <w:r>
+        <w:rPr>
+          <w:b/>
+          <w:bCs/>
+        </w:rPr>
+        <w:t xml:space="preserve">â€¢ 6.16 Pautas de seguridad para asistentes de IA:</w:t>
+      </w:r>
+      <w:r>
+        <w:t xml:space="preserve"> GuÃ­a de uso responsable de herramientas asistidas por IA como apoyo a la programaciÃ³n y documentaciÃ³n, prohibiendo estrictamente la carga de credenciales, claves de bases de datos o datos personales de ciudadanos en plataformas pÃºblicas.</w:t>
+      </w:r>
+    </w:p>
+    <w:p>
+      <w:r>
+        <w:rPr>
+          <w:b/>
+          <w:bCs/>
+        </w:rPr>
+        <w:t xml:space="preserve">â€¢ 6.17 ContenerizaciÃ³n y modernizaciÃ³n progresiva:</w:t>
+      </w:r>
+      <w:r>
+        <w:t xml:space="preserve"> IntroducciÃ³n gradual de paquetes estandarizados (Docker) en sinergia con el Ã¡rea de Infraestructura/Redes para simplificar los despliegues.</w:t>
+      </w:r>
+    </w:p>
+    <w:p>
+      <w:r>
+        <w:rPr>
+          <w:b/>
+          <w:bCs/>
+        </w:rPr>
+        <w:t xml:space="preserve">â€¢ 6.18 EvaluaciÃ³n de licencias corporativas e innovaciÃ³n:</w:t>
+      </w:r>
+      <w:r>
+        <w:t xml:space="preserve"> AnÃ¡lisis fundamentado de la incorporaciÃ³n futura de herramientas avanzadas segÃºn el valor real aportado al Municipio.</w:t>
       </w:r>
     </w:p>
     <w:p/>
@@ -1437,16 +1434,16 @@
           <w:b/>
           <w:bCs/>
         </w:rPr>
-        <w:t xml:space="preserve">7. PROPUESTA DE MEJORA Y OPTIMIZACIÓN DE RECURSOS</w:t>
-      </w:r>
-    </w:p>
-    <w:p>
-      <w:r>
-        <w:rPr>
-          <w:i/>
-          <w:iCs/>
-        </w:rPr>
-        <w:t xml:space="preserve">La primera responsabilidad de una Jefatura consiste en optimizar los recursos existentes antes de requerir nuevas incorporaciones presupuestarias. En consecuencia, las acciones propuestas en esta etapa priorizan la reorganización del trabajo, la mejora de los procedimientos y el fortalecimiento de la coordinación interna, aprovechando la infraestructura y el capital humano actualmente disponibles.</w:t>
+        <w:t xml:space="preserve">7. PROPUESTA DE MEJORA Y OPTIMIZACIÃ“N DE RECURSOS</w:t>
+      </w:r>
+    </w:p>
+    <w:p>
+      <w:r>
+        <w:rPr>
+          <w:i/>
+          <w:iCs/>
+        </w:rPr>
+        <w:t xml:space="preserve">La primera responsabilidad de una Jefatura consiste en optimizar los recursos existentes antes de requerir nuevas incorporaciones presupuestarias. En consecuencia, las acciones propuestas en esta etapa priorizan la reorganizaciÃ³n del trabajo, la mejora de los procedimientos y el fortalecimiento de la coordinaciÃ³n interna, aprovechando la infraestructura y el capital humano actualmente disponibles.</w:t>
       </w:r>
     </w:p>
     <w:p>
@@ -1467,7 +1464,7 @@
           <w:b/>
           <w:bCs/>
         </w:rPr>
-        <w:t xml:space="preserve">1. Liderazgo Híbrido:</w:t>
+        <w:t xml:space="preserve">1. Liderazgo HÃ­brido:</w:t>
       </w:r>
       <w:r>
         <w:t xml:space="preserve"> Jefatura como Scrum Master Global (filtro de cargas entre oficinas) y Gestor.</w:t>
@@ -1479,19 +1476,19 @@
           <w:b/>
           <w:bCs/>
         </w:rPr>
-        <w:t xml:space="preserve">2. Mitigación de Puntos Únicos de Falla:</w:t>
-      </w:r>
-      <w:r>
-        <w:t xml:space="preserve"> Asignación de Referentes Secundarios en sistemas críticos.</w:t>
-      </w:r>
-    </w:p>
-    <w:p>
-      <w:r>
-        <w:rPr>
-          <w:b/>
-          <w:bCs/>
-        </w:rPr>
-        <w:t xml:space="preserve">3. Estandarización Obligatoria:</w:t>
+        <w:t xml:space="preserve">2. MitigaciÃ³n de Puntos Ãšnicos de Falla:</w:t>
+      </w:r>
+      <w:r>
+        <w:t xml:space="preserve"> AsignaciÃ³n de Referentes Secundarios en sistemas crÃ­ticos.</w:t>
+      </w:r>
+    </w:p>
+    <w:p>
+      <w:r>
+        <w:rPr>
+          <w:b/>
+          <w:bCs/>
+        </w:rPr>
+        <w:t xml:space="preserve">3. EstandarizaciÃ³n Obligatoria:</w:t>
       </w:r>
       <w:r>
         <w:t xml:space="preserve"> Uso del Template de Arquitectura Base municipal (Congelamiento Legacy).</w:t>
@@ -1506,7 +1503,7 @@
         <w:t xml:space="preserve">4. Gobernanza de Proveedores:</w:t>
       </w:r>
       <w:r>
-        <w:t xml:space="preserve"> Exigencia de código fuente, manuales y pruebas de recepción antes de la aceptación.</w:t>
+        <w:t xml:space="preserve"> Exigencia de cÃ³digo fuente, manuales y pruebas de recepciÃ³n antes de la aceptaciÃ³n.</w:t>
       </w:r>
     </w:p>
     <w:p>
@@ -1518,7 +1515,7 @@
         <w:t xml:space="preserve">5. Uso Seguro de IA:</w:t>
       </w:r>
       <w:r>
-        <w:t xml:space="preserve"> Protocolo de resguardo de datos sensibles en asistentes de código.</w:t>
+        <w:t xml:space="preserve"> Protocolo de resguardo de datos sensibles en asistentes de cÃ³digo.</w:t>
       </w:r>
     </w:p>
     <w:p/>
@@ -1543,40 +1540,40 @@
         <w:t xml:space="preserve">1. Licencias Corporativas Oficiales de IA:</w:t>
       </w:r>
       <w:r>
-        <w:t xml:space="preserve"> Adquisición de licencias para IDEs en entornos privados institucionales.</w:t>
-      </w:r>
-    </w:p>
-    <w:p>
-      <w:r>
-        <w:rPr>
-          <w:b/>
-          <w:bCs/>
-        </w:rPr>
-        <w:t xml:space="preserve">2. Plataforma de Análisis Estático de Calidad:</w:t>
-      </w:r>
-      <w:r>
-        <w:t xml:space="preserve"> Herramientas automatizadas (ej. SonarQube) para auditar deuda técnica y seguridad.</w:t>
-      </w:r>
-    </w:p>
-    <w:p>
-      <w:r>
-        <w:rPr>
-          <w:b/>
-          <w:bCs/>
-        </w:rPr>
-        <w:t xml:space="preserve">3. Contenerización e Infraestructura:</w:t>
-      </w:r>
-      <w:r>
-        <w:t xml:space="preserve"> Proyección presupuestaria para migración a contenedores Docker.</w:t>
-      </w:r>
-    </w:p>
-    <w:p>
-      <w:r>
-        <w:rPr>
-          <w:b/>
-          <w:bCs/>
-        </w:rPr>
-        <w:t xml:space="preserve">4. Capacitación Formal Externa:</w:t>
+        <w:t xml:space="preserve"> AdquisiciÃ³n de licencias para IDEs en entornos privados institucionales.</w:t>
+      </w:r>
+    </w:p>
+    <w:p>
+      <w:r>
+        <w:rPr>
+          <w:b/>
+          <w:bCs/>
+        </w:rPr>
+        <w:t xml:space="preserve">2. Plataforma de AnÃ¡lisis EstÃ¡tico de Calidad:</w:t>
+      </w:r>
+      <w:r>
+        <w:t xml:space="preserve"> Herramientas automatizadas (ej. SonarQube) para auditar deuda tÃ©cnica y seguridad.</w:t>
+      </w:r>
+    </w:p>
+    <w:p>
+      <w:r>
+        <w:rPr>
+          <w:b/>
+          <w:bCs/>
+        </w:rPr>
+        <w:t xml:space="preserve">3. ContenerizaciÃ³n e Infraestructura:</w:t>
+      </w:r>
+      <w:r>
+        <w:t xml:space="preserve"> ProyecciÃ³n presupuestaria para migraciÃ³n a contenedores Docker.</w:t>
+      </w:r>
+    </w:p>
+    <w:p>
+      <w:r>
+        <w:rPr>
+          <w:b/>
+          <w:bCs/>
+        </w:rPr>
+        <w:t xml:space="preserve">4. CapacitaciÃ³n Formal Externa:</w:t>
       </w:r>
       <w:r>
         <w:t xml:space="preserve"> Cursos profesionales en Clean Architecture, APIs y Microservicios.</w:t>
@@ -1591,7 +1588,7 @@
         <w:t xml:space="preserve">5. Equipamiento para Trabajo Colaborativo:</w:t>
       </w:r>
       <w:r>
-        <w:t xml:space="preserve"> Provisión de webcams y auriculares con micrófono para puestos de trabajo.</w:t>
+        <w:t xml:space="preserve"> ProvisiÃ³n de webcams y auriculares con micrÃ³fono para puestos de trabajo.</w:t>
       </w:r>
     </w:p>
     <w:p/>
@@ -1604,7 +1601,7 @@
           <w:b/>
           <w:bCs/>
         </w:rPr>
-        <w:t xml:space="preserve">8. ESTRATEGIA DE IMPLEMENTACIÓN Y ROADMAP POR ETAPAS</w:t>
+        <w:t xml:space="preserve">8. ESTRATEGIA DE IMPLEMENTACIÃ“N Y ROADMAP POR ETAPAS</w:t>
       </w:r>
     </w:p>
     <w:p>
@@ -1616,55 +1613,55 @@
           <w:b/>
           <w:bCs/>
         </w:rPr>
-        <w:t xml:space="preserve">8.1 Fases de la Hoja de Ruta Ágil</w:t>
-      </w:r>
-    </w:p>
-    <w:p>
-      <w:r>
-        <w:rPr>
-          <w:b/>
-          <w:bCs/>
-        </w:rPr>
-        <w:t xml:space="preserve">Etapa I – Conocer y Ordenar (Sprints 1 a 4):</w:t>
-      </w:r>
-      <w:r>
-        <w:t xml:space="preserve"> Relevamiento de competencias, inventario de sistemas, conformación de la Cartera Única en Redmine y asignación de Referentes Secundarios.</w:t>
-      </w:r>
-    </w:p>
-    <w:p>
-      <w:r>
-        <w:rPr>
-          <w:b/>
-          <w:bCs/>
-        </w:rPr>
-        <w:t xml:space="preserve">Etapa II – Integrar y Estandarizar (Sprints 5 a 12):</w:t>
-      </w:r>
-      <w:r>
-        <w:t xml:space="preserve"> Reuniones transversales inter-oficinas, difusión de guías de buenas prácticas, obligatoriedad del template de arquitectura y gobierno técnico de proveedores.</w:t>
-      </w:r>
-    </w:p>
-    <w:p>
-      <w:r>
-        <w:rPr>
-          <w:b/>
-          <w:bCs/>
-        </w:rPr>
-        <w:t xml:space="preserve">Etapa III – Consolidar y Evaluar (Sprints 13+):</w:t>
-      </w:r>
-      <w:r>
-        <w:t xml:space="preserve"> Medición de KPIs, revisiones de código en GitLab y proyectos de dockerización.</w:t>
-      </w:r>
-    </w:p>
-    <w:p>
-      <w:r>
-        <w:rPr>
-          <w:b/>
-          <w:bCs/>
-        </w:rPr>
-        <w:t xml:space="preserve">Proceso Permanente – Mejora Continua:</w:t>
-      </w:r>
-      <w:r>
-        <w:t xml:space="preserve"> Auditorías periódicas de procedimientos, actualización de capacitaciones y evaluación de innovaciones.</w:t>
+        <w:t xml:space="preserve">8.1 Fases de la Hoja de Ruta Ãgil</w:t>
+      </w:r>
+    </w:p>
+    <w:p>
+      <w:r>
+        <w:rPr>
+          <w:b/>
+          <w:bCs/>
+        </w:rPr>
+        <w:t xml:space="preserve">Etapa I â€“ Conocer y Ordenar (Sprints 1 a 4):</w:t>
+      </w:r>
+      <w:r>
+        <w:t xml:space="preserve"> Relevamiento de competencias, inventario de sistemas, conformaciÃ³n de la Cartera Ãšnica en Redmine y asignaciÃ³n de Referentes Secundarios.</w:t>
+      </w:r>
+    </w:p>
+    <w:p>
+      <w:r>
+        <w:rPr>
+          <w:b/>
+          <w:bCs/>
+        </w:rPr>
+        <w:t xml:space="preserve">Etapa II â€“ Integrar y Estandarizar (Sprints 5 a 12):</w:t>
+      </w:r>
+      <w:r>
+        <w:t xml:space="preserve"> Reuniones transversales inter-oficinas, difusiÃ³n de guÃ­as de buenas prÃ¡cticas, obligatoriedad del template de arquitectura y gobierno tÃ©cnico de proveedores.</w:t>
+      </w:r>
+    </w:p>
+    <w:p>
+      <w:r>
+        <w:rPr>
+          <w:b/>
+          <w:bCs/>
+        </w:rPr>
+        <w:t xml:space="preserve">Etapa III â€“ Consolidar y Evaluar (Sprints 13+):</w:t>
+      </w:r>
+      <w:r>
+        <w:t xml:space="preserve"> MediciÃ³n de KPIs, revisiones de cÃ³digo en GitLab y proyectos de dockerizaciÃ³n.</w:t>
+      </w:r>
+    </w:p>
+    <w:p>
+      <w:r>
+        <w:rPr>
+          <w:b/>
+          <w:bCs/>
+        </w:rPr>
+        <w:t xml:space="preserve">Proceso Permanente â€“ Mejora Continua:</w:t>
+      </w:r>
+      <w:r>
+        <w:t xml:space="preserve"> AuditorÃ­as periÃ³dicas de procedimientos, actualizaciÃ³n de capacitaciones y evaluaciÃ³n de innovaciones.</w:t>
       </w:r>
     </w:p>
     <w:p/>
@@ -1677,7 +1674,7 @@
           <w:b/>
           <w:bCs/>
         </w:rPr>
-        <w:t xml:space="preserve">8.2 Cuadro Resumen de Implementación</w:t>
+        <w:t xml:space="preserve">8.2 Cuadro Resumen de ImplementaciÃ³n</w:t>
       </w:r>
     </w:p>
     <w:tbl>
@@ -1736,7 +1733,7 @@
         <w:tc>
           <w:p>
             <w:r>
-              <w:t xml:space="preserve">Organización (Etapa I)</w:t>
+              <w:t xml:space="preserve">OrganizaciÃ³n (Etapa I)</w:t>
             </w:r>
           </w:p>
         </w:tc>
@@ -1759,7 +1756,7 @@
         <w:tc>
           <w:p>
             <w:r>
-              <w:t xml:space="preserve">Estandarización (Etapa II)</w:t>
+              <w:t xml:space="preserve">EstandarizaciÃ³n (Etapa II)</w:t>
             </w:r>
           </w:p>
         </w:tc>
@@ -1773,7 +1770,7 @@
         <w:tc>
           <w:p>
             <w:r>
-              <w:t xml:space="preserve">Procesos homogéneos y guías instituidas</w:t>
+              <w:t xml:space="preserve">Procesos homogÃ©neos y guÃ­as instituidas</w:t>
             </w:r>
           </w:p>
         </w:tc>
@@ -1782,7 +1779,7 @@
         <w:tc>
           <w:p>
             <w:r>
-              <w:t xml:space="preserve">Consolidación (Etapa III)</w:t>
+              <w:t xml:space="preserve">ConsolidaciÃ³n (Etapa III)</w:t>
             </w:r>
           </w:p>
         </w:tc>
@@ -1805,14 +1802,14 @@
         <w:tc>
           <w:p>
             <w:r>
-              <w:t xml:space="preserve">Innovación (Permanente)</w:t>
-            </w:r>
-          </w:p>
-        </w:tc>
-        <w:tc>
-          <w:p>
-            <w:r>
-              <w:t xml:space="preserve">Evolución tecnológica y adopción de IA</w:t>
+              <w:t xml:space="preserve">InnovaciÃ³n (Permanente)</w:t>
+            </w:r>
+          </w:p>
+        </w:tc>
+        <w:tc>
+          <w:p>
+            <w:r>
+              <w:t xml:space="preserve">EvoluciÃ³n tecnolÃ³gica y adopciÃ³n de IA</w:t>
             </w:r>
           </w:p>
         </w:tc>
@@ -1835,7 +1832,7 @@
           <w:b/>
           <w:bCs/>
         </w:rPr>
-        <w:t xml:space="preserve">9. MATRIZ DE INDICADORES DE EVALUACIÓN Y GESTIÓN (KPIs)</w:t>
+        <w:t xml:space="preserve">9. MATRIZ DE INDICADORES DE EVALUACIÃ“N Y GESTIÃ“N (KPIs)</w:t>
       </w:r>
     </w:p>
     <w:tbl>
@@ -1863,7 +1860,7 @@
                 <w:b/>
                 <w:bCs/>
               </w:rPr>
-              <w:t xml:space="preserve">Categoría</w:t>
+              <w:t xml:space="preserve">CategorÃ­a</w:t>
             </w:r>
           </w:p>
         </w:tc>
@@ -1874,7 +1871,7 @@
                 <w:b/>
                 <w:bCs/>
               </w:rPr>
-              <w:t xml:space="preserve">Indicador de Gestión</w:t>
+              <w:t xml:space="preserve">Indicador de GestiÃ³n</w:t>
             </w:r>
           </w:p>
         </w:tc>
@@ -1885,7 +1882,7 @@
                 <w:b/>
                 <w:bCs/>
               </w:rPr>
-              <w:t xml:space="preserve">Objetivo Estratégico</w:t>
+              <w:t xml:space="preserve">Objetivo EstratÃ©gico</w:t>
             </w:r>
           </w:p>
         </w:tc>
@@ -1901,7 +1898,7 @@
         <w:tc>
           <w:p>
             <w:r>
-              <w:t xml:space="preserve">% de Sistemas Críticos con Referente Secundario Asignado</w:t>
+              <w:t xml:space="preserve">% de Sistemas CrÃ­ticos con Referente Secundario Asignado</w:t>
             </w:r>
           </w:p>
         </w:tc>
@@ -1917,21 +1914,21 @@
         <w:tc>
           <w:p>
             <w:r>
-              <w:t xml:space="preserve">Documentación</w:t>
-            </w:r>
-          </w:p>
-        </w:tc>
-        <w:tc>
-          <w:p>
-            <w:r>
-              <w:t xml:space="preserve">% de Sistemas con Documentación Mínima Útil</w:t>
-            </w:r>
-          </w:p>
-        </w:tc>
-        <w:tc>
-          <w:p>
-            <w:r>
-              <w:t xml:space="preserve">Garantizar la retención y transferencia del conocimiento.</w:t>
+              <w:t xml:space="preserve">DocumentaciÃ³n</w:t>
+            </w:r>
+          </w:p>
+        </w:tc>
+        <w:tc>
+          <w:p>
+            <w:r>
+              <w:t xml:space="preserve">% de Sistemas con DocumentaciÃ³n MÃ­nima Ãštil</w:t>
+            </w:r>
+          </w:p>
+        </w:tc>
+        <w:tc>
+          <w:p>
+            <w:r>
+              <w:t xml:space="preserve">Garantizar la retenciÃ³n y transferencia del conocimiento.</w:t>
             </w:r>
           </w:p>
         </w:tc>
@@ -1940,7 +1937,7 @@
         <w:tc>
           <w:p>
             <w:r>
-              <w:t xml:space="preserve">Estandarización</w:t>
+              <w:t xml:space="preserve">EstandarizaciÃ³n</w:t>
             </w:r>
           </w:p>
         </w:tc>
@@ -1954,7 +1951,7 @@
         <w:tc>
           <w:p>
             <w:r>
-              <w:t xml:space="preserve">Garantizar código homogéneo, mantenible y escalable.</w:t>
+              <w:t xml:space="preserve">Garantizar cÃ³digo homogÃ©neo, mantenible y escalable.</w:t>
             </w:r>
           </w:p>
         </w:tc>
@@ -1970,14 +1967,14 @@
         <w:tc>
           <w:p>
             <w:r>
-              <w:t xml:space="preserve">Lead Time de Desarrollo (Solicitud → Puesta en Producción)</w:t>
-            </w:r>
-          </w:p>
-        </w:tc>
-        <w:tc>
-          <w:p>
-            <w:r>
-              <w:t xml:space="preserve">Reducir tiempos de entrega mediante priorización ágil.</w:t>
+              <w:t xml:space="preserve">Lead Time de Desarrollo (Solicitud â†’ Puesta en ProducciÃ³n)</w:t>
+            </w:r>
+          </w:p>
+        </w:tc>
+        <w:tc>
+          <w:p>
+            <w:r>
+              <w:t xml:space="preserve">Reducir tiempos de entrega mediante priorizaciÃ³n Ã¡gil.</w:t>
             </w:r>
           </w:p>
         </w:tc>
@@ -1993,14 +1990,14 @@
         <w:tc>
           <w:p>
             <w:r>
-              <w:t xml:space="preserve">Tasa de Defectos Reportados en Post-Producción</w:t>
-            </w:r>
-          </w:p>
-        </w:tc>
-        <w:tc>
-          <w:p>
-            <w:r>
-              <w:t xml:space="preserve">Minimizar fallas mediante buenas prácticas y peer review.</w:t>
+              <w:t xml:space="preserve">Tasa de Defectos Reportados en Post-ProducciÃ³n</w:t>
+            </w:r>
+          </w:p>
+        </w:tc>
+        <w:tc>
+          <w:p>
+            <w:r>
+              <w:t xml:space="preserve">Minimizar fallas mediante buenas prÃ¡cticas y peer review.</w:t>
             </w:r>
           </w:p>
         </w:tc>
@@ -2016,14 +2013,14 @@
         <w:tc>
           <w:p>
             <w:r>
-              <w:t xml:space="preserve">% de Desarrollos Externos con Recepción Técnica Aprobada</w:t>
-            </w:r>
-          </w:p>
-        </w:tc>
-        <w:tc>
-          <w:p>
-            <w:r>
-              <w:t xml:space="preserve">Asegurar entrega de código fuente y soberanía técnica.</w:t>
+              <w:t xml:space="preserve">% de Desarrollos Externos con RecepciÃ³n TÃ©cnica Aprobada</w:t>
+            </w:r>
+          </w:p>
+        </w:tc>
+        <w:tc>
+          <w:p>
+            <w:r>
+              <w:t xml:space="preserve">Asegurar entrega de cÃ³digo fuente y soberanÃ­a tÃ©cnica.</w:t>
             </w:r>
           </w:p>
         </w:tc>
@@ -2039,24 +2036,24 @@
           <w:b/>
           <w:bCs/>
         </w:rPr>
-        <w:t xml:space="preserve">10. SECTORES DEL DEPARTAMENTO (MATRIZ DINÁMICA DE TRABAJO)</w:t>
-      </w:r>
-    </w:p>
-    <w:p>
-      <w:r>
-        <w:t xml:space="preserve">Aprovechando la estructura vigente del Grupo Ocupacional Computación (Decreto N° 2250/98) sin solicitar nuevos cargos en el escalafón:</w:t>
-      </w:r>
-    </w:p>
-    <w:p>
-      <w:r>
-        <w:rPr>
-          <w:b/>
-          <w:bCs/>
-        </w:rPr>
-        <w:t xml:space="preserve">1. Liderazgo Técnico y Arquitectura (Analistas y Especialistas Senior - Clase XI):</w:t>
-      </w:r>
-      <w:r>
-        <w:t xml:space="preserve"> Diseño de arquitectura base, análisis funcional complejo, mentoría en capacitación cruzada y supervisión de estándares.</w:t>
+        <w:t xml:space="preserve">10. SECTORES DEL DEPARTAMENTO (MATRIZ DINÃMICA DE TRABAJO)</w:t>
+      </w:r>
+    </w:p>
+    <w:p>
+      <w:r>
+        <w:t xml:space="preserve">Aprovechando la estructura vigente del Grupo Ocupacional ComputaciÃ³n (Decreto NÂ° 2250/98) sin solicitar nuevos cargos en el escalafÃ³n:</w:t>
+      </w:r>
+    </w:p>
+    <w:p>
+      <w:r>
+        <w:rPr>
+          <w:b/>
+          <w:bCs/>
+        </w:rPr>
+        <w:t xml:space="preserve">1. Liderazgo TÃ©cnico y Arquitectura (Analistas y Especialistas Senior - Clase XI):</w:t>
+      </w:r>
+      <w:r>
+        <w:t xml:space="preserve"> DiseÃ±o de arquitectura base, anÃ¡lisis funcional complejo, mentorÃ­a en capacitaciÃ³n cruzada y supervisiÃ³n de estÃ¡ndares.</w:t>
       </w:r>
     </w:p>
     <w:p>
@@ -2068,19 +2065,19 @@
         <w:t xml:space="preserve">2. Desarrollo Funcional (Analistas Programadores Semi-Senior y Programadores - Clases X e IX):</w:t>
       </w:r>
       <w:r>
-        <w:t xml:space="preserve"> Codificación de lógica de negocio, construcción de interfaces y solución de incidencias bajo las guías de estilo.</w:t>
-      </w:r>
-    </w:p>
-    <w:p>
-      <w:r>
-        <w:rPr>
-          <w:b/>
-          <w:bCs/>
-        </w:rPr>
-        <w:t xml:space="preserve">3. Innovación, Integración y Transferencia (Roles Transversales Rotativos):</w:t>
-      </w:r>
-      <w:r>
-        <w:t xml:space="preserve"> Asignaciones dinámicas para acompañar como Referentes Secundarios, investigar integraciones y empaquetar software en contenedores.</w:t>
+        <w:t xml:space="preserve"> CodificaciÃ³n de lÃ³gica de negocio, construcciÃ³n de interfaces y soluciÃ³n de incidencias bajo las guÃ­as de estilo.</w:t>
+      </w:r>
+    </w:p>
+    <w:p>
+      <w:r>
+        <w:rPr>
+          <w:b/>
+          <w:bCs/>
+        </w:rPr>
+        <w:t xml:space="preserve">3. InnovaciÃ³n, IntegraciÃ³n y Transferencia (Roles Transversales Rotativos):</w:t>
+      </w:r>
+      <w:r>
+        <w:t xml:space="preserve"> Asignaciones dinÃ¡micas para acompaÃ±ar como Referentes Secundarios, investigar integraciones y empaquetar software en contenedores.</w:t>
       </w:r>
     </w:p>
     <w:p/>
@@ -2093,27 +2090,27 @@
           <w:b/>
           <w:bCs/>
         </w:rPr>
-        <w:t xml:space="preserve">11. CONCLUSIONES</w:t>
-      </w:r>
-    </w:p>
-    <w:p>
-      <w:r>
-        <w:t xml:space="preserve">La modernización tecnológica de la Municipalidad de General Pueyrredon requiere un Departamento de Software ordenado, previsible y sostenible, capaz de trascender a las personas y a los cambios de gestión política.</w:t>
-      </w:r>
-    </w:p>
-    <w:p>
-      <w:r>
-        <w:t xml:space="preserve">Al implementar un marco de agilidad adaptativa con la Jefatura en un rol activo de Scrum Master Global y Gestor, establecer el uso obligatorio de la arquitectura base municipal, instituir la figura de los Referentes Secundarios y aplicar un estricto Gobierno Técnico sobre Proveedores, se resuelven los problemas históricos de desarticulación, multitarea caótica y conocimiento concentrado.</w:t>
-      </w:r>
-    </w:p>
-    <w:p>
-      <w:r>
-        <w:t xml:space="preserve">Esta propuesta nace desde adentro del Departamento: no es una visión externa de lo que debería mejorarse, sino el resultado del conocimiento acumulado en el trabajo cotidiano, en el análisis de sus procesos y en la identificación concreta de lo que frena el desarrollo institucional del área. Por eso sus iniciativas son realizables, sus tiempos son reales y sus resultados son medibles.</w:t>
-      </w:r>
-    </w:p>
-    <w:p>
-      <w:r>
-        <w:t xml:space="preserve">La tecnología es una herramienta al servicio de la gestión pública. El verdadero desafío del Departamento no consiste únicamente en desarrollar software, sino en aportar soluciones que mejoren la eficiencia administrativa, fortalezcan la continuidad institucional y generen valor para toda la ciudadanía. Ese será el criterio rector de la gestión.</w:t>
+        <w:t xml:space="preserve">10. CONCLUSIONES</w:t>
+      </w:r>
+    </w:p>
+    <w:p>
+      <w:r>
+        <w:t xml:space="preserve">La modernizaciÃ³n tecnolÃ³gica de la Municipalidad de General Pueyrredon requiere un Departamento de Software ordenado, previsible y sostenible, capaz de trascender a las personas y a los cambios de gestiÃ³n polÃ­tica.</w:t>
+      </w:r>
+    </w:p>
+    <w:p>
+      <w:r>
+        <w:t xml:space="preserve">Al implementar un marco de agilidad adaptativa con la Jefatura en un rol activo de Scrum Master Global y Gestor, establecer el uso obligatorio de la arquitectura base municipal, instituir la figura de los Referentes Secundarios y aplicar un estricto Gobierno TÃ©cnico sobre Proveedores, se resuelven los problemas histÃ³ricos de desarticulaciÃ³n, multitarea caÃ³tica y conocimiento concentrado.</w:t>
+      </w:r>
+    </w:p>
+    <w:p>
+      <w:r>
+        <w:t xml:space="preserve">Esta propuesta nace desde adentro del Departamento: no es una visiÃ³n externa de lo que deberÃ­a mejorarse, sino el resultado del conocimiento acumulado en el trabajo cotidiano, en el anÃ¡lisis de sus procesos y en la identificaciÃ³n concreta de lo que frena el desarrollo institucional del Ã¡rea. Por eso sus iniciativas son realizables, sus tiempos son reales y sus resultados son medibles.</w:t>
+      </w:r>
+    </w:p>
+    <w:p>
+      <w:r>
+        <w:t xml:space="preserve">La tecnologÃ­a es una herramienta al servicio de la gestiÃ³n pÃºblica. El verdadero desafÃ­o del Departamento no consiste Ãºnicamente en desarrollar software, sino en aportar soluciones que mejoren la eficiencia administrativa, fortalezcan la continuidad institucional y generen valor para toda la ciudadanÃ­a. Ese serÃ¡ el criterio rector de la gestiÃ³n.</w:t>
       </w:r>
     </w:p>
     <w:sectPr>

</xml_diff>

<commit_message>
Restaura estilo de encabezados original en Secciones 1, 8, 9 y 10, manteniendo desarrollo del Cap. 5 y correlación 5.x, 6.x, 7.x
</commit_message>
<xml_diff>
--- a/Plan_Trabajo_Jefatura_Software_Version_Director.docx
+++ b/Plan_Trabajo_Jefatura_Software_Version_Director.docx
@@ -649,7 +649,7 @@
         <w:t xml:space="preserve">• Requerimientos normativos e imprevistos de gestión: </w:t>
       </w:r>
       <w:r>
-        <w:t xml:space="preserve">El surgimiento de necesidades imprevistas derivadas de cambios normativos o resoluciones urgentes puede forzar la reorganización del cronograma establecido.</w:t>
+        <w:t xml:space="preserve">El surgimiento de necesidades imprevistas derivadas de cambios normativos o resoluciones urgentes puede forzar la reorganización del cronograma established.</w:t>
       </w:r>
     </w:p>
     <w:p>
@@ -1759,18 +1759,6 @@
         <w:t xml:space="preserve">8. MATRIZ DE INDICADORES DE EVALUACIÓN Y GESTIÓN (KPIs)</w:t>
       </w:r>
     </w:p>
-    <w:p>
-      <w:pPr>
-        <w:pStyle w:val="Heading2"/>
-      </w:pPr>
-      <w:r>
-        <w:rPr>
-          <w:b/>
-          <w:bCs/>
-        </w:rPr>
-        <w:t xml:space="preserve">8.1 Indicadores Clave de Gestión</w:t>
-      </w:r>
-    </w:p>
     <w:tbl>
       <w:tblPr>
         <w:tblW w:type="pct" w:w="100%"/>
@@ -2009,18 +1997,6 @@
       </w:r>
     </w:p>
     <w:p>
-      <w:pPr>
-        <w:pStyle w:val="Heading2"/>
-      </w:pPr>
-      <w:r>
-        <w:rPr>
-          <w:b/>
-          <w:bCs/>
-        </w:rPr>
-        <w:t xml:space="preserve">9.1 Organización Funcional según Decreto N° 2250/98</w:t>
-      </w:r>
-    </w:p>
-    <w:p>
       <w:r>
         <w:t xml:space="preserve">Aprovechando la estructura vigente del Grupo Ocupacional Computación (Decreto N° 2250/98) sin solicitar nuevos cargos en el escalafón:</w:t>
       </w:r>
@@ -2072,18 +2048,6 @@
           <w:bCs/>
         </w:rPr>
         <w:t xml:space="preserve">10. CONCLUSIONES</w:t>
-      </w:r>
-    </w:p>
-    <w:p>
-      <w:pPr>
-        <w:pStyle w:val="Heading2"/>
-      </w:pPr>
-      <w:r>
-        <w:rPr>
-          <w:b/>
-          <w:bCs/>
-        </w:rPr>
-        <w:t xml:space="preserve">10.1 Síntesis Final e Impacto Institucional</w:t>
       </w:r>
     </w:p>
     <w:p>

</xml_diff>

<commit_message>
Aplica estructura exacta de 13 secciones e índice del proyecto de Gabriela López manteniendo 100% nuestro contenido
</commit_message>
<xml_diff>
--- a/Plan_Trabajo_Jefatura_Software_Version_Director.docx
+++ b/Plan_Trabajo_Jefatura_Software_Version_Director.docx
@@ -70,7 +70,7 @@
           <w:sz w:val="22"/>
           <w:szCs w:val="22"/>
         </w:rPr>
-        <w:t xml:space="preserve">Cargo: Jefe de Departamento de Gestión, Desarrollo e Innovación en Sistemas de Software</w:t>
+        <w:t xml:space="preserve">CARGO: JEFE DE DEPARTAMENTO DE GESTIÓN, DESARROLLO E INNOVACIÓN EN SISTEMAS DE SOFTWARE</w:t>
       </w:r>
     </w:p>
     <w:p>
@@ -84,7 +84,7 @@
           <w:sz w:val="20"/>
           <w:szCs w:val="20"/>
         </w:rPr>
-        <w:t xml:space="preserve">C.F. 1-31-00-01 – Nº de Orden 6733</w:t>
+        <w:t xml:space="preserve">C.F. 1-31-00-01 | N° de Orden 6733</w:t>
       </w:r>
     </w:p>
     <w:p/>
@@ -151,7 +151,7 @@
           <w:b/>
           <w:bCs/>
         </w:rPr>
-        <w:t xml:space="preserve">Cargo actual: </w:t>
+        <w:t xml:space="preserve">Cargo Actual: </w:t>
       </w:r>
       <w:r>
         <w:t xml:space="preserve">Analista Programador / Personal de Software</w:t>
@@ -163,7 +163,7 @@
           <w:b/>
           <w:bCs/>
         </w:rPr>
-        <w:t xml:space="preserve">Legajo: </w:t>
+        <w:t xml:space="preserve">Legajo N°: </w:t>
       </w:r>
       <w:r>
         <w:t xml:space="preserve">[Completar Legajo]</w:t>
@@ -179,7 +179,165 @@
           <w:i/>
           <w:iCs/>
         </w:rPr>
-        <w:t xml:space="preserve">Mar del Plata – Julio 2026</w:t>
+        <w:t xml:space="preserve">Mar del Plata, Julio de 2026</w:t>
+      </w:r>
+    </w:p>
+    <w:p/>
+    <w:p>
+      <w:pPr>
+        <w:pStyle w:val="Heading2"/>
+      </w:pPr>
+      <w:r>
+        <w:rPr>
+          <w:b/>
+          <w:bCs/>
+        </w:rPr>
+        <w:t xml:space="preserve">Índice</w:t>
+      </w:r>
+    </w:p>
+    <w:p>
+      <w:r>
+        <w:t xml:space="preserve">1. Introducción y fundamentación</w:t>
+      </w:r>
+    </w:p>
+    <w:p>
+      <w:r>
+        <w:t xml:space="preserve">2. Diagnóstico integral</w:t>
+      </w:r>
+    </w:p>
+    <w:p>
+      <w:r>
+        <w:t xml:space="preserve">   2.1. Situación actual del Departamento</w:t>
+      </w:r>
+    </w:p>
+    <w:p>
+      <w:r>
+        <w:t xml:space="preserve">   2.2. Análisis FODA</w:t>
+      </w:r>
+    </w:p>
+    <w:p>
+      <w:r>
+        <w:t xml:space="preserve">   2.3. Conclusión del diagnóstico</w:t>
+      </w:r>
+    </w:p>
+    <w:p>
+      <w:r>
+        <w:t xml:space="preserve">3. Objetivos</w:t>
+      </w:r>
+    </w:p>
+    <w:p>
+      <w:r>
+        <w:t xml:space="preserve">   3.1. Objetivo general</w:t>
+      </w:r>
+    </w:p>
+    <w:p>
+      <w:r>
+        <w:t xml:space="preserve">   3.2. Objetivos específicos</w:t>
+      </w:r>
+    </w:p>
+    <w:p>
+      <w:r>
+        <w:t xml:space="preserve">4. Eje I – Personas, motivación y desarrollo del equipo</w:t>
+      </w:r>
+    </w:p>
+    <w:p>
+      <w:r>
+        <w:t xml:space="preserve">   4.1. Comunicación y coordinación permanente entre dependencias</w:t>
+      </w:r>
+    </w:p>
+    <w:p>
+      <w:r>
+        <w:t xml:space="preserve">   4.2. Desarrollo de competencias y Matriz de Competencias</w:t>
+      </w:r>
+    </w:p>
+    <w:p>
+      <w:r>
+        <w:t xml:space="preserve">5. Eje II – Gestión del conocimiento y continuidad operativa</w:t>
+      </w:r>
+    </w:p>
+    <w:p>
+      <w:r>
+        <w:t xml:space="preserve">   5.1. Preservación del conocimiento e institucionalización de Referentes Secundarios (Shadowing)</w:t>
+      </w:r>
+    </w:p>
+    <w:p>
+      <w:r>
+        <w:t xml:space="preserve">   5.2. Documentación mínima y útil</w:t>
+      </w:r>
+    </w:p>
+    <w:p>
+      <w:r>
+        <w:t xml:space="preserve">6. Eje III – Modelo común de gestión y desarrollo</w:t>
+      </w:r>
+    </w:p>
+    <w:p>
+      <w:r>
+        <w:t xml:space="preserve">   6.1. Cartera Única de Proyectos y centralización en Redmine</w:t>
+      </w:r>
+    </w:p>
+    <w:p>
+      <w:r>
+        <w:t xml:space="preserve">   6.2. Modelo de Agilidad Adaptativa (Scrum Master Global / Kanban)</w:t>
+      </w:r>
+    </w:p>
+    <w:p>
+      <w:r>
+        <w:t xml:space="preserve">7. Eje IV – Arquitectura de referencia, calidad, seguridad e innovación</w:t>
+      </w:r>
+    </w:p>
+    <w:p>
+      <w:r>
+        <w:t xml:space="preserve">   7.1. Estandarización del desarrollo y consolidación de una Arquitectura Base Institucional</w:t>
+      </w:r>
+    </w:p>
+    <w:p>
+      <w:r>
+        <w:t xml:space="preserve">   7.2. Gestión de la calidad del software y fortalecimiento de la documentación institucional</w:t>
+      </w:r>
+    </w:p>
+    <w:p>
+      <w:r>
+        <w:t xml:space="preserve">   7.3. Innovación tecnológica y utilización responsable de Inteligencia Artificial</w:t>
+      </w:r>
+    </w:p>
+    <w:p>
+      <w:r>
+        <w:t xml:space="preserve">8. Eje V – Gestión de demanda y proveedores externos</w:t>
+      </w:r>
+    </w:p>
+    <w:p>
+      <w:r>
+        <w:t xml:space="preserve">   8.1. Gobierno técnico de proveedores externos</w:t>
+      </w:r>
+    </w:p>
+    <w:p>
+      <w:r>
+        <w:t xml:space="preserve">   8.2. Gestión de la relación con las áreas usuarias</w:t>
+      </w:r>
+    </w:p>
+    <w:p>
+      <w:r>
+        <w:t xml:space="preserve">9. Optimización con recursos actuales (Escenario $0)</w:t>
+      </w:r>
+    </w:p>
+    <w:p>
+      <w:r>
+        <w:t xml:space="preserve">10. Proyección con incorporación de recursos (Escenario con presupuesto)</w:t>
+      </w:r>
+    </w:p>
+    <w:p>
+      <w:r>
+        <w:t xml:space="preserve">11. Estrategia de implementación (Roadmap por etapas)</w:t>
+      </w:r>
+    </w:p>
+    <w:p>
+      <w:r>
+        <w:t xml:space="preserve">12. Indicadores de gestión y mejora continua (KPIs)</w:t>
+      </w:r>
+    </w:p>
+    <w:p>
+      <w:r>
+        <w:t xml:space="preserve">13. Sectores del Departamento y Conclusión</w:t>
       </w:r>
     </w:p>
     <w:p/>
@@ -192,7 +350,7 @@
           <w:b/>
           <w:bCs/>
         </w:rPr>
-        <w:t xml:space="preserve">1. INTRODUCCIÓN</w:t>
+        <w:t xml:space="preserve">1. Introducción y fundamentación</w:t>
       </w:r>
     </w:p>
     <w:p>
@@ -325,7 +483,7 @@
           <w:b/>
           <w:bCs/>
         </w:rPr>
-        <w:t xml:space="preserve">2. DIAGNÓSTICO INSTITUCIONAL</w:t>
+        <w:t xml:space="preserve">2. Diagnóstico integral</w:t>
       </w:r>
     </w:p>
     <w:p>
@@ -337,7 +495,7 @@
           <w:b/>
           <w:bCs/>
         </w:rPr>
-        <w:t xml:space="preserve">2.1 Situación actual del Departamento</w:t>
+        <w:t xml:space="preserve">2.1. Situación actual del Departamento</w:t>
       </w:r>
     </w:p>
     <w:p>
@@ -370,7 +528,7 @@
           <w:b/>
           <w:bCs/>
         </w:rPr>
-        <w:t xml:space="preserve">2.2 Análisis FODA</w:t>
+        <w:t xml:space="preserve">2.2. Análisis FODA</w:t>
       </w:r>
     </w:p>
     <w:p>
@@ -649,7 +807,7 @@
         <w:t xml:space="preserve">• Requerimientos normativos e imprevistos de gestión: </w:t>
       </w:r>
       <w:r>
-        <w:t xml:space="preserve">El surgimiento de necesidades imprevistas derivadas de cambios normativos o resoluciones urgentes puede forzar la reorganización del cronograma established.</w:t>
+        <w:t xml:space="preserve">El surgimiento de necesidades imprevistas derivadas de cambios normativos o resoluciones urgentes puede forzar la reorganización del cronograma establecido.</w:t>
       </w:r>
     </w:p>
     <w:p>
@@ -674,7 +832,7 @@
           <w:b/>
           <w:bCs/>
         </w:rPr>
-        <w:t xml:space="preserve">2.3 Conclusión del diagnóstico</w:t>
+        <w:t xml:space="preserve">2.3. Conclusión del diagnóstico</w:t>
       </w:r>
     </w:p>
     <w:p>
@@ -697,12 +855,7 @@
           <w:b/>
           <w:bCs/>
         </w:rPr>
-        <w:t xml:space="preserve">3. PRINCIPIOS DE GESTIÓN</w:t>
-      </w:r>
-    </w:p>
-    <w:p>
-      <w:r>
-        <w:t xml:space="preserve">El ejercicio de la Jefatura del Departamento requiere combinar capacidades técnicas con habilidades de conducción, planificación y coordinación. En consecuencia, las decisiones organizacionales y técnicas deberán sustentarse sobre principios de gestión que otorguen coherencia a las acciones del Departamento.</w:t>
+        <w:t xml:space="preserve">3. Objetivos</w:t>
       </w:r>
     </w:p>
     <w:p>
@@ -714,12 +867,12 @@
           <w:b/>
           <w:bCs/>
         </w:rPr>
-        <w:t xml:space="preserve">3.1 Liderazgo basado en la colaboración</w:t>
-      </w:r>
-    </w:p>
-    <w:p>
-      <w:r>
-        <w:t xml:space="preserve">La conducción del Departamento promoverá un ambiente de trabajo participativo, donde la comunicación, el intercambio de conocimientos y la construcción colectiva de soluciones sean parte de la cultura organizacional. La función de la Jefatura consistirá en facilitar el trabajo de los equipos, remover obstáculos, promover acuerdos y generar las condiciones necesarias para que cada integrante pueda desarrollar sus capacidades profesionales.</w:t>
+        <w:t xml:space="preserve">3.1. Objetivo general</w:t>
+      </w:r>
+    </w:p>
+    <w:p>
+      <w:r>
+        <w:t xml:space="preserve">Fortalecer la capacidad institucional del Departamento de Gestión, Desarrollo e Innovación en Sistemas de Software mediante un modelo de gestión orientado a las personas, la organización de los procesos, la estandarización técnica y la mejora continua, asegurando el desarrollo de soluciones tecnológicas sostenibles, seguras y alineadas con los objetivos estratégicos de la Municipalidad de General Pueyrredon.</w:t>
       </w:r>
     </w:p>
     <w:p>
@@ -731,12 +884,104 @@
           <w:b/>
           <w:bCs/>
         </w:rPr>
-        <w:t xml:space="preserve">3.2 Gestión orientada a procesos</w:t>
-      </w:r>
-    </w:p>
-    <w:p>
-      <w:r>
-        <w:t xml:space="preserve">El crecimiento sostenido del Departamento hace necesario reducir la dependencia de prácticas individuales y avanzar hacia procedimientos institucionales homogéneos. Toda actividad recurrente deberá encontrarse respaldada por procedimientos claros que permitan garantizar continuidad, previsibilidad y calidad, simplificando el trabajo cotidiano y asegurando la continuidad operativa.</w:t>
+        <w:t xml:space="preserve">3.2. Objetivos específicos</w:t>
+      </w:r>
+    </w:p>
+    <w:p>
+      <w:r>
+        <w:rPr>
+          <w:b/>
+          <w:bCs/>
+        </w:rPr>
+        <w:t xml:space="preserve">1. Fortalecer la organización interna:</w:t>
+      </w:r>
+      <w:r>
+        <w:t xml:space="preserve"> Promover una estructura colaborativa basada en planificación, comunicación transversal entre oficinas y liderazgo activo de la Jefatura.</w:t>
+      </w:r>
+    </w:p>
+    <w:p>
+      <w:r>
+        <w:rPr>
+          <w:b/>
+          <w:bCs/>
+        </w:rPr>
+        <w:t xml:space="preserve">2. Preservar el conocimiento institucional:</w:t>
+      </w:r>
+      <w:r>
+        <w:t xml:space="preserve"> Eliminar puntos únicos de falla mediante la asignación de Referentes Secundarios y documentación sistemática.</w:t>
+      </w:r>
+    </w:p>
+    <w:p>
+      <w:r>
+        <w:rPr>
+          <w:b/>
+          <w:bCs/>
+        </w:rPr>
+        <w:t xml:space="preserve">3. Estandarizar procesos y código:</w:t>
+      </w:r>
+      <w:r>
+        <w:t xml:space="preserve"> Institucionalizar la obligatoriedad del template de Arquitectura Base Municipal y guías de buenas prácticas.</w:t>
+      </w:r>
+    </w:p>
+    <w:p>
+      <w:r>
+        <w:rPr>
+          <w:b/>
+          <w:bCs/>
+        </w:rPr>
+        <w:t xml:space="preserve">4. Optimizar la gestión de proyectos:</w:t>
+      </w:r>
+      <w:r>
+        <w:t xml:space="preserve"> Consolidar una Cartera Única de Proyectos gestionada homogéneamente en Redmine.</w:t>
+      </w:r>
+    </w:p>
+    <w:p>
+      <w:r>
+        <w:rPr>
+          <w:b/>
+          <w:bCs/>
+        </w:rPr>
+        <w:t xml:space="preserve">5. Consolidar el Gobierno Técnico:</w:t>
+      </w:r>
+      <w:r>
+        <w:t xml:space="preserve"> Establecer protocolos de auditoría y recepción técnica para desarrollos internos y de proveedores externos.</w:t>
+      </w:r>
+    </w:p>
+    <w:p>
+      <w:r>
+        <w:rPr>
+          <w:b/>
+          <w:bCs/>
+        </w:rPr>
+        <w:t xml:space="preserve">6. Promover la innovación tecnológica responsable:</w:t>
+      </w:r>
+      <w:r>
+        <w:t xml:space="preserve"> Regular el uso asistido de Inteligencia Artificial garantizando la seguridad de los datos municipales.</w:t>
+      </w:r>
+    </w:p>
+    <w:p>
+      <w:r>
+        <w:rPr>
+          <w:b/>
+          <w:bCs/>
+        </w:rPr>
+        <w:t xml:space="preserve">7. Fortalecer la articulación institucional:</w:t>
+      </w:r>
+      <w:r>
+        <w:t xml:space="preserve"> Mejorar los canales de relevamiento, validación y gestión de expectativas con las áreas usuarias.</w:t>
+      </w:r>
+    </w:p>
+    <w:p/>
+    <w:p>
+      <w:pPr>
+        <w:pStyle w:val="Heading1"/>
+      </w:pPr>
+      <w:r>
+        <w:rPr>
+          <w:b/>
+          <w:bCs/>
+        </w:rPr>
+        <w:t xml:space="preserve">4. Eje I – Personas, motivación y desarrollo del equipo</w:t>
       </w:r>
     </w:p>
     <w:p>
@@ -748,14 +993,35 @@
           <w:b/>
           <w:bCs/>
         </w:rPr>
-        <w:t xml:space="preserve">3.3 Gestión del conocimiento institucional</w:t>
-      </w:r>
-    </w:p>
-    <w:p>
-      <w:r>
-        <w:t xml:space="preserve">El conocimiento generado durante el desarrollo y mantenimiento de los sistemas constituye un activo estratégico de la Municipalidad. Por ello, la Jefatura impulsará mecanismos que favorezcan la documentación, la transferencia de conocimientos y la capacitación interna, procurando que la información crítica permanezca en la organización.</w:t>
-      </w:r>
-    </w:p>
+        <w:t xml:space="preserve">4.1. Comunicación y coordinación permanente entre dependencias</w:t>
+      </w:r>
+    </w:p>
+    <w:p>
+      <w:r>
+        <w:t xml:space="preserve">Uno de los principales problemas detectados es la escasa interacción entre los grupos de trabajo que desarrollan sus actividades en distintas dependencias físicas. Esta situación dificulta conocer los proyectos en ejecución, compartir experiencias, detectar oportunidades de reutilización y coordinar esfuerzos entre equipos.</w:t>
+      </w:r>
+    </w:p>
+    <w:p>
+      <w:r>
+        <w:t xml:space="preserve">La propuesta consiste en institucionalizar un esquema permanente de coordinación entre ambos grupos de trabajo. Para ello se establecerán reuniones breves de seguimiento donde participen representantes de los distintos proyectos con el objetivo de compartir avances, informar bloqueos, detectar necesidades de colaboración, comunicar cambios relevantes e identificar desarrollos similares que puedan reutilizar componentes existentes.</w:t>
+      </w:r>
+    </w:p>
+    <w:p>
+      <w:r>
+        <w:t xml:space="preserve">Estas reuniones no tendrán carácter burocrático ni buscarán controlar el trabajo diario de cada agente, sino facilitar la circulación de información y fortalecer la coordinación del Departamento. Como complemento se promoverá el uso uniforme de las herramientas institucionales de seguimiento (Redmine), permitiendo que la información de los proyectos permanezca accesible para todo el equipo.</w:t>
+      </w:r>
+    </w:p>
+    <w:p>
+      <w:r>
+        <w:t xml:space="preserve">La Jefatura actuará como facilitadora del proceso, asegurando la continuidad de las reuniones, removiendo los bloqueos detectados y promoviendo una cultura de responsabilidad compartida entre las distintas dependencias.</w:t>
+      </w:r>
+    </w:p>
+    <w:p>
+      <w:r>
+        <w:t xml:space="preserve">Con esta medida se espera disminuir el aislamiento operativo existente entre las dependencias, mejorar la coordinación interna y reducir significativamente la duplicación de esfuerzos dentro del Departamento.</w:t>
+      </w:r>
+    </w:p>
+    <w:p/>
     <w:p>
       <w:pPr>
         <w:pStyle w:val="Heading2"/>
@@ -765,12 +1031,25 @@
           <w:b/>
           <w:bCs/>
         </w:rPr>
-        <w:t xml:space="preserve">3.4 Mejora continua</w:t>
-      </w:r>
-    </w:p>
-    <w:p>
-      <w:r>
-        <w:t xml:space="preserve">Los procedimientos, metodologías y herramientas deberán revisarse periódicamente para identificar oportunidades de mejora sobre la base de evidencias objetivas, indicadores de gestión y resultados observables.</w:t>
+        <w:t xml:space="preserve">4.2. Desarrollo de competencias y Matriz de Competencias</w:t>
+      </w:r>
+    </w:p>
+    <w:p>
+      <w:r>
+        <w:t xml:space="preserve">Relevamiento integral del personal para construir una Matriz de Competencias que distinga entre capacidad técnica y conocimiento funcional del trámite municipal, planificando capacitaciones en servicio para nivelar habilidades y fomentar el crecimiento profesional dentro de la estructura municipal.</w:t>
+      </w:r>
+    </w:p>
+    <w:p/>
+    <w:p>
+      <w:pPr>
+        <w:pStyle w:val="Heading1"/>
+      </w:pPr>
+      <w:r>
+        <w:rPr>
+          <w:b/>
+          <w:bCs/>
+        </w:rPr>
+        <w:t xml:space="preserve">5. Eje II – Gestión del conocimiento y continuidad operativa</w:t>
       </w:r>
     </w:p>
     <w:p>
@@ -782,14 +1061,35 @@
           <w:b/>
           <w:bCs/>
         </w:rPr>
-        <w:t xml:space="preserve">3.5 Innovación responsable</w:t>
-      </w:r>
-    </w:p>
-    <w:p>
-      <w:r>
-        <w:t xml:space="preserve">Antes de adoptar una herramienta, metodología o plataforma tecnológica se evaluarán aspectos tales como compatibilidad con la arquitectura existente, sostenibilidad en el tiempo, costos de implementación, impacto sobre los procesos, requerimientos de capacitación y seguridad de la información.</w:t>
-      </w:r>
-    </w:p>
+        <w:t xml:space="preserve">5.1. Preservación del conocimiento e institucionalización de Referentes Secundarios (Shadowing)</w:t>
+      </w:r>
+    </w:p>
+    <w:p>
+      <w:r>
+        <w:t xml:space="preserve">La concentración del conocimiento técnico y funcional de sistemas críticos en agentes individuales genera un alto riesgo operacional para la Municipalidad. Ante licencias, traslados o imprevistos, la continuidad del servicio puede verse comprometida por la falta de personal capacitado para intervenir inmediatamente sobre dichos aplicativos.</w:t>
+      </w:r>
+    </w:p>
+    <w:p>
+      <w:r>
+        <w:t xml:space="preserve">Para mitigar este riesgo sin alterar las estructuras escalafonarias vigentes se propone instituir la figura del Referente Secundario (Shadowing). La medida consiste en asignar a un segundo agente para que acompañe al responsable principal de cada sistema crítico en tareas de mantenimiento, actualización y soporte.</w:t>
+      </w:r>
+    </w:p>
+    <w:p>
+      <w:r>
+        <w:t xml:space="preserve">El proceso comenzará con la identificación de los aplicativos de mayor criticidad institucional, la evaluación de las competencias técnicas requeridas y la asignación formal del referente secundario. El esquema contempla instancias periódicas de trabajo conjunto, participación en revisiones de código, acompañamiento en el despliegue de actualizaciones y documentación colaborativa de los procesos clave.</w:t>
+      </w:r>
+    </w:p>
+    <w:p>
+      <w:r>
+        <w:t xml:space="preserve">La Jefatura supervisará el cumplimiento del esquema de acompañamiento, asegurando que el referente secundario disponga de tiempo efectivo en su planificación para participar activamente del mantenimiento de los sistemas asignados.</w:t>
+      </w:r>
+    </w:p>
+    <w:p>
+      <w:r>
+        <w:t xml:space="preserve">La implementación de este esquema permitirá eliminar los puntos únicos de falla (Single Points of Failure), garantizar la continuidad operativa ante contingencias y favorecer la transferencia continua del conocimiento dentro de la organización.</w:t>
+      </w:r>
+    </w:p>
+    <w:p/>
     <w:p>
       <w:pPr>
         <w:pStyle w:val="Heading2"/>
@@ -799,12 +1099,25 @@
           <w:b/>
           <w:bCs/>
         </w:rPr>
-        <w:t xml:space="preserve">3.6 Orientación al servicio</w:t>
-      </w:r>
-    </w:p>
-    <w:p>
-      <w:r>
-        <w:t xml:space="preserve">El Departamento presta servicios a las distintas áreas municipales y, de manera indirecta, a toda la comunidad. Las decisiones priorizarán el valor que los sistemas aportan a los procesos administrativos, sustentándose en un diálogo permanente y una definición clara de prioridades.</w:t>
+        <w:t xml:space="preserve">5.2. Documentación mínima y útil</w:t>
+      </w:r>
+    </w:p>
+    <w:p>
+      <w:r>
+        <w:t xml:space="preserve">Definición de un estándar de documentación funcional, técnica y de despliegue proporcional a la criticidad del sistema, integrado al proceso normal de entrega (Definition of Done), asegurando que los manuales permanezcan actualizados sin generar burocracia innecesaria.</w:t>
+      </w:r>
+    </w:p>
+    <w:p/>
+    <w:p>
+      <w:pPr>
+        <w:pStyle w:val="Heading1"/>
+      </w:pPr>
+      <w:r>
+        <w:rPr>
+          <w:b/>
+          <w:bCs/>
+        </w:rPr>
+        <w:t xml:space="preserve">6. Eje III – Modelo común de gestión y desarrollo</w:t>
       </w:r>
     </w:p>
     <w:p>
@@ -816,12 +1129,70 @@
           <w:b/>
           <w:bCs/>
         </w:rPr>
-        <w:t xml:space="preserve">3.7 Decisiones basadas en evidencia</w:t>
-      </w:r>
-    </w:p>
-    <w:p>
-      <w:r>
-        <w:t xml:space="preserve">La planificación y administración del Departamento se apoyará en información objetiva proveniente de indicadores que midan la capacidad operativa, la evolución de proyectos y los cuellos de botella.</w:t>
+        <w:t xml:space="preserve">6.1. Cartera Única de Proyectos y centralización en Redmine</w:t>
+      </w:r>
+    </w:p>
+    <w:p>
+      <w:r>
+        <w:t xml:space="preserve">Actualmente el seguimiento de requerimientos y proyectos se realiza mediante metodologías y canales heterogéneos, lo que impide contar con una visión integral de la capacidad operativa del Departamento y dificulta la priorización transparente de las solicitudes provenientes de las distintas Secretarías.</w:t>
+      </w:r>
+    </w:p>
+    <w:p>
+      <w:r>
+        <w:t xml:space="preserve">La propuesta contempla consolidar la plataforma Redmine como el repositorio único y obligatorio para el registro, asignación y seguimiento de la totalidad de las actividades del Departamento, incluyendo proyectos nuevos, mantenimientos evolutivos, corrección de incidencias y tareas de asistencia técnica.</w:t>
+      </w:r>
+    </w:p>
+    <w:p>
+      <w:r>
+        <w:t xml:space="preserve">Todas las solicitudes ingresadas deberán clasificarse según su impacto institucional, urgencia y factibilidad técnica. La visibilidad centralizada de la carga de trabajo permitirá estimar plazos de entrega realistas y comunicar con transparencia el estado de los desarrollos a las áreas usuarias.</w:t>
+      </w:r>
+    </w:p>
+    <w:p>
+      <w:r>
+        <w:t xml:space="preserve">La Jefatura asumirá la responsabilidad de administrar la Cartera Única, actuando como filtro frente a las demandas de las dependencias solicitantes, gestionando las prioridades junto a las autoridades y asignando los recursos según la capacidad real del equipo.</w:t>
+      </w:r>
+    </w:p>
+    <w:p>
+      <w:r>
+        <w:t xml:space="preserve">Con esta centralización se logrará unificar la gestión de demandas, mejorar la previsibilidad en los tiempos de respuesta y dotar de total transparencia a la administración de los recursos del Departamento.</w:t>
+      </w:r>
+    </w:p>
+    <w:p/>
+    <w:p>
+      <w:pPr>
+        <w:pStyle w:val="Heading2"/>
+      </w:pPr>
+      <w:r>
+        <w:rPr>
+          <w:b/>
+          <w:bCs/>
+        </w:rPr>
+        <w:t xml:space="preserve">6.2. Modelo de Agilidad Adaptativa (Scrum Master Global / Kanban)</w:t>
+      </w:r>
+    </w:p>
+    <w:p>
+      <w:r>
+        <w:t xml:space="preserve">La diversidad de proyectos y mantenimientos simultáneos dificulta la aplicación rígida de una única metodología de trabajo. Los proyectos nuevos requieren iteraciones planificadas, mientras que la atención de incidencias operativas exige un flujo continuo de respuesta.</w:t>
+      </w:r>
+    </w:p>
+    <w:p>
+      <w:r>
+        <w:t xml:space="preserve">Se propone implementar un marco de Agilidad Adaptativa que combine iteraciones cortas (Sprints) para nuevos desarrollos con gestión de flujo continuo (Kanban) para mantenimientos y soporte técnico. La propuesta contempla reuniones breves de sincronización, priorización periódica del backlog y definición clara de criterios de finalización (Definition of Done).</w:t>
+      </w:r>
+    </w:p>
+    <w:p>
+      <w:r>
+        <w:t xml:space="preserve">Este esquema permitirá flexibilizar la gestión del trabajo sin perder el control sobre los entregables ni saturar al equipo con sobrecargas imprevistas.</w:t>
+      </w:r>
+    </w:p>
+    <w:p>
+      <w:r>
+        <w:t xml:space="preserve">La Jefatura asumirá el rol activo de Scrum Master Global y Gestor, protegiendo al equipo de interrupciones externas, removiendo impedimentos técnicos u organizacionales y ajustando la dinámica de trabajo según los resultados observados.</w:t>
+      </w:r>
+    </w:p>
+    <w:p>
+      <w:r>
+        <w:t xml:space="preserve">La adopción de este marco ágil adaptativo incrementará la productividad técnica, mejorará la adaptabilidad ante requerimientos cambiantes y reducirá el estrés operativo generado por la atención reactiva de emergencias.</w:t>
       </w:r>
     </w:p>
     <w:p/>
@@ -834,7 +1205,7 @@
           <w:b/>
           <w:bCs/>
         </w:rPr>
-        <w:t xml:space="preserve">4. OBJETIVOS</w:t>
+        <w:t xml:space="preserve">7. Eje IV – Arquitectura de referencia, calidad, seguridad e innovación</w:t>
       </w:r>
     </w:p>
     <w:p>
@@ -846,14 +1217,35 @@
           <w:b/>
           <w:bCs/>
         </w:rPr>
-        <w:t xml:space="preserve">4.1 Objetivo General</w:t>
-      </w:r>
-    </w:p>
-    <w:p>
-      <w:r>
-        <w:t xml:space="preserve">Fortalecer la capacidad institucional del Departamento de Gestión, Desarrollo e Innovación en Sistemas de Software mediante un modelo de gestión orientado a las personas, la organización de los procesos, la estandarización técnica y la mejora continua, asegurando el desarrollo de soluciones tecnológicas sostenibles, seguras y alineadas con los objetivos estratégicos de la Municipalidad de General Pueyrredon.</w:t>
-      </w:r>
-    </w:p>
+        <w:t xml:space="preserve">7.1. Estandarización del desarrollo y consolidación de una Arquitectura Base Institucional</w:t>
+      </w:r>
+    </w:p>
+    <w:p>
+      <w:r>
+        <w:t xml:space="preserve">La diversidad de tecnologías, criterios de diseño y convenciones de programación utilizadas a lo largo del tiempo ha generado un ecosistema de aplicaciones heterogéneo, dificultando el mantenimiento, la reutilización de componentes y la incorporación de nuevos desarrolladores a los proyectos existentes.</w:t>
+      </w:r>
+    </w:p>
+    <w:p>
+      <w:r>
+        <w:t xml:space="preserve">Para reducir esta complejidad se propone institucionalizar una Arquitectura Base que establezca criterios comunes para todos los nuevos desarrollos y para aquellas refactorizaciones cuya magnitud justifique su adopción. Esta arquitectura definirá lineamientos sobre organización de proyectos, acceso a datos, autenticación, manejo de errores, configuración, registro de eventos y demás componentes reutilizables, permitiendo desarrollar aplicaciones homogéneas, mantenibles y compatibles entre sí.</w:t>
+      </w:r>
+    </w:p>
+    <w:p>
+      <w:r>
+        <w:t xml:space="preserve">Como complemento, se elaborarán Guías de Buenas Prácticas que unifiquen criterios de codificación, documentación, control de versiones, pruebas y estructura de los proyectos. Estos documentos deberán mantenerse actualizados y evolucionar conforme lo hagan las necesidades del Departamento.</w:t>
+      </w:r>
+    </w:p>
+    <w:p>
+      <w:r>
+        <w:t xml:space="preserve">La Jefatura será responsable de definir estos estándares, promover su utilización, evaluar las excepciones técnicamente justificadas y coordinar su actualización periódica junto con los equipos de desarrollo. Asimismo, impulsará instancias de revisión técnica previas al inicio de nuevos proyectos para verificar la reutilización de componentes existentes y la compatibilidad con la estrategia tecnológica institucional.</w:t>
+      </w:r>
+    </w:p>
+    <w:p>
+      <w:r>
+        <w:t xml:space="preserve">La implementación de estos lineamientos permitirá reducir la deuda técnica, facilitar el mantenimiento evolutivo, simplificar la incorporación de nuevos desarrolladores y asegurar que el crecimiento del software municipal responda a criterios comunes de calidad y sostenibilidad.</w:t>
+      </w:r>
+    </w:p>
+    <w:p/>
     <w:p>
       <w:pPr>
         <w:pStyle w:val="Heading2"/>
@@ -863,91 +1255,85 @@
           <w:b/>
           <w:bCs/>
         </w:rPr>
-        <w:t xml:space="preserve">4.2 Objetivos Específicos</w:t>
-      </w:r>
-    </w:p>
-    <w:p>
-      <w:r>
-        <w:rPr>
-          <w:b/>
-          <w:bCs/>
-        </w:rPr>
-        <w:t xml:space="preserve">1. Fortalecer la organización interna:</w:t>
-      </w:r>
-      <w:r>
-        <w:t xml:space="preserve"> Promover una estructura colaborativa basada en planificación, comunicación transversal entre oficinas y liderazgo activo de la Jefatura.</w:t>
-      </w:r>
-    </w:p>
-    <w:p>
-      <w:r>
-        <w:rPr>
-          <w:b/>
-          <w:bCs/>
-        </w:rPr>
-        <w:t xml:space="preserve">2. Preservar el conocimiento institucional:</w:t>
-      </w:r>
-      <w:r>
-        <w:t xml:space="preserve"> Eliminar puntos únicos de falla mediante la asignación de Referentes Secundarios y documentación sistemática.</w:t>
-      </w:r>
-    </w:p>
-    <w:p>
-      <w:r>
-        <w:rPr>
-          <w:b/>
-          <w:bCs/>
-        </w:rPr>
-        <w:t xml:space="preserve">3. Estandarizar procesos y código:</w:t>
-      </w:r>
-      <w:r>
-        <w:t xml:space="preserve"> Institucionalizar la obligatoriedad del template de Arquitectura Base Municipal y guías de buenas prácticas.</w:t>
-      </w:r>
-    </w:p>
-    <w:p>
-      <w:r>
-        <w:rPr>
-          <w:b/>
-          <w:bCs/>
-        </w:rPr>
-        <w:t xml:space="preserve">4. Optimizar la gestión de proyectos:</w:t>
-      </w:r>
-      <w:r>
-        <w:t xml:space="preserve"> Consolidar una Cartera Única de Proyectos gestionada homogéneamente en Redmine.</w:t>
-      </w:r>
-    </w:p>
-    <w:p>
-      <w:r>
-        <w:rPr>
-          <w:b/>
-          <w:bCs/>
-        </w:rPr>
-        <w:t xml:space="preserve">5. Consolidar el Gobierno Técnico:</w:t>
-      </w:r>
-      <w:r>
-        <w:t xml:space="preserve"> Establecer protocolos de auditoría y recepción técnica para desarrollos internos y de proveedores externos.</w:t>
-      </w:r>
-    </w:p>
-    <w:p>
-      <w:r>
-        <w:rPr>
-          <w:b/>
-          <w:bCs/>
-        </w:rPr>
-        <w:t xml:space="preserve">6. Promover la innovación tecnológica responsable:</w:t>
-      </w:r>
-      <w:r>
-        <w:t xml:space="preserve"> Regular el uso asistido de Inteligencia Artificial garantizando la seguridad de los datos municipales.</w:t>
-      </w:r>
-    </w:p>
-    <w:p>
-      <w:r>
-        <w:rPr>
-          <w:b/>
-          <w:bCs/>
-        </w:rPr>
-        <w:t xml:space="preserve">7. Fortalecer la articulación institucional:</w:t>
-      </w:r>
-      <w:r>
-        <w:t xml:space="preserve"> Mejorar los canales de relevamiento, validación y gestión de expectativas con las áreas usuarias.</w:t>
+        <w:t xml:space="preserve">7.2. Gestión de la calidad del software y fortalecimiento de la documentación institucional</w:t>
+      </w:r>
+    </w:p>
+    <w:p>
+      <w:r>
+        <w:t xml:space="preserve">La calidad del software constituye un objetivo transversal del Departamento y debe formar parte del proceso de desarrollo desde las etapas iniciales de cada proyecto. Si bien el equipo posee capacidad técnica para desarrollar soluciones de calidad, la ausencia de criterios homogéneos de revisión y documentación genera diferencias entre proyectos que posteriormente incrementan los tiempos de mantenimiento y dificultan la incorporación de nuevos desarrolladores.</w:t>
+      </w:r>
+    </w:p>
+    <w:p>
+      <w:r>
+        <w:t xml:space="preserve">Con el propósito de fortalecer la calidad de los sistemas municipales, se propone institucionalizar un conjunto de prácticas mínimas aplicables a todos los proyectos, adaptadas a su complejidad y criticidad. El objetivo no consiste en incorporar controles burocráticos, sino en asegurar que cada desarrollo reúna las condiciones necesarias para ser mantenido y evolucionado por cualquier integrante del Departamento.</w:t>
+      </w:r>
+    </w:p>
+    <w:p>
+      <w:r>
+        <w:t xml:space="preserve">Como criterio general, cada proyecto deberá contar con una documentación técnica mínima que describa el objetivo del sistema, su arquitectura general, el modelo de datos utilizado, las integraciones con otros aplicativos, los procedimientos de instalación y despliegue, así como los responsables funcionales y técnicos. La profundidad de esta documentación será proporcional a la complejidad del sistema, evitando generar documentación innecesaria que luego quede desactualizada.</w:t>
+      </w:r>
+    </w:p>
+    <w:p>
+      <w:r>
+        <w:t xml:space="preserve">Del mismo modo, antes de la puesta en producción de modificaciones relevantes se promoverán instancias de revisión técnica orientadas a verificar el cumplimiento de los estándares definidos por el Departamento, la correcta integración con los sistemas existentes y la ausencia de errores evidentes que puedan afectar la operación normal de los servicios municipales.</w:t>
+      </w:r>
+    </w:p>
+    <w:p>
+      <w:r>
+        <w:t xml:space="preserve">La Jefatura será responsable de impulsar estas prácticas como parte habitual del proceso de desarrollo, supervisando su cumplimiento y promoviendo una cultura donde la calidad y la documentación sean entendidas como componentes naturales del trabajo cotidiano.</w:t>
+      </w:r>
+    </w:p>
+    <w:p>
+      <w:r>
+        <w:t xml:space="preserve">La implementación de estas medidas permitirá mejorar la mantenibilidad de las aplicaciones, reducir la dependencia del conocimiento individual y fortalecer la continuidad operativa del Departamento.</w:t>
+      </w:r>
+    </w:p>
+    <w:p/>
+    <w:p>
+      <w:pPr>
+        <w:pStyle w:val="Heading2"/>
+      </w:pPr>
+      <w:r>
+        <w:rPr>
+          <w:b/>
+          <w:bCs/>
+        </w:rPr>
+        <w:t xml:space="preserve">7.3. Innovación tecnológica y utilización responsable de Inteligencia Artificial</w:t>
+      </w:r>
+    </w:p>
+    <w:p>
+      <w:r>
+        <w:t xml:space="preserve">La innovación tecnológica constituye una función permanente del Departamento y debe orientarse a mejorar la calidad de los servicios brindados por la Municipalidad. Sin embargo, la incorporación de nuevas herramientas debe responder a una planificación institucional y no únicamente a iniciativas individuales o tendencias del mercado.</w:t>
+      </w:r>
+    </w:p>
+    <w:p>
+      <w:r>
+        <w:t xml:space="preserve">La Jefatura impulsará un proceso continuo de evaluación de tecnologías, metodologías y herramientas de desarrollo, analizando su impacto sobre la infraestructura existente, los costos de adopción, las necesidades de capacitación y los beneficios concretos que puedan aportar a la gestión municipal. Sólo aquellas soluciones que demuestren una mejora objetiva en la productividad, la seguridad o la calidad del software serán incorporadas como estándares institucionales.</w:t>
+      </w:r>
+    </w:p>
+    <w:p>
+      <w:r>
+        <w:t xml:space="preserve">Dentro de este escenario, las herramientas basadas en Inteligencia Artificial representan una oportunidad para asistir al equipo de desarrollo en tareas como generación de código, documentación técnica, análisis de errores y automatización de actividades repetitivas. Su utilización permitirá reducir tiempos operativos y mejorar la productividad del Departamento, siempre que su uso se realice bajo criterios claros de seguridad y confidencialidad.</w:t>
+      </w:r>
+    </w:p>
+    <w:p>
+      <w:r>
+        <w:t xml:space="preserve">Por tal motivo se establecerán lineamientos que prohíban expresamente incorporar en plataformas públicas de Inteligencia Artificial información sensible, datos personales de ciudadanos, credenciales institucionales o cualquier otro contenido protegido por las políticas de seguridad del Municipio.</w:t>
+      </w:r>
+    </w:p>
+    <w:p>
+      <w:r>
+        <w:t xml:space="preserve">Asimismo, toda producción generada mediante estas herramientas deberá ser revisada y validada por el profesional responsable del desarrollo antes de incorporarse a los sistemas municipales, manteniendo en todo momento la responsabilidad técnica sobre las decisiones adoptadas.</w:t>
+      </w:r>
+    </w:p>
+    <w:p>
+      <w:r>
+        <w:t xml:space="preserve">Como proyección futura, y sujeto a disponibilidad presupuestaria, podrá evaluarse la incorporación de plataformas corporativas de Inteligencia Artificial administradas por el Municipio, que ofrezcan mayores garantías de privacidad, trazabilidad y administración centralizada.</w:t>
+      </w:r>
+    </w:p>
+    <w:p>
+      <w:r>
+        <w:t xml:space="preserve">De este modo, la innovación tecnológica dejará de depender de decisiones individuales para transformarse en una política institucional permanente, orientada a fortalecer la capacidad del Departamento para brindar soluciones modernas, seguras y sostenibles.</w:t>
       </w:r>
     </w:p>
     <w:p/>
@@ -960,7 +1346,80 @@
           <w:b/>
           <w:bCs/>
         </w:rPr>
-        <w:t xml:space="preserve">5. PROPUESTAS DE MEJORA Y POLÍTICAS INSTITUCIONALES DE GESTIÓN</w:t>
+        <w:t xml:space="preserve">8. Eje V – Gestión de demanda y proveedores externos</w:t>
+      </w:r>
+    </w:p>
+    <w:p>
+      <w:pPr>
+        <w:pStyle w:val="Heading2"/>
+      </w:pPr>
+      <w:r>
+        <w:rPr>
+          <w:b/>
+          <w:bCs/>
+        </w:rPr>
+        <w:t xml:space="preserve">8.1. Gobierno técnico de proveedores externos</w:t>
+      </w:r>
+    </w:p>
+    <w:p>
+      <w:r>
+        <w:t xml:space="preserve">Las funciones asignadas al Departamento comprenden no sólo el desarrollo interno de sistemas informáticos, sino también la supervisión técnica de aquellas soluciones provistas por empresas externas. En consecuencia, la contratación de un proveedor no implica delegar la responsabilidad sobre la calidad del software incorporado al ecosistema municipal.</w:t>
+      </w:r>
+    </w:p>
+    <w:p>
+      <w:r>
+        <w:t xml:space="preserve">La Jefatura deberá asumir un rol activo durante todo el ciclo de contratación, participando en la definición de los requerimientos técnicos, colaborando en la elaboración de las especificaciones funcionales y verificando que las soluciones propuestas resulten compatibles con la arquitectura tecnológica del Municipio y con los estándares definidos por el Departamento.</w:t>
+      </w:r>
+    </w:p>
+    <w:p>
+      <w:r>
+        <w:t xml:space="preserve">Durante la ejecución de los proyectos se promoverán reuniones periódicas de seguimiento técnico que permitan detectar tempranamente desvíos respecto de las especificaciones acordadas, facilitando la resolución de inconvenientes antes de su impacto sobre la implementación.</w:t>
+      </w:r>
+    </w:p>
+    <w:p>
+      <w:r>
+        <w:t xml:space="preserve">Asimismo, previo a la recepción definitiva de cualquier desarrollo contratado, se verificará el cumplimiento de requisitos mínimos que garanticen la autonomía tecnológica del Municipio. Entre ellos se incluyen la entrega del código fuente, la documentación técnica actualizada, los modelos de datos, los procedimientos de instalación y despliegue, la descripción de las interfaces de integración y las evidencias de las pruebas realizadas.</w:t>
+      </w:r>
+    </w:p>
+    <w:p>
+      <w:r>
+        <w:t xml:space="preserve">Cuando los contratos contemplen servicios de mantenimiento, la Jefatura actuará además como nexo técnico entre las áreas usuarias y los proveedores, coordinando la gestión de incidencias, verificando el cumplimiento de los niveles de servicio comprometidos y controlando la calidad de las soluciones implementadas.</w:t>
+      </w:r>
+    </w:p>
+    <w:p>
+      <w:r>
+        <w:t xml:space="preserve">De esta manera se fortalece el rol institucional del Departamento como autoridad técnica sobre los sistemas municipales, evitando la dependencia tecnológica de proveedores externos y asegurando que el conocimiento generado permanezca dentro de la organización.</w:t>
+      </w:r>
+    </w:p>
+    <w:p/>
+    <w:p>
+      <w:pPr>
+        <w:pStyle w:val="Heading2"/>
+      </w:pPr>
+      <w:r>
+        <w:rPr>
+          <w:b/>
+          <w:bCs/>
+        </w:rPr>
+        <w:t xml:space="preserve">8.2. Gestión de la relación con las áreas usuarias</w:t>
+      </w:r>
+    </w:p>
+    <w:p>
+      <w:r>
+        <w:t xml:space="preserve">Fortalecimiento del rol de la Jefatura como nexo institucional con las Secretarías solicitantes mediante entrevistas funcionales, priorización conjunta, validaciones parciales y gestión compartida de expectativas.</w:t>
+      </w:r>
+    </w:p>
+    <w:p/>
+    <w:p>
+      <w:pPr>
+        <w:pStyle w:val="Heading1"/>
+      </w:pPr>
+      <w:r>
+        <w:rPr>
+          <w:b/>
+          <w:bCs/>
+        </w:rPr>
+        <w:t xml:space="preserve">9. Optimización con recursos actuales (Escenario $0)</w:t>
       </w:r>
     </w:p>
     <w:p>
@@ -969,7 +1428,153 @@
           <w:i/>
           <w:iCs/>
         </w:rPr>
-        <w:t xml:space="preserve">Esta sección constituye el núcleo central del Plan de Trabajo. Cada propuesta se presenta no como una mera enumeración de intenciones, sino como una verdadera política institucional de gestión que define el problema detectado, la propuesta concreta de solución, el rol de la Jefatura y el resultado esperado para el Municipio.</w:t>
+        <w:t xml:space="preserve">La primera responsabilidad de una Jefatura consiste en optimizar los recursos existentes antes de requerir nuevas incorporaciones presupuestarias. En consecuencia, las acciones propuestas en esta etapa priorizan la reorganización del trabajo, la mejora de los procedimientos y el fortalecimiento de la coordinación interna, aprovechando la infraestructura y el capital humano actualmente disponibles.</w:t>
+      </w:r>
+    </w:p>
+    <w:p>
+      <w:r>
+        <w:rPr>
+          <w:b/>
+          <w:bCs/>
+        </w:rPr>
+        <w:t xml:space="preserve">1. Liderazgo Híbrido: </w:t>
+      </w:r>
+      <w:r>
+        <w:t xml:space="preserve">Jefatura como Scrum Master Global (filtro de cargas entre oficinas) y Gestor.</w:t>
+      </w:r>
+    </w:p>
+    <w:p>
+      <w:r>
+        <w:rPr>
+          <w:b/>
+          <w:bCs/>
+        </w:rPr>
+        <w:t xml:space="preserve">2. Mitigación de Puntos Únicos de Falla: </w:t>
+      </w:r>
+      <w:r>
+        <w:t xml:space="preserve">Asignación de Referentes Secundarios en sistemas críticos.</w:t>
+      </w:r>
+    </w:p>
+    <w:p>
+      <w:r>
+        <w:rPr>
+          <w:b/>
+          <w:bCs/>
+        </w:rPr>
+        <w:t xml:space="preserve">3. Estandarización Obligatoria: </w:t>
+      </w:r>
+      <w:r>
+        <w:t xml:space="preserve">Uso del Template de Arquitectura Base municipal (Congelamiento Legacy).</w:t>
+      </w:r>
+    </w:p>
+    <w:p>
+      <w:r>
+        <w:rPr>
+          <w:b/>
+          <w:bCs/>
+        </w:rPr>
+        <w:t xml:space="preserve">4. Gobernanza de Proveedores: </w:t>
+      </w:r>
+      <w:r>
+        <w:t xml:space="preserve">Exigencia de código fuente, manuales y pruebas de recepción antes de la aceptación.</w:t>
+      </w:r>
+    </w:p>
+    <w:p>
+      <w:r>
+        <w:rPr>
+          <w:b/>
+          <w:bCs/>
+        </w:rPr>
+        <w:t xml:space="preserve">5. Uso Seguro de IA: </w:t>
+      </w:r>
+      <w:r>
+        <w:t xml:space="preserve">Protocolo de resguardo de datos sensibles en asistentes de código.</w:t>
+      </w:r>
+    </w:p>
+    <w:p/>
+    <w:p>
+      <w:pPr>
+        <w:pStyle w:val="Heading1"/>
+      </w:pPr>
+      <w:r>
+        <w:rPr>
+          <w:b/>
+          <w:bCs/>
+        </w:rPr>
+        <w:t xml:space="preserve">10. Proyección con incorporación de recursos (Escenario con presupuesto)</w:t>
+      </w:r>
+    </w:p>
+    <w:p>
+      <w:r>
+        <w:rPr>
+          <w:b/>
+          <w:bCs/>
+        </w:rPr>
+        <w:t xml:space="preserve">1. Licencias Corporativas Oficiales de IA: </w:t>
+      </w:r>
+      <w:r>
+        <w:t xml:space="preserve">Adquisición de licencias para IDEs en entornos privados institucionales.</w:t>
+      </w:r>
+    </w:p>
+    <w:p>
+      <w:r>
+        <w:rPr>
+          <w:b/>
+          <w:bCs/>
+        </w:rPr>
+        <w:t xml:space="preserve">2. Plataforma de Análisis Estático de Calidad: </w:t>
+      </w:r>
+      <w:r>
+        <w:t xml:space="preserve">Herramientas automatizadas (ej. SonarQube) para auditar deuda técnica y seguridad.</w:t>
+      </w:r>
+    </w:p>
+    <w:p>
+      <w:r>
+        <w:rPr>
+          <w:b/>
+          <w:bCs/>
+        </w:rPr>
+        <w:t xml:space="preserve">3. Contenerización e Infraestructura: </w:t>
+      </w:r>
+      <w:r>
+        <w:t xml:space="preserve">Proyección presupuestaria para migración a contenedores Docker.</w:t>
+      </w:r>
+    </w:p>
+    <w:p>
+      <w:r>
+        <w:rPr>
+          <w:b/>
+          <w:bCs/>
+        </w:rPr>
+        <w:t xml:space="preserve">4. Capacitación Formal Externa: </w:t>
+      </w:r>
+      <w:r>
+        <w:t xml:space="preserve">Cursos profesionales en Clean Architecture, APIs y Microservicios.</w:t>
+      </w:r>
+    </w:p>
+    <w:p>
+      <w:r>
+        <w:rPr>
+          <w:b/>
+          <w:bCs/>
+        </w:rPr>
+        <w:t xml:space="preserve">5. Equipamiento para Trabajo Colaborativo: </w:t>
+      </w:r>
+      <w:r>
+        <w:t xml:space="preserve">Provisión de webcams y auriculares con micrófono para puestos de trabajo.</w:t>
+      </w:r>
+    </w:p>
+    <w:p/>
+    <w:p>
+      <w:pPr>
+        <w:pStyle w:val="Heading1"/>
+      </w:pPr>
+      <w:r>
+        <w:rPr>
+          <w:b/>
+          <w:bCs/>
+        </w:rPr>
+        <w:t xml:space="preserve">11. Estrategia de implementación (Roadmap por etapas)</w:t>
       </w:r>
     </w:p>
     <w:p>
@@ -981,35 +1586,14 @@
           <w:b/>
           <w:bCs/>
         </w:rPr>
-        <w:t xml:space="preserve">5.1 Comunicación y coordinación permanente entre dependencias</w:t>
-      </w:r>
-    </w:p>
-    <w:p>
-      <w:r>
-        <w:t xml:space="preserve">Uno de los principales problemas detectados es la escasa interacción entre los grupos de trabajo que desarrollan sus actividades en distintas dependencias físicas. Esta situación dificulta conocer los proyectos en ejecución, compartir experiencias, detectar oportunidades de reutilización y coordinar esfuerzos entre equipos.</w:t>
-      </w:r>
-    </w:p>
-    <w:p>
-      <w:r>
-        <w:t xml:space="preserve">La propuesta consiste en institucionalizar un esquema permanente de coordinación entre ambos grupos de trabajo. Para ello se establecerán reuniones breves de seguimiento donde participen representantes de los distintos proyectos con el objetivo de compartir avances, informar bloqueos, detectar necesidades de colaboración, comunicar cambios relevantes e identificar desarrollos similares que puedan reutilizar componentes existentes.</w:t>
-      </w:r>
-    </w:p>
-    <w:p>
-      <w:r>
-        <w:t xml:space="preserve">Estas reuniones no tendrán carácter burocrático ni buscarán controlar el trabajo diario de cada agente, sino facilitar la circulación de información y fortalecer la coordinación del Departamento. Como complemento se promoverá el uso uniforme de las herramientas institucionales de seguimiento (Redmine), permitiendo que la información de los proyectos permanezca accesible para todo el equipo.</w:t>
-      </w:r>
-    </w:p>
-    <w:p>
-      <w:r>
-        <w:t xml:space="preserve">La Jefatura actuará como facilitadora del proceso, asegurando la continuidad de las reuniones, removiendo los bloqueos detectados y promoviendo una cultura de responsabilidad compartida entre las distintas dependencias.</w:t>
-      </w:r>
-    </w:p>
-    <w:p>
-      <w:r>
-        <w:t xml:space="preserve">Con esta medida se espera disminuir el aislamiento operativo existente entre las dependencias, mejorar la coordinación interna y reducir significativamente la duplicación de esfuerzos dentro del Departamento.</w:t>
-      </w:r>
-    </w:p>
-    <w:p/>
+        <w:t xml:space="preserve">Etapa I – Conocer y ordenar (Sprints 1 a 4)</w:t>
+      </w:r>
+    </w:p>
+    <w:p>
+      <w:r>
+        <w:t xml:space="preserve">Relevamiento de competencias, inventario de sistemas, conformación de la Cartera Única en Redmine y asignación de Referentes Secundarios.</w:t>
+      </w:r>
+    </w:p>
     <w:p>
       <w:pPr>
         <w:pStyle w:val="Heading2"/>
@@ -1019,35 +1603,14 @@
           <w:b/>
           <w:bCs/>
         </w:rPr>
-        <w:t xml:space="preserve">5.2 Preservación del conocimiento e institucionalización de Referentes Secundarios (Shadowing)</w:t>
-      </w:r>
-    </w:p>
-    <w:p>
-      <w:r>
-        <w:t xml:space="preserve">La concentración del conocimiento técnico y funcional de sistemas críticos en agentes individuales genera un alto riesgo operacional para la Municipalidad. Ante licencias, traslados o imprevistos, la continuidad del servicio puede verse comprometida por la falta de personal capacitado para intervenir inmediatamente sobre dichos aplicativos.</w:t>
-      </w:r>
-    </w:p>
-    <w:p>
-      <w:r>
-        <w:t xml:space="preserve">Para mitigar este riesgo sin alterar las estructuras escalafonarias vigentes se propone instituir la figura del Referente Secundario (Shadowing). La medida consiste en asignar a un segundo agente para que acompañe al responsable principal de cada sistema crítico en tareas de mantenimiento, actualización y soporte.</w:t>
-      </w:r>
-    </w:p>
-    <w:p>
-      <w:r>
-        <w:t xml:space="preserve">El proceso comenzará con la identificación de los aplicativos de mayor criticidad institucional, la evaluación de las competencias técnicas requeridas y la asignación formal del referente secundario. El esquema contempla instancias periódicas de trabajo conjunto, participación en revisiones de código, acompañamiento en el despliegue de actualizaciones y documentación colaborativa de los procesos clave.</w:t>
-      </w:r>
-    </w:p>
-    <w:p>
-      <w:r>
-        <w:t xml:space="preserve">La Jefatura supervisará el cumplimiento del esquema de acompañamiento, asegurando que el referente secundario disponga de tiempo efectivo en su planificación para participar activamente del mantenimiento de los sistemas asignados.</w:t>
-      </w:r>
-    </w:p>
-    <w:p>
-      <w:r>
-        <w:t xml:space="preserve">La implementación de este esquema permitirá eliminar los puntos únicos de falla (Single Points of Failure), garantizar la continuidad operativa ante contingencias y favorecer la transferencia continua del conocimiento dentro de la organización.</w:t>
-      </w:r>
-    </w:p>
-    <w:p/>
+        <w:t xml:space="preserve">Etapa II – Integrar y estandarizar (Sprints 5 a 12)</w:t>
+      </w:r>
+    </w:p>
+    <w:p>
+      <w:r>
+        <w:t xml:space="preserve">Reuniones transversales inter-oficinas, difusión de guías de buenas prácticas, obligatoriedad del template de arquitectura y gobierno técnico de proveedores.</w:t>
+      </w:r>
+    </w:p>
     <w:p>
       <w:pPr>
         <w:pStyle w:val="Heading2"/>
@@ -1057,35 +1620,14 @@
           <w:b/>
           <w:bCs/>
         </w:rPr>
-        <w:t xml:space="preserve">5.3 Cartera Única de Proyectos y Centralización en Redmine</w:t>
-      </w:r>
-    </w:p>
-    <w:p>
-      <w:r>
-        <w:t xml:space="preserve">Actualmente el seguimiento de requerimientos y proyectos se realiza mediante metodologías y canales heterogéneos, lo que impide contar con una visión integral de la capacidad operativa del Departamento y dificulta la priorización transparente de las solicitudes provenientes de las distintas Secretarías.</w:t>
-      </w:r>
-    </w:p>
-    <w:p>
-      <w:r>
-        <w:t xml:space="preserve">La propuesta contempla consolidar la plataforma Redmine como el repositorio único y obligatorio para el registro, asignación y seguimiento de la totalidad de las actividades del Departamento, incluyendo proyectos nuevos, mantenimientos evolutivos, corrección de incidencias y tareas de asistencia técnica.</w:t>
-      </w:r>
-    </w:p>
-    <w:p>
-      <w:r>
-        <w:t xml:space="preserve">Todas las solicitudes ingresadas deberán clasificarse según su impacto institucional, urgencia y factibilidad técnica. La visibilidad centralizada de la carga de trabajo permitirá estimar plazos de entrega realistas y comunicar con transparencia el estado de los desarrollos a las áreas usuarias.</w:t>
-      </w:r>
-    </w:p>
-    <w:p>
-      <w:r>
-        <w:t xml:space="preserve">La Jefatura asumirá la responsabilidad de administrar la Cartera Única, actuando como filtro frente a las demandas de las dependencias solicitantes, gestionando las prioridades junto a las autoridades y asignando los recursos según la capacidad real del equipo.</w:t>
-      </w:r>
-    </w:p>
-    <w:p>
-      <w:r>
-        <w:t xml:space="preserve">Con esta centralización se logrará unificar la gestión de demandas, mejorar la previsibilidad en los tiempos de respuesta y dotar de total transparencia a la administración de los recursos del Departamento.</w:t>
-      </w:r>
-    </w:p>
-    <w:p/>
+        <w:t xml:space="preserve">Etapa III – Consolidar y transferir (Sprints 13+)</w:t>
+      </w:r>
+    </w:p>
+    <w:p>
+      <w:r>
+        <w:t xml:space="preserve">Medición de KPIs, revisiones de código en GitLab y proyectos de dockerización.</w:t>
+      </w:r>
+    </w:p>
     <w:p>
       <w:pPr>
         <w:pStyle w:val="Heading2"/>
@@ -1095,204 +1637,12 @@
           <w:b/>
           <w:bCs/>
         </w:rPr>
-        <w:t xml:space="preserve">5.4 Modelo de Agilidad Adaptativa (Scrum Master Global / Kanban)</w:t>
-      </w:r>
-    </w:p>
-    <w:p>
-      <w:r>
-        <w:t xml:space="preserve">La diversidad de proyectos y mantenimientos simultáneos dificulta la aplicación rígida de una única metodología de trabajo. Los proyectos nuevos requieren iteraciones planificadas, mientras que la atención de incidencias operativas exige un flujo continuo de respuesta.</w:t>
-      </w:r>
-    </w:p>
-    <w:p>
-      <w:r>
-        <w:t xml:space="preserve">Se propone implementar un marco de Agilidad Adaptativa que combine iteraciones cortas (Sprints) para nuevos desarrollos con gestión de flujo continuo (Kanban) para mantenimientos y soporte técnico. La propuesta contempla reuniones breves de sincronización, priorización periódica del backlog y definición clara de criterios de finalización (Definition of Done).</w:t>
-      </w:r>
-    </w:p>
-    <w:p>
-      <w:r>
-        <w:t xml:space="preserve">Este esquema permitirá flexibilizar la gestión del trabajo sin perder el control sobre los entregables ni saturar al equipo con sobrecargas imprevistas.</w:t>
-      </w:r>
-    </w:p>
-    <w:p>
-      <w:r>
-        <w:t xml:space="preserve">La Jefatura asumirá el rol activo de Scrum Master Global y Gestor, protegiendo al equipo de interrupciones externas, removiendo impedimentos técnicos u organizacionales y ajustando la dinámica de trabajo según los resultados observados.</w:t>
-      </w:r>
-    </w:p>
-    <w:p>
-      <w:r>
-        <w:t xml:space="preserve">La adopción de este marco ágil adaptativo incrementará la productividad técnica, mejorará la adaptabilidad ante requerimientos cambiantes y reducirá el estrés operativo generado por la atención reactiva de emergencias.</w:t>
-      </w:r>
-    </w:p>
-    <w:p/>
-    <w:p>
-      <w:pPr>
-        <w:pStyle w:val="Heading2"/>
-      </w:pPr>
-      <w:r>
-        <w:rPr>
-          <w:b/>
-          <w:bCs/>
-        </w:rPr>
-        <w:t xml:space="preserve">5.5 Estandarización del desarrollo y consolidación de una Arquitectura Base Institucional</w:t>
-      </w:r>
-    </w:p>
-    <w:p>
-      <w:r>
-        <w:t xml:space="preserve">La diversidad de tecnologías, criterios de diseño y convenciones de programación utilizadas a lo largo del tiempo ha generado un ecosistema de aplicaciones heterogéneo, dificultando el mantenimiento, la reutilización de componentes y la incorporación de nuevos desarrolladores a los proyectos existentes.</w:t>
-      </w:r>
-    </w:p>
-    <w:p>
-      <w:r>
-        <w:t xml:space="preserve">Para reducir esta complejidad se propone institucionalizar una Arquitectura Base que establezca criterios comunes para todos los nuevos desarrollos y para aquellas refactorizaciones cuya magnitud justifique su adopción. Esta arquitectura definirá lineamientos sobre organización de proyectos, acceso a datos, autenticación, manejo de errores, configuración, registro de eventos y demás componentes reutilizables, permitiendo desarrollar aplicaciones homogéneas, mantenibles y compatibles entre sí.</w:t>
-      </w:r>
-    </w:p>
-    <w:p>
-      <w:r>
-        <w:t xml:space="preserve">Como complemento, se elaborarán Guías de Buenas Prácticas que unifiquen criterios de codificación, documentación, control de versiones, pruebas y estructura de los proyectos. Estos documentos deberán mantenerse actualizados y evolucionar conforme lo hagan las necesidades del Departamento.</w:t>
-      </w:r>
-    </w:p>
-    <w:p>
-      <w:r>
-        <w:t xml:space="preserve">La Jefatura será responsable de definir estos estándares, promover su utilización, evaluar las excepciones técnicamente justificadas y coordinar su actualización periódica junto con los equipos de desarrollo. Asimismo, impulsará instancias de revisión técnica previas al inicio de nuevos proyectos para verificar la reutilización de componentes existentes y la compatibilidad con la estrategia tecnológica institucional.</w:t>
-      </w:r>
-    </w:p>
-    <w:p>
-      <w:r>
-        <w:t xml:space="preserve">La implementación de estos lineamientos permitirá reducir la deuda técnica, facilitar el mantenimiento evolutivo, simplificar la incorporación de nuevos desarrolladores y asegurar que el crecimiento del software municipal responda a criterios comunes de calidad y sostenibilidad.</w:t>
-      </w:r>
-    </w:p>
-    <w:p/>
-    <w:p>
-      <w:pPr>
-        <w:pStyle w:val="Heading2"/>
-      </w:pPr>
-      <w:r>
-        <w:rPr>
-          <w:b/>
-          <w:bCs/>
-        </w:rPr>
-        <w:t xml:space="preserve">5.6 Gestión de la calidad del software y fortalecimiento de la documentación institucional</w:t>
-      </w:r>
-    </w:p>
-    <w:p>
-      <w:r>
-        <w:t xml:space="preserve">La calidad del software constituye un objetivo transversal del Departamento y debe formar parte del proceso de desarrollo desde las etapas iniciales de cada proyecto. Si bien el equipo posee capacidad técnica para desarrollar soluciones de calidad, la ausencia de criterios homogéneos de revisión y documentación genera diferencias entre proyectos que posteriormente incrementan los tiempos de mantenimiento y dificultan la incorporación de nuevos desarrolladores.</w:t>
-      </w:r>
-    </w:p>
-    <w:p>
-      <w:r>
-        <w:t xml:space="preserve">Con el propósito de fortalecer la calidad de los sistemas municipales, se propone institucionalizar un conjunto de prácticas mínimas aplicables a todos los proyectos, adaptadas a su complejidad y criticidad. El objetivo no consiste en incorporar controles burocráticos, sino en asegurar que cada desarrollo reúna las condiciones necesarias para ser mantenido y evolucionado por cualquier integrante del Departamento.</w:t>
-      </w:r>
-    </w:p>
-    <w:p>
-      <w:r>
-        <w:t xml:space="preserve">Como criterio general, cada proyecto deberá contar con una documentación técnica mínima que describa el objetivo del sistema, su arquitectura general, el modelo de datos utilizado, las integraciones con otros aplicativos, los procedimientos de instalación y despliegue, así como los responsables funcionales y técnicos. La profundidad de esta documentación será proporcional a la complejidad del sistema, evitando generar documentación innecesaria que luego quede desactualizada.</w:t>
-      </w:r>
-    </w:p>
-    <w:p>
-      <w:r>
-        <w:t xml:space="preserve">Del mismo modo, antes de la puesta en producción de modificaciones relevantes se promoverán instancias de revisión técnica orientadas a verificar el cumplimiento de los estándares definidos por el Departamento, la correcta integración con los sistemas existentes y la ausencia de errores evidentes que puedan afectar la operación normal de los servicios municipales.</w:t>
-      </w:r>
-    </w:p>
-    <w:p>
-      <w:r>
-        <w:t xml:space="preserve">La Jefatura será responsable de impulsar estas prácticas como parte habitual del proceso de desarrollo, supervisando su cumplimiento y promoviendo una cultura donde la calidad y la documentación sean entendidas como componentes naturales del trabajo cotidiano.</w:t>
-      </w:r>
-    </w:p>
-    <w:p>
-      <w:r>
-        <w:t xml:space="preserve">La implementación de estas medidas permitirá mejorar la mantenibilidad de las aplicaciones, reducir la dependencia del conocimiento individual y fortalecer la continuidad operativa del Departamento.</w:t>
-      </w:r>
-    </w:p>
-    <w:p/>
-    <w:p>
-      <w:pPr>
-        <w:pStyle w:val="Heading2"/>
-      </w:pPr>
-      <w:r>
-        <w:rPr>
-          <w:b/>
-          <w:bCs/>
-        </w:rPr>
-        <w:t xml:space="preserve">5.7 Gobierno técnico de proveedores externos</w:t>
-      </w:r>
-    </w:p>
-    <w:p>
-      <w:r>
-        <w:t xml:space="preserve">Las funciones asignadas al Departamento comprenden no sólo el desarrollo interno de sistemas informáticos, sino también la supervisión técnica de aquellas soluciones provistas por empresas externas. En consecuencia, la contratación de un proveedor no implica delegar la responsabilidad sobre la calidad del software incorporado al ecosistema municipal.</w:t>
-      </w:r>
-    </w:p>
-    <w:p>
-      <w:r>
-        <w:t xml:space="preserve">La Jefatura deberá asumir un rol activo durante todo el ciclo de contratación, participando en la definición de los requerimientos técnicos, colaborando en la elaboración de las especificaciones funcionales y verificando que las soluciones propuestas resulten compatibles con la arquitectura tecnológica del Municipio y con los estándares definidos por el Departamento.</w:t>
-      </w:r>
-    </w:p>
-    <w:p>
-      <w:r>
-        <w:t xml:space="preserve">Durante la ejecución de los proyectos se promoverán reuniones periódicas de seguimiento técnico que permitan detectar tempranamente desvíos respecto de las especificaciones acordadas, facilitando la resolución de inconvenientes antes de su impacto sobre la implementación.</w:t>
-      </w:r>
-    </w:p>
-    <w:p>
-      <w:r>
-        <w:t xml:space="preserve">Asimismo, previo a la recepción definitiva de cualquier desarrollo contratado, se verificará el cumplimiento de requisitos mínimos que garanticen la autonomía tecnológica del Municipio. Entre ellos se incluyen la entrega del código fuente, la documentación técnica actualizada, los modelos de datos, los procedimientos de instalación y despliegue, la descripción de las interfaces de integración y las evidencias de las pruebas realizadas.</w:t>
-      </w:r>
-    </w:p>
-    <w:p>
-      <w:r>
-        <w:t xml:space="preserve">Cuando los contratos contemplen servicios de mantenimiento, la Jefatura actuará además como nexo técnico entre las áreas usuarias y los proveedores, coordinando la gestión de incidencias, verificando el cumplimiento de los niveles de servicio comprometidos y controlando la calidad de las soluciones implementadas.</w:t>
-      </w:r>
-    </w:p>
-    <w:p>
-      <w:r>
-        <w:t xml:space="preserve">De esta manera se fortalece el rol institucional del Departamento como autoridad técnica sobre los sistemas municipales, evitando la dependencia tecnológica de proveedores externos y asegurando que el conocimiento generado permanezca dentro de la organización.</w:t>
-      </w:r>
-    </w:p>
-    <w:p/>
-    <w:p>
-      <w:pPr>
-        <w:pStyle w:val="Heading2"/>
-      </w:pPr>
-      <w:r>
-        <w:rPr>
-          <w:b/>
-          <w:bCs/>
-        </w:rPr>
-        <w:t xml:space="preserve">5.8 Innovación tecnológica y utilización responsable de Inteligencia Artificial</w:t>
-      </w:r>
-    </w:p>
-    <w:p>
-      <w:r>
-        <w:t xml:space="preserve">La innovación tecnológica constituye una función permanente del Departamento y debe orientarse a mejorar la calidad de los servicios brindados por la Municipalidad. Sin embargo, la incorporación de nuevas herramientas debe responder a una planificación institucional y no únicamente a iniciativas individuales o tendencias del mercado.</w:t>
-      </w:r>
-    </w:p>
-    <w:p>
-      <w:r>
-        <w:t xml:space="preserve">La Jefatura impulsará un proceso continuo de evaluación de tecnologías, metodologías y herramientas de desarrollo, analizando su impacto sobre la infraestructura existente, los costos de adopción, las necesidades de capacitación y los beneficios concretos que puedan aportar a la gestión municipal. Sólo aquellas soluciones que demuestren una mejora objetiva en la productividad, la seguridad o la calidad del software serán incorporadas como estándares institucionales.</w:t>
-      </w:r>
-    </w:p>
-    <w:p>
-      <w:r>
-        <w:t xml:space="preserve">Dentro de este escenario, las herramientas basadas en Inteligencia Artificial representan una oportunidad para asistir al equipo de desarrollo en tareas como generación de código, documentación técnica, análisis de errores y automatización de actividades repetitivas. Su utilización permitirá reducir tiempos operativos y mejorar la productividad del Departamento, siempre que su uso se realice bajo criterios claros de seguridad y confidencialidad.</w:t>
-      </w:r>
-    </w:p>
-    <w:p>
-      <w:r>
-        <w:t xml:space="preserve">Por tal motivo se establecerán lineamientos que prohíban expresamente incorporar en plataformas públicas de Inteligencia Artificial información sensible, datos personales de ciudadanos, credenciales institucionales o cualquier otro contenido protegido por las políticas de seguridad del Municipio.</w:t>
-      </w:r>
-    </w:p>
-    <w:p>
-      <w:r>
-        <w:t xml:space="preserve">Asimismo, toda producción generada mediante estas herramientas deberá ser revisada y validada por el profesional responsable del desarrollo antes de incorporarse a los sistemas municipales, manteniendo en todo momento la responsabilidad técnica sobre las decisiones adoptadas.</w:t>
-      </w:r>
-    </w:p>
-    <w:p>
-      <w:r>
-        <w:t xml:space="preserve">Como proyección futura, y sujeto a disponibilidad presupuestaria, podrá evaluarse la incorporación de plataformas corporativas de Inteligencia Artificial administradas por el Municipio, que ofrezcan mayores garantías de privacidad, trazabilidad y administración centralizada.</w:t>
-      </w:r>
-    </w:p>
-    <w:p>
-      <w:r>
-        <w:t xml:space="preserve">De este modo, la innovación tecnológica dejará de depender de decisiones individuales para transformarse en una política institucional permanente, orientada a fortalecer la capacidad del Departamento para brindar soluciones modernas, seguras y sostenibles.</w:t>
+        <w:t xml:space="preserve">Proceso permanente – Evaluar, capacitar e innovar</w:t>
+      </w:r>
+    </w:p>
+    <w:p>
+      <w:r>
+        <w:t xml:space="preserve">Auditorías periódicas de procedimientos, actualización de capacitaciones y evaluación de innovaciones.</w:t>
       </w:r>
     </w:p>
     <w:p/>
@@ -1305,458 +1655,7 @@
           <w:b/>
           <w:bCs/>
         </w:rPr>
-        <w:t xml:space="preserve">6. OPTIMIZACIÓN DE RECURSOS Y ESCENARIOS DE INVERSIÓN</w:t>
-      </w:r>
-    </w:p>
-    <w:p>
-      <w:r>
-        <w:rPr>
-          <w:i/>
-          <w:iCs/>
-        </w:rPr>
-        <w:t xml:space="preserve">La primera responsabilidad de una Jefatura consiste en optimizar los recursos existentes antes de requerir nuevas incorporaciones presupuestarias. En consecuencia, las acciones propuestas en esta etapa priorizan la reorganización del trabajo, la mejora de los procedimientos y el fortalecimiento de la coordinación interna, aprovechando la infraestructura y el capital humano actualmente disponibles.</w:t>
-      </w:r>
-    </w:p>
-    <w:p>
-      <w:pPr>
-        <w:pStyle w:val="Heading2"/>
-      </w:pPr>
-      <w:r>
-        <w:rPr>
-          <w:b/>
-          <w:bCs/>
-        </w:rPr>
-        <w:t xml:space="preserve">6.1 Escenario SIN PRESUPUESTO (Plan Realista - Costo $0)</w:t>
-      </w:r>
-    </w:p>
-    <w:p>
-      <w:r>
-        <w:rPr>
-          <w:b/>
-          <w:bCs/>
-        </w:rPr>
-        <w:t xml:space="preserve">1. Liderazgo Híbrido: </w:t>
-      </w:r>
-      <w:r>
-        <w:t xml:space="preserve">Jefatura como Scrum Master Global (filtro de cargas entre oficinas) y Gestor.</w:t>
-      </w:r>
-    </w:p>
-    <w:p>
-      <w:r>
-        <w:rPr>
-          <w:b/>
-          <w:bCs/>
-        </w:rPr>
-        <w:t xml:space="preserve">2. Mitigación de Puntos Únicos de Falla: </w:t>
-      </w:r>
-      <w:r>
-        <w:t xml:space="preserve">Asignación de Referentes Secundarios en sistemas críticos.</w:t>
-      </w:r>
-    </w:p>
-    <w:p>
-      <w:r>
-        <w:rPr>
-          <w:b/>
-          <w:bCs/>
-        </w:rPr>
-        <w:t xml:space="preserve">3. Estandarización Obligatoria: </w:t>
-      </w:r>
-      <w:r>
-        <w:t xml:space="preserve">Uso del Template de Arquitectura Base municipal (Congelamiento Legacy).</w:t>
-      </w:r>
-    </w:p>
-    <w:p>
-      <w:r>
-        <w:rPr>
-          <w:b/>
-          <w:bCs/>
-        </w:rPr>
-        <w:t xml:space="preserve">4. Gobernanza de Proveedores: </w:t>
-      </w:r>
-      <w:r>
-        <w:t xml:space="preserve">Exigencia de código fuente, manuales y pruebas de recepción antes de la aceptación.</w:t>
-      </w:r>
-    </w:p>
-    <w:p>
-      <w:r>
-        <w:rPr>
-          <w:b/>
-          <w:bCs/>
-        </w:rPr>
-        <w:t xml:space="preserve">5. Uso Seguro de IA: </w:t>
-      </w:r>
-      <w:r>
-        <w:t xml:space="preserve">Protocolo de resguardo de datos sensibles en asistentes de código.</w:t>
-      </w:r>
-    </w:p>
-    <w:p/>
-    <w:p>
-      <w:pPr>
-        <w:pStyle w:val="Heading2"/>
-      </w:pPr>
-      <w:r>
-        <w:rPr>
-          <w:b/>
-          <w:bCs/>
-        </w:rPr>
-        <w:t xml:space="preserve">6.2 Escenario CON PRESUPUESTO (Plan Proyectado a Mediano/Largo Plazo)</w:t>
-      </w:r>
-    </w:p>
-    <w:p>
-      <w:r>
-        <w:rPr>
-          <w:b/>
-          <w:bCs/>
-        </w:rPr>
-        <w:t xml:space="preserve">1. Licencias Corporativas Oficiales de IA: </w:t>
-      </w:r>
-      <w:r>
-        <w:t xml:space="preserve">Adquisición de licencias para IDEs en entornos privados institucionales.</w:t>
-      </w:r>
-    </w:p>
-    <w:p>
-      <w:r>
-        <w:rPr>
-          <w:b/>
-          <w:bCs/>
-        </w:rPr>
-        <w:t xml:space="preserve">2. Plataforma de Análisis Estático de Calidad: </w:t>
-      </w:r>
-      <w:r>
-        <w:t xml:space="preserve">Herramientas automatizadas (ej. SonarQube) para auditar deuda técnica y seguridad.</w:t>
-      </w:r>
-    </w:p>
-    <w:p>
-      <w:r>
-        <w:rPr>
-          <w:b/>
-          <w:bCs/>
-        </w:rPr>
-        <w:t xml:space="preserve">3. Contenerización e Infraestructura: </w:t>
-      </w:r>
-      <w:r>
-        <w:t xml:space="preserve">Proyección presupuestaria para migración a contenedores Docker.</w:t>
-      </w:r>
-    </w:p>
-    <w:p>
-      <w:r>
-        <w:rPr>
-          <w:b/>
-          <w:bCs/>
-        </w:rPr>
-        <w:t xml:space="preserve">4. Capacitación Formal Externa: </w:t>
-      </w:r>
-      <w:r>
-        <w:t xml:space="preserve">Cursos profesionales en Clean Architecture, APIs y Microservicios.</w:t>
-      </w:r>
-    </w:p>
-    <w:p>
-      <w:r>
-        <w:rPr>
-          <w:b/>
-          <w:bCs/>
-        </w:rPr>
-        <w:t xml:space="preserve">5. Equipamiento para Trabajo Colaborativo: </w:t>
-      </w:r>
-      <w:r>
-        <w:t xml:space="preserve">Provisión de webcams y auriculares con micrófono para puestos de trabajo.</w:t>
-      </w:r>
-    </w:p>
-    <w:p/>
-    <w:p>
-      <w:pPr>
-        <w:pStyle w:val="Heading1"/>
-      </w:pPr>
-      <w:r>
-        <w:rPr>
-          <w:b/>
-          <w:bCs/>
-        </w:rPr>
-        <w:t xml:space="preserve">7. ESTRATEGIA DE IMPLEMENTACIÓN Y ROADMAP POR ETAPAS</w:t>
-      </w:r>
-    </w:p>
-    <w:p>
-      <w:pPr>
-        <w:pStyle w:val="Heading2"/>
-      </w:pPr>
-      <w:r>
-        <w:rPr>
-          <w:b/>
-          <w:bCs/>
-        </w:rPr>
-        <w:t xml:space="preserve">7.1 Fases de la Hoja de Ruta Ágil</w:t>
-      </w:r>
-    </w:p>
-    <w:p>
-      <w:pPr>
-        <w:pStyle w:val="ListParagraph"/>
-        <w:numPr>
-          <w:ilvl w:val="0"/>
-          <w:numId w:val="1"/>
-        </w:numPr>
-      </w:pPr>
-      <w:r>
-        <w:rPr>
-          <w:b/>
-          <w:bCs/>
-        </w:rPr>
-        <w:t xml:space="preserve">Etapa I – Conocer y Ordenar (Sprints 1 a 4): </w:t>
-      </w:r>
-      <w:r>
-        <w:t xml:space="preserve">Relevamiento de competencias, inventario de sistemas, conformación de la Cartera Única en Redmine y asignación de Referentes Secundarios.</w:t>
-      </w:r>
-    </w:p>
-    <w:p>
-      <w:pPr>
-        <w:pStyle w:val="ListParagraph"/>
-        <w:numPr>
-          <w:ilvl w:val="0"/>
-          <w:numId w:val="1"/>
-        </w:numPr>
-      </w:pPr>
-      <w:r>
-        <w:rPr>
-          <w:b/>
-          <w:bCs/>
-        </w:rPr>
-        <w:t xml:space="preserve">Etapa II – Integrar y Estandarizar (Sprints 5 a 12): </w:t>
-      </w:r>
-      <w:r>
-        <w:t xml:space="preserve">Reuniones transversales inter-oficinas, difusión de guías de buenas prácticas, obligatoriedad del template de arquitectura y gobierno técnico de proveedores.</w:t>
-      </w:r>
-    </w:p>
-    <w:p>
-      <w:pPr>
-        <w:pStyle w:val="ListParagraph"/>
-        <w:numPr>
-          <w:ilvl w:val="0"/>
-          <w:numId w:val="1"/>
-        </w:numPr>
-      </w:pPr>
-      <w:r>
-        <w:rPr>
-          <w:b/>
-          <w:bCs/>
-        </w:rPr>
-        <w:t xml:space="preserve">Etapa III – Consolidar y Evaluar (Sprints 13+): </w:t>
-      </w:r>
-      <w:r>
-        <w:t xml:space="preserve">Medición de KPIs, revisiones de código en GitLab y proyectos de dockerización.</w:t>
-      </w:r>
-    </w:p>
-    <w:p>
-      <w:pPr>
-        <w:pStyle w:val="ListParagraph"/>
-        <w:numPr>
-          <w:ilvl w:val="0"/>
-          <w:numId w:val="1"/>
-        </w:numPr>
-      </w:pPr>
-      <w:r>
-        <w:rPr>
-          <w:b/>
-          <w:bCs/>
-        </w:rPr>
-        <w:t xml:space="preserve">Proceso Permanente – Mejora Continua: </w:t>
-      </w:r>
-      <w:r>
-        <w:t xml:space="preserve">Auditorías periódicas de procedimientos, actualización de capacitaciones y evaluación de innovaciones.</w:t>
-      </w:r>
-    </w:p>
-    <w:p/>
-    <w:p>
-      <w:pPr>
-        <w:pStyle w:val="Heading2"/>
-      </w:pPr>
-      <w:r>
-        <w:rPr>
-          <w:b/>
-          <w:bCs/>
-        </w:rPr>
-        <w:t xml:space="preserve">7.2 Cuadro Resumen de Implementación</w:t>
-      </w:r>
-    </w:p>
-    <w:tbl>
-      <w:tblPr>
-        <w:tblW w:type="pct" w:w="100%"/>
-        <w:tblBorders>
-          <w:top w:val="single" w:color="auto" w:sz="4"/>
-          <w:left w:val="single" w:color="auto" w:sz="4"/>
-          <w:bottom w:val="single" w:color="auto" w:sz="4"/>
-          <w:right w:val="single" w:color="auto" w:sz="4"/>
-          <w:insideH w:val="single" w:color="auto" w:sz="4"/>
-          <w:insideV w:val="single" w:color="auto" w:sz="4"/>
-        </w:tblBorders>
-      </w:tblPr>
-      <w:tblGrid>
-        <w:gridCol w:w="100"/>
-        <w:gridCol w:w="100"/>
-        <w:gridCol w:w="100"/>
-      </w:tblGrid>
-      <w:tr>
-        <w:tc>
-          <w:tcPr>
-            <w:tcW w:type="pct" w:w="30%"/>
-          </w:tcPr>
-          <w:p>
-            <w:r>
-              <w:rPr>
-                <w:b/>
-                <w:bCs/>
-              </w:rPr>
-              <w:t xml:space="preserve">Etapa</w:t>
-            </w:r>
-          </w:p>
-        </w:tc>
-        <w:tc>
-          <w:tcPr>
-            <w:tcW w:type="pct" w:w="35%"/>
-          </w:tcPr>
-          <w:p>
-            <w:r>
-              <w:rPr>
-                <w:b/>
-                <w:bCs/>
-              </w:rPr>
-              <w:t xml:space="preserve">Objetivo Principal</w:t>
-            </w:r>
-          </w:p>
-        </w:tc>
-        <w:tc>
-          <w:tcPr>
-            <w:tcW w:type="pct" w:w="35%"/>
-          </w:tcPr>
-          <w:p>
-            <w:r>
-              <w:rPr>
-                <w:b/>
-                <w:bCs/>
-              </w:rPr>
-              <w:t xml:space="preserve">Resultado Esperado</w:t>
-            </w:r>
-          </w:p>
-        </w:tc>
-      </w:tr>
-      <w:tr>
-        <w:tc>
-          <w:p>
-            <w:r>
-              <w:rPr>
-                <w:b/>
-                <w:bCs/>
-              </w:rPr>
-              <w:t xml:space="preserve">Organización (Etapa I)</w:t>
-            </w:r>
-          </w:p>
-        </w:tc>
-        <w:tc>
-          <w:p>
-            <w:r>
-              <w:t xml:space="preserve">Conocer e inventariar el Departamento</w:t>
-            </w:r>
-          </w:p>
-        </w:tc>
-        <w:tc>
-          <w:p>
-            <w:r>
-              <w:t xml:space="preserve">Inventario completo de sistemas y Matriz de Competencias</w:t>
-            </w:r>
-          </w:p>
-        </w:tc>
-      </w:tr>
-      <w:tr>
-        <w:tc>
-          <w:p>
-            <w:r>
-              <w:rPr>
-                <w:b/>
-                <w:bCs/>
-              </w:rPr>
-              <w:t xml:space="preserve">Estandarización (Etapa II)</w:t>
-            </w:r>
-          </w:p>
-        </w:tc>
-        <w:tc>
-          <w:p>
-            <w:r>
-              <w:t xml:space="preserve">Unificar procedimientos y arquitectura</w:t>
-            </w:r>
-          </w:p>
-        </w:tc>
-        <w:tc>
-          <w:p>
-            <w:r>
-              <w:t xml:space="preserve">Procesos homogéneos y guías instituidas</w:t>
-            </w:r>
-          </w:p>
-        </w:tc>
-      </w:tr>
-      <w:tr>
-        <w:tc>
-          <w:p>
-            <w:r>
-              <w:rPr>
-                <w:b/>
-                <w:bCs/>
-              </w:rPr>
-              <w:t xml:space="preserve">Consolidación (Etapa III)</w:t>
-            </w:r>
-          </w:p>
-        </w:tc>
-        <w:tc>
-          <w:p>
-            <w:r>
-              <w:t xml:space="preserve">Reducir riesgos operacionales</w:t>
-            </w:r>
-          </w:p>
-        </w:tc>
-        <w:tc>
-          <w:p>
-            <w:r>
-              <w:t xml:space="preserve">Conocimiento distribuido (Referentes Secundarios) y KPIs</w:t>
-            </w:r>
-          </w:p>
-        </w:tc>
-      </w:tr>
-      <w:tr>
-        <w:tc>
-          <w:p>
-            <w:r>
-              <w:rPr>
-                <w:b/>
-                <w:bCs/>
-              </w:rPr>
-              <w:t xml:space="preserve">Innovación (Permanente)</w:t>
-            </w:r>
-          </w:p>
-        </w:tc>
-        <w:tc>
-          <w:p>
-            <w:r>
-              <w:t xml:space="preserve">Evolución tecnológica y adopción de IA</w:t>
-            </w:r>
-          </w:p>
-        </w:tc>
-        <w:tc>
-          <w:p>
-            <w:r>
-              <w:t xml:space="preserve">Mayor productividad y soluciones sostenibles</w:t>
-            </w:r>
-          </w:p>
-        </w:tc>
-      </w:tr>
-    </w:tbl>
-    <w:p/>
-    <w:p>
-      <w:pPr>
-        <w:pStyle w:val="Heading1"/>
-      </w:pPr>
-      <w:r>
-        <w:rPr>
-          <w:b/>
-          <w:bCs/>
-        </w:rPr>
-        <w:t xml:space="preserve">8. MATRIZ DE INDICADORES DE EVALUACIÓN Y GESTIÓN (KPIs)</w:t>
+        <w:t xml:space="preserve">12. Indicadores de gestión y mejora continua (KPIs)</w:t>
       </w:r>
     </w:p>
     <w:tbl>
@@ -1993,7 +1892,19 @@
           <w:b/>
           <w:bCs/>
         </w:rPr>
-        <w:t xml:space="preserve">9. SECTORES DEL DEPARTAMENTO (MATRIZ DINÁMICA DE TRABAJO)</w:t>
+        <w:t xml:space="preserve">13. Sectores del Departamento y Conclusión</w:t>
+      </w:r>
+    </w:p>
+    <w:p>
+      <w:pPr>
+        <w:pStyle w:val="Heading2"/>
+      </w:pPr>
+      <w:r>
+        <w:rPr>
+          <w:b/>
+          <w:bCs/>
+        </w:rPr>
+        <w:t xml:space="preserve">13.1. Organización funcional según Decreto N° 2250/98</w:t>
       </w:r>
     </w:p>
     <w:p>
@@ -2040,14 +1951,14 @@
     <w:p/>
     <w:p>
       <w:pPr>
-        <w:pStyle w:val="Heading1"/>
-      </w:pPr>
-      <w:r>
-        <w:rPr>
-          <w:b/>
-          <w:bCs/>
-        </w:rPr>
-        <w:t xml:space="preserve">10. CONCLUSIONES</w:t>
+        <w:pStyle w:val="Heading2"/>
+      </w:pPr>
+      <w:r>
+        <w:rPr>
+          <w:b/>
+          <w:bCs/>
+        </w:rPr>
+        <w:t xml:space="preserve">13.2. Síntesis e impacto institucional final</w:t>
       </w:r>
     </w:p>
     <w:p>

</xml_diff>

<commit_message>
Mantiene nuestra estructura de 10 secciones y aplica el formato visual exacto de Gabriela López (Arial, Justificado, Márgenes y Espaciados)
</commit_message>
<xml_diff>
--- a/Plan_Trabajo_Jefatura_Software_Version_Director.docx
+++ b/Plan_Trabajo_Jefatura_Software_Version_Director.docx
@@ -8,6 +8,7 @@
       </w:pPr>
       <w:r>
         <w:rPr>
+          <w:rFonts w:ascii="Arial" w:cs="Arial" w:eastAsia="Arial" w:hAnsi="Arial"/>
           <w:b/>
           <w:bCs/>
           <w:sz w:val="24"/>
@@ -22,6 +23,7 @@
       </w:pPr>
       <w:r>
         <w:rPr>
+          <w:rFonts w:ascii="Arial" w:cs="Arial" w:eastAsia="Arial" w:hAnsi="Arial"/>
           <w:b/>
           <w:bCs/>
           <w:sz w:val="20"/>
@@ -36,6 +38,7 @@
       </w:pPr>
       <w:r>
         <w:rPr>
+          <w:rFonts w:ascii="Arial" w:cs="Arial" w:eastAsia="Arial" w:hAnsi="Arial"/>
           <w:b/>
           <w:bCs/>
           <w:sz w:val="20"/>
@@ -51,6 +54,7 @@
       </w:pPr>
       <w:r>
         <w:rPr>
+          <w:rFonts w:ascii="Arial" w:cs="Arial" w:eastAsia="Arial" w:hAnsi="Arial"/>
           <w:b/>
           <w:bCs/>
           <w:sz w:val="22"/>
@@ -65,6 +69,7 @@
       </w:pPr>
       <w:r>
         <w:rPr>
+          <w:rFonts w:ascii="Arial" w:cs="Arial" w:eastAsia="Arial" w:hAnsi="Arial"/>
           <w:b/>
           <w:bCs/>
           <w:sz w:val="22"/>
@@ -79,6 +84,7 @@
       </w:pPr>
       <w:r>
         <w:rPr>
+          <w:rFonts w:ascii="Arial" w:cs="Arial" w:eastAsia="Arial" w:hAnsi="Arial"/>
           <w:i/>
           <w:iCs/>
           <w:sz w:val="20"/>
@@ -95,6 +101,7 @@
       </w:pPr>
       <w:r>
         <w:rPr>
+          <w:rFonts w:ascii="Arial" w:cs="Arial" w:eastAsia="Arial" w:hAnsi="Arial"/>
           <w:b/>
           <w:bCs/>
           <w:sz w:val="28"/>
@@ -109,6 +116,7 @@
       </w:pPr>
       <w:r>
         <w:rPr>
+          <w:rFonts w:ascii="Arial" w:cs="Arial" w:eastAsia="Arial" w:hAnsi="Arial"/>
           <w:b/>
           <w:bCs/>
           <w:sz w:val="22"/>
@@ -124,6 +132,7 @@
       </w:pPr>
       <w:r>
         <w:rPr>
+          <w:rFonts w:ascii="Arial" w:cs="Arial" w:eastAsia="Arial" w:hAnsi="Arial"/>
           <w:i/>
           <w:iCs/>
           <w:sz w:val="22"/>
@@ -136,36 +145,48 @@
     <w:p>
       <w:r>
         <w:rPr>
+          <w:rFonts w:ascii="Arial" w:cs="Arial" w:eastAsia="Arial" w:hAnsi="Arial"/>
           <w:b/>
           <w:bCs/>
         </w:rPr>
         <w:t xml:space="preserve">Postulante: </w:t>
       </w:r>
       <w:r>
+        <w:rPr>
+          <w:rFonts w:ascii="Arial" w:cs="Arial" w:eastAsia="Arial" w:hAnsi="Arial"/>
+        </w:rPr>
         <w:t xml:space="preserve">Guido Cassulo</w:t>
       </w:r>
     </w:p>
     <w:p>
       <w:r>
         <w:rPr>
+          <w:rFonts w:ascii="Arial" w:cs="Arial" w:eastAsia="Arial" w:hAnsi="Arial"/>
           <w:b/>
           <w:bCs/>
         </w:rPr>
         <w:t xml:space="preserve">Cargo Actual: </w:t>
       </w:r>
       <w:r>
+        <w:rPr>
+          <w:rFonts w:ascii="Arial" w:cs="Arial" w:eastAsia="Arial" w:hAnsi="Arial"/>
+        </w:rPr>
         <w:t xml:space="preserve">Analista Programador / Personal de Software</w:t>
       </w:r>
     </w:p>
     <w:p>
       <w:r>
         <w:rPr>
+          <w:rFonts w:ascii="Arial" w:cs="Arial" w:eastAsia="Arial" w:hAnsi="Arial"/>
           <w:b/>
           <w:bCs/>
         </w:rPr>
         <w:t xml:space="preserve">Legajo N°: </w:t>
       </w:r>
       <w:r>
+        <w:rPr>
+          <w:rFonts w:ascii="Arial" w:cs="Arial" w:eastAsia="Arial" w:hAnsi="Arial"/>
+        </w:rPr>
         <w:t xml:space="preserve">[Completar Legajo]</w:t>
       </w:r>
     </w:p>
@@ -176,6 +197,7 @@
       </w:pPr>
       <w:r>
         <w:rPr>
+          <w:rFonts w:ascii="Arial" w:cs="Arial" w:eastAsia="Arial" w:hAnsi="Arial"/>
           <w:i/>
           <w:iCs/>
         </w:rPr>
@@ -185,172 +207,17 @@
     <w:p/>
     <w:p>
       <w:pPr>
-        <w:pStyle w:val="Heading2"/>
-      </w:pPr>
-      <w:r>
-        <w:rPr>
-          <w:b/>
-          <w:bCs/>
-        </w:rPr>
-        <w:t xml:space="preserve">Índice</w:t>
-      </w:r>
-    </w:p>
-    <w:p>
-      <w:r>
-        <w:t xml:space="preserve">1. Introducción y fundamentación</w:t>
-      </w:r>
-    </w:p>
-    <w:p>
-      <w:r>
-        <w:t xml:space="preserve">2. Diagnóstico integral</w:t>
-      </w:r>
-    </w:p>
-    <w:p>
-      <w:r>
-        <w:t xml:space="preserve">   2.1. Situación actual del Departamento</w:t>
-      </w:r>
-    </w:p>
-    <w:p>
-      <w:r>
-        <w:t xml:space="preserve">   2.2. Análisis FODA</w:t>
-      </w:r>
-    </w:p>
-    <w:p>
-      <w:r>
-        <w:t xml:space="preserve">   2.3. Conclusión del diagnóstico</w:t>
-      </w:r>
-    </w:p>
-    <w:p>
-      <w:r>
-        <w:t xml:space="preserve">3. Objetivos</w:t>
-      </w:r>
-    </w:p>
-    <w:p>
-      <w:r>
-        <w:t xml:space="preserve">   3.1. Objetivo general</w:t>
-      </w:r>
-    </w:p>
-    <w:p>
-      <w:r>
-        <w:t xml:space="preserve">   3.2. Objetivos específicos</w:t>
-      </w:r>
-    </w:p>
-    <w:p>
-      <w:r>
-        <w:t xml:space="preserve">4. Eje I – Personas, motivación y desarrollo del equipo</w:t>
-      </w:r>
-    </w:p>
-    <w:p>
-      <w:r>
-        <w:t xml:space="preserve">   4.1. Comunicación y coordinación permanente entre dependencias</w:t>
-      </w:r>
-    </w:p>
-    <w:p>
-      <w:r>
-        <w:t xml:space="preserve">   4.2. Desarrollo de competencias y Matriz de Competencias</w:t>
-      </w:r>
-    </w:p>
-    <w:p>
-      <w:r>
-        <w:t xml:space="preserve">5. Eje II – Gestión del conocimiento y continuidad operativa</w:t>
-      </w:r>
-    </w:p>
-    <w:p>
-      <w:r>
-        <w:t xml:space="preserve">   5.1. Preservación del conocimiento e institucionalización de Referentes Secundarios (Shadowing)</w:t>
-      </w:r>
-    </w:p>
-    <w:p>
-      <w:r>
-        <w:t xml:space="preserve">   5.2. Documentación mínima y útil</w:t>
-      </w:r>
-    </w:p>
-    <w:p>
-      <w:r>
-        <w:t xml:space="preserve">6. Eje III – Modelo común de gestión y desarrollo</w:t>
-      </w:r>
-    </w:p>
-    <w:p>
-      <w:r>
-        <w:t xml:space="preserve">   6.1. Cartera Única de Proyectos y centralización en Redmine</w:t>
-      </w:r>
-    </w:p>
-    <w:p>
-      <w:r>
-        <w:t xml:space="preserve">   6.2. Modelo de Agilidad Adaptativa (Scrum Master Global / Kanban)</w:t>
-      </w:r>
-    </w:p>
-    <w:p>
-      <w:r>
-        <w:t xml:space="preserve">7. Eje IV – Arquitectura de referencia, calidad, seguridad e innovación</w:t>
-      </w:r>
-    </w:p>
-    <w:p>
-      <w:r>
-        <w:t xml:space="preserve">   7.1. Estandarización del desarrollo y consolidación de una Arquitectura Base Institucional</w:t>
-      </w:r>
-    </w:p>
-    <w:p>
-      <w:r>
-        <w:t xml:space="preserve">   7.2. Gestión de la calidad del software y fortalecimiento de la documentación institucional</w:t>
-      </w:r>
-    </w:p>
-    <w:p>
-      <w:r>
-        <w:t xml:space="preserve">   7.3. Innovación tecnológica y utilización responsable de Inteligencia Artificial</w:t>
-      </w:r>
-    </w:p>
-    <w:p>
-      <w:r>
-        <w:t xml:space="preserve">8. Eje V – Gestión de demanda y proveedores externos</w:t>
-      </w:r>
-    </w:p>
-    <w:p>
-      <w:r>
-        <w:t xml:space="preserve">   8.1. Gobierno técnico de proveedores externos</w:t>
-      </w:r>
-    </w:p>
-    <w:p>
-      <w:r>
-        <w:t xml:space="preserve">   8.2. Gestión de la relación con las áreas usuarias</w:t>
-      </w:r>
-    </w:p>
-    <w:p>
-      <w:r>
-        <w:t xml:space="preserve">9. Optimización con recursos actuales (Escenario $0)</w:t>
-      </w:r>
-    </w:p>
-    <w:p>
-      <w:r>
-        <w:t xml:space="preserve">10. Proyección con incorporación de recursos (Escenario con presupuesto)</w:t>
-      </w:r>
-    </w:p>
-    <w:p>
-      <w:r>
-        <w:t xml:space="preserve">11. Estrategia de implementación (Roadmap por etapas)</w:t>
-      </w:r>
-    </w:p>
-    <w:p>
-      <w:r>
-        <w:t xml:space="preserve">12. Indicadores de gestión y mejora continua (KPIs)</w:t>
-      </w:r>
-    </w:p>
-    <w:p>
-      <w:r>
-        <w:t xml:space="preserve">13. Sectores del Departamento y Conclusión</w:t>
-      </w:r>
-    </w:p>
-    <w:p/>
-    <w:p>
-      <w:pPr>
         <w:pStyle w:val="Heading1"/>
       </w:pPr>
       <w:r>
         <w:rPr>
-          <w:b/>
-          <w:bCs/>
-        </w:rPr>
-        <w:t xml:space="preserve">1. Introducción y fundamentación</w:t>
+          <w:rFonts w:ascii="Arial" w:cs="Arial" w:eastAsia="Arial" w:hAnsi="Arial"/>
+          <w:b/>
+          <w:bCs/>
+          <w:sz w:val="28"/>
+          <w:szCs w:val="28"/>
+        </w:rPr>
+        <w:t xml:space="preserve">1. INTRODUCCIÓN</w:t>
       </w:r>
     </w:p>
     <w:p>
@@ -480,10 +347,13 @@
       </w:pPr>
       <w:r>
         <w:rPr>
-          <w:b/>
-          <w:bCs/>
-        </w:rPr>
-        <w:t xml:space="preserve">2. Diagnóstico integral</w:t>
+          <w:rFonts w:ascii="Arial" w:cs="Arial" w:eastAsia="Arial" w:hAnsi="Arial"/>
+          <w:b/>
+          <w:bCs/>
+          <w:sz w:val="28"/>
+          <w:szCs w:val="28"/>
+        </w:rPr>
+        <w:t xml:space="preserve">2. DIAGNÓSTICO INSTITUCIONAL</w:t>
       </w:r>
     </w:p>
     <w:p>
@@ -492,10 +362,13 @@
       </w:pPr>
       <w:r>
         <w:rPr>
-          <w:b/>
-          <w:bCs/>
-        </w:rPr>
-        <w:t xml:space="preserve">2.1. Situación actual del Departamento</w:t>
+          <w:rFonts w:ascii="Arial" w:cs="Arial" w:eastAsia="Arial" w:hAnsi="Arial"/>
+          <w:b/>
+          <w:bCs/>
+          <w:sz w:val="24"/>
+          <w:szCs w:val="24"/>
+        </w:rPr>
+        <w:t xml:space="preserve">2.1 Situación actual del Departamento</w:t>
       </w:r>
     </w:p>
     <w:p>
@@ -525,10 +398,13 @@
       </w:pPr>
       <w:r>
         <w:rPr>
-          <w:b/>
-          <w:bCs/>
-        </w:rPr>
-        <w:t xml:space="preserve">2.2. Análisis FODA</w:t>
+          <w:rFonts w:ascii="Arial" w:cs="Arial" w:eastAsia="Arial" w:hAnsi="Arial"/>
+          <w:b/>
+          <w:bCs/>
+          <w:sz w:val="24"/>
+          <w:szCs w:val="24"/>
+        </w:rPr>
+        <w:t xml:space="preserve">2.2 Análisis FODA</w:t>
       </w:r>
     </w:p>
     <w:p>
@@ -537,8 +413,11 @@
       </w:pPr>
       <w:r>
         <w:rPr>
-          <w:b/>
-          <w:bCs/>
+          <w:rFonts w:ascii="Arial" w:cs="Arial" w:eastAsia="Arial" w:hAnsi="Arial"/>
+          <w:b/>
+          <w:bCs/>
+          <w:sz w:val="22"/>
+          <w:szCs w:val="22"/>
         </w:rPr>
         <w:t xml:space="preserve">Fortalezas</w:t>
       </w:r>
@@ -598,8 +477,11 @@
       </w:pPr>
       <w:r>
         <w:rPr>
-          <w:b/>
-          <w:bCs/>
+          <w:rFonts w:ascii="Arial" w:cs="Arial" w:eastAsia="Arial" w:hAnsi="Arial"/>
+          <w:b/>
+          <w:bCs/>
+          <w:sz w:val="22"/>
+          <w:szCs w:val="22"/>
         </w:rPr>
         <w:t xml:space="preserve">Oportunidades</w:t>
       </w:r>
@@ -659,8 +541,11 @@
       </w:pPr>
       <w:r>
         <w:rPr>
-          <w:b/>
-          <w:bCs/>
+          <w:rFonts w:ascii="Arial" w:cs="Arial" w:eastAsia="Arial" w:hAnsi="Arial"/>
+          <w:b/>
+          <w:bCs/>
+          <w:sz w:val="22"/>
+          <w:szCs w:val="22"/>
         </w:rPr>
         <w:t xml:space="preserve">Debilidades</w:t>
       </w:r>
@@ -756,8 +641,11 @@
       </w:pPr>
       <w:r>
         <w:rPr>
-          <w:b/>
-          <w:bCs/>
+          <w:rFonts w:ascii="Arial" w:cs="Arial" w:eastAsia="Arial" w:hAnsi="Arial"/>
+          <w:b/>
+          <w:bCs/>
+          <w:sz w:val="22"/>
+          <w:szCs w:val="22"/>
         </w:rPr>
         <w:t xml:space="preserve">Amenazas</w:t>
       </w:r>
@@ -829,10 +717,13 @@
       </w:pPr>
       <w:r>
         <w:rPr>
-          <w:b/>
-          <w:bCs/>
-        </w:rPr>
-        <w:t xml:space="preserve">2.3. Conclusión del diagnóstico</w:t>
+          <w:rFonts w:ascii="Arial" w:cs="Arial" w:eastAsia="Arial" w:hAnsi="Arial"/>
+          <w:b/>
+          <w:bCs/>
+          <w:sz w:val="24"/>
+          <w:szCs w:val="24"/>
+        </w:rPr>
+        <w:t xml:space="preserve">2.3 Conclusión del diagnóstico</w:t>
       </w:r>
     </w:p>
     <w:p>
@@ -852,10 +743,18 @@
       </w:pPr>
       <w:r>
         <w:rPr>
-          <w:b/>
-          <w:bCs/>
-        </w:rPr>
-        <w:t xml:space="preserve">3. Objetivos</w:t>
+          <w:rFonts w:ascii="Arial" w:cs="Arial" w:eastAsia="Arial" w:hAnsi="Arial"/>
+          <w:b/>
+          <w:bCs/>
+          <w:sz w:val="28"/>
+          <w:szCs w:val="28"/>
+        </w:rPr>
+        <w:t xml:space="preserve">3. PRINCIPIOS DE GESTIÓN</w:t>
+      </w:r>
+    </w:p>
+    <w:p>
+      <w:r>
+        <w:t xml:space="preserve">El ejercicio de la Jefatura del Departamento requiere combinar capacidades técnicas con habilidades de conducción, planificación y coordinación. En consecuencia, las decisiones organizacionales y técnicas deberán sustentarse sobre principios de gestión que otorguen coherencia a las acciones del Departamento.</w:t>
       </w:r>
     </w:p>
     <w:p>
@@ -864,10 +763,169 @@
       </w:pPr>
       <w:r>
         <w:rPr>
-          <w:b/>
-          <w:bCs/>
-        </w:rPr>
-        <w:t xml:space="preserve">3.1. Objetivo general</w:t>
+          <w:rFonts w:ascii="Arial" w:cs="Arial" w:eastAsia="Arial" w:hAnsi="Arial"/>
+          <w:b/>
+          <w:bCs/>
+          <w:sz w:val="24"/>
+          <w:szCs w:val="24"/>
+        </w:rPr>
+        <w:t xml:space="preserve">3.1 Liderazgo basado en la colaboración</w:t>
+      </w:r>
+    </w:p>
+    <w:p>
+      <w:r>
+        <w:t xml:space="preserve">La conducción del Departamento promoverá un ambiente de trabajo participativo, donde la comunicación, el intercambio de conocimientos y la construcción colectiva de soluciones sean parte de la cultura organizacional. La función de la Jefatura consistirá en facilitar el trabajo de los equipos, remover obstáculos, promover acuerdos y generar las condiciones necesarias para que cada integrante pueda desarrollar sus capacidades profesionales.</w:t>
+      </w:r>
+    </w:p>
+    <w:p>
+      <w:pPr>
+        <w:pStyle w:val="Heading2"/>
+      </w:pPr>
+      <w:r>
+        <w:rPr>
+          <w:rFonts w:ascii="Arial" w:cs="Arial" w:eastAsia="Arial" w:hAnsi="Arial"/>
+          <w:b/>
+          <w:bCs/>
+          <w:sz w:val="24"/>
+          <w:szCs w:val="24"/>
+        </w:rPr>
+        <w:t xml:space="preserve">3.2 Gestión orientada a procesos</w:t>
+      </w:r>
+    </w:p>
+    <w:p>
+      <w:r>
+        <w:t xml:space="preserve">El crecimiento sostenido del Departamento hace necesario reducir la dependencia de prácticas individuales y avanzar hacia procedimientos institucionales homogéneos. Toda actividad recurrente deberá encontrarse respaldada por procedimientos claros que permitan garantizar continuidad, previsibilidad y calidad, simplificando el trabajo cotidiano y asegurando la continuidad operativa.</w:t>
+      </w:r>
+    </w:p>
+    <w:p>
+      <w:pPr>
+        <w:pStyle w:val="Heading2"/>
+      </w:pPr>
+      <w:r>
+        <w:rPr>
+          <w:rFonts w:ascii="Arial" w:cs="Arial" w:eastAsia="Arial" w:hAnsi="Arial"/>
+          <w:b/>
+          <w:bCs/>
+          <w:sz w:val="24"/>
+          <w:szCs w:val="24"/>
+        </w:rPr>
+        <w:t xml:space="preserve">3.3 Gestión del conocimiento institucional</w:t>
+      </w:r>
+    </w:p>
+    <w:p>
+      <w:r>
+        <w:t xml:space="preserve">El conocimiento generado durante el desarrollo y mantenimiento de los sistemas constituye un activo estratégico de la Municipalidad. Por ello, la Jefatura impulsará mecanismos que favorezcan la documentación, la transferencia de conocimientos y la capacitación interna, procurando que la información crítica permanezca en la organización.</w:t>
+      </w:r>
+    </w:p>
+    <w:p>
+      <w:pPr>
+        <w:pStyle w:val="Heading2"/>
+      </w:pPr>
+      <w:r>
+        <w:rPr>
+          <w:rFonts w:ascii="Arial" w:cs="Arial" w:eastAsia="Arial" w:hAnsi="Arial"/>
+          <w:b/>
+          <w:bCs/>
+          <w:sz w:val="24"/>
+          <w:szCs w:val="24"/>
+        </w:rPr>
+        <w:t xml:space="preserve">3.4 Mejora continua</w:t>
+      </w:r>
+    </w:p>
+    <w:p>
+      <w:r>
+        <w:t xml:space="preserve">Los procedimientos, metodologías y herramientas deberán revisarse periódicamente para identificar oportunidades de mejora sobre la base de evidencias objetivas, indicadores de gestión y resultados observables.</w:t>
+      </w:r>
+    </w:p>
+    <w:p>
+      <w:pPr>
+        <w:pStyle w:val="Heading2"/>
+      </w:pPr>
+      <w:r>
+        <w:rPr>
+          <w:rFonts w:ascii="Arial" w:cs="Arial" w:eastAsia="Arial" w:hAnsi="Arial"/>
+          <w:b/>
+          <w:bCs/>
+          <w:sz w:val="24"/>
+          <w:szCs w:val="24"/>
+        </w:rPr>
+        <w:t xml:space="preserve">3.5 Innovación responsable</w:t>
+      </w:r>
+    </w:p>
+    <w:p>
+      <w:r>
+        <w:t xml:space="preserve">Antes de adoptar una herramienta, metodología o plataforma tecnológica se evaluarán aspectos tales como compatibilidad con la arquitectura existente, sostenibilidad en el tiempo, costos de implementación, impacto sobre los procesos, requerimientos de capacitación y seguridad de la información.</w:t>
+      </w:r>
+    </w:p>
+    <w:p>
+      <w:pPr>
+        <w:pStyle w:val="Heading2"/>
+      </w:pPr>
+      <w:r>
+        <w:rPr>
+          <w:rFonts w:ascii="Arial" w:cs="Arial" w:eastAsia="Arial" w:hAnsi="Arial"/>
+          <w:b/>
+          <w:bCs/>
+          <w:sz w:val="24"/>
+          <w:szCs w:val="24"/>
+        </w:rPr>
+        <w:t xml:space="preserve">3.6 Orientación al servicio</w:t>
+      </w:r>
+    </w:p>
+    <w:p>
+      <w:r>
+        <w:t xml:space="preserve">El Departamento presta servicios a las distintas áreas municipales y, de manera indirecta, a toda la comunidad. Las decisiones priorizarán el valor que los sistemas aportan a los procesos administrativos, sustentándose en un diálogo permanente y una definición clara de prioridades.</w:t>
+      </w:r>
+    </w:p>
+    <w:p>
+      <w:pPr>
+        <w:pStyle w:val="Heading2"/>
+      </w:pPr>
+      <w:r>
+        <w:rPr>
+          <w:rFonts w:ascii="Arial" w:cs="Arial" w:eastAsia="Arial" w:hAnsi="Arial"/>
+          <w:b/>
+          <w:bCs/>
+          <w:sz w:val="24"/>
+          <w:szCs w:val="24"/>
+        </w:rPr>
+        <w:t xml:space="preserve">3.7 Decisiones basadas en evidencia</w:t>
+      </w:r>
+    </w:p>
+    <w:p>
+      <w:r>
+        <w:t xml:space="preserve">La planificación y administración del Departamento se apoyará en información objetiva proveniente de indicadores que midan la capacidad operativa, la evolución de proyectos y los cuellos de botella.</w:t>
+      </w:r>
+    </w:p>
+    <w:p/>
+    <w:p>
+      <w:pPr>
+        <w:pStyle w:val="Heading1"/>
+      </w:pPr>
+      <w:r>
+        <w:rPr>
+          <w:rFonts w:ascii="Arial" w:cs="Arial" w:eastAsia="Arial" w:hAnsi="Arial"/>
+          <w:b/>
+          <w:bCs/>
+          <w:sz w:val="28"/>
+          <w:szCs w:val="28"/>
+        </w:rPr>
+        <w:t xml:space="preserve">4. OBJETIVOS</w:t>
+      </w:r>
+    </w:p>
+    <w:p>
+      <w:pPr>
+        <w:pStyle w:val="Heading2"/>
+      </w:pPr>
+      <w:r>
+        <w:rPr>
+          <w:rFonts w:ascii="Arial" w:cs="Arial" w:eastAsia="Arial" w:hAnsi="Arial"/>
+          <w:b/>
+          <w:bCs/>
+          <w:sz w:val="24"/>
+          <w:szCs w:val="24"/>
+        </w:rPr>
+        <w:t xml:space="preserve">4.1 Objetivo General</w:t>
       </w:r>
     </w:p>
     <w:p>
@@ -881,10 +939,13 @@
       </w:pPr>
       <w:r>
         <w:rPr>
-          <w:b/>
-          <w:bCs/>
-        </w:rPr>
-        <w:t xml:space="preserve">3.2. Objetivos específicos</w:t>
+          <w:rFonts w:ascii="Arial" w:cs="Arial" w:eastAsia="Arial" w:hAnsi="Arial"/>
+          <w:b/>
+          <w:bCs/>
+          <w:sz w:val="24"/>
+          <w:szCs w:val="24"/>
+        </w:rPr>
+        <w:t xml:space="preserve">4.2 Objetivos Específicos</w:t>
       </w:r>
     </w:p>
     <w:p>
@@ -978,448 +1039,13 @@
       </w:pPr>
       <w:r>
         <w:rPr>
-          <w:b/>
-          <w:bCs/>
-        </w:rPr>
-        <w:t xml:space="preserve">4. Eje I – Personas, motivación y desarrollo del equipo</w:t>
-      </w:r>
-    </w:p>
-    <w:p>
-      <w:pPr>
-        <w:pStyle w:val="Heading2"/>
-      </w:pPr>
-      <w:r>
-        <w:rPr>
-          <w:b/>
-          <w:bCs/>
-        </w:rPr>
-        <w:t xml:space="preserve">4.1. Comunicación y coordinación permanente entre dependencias</w:t>
-      </w:r>
-    </w:p>
-    <w:p>
-      <w:r>
-        <w:t xml:space="preserve">Uno de los principales problemas detectados es la escasa interacción entre los grupos de trabajo que desarrollan sus actividades en distintas dependencias físicas. Esta situación dificulta conocer los proyectos en ejecución, compartir experiencias, detectar oportunidades de reutilización y coordinar esfuerzos entre equipos.</w:t>
-      </w:r>
-    </w:p>
-    <w:p>
-      <w:r>
-        <w:t xml:space="preserve">La propuesta consiste en institucionalizar un esquema permanente de coordinación entre ambos grupos de trabajo. Para ello se establecerán reuniones breves de seguimiento donde participen representantes de los distintos proyectos con el objetivo de compartir avances, informar bloqueos, detectar necesidades de colaboración, comunicar cambios relevantes e identificar desarrollos similares que puedan reutilizar componentes existentes.</w:t>
-      </w:r>
-    </w:p>
-    <w:p>
-      <w:r>
-        <w:t xml:space="preserve">Estas reuniones no tendrán carácter burocrático ni buscarán controlar el trabajo diario de cada agente, sino facilitar la circulación de información y fortalecer la coordinación del Departamento. Como complemento se promoverá el uso uniforme de las herramientas institucionales de seguimiento (Redmine), permitiendo que la información de los proyectos permanezca accesible para todo el equipo.</w:t>
-      </w:r>
-    </w:p>
-    <w:p>
-      <w:r>
-        <w:t xml:space="preserve">La Jefatura actuará como facilitadora del proceso, asegurando la continuidad de las reuniones, removiendo los bloqueos detectados y promoviendo una cultura de responsabilidad compartida entre las distintas dependencias.</w:t>
-      </w:r>
-    </w:p>
-    <w:p>
-      <w:r>
-        <w:t xml:space="preserve">Con esta medida se espera disminuir el aislamiento operativo existente entre las dependencias, mejorar la coordinación interna y reducir significativamente la duplicación de esfuerzos dentro del Departamento.</w:t>
-      </w:r>
-    </w:p>
-    <w:p/>
-    <w:p>
-      <w:pPr>
-        <w:pStyle w:val="Heading2"/>
-      </w:pPr>
-      <w:r>
-        <w:rPr>
-          <w:b/>
-          <w:bCs/>
-        </w:rPr>
-        <w:t xml:space="preserve">4.2. Desarrollo de competencias y Matriz de Competencias</w:t>
-      </w:r>
-    </w:p>
-    <w:p>
-      <w:r>
-        <w:t xml:space="preserve">Relevamiento integral del personal para construir una Matriz de Competencias que distinga entre capacidad técnica y conocimiento funcional del trámite municipal, planificando capacitaciones en servicio para nivelar habilidades y fomentar el crecimiento profesional dentro de la estructura municipal.</w:t>
-      </w:r>
-    </w:p>
-    <w:p/>
-    <w:p>
-      <w:pPr>
-        <w:pStyle w:val="Heading1"/>
-      </w:pPr>
-      <w:r>
-        <w:rPr>
-          <w:b/>
-          <w:bCs/>
-        </w:rPr>
-        <w:t xml:space="preserve">5. Eje II – Gestión del conocimiento y continuidad operativa</w:t>
-      </w:r>
-    </w:p>
-    <w:p>
-      <w:pPr>
-        <w:pStyle w:val="Heading2"/>
-      </w:pPr>
-      <w:r>
-        <w:rPr>
-          <w:b/>
-          <w:bCs/>
-        </w:rPr>
-        <w:t xml:space="preserve">5.1. Preservación del conocimiento e institucionalización de Referentes Secundarios (Shadowing)</w:t>
-      </w:r>
-    </w:p>
-    <w:p>
-      <w:r>
-        <w:t xml:space="preserve">La concentración del conocimiento técnico y funcional de sistemas críticos en agentes individuales genera un alto riesgo operacional para la Municipalidad. Ante licencias, traslados o imprevistos, la continuidad del servicio puede verse comprometida por la falta de personal capacitado para intervenir inmediatamente sobre dichos aplicativos.</w:t>
-      </w:r>
-    </w:p>
-    <w:p>
-      <w:r>
-        <w:t xml:space="preserve">Para mitigar este riesgo sin alterar las estructuras escalafonarias vigentes se propone instituir la figura del Referente Secundario (Shadowing). La medida consiste en asignar a un segundo agente para que acompañe al responsable principal de cada sistema crítico en tareas de mantenimiento, actualización y soporte.</w:t>
-      </w:r>
-    </w:p>
-    <w:p>
-      <w:r>
-        <w:t xml:space="preserve">El proceso comenzará con la identificación de los aplicativos de mayor criticidad institucional, la evaluación de las competencias técnicas requeridas y la asignación formal del referente secundario. El esquema contempla instancias periódicas de trabajo conjunto, participación en revisiones de código, acompañamiento en el despliegue de actualizaciones y documentación colaborativa de los procesos clave.</w:t>
-      </w:r>
-    </w:p>
-    <w:p>
-      <w:r>
-        <w:t xml:space="preserve">La Jefatura supervisará el cumplimiento del esquema de acompañamiento, asegurando que el referente secundario disponga de tiempo efectivo en su planificación para participar activamente del mantenimiento de los sistemas asignados.</w:t>
-      </w:r>
-    </w:p>
-    <w:p>
-      <w:r>
-        <w:t xml:space="preserve">La implementación de este esquema permitirá eliminar los puntos únicos de falla (Single Points of Failure), garantizar la continuidad operativa ante contingencias y favorecer la transferencia continua del conocimiento dentro de la organización.</w:t>
-      </w:r>
-    </w:p>
-    <w:p/>
-    <w:p>
-      <w:pPr>
-        <w:pStyle w:val="Heading2"/>
-      </w:pPr>
-      <w:r>
-        <w:rPr>
-          <w:b/>
-          <w:bCs/>
-        </w:rPr>
-        <w:t xml:space="preserve">5.2. Documentación mínima y útil</w:t>
-      </w:r>
-    </w:p>
-    <w:p>
-      <w:r>
-        <w:t xml:space="preserve">Definición de un estándar de documentación funcional, técnica y de despliegue proporcional a la criticidad del sistema, integrado al proceso normal de entrega (Definition of Done), asegurando que los manuales permanezcan actualizados sin generar burocracia innecesaria.</w:t>
-      </w:r>
-    </w:p>
-    <w:p/>
-    <w:p>
-      <w:pPr>
-        <w:pStyle w:val="Heading1"/>
-      </w:pPr>
-      <w:r>
-        <w:rPr>
-          <w:b/>
-          <w:bCs/>
-        </w:rPr>
-        <w:t xml:space="preserve">6. Eje III – Modelo común de gestión y desarrollo</w:t>
-      </w:r>
-    </w:p>
-    <w:p>
-      <w:pPr>
-        <w:pStyle w:val="Heading2"/>
-      </w:pPr>
-      <w:r>
-        <w:rPr>
-          <w:b/>
-          <w:bCs/>
-        </w:rPr>
-        <w:t xml:space="preserve">6.1. Cartera Única de Proyectos y centralización en Redmine</w:t>
-      </w:r>
-    </w:p>
-    <w:p>
-      <w:r>
-        <w:t xml:space="preserve">Actualmente el seguimiento de requerimientos y proyectos se realiza mediante metodologías y canales heterogéneos, lo que impide contar con una visión integral de la capacidad operativa del Departamento y dificulta la priorización transparente de las solicitudes provenientes de las distintas Secretarías.</w:t>
-      </w:r>
-    </w:p>
-    <w:p>
-      <w:r>
-        <w:t xml:space="preserve">La propuesta contempla consolidar la plataforma Redmine como el repositorio único y obligatorio para el registro, asignación y seguimiento de la totalidad de las actividades del Departamento, incluyendo proyectos nuevos, mantenimientos evolutivos, corrección de incidencias y tareas de asistencia técnica.</w:t>
-      </w:r>
-    </w:p>
-    <w:p>
-      <w:r>
-        <w:t xml:space="preserve">Todas las solicitudes ingresadas deberán clasificarse según su impacto institucional, urgencia y factibilidad técnica. La visibilidad centralizada de la carga de trabajo permitirá estimar plazos de entrega realistas y comunicar con transparencia el estado de los desarrollos a las áreas usuarias.</w:t>
-      </w:r>
-    </w:p>
-    <w:p>
-      <w:r>
-        <w:t xml:space="preserve">La Jefatura asumirá la responsabilidad de administrar la Cartera Única, actuando como filtro frente a las demandas de las dependencias solicitantes, gestionando las prioridades junto a las autoridades y asignando los recursos según la capacidad real del equipo.</w:t>
-      </w:r>
-    </w:p>
-    <w:p>
-      <w:r>
-        <w:t xml:space="preserve">Con esta centralización se logrará unificar la gestión de demandas, mejorar la previsibilidad en los tiempos de respuesta y dotar de total transparencia a la administración de los recursos del Departamento.</w:t>
-      </w:r>
-    </w:p>
-    <w:p/>
-    <w:p>
-      <w:pPr>
-        <w:pStyle w:val="Heading2"/>
-      </w:pPr>
-      <w:r>
-        <w:rPr>
-          <w:b/>
-          <w:bCs/>
-        </w:rPr>
-        <w:t xml:space="preserve">6.2. Modelo de Agilidad Adaptativa (Scrum Master Global / Kanban)</w:t>
-      </w:r>
-    </w:p>
-    <w:p>
-      <w:r>
-        <w:t xml:space="preserve">La diversidad de proyectos y mantenimientos simultáneos dificulta la aplicación rígida de una única metodología de trabajo. Los proyectos nuevos requieren iteraciones planificadas, mientras que la atención de incidencias operativas exige un flujo continuo de respuesta.</w:t>
-      </w:r>
-    </w:p>
-    <w:p>
-      <w:r>
-        <w:t xml:space="preserve">Se propone implementar un marco de Agilidad Adaptativa que combine iteraciones cortas (Sprints) para nuevos desarrollos con gestión de flujo continuo (Kanban) para mantenimientos y soporte técnico. La propuesta contempla reuniones breves de sincronización, priorización periódica del backlog y definición clara de criterios de finalización (Definition of Done).</w:t>
-      </w:r>
-    </w:p>
-    <w:p>
-      <w:r>
-        <w:t xml:space="preserve">Este esquema permitirá flexibilizar la gestión del trabajo sin perder el control sobre los entregables ni saturar al equipo con sobrecargas imprevistas.</w:t>
-      </w:r>
-    </w:p>
-    <w:p>
-      <w:r>
-        <w:t xml:space="preserve">La Jefatura asumirá el rol activo de Scrum Master Global y Gestor, protegiendo al equipo de interrupciones externas, removiendo impedimentos técnicos u organizacionales y ajustando la dinámica de trabajo según los resultados observados.</w:t>
-      </w:r>
-    </w:p>
-    <w:p>
-      <w:r>
-        <w:t xml:space="preserve">La adopción de este marco ágil adaptativo incrementará la productividad técnica, mejorará la adaptabilidad ante requerimientos cambiantes y reducirá el estrés operativo generado por la atención reactiva de emergencias.</w:t>
-      </w:r>
-    </w:p>
-    <w:p/>
-    <w:p>
-      <w:pPr>
-        <w:pStyle w:val="Heading1"/>
-      </w:pPr>
-      <w:r>
-        <w:rPr>
-          <w:b/>
-          <w:bCs/>
-        </w:rPr>
-        <w:t xml:space="preserve">7. Eje IV – Arquitectura de referencia, calidad, seguridad e innovación</w:t>
-      </w:r>
-    </w:p>
-    <w:p>
-      <w:pPr>
-        <w:pStyle w:val="Heading2"/>
-      </w:pPr>
-      <w:r>
-        <w:rPr>
-          <w:b/>
-          <w:bCs/>
-        </w:rPr>
-        <w:t xml:space="preserve">7.1. Estandarización del desarrollo y consolidación de una Arquitectura Base Institucional</w:t>
-      </w:r>
-    </w:p>
-    <w:p>
-      <w:r>
-        <w:t xml:space="preserve">La diversidad de tecnologías, criterios de diseño y convenciones de programación utilizadas a lo largo del tiempo ha generado un ecosistema de aplicaciones heterogéneo, dificultando el mantenimiento, la reutilización de componentes y la incorporación de nuevos desarrolladores a los proyectos existentes.</w:t>
-      </w:r>
-    </w:p>
-    <w:p>
-      <w:r>
-        <w:t xml:space="preserve">Para reducir esta complejidad se propone institucionalizar una Arquitectura Base que establezca criterios comunes para todos los nuevos desarrollos y para aquellas refactorizaciones cuya magnitud justifique su adopción. Esta arquitectura definirá lineamientos sobre organización de proyectos, acceso a datos, autenticación, manejo de errores, configuración, registro de eventos y demás componentes reutilizables, permitiendo desarrollar aplicaciones homogéneas, mantenibles y compatibles entre sí.</w:t>
-      </w:r>
-    </w:p>
-    <w:p>
-      <w:r>
-        <w:t xml:space="preserve">Como complemento, se elaborarán Guías de Buenas Prácticas que unifiquen criterios de codificación, documentación, control de versiones, pruebas y estructura de los proyectos. Estos documentos deberán mantenerse actualizados y evolucionar conforme lo hagan las necesidades del Departamento.</w:t>
-      </w:r>
-    </w:p>
-    <w:p>
-      <w:r>
-        <w:t xml:space="preserve">La Jefatura será responsable de definir estos estándares, promover su utilización, evaluar las excepciones técnicamente justificadas y coordinar su actualización periódica junto con los equipos de desarrollo. Asimismo, impulsará instancias de revisión técnica previas al inicio de nuevos proyectos para verificar la reutilización de componentes existentes y la compatibilidad con la estrategia tecnológica institucional.</w:t>
-      </w:r>
-    </w:p>
-    <w:p>
-      <w:r>
-        <w:t xml:space="preserve">La implementación de estos lineamientos permitirá reducir la deuda técnica, facilitar el mantenimiento evolutivo, simplificar la incorporación de nuevos desarrolladores y asegurar que el crecimiento del software municipal responda a criterios comunes de calidad y sostenibilidad.</w:t>
-      </w:r>
-    </w:p>
-    <w:p/>
-    <w:p>
-      <w:pPr>
-        <w:pStyle w:val="Heading2"/>
-      </w:pPr>
-      <w:r>
-        <w:rPr>
-          <w:b/>
-          <w:bCs/>
-        </w:rPr>
-        <w:t xml:space="preserve">7.2. Gestión de la calidad del software y fortalecimiento de la documentación institucional</w:t>
-      </w:r>
-    </w:p>
-    <w:p>
-      <w:r>
-        <w:t xml:space="preserve">La calidad del software constituye un objetivo transversal del Departamento y debe formar parte del proceso de desarrollo desde las etapas iniciales de cada proyecto. Si bien el equipo posee capacidad técnica para desarrollar soluciones de calidad, la ausencia de criterios homogéneos de revisión y documentación genera diferencias entre proyectos que posteriormente incrementan los tiempos de mantenimiento y dificultan la incorporación de nuevos desarrolladores.</w:t>
-      </w:r>
-    </w:p>
-    <w:p>
-      <w:r>
-        <w:t xml:space="preserve">Con el propósito de fortalecer la calidad de los sistemas municipales, se propone institucionalizar un conjunto de prácticas mínimas aplicables a todos los proyectos, adaptadas a su complejidad y criticidad. El objetivo no consiste en incorporar controles burocráticos, sino en asegurar que cada desarrollo reúna las condiciones necesarias para ser mantenido y evolucionado por cualquier integrante del Departamento.</w:t>
-      </w:r>
-    </w:p>
-    <w:p>
-      <w:r>
-        <w:t xml:space="preserve">Como criterio general, cada proyecto deberá contar con una documentación técnica mínima que describa el objetivo del sistema, su arquitectura general, el modelo de datos utilizado, las integraciones con otros aplicativos, los procedimientos de instalación y despliegue, así como los responsables funcionales y técnicos. La profundidad de esta documentación será proporcional a la complejidad del sistema, evitando generar documentación innecesaria que luego quede desactualizada.</w:t>
-      </w:r>
-    </w:p>
-    <w:p>
-      <w:r>
-        <w:t xml:space="preserve">Del mismo modo, antes de la puesta en producción de modificaciones relevantes se promoverán instancias de revisión técnica orientadas a verificar el cumplimiento de los estándares definidos por el Departamento, la correcta integración con los sistemas existentes y la ausencia de errores evidentes que puedan afectar la operación normal de los servicios municipales.</w:t>
-      </w:r>
-    </w:p>
-    <w:p>
-      <w:r>
-        <w:t xml:space="preserve">La Jefatura será responsable de impulsar estas prácticas como parte habitual del proceso de desarrollo, supervisando su cumplimiento y promoviendo una cultura donde la calidad y la documentación sean entendidas como componentes naturales del trabajo cotidiano.</w:t>
-      </w:r>
-    </w:p>
-    <w:p>
-      <w:r>
-        <w:t xml:space="preserve">La implementación de estas medidas permitirá mejorar la mantenibilidad de las aplicaciones, reducir la dependencia del conocimiento individual y fortalecer la continuidad operativa del Departamento.</w:t>
-      </w:r>
-    </w:p>
-    <w:p/>
-    <w:p>
-      <w:pPr>
-        <w:pStyle w:val="Heading2"/>
-      </w:pPr>
-      <w:r>
-        <w:rPr>
-          <w:b/>
-          <w:bCs/>
-        </w:rPr>
-        <w:t xml:space="preserve">7.3. Innovación tecnológica y utilización responsable de Inteligencia Artificial</w:t>
-      </w:r>
-    </w:p>
-    <w:p>
-      <w:r>
-        <w:t xml:space="preserve">La innovación tecnológica constituye una función permanente del Departamento y debe orientarse a mejorar la calidad de los servicios brindados por la Municipalidad. Sin embargo, la incorporación de nuevas herramientas debe responder a una planificación institucional y no únicamente a iniciativas individuales o tendencias del mercado.</w:t>
-      </w:r>
-    </w:p>
-    <w:p>
-      <w:r>
-        <w:t xml:space="preserve">La Jefatura impulsará un proceso continuo de evaluación de tecnologías, metodologías y herramientas de desarrollo, analizando su impacto sobre la infraestructura existente, los costos de adopción, las necesidades de capacitación y los beneficios concretos que puedan aportar a la gestión municipal. Sólo aquellas soluciones que demuestren una mejora objetiva en la productividad, la seguridad o la calidad del software serán incorporadas como estándares institucionales.</w:t>
-      </w:r>
-    </w:p>
-    <w:p>
-      <w:r>
-        <w:t xml:space="preserve">Dentro de este escenario, las herramientas basadas en Inteligencia Artificial representan una oportunidad para asistir al equipo de desarrollo en tareas como generación de código, documentación técnica, análisis de errores y automatización de actividades repetitivas. Su utilización permitirá reducir tiempos operativos y mejorar la productividad del Departamento, siempre que su uso se realice bajo criterios claros de seguridad y confidencialidad.</w:t>
-      </w:r>
-    </w:p>
-    <w:p>
-      <w:r>
-        <w:t xml:space="preserve">Por tal motivo se establecerán lineamientos que prohíban expresamente incorporar en plataformas públicas de Inteligencia Artificial información sensible, datos personales de ciudadanos, credenciales institucionales o cualquier otro contenido protegido por las políticas de seguridad del Municipio.</w:t>
-      </w:r>
-    </w:p>
-    <w:p>
-      <w:r>
-        <w:t xml:space="preserve">Asimismo, toda producción generada mediante estas herramientas deberá ser revisada y validada por el profesional responsable del desarrollo antes de incorporarse a los sistemas municipales, manteniendo en todo momento la responsabilidad técnica sobre las decisiones adoptadas.</w:t>
-      </w:r>
-    </w:p>
-    <w:p>
-      <w:r>
-        <w:t xml:space="preserve">Como proyección futura, y sujeto a disponibilidad presupuestaria, podrá evaluarse la incorporación de plataformas corporativas de Inteligencia Artificial administradas por el Municipio, que ofrezcan mayores garantías de privacidad, trazabilidad y administración centralizada.</w:t>
-      </w:r>
-    </w:p>
-    <w:p>
-      <w:r>
-        <w:t xml:space="preserve">De este modo, la innovación tecnológica dejará de depender de decisiones individuales para transformarse en una política institucional permanente, orientada a fortalecer la capacidad del Departamento para brindar soluciones modernas, seguras y sostenibles.</w:t>
-      </w:r>
-    </w:p>
-    <w:p/>
-    <w:p>
-      <w:pPr>
-        <w:pStyle w:val="Heading1"/>
-      </w:pPr>
-      <w:r>
-        <w:rPr>
-          <w:b/>
-          <w:bCs/>
-        </w:rPr>
-        <w:t xml:space="preserve">8. Eje V – Gestión de demanda y proveedores externos</w:t>
-      </w:r>
-    </w:p>
-    <w:p>
-      <w:pPr>
-        <w:pStyle w:val="Heading2"/>
-      </w:pPr>
-      <w:r>
-        <w:rPr>
-          <w:b/>
-          <w:bCs/>
-        </w:rPr>
-        <w:t xml:space="preserve">8.1. Gobierno técnico de proveedores externos</w:t>
-      </w:r>
-    </w:p>
-    <w:p>
-      <w:r>
-        <w:t xml:space="preserve">Las funciones asignadas al Departamento comprenden no sólo el desarrollo interno de sistemas informáticos, sino también la supervisión técnica de aquellas soluciones provistas por empresas externas. En consecuencia, la contratación de un proveedor no implica delegar la responsabilidad sobre la calidad del software incorporado al ecosistema municipal.</w:t>
-      </w:r>
-    </w:p>
-    <w:p>
-      <w:r>
-        <w:t xml:space="preserve">La Jefatura deberá asumir un rol activo durante todo el ciclo de contratación, participando en la definición de los requerimientos técnicos, colaborando en la elaboración de las especificaciones funcionales y verificando que las soluciones propuestas resulten compatibles con la arquitectura tecnológica del Municipio y con los estándares definidos por el Departamento.</w:t>
-      </w:r>
-    </w:p>
-    <w:p>
-      <w:r>
-        <w:t xml:space="preserve">Durante la ejecución de los proyectos se promoverán reuniones periódicas de seguimiento técnico que permitan detectar tempranamente desvíos respecto de las especificaciones acordadas, facilitando la resolución de inconvenientes antes de su impacto sobre la implementación.</w:t>
-      </w:r>
-    </w:p>
-    <w:p>
-      <w:r>
-        <w:t xml:space="preserve">Asimismo, previo a la recepción definitiva de cualquier desarrollo contratado, se verificará el cumplimiento de requisitos mínimos que garanticen la autonomía tecnológica del Municipio. Entre ellos se incluyen la entrega del código fuente, la documentación técnica actualizada, los modelos de datos, los procedimientos de instalación y despliegue, la descripción de las interfaces de integración y las evidencias de las pruebas realizadas.</w:t>
-      </w:r>
-    </w:p>
-    <w:p>
-      <w:r>
-        <w:t xml:space="preserve">Cuando los contratos contemplen servicios de mantenimiento, la Jefatura actuará además como nexo técnico entre las áreas usuarias y los proveedores, coordinando la gestión de incidencias, verificando el cumplimiento de los niveles de servicio comprometidos y controlando la calidad de las soluciones implementadas.</w:t>
-      </w:r>
-    </w:p>
-    <w:p>
-      <w:r>
-        <w:t xml:space="preserve">De esta manera se fortalece el rol institucional del Departamento como autoridad técnica sobre los sistemas municipales, evitando la dependencia tecnológica de proveedores externos y asegurando que el conocimiento generado permanezca dentro de la organización.</w:t>
-      </w:r>
-    </w:p>
-    <w:p/>
-    <w:p>
-      <w:pPr>
-        <w:pStyle w:val="Heading2"/>
-      </w:pPr>
-      <w:r>
-        <w:rPr>
-          <w:b/>
-          <w:bCs/>
-        </w:rPr>
-        <w:t xml:space="preserve">8.2. Gestión de la relación con las áreas usuarias</w:t>
-      </w:r>
-    </w:p>
-    <w:p>
-      <w:r>
-        <w:t xml:space="preserve">Fortalecimiento del rol de la Jefatura como nexo institucional con las Secretarías solicitantes mediante entrevistas funcionales, priorización conjunta, validaciones parciales y gestión compartida de expectativas.</w:t>
-      </w:r>
-    </w:p>
-    <w:p/>
-    <w:p>
-      <w:pPr>
-        <w:pStyle w:val="Heading1"/>
-      </w:pPr>
-      <w:r>
-        <w:rPr>
-          <w:b/>
-          <w:bCs/>
-        </w:rPr>
-        <w:t xml:space="preserve">9. Optimización con recursos actuales (Escenario $0)</w:t>
+          <w:rFonts w:ascii="Arial" w:cs="Arial" w:eastAsia="Arial" w:hAnsi="Arial"/>
+          <w:b/>
+          <w:bCs/>
+          <w:sz w:val="28"/>
+          <w:szCs w:val="28"/>
+        </w:rPr>
+        <w:t xml:space="preserve">5. PROPUESTAS DE MEJORA Y POLÍTICAS INSTITUCIONALES DE GESTIÓN</w:t>
       </w:r>
     </w:p>
     <w:p>
@@ -1428,10 +1054,397 @@
           <w:i/>
           <w:iCs/>
         </w:rPr>
+        <w:t xml:space="preserve">Esta sección constituye el núcleo central del Plan de Trabajo. Cada propuesta se presenta no como una mera enumeración de intenciones, sino como una verdadera política institucional de gestión que define el problema detectado, la propuesta concreta de solución, el rol de la Jefatura y el resultado esperado para el Municipio.</w:t>
+      </w:r>
+    </w:p>
+    <w:p>
+      <w:pPr>
+        <w:pStyle w:val="Heading2"/>
+      </w:pPr>
+      <w:r>
+        <w:rPr>
+          <w:rFonts w:ascii="Arial" w:cs="Arial" w:eastAsia="Arial" w:hAnsi="Arial"/>
+          <w:b/>
+          <w:bCs/>
+          <w:sz w:val="24"/>
+          <w:szCs w:val="24"/>
+        </w:rPr>
+        <w:t xml:space="preserve">5.1 Comunicación y coordinación permanente entre dependencias</w:t>
+      </w:r>
+    </w:p>
+    <w:p>
+      <w:r>
+        <w:t xml:space="preserve">Uno de los principales problemas detectados es la escasa interacción entre los grupos de trabajo que desarrollan sus actividades en distintas dependencias físicas. Esta situación dificulta conocer los proyectos en ejecución, compartir experiencias, detectar oportunidades de reutilización y coordinar esfuerzos entre equipos.</w:t>
+      </w:r>
+    </w:p>
+    <w:p>
+      <w:r>
+        <w:t xml:space="preserve">La propuesta consiste en institucionalizar un esquema permanente de coordinación entre ambos grupos de trabajo. Para ello se establecerán reuniones breves de seguimiento donde participen representantes de los distintos proyectos con el objetivo de compartir avances, informar bloqueos, detectar necesidades de colaboración, comunicar cambios relevantes e identificar desarrollos similares que puedan reutilizar componentes existentes.</w:t>
+      </w:r>
+    </w:p>
+    <w:p>
+      <w:r>
+        <w:t xml:space="preserve">Estas reuniones no tendrán carácter burocrático ni buscarán controlar el trabajo diario de cada agente, sino facilitar la circulación de información y fortalecer la coordinación del Departamento. Como complemento se promoverá el uso uniforme de las herramientas institucionales de seguimiento (Redmine), permitiendo que la información de los proyectos permanezca accesible para todo el equipo.</w:t>
+      </w:r>
+    </w:p>
+    <w:p>
+      <w:r>
+        <w:t xml:space="preserve">La Jefatura actuará como facilitadora del proceso, asegurando la continuidad de las reuniones, removiendo los bloqueos detectados y promoviendo una cultura de responsabilidad compartida entre las distintas dependencias.</w:t>
+      </w:r>
+    </w:p>
+    <w:p>
+      <w:r>
+        <w:t xml:space="preserve">Con esta medida se espera disminuir el aislamiento operativo existente entre las dependencias, mejorar la coordinación interna y reducir significativamente la duplicación de esfuerzos dentro del Departamento.</w:t>
+      </w:r>
+    </w:p>
+    <w:p/>
+    <w:p>
+      <w:pPr>
+        <w:pStyle w:val="Heading2"/>
+      </w:pPr>
+      <w:r>
+        <w:rPr>
+          <w:rFonts w:ascii="Arial" w:cs="Arial" w:eastAsia="Arial" w:hAnsi="Arial"/>
+          <w:b/>
+          <w:bCs/>
+          <w:sz w:val="24"/>
+          <w:szCs w:val="24"/>
+        </w:rPr>
+        <w:t xml:space="preserve">5.2 Preservación del conocimiento e institucionalización de Referentes Secundarios (Shadowing)</w:t>
+      </w:r>
+    </w:p>
+    <w:p>
+      <w:r>
+        <w:t xml:space="preserve">La concentración del conocimiento técnico y funcional de sistemas críticos en agentes individuales genera un alto riesgo operacional para la Municipalidad. Ante licencias, traslados o imprevistos, la continuidad del servicio puede verse comprometida por la falta de personal capacitado para intervenir inmediatamente sobre dichos aplicativos.</w:t>
+      </w:r>
+    </w:p>
+    <w:p>
+      <w:r>
+        <w:t xml:space="preserve">Para mitigar este riesgo sin alterar las estructuras escalafonarias vigentes se propone instituir la figura del Referente Secundario (Shadowing). La medida consiste en asignar a un segundo agente para que acompañe al responsable principal de cada sistema crítico en tareas de mantenimiento, actualización y soporte.</w:t>
+      </w:r>
+    </w:p>
+    <w:p>
+      <w:r>
+        <w:t xml:space="preserve">El proceso comenzará con la identificación de los aplicativos de mayor criticidad institucional, la evaluación de las competencias técnicas requeridas y la asignación formal del referente secundario. El esquema contempla instancias periódicas de trabajo conjunto, participación en revisiones de código, acompañamiento en el despliegue de actualizaciones y documentación colaborativa de los procesos clave.</w:t>
+      </w:r>
+    </w:p>
+    <w:p>
+      <w:r>
+        <w:t xml:space="preserve">La Jefatura supervisará el cumplimiento del esquema de acompañamiento, asegurando que el referente secundario disponga de tiempo efectivo en su planificación para participar activamente del mantenimiento de los sistemas asignados.</w:t>
+      </w:r>
+    </w:p>
+    <w:p>
+      <w:r>
+        <w:t xml:space="preserve">La implementación de este esquema permitirá eliminar los puntos únicos de falla (Single Points of Failure), garantizar la continuidad operativa ante contingencias y favorecer la transferencia continua del conocimiento dentro de la organización.</w:t>
+      </w:r>
+    </w:p>
+    <w:p/>
+    <w:p>
+      <w:pPr>
+        <w:pStyle w:val="Heading2"/>
+      </w:pPr>
+      <w:r>
+        <w:rPr>
+          <w:rFonts w:ascii="Arial" w:cs="Arial" w:eastAsia="Arial" w:hAnsi="Arial"/>
+          <w:b/>
+          <w:bCs/>
+          <w:sz w:val="24"/>
+          <w:szCs w:val="24"/>
+        </w:rPr>
+        <w:t xml:space="preserve">5.3 Cartera Única de Proyectos y Centralización en Redmine</w:t>
+      </w:r>
+    </w:p>
+    <w:p>
+      <w:r>
+        <w:t xml:space="preserve">Actualmente el seguimiento de requerimientos y proyectos se realiza mediante metodologías y canales heterogéneos, lo que impide contar con una visión integral de la capacidad operativa del Departamento y dificulta la priorización transparente de las solicitudes provenientes de las distintas Secretarías.</w:t>
+      </w:r>
+    </w:p>
+    <w:p>
+      <w:r>
+        <w:t xml:space="preserve">La propuesta contempla consolidar la plataforma Redmine como el repositorio único y obligatorio para el registro, asignación y seguimiento de la totalidad de las actividades del Departamento, incluyendo proyectos nuevos, mantenimientos evolutivos, corrección de incidencias y tareas de asistencia técnica.</w:t>
+      </w:r>
+    </w:p>
+    <w:p>
+      <w:r>
+        <w:t xml:space="preserve">Todas las solicitudes ingresadas deberán clasificarse según su impacto institucional, urgencia y factibilidad técnica. La visibilidad centralizada de la carga de trabajo permitirá estimar plazos de entrega realistas y comunicar con transparencia el estado de los desarrollos a las áreas usuarias.</w:t>
+      </w:r>
+    </w:p>
+    <w:p>
+      <w:r>
+        <w:t xml:space="preserve">La Jefatura asumirá la responsabilidad de administrar la Cartera Única, actuando como filtro frente a las demandas de las dependencias solicitantes, gestionando las prioridades junto a las autoridades y asignando los recursos según la capacidad real del equipo.</w:t>
+      </w:r>
+    </w:p>
+    <w:p>
+      <w:r>
+        <w:t xml:space="preserve">Con esta centralización se logrará unificar la gestión de demandas, mejorar la previsibilidad en los tiempos de respuesta y dotar de total transparencia a la administración de los recursos del Departamento.</w:t>
+      </w:r>
+    </w:p>
+    <w:p/>
+    <w:p>
+      <w:pPr>
+        <w:pStyle w:val="Heading2"/>
+      </w:pPr>
+      <w:r>
+        <w:rPr>
+          <w:rFonts w:ascii="Arial" w:cs="Arial" w:eastAsia="Arial" w:hAnsi="Arial"/>
+          <w:b/>
+          <w:bCs/>
+          <w:sz w:val="24"/>
+          <w:szCs w:val="24"/>
+        </w:rPr>
+        <w:t xml:space="preserve">5.4 Modelo de Agilidad Adaptativa (Scrum Master Global / Kanban)</w:t>
+      </w:r>
+    </w:p>
+    <w:p>
+      <w:r>
+        <w:t xml:space="preserve">La diversidad de proyectos y mantenimientos simultáneos dificulta la aplicación rígida de una única metodología de trabajo. Los proyectos nuevos requieren iteraciones planificadas, mientras que la atención de incidencias operativas exige un flujo continuo de respuesta.</w:t>
+      </w:r>
+    </w:p>
+    <w:p>
+      <w:r>
+        <w:t xml:space="preserve">Se propone implementar un marco de Agilidad Adaptativa que combine iteraciones cortas (Sprints) para nuevos desarrollos con gestión de flujo continuo (Kanban) para mantenimientos y soporte técnico. La propuesta contempla reuniones breves de sincronización, priorización periódica del backlog y definición clara de criterios de finalización (Definition of Done).</w:t>
+      </w:r>
+    </w:p>
+    <w:p>
+      <w:r>
+        <w:t xml:space="preserve">Este esquema permitirá flexibilizar la gestión del trabajo sin perder el control sobre los entregables ni saturar al equipo con sobrecargas imprevistas.</w:t>
+      </w:r>
+    </w:p>
+    <w:p>
+      <w:r>
+        <w:t xml:space="preserve">La Jefatura asumirá el rol activo de Scrum Master Global y Gestor, protegiendo al equipo de interrupciones externas, removiendo impedimentos técnicos u organizacionales y ajustando la dinámica de trabajo según los resultados observados.</w:t>
+      </w:r>
+    </w:p>
+    <w:p>
+      <w:r>
+        <w:t xml:space="preserve">La adopción de este marco ágil adaptativo incrementará la productividad técnica, mejorará la adaptabilidad ante requerimientos cambiantes y reducirá el estrés operativo generado por la atención reactiva de emergencias.</w:t>
+      </w:r>
+    </w:p>
+    <w:p/>
+    <w:p>
+      <w:pPr>
+        <w:pStyle w:val="Heading2"/>
+      </w:pPr>
+      <w:r>
+        <w:rPr>
+          <w:rFonts w:ascii="Arial" w:cs="Arial" w:eastAsia="Arial" w:hAnsi="Arial"/>
+          <w:b/>
+          <w:bCs/>
+          <w:sz w:val="24"/>
+          <w:szCs w:val="24"/>
+        </w:rPr>
+        <w:t xml:space="preserve">5.5 Estandarización del desarrollo y consolidación de una Arquitectura Base Institucional</w:t>
+      </w:r>
+    </w:p>
+    <w:p>
+      <w:r>
+        <w:t xml:space="preserve">La diversidad de tecnologías, criterios de diseño y convenciones de programación utilizadas a lo largo del tiempo ha generado un ecosistema de aplicaciones heterogéneo, dificultando el mantenimiento, la reutilización de componentes y la incorporación de nuevos desarrolladores a los proyectos existentes.</w:t>
+      </w:r>
+    </w:p>
+    <w:p>
+      <w:r>
+        <w:t xml:space="preserve">Para reducir esta complejidad se propone institucionalizar una Arquitectura Base que establezca criterios comunes para todos los nuevos desarrollos y para aquellas refactorizaciones cuya magnitud justifique su adopción. Esta arquitectura definirá lineamientos sobre organización de proyectos, acceso a datos, autenticación, manejo de errores, configuración, registro de eventos y demás componentes reutilizables, permitiendo desarrollar aplicaciones homogéneas, mantenibles y compatibles entre sí.</w:t>
+      </w:r>
+    </w:p>
+    <w:p>
+      <w:r>
+        <w:t xml:space="preserve">Como complemento, se elaborarán Guías de Buenas Prácticas que unifiquen criterios de codificación, documentación, control de versiones, pruebas y estructura de los proyectos. Estos documentos deberán mantenerse actualizados y evolucionar conforme lo hagan las necesidades del Departamento.</w:t>
+      </w:r>
+    </w:p>
+    <w:p>
+      <w:r>
+        <w:t xml:space="preserve">La Jefatura será responsable de definir estos estándares, promover su utilización, evaluar las excepciones técnicamente justificadas y coordinar su actualización periódica junto con los equipos de desarrollo. Asimismo, impulsará instancias de revisión técnica previas al inicio de nuevos proyectos para verificar la reutilización de componentes existentes y la compatibilidad con la estrategia tecnológica institucional.</w:t>
+      </w:r>
+    </w:p>
+    <w:p>
+      <w:r>
+        <w:t xml:space="preserve">La implementación de estos lineamientos permitirá reducir la deuda técnica, facilitar el mantenimiento evolutivo, simplificar la incorporación de nuevos desarrolladores y asegurar que el crecimiento del software municipal responda a criterios comunes de calidad y sostenibilidad.</w:t>
+      </w:r>
+    </w:p>
+    <w:p/>
+    <w:p>
+      <w:pPr>
+        <w:pStyle w:val="Heading2"/>
+      </w:pPr>
+      <w:r>
+        <w:rPr>
+          <w:rFonts w:ascii="Arial" w:cs="Arial" w:eastAsia="Arial" w:hAnsi="Arial"/>
+          <w:b/>
+          <w:bCs/>
+          <w:sz w:val="24"/>
+          <w:szCs w:val="24"/>
+        </w:rPr>
+        <w:t xml:space="preserve">5.6 Gestión de la calidad del software y fortalecimiento de la documentación institucional</w:t>
+      </w:r>
+    </w:p>
+    <w:p>
+      <w:r>
+        <w:t xml:space="preserve">La calidad del software constituye un objetivo transversal del Departamento y debe formar parte del proceso de desarrollo desde las etapas iniciales de cada proyecto. Si bien el equipo posee capacidad técnica para desarrollar soluciones de calidad, la ausencia de criterios homogéneos de revisión y documentación genera diferencias entre proyectos que posteriormente incrementan los tiempos de mantenimiento y dificultan la incorporación de nuevos desarrolladores.</w:t>
+      </w:r>
+    </w:p>
+    <w:p>
+      <w:r>
+        <w:t xml:space="preserve">Con el propósito de fortalecer la calidad de los sistemas municipales, se propone institucionalizar un conjunto de prácticas mínimas aplicables a todos los proyectos, adaptadas a su complejidad y criticidad. El objetivo no consiste en incorporar controles burocráticos, sino en asegurar que cada desarrollo reúna las condiciones necesarias para ser mantenido y evolucionado por cualquier integrante del Departamento.</w:t>
+      </w:r>
+    </w:p>
+    <w:p>
+      <w:r>
+        <w:t xml:space="preserve">Como criterio general, cada proyecto deberá contar con una documentación técnica mínima que describa el objetivo del sistema, su arquitectura general, el modelo de datos utilizado, las integraciones con otros aplicativos, los procedimientos de instalación y despliegue, así como los responsables funcionales y técnicos. La profundidad de esta documentación será proporcional a la complejidad del sistema, evitando generar documentación innecesaria que luego quede desactualizada.</w:t>
+      </w:r>
+    </w:p>
+    <w:p>
+      <w:r>
+        <w:t xml:space="preserve">Del mismo modo, antes de la puesta en producción de modificaciones relevantes se promoverán instancias de revisión técnica orientadas a verificar el cumplimiento de los estándares definidos por el Departamento, la correcta integración con los sistemas existentes y la ausencia de errores evidentes que puedan afectar la operación normal de los servicios municipales.</w:t>
+      </w:r>
+    </w:p>
+    <w:p>
+      <w:r>
+        <w:t xml:space="preserve">La Jefatura será responsable de impulsar estas prácticas como parte habitual del proceso de desarrollo, supervisando su cumplimiento y promoviendo una cultura donde la calidad y la documentación sean entendidas como componentes naturales del trabajo cotidiano.</w:t>
+      </w:r>
+    </w:p>
+    <w:p>
+      <w:r>
+        <w:t xml:space="preserve">La implementación de estas medidas permitirá mejorar la mantenibilidad de las aplicaciones, reducir la dependencia del conocimiento individual y fortalecer la continuidad operativa del Departamento.</w:t>
+      </w:r>
+    </w:p>
+    <w:p/>
+    <w:p>
+      <w:pPr>
+        <w:pStyle w:val="Heading2"/>
+      </w:pPr>
+      <w:r>
+        <w:rPr>
+          <w:rFonts w:ascii="Arial" w:cs="Arial" w:eastAsia="Arial" w:hAnsi="Arial"/>
+          <w:b/>
+          <w:bCs/>
+          <w:sz w:val="24"/>
+          <w:szCs w:val="24"/>
+        </w:rPr>
+        <w:t xml:space="preserve">5.7 Gobierno técnico de proveedores externos</w:t>
+      </w:r>
+    </w:p>
+    <w:p>
+      <w:r>
+        <w:t xml:space="preserve">Las funciones asignadas al Departamento comprenden no sólo el desarrollo interno de sistemas informáticos, sino también la supervisión técnica de aquellas soluciones provistas por empresas externas. En consecuencia, la contratación de un proveedor no implica delegar la responsabilidad sobre la calidad del software incorporado al ecosistema municipal.</w:t>
+      </w:r>
+    </w:p>
+    <w:p>
+      <w:r>
+        <w:t xml:space="preserve">La Jefatura deberá asumir un rol activo durante todo el ciclo de contratación, participando en la definición de los requerimientos técnicos, colaborando en la elaboración de las especificaciones funcionales y verificando que las soluciones propuestas resulten compatibles con la arquitectura tecnológica del Municipio y con los estándares definidos por el Departamento.</w:t>
+      </w:r>
+    </w:p>
+    <w:p>
+      <w:r>
+        <w:t xml:space="preserve">Durante la ejecución de los proyectos se promoverán reuniones periódicas de seguimiento técnico que permitan detectar tempranamente desvíos respecto de las especificaciones acordadas, facilitando la resolución de inconvenientes antes de su impacto sobre la implementación.</w:t>
+      </w:r>
+    </w:p>
+    <w:p>
+      <w:r>
+        <w:t xml:space="preserve">Asimismo, previo a la recepción definitiva de cualquier desarrollo contratado, se verificará el cumplimiento de requisitos mínimos que garanticen la autonomía tecnológica del Municipio. Entre ellos se incluyen la entrega del código fuente, la documentación técnica actualizada, los modelos de datos, los procedimientos de instalación y despliegue, la descripción de las interfaces de integración y las evidencias de las pruebas realizadas.</w:t>
+      </w:r>
+    </w:p>
+    <w:p>
+      <w:r>
+        <w:t xml:space="preserve">Cuando los contratos contemplen servicios de mantenimiento, la Jefatura actuará además como nexo técnico entre las áreas usuarias y los proveedores, coordinando la gestión de incidencias, verificando el cumplimiento de los niveles de servicio comprometidos y controlando la calidad de las soluciones implementadas.</w:t>
+      </w:r>
+    </w:p>
+    <w:p>
+      <w:r>
+        <w:t xml:space="preserve">De esta manera se fortalece el rol institucional del Departamento como autoridad técnica sobre los sistemas municipales, evitando la dependencia tecnológica de proveedores externos y asegurando que el conocimiento generado permanezca dentro de la organización.</w:t>
+      </w:r>
+    </w:p>
+    <w:p/>
+    <w:p>
+      <w:pPr>
+        <w:pStyle w:val="Heading2"/>
+      </w:pPr>
+      <w:r>
+        <w:rPr>
+          <w:rFonts w:ascii="Arial" w:cs="Arial" w:eastAsia="Arial" w:hAnsi="Arial"/>
+          <w:b/>
+          <w:bCs/>
+          <w:sz w:val="24"/>
+          <w:szCs w:val="24"/>
+        </w:rPr>
+        <w:t xml:space="preserve">5.8 Innovación tecnológica y utilización responsable de Inteligencia Artificial</w:t>
+      </w:r>
+    </w:p>
+    <w:p>
+      <w:r>
+        <w:t xml:space="preserve">La innovación tecnológica constituye una función permanente del Departamento y debe orientarse a mejorar la calidad de los servicios brindados por la Municipalidad. Sin embargo, la incorporación de nuevas herramientas debe responder a una planificación institucional y no únicamente a iniciativas individuales o tendencias del mercado.</w:t>
+      </w:r>
+    </w:p>
+    <w:p>
+      <w:r>
+        <w:t xml:space="preserve">La Jefatura impulsará un proceso continuo de evaluación de tecnologías, metodologías y herramientas de desarrollo, analizando su impacto sobre la infraestructura existente, los costos de adopción, las necesidades de capacitación y los beneficios concretos que puedan aportar a la gestión municipal. Sólo aquellas soluciones que demuestren una mejora objetiva en la productividad, la seguridad o la calidad del software serán incorporadas como estándares institucionales.</w:t>
+      </w:r>
+    </w:p>
+    <w:p>
+      <w:r>
+        <w:t xml:space="preserve">Dentro de este escenario, las herramientas basadas en Inteligencia Artificial representan una oportunidad para asistir al equipo de desarrollo en tareas como generación de código, documentación técnica, análisis de errores y automatización de actividades repetitivas. Su utilización permitirá reducir tiempos operativos y mejorar la productividad del Departamento, siempre que su uso se realice bajo criterios claros de seguridad y confidencialidad.</w:t>
+      </w:r>
+    </w:p>
+    <w:p>
+      <w:r>
+        <w:t xml:space="preserve">Por tal motivo se establecerán lineamientos que prohíban expresamente incorporar en plataformas públicas de Inteligencia Artificial información sensible, datos personales de ciudadanos, credenciales institucionales o cualquier otro contenido protegido por las políticas de seguridad del Municipio.</w:t>
+      </w:r>
+    </w:p>
+    <w:p>
+      <w:r>
+        <w:t xml:space="preserve">Asimismo, toda producción generada mediante estas herramientas deberá ser revisada y validada por el profesional responsable del desarrollo antes de incorporarse a los sistemas municipales, manteniendo en todo momento la responsabilidad técnica sobre las decisiones adoptadas.</w:t>
+      </w:r>
+    </w:p>
+    <w:p>
+      <w:r>
+        <w:t xml:space="preserve">Como proyección futura, y sujeto a disponibilidad presupuestaria, podrá evaluarse la incorporación de plataformas corporativas de Inteligencia Artificial administradas por el Municipio, que ofrezcan mayores garantías de privacidad, trazabilidad y administración centralizada.</w:t>
+      </w:r>
+    </w:p>
+    <w:p>
+      <w:r>
+        <w:t xml:space="preserve">De este modo, la innovación tecnológica dejará de depender de decisiones individuales para transformarse en una política institucional permanente, orientada a fortalecer la capacidad del Departamento para brindar soluciones modernas, seguras y sostenibles.</w:t>
+      </w:r>
+    </w:p>
+    <w:p/>
+    <w:p>
+      <w:pPr>
+        <w:pStyle w:val="Heading1"/>
+      </w:pPr>
+      <w:r>
+        <w:rPr>
+          <w:rFonts w:ascii="Arial" w:cs="Arial" w:eastAsia="Arial" w:hAnsi="Arial"/>
+          <w:b/>
+          <w:bCs/>
+          <w:sz w:val="28"/>
+          <w:szCs w:val="28"/>
+        </w:rPr>
+        <w:t xml:space="preserve">6. OPTIMIZACIÓN DE RECURSOS Y ESCENARIOS DE INVERSIÓN</w:t>
+      </w:r>
+    </w:p>
+    <w:p>
+      <w:r>
+        <w:rPr>
+          <w:i/>
+          <w:iCs/>
+        </w:rPr>
         <w:t xml:space="preserve">La primera responsabilidad de una Jefatura consiste en optimizar los recursos existentes antes de requerir nuevas incorporaciones presupuestarias. En consecuencia, las acciones propuestas en esta etapa priorizan la reorganización del trabajo, la mejora de los procedimientos y el fortalecimiento de la coordinación interna, aprovechando la infraestructura y el capital humano actualmente disponibles.</w:t>
       </w:r>
     </w:p>
     <w:p>
+      <w:pPr>
+        <w:pStyle w:val="Heading2"/>
+      </w:pPr>
+      <w:r>
+        <w:rPr>
+          <w:rFonts w:ascii="Arial" w:cs="Arial" w:eastAsia="Arial" w:hAnsi="Arial"/>
+          <w:b/>
+          <w:bCs/>
+          <w:sz w:val="24"/>
+          <w:szCs w:val="24"/>
+        </w:rPr>
+        <w:t xml:space="preserve">6.1 Escenario SIN PRESUPUESTO (Plan Realista - Costo $0)</w:t>
+      </w:r>
+    </w:p>
+    <w:p>
       <w:r>
         <w:rPr>
           <w:b/>
@@ -1494,87 +1507,93 @@
     <w:p/>
     <w:p>
       <w:pPr>
+        <w:pStyle w:val="Heading2"/>
+      </w:pPr>
+      <w:r>
+        <w:rPr>
+          <w:rFonts w:ascii="Arial" w:cs="Arial" w:eastAsia="Arial" w:hAnsi="Arial"/>
+          <w:b/>
+          <w:bCs/>
+          <w:sz w:val="24"/>
+          <w:szCs w:val="24"/>
+        </w:rPr>
+        <w:t xml:space="preserve">6.2 Escenario CON PRESUPUESTO (Plan Proyectado a Mediano/Largo Plazo)</w:t>
+      </w:r>
+    </w:p>
+    <w:p>
+      <w:r>
+        <w:rPr>
+          <w:b/>
+          <w:bCs/>
+        </w:rPr>
+        <w:t xml:space="preserve">1. Licencias Corporativas Oficiales de IA: </w:t>
+      </w:r>
+      <w:r>
+        <w:t xml:space="preserve">Adquisición de licencias para IDEs en entornos privados institucionales.</w:t>
+      </w:r>
+    </w:p>
+    <w:p>
+      <w:r>
+        <w:rPr>
+          <w:b/>
+          <w:bCs/>
+        </w:rPr>
+        <w:t xml:space="preserve">2. Plataforma de Análisis Estático de Calidad: </w:t>
+      </w:r>
+      <w:r>
+        <w:t xml:space="preserve">Herramientas automatizadas (ej. SonarQube) para auditar deuda técnica y seguridad.</w:t>
+      </w:r>
+    </w:p>
+    <w:p>
+      <w:r>
+        <w:rPr>
+          <w:b/>
+          <w:bCs/>
+        </w:rPr>
+        <w:t xml:space="preserve">3. Contenerización e Infraestructura: </w:t>
+      </w:r>
+      <w:r>
+        <w:t xml:space="preserve">Proyección presupuestaria para migración a contenedores Docker.</w:t>
+      </w:r>
+    </w:p>
+    <w:p>
+      <w:r>
+        <w:rPr>
+          <w:b/>
+          <w:bCs/>
+        </w:rPr>
+        <w:t xml:space="preserve">4. Capacitación Formal Externa: </w:t>
+      </w:r>
+      <w:r>
+        <w:t xml:space="preserve">Cursos profesionales en Clean Architecture, APIs y Microservicios.</w:t>
+      </w:r>
+    </w:p>
+    <w:p>
+      <w:r>
+        <w:rPr>
+          <w:b/>
+          <w:bCs/>
+        </w:rPr>
+        <w:t xml:space="preserve">5. Equipamiento para Trabajo Colaborativo: </w:t>
+      </w:r>
+      <w:r>
+        <w:t xml:space="preserve">Provisión de webcams y auriculares con micrófono para puestos de trabajo.</w:t>
+      </w:r>
+    </w:p>
+    <w:p/>
+    <w:p>
+      <w:pPr>
         <w:pStyle w:val="Heading1"/>
       </w:pPr>
       <w:r>
         <w:rPr>
-          <w:b/>
-          <w:bCs/>
-        </w:rPr>
-        <w:t xml:space="preserve">10. Proyección con incorporación de recursos (Escenario con presupuesto)</w:t>
-      </w:r>
-    </w:p>
-    <w:p>
-      <w:r>
-        <w:rPr>
-          <w:b/>
-          <w:bCs/>
-        </w:rPr>
-        <w:t xml:space="preserve">1. Licencias Corporativas Oficiales de IA: </w:t>
-      </w:r>
-      <w:r>
-        <w:t xml:space="preserve">Adquisición de licencias para IDEs en entornos privados institucionales.</w:t>
-      </w:r>
-    </w:p>
-    <w:p>
-      <w:r>
-        <w:rPr>
-          <w:b/>
-          <w:bCs/>
-        </w:rPr>
-        <w:t xml:space="preserve">2. Plataforma de Análisis Estático de Calidad: </w:t>
-      </w:r>
-      <w:r>
-        <w:t xml:space="preserve">Herramientas automatizadas (ej. SonarQube) para auditar deuda técnica y seguridad.</w:t>
-      </w:r>
-    </w:p>
-    <w:p>
-      <w:r>
-        <w:rPr>
-          <w:b/>
-          <w:bCs/>
-        </w:rPr>
-        <w:t xml:space="preserve">3. Contenerización e Infraestructura: </w:t>
-      </w:r>
-      <w:r>
-        <w:t xml:space="preserve">Proyección presupuestaria para migración a contenedores Docker.</w:t>
-      </w:r>
-    </w:p>
-    <w:p>
-      <w:r>
-        <w:rPr>
-          <w:b/>
-          <w:bCs/>
-        </w:rPr>
-        <w:t xml:space="preserve">4. Capacitación Formal Externa: </w:t>
-      </w:r>
-      <w:r>
-        <w:t xml:space="preserve">Cursos profesionales en Clean Architecture, APIs y Microservicios.</w:t>
-      </w:r>
-    </w:p>
-    <w:p>
-      <w:r>
-        <w:rPr>
-          <w:b/>
-          <w:bCs/>
-        </w:rPr>
-        <w:t xml:space="preserve">5. Equipamiento para Trabajo Colaborativo: </w:t>
-      </w:r>
-      <w:r>
-        <w:t xml:space="preserve">Provisión de webcams y auriculares con micrófono para puestos de trabajo.</w:t>
-      </w:r>
-    </w:p>
-    <w:p/>
-    <w:p>
-      <w:pPr>
-        <w:pStyle w:val="Heading1"/>
-      </w:pPr>
-      <w:r>
-        <w:rPr>
-          <w:b/>
-          <w:bCs/>
-        </w:rPr>
-        <w:t xml:space="preserve">11. Estrategia de implementación (Roadmap por etapas)</w:t>
+          <w:rFonts w:ascii="Arial" w:cs="Arial" w:eastAsia="Arial" w:hAnsi="Arial"/>
+          <w:b/>
+          <w:bCs/>
+          <w:sz w:val="28"/>
+          <w:szCs w:val="28"/>
+        </w:rPr>
+        <w:t xml:space="preserve">7. ESTRATEGIA DE IMPLEMENTACIÓN Y ROADMAP POR ETAPAS</w:t>
       </w:r>
     </w:p>
     <w:p>
@@ -1583,79 +1602,105 @@
       </w:pPr>
       <w:r>
         <w:rPr>
-          <w:b/>
-          <w:bCs/>
-        </w:rPr>
-        <w:t xml:space="preserve">Etapa I – Conocer y ordenar (Sprints 1 a 4)</w:t>
-      </w:r>
-    </w:p>
-    <w:p>
+          <w:rFonts w:ascii="Arial" w:cs="Arial" w:eastAsia="Arial" w:hAnsi="Arial"/>
+          <w:b/>
+          <w:bCs/>
+          <w:sz w:val="24"/>
+          <w:szCs w:val="24"/>
+        </w:rPr>
+        <w:t xml:space="preserve">7.1 Fases de la Hoja de Ruta Ágil</w:t>
+      </w:r>
+    </w:p>
+    <w:p>
+      <w:pPr>
+        <w:pStyle w:val="ListParagraph"/>
+        <w:numPr>
+          <w:ilvl w:val="0"/>
+          <w:numId w:val="1"/>
+        </w:numPr>
+      </w:pPr>
+      <w:r>
+        <w:rPr>
+          <w:b/>
+          <w:bCs/>
+        </w:rPr>
+        <w:t xml:space="preserve">Etapa I – Conocer y Ordenar (Sprints 1 a 4): </w:t>
+      </w:r>
       <w:r>
         <w:t xml:space="preserve">Relevamiento de competencias, inventario de sistemas, conformación de la Cartera Única en Redmine y asignación de Referentes Secundarios.</w:t>
       </w:r>
     </w:p>
     <w:p>
       <w:pPr>
+        <w:pStyle w:val="ListParagraph"/>
+        <w:numPr>
+          <w:ilvl w:val="0"/>
+          <w:numId w:val="1"/>
+        </w:numPr>
+      </w:pPr>
+      <w:r>
+        <w:rPr>
+          <w:b/>
+          <w:bCs/>
+        </w:rPr>
+        <w:t xml:space="preserve">Etapa II – Integrar y Estandarizar (Sprints 5 a 12): </w:t>
+      </w:r>
+      <w:r>
+        <w:t xml:space="preserve">Reuniones transversales inter-oficinas, difusión de guías de buenas prácticas, obligatoriedad del template de arquitectura y gobierno técnico de proveedores.</w:t>
+      </w:r>
+    </w:p>
+    <w:p>
+      <w:pPr>
+        <w:pStyle w:val="ListParagraph"/>
+        <w:numPr>
+          <w:ilvl w:val="0"/>
+          <w:numId w:val="1"/>
+        </w:numPr>
+      </w:pPr>
+      <w:r>
+        <w:rPr>
+          <w:b/>
+          <w:bCs/>
+        </w:rPr>
+        <w:t xml:space="preserve">Etapa III – Consolidar y Evaluar (Sprints 13+): </w:t>
+      </w:r>
+      <w:r>
+        <w:t xml:space="preserve">Medición de KPIs, revisiones de código en GitLab y proyectos de dockerización.</w:t>
+      </w:r>
+    </w:p>
+    <w:p>
+      <w:pPr>
+        <w:pStyle w:val="ListParagraph"/>
+        <w:numPr>
+          <w:ilvl w:val="0"/>
+          <w:numId w:val="1"/>
+        </w:numPr>
+      </w:pPr>
+      <w:r>
+        <w:rPr>
+          <w:b/>
+          <w:bCs/>
+        </w:rPr>
+        <w:t xml:space="preserve">Proceso Permanente – Mejora Continua: </w:t>
+      </w:r>
+      <w:r>
+        <w:t xml:space="preserve">Auditorías periódicas de procedimientos, actualización de capacitaciones y evaluación de innovaciones.</w:t>
+      </w:r>
+    </w:p>
+    <w:p/>
+    <w:p>
+      <w:pPr>
         <w:pStyle w:val="Heading2"/>
       </w:pPr>
       <w:r>
         <w:rPr>
-          <w:b/>
-          <w:bCs/>
-        </w:rPr>
-        <w:t xml:space="preserve">Etapa II – Integrar y estandarizar (Sprints 5 a 12)</w:t>
-      </w:r>
-    </w:p>
-    <w:p>
-      <w:r>
-        <w:t xml:space="preserve">Reuniones transversales inter-oficinas, difusión de guías de buenas prácticas, obligatoriedad del template de arquitectura y gobierno técnico de proveedores.</w:t>
-      </w:r>
-    </w:p>
-    <w:p>
-      <w:pPr>
-        <w:pStyle w:val="Heading2"/>
-      </w:pPr>
-      <w:r>
-        <w:rPr>
-          <w:b/>
-          <w:bCs/>
-        </w:rPr>
-        <w:t xml:space="preserve">Etapa III – Consolidar y transferir (Sprints 13+)</w:t>
-      </w:r>
-    </w:p>
-    <w:p>
-      <w:r>
-        <w:t xml:space="preserve">Medición de KPIs, revisiones de código en GitLab y proyectos de dockerización.</w:t>
-      </w:r>
-    </w:p>
-    <w:p>
-      <w:pPr>
-        <w:pStyle w:val="Heading2"/>
-      </w:pPr>
-      <w:r>
-        <w:rPr>
-          <w:b/>
-          <w:bCs/>
-        </w:rPr>
-        <w:t xml:space="preserve">Proceso permanente – Evaluar, capacitar e innovar</w:t>
-      </w:r>
-    </w:p>
-    <w:p>
-      <w:r>
-        <w:t xml:space="preserve">Auditorías periódicas de procedimientos, actualización de capacitaciones y evaluación de innovaciones.</w:t>
-      </w:r>
-    </w:p>
-    <w:p/>
-    <w:p>
-      <w:pPr>
-        <w:pStyle w:val="Heading1"/>
-      </w:pPr>
-      <w:r>
-        <w:rPr>
-          <w:b/>
-          <w:bCs/>
-        </w:rPr>
-        <w:t xml:space="preserve">12. Indicadores de gestión y mejora continua (KPIs)</w:t>
+          <w:rFonts w:ascii="Arial" w:cs="Arial" w:eastAsia="Arial" w:hAnsi="Arial"/>
+          <w:b/>
+          <w:bCs/>
+          <w:sz w:val="24"/>
+          <w:szCs w:val="24"/>
+        </w:rPr>
+        <w:t xml:space="preserve">7.2 Cuadro Resumen de Implementación</w:t>
       </w:r>
     </w:p>
     <w:tbl>
@@ -1678,11 +1723,229 @@
       <w:tr>
         <w:tc>
           <w:tcPr>
+            <w:tcW w:type="pct" w:w="30%"/>
+          </w:tcPr>
+          <w:p>
+            <w:r>
+              <w:rPr>
+                <w:rFonts w:ascii="Arial" w:cs="Arial" w:eastAsia="Arial" w:hAnsi="Arial"/>
+                <w:b/>
+                <w:bCs/>
+              </w:rPr>
+              <w:t xml:space="preserve">Etapa</w:t>
+            </w:r>
+          </w:p>
+        </w:tc>
+        <w:tc>
+          <w:tcPr>
+            <w:tcW w:type="pct" w:w="35%"/>
+          </w:tcPr>
+          <w:p>
+            <w:r>
+              <w:rPr>
+                <w:rFonts w:ascii="Arial" w:cs="Arial" w:eastAsia="Arial" w:hAnsi="Arial"/>
+                <w:b/>
+                <w:bCs/>
+              </w:rPr>
+              <w:t xml:space="preserve">Objetivo Principal</w:t>
+            </w:r>
+          </w:p>
+        </w:tc>
+        <w:tc>
+          <w:tcPr>
+            <w:tcW w:type="pct" w:w="35%"/>
+          </w:tcPr>
+          <w:p>
+            <w:r>
+              <w:rPr>
+                <w:rFonts w:ascii="Arial" w:cs="Arial" w:eastAsia="Arial" w:hAnsi="Arial"/>
+                <w:b/>
+                <w:bCs/>
+              </w:rPr>
+              <w:t xml:space="preserve">Resultado Esperado</w:t>
+            </w:r>
+          </w:p>
+        </w:tc>
+      </w:tr>
+      <w:tr>
+        <w:tc>
+          <w:p>
+            <w:r>
+              <w:rPr>
+                <w:rFonts w:ascii="Arial" w:cs="Arial" w:eastAsia="Arial" w:hAnsi="Arial"/>
+                <w:b/>
+                <w:bCs/>
+              </w:rPr>
+              <w:t xml:space="preserve">Organización (Etapa I)</w:t>
+            </w:r>
+          </w:p>
+        </w:tc>
+        <w:tc>
+          <w:p>
+            <w:r>
+              <w:rPr>
+                <w:rFonts w:ascii="Arial" w:cs="Arial" w:eastAsia="Arial" w:hAnsi="Arial"/>
+              </w:rPr>
+              <w:t xml:space="preserve">Conocer e inventariar el Departamento</w:t>
+            </w:r>
+          </w:p>
+        </w:tc>
+        <w:tc>
+          <w:p>
+            <w:r>
+              <w:rPr>
+                <w:rFonts w:ascii="Arial" w:cs="Arial" w:eastAsia="Arial" w:hAnsi="Arial"/>
+              </w:rPr>
+              <w:t xml:space="preserve">Inventario completo de sistemas y Matriz de Competencias</w:t>
+            </w:r>
+          </w:p>
+        </w:tc>
+      </w:tr>
+      <w:tr>
+        <w:tc>
+          <w:p>
+            <w:r>
+              <w:rPr>
+                <w:rFonts w:ascii="Arial" w:cs="Arial" w:eastAsia="Arial" w:hAnsi="Arial"/>
+                <w:b/>
+                <w:bCs/>
+              </w:rPr>
+              <w:t xml:space="preserve">Estandarización (Etapa II)</w:t>
+            </w:r>
+          </w:p>
+        </w:tc>
+        <w:tc>
+          <w:p>
+            <w:r>
+              <w:rPr>
+                <w:rFonts w:ascii="Arial" w:cs="Arial" w:eastAsia="Arial" w:hAnsi="Arial"/>
+              </w:rPr>
+              <w:t xml:space="preserve">Unificar procedimientos y arquitectura</w:t>
+            </w:r>
+          </w:p>
+        </w:tc>
+        <w:tc>
+          <w:p>
+            <w:r>
+              <w:rPr>
+                <w:rFonts w:ascii="Arial" w:cs="Arial" w:eastAsia="Arial" w:hAnsi="Arial"/>
+              </w:rPr>
+              <w:t xml:space="preserve">Procesos homogéneos y guías instituidas</w:t>
+            </w:r>
+          </w:p>
+        </w:tc>
+      </w:tr>
+      <w:tr>
+        <w:tc>
+          <w:p>
+            <w:r>
+              <w:rPr>
+                <w:rFonts w:ascii="Arial" w:cs="Arial" w:eastAsia="Arial" w:hAnsi="Arial"/>
+                <w:b/>
+                <w:bCs/>
+              </w:rPr>
+              <w:t xml:space="preserve">Consolidación (Etapa III)</w:t>
+            </w:r>
+          </w:p>
+        </w:tc>
+        <w:tc>
+          <w:p>
+            <w:r>
+              <w:rPr>
+                <w:rFonts w:ascii="Arial" w:cs="Arial" w:eastAsia="Arial" w:hAnsi="Arial"/>
+              </w:rPr>
+              <w:t xml:space="preserve">Reducir riesgos operacionales</w:t>
+            </w:r>
+          </w:p>
+        </w:tc>
+        <w:tc>
+          <w:p>
+            <w:r>
+              <w:rPr>
+                <w:rFonts w:ascii="Arial" w:cs="Arial" w:eastAsia="Arial" w:hAnsi="Arial"/>
+              </w:rPr>
+              <w:t xml:space="preserve">Conocimiento distribuido (Referentes Secundarios) y KPIs</w:t>
+            </w:r>
+          </w:p>
+        </w:tc>
+      </w:tr>
+      <w:tr>
+        <w:tc>
+          <w:p>
+            <w:r>
+              <w:rPr>
+                <w:rFonts w:ascii="Arial" w:cs="Arial" w:eastAsia="Arial" w:hAnsi="Arial"/>
+                <w:b/>
+                <w:bCs/>
+              </w:rPr>
+              <w:t xml:space="preserve">Innovación (Permanente)</w:t>
+            </w:r>
+          </w:p>
+        </w:tc>
+        <w:tc>
+          <w:p>
+            <w:r>
+              <w:rPr>
+                <w:rFonts w:ascii="Arial" w:cs="Arial" w:eastAsia="Arial" w:hAnsi="Arial"/>
+              </w:rPr>
+              <w:t xml:space="preserve">Evolución tecnológica y adopción de IA</w:t>
+            </w:r>
+          </w:p>
+        </w:tc>
+        <w:tc>
+          <w:p>
+            <w:r>
+              <w:rPr>
+                <w:rFonts w:ascii="Arial" w:cs="Arial" w:eastAsia="Arial" w:hAnsi="Arial"/>
+              </w:rPr>
+              <w:t xml:space="preserve">Mayor productividad y soluciones sostenibles</w:t>
+            </w:r>
+          </w:p>
+        </w:tc>
+      </w:tr>
+    </w:tbl>
+    <w:p/>
+    <w:p>
+      <w:pPr>
+        <w:pStyle w:val="Heading1"/>
+      </w:pPr>
+      <w:r>
+        <w:rPr>
+          <w:rFonts w:ascii="Arial" w:cs="Arial" w:eastAsia="Arial" w:hAnsi="Arial"/>
+          <w:b/>
+          <w:bCs/>
+          <w:sz w:val="28"/>
+          <w:szCs w:val="28"/>
+        </w:rPr>
+        <w:t xml:space="preserve">8. MATRIZ DE INDICADORES DE EVALUACIÓN Y GESTIÓN (KPIs)</w:t>
+      </w:r>
+    </w:p>
+    <w:tbl>
+      <w:tblPr>
+        <w:tblW w:type="pct" w:w="100%"/>
+        <w:tblBorders>
+          <w:top w:val="single" w:color="auto" w:sz="4"/>
+          <w:left w:val="single" w:color="auto" w:sz="4"/>
+          <w:bottom w:val="single" w:color="auto" w:sz="4"/>
+          <w:right w:val="single" w:color="auto" w:sz="4"/>
+          <w:insideH w:val="single" w:color="auto" w:sz="4"/>
+          <w:insideV w:val="single" w:color="auto" w:sz="4"/>
+        </w:tblBorders>
+      </w:tblPr>
+      <w:tblGrid>
+        <w:gridCol w:w="100"/>
+        <w:gridCol w:w="100"/>
+        <w:gridCol w:w="100"/>
+      </w:tblGrid>
+      <w:tr>
+        <w:tc>
+          <w:tcPr>
             <w:tcW w:type="pct" w:w="25%"/>
           </w:tcPr>
           <w:p>
             <w:r>
               <w:rPr>
+                <w:rFonts w:ascii="Arial" w:cs="Arial" w:eastAsia="Arial" w:hAnsi="Arial"/>
                 <w:b/>
                 <w:bCs/>
               </w:rPr>
@@ -1697,6 +1960,7 @@
           <w:p>
             <w:r>
               <w:rPr>
+                <w:rFonts w:ascii="Arial" w:cs="Arial" w:eastAsia="Arial" w:hAnsi="Arial"/>
                 <w:b/>
                 <w:bCs/>
               </w:rPr>
@@ -1711,6 +1975,7 @@
           <w:p>
             <w:r>
               <w:rPr>
+                <w:rFonts w:ascii="Arial" w:cs="Arial" w:eastAsia="Arial" w:hAnsi="Arial"/>
                 <w:b/>
                 <w:bCs/>
               </w:rPr>
@@ -1724,6 +1989,7 @@
           <w:p>
             <w:r>
               <w:rPr>
+                <w:rFonts w:ascii="Arial" w:cs="Arial" w:eastAsia="Arial" w:hAnsi="Arial"/>
                 <w:b/>
                 <w:bCs/>
               </w:rPr>
@@ -1734,6 +2000,9 @@
         <w:tc>
           <w:p>
             <w:r>
+              <w:rPr>
+                <w:rFonts w:ascii="Arial" w:cs="Arial" w:eastAsia="Arial" w:hAnsi="Arial"/>
+              </w:rPr>
               <w:t xml:space="preserve">% de Sistemas Críticos con Referente Secundario Asignado</w:t>
             </w:r>
           </w:p>
@@ -1741,6 +2010,9 @@
         <w:tc>
           <w:p>
             <w:r>
+              <w:rPr>
+                <w:rFonts w:ascii="Arial" w:cs="Arial" w:eastAsia="Arial" w:hAnsi="Arial"/>
+              </w:rPr>
               <w:t xml:space="preserve">Tender al 100% para eliminar los Single Points of Failure.</w:t>
             </w:r>
           </w:p>
@@ -1751,6 +2023,7 @@
           <w:p>
             <w:r>
               <w:rPr>
+                <w:rFonts w:ascii="Arial" w:cs="Arial" w:eastAsia="Arial" w:hAnsi="Arial"/>
                 <w:b/>
                 <w:bCs/>
               </w:rPr>
@@ -1761,6 +2034,9 @@
         <w:tc>
           <w:p>
             <w:r>
+              <w:rPr>
+                <w:rFonts w:ascii="Arial" w:cs="Arial" w:eastAsia="Arial" w:hAnsi="Arial"/>
+              </w:rPr>
               <w:t xml:space="preserve">% de Sistemas con Documentación Mínima Útil</w:t>
             </w:r>
           </w:p>
@@ -1768,6 +2044,9 @@
         <w:tc>
           <w:p>
             <w:r>
+              <w:rPr>
+                <w:rFonts w:ascii="Arial" w:cs="Arial" w:eastAsia="Arial" w:hAnsi="Arial"/>
+              </w:rPr>
               <w:t xml:space="preserve">Garantizar la retención y transferencia del conocimiento.</w:t>
             </w:r>
           </w:p>
@@ -1778,6 +2057,7 @@
           <w:p>
             <w:r>
               <w:rPr>
+                <w:rFonts w:ascii="Arial" w:cs="Arial" w:eastAsia="Arial" w:hAnsi="Arial"/>
                 <w:b/>
                 <w:bCs/>
               </w:rPr>
@@ -1788,6 +2068,9 @@
         <w:tc>
           <w:p>
             <w:r>
+              <w:rPr>
+                <w:rFonts w:ascii="Arial" w:cs="Arial" w:eastAsia="Arial" w:hAnsi="Arial"/>
+              </w:rPr>
               <w:t xml:space="preserve">% de Proyectos Nuevos alineados a la Arquitectura Base</w:t>
             </w:r>
           </w:p>
@@ -1795,6 +2078,9 @@
         <w:tc>
           <w:p>
             <w:r>
+              <w:rPr>
+                <w:rFonts w:ascii="Arial" w:cs="Arial" w:eastAsia="Arial" w:hAnsi="Arial"/>
+              </w:rPr>
               <w:t xml:space="preserve">Garantizar código homogéneo, mantenible y escalable.</w:t>
             </w:r>
           </w:p>
@@ -1805,6 +2091,7 @@
           <w:p>
             <w:r>
               <w:rPr>
+                <w:rFonts w:ascii="Arial" w:cs="Arial" w:eastAsia="Arial" w:hAnsi="Arial"/>
                 <w:b/>
                 <w:bCs/>
               </w:rPr>
@@ -1815,6 +2102,9 @@
         <w:tc>
           <w:p>
             <w:r>
+              <w:rPr>
+                <w:rFonts w:ascii="Arial" w:cs="Arial" w:eastAsia="Arial" w:hAnsi="Arial"/>
+              </w:rPr>
               <w:t xml:space="preserve">Lead Time de Desarrollo (Solicitud ➔ Puesta en Producción)</w:t>
             </w:r>
           </w:p>
@@ -1822,6 +2112,9 @@
         <w:tc>
           <w:p>
             <w:r>
+              <w:rPr>
+                <w:rFonts w:ascii="Arial" w:cs="Arial" w:eastAsia="Arial" w:hAnsi="Arial"/>
+              </w:rPr>
               <w:t xml:space="preserve">Reducir tiempos de entrega mediante priorización ágil.</w:t>
             </w:r>
           </w:p>
@@ -1832,6 +2125,7 @@
           <w:p>
             <w:r>
               <w:rPr>
+                <w:rFonts w:ascii="Arial" w:cs="Arial" w:eastAsia="Arial" w:hAnsi="Arial"/>
                 <w:b/>
                 <w:bCs/>
               </w:rPr>
@@ -1842,6 +2136,9 @@
         <w:tc>
           <w:p>
             <w:r>
+              <w:rPr>
+                <w:rFonts w:ascii="Arial" w:cs="Arial" w:eastAsia="Arial" w:hAnsi="Arial"/>
+              </w:rPr>
               <w:t xml:space="preserve">Tasa de Defectos Reportados en Post-Producción</w:t>
             </w:r>
           </w:p>
@@ -1849,6 +2146,9 @@
         <w:tc>
           <w:p>
             <w:r>
+              <w:rPr>
+                <w:rFonts w:ascii="Arial" w:cs="Arial" w:eastAsia="Arial" w:hAnsi="Arial"/>
+              </w:rPr>
               <w:t xml:space="preserve">Minimizar fallas mediante buenas prácticas y peer review.</w:t>
             </w:r>
           </w:p>
@@ -1859,6 +2159,7 @@
           <w:p>
             <w:r>
               <w:rPr>
+                <w:rFonts w:ascii="Arial" w:cs="Arial" w:eastAsia="Arial" w:hAnsi="Arial"/>
                 <w:b/>
                 <w:bCs/>
               </w:rPr>
@@ -1869,6 +2170,9 @@
         <w:tc>
           <w:p>
             <w:r>
+              <w:rPr>
+                <w:rFonts w:ascii="Arial" w:cs="Arial" w:eastAsia="Arial" w:hAnsi="Arial"/>
+              </w:rPr>
               <w:t xml:space="preserve">% de Desarrollos Externos con Recepción Técnica Aprobada</w:t>
             </w:r>
           </w:p>
@@ -1876,6 +2180,9 @@
         <w:tc>
           <w:p>
             <w:r>
+              <w:rPr>
+                <w:rFonts w:ascii="Arial" w:cs="Arial" w:eastAsia="Arial" w:hAnsi="Arial"/>
+              </w:rPr>
               <w:t xml:space="preserve">Asegurar entrega de código fuente y soberanía técnica.</w:t>
             </w:r>
           </w:p>
@@ -1889,22 +2196,13 @@
       </w:pPr>
       <w:r>
         <w:rPr>
-          <w:b/>
-          <w:bCs/>
-        </w:rPr>
-        <w:t xml:space="preserve">13. Sectores del Departamento y Conclusión</w:t>
-      </w:r>
-    </w:p>
-    <w:p>
-      <w:pPr>
-        <w:pStyle w:val="Heading2"/>
-      </w:pPr>
-      <w:r>
-        <w:rPr>
-          <w:b/>
-          <w:bCs/>
-        </w:rPr>
-        <w:t xml:space="preserve">13.1. Organización funcional según Decreto N° 2250/98</w:t>
+          <w:rFonts w:ascii="Arial" w:cs="Arial" w:eastAsia="Arial" w:hAnsi="Arial"/>
+          <w:b/>
+          <w:bCs/>
+          <w:sz w:val="28"/>
+          <w:szCs w:val="28"/>
+        </w:rPr>
+        <w:t xml:space="preserve">9. SECTORES DEL DEPARTAMENTO (MATRIZ DINÁMICA DE TRABAJO)</w:t>
       </w:r>
     </w:p>
     <w:p>
@@ -1951,14 +2249,17 @@
     <w:p/>
     <w:p>
       <w:pPr>
-        <w:pStyle w:val="Heading2"/>
-      </w:pPr>
-      <w:r>
-        <w:rPr>
-          <w:b/>
-          <w:bCs/>
-        </w:rPr>
-        <w:t xml:space="preserve">13.2. Síntesis e impacto institucional final</w:t>
+        <w:pStyle w:val="Heading1"/>
+      </w:pPr>
+      <w:r>
+        <w:rPr>
+          <w:rFonts w:ascii="Arial" w:cs="Arial" w:eastAsia="Arial" w:hAnsi="Arial"/>
+          <w:b/>
+          <w:bCs/>
+          <w:sz w:val="28"/>
+          <w:szCs w:val="28"/>
+        </w:rPr>
+        <w:t xml:space="preserve">10. CONCLUSIONES</w:t>
       </w:r>
     </w:p>
     <w:p>
@@ -1983,7 +2284,7 @@
     </w:p>
     <w:sectPr>
       <w:pgSz w:w="11906" w:h="16838" w:orient="portrait"/>
-      <w:pgMar w:top="1700" w:right="850" w:bottom="850" w:left="1700" w:header="708" w:footer="708" w:gutter="0"/>
+      <w:pgMar w:top="1701" w:right="850" w:bottom="850" w:left="1701" w:header="708" w:footer="708" w:gutter="0"/>
       <w:pgNumType/>
       <w:docGrid w:linePitch="360"/>
     </w:sectPr>
@@ -2167,8 +2468,19 @@
 <file path=word/styles.xml><?xml version="1.0" encoding="utf-8"?>
 <w:styles xmlns:mc="http://schemas.openxmlformats.org/markup-compatibility/2006" xmlns:r="http://schemas.openxmlformats.org/officeDocument/2006/relationships" xmlns:w="http://schemas.openxmlformats.org/wordprocessingml/2006/main" xmlns:w14="http://schemas.microsoft.com/office/word/2010/wordml" xmlns:w15="http://schemas.microsoft.com/office/word/2012/wordml" mc:Ignorable="w14 w15">
   <w:docDefaults>
-    <w:rPrDefault/>
-    <w:pPrDefault/>
+    <w:rPrDefault>
+      <w:rPr>
+        <w:rFonts w:ascii="Arial" w:cs="Arial" w:eastAsia="Arial" w:hAnsi="Arial"/>
+        <w:sz w:val="22"/>
+        <w:szCs w:val="22"/>
+      </w:rPr>
+    </w:rPrDefault>
+    <w:pPrDefault>
+      <w:pPr>
+        <w:spacing w:after="100" w:line="259"/>
+        <w:jc w:val="both"/>
+      </w:pPr>
+    </w:pPrDefault>
   </w:docDefaults>
   <w:style w:type="paragraph" w:styleId="Title">
     <w:name w:val="Title"/>

</xml_diff>

<commit_message>
Compila en DOCX el texto exacto reconstruido por el usuario manteniendo el formato visual de Gabriela López
</commit_message>
<xml_diff>
--- a/Plan_Trabajo_Jefatura_Software_Version_Director.docx
+++ b/Plan_Trabajo_Jefatura_Software_Version_Director.docx
@@ -75,7 +75,7 @@
           <w:sz w:val="22"/>
           <w:szCs w:val="22"/>
         </w:rPr>
-        <w:t xml:space="preserve">CARGO: JEFE DE DEPARTAMENTO DE GESTIÓN, DESARROLLO E INNOVACIÓN EN SISTEMAS DE SOFTWARE</w:t>
+        <w:t xml:space="preserve">Cargo: Jefe de Departamento de Gestión, Desarrollo e Innovación en Sistemas de Software</w:t>
       </w:r>
     </w:p>
     <w:p>
@@ -90,7 +90,7 @@
           <w:sz w:val="20"/>
           <w:szCs w:val="20"/>
         </w:rPr>
-        <w:t xml:space="preserve">C.F. 1-31-00-01 | N° de Orden 6733</w:t>
+        <w:t xml:space="preserve">C.F. 1-31-00-01 – Nº de Orden 6733</w:t>
       </w:r>
     </w:p>
     <w:p/>
@@ -165,7 +165,7 @@
           <w:b/>
           <w:bCs/>
         </w:rPr>
-        <w:t xml:space="preserve">Cargo Actual: </w:t>
+        <w:t xml:space="preserve">Cargo actual: </w:t>
       </w:r>
       <w:r>
         <w:rPr>
@@ -181,7 +181,7 @@
           <w:b/>
           <w:bCs/>
         </w:rPr>
-        <w:t xml:space="preserve">Legajo N°: </w:t>
+        <w:t xml:space="preserve">Legajo: </w:t>
       </w:r>
       <w:r>
         <w:rPr>
@@ -201,7 +201,7 @@
           <w:i/>
           <w:iCs/>
         </w:rPr>
-        <w:t xml:space="preserve">Mar del Plata, Julio de 2026</w:t>
+        <w:t xml:space="preserve">Mar del Plata – Julio 2026</w:t>
       </w:r>
     </w:p>
     <w:p/>
@@ -774,7 +774,7 @@
     </w:p>
     <w:p>
       <w:r>
-        <w:t xml:space="preserve">La conducción del Departamento promoverá un ambiente de trabajo participativo, donde la comunicación, el intercambio de conocimientos y la construcción colectiva de soluciones sean parte de la cultura organizacional. La función de la Jefatura consistirá en facilitar el trabajo de los equipos, remover obstáculos, promover acuerdos y generar las condiciones necesarias para que cada integrante pueda desarrollar sus capacidades profesionales.</w:t>
+        <w:t xml:space="preserve">La conducción del Departamento deberá promover un ambiente de trabajo participativo, donde la comunicación, el intercambio de conocimientos y la construcción colectiva de soluciones sean parte de la cultura organizacional. La función de la Jefatura consistirá en facilitar el trabajo de los equipos, remover obstáculos, promover acuerdos y generar las condiciones necesarias para que cada integrante pueda desarrollar sus capacidades profesionales.</w:t>
       </w:r>
     </w:p>
     <w:p>
@@ -874,7 +874,7 @@
     </w:p>
     <w:p>
       <w:r>
-        <w:t xml:space="preserve">El Departamento presta servicios a las distintas áreas municipales y, de manera indirecta, a toda la comunidad. Las decisiones priorizarán el valor que los sistemas aportan a los procesos administrativos, sustentándose en un diálogo permanente y una definición clara de prioridades.</w:t>
+        <w:t xml:space="preserve">El Departamento presta servicios a las distintas áreas municipales y, de manera indirecta, a toda la comunidad. Las decisiones deberán priorizar el valor que los sistemas aportan a los procesos administrativos, sustentándose en un diálogo permanente y una definición clara de prioridades.</w:t>
       </w:r>
     </w:p>
     <w:p>
@@ -894,7 +894,7 @@
     </w:p>
     <w:p>
       <w:r>
-        <w:t xml:space="preserve">La planificación y administración del Departamento se apoyará en información objetiva proveniente de indicadores que midan la capacidad operativa, la evolución de proyectos y los cuellos de botella.</w:t>
+        <w:t xml:space="preserve">La planificación y administración del Departamento deberá apoyarse en información objetiva proveniente de indicadores que midan la capacidad operativa, la evolución de proyectos y los cuellos de botella.</w:t>
       </w:r>
     </w:p>
     <w:p/>
@@ -1045,7 +1045,802 @@
           <w:sz w:val="28"/>
           <w:szCs w:val="28"/>
         </w:rPr>
-        <w:t xml:space="preserve">5. PROPUESTAS DE MEJORA Y POLÍTICAS INSTITUCIONALES DE GESTIÓN</w:t>
+        <w:t xml:space="preserve">5. PROPUESTA DE MEJORA Y OPTIMIZACIÓN CON RECURSOS ACTUALES</w:t>
+      </w:r>
+    </w:p>
+    <w:p>
+      <w:r>
+        <w:t xml:space="preserve">La principal fortaleza del Departamento radica en el conocimiento técnico y funcional de su personal. Sin embargo, el diagnóstico realizado evidencia que gran parte de las dificultades actuales no responden exclusivamente a limitaciones tecnológicas o presupuestarias, sino a aspectos vinculados con la organización del trabajo, la coordinación entre equipos, la gestión del conocimiento y la ausencia de procedimientos institucionalizados.</w:t>
+      </w:r>
+    </w:p>
+    <w:p>
+      <w:r>
+        <w:t xml:space="preserve">En este contexto, se propone una estrategia de mejora basada en la optimización de los recursos actualmente disponibles, priorizando acciones que puedan implementarse sin requerir modificaciones en la estructura orgánica ni incorporaciones inmediatas de personal. El objetivo es fortalecer el funcionamiento del Departamento mediante la definición de procesos comunes, la mejora de la planificación, la estandarización técnica y una conducción activa por parte de la Jefatura.</w:t>
+      </w:r>
+    </w:p>
+    <w:p>
+      <w:r>
+        <w:t xml:space="preserve">Las medidas que se desarrollan a continuación responden directamente a las debilidades identificadas en el diagnóstico y se orientan a mejorar la capacidad del Departamento para desarrollar, mantener e integrar sistemas informáticos de forma eficiente, segura y sostenible.</w:t>
+      </w:r>
+    </w:p>
+    <w:p/>
+    <w:p>
+      <w:pPr>
+        <w:pStyle w:val="Heading2"/>
+      </w:pPr>
+      <w:r>
+        <w:rPr>
+          <w:rFonts w:ascii="Arial" w:cs="Arial" w:eastAsia="Arial" w:hAnsi="Arial"/>
+          <w:b/>
+          <w:bCs/>
+          <w:sz w:val="24"/>
+          <w:szCs w:val="24"/>
+        </w:rPr>
+        <w:t xml:space="preserve">5.1 Organización y planificación del trabajo</w:t>
+      </w:r>
+    </w:p>
+    <w:p>
+      <w:r>
+        <w:t xml:space="preserve">El Departamento desarrolla simultáneamente actividades de mantenimiento de sistemas existentes, atención de incidencias, asistencia técnica a distintas áreas municipales y desarrollo de nuevos proyectos. Esta diversidad de tareas, sumada a la cantidad limitada de recursos humanos disponibles, provoca frecuentes cambios de prioridades, interrupciones constantes y dificultades para planificar el trabajo de manera ordenada.</w:t>
+      </w:r>
+    </w:p>
+    <w:p>
+      <w:r>
+        <w:t xml:space="preserve">La propuesta consiste en establecer un modelo común de planificación que permita organizar las actividades del Departamento sin incrementar la carga administrativa sobre los equipos de desarrollo. La planificación deberá contemplar dos tipos de trabajo claramente diferenciados. Por un lado, las tareas vinculadas al mantenimiento evolutivo y correctivo de sistemas existentes, que requieren una atención continua y capacidad de respuesta frente a incidencias. Por otro, los nuevos desarrollos, que demandan una planificación más estructurada, con objetivos definidos y seguimiento periódico.</w:t>
+      </w:r>
+    </w:p>
+    <w:p>
+      <w:r>
+        <w:t xml:space="preserve">Para responder adecuadamente a ambas realidades, la Jefatura impulsará un modelo de gestión flexible que combine herramientas de planificación visual para las tareas continuas con ciclos breves de planificación para los proyectos de desarrollo, evitando la aplicación rígida de metodologías que no se adapten al contexto municipal.</w:t>
+      </w:r>
+    </w:p>
+    <w:p>
+      <w:r>
+        <w:t xml:space="preserve">La responsabilidad de la Jefatura será coordinar este proceso, evaluar periódicamente la capacidad operativa del Departamento, establecer prioridades institucionales y redistribuir recursos cuando las necesidades del servicio así lo requieran. Asimismo, todas las iniciativas deberán registrarse en una herramienta común de seguimiento que permita conocer en todo momento el estado de cada proyecto, los responsables asignados, las tareas pendientes y las dificultades detectadas.</w:t>
+      </w:r>
+    </w:p>
+    <w:p>
+      <w:r>
+        <w:t xml:space="preserve">La disponibilidad de información centralizada facilitará la toma de decisiones, permitirá identificar sobrecargas de trabajo y brindará una visión integral de la capacidad operativa del Departamento.</w:t>
+      </w:r>
+    </w:p>
+    <w:p>
+      <w:r>
+        <w:t xml:space="preserve">Con esta medida se espera mejorar la previsibilidad de los proyectos, optimizar la utilización de los recursos existentes y reducir la necesidad de reorganizaciones permanentes derivadas de la falta de planificación.</w:t>
+      </w:r>
+    </w:p>
+    <w:p/>
+    <w:p>
+      <w:pPr>
+        <w:pStyle w:val="Heading2"/>
+      </w:pPr>
+      <w:r>
+        <w:rPr>
+          <w:rFonts w:ascii="Arial" w:cs="Arial" w:eastAsia="Arial" w:hAnsi="Arial"/>
+          <w:b/>
+          <w:bCs/>
+          <w:sz w:val="24"/>
+          <w:szCs w:val="24"/>
+        </w:rPr>
+        <w:t xml:space="preserve">5.2 Gestión de requerimientos y priorización institucional</w:t>
+      </w:r>
+    </w:p>
+    <w:p>
+      <w:r>
+        <w:t xml:space="preserve">Una de las funciones asignadas al Departamento consiste en relevar, analizar y transformar las necesidades de las distintas dependencias municipales en soluciones informáticas que aporten valor a la gestión. Para cumplir adecuadamente esta función resulta imprescindible establecer un procedimiento uniforme para la recepción, análisis y priorización de requerimientos.</w:t>
+      </w:r>
+    </w:p>
+    <w:p>
+      <w:r>
+        <w:t xml:space="preserve">Actualmente las solicitudes pueden originarse por diferentes canales y con distintos niveles de definición, lo que dificulta evaluar su alcance, estimar el esfuerzo requerido y establecer prioridades objetivas.</w:t>
+      </w:r>
+    </w:p>
+    <w:p>
+      <w:r>
+        <w:t xml:space="preserve">Se propone institucionalizar un procedimiento de gestión de requerimientos que permita registrar cada solicitud desde su ingreso, analizar su viabilidad técnica y funcional, determinar el impacto esperado y definir conjuntamente con el área solicitante su prioridad de implementación.</w:t>
+      </w:r>
+    </w:p>
+    <w:p>
+      <w:r>
+        <w:t xml:space="preserve">La Jefatura tendrá un rol central en este proceso, actuando como articulador entre las necesidades de las áreas usuarias y la capacidad operativa del Departamento. Su función no consistirá únicamente en asignar tareas, sino también en garantizar que los recursos disponibles se orienten hacia aquellas iniciativas que generen mayor beneficio institucional.</w:t>
+      </w:r>
+    </w:p>
+    <w:p>
+      <w:r>
+        <w:t xml:space="preserve">Durante el análisis de cada requerimiento se verificará, además, la existencia de soluciones similares dentro del ecosistema de aplicaciones municipales, promoviendo la reutilización de componentes y evitando el desarrollo de funcionalidades duplicadas.</w:t>
+      </w:r>
+    </w:p>
+    <w:p>
+      <w:r>
+        <w:t xml:space="preserve">La incorporación de este procedimiento permitirá mejorar la calidad del relevamiento funcional, optimizar la planificación de los proyectos y fortalecer la relación entre el Departamento y las distintas áreas municipales.</w:t>
+      </w:r>
+    </w:p>
+    <w:p/>
+    <w:p>
+      <w:pPr>
+        <w:pStyle w:val="Heading2"/>
+      </w:pPr>
+      <w:r>
+        <w:rPr>
+          <w:rFonts w:ascii="Arial" w:cs="Arial" w:eastAsia="Arial" w:hAnsi="Arial"/>
+          <w:b/>
+          <w:bCs/>
+          <w:sz w:val="24"/>
+          <w:szCs w:val="24"/>
+        </w:rPr>
+        <w:t xml:space="preserve">5.3 Coordinación entre equipos y fortalecimiento de la comunicación interna</w:t>
+      </w:r>
+    </w:p>
+    <w:p>
+      <w:r>
+        <w:t xml:space="preserve">El Departamento desarrolla sus actividades a través de equipos distribuidos físicamente en distintas dependencias. Si bien esta organización responde a necesidades operativas, también genera dificultades para mantener una comunicación fluida entre los agentes, compartir información sobre los proyectos en curso y coordinar acciones entre los distintos grupos de trabajo.</w:t>
+      </w:r>
+    </w:p>
+    <w:p>
+      <w:r>
+        <w:t xml:space="preserve">La falta de mecanismos formales de comunicación favorece la aparición de "silos de información", donde el conocimiento sobre determinados sistemas o desarrollos permanece dentro de un grupo reducido de personas. Esta situación dificulta la colaboración entre equipos, incrementa el riesgo de duplicar esfuerzos y limita la capacidad del Departamento para responder de manera coordinada ante nuevas demandas.</w:t>
+      </w:r>
+    </w:p>
+    <w:p>
+      <w:r>
+        <w:t xml:space="preserve">Con el objetivo de fortalecer el trabajo colaborativo, se propone institucionalizar un esquema permanente de coordinación entre las distintas dependencias del Departamento. La Jefatura será responsable de promover espacios periódicos de intercambio que permitan conocer el estado de los proyectos, identificar dificultades comunes, compartir experiencias y detectar oportunidades de colaboración entre los equipos.</w:t>
+      </w:r>
+    </w:p>
+    <w:p>
+      <w:r>
+        <w:t xml:space="preserve">Estas reuniones deberán ser breves, con una agenda previamente definida y orientadas exclusivamente a la coordinación operativa, evitando generar instancias burocráticas que resten tiempo al desarrollo de las actividades técnicas.</w:t>
+      </w:r>
+    </w:p>
+    <w:p>
+      <w:r>
+        <w:t xml:space="preserve">Como complemento, toda la información vinculada a los proyectos deberá mantenerse actualizada en las herramientas institucionales de seguimiento, permitiendo que cualquier integrante del Departamento pueda conocer el estado general de las iniciativas, los responsables asignados y las tareas pendientes.</w:t>
+      </w:r>
+    </w:p>
+    <w:p>
+      <w:r>
+        <w:t xml:space="preserve">La mejora de la comunicación interna permitirá optimizar la utilización de los recursos disponibles, reducir la duplicación de desarrollos y fortalecer el sentido de pertenencia del equipo, promoviendo una visión compartida de los objetivos institucionales.</w:t>
+      </w:r>
+    </w:p>
+    <w:p/>
+    <w:p>
+      <w:pPr>
+        <w:pStyle w:val="Heading2"/>
+      </w:pPr>
+      <w:r>
+        <w:rPr>
+          <w:rFonts w:ascii="Arial" w:cs="Arial" w:eastAsia="Arial" w:hAnsi="Arial"/>
+          <w:b/>
+          <w:bCs/>
+          <w:sz w:val="24"/>
+          <w:szCs w:val="24"/>
+        </w:rPr>
+        <w:t xml:space="preserve">5.4 Gestión del conocimiento y continuidad operativa</w:t>
+      </w:r>
+    </w:p>
+    <w:p>
+      <w:r>
+        <w:t xml:space="preserve">Uno de los principales riesgos identificados durante el diagnóstico es la concentración del conocimiento técnico y funcional en un número reducido de agentes. La existencia de sistemas cuya operación depende exclusivamente de una persona incrementa significativamente la vulnerabilidad del Departamento frente a licencias prolongadas, cambios de funciones, jubilaciones o cualquier circunstancia que impida la disponibilidad del referente principal.</w:t>
+      </w:r>
+    </w:p>
+    <w:p>
+      <w:r>
+        <w:t xml:space="preserve">La continuidad de los servicios informáticos constituye una responsabilidad institucional que no puede depender del conocimiento individual de un único agente. Por este motivo, resulta necesario implementar mecanismos que permitan distribuir progresivamente el conocimiento entre los integrantes del equipo y reducir los puntos únicos de falla.</w:t>
+      </w:r>
+    </w:p>
+    <w:p>
+      <w:r>
+        <w:t xml:space="preserve">Se propone incorporar la figura del Referente Secundario, entendida como un mecanismo de transferencia de conocimiento y no como una modificación de la estructura jerárquica del Departamento. Cada sistema considerado crítico contará con un agente que acompañará al responsable principal en las tareas de análisis, mantenimiento y evolución del aplicativo. Este acompañamiento tendrá como finalidad adquirir conocimiento funcional y técnico suficiente para intervenir ante situaciones de contingencia y colaborar en futuras tareas de desarrollo.</w:t>
+      </w:r>
+    </w:p>
+    <w:p>
+      <w:r>
+        <w:t xml:space="preserve">La implementación se realizará de manera gradual, priorizando aquellos sistemas cuyo impacto institucional sea mayor y procurando equilibrar la carga de trabajo entre los distintos integrantes del Departamento. El proceso comprenderá actividades de observación, participación progresiva en tareas de mantenimiento, revisión conjunta de desarrollos, elaboración de documentación complementaria y reuniones periódicas de transferencia de conocimiento.</w:t>
+      </w:r>
+    </w:p>
+    <w:p>
+      <w:r>
+        <w:t xml:space="preserve">La Jefatura deberá supervisar este proceso, definiendo las prioridades, asignando los referentes correspondientes y evaluando periódicamente el grado de cobertura alcanzado sobre los distintos sistemas municipales.</w:t>
+      </w:r>
+    </w:p>
+    <w:p>
+      <w:r>
+        <w:t xml:space="preserve">La implementación de esta medida permitirá disminuir el riesgo operativo asociado a la dependencia de personas específicas, mejorar la capacidad de respuesta frente a contingencias y favorecer el crecimiento profesional de los integrantes del Departamento mediante una capacitación continua basada en la experiencia práctica. Asimismo, la existencia de referentes secundarios facilitará la redistribución de tareas cuando las necesidades operativas lo requieran, otorgando mayor flexibilidad a la planificación y fortaleciendo la resiliencia organizacional del área.</w:t>
+      </w:r>
+    </w:p>
+    <w:p/>
+    <w:p>
+      <w:pPr>
+        <w:pStyle w:val="Heading2"/>
+      </w:pPr>
+      <w:r>
+        <w:rPr>
+          <w:rFonts w:ascii="Arial" w:cs="Arial" w:eastAsia="Arial" w:hAnsi="Arial"/>
+          <w:b/>
+          <w:bCs/>
+          <w:sz w:val="24"/>
+          <w:szCs w:val="24"/>
+        </w:rPr>
+        <w:t xml:space="preserve">5.5 Estandarización del desarrollo y consolidación de una Arquitectura Base Institucional</w:t>
+      </w:r>
+    </w:p>
+    <w:p>
+      <w:r>
+        <w:t xml:space="preserve">La coexistencia de aplicaciones desarrolladas en distintos momentos, utilizando tecnologías, criterios de diseño y convenciones de programación diferentes, constituye una de las principales causas del incremento de la complejidad técnica del ecosistema de sistemas municipales. La ausencia de estándares comunes dificulta la incorporación de nuevos desarrolladores a los proyectos existentes, incrementa los tiempos de mantenimiento y provoca diferencias significativas en la calidad y estructura del software desarrollado.</w:t>
+      </w:r>
+    </w:p>
+    <w:p>
+      <w:r>
+        <w:t xml:space="preserve">Con el propósito de revertir esta situación, se propone consolidar una Arquitectura Base Institucional que establezca criterios comunes para todos los nuevos desarrollos y para aquellas refactorizaciones que, por su alcance, justifiquen su adopción. La Arquitectura Base deberá contemplar aspectos vinculados con la organización de las soluciones, separación de responsabilidades, acceso a datos, seguridad, manejo de errores, autenticación, registro de eventos, configuración y demás componentes transversales utilizados por las aplicaciones municipales. Su utilización permitirá reducir tiempos de desarrollo, favorecer la reutilización de componentes y asegurar que todos los proyectos compartan una estructura homogénea que facilite su mantenimiento futuro.</w:t>
+      </w:r>
+    </w:p>
+    <w:p>
+      <w:r>
+        <w:t xml:space="preserve">La responsabilidad de la Jefatura consistirá en impulsar su utilización, promover su actualización permanente y evaluar las excepciones que pudieran justificarse por razones técnicas debidamente fundamentadas. La adopción de estándares comunes no deberá interpretarse como una limitación a la innovación tecnológica, sino como un mecanismo para garantizar que la evolución del software municipal se produzca de manera ordenada, sostenible y compatible con la estrategia tecnológica del Municipio.</w:t>
+      </w:r>
+    </w:p>
+    <w:p>
+      <w:r>
+        <w:t xml:space="preserve">Además de la arquitectura, se elaborarán guías institucionales de buenas prácticas de programación que establezcan criterios mínimos para la escritura de código, nomenclatura, documentación, control de versiones, manejo de excepciones, pruebas y revisión técnica. La existencia de estas pautas permitirá disminuir diferencias entre proyectos, facilitar la rotación de desarrolladores y mejorar la calidad general de las aplicaciones desarrolladas por el Departamento.</w:t>
+      </w:r>
+    </w:p>
+    <w:p/>
+    <w:p>
+      <w:pPr>
+        <w:pStyle w:val="Heading2"/>
+      </w:pPr>
+      <w:r>
+        <w:rPr>
+          <w:rFonts w:ascii="Arial" w:cs="Arial" w:eastAsia="Arial" w:hAnsi="Arial"/>
+          <w:b/>
+          <w:bCs/>
+          <w:sz w:val="24"/>
+          <w:szCs w:val="24"/>
+        </w:rPr>
+        <w:t xml:space="preserve">5.6 Gestión de la calidad del software y fortalecimiento de la documentación institucional</w:t>
+      </w:r>
+    </w:p>
+    <w:p>
+      <w:r>
+        <w:t xml:space="preserve">La calidad del software desarrollado por el Departamento no depende únicamente de la capacidad técnica de los desarrolladores, sino también de la existencia de procedimientos que permitan asegurar resultados consistentes, facilitar el mantenimiento futuro y preservar el conocimiento institucional. Actualmente la documentación técnica de los sistemas presenta distintos niveles de desarrollo, dependiendo del proyecto y de las prácticas adoptadas por cada equipo de trabajo. Esta situación incrementa los tiempos necesarios para realizar modificaciones, dificulta la incorporación de nuevos agentes a los proyectos y aumenta la dependencia del conocimiento individual.</w:t>
+      </w:r>
+    </w:p>
+    <w:p>
+      <w:r>
+        <w:t xml:space="preserve">Con el propósito de fortalecer la calidad de los desarrollos y garantizar la continuidad operativa, se propone establecer una política institucional de documentación mínima obligatoria para todos los sistemas desarrollados o modificados por el Departamento. Esta documentación no deberá transformarse en un requisito burocrático, sino en una herramienta de gestión que permita comprender rápidamente el funcionamiento general de cada aplicación y facilite su evolución a lo largo del tiempo.</w:t>
+      </w:r>
+    </w:p>
+    <w:p>
+      <w:r>
+        <w:t xml:space="preserve">Como criterio mínimo, cada sistema deberá contar con información relativa a:</w:t>
+      </w:r>
+    </w:p>
+    <w:p>
+      <w:pPr>
+        <w:pStyle w:val="ListParagraph"/>
+        <w:numPr>
+          <w:ilvl w:val="0"/>
+          <w:numId w:val="1"/>
+        </w:numPr>
+      </w:pPr>
+      <w:r>
+        <w:t xml:space="preserve">objetivo funcional del sistema;</w:t>
+      </w:r>
+    </w:p>
+    <w:p>
+      <w:pPr>
+        <w:pStyle w:val="ListParagraph"/>
+        <w:numPr>
+          <w:ilvl w:val="0"/>
+          <w:numId w:val="1"/>
+        </w:numPr>
+      </w:pPr>
+      <w:r>
+        <w:t xml:space="preserve">área responsable;</w:t>
+      </w:r>
+    </w:p>
+    <w:p>
+      <w:pPr>
+        <w:pStyle w:val="ListParagraph"/>
+        <w:numPr>
+          <w:ilvl w:val="0"/>
+          <w:numId w:val="1"/>
+        </w:numPr>
+      </w:pPr>
+      <w:r>
+        <w:t xml:space="preserve">responsables técnicos;</w:t>
+      </w:r>
+    </w:p>
+    <w:p>
+      <w:pPr>
+        <w:pStyle w:val="ListParagraph"/>
+        <w:numPr>
+          <w:ilvl w:val="0"/>
+          <w:numId w:val="1"/>
+        </w:numPr>
+      </w:pPr>
+      <w:r>
+        <w:t xml:space="preserve">arquitectura general de la solución;</w:t>
+      </w:r>
+    </w:p>
+    <w:p>
+      <w:pPr>
+        <w:pStyle w:val="ListParagraph"/>
+        <w:numPr>
+          <w:ilvl w:val="0"/>
+          <w:numId w:val="1"/>
+        </w:numPr>
+      </w:pPr>
+      <w:r>
+        <w:t xml:space="preserve">modelo de datos utilizado;</w:t>
+      </w:r>
+    </w:p>
+    <w:p>
+      <w:pPr>
+        <w:pStyle w:val="ListParagraph"/>
+        <w:numPr>
+          <w:ilvl w:val="0"/>
+          <w:numId w:val="1"/>
+        </w:numPr>
+      </w:pPr>
+      <w:r>
+        <w:t xml:space="preserve">dependencias con otros sistemas;</w:t>
+      </w:r>
+    </w:p>
+    <w:p>
+      <w:pPr>
+        <w:pStyle w:val="ListParagraph"/>
+        <w:numPr>
+          <w:ilvl w:val="0"/>
+          <w:numId w:val="1"/>
+        </w:numPr>
+      </w:pPr>
+      <w:r>
+        <w:t xml:space="preserve">procedimientos de instalación y despliegue;</w:t>
+      </w:r>
+    </w:p>
+    <w:p>
+      <w:pPr>
+        <w:pStyle w:val="ListParagraph"/>
+        <w:numPr>
+          <w:ilvl w:val="0"/>
+          <w:numId w:val="1"/>
+        </w:numPr>
+      </w:pPr>
+      <w:r>
+        <w:t xml:space="preserve">mecanismos de autenticación y autorizaciones;</w:t>
+      </w:r>
+    </w:p>
+    <w:p>
+      <w:pPr>
+        <w:pStyle w:val="ListParagraph"/>
+        <w:numPr>
+          <w:ilvl w:val="0"/>
+          <w:numId w:val="1"/>
+        </w:numPr>
+      </w:pPr>
+      <w:r>
+        <w:t xml:space="preserve">interfaces de integración;</w:t>
+      </w:r>
+    </w:p>
+    <w:p>
+      <w:pPr>
+        <w:pStyle w:val="ListParagraph"/>
+        <w:numPr>
+          <w:ilvl w:val="0"/>
+          <w:numId w:val="1"/>
+        </w:numPr>
+      </w:pPr>
+      <w:r>
+        <w:t xml:space="preserve">historial de cambios relevantes.</w:t>
+      </w:r>
+    </w:p>
+    <w:p>
+      <w:r>
+        <w:t xml:space="preserve">La Jefatura deberá promover el cumplimiento de estos criterios como parte natural del proceso de desarrollo, incorporando la documentación dentro de las tareas habituales de cada proyecto y verificando periódicamente su actualización.</w:t>
+      </w:r>
+    </w:p>
+    <w:p>
+      <w:r>
+        <w:t xml:space="preserve">Del mismo modo, se establecerán procedimientos básicos de revisión técnica antes de la puesta en producción de modificaciones relevantes, procurando verificar el cumplimiento de los estándares definidos por el Departamento, la consistencia de las implementaciones y la correcta integración con los sistemas existentes.</w:t>
+      </w:r>
+    </w:p>
+    <w:p>
+      <w:r>
+        <w:t xml:space="preserve">Estas acciones permitirán mejorar la calidad del software desarrollado, facilitar el mantenimiento evolutivo y preservar el conocimiento técnico generado por el Departamento, reduciendo los riesgos asociados a la rotación del personal y a la evolución tecnológica de los sistemas.</w:t>
+      </w:r>
+    </w:p>
+    <w:p/>
+    <w:p>
+      <w:pPr>
+        <w:pStyle w:val="Heading2"/>
+      </w:pPr>
+      <w:r>
+        <w:rPr>
+          <w:rFonts w:ascii="Arial" w:cs="Arial" w:eastAsia="Arial" w:hAnsi="Arial"/>
+          <w:b/>
+          <w:bCs/>
+          <w:sz w:val="24"/>
+          <w:szCs w:val="24"/>
+        </w:rPr>
+        <w:t xml:space="preserve">5.7 Gobierno técnico de proveedores externos</w:t>
+      </w:r>
+    </w:p>
+    <w:p>
+      <w:r>
+        <w:t xml:space="preserve">Las funciones asignadas al Departamento comprenden no sólo el desarrollo interno de sistemas informáticos, sino también la participación activa en aquellos proyectos ejecutados por proveedores externos contratados por la Municipalidad. En estos casos, la responsabilidad del Departamento trasciende el seguimiento administrativo de los contratos, comprendiendo la verificación técnica de las soluciones desarrolladas y la protección del patrimonio tecnológico institucional.</w:t>
+      </w:r>
+    </w:p>
+    <w:p>
+      <w:r>
+        <w:t xml:space="preserve">La contratación de un proveedor externo no implica delegar la responsabilidad sobre la calidad técnica del software incorporado al ecosistema municipal. Por el contrario, corresponde al Departamento ejercer un rol de conducción técnica que asegure que las soluciones adquiridas respondan a los estándares definidos por la organización y puedan mantenerse adecuadamente durante todo su ciclo de vida.</w:t>
+      </w:r>
+    </w:p>
+    <w:p>
+      <w:r>
+        <w:t xml:space="preserve">En este marco, se propone institucionalizar un procedimiento de Gobierno Técnico de Proveedores que abarque todas las etapas del proceso de contratación e implementación. Durante la elaboración de especificaciones técnicas y pliegos de contratación, el Departamento participará en la definición de los requerimientos funcionales, técnicos y contractuales necesarios para garantizar que los productos adquiridos resulten compatibles con la arquitectura tecnológica municipal.</w:t>
+      </w:r>
+    </w:p>
+    <w:p>
+      <w:r>
+        <w:t xml:space="preserve">Durante la etapa de desarrollo se promoverán instancias periódicas de seguimiento técnico que permitan verificar el avance de los trabajos, detectar tempranamente desvíos respecto de las especificaciones acordadas y asegurar el cumplimiento de los estándares definidos por el Departamento.</w:t>
+      </w:r>
+    </w:p>
+    <w:p>
+      <w:r>
+        <w:t xml:space="preserve">Finalmente, previo a la recepción definitiva de cualquier sistema desarrollado por terceros, deberá verificarse el cumplimiento de un conjunto mínimo de condiciones técnicas, entre ellas:</w:t>
+      </w:r>
+    </w:p>
+    <w:p>
+      <w:pPr>
+        <w:pStyle w:val="ListParagraph"/>
+        <w:numPr>
+          <w:ilvl w:val="0"/>
+          <w:numId w:val="1"/>
+        </w:numPr>
+      </w:pPr>
+      <w:r>
+        <w:t xml:space="preserve">entrega completa del código fuente;</w:t>
+      </w:r>
+    </w:p>
+    <w:p>
+      <w:pPr>
+        <w:pStyle w:val="ListParagraph"/>
+        <w:numPr>
+          <w:ilvl w:val="0"/>
+          <w:numId w:val="1"/>
+        </w:numPr>
+      </w:pPr>
+      <w:r>
+        <w:t xml:space="preserve">documentación técnica actualizada;</w:t>
+      </w:r>
+    </w:p>
+    <w:p>
+      <w:pPr>
+        <w:pStyle w:val="ListParagraph"/>
+        <w:numPr>
+          <w:ilvl w:val="0"/>
+          <w:numId w:val="1"/>
+        </w:numPr>
+      </w:pPr>
+      <w:r>
+        <w:t xml:space="preserve">modelos de datos;</w:t>
+      </w:r>
+    </w:p>
+    <w:p>
+      <w:pPr>
+        <w:pStyle w:val="ListParagraph"/>
+        <w:numPr>
+          <w:ilvl w:val="0"/>
+          <w:numId w:val="1"/>
+        </w:numPr>
+      </w:pPr>
+      <w:r>
+        <w:t xml:space="preserve">manuales de instalación y administración;</w:t>
+      </w:r>
+    </w:p>
+    <w:p>
+      <w:pPr>
+        <w:pStyle w:val="ListParagraph"/>
+        <w:numPr>
+          <w:ilvl w:val="0"/>
+          <w:numId w:val="1"/>
+        </w:numPr>
+      </w:pPr>
+      <w:r>
+        <w:t xml:space="preserve">manuales de usuario cuando correspondan;</w:t>
+      </w:r>
+    </w:p>
+    <w:p>
+      <w:pPr>
+        <w:pStyle w:val="ListParagraph"/>
+        <w:numPr>
+          <w:ilvl w:val="0"/>
+          <w:numId w:val="1"/>
+        </w:numPr>
+      </w:pPr>
+      <w:r>
+        <w:t xml:space="preserve">procedimientos de despliegue;</w:t>
+      </w:r>
+    </w:p>
+    <w:p>
+      <w:pPr>
+        <w:pStyle w:val="ListParagraph"/>
+        <w:numPr>
+          <w:ilvl w:val="0"/>
+          <w:numId w:val="1"/>
+        </w:numPr>
+      </w:pPr>
+      <w:r>
+        <w:t xml:space="preserve">evidencias de pruebas realizadas;</w:t>
+      </w:r>
+    </w:p>
+    <w:p>
+      <w:pPr>
+        <w:pStyle w:val="ListParagraph"/>
+        <w:numPr>
+          <w:ilvl w:val="0"/>
+          <w:numId w:val="1"/>
+        </w:numPr>
+      </w:pPr>
+      <w:r>
+        <w:t xml:space="preserve">cumplimiento de estándares de seguridad e integración.</w:t>
+      </w:r>
+    </w:p>
+    <w:p>
+      <w:r>
+        <w:t xml:space="preserve">La recepción técnica favorable constituirá un requisito previo para la aceptación definitiva de los desarrollos contratados. Asimismo, cuando los contratos contemplen servicios de mantenimiento, la Jefatura coordinará la relación técnica entre las áreas usuarias y los proveedores, supervisando el cumplimiento de los niveles de servicio acordados, administrando la gestión de incidencias y verificando la calidad de las soluciones implementadas.</w:t>
+      </w:r>
+    </w:p>
+    <w:p>
+      <w:r>
+        <w:t xml:space="preserve">La aplicación de este procedimiento permitirá fortalecer el control institucional sobre las soluciones desarrolladas por terceros, garantizar la disponibilidad futura del conocimiento técnico y preservar la capacidad del Municipio para evolucionar sus sistemas independientemente del proveedor que haya intervenido en su desarrollo.</w:t>
+      </w:r>
+    </w:p>
+    <w:p/>
+    <w:p>
+      <w:pPr>
+        <w:pStyle w:val="Heading2"/>
+      </w:pPr>
+      <w:r>
+        <w:rPr>
+          <w:rFonts w:ascii="Arial" w:cs="Arial" w:eastAsia="Arial" w:hAnsi="Arial"/>
+          <w:b/>
+          <w:bCs/>
+          <w:sz w:val="24"/>
+          <w:szCs w:val="24"/>
+        </w:rPr>
+        <w:t xml:space="preserve">5.8 Innovación tecnológica y utilización responsable de Inteligencia Artificial</w:t>
+      </w:r>
+    </w:p>
+    <w:p>
+      <w:r>
+        <w:t xml:space="preserve">La innovación constituye una función permanente del Departamento y debe orientarse a mejorar la capacidad institucional para responder a las necesidades presentes y futuras de la Administración Municipal. Sin embargo, la incorporación de nuevas tecnologías debe realizarse mediante un proceso de evaluación técnica que considere no sólo las ventajas potenciales de cada herramienta, sino también su impacto sobre la organización, la disponibilidad de recursos para su mantenimiento y su compatibilidad con la estrategia tecnológica del Municipio.</w:t>
+      </w:r>
+    </w:p>
+    <w:p>
+      <w:r>
+        <w:t xml:space="preserve">En consecuencia, la innovación no deberá entenderse como la adopción permanente de nuevas plataformas o lenguajes de programación, sino como la capacidad del Departamento para identificar oportunidades de mejora que generen beneficios concretos para la gestión pública.</w:t>
+      </w:r>
+    </w:p>
+    <w:p>
+      <w:r>
+        <w:t xml:space="preserve">Dentro de este contexto, las herramientas basadas en Inteligencia Artificial representan una oportunidad significativa para incrementar la productividad de los equipos de desarrollo, reducir tiempos dedicados a tareas repetitivas y facilitar actividades de documentación, análisis y asistencia en programación. Su incorporación deberá realizarse de manera gradual y bajo criterios institucionales claramente definidos.</w:t>
+      </w:r>
+    </w:p>
+    <w:p>
+      <w:r>
+        <w:t xml:space="preserve">En una primera etapa se promoverá la capacitación del personal en el uso responsable de estas herramientas, estableciendo lineamientos que garanticen la protección de la información municipal y eviten la exposición de datos sensibles o credenciales institucionales en servicios externos. Asimismo, se promoverá que toda información generada mediante herramientas de Inteligencia Artificial sea revisada y validada por los profesionales responsables antes de su incorporación a los sistemas municipales, manteniendo siempre el criterio técnico y la responsabilidad profesional como elementos centrales del proceso de desarrollo.</w:t>
+      </w:r>
+    </w:p>
+    <w:p>
+      <w:r>
+        <w:t xml:space="preserve">La experiencia obtenida permitirá evaluar, en una etapa posterior, la conveniencia de incorporar soluciones corporativas administradas por el Municipio que ofrezcan mayores garantías de seguridad, privacidad y administración centralizada.</w:t>
+      </w:r>
+    </w:p>
+    <w:p>
+      <w:r>
+        <w:t xml:space="preserve">Paralelamente, la Jefatura impulsará una evaluación continua de nuevas tecnologías, metodologías y herramientas de desarrollo, promoviendo su adopción únicamente cuando se encuentren debidamente justificadas desde el punto de vista técnico, organizacional y económico. De esta manera, la innovación dejará de depender de iniciativas individuales para convertirse en una política institucional planificada, alineada con las necesidades estratégicas de la Municipalidad y orientada a fortalecer la capacidad del Departamento para brindar soluciones tecnológicas de calidad.</w:t>
+      </w:r>
+    </w:p>
+    <w:p/>
+    <w:p>
+      <w:pPr>
+        <w:pStyle w:val="Heading1"/>
+      </w:pPr>
+      <w:r>
+        <w:rPr>
+          <w:rFonts w:ascii="Arial" w:cs="Arial" w:eastAsia="Arial" w:hAnsi="Arial"/>
+          <w:b/>
+          <w:bCs/>
+          <w:sz w:val="28"/>
+          <w:szCs w:val="28"/>
+        </w:rPr>
+        <w:t xml:space="preserve">6. EJES ESTRATÉGICOS DE LA GESTIÓN</w:t>
+      </w:r>
+    </w:p>
+    <w:p>
+      <w:pPr>
+        <w:pStyle w:val="Heading2"/>
+      </w:pPr>
+      <w:r>
+        <w:rPr>
+          <w:rFonts w:ascii="Arial" w:cs="Arial" w:eastAsia="Arial" w:hAnsi="Arial"/>
+          <w:b/>
+          <w:bCs/>
+          <w:sz w:val="24"/>
+          <w:szCs w:val="24"/>
+        </w:rPr>
+        <w:t xml:space="preserve">EJE I: Gestión del Capital Humano y Desarrollo del Equipo</w:t>
+      </w:r>
+    </w:p>
+    <w:p>
+      <w:r>
+        <w:t xml:space="preserve">Las personas constituyen el principal activo del Departamento. La función de la Jefatura será generar un entorno de trabajo que favorezca la colaboración y el crecimiento profesional.</w:t>
+      </w:r>
+    </w:p>
+    <w:p>
+      <w:pPr>
+        <w:pStyle w:val="ListParagraph"/>
+        <w:numPr>
+          <w:ilvl w:val="0"/>
+          <w:numId w:val="1"/>
+        </w:numPr>
+      </w:pPr>
+      <w:r>
+        <w:rPr>
+          <w:b/>
+          <w:bCs/>
+        </w:rPr>
+        <w:t xml:space="preserve">6.1 Comunicación y coordinación permanente: </w:t>
+      </w:r>
+      <w:r>
+        <w:t xml:space="preserve">Reuniones breves de coordinación transversal entre ambas sedes físicas y uso de herramientas comunes para mantener la visibilidad del trabajo.</w:t>
+      </w:r>
+    </w:p>
+    <w:p>
+      <w:pPr>
+        <w:pStyle w:val="ListParagraph"/>
+        <w:numPr>
+          <w:ilvl w:val="0"/>
+          <w:numId w:val="1"/>
+        </w:numPr>
+      </w:pPr>
+      <w:r>
+        <w:rPr>
+          <w:b/>
+          <w:bCs/>
+        </w:rPr>
+        <w:t xml:space="preserve">6.2 Desarrollo de competencias y Matriz de Competencias: </w:t>
+      </w:r>
+      <w:r>
+        <w:t xml:space="preserve">Relevamiento integral del personal para construir una Matriz de Competencias que distinga entre capacidad técnica y conocimiento funcional del trámite municipal, planificando capacitaciones en servicio.</w:t>
+      </w:r>
+    </w:p>
+    <w:p>
+      <w:pPr>
+        <w:pStyle w:val="ListParagraph"/>
+        <w:numPr>
+          <w:ilvl w:val="0"/>
+          <w:numId w:val="1"/>
+        </w:numPr>
+      </w:pPr>
+      <w:r>
+        <w:rPr>
+          <w:b/>
+          <w:bCs/>
+        </w:rPr>
+        <w:t xml:space="preserve">6.3 Transferencia del conocimiento (Referentes Secundarios): </w:t>
+      </w:r>
+      <w:r>
+        <w:t xml:space="preserve">Designación de un Referente Secundario en sistemas críticos que acompañe al responsable principal (shadowing), garantizando continuidad operativa sin tocar el escalafón.</w:t>
+      </w:r>
+    </w:p>
+    <w:p>
+      <w:pPr>
+        <w:pStyle w:val="ListParagraph"/>
+        <w:numPr>
+          <w:ilvl w:val="0"/>
+          <w:numId w:val="1"/>
+        </w:numPr>
+      </w:pPr>
+      <w:r>
+        <w:rPr>
+          <w:b/>
+          <w:bCs/>
+        </w:rPr>
+        <w:t xml:space="preserve">6.4 Cultura de trabajo colaborativo: </w:t>
+      </w:r>
+      <w:r>
+        <w:t xml:space="preserve">Espacios de participación para que los desarrolladores propongan mejoras operativas y técnicas.</w:t>
+      </w:r>
+    </w:p>
+    <w:p/>
+    <w:p>
+      <w:pPr>
+        <w:pStyle w:val="Heading2"/>
+      </w:pPr>
+      <w:r>
+        <w:rPr>
+          <w:rFonts w:ascii="Arial" w:cs="Arial" w:eastAsia="Arial" w:hAnsi="Arial"/>
+          <w:b/>
+          <w:bCs/>
+          <w:sz w:val="24"/>
+          <w:szCs w:val="24"/>
+        </w:rPr>
+        <w:t xml:space="preserve">EJE II: Gestión del Conocimiento y Organización del Trabajo</w:t>
+      </w:r>
+    </w:p>
+    <w:p>
+      <w:pPr>
+        <w:pStyle w:val="ListParagraph"/>
+        <w:numPr>
+          <w:ilvl w:val="0"/>
+          <w:numId w:val="1"/>
+        </w:numPr>
+      </w:pPr>
+      <w:r>
+        <w:rPr>
+          <w:b/>
+          <w:bCs/>
+        </w:rPr>
+        <w:t xml:space="preserve">6.5 Documentación Mínima y Útil: </w:t>
+      </w:r>
+      <w:r>
+        <w:t xml:space="preserve">Definición de un estándar de documentación funcional, técnica y de despliegue proporcional a la criticidad del sistema, integrado al proceso normal de entrega (Definition of Done).</w:t>
+      </w:r>
+    </w:p>
+    <w:p>
+      <w:pPr>
+        <w:pStyle w:val="ListParagraph"/>
+        <w:numPr>
+          <w:ilvl w:val="0"/>
+          <w:numId w:val="1"/>
+        </w:numPr>
+      </w:pPr>
+      <w:r>
+        <w:rPr>
+          <w:b/>
+          <w:bCs/>
+        </w:rPr>
+        <w:t xml:space="preserve">6.6 Arquitectura Base Institucional: </w:t>
+      </w:r>
+      <w:r>
+        <w:t xml:space="preserve">Institucionalización obligatoria de un template de arquitectura en capas (APIs, acceso a datos, manejo de errores, seguridad) para todos los desarrollos nuevos.</w:t>
+      </w:r>
+    </w:p>
+    <w:p>
+      <w:pPr>
+        <w:pStyle w:val="ListParagraph"/>
+        <w:numPr>
+          <w:ilvl w:val="0"/>
+          <w:numId w:val="1"/>
+        </w:numPr>
+      </w:pPr>
+      <w:r>
+        <w:rPr>
+          <w:b/>
+          <w:bCs/>
+        </w:rPr>
+        <w:t xml:space="preserve">6.7 Cartera Única de Proyectos en Redmine: </w:t>
+      </w:r>
+      <w:r>
+        <w:t xml:space="preserve">Registro centralizado de todas las solicitudes, desarrollos y mantenimientos para visibilizar la carga real de trabajo y priorizar estratégicamente.</w:t>
+      </w:r>
+    </w:p>
+    <w:p/>
+    <w:p>
+      <w:pPr>
+        <w:pStyle w:val="Heading2"/>
+      </w:pPr>
+      <w:r>
+        <w:rPr>
+          <w:rFonts w:ascii="Arial" w:cs="Arial" w:eastAsia="Arial" w:hAnsi="Arial"/>
+          <w:b/>
+          <w:bCs/>
+          <w:sz w:val="24"/>
+          <w:szCs w:val="24"/>
+        </w:rPr>
+        <w:t xml:space="preserve">EJE III: Gobierno Técnico y Calidad del Software</w:t>
       </w:r>
     </w:p>
     <w:p>
@@ -1054,9 +1849,86 @@
           <w:i/>
           <w:iCs/>
         </w:rPr>
-        <w:t xml:space="preserve">Esta sección constituye el núcleo central del Plan de Trabajo. Cada propuesta se presenta no como una mera enumeración de intenciones, sino como una verdadera política institucional de gestión que define el problema detectado, la propuesta concreta de solución, el rol de la Jefatura y el resultado esperado para el Municipio.</w:t>
-      </w:r>
-    </w:p>
+        <w:t xml:space="preserve">La responsabilidad de la Jefatura no consiste únicamente en coordinar personas, sino también en establecer el marco técnico que permita que los distintos equipos desarrollen soluciones homogéneas, seguras y sostenibles. El gobierno técnico constituye el conjunto de políticas, estándares y procedimientos que aseguran que las decisiones tecnológicas respondan a criterios institucionales y no exclusivamente a preferencias individuales.</w:t>
+      </w:r>
+    </w:p>
+    <w:p>
+      <w:pPr>
+        <w:pStyle w:val="ListParagraph"/>
+        <w:numPr>
+          <w:ilvl w:val="0"/>
+          <w:numId w:val="1"/>
+        </w:numPr>
+      </w:pPr>
+      <w:r>
+        <w:rPr>
+          <w:b/>
+          <w:bCs/>
+        </w:rPr>
+        <w:t xml:space="preserve">6.8 Estandarización del ciclo de desarrollo: </w:t>
+      </w:r>
+      <w:r>
+        <w:t xml:space="preserve">Definición clara de etapas: relevamiento, análisis, estimación, desarrollo, testing, implementación y mantenimiento.</w:t>
+      </w:r>
+    </w:p>
+    <w:p>
+      <w:pPr>
+        <w:pStyle w:val="ListParagraph"/>
+        <w:numPr>
+          <w:ilvl w:val="0"/>
+          <w:numId w:val="1"/>
+        </w:numPr>
+      </w:pPr>
+      <w:r>
+        <w:rPr>
+          <w:b/>
+          <w:bCs/>
+        </w:rPr>
+        <w:t xml:space="preserve">6.9 Estándares de codificación y buenas prácticas: </w:t>
+      </w:r>
+      <w:r>
+        <w:t xml:space="preserve">Guías institucionales de estilo de código, convenciones de nomenclatura y estructura de proyectos.</w:t>
+      </w:r>
+    </w:p>
+    <w:p>
+      <w:pPr>
+        <w:pStyle w:val="ListParagraph"/>
+        <w:numPr>
+          <w:ilvl w:val="0"/>
+          <w:numId w:val="1"/>
+        </w:numPr>
+      </w:pPr>
+      <w:r>
+        <w:rPr>
+          <w:b/>
+          <w:bCs/>
+        </w:rPr>
+        <w:t xml:space="preserve">6.10 Calidad incorporada y revisión entre pares: </w:t>
+      </w:r>
+      <w:r>
+        <w:t xml:space="preserve">Revisiones cruzadas (peer reviews) en GitLab para cambios críticos y validaciones funcionales antes de producción.</w:t>
+      </w:r>
+    </w:p>
+    <w:p>
+      <w:pPr>
+        <w:pStyle w:val="ListParagraph"/>
+        <w:numPr>
+          <w:ilvl w:val="0"/>
+          <w:numId w:val="1"/>
+        </w:numPr>
+      </w:pPr>
+      <w:r>
+        <w:rPr>
+          <w:b/>
+          <w:bCs/>
+        </w:rPr>
+        <w:t xml:space="preserve">6.11 Seguridad desde el análisis (Security by Design): </w:t>
+      </w:r>
+      <w:r>
+        <w:t xml:space="preserve">Protección de datos, autenticación, gestión de permisos y tratamiento seguro de credenciales.</w:t>
+      </w:r>
+    </w:p>
+    <w:p/>
     <w:p>
       <w:pPr>
         <w:pStyle w:val="Heading2"/>
@@ -1069,32 +1941,83 @@
           <w:sz w:val="24"/>
           <w:szCs w:val="24"/>
         </w:rPr>
-        <w:t xml:space="preserve">5.1 Comunicación y coordinación permanente entre dependencias</w:t>
-      </w:r>
-    </w:p>
-    <w:p>
-      <w:r>
-        <w:t xml:space="preserve">Uno de los principales problemas detectados es la escasa interacción entre los grupos de trabajo que desarrollan sus actividades en distintas dependencias físicas. Esta situación dificulta conocer los proyectos en ejecución, compartir experiencias, detectar oportunidades de reutilización y coordinar esfuerzos entre equipos.</w:t>
-      </w:r>
-    </w:p>
-    <w:p>
-      <w:r>
-        <w:t xml:space="preserve">La propuesta consiste en institucionalizar un esquema permanente de coordinación entre ambos grupos de trabajo. Para ello se establecerán reuniones breves de seguimiento donde participen representantes de los distintos proyectos con el objetivo de compartir avances, informar bloqueos, detectar necesidades de colaboración, comunicar cambios relevantes e identificar desarrollos similares que puedan reutilizar componentes existentes.</w:t>
-      </w:r>
-    </w:p>
-    <w:p>
-      <w:r>
-        <w:t xml:space="preserve">Estas reuniones no tendrán carácter burocrático ni buscarán controlar el trabajo diario de cada agente, sino facilitar la circulación de información y fortalecer la coordinación del Departamento. Como complemento se promoverá el uso uniforme de las herramientas institucionales de seguimiento (Redmine), permitiendo que la información de los proyectos permanezca accesible para todo el equipo.</w:t>
-      </w:r>
-    </w:p>
-    <w:p>
-      <w:r>
-        <w:t xml:space="preserve">La Jefatura actuará como facilitadora del proceso, asegurando la continuidad de las reuniones, removiendo los bloqueos detectados y promoviendo una cultura de responsabilidad compartida entre las distintas dependencias.</w:t>
-      </w:r>
-    </w:p>
-    <w:p>
-      <w:r>
-        <w:t xml:space="preserve">Con esta medida se espera disminuir el aislamiento operativo existente entre las dependencias, mejorar la coordinación interna y reducir significativamente la duplicación de esfuerzos dentro del Departamento.</w:t>
+        <w:t xml:space="preserve">EJE IV: Gestión de Proyectos, Articulación Institucional y Control de Proveedores</w:t>
+      </w:r>
+    </w:p>
+    <w:p>
+      <w:pPr>
+        <w:pStyle w:val="ListParagraph"/>
+        <w:numPr>
+          <w:ilvl w:val="0"/>
+          <w:numId w:val="1"/>
+        </w:numPr>
+      </w:pPr>
+      <w:r>
+        <w:rPr>
+          <w:b/>
+          <w:bCs/>
+        </w:rPr>
+        <w:t xml:space="preserve">6.12 Relevamiento integral y viabilidad: </w:t>
+      </w:r>
+      <w:r>
+        <w:t xml:space="preserve">Análisis de factibilidad técnica e impacto institucional antes de autorizar un desarrollo.</w:t>
+      </w:r>
+    </w:p>
+    <w:p>
+      <w:pPr>
+        <w:pStyle w:val="ListParagraph"/>
+        <w:numPr>
+          <w:ilvl w:val="0"/>
+          <w:numId w:val="1"/>
+        </w:numPr>
+      </w:pPr>
+      <w:r>
+        <w:rPr>
+          <w:b/>
+          <w:bCs/>
+        </w:rPr>
+        <w:t xml:space="preserve">6.13 Priorización objetiva de demandas: </w:t>
+      </w:r>
+      <w:r>
+        <w:t xml:space="preserve">Asignación de recursos basada en criticidad, urgencia, normativas y capacidad real.</w:t>
+      </w:r>
+    </w:p>
+    <w:p>
+      <w:pPr>
+        <w:pStyle w:val="ListParagraph"/>
+        <w:numPr>
+          <w:ilvl w:val="0"/>
+          <w:numId w:val="1"/>
+        </w:numPr>
+      </w:pPr>
+      <w:r>
+        <w:rPr>
+          <w:b/>
+          <w:bCs/>
+        </w:rPr>
+        <w:t xml:space="preserve">6.14 Gobierno técnico de proveedores externos: </w:t>
+      </w:r>
+      <w:r>
+        <w:t xml:space="preserve">Auditoría de entregables, exigencia de código fuente, documentación y pruebas de recepción validadas por el Municipio.</w:t>
+      </w:r>
+    </w:p>
+    <w:p>
+      <w:pPr>
+        <w:pStyle w:val="ListParagraph"/>
+        <w:numPr>
+          <w:ilvl w:val="0"/>
+          <w:numId w:val="1"/>
+        </w:numPr>
+      </w:pPr>
+      <w:r>
+        <w:rPr>
+          <w:b/>
+          <w:bCs/>
+        </w:rPr>
+        <w:t xml:space="preserve">6.15 Gestión de la relación con las áreas usuarias: </w:t>
+      </w:r>
+      <w:r>
+        <w:t xml:space="preserve">Fortalecimiento del rol de la Jefatura como nexo institucional con las Secretarías solicitantes mediante entrevistas funcionales, priorización conjunta, validaciones parciales y gestión compartida de expectativas.</w:t>
       </w:r>
     </w:p>
     <w:p/>
@@ -1110,35 +2033,91 @@
           <w:sz w:val="24"/>
           <w:szCs w:val="24"/>
         </w:rPr>
-        <w:t xml:space="preserve">5.2 Preservación del conocimiento e institucionalización de Referentes Secundarios (Shadowing)</w:t>
-      </w:r>
-    </w:p>
-    <w:p>
-      <w:r>
-        <w:t xml:space="preserve">La concentración del conocimiento técnico y funcional de sistemas críticos en agentes individuales genera un alto riesgo operacional para la Municipalidad. Ante licencias, traslados o imprevistos, la continuidad del servicio puede verse comprometida por la falta de personal capacitado para intervenir inmediatamente sobre dichos aplicativos.</w:t>
-      </w:r>
-    </w:p>
-    <w:p>
-      <w:r>
-        <w:t xml:space="preserve">Para mitigar este riesgo sin alterar las estructuras escalafonarias vigentes se propone instituir la figura del Referente Secundario (Shadowing). La medida consiste en asignar a un segundo agente para que acompañe al responsable principal de cada sistema crítico en tareas de mantenimiento, actualización y soporte.</w:t>
-      </w:r>
-    </w:p>
-    <w:p>
-      <w:r>
-        <w:t xml:space="preserve">El proceso comenzará con la identificación de los aplicativos de mayor criticidad institucional, la evaluación de las competencias técnicas requeridas y la asignación formal del referente secundario. El esquema contempla instancias periódicas de trabajo conjunto, participación en revisiones de código, acompañamiento en el despliegue de actualizaciones y documentación colaborativa de los procesos clave.</w:t>
-      </w:r>
-    </w:p>
-    <w:p>
-      <w:r>
-        <w:t xml:space="preserve">La Jefatura supervisará el cumplimiento del esquema de acompañamiento, asegurando que el referente secundario disponga de tiempo efectivo en su planificación para participar activamente del mantenimiento de los sistemas asignados.</w:t>
-      </w:r>
-    </w:p>
-    <w:p>
-      <w:r>
-        <w:t xml:space="preserve">La implementación de este esquema permitirá eliminar los puntos únicos de falla (Single Points of Failure), garantizar la continuidad operativa ante contingencias y favorecer la transferencia continua del conocimiento dentro de la organización.</w:t>
-      </w:r>
-    </w:p>
-    <w:p/>
+        <w:t xml:space="preserve">EJE V: Innovación Tecnológica Responsable e Inteligencia Artificial</w:t>
+      </w:r>
+    </w:p>
+    <w:p>
+      <w:pPr>
+        <w:pStyle w:val="ListParagraph"/>
+        <w:numPr>
+          <w:ilvl w:val="0"/>
+          <w:numId w:val="1"/>
+        </w:numPr>
+      </w:pPr>
+      <w:r>
+        <w:rPr>
+          <w:b/>
+          <w:bCs/>
+        </w:rPr>
+        <w:t xml:space="preserve">6.16 Pautas de seguridad para asistentes de IA: </w:t>
+      </w:r>
+      <w:r>
+        <w:t xml:space="preserve">Guía de uso responsable de herramientas asistidas por IA como apoyo a la programación y documentación, prohibiendo estrictamente la carga de credenciales, claves de bases de datos o datos personales de ciudadanos en plataformas públicas.</w:t>
+      </w:r>
+    </w:p>
+    <w:p>
+      <w:pPr>
+        <w:pStyle w:val="ListParagraph"/>
+        <w:numPr>
+          <w:ilvl w:val="0"/>
+          <w:numId w:val="1"/>
+        </w:numPr>
+      </w:pPr>
+      <w:r>
+        <w:rPr>
+          <w:b/>
+          <w:bCs/>
+        </w:rPr>
+        <w:t xml:space="preserve">6.17 Contenerización y modernización progresiva: </w:t>
+      </w:r>
+      <w:r>
+        <w:t xml:space="preserve">Introducción gradual de paquetes estandarizados (Docker) en sinergia con el área de Infraestructura/Redes para simplificar los despliegues.</w:t>
+      </w:r>
+    </w:p>
+    <w:p>
+      <w:pPr>
+        <w:pStyle w:val="ListParagraph"/>
+        <w:numPr>
+          <w:ilvl w:val="0"/>
+          <w:numId w:val="1"/>
+        </w:numPr>
+      </w:pPr>
+      <w:r>
+        <w:rPr>
+          <w:b/>
+          <w:bCs/>
+        </w:rPr>
+        <w:t xml:space="preserve">6.18 Evaluación de licencias corporativas e innovación: </w:t>
+      </w:r>
+      <w:r>
+        <w:t xml:space="preserve">Análisis fundamentado de la incorporación futura de herramientas avanzadas según el valor real aportado al Municipio.</w:t>
+      </w:r>
+    </w:p>
+    <w:p/>
+    <w:p>
+      <w:pPr>
+        <w:pStyle w:val="Heading1"/>
+      </w:pPr>
+      <w:r>
+        <w:rPr>
+          <w:rFonts w:ascii="Arial" w:cs="Arial" w:eastAsia="Arial" w:hAnsi="Arial"/>
+          <w:b/>
+          <w:bCs/>
+          <w:sz w:val="28"/>
+          <w:szCs w:val="28"/>
+        </w:rPr>
+        <w:t xml:space="preserve">7. PROPUESTA DE MEJORA Y OPTIMIZACIÓN DE RECURSOS</w:t>
+      </w:r>
+    </w:p>
+    <w:p>
+      <w:r>
+        <w:rPr>
+          <w:i/>
+          <w:iCs/>
+        </w:rPr>
+        <w:t xml:space="preserve">La primera responsabilidad de una Jefatura consiste en optimizar los recursos existentes antes de requerir nuevas incorporaciones presupuestarias. En consecuencia, las acciones propuestas en esta etapa priorizan la reorganización del trabajo, la mejora de los procedimientos y el fortalecimiento de la coordinación interna, aprovechando la infraestructura y el capital humano actualmente disponibles.</w:t>
+      </w:r>
+    </w:p>
     <w:p>
       <w:pPr>
         <w:pStyle w:val="Heading2"/>
@@ -1151,32 +2130,67 @@
           <w:sz w:val="24"/>
           <w:szCs w:val="24"/>
         </w:rPr>
-        <w:t xml:space="preserve">5.3 Cartera Única de Proyectos y Centralización en Redmine</w:t>
-      </w:r>
-    </w:p>
-    <w:p>
-      <w:r>
-        <w:t xml:space="preserve">Actualmente el seguimiento de requerimientos y proyectos se realiza mediante metodologías y canales heterogéneos, lo que impide contar con una visión integral de la capacidad operativa del Departamento y dificulta la priorización transparente de las solicitudes provenientes de las distintas Secretarías.</w:t>
-      </w:r>
-    </w:p>
-    <w:p>
-      <w:r>
-        <w:t xml:space="preserve">La propuesta contempla consolidar la plataforma Redmine como el repositorio único y obligatorio para el registro, asignación y seguimiento de la totalidad de las actividades del Departamento, incluyendo proyectos nuevos, mantenimientos evolutivos, corrección de incidencias y tareas de asistencia técnica.</w:t>
-      </w:r>
-    </w:p>
-    <w:p>
-      <w:r>
-        <w:t xml:space="preserve">Todas las solicitudes ingresadas deberán clasificarse según su impacto institucional, urgencia y factibilidad técnica. La visibilidad centralizada de la carga de trabajo permitirá estimar plazos de entrega realistas y comunicar con transparencia el estado de los desarrollos a las áreas usuarias.</w:t>
-      </w:r>
-    </w:p>
-    <w:p>
-      <w:r>
-        <w:t xml:space="preserve">La Jefatura asumirá la responsabilidad de administrar la Cartera Única, actuando como filtro frente a las demandas de las dependencias solicitantes, gestionando las prioridades junto a las autoridades y asignando los recursos según la capacidad real del equipo.</w:t>
-      </w:r>
-    </w:p>
-    <w:p>
-      <w:r>
-        <w:t xml:space="preserve">Con esta centralización se logrará unificar la gestión de demandas, mejorar la previsibilidad en los tiempos de respuesta y dotar de total transparencia a la administración de los recursos del Departamento.</w:t>
+        <w:t xml:space="preserve">7.1 Escenario SIN PRESUPUESTO (Plan Realista - Costo $0)</w:t>
+      </w:r>
+    </w:p>
+    <w:p>
+      <w:r>
+        <w:rPr>
+          <w:b/>
+          <w:bCs/>
+        </w:rPr>
+        <w:t xml:space="preserve">1. Liderazgo Híbrido: </w:t>
+      </w:r>
+      <w:r>
+        <w:t xml:space="preserve">Jefatura como Scrum Master Global (filtro de cargas entre oficinas) y Gestor.</w:t>
+      </w:r>
+    </w:p>
+    <w:p>
+      <w:r>
+        <w:rPr>
+          <w:b/>
+          <w:bCs/>
+        </w:rPr>
+        <w:t xml:space="preserve">2. Mitigación de Puntos Únicos de Falla: </w:t>
+      </w:r>
+      <w:r>
+        <w:t xml:space="preserve">Asignación de Referentes Secundarios en sistemas críticos.</w:t>
+      </w:r>
+    </w:p>
+    <w:p>
+      <w:r>
+        <w:rPr>
+          <w:b/>
+          <w:bCs/>
+        </w:rPr>
+        <w:t xml:space="preserve">3. Estandarización Obligatoria: </w:t>
+      </w:r>
+      <w:r>
+        <w:t xml:space="preserve">Uso del Template de Arquitectura Base municipal (Congelamiento Legacy).</w:t>
+      </w:r>
+    </w:p>
+    <w:p>
+      <w:r>
+        <w:rPr>
+          <w:b/>
+          <w:bCs/>
+        </w:rPr>
+        <w:t xml:space="preserve">4. Gobernanza de Proveedores: </w:t>
+      </w:r>
+      <w:r>
+        <w:t xml:space="preserve">Exigencia de código fuente, manuales y pruebas de recepción antes de la aceptación.</w:t>
+      </w:r>
+    </w:p>
+    <w:p>
+      <w:r>
+        <w:rPr>
+          <w:b/>
+          <w:bCs/>
+        </w:rPr>
+        <w:t xml:space="preserve">5. Uso Seguro de IA: </w:t>
+      </w:r>
+      <w:r>
+        <w:t xml:space="preserve">Protocolo de resguardo de datos sensibles en asistentes de código.</w:t>
       </w:r>
     </w:p>
     <w:p/>
@@ -1192,35 +2206,85 @@
           <w:sz w:val="24"/>
           <w:szCs w:val="24"/>
         </w:rPr>
-        <w:t xml:space="preserve">5.4 Modelo de Agilidad Adaptativa (Scrum Master Global / Kanban)</w:t>
-      </w:r>
-    </w:p>
-    <w:p>
-      <w:r>
-        <w:t xml:space="preserve">La diversidad de proyectos y mantenimientos simultáneos dificulta la aplicación rígida de una única metodología de trabajo. Los proyectos nuevos requieren iteraciones planificadas, mientras que la atención de incidencias operativas exige un flujo continuo de respuesta.</w:t>
-      </w:r>
-    </w:p>
-    <w:p>
-      <w:r>
-        <w:t xml:space="preserve">Se propone implementar un marco de Agilidad Adaptativa que combine iteraciones cortas (Sprints) para nuevos desarrollos con gestión de flujo continuo (Kanban) para mantenimientos y soporte técnico. La propuesta contempla reuniones breves de sincronización, priorización periódica del backlog y definición clara de criterios de finalización (Definition of Done).</w:t>
-      </w:r>
-    </w:p>
-    <w:p>
-      <w:r>
-        <w:t xml:space="preserve">Este esquema permitirá flexibilizar la gestión del trabajo sin perder el control sobre los entregables ni saturar al equipo con sobrecargas imprevistas.</w:t>
-      </w:r>
-    </w:p>
-    <w:p>
-      <w:r>
-        <w:t xml:space="preserve">La Jefatura asumirá el rol activo de Scrum Master Global y Gestor, protegiendo al equipo de interrupciones externas, removiendo impedimentos técnicos u organizacionales y ajustando la dinámica de trabajo según los resultados observados.</w:t>
-      </w:r>
-    </w:p>
-    <w:p>
-      <w:r>
-        <w:t xml:space="preserve">La adopción de este marco ágil adaptativo incrementará la productividad técnica, mejorará la adaptabilidad ante requerimientos cambiantes y reducirá el estrés operativo generado por la atención reactiva de emergencias.</w:t>
-      </w:r>
-    </w:p>
-    <w:p/>
+        <w:t xml:space="preserve">7.2 Escenario CON PRESUPUESTO (Plan Proyectado a Mediano/Largo Plazo)</w:t>
+      </w:r>
+    </w:p>
+    <w:p>
+      <w:r>
+        <w:rPr>
+          <w:b/>
+          <w:bCs/>
+        </w:rPr>
+        <w:t xml:space="preserve">1. Licencias Corporativas Oficiales de IA: </w:t>
+      </w:r>
+      <w:r>
+        <w:t xml:space="preserve">Adquisición de licencias para IDEs en entornos privados institucionales.</w:t>
+      </w:r>
+    </w:p>
+    <w:p>
+      <w:r>
+        <w:rPr>
+          <w:b/>
+          <w:bCs/>
+        </w:rPr>
+        <w:t xml:space="preserve">2. Plataforma de Análisis Estático de Calidad: </w:t>
+      </w:r>
+      <w:r>
+        <w:t xml:space="preserve">Herramientas automatizadas (ej. SonarQube) para auditar deuda técnica y seguridad.</w:t>
+      </w:r>
+    </w:p>
+    <w:p>
+      <w:r>
+        <w:rPr>
+          <w:b/>
+          <w:bCs/>
+        </w:rPr>
+        <w:t xml:space="preserve">3. Contenerización e Infraestructura: </w:t>
+      </w:r>
+      <w:r>
+        <w:t xml:space="preserve">Proyección presupuestaria para migración a contenedores Docker.</w:t>
+      </w:r>
+    </w:p>
+    <w:p>
+      <w:r>
+        <w:rPr>
+          <w:b/>
+          <w:bCs/>
+        </w:rPr>
+        <w:t xml:space="preserve">4. Capacitación Formal Externa: </w:t>
+      </w:r>
+      <w:r>
+        <w:t xml:space="preserve">Cursos profesionales en Clean Architecture, APIs y Microservicios.</w:t>
+      </w:r>
+    </w:p>
+    <w:p>
+      <w:r>
+        <w:rPr>
+          <w:b/>
+          <w:bCs/>
+        </w:rPr>
+        <w:t xml:space="preserve">5. Equipamiento para Trabajo Colaborativo: </w:t>
+      </w:r>
+      <w:r>
+        <w:t xml:space="preserve">Provisión de webcams y auriculares con micrófono para puestos de trabajo.</w:t>
+      </w:r>
+    </w:p>
+    <w:p/>
+    <w:p>
+      <w:pPr>
+        <w:pStyle w:val="Heading1"/>
+      </w:pPr>
+      <w:r>
+        <w:rPr>
+          <w:rFonts w:ascii="Arial" w:cs="Arial" w:eastAsia="Arial" w:hAnsi="Arial"/>
+          <w:b/>
+          <w:bCs/>
+          <w:sz w:val="28"/>
+          <w:szCs w:val="28"/>
+        </w:rPr>
+        <w:t xml:space="preserve">8. ESTRATEGIA DE IMPLEMENTACIÓN Y ROADMAP POR ETAPAS</w:t>
+      </w:r>
+    </w:p>
     <w:p>
       <w:pPr>
         <w:pStyle w:val="Heading2"/>
@@ -1233,32 +2297,83 @@
           <w:sz w:val="24"/>
           <w:szCs w:val="24"/>
         </w:rPr>
-        <w:t xml:space="preserve">5.5 Estandarización del desarrollo y consolidación de una Arquitectura Base Institucional</w:t>
-      </w:r>
-    </w:p>
-    <w:p>
-      <w:r>
-        <w:t xml:space="preserve">La diversidad de tecnologías, criterios de diseño y convenciones de programación utilizadas a lo largo del tiempo ha generado un ecosistema de aplicaciones heterogéneo, dificultando el mantenimiento, la reutilización de componentes y la incorporación de nuevos desarrolladores a los proyectos existentes.</w:t>
-      </w:r>
-    </w:p>
-    <w:p>
-      <w:r>
-        <w:t xml:space="preserve">Para reducir esta complejidad se propone institucionalizar una Arquitectura Base que establezca criterios comunes para todos los nuevos desarrollos y para aquellas refactorizaciones cuya magnitud justifique su adopción. Esta arquitectura definirá lineamientos sobre organización de proyectos, acceso a datos, autenticación, manejo de errores, configuración, registro de eventos y demás componentes reutilizables, permitiendo desarrollar aplicaciones homogéneas, mantenibles y compatibles entre sí.</w:t>
-      </w:r>
-    </w:p>
-    <w:p>
-      <w:r>
-        <w:t xml:space="preserve">Como complemento, se elaborarán Guías de Buenas Prácticas que unifiquen criterios de codificación, documentación, control de versiones, pruebas y estructura de los proyectos. Estos documentos deberán mantenerse actualizados y evolucionar conforme lo hagan las necesidades del Departamento.</w:t>
-      </w:r>
-    </w:p>
-    <w:p>
-      <w:r>
-        <w:t xml:space="preserve">La Jefatura será responsable de definir estos estándares, promover su utilización, evaluar las excepciones técnicamente justificadas y coordinar su actualización periódica junto con los equipos de desarrollo. Asimismo, impulsará instancias de revisión técnica previas al inicio de nuevos proyectos para verificar la reutilización de componentes existentes y la compatibilidad con la estrategia tecnológica institucional.</w:t>
-      </w:r>
-    </w:p>
-    <w:p>
-      <w:r>
-        <w:t xml:space="preserve">La implementación de estos lineamientos permitirá reducir la deuda técnica, facilitar el mantenimiento evolutivo, simplificar la incorporación de nuevos desarrolladores y asegurar que el crecimiento del software municipal responda a criterios comunes de calidad y sostenibilidad.</w:t>
+        <w:t xml:space="preserve">8.1 Fases de la Hoja de Ruta Ágil</w:t>
+      </w:r>
+    </w:p>
+    <w:p>
+      <w:pPr>
+        <w:pStyle w:val="ListParagraph"/>
+        <w:numPr>
+          <w:ilvl w:val="0"/>
+          <w:numId w:val="1"/>
+        </w:numPr>
+      </w:pPr>
+      <w:r>
+        <w:rPr>
+          <w:b/>
+          <w:bCs/>
+        </w:rPr>
+        <w:t xml:space="preserve">Etapa I – Conocer y Ordenar (Sprints 1 a 4): </w:t>
+      </w:r>
+      <w:r>
+        <w:t xml:space="preserve">Relevamiento de competencias, inventario de sistemas, conformación de la Cartera Única en Redmine y asignación de Referentes Secundarios.</w:t>
+      </w:r>
+    </w:p>
+    <w:p>
+      <w:pPr>
+        <w:pStyle w:val="ListParagraph"/>
+        <w:numPr>
+          <w:ilvl w:val="0"/>
+          <w:numId w:val="1"/>
+        </w:numPr>
+      </w:pPr>
+      <w:r>
+        <w:rPr>
+          <w:b/>
+          <w:bCs/>
+        </w:rPr>
+        <w:t xml:space="preserve">Etapa II – Integrar y Estandarizar (Sprints 5 a 12): </w:t>
+      </w:r>
+      <w:r>
+        <w:t xml:space="preserve">Reuniones transversales inter-oficinas, difusión de guías de buenas prácticas, obligatoriedad del template de arquitectura y gobierno técnico de proveedores.</w:t>
+      </w:r>
+    </w:p>
+    <w:p>
+      <w:pPr>
+        <w:pStyle w:val="ListParagraph"/>
+        <w:numPr>
+          <w:ilvl w:val="0"/>
+          <w:numId w:val="1"/>
+        </w:numPr>
+      </w:pPr>
+      <w:r>
+        <w:rPr>
+          <w:b/>
+          <w:bCs/>
+        </w:rPr>
+        <w:t xml:space="preserve">Etapa III – Consolidar y Evaluar (Sprints 13+): </w:t>
+      </w:r>
+      <w:r>
+        <w:t xml:space="preserve">Medición de KPIs, revisiones de código en GitLab y proyectos de dockerización.</w:t>
+      </w:r>
+    </w:p>
+    <w:p>
+      <w:pPr>
+        <w:pStyle w:val="ListParagraph"/>
+        <w:numPr>
+          <w:ilvl w:val="0"/>
+          <w:numId w:val="1"/>
+        </w:numPr>
+      </w:pPr>
+      <w:r>
+        <w:rPr>
+          <w:b/>
+          <w:bCs/>
+        </w:rPr>
+        <w:t xml:space="preserve">Proceso Permanente – Mejora Continua: </w:t>
+      </w:r>
+      <w:r>
+        <w:t xml:space="preserve">Auditorías periódicas de procedimientos, actualización de capacitaciones y evaluación de innovaciones.</w:t>
       </w:r>
     </w:p>
     <w:p/>
@@ -1274,433 +2389,7 @@
           <w:sz w:val="24"/>
           <w:szCs w:val="24"/>
         </w:rPr>
-        <w:t xml:space="preserve">5.6 Gestión de la calidad del software y fortalecimiento de la documentación institucional</w:t>
-      </w:r>
-    </w:p>
-    <w:p>
-      <w:r>
-        <w:t xml:space="preserve">La calidad del software constituye un objetivo transversal del Departamento y debe formar parte del proceso de desarrollo desde las etapas iniciales de cada proyecto. Si bien el equipo posee capacidad técnica para desarrollar soluciones de calidad, la ausencia de criterios homogéneos de revisión y documentación genera diferencias entre proyectos que posteriormente incrementan los tiempos de mantenimiento y dificultan la incorporación de nuevos desarrolladores.</w:t>
-      </w:r>
-    </w:p>
-    <w:p>
-      <w:r>
-        <w:t xml:space="preserve">Con el propósito de fortalecer la calidad de los sistemas municipales, se propone institucionalizar un conjunto de prácticas mínimas aplicables a todos los proyectos, adaptadas a su complejidad y criticidad. El objetivo no consiste en incorporar controles burocráticos, sino en asegurar que cada desarrollo reúna las condiciones necesarias para ser mantenido y evolucionado por cualquier integrante del Departamento.</w:t>
-      </w:r>
-    </w:p>
-    <w:p>
-      <w:r>
-        <w:t xml:space="preserve">Como criterio general, cada proyecto deberá contar con una documentación técnica mínima que describa el objetivo del sistema, su arquitectura general, el modelo de datos utilizado, las integraciones con otros aplicativos, los procedimientos de instalación y despliegue, así como los responsables funcionales y técnicos. La profundidad de esta documentación será proporcional a la complejidad del sistema, evitando generar documentación innecesaria que luego quede desactualizada.</w:t>
-      </w:r>
-    </w:p>
-    <w:p>
-      <w:r>
-        <w:t xml:space="preserve">Del mismo modo, antes de la puesta en producción de modificaciones relevantes se promoverán instancias de revisión técnica orientadas a verificar el cumplimiento de los estándares definidos por el Departamento, la correcta integración con los sistemas existentes y la ausencia de errores evidentes que puedan afectar la operación normal de los servicios municipales.</w:t>
-      </w:r>
-    </w:p>
-    <w:p>
-      <w:r>
-        <w:t xml:space="preserve">La Jefatura será responsable de impulsar estas prácticas como parte habitual del proceso de desarrollo, supervisando su cumplimiento y promoviendo una cultura donde la calidad y la documentación sean entendidas como componentes naturales del trabajo cotidiano.</w:t>
-      </w:r>
-    </w:p>
-    <w:p>
-      <w:r>
-        <w:t xml:space="preserve">La implementación de estas medidas permitirá mejorar la mantenibilidad de las aplicaciones, reducir la dependencia del conocimiento individual y fortalecer la continuidad operativa del Departamento.</w:t>
-      </w:r>
-    </w:p>
-    <w:p/>
-    <w:p>
-      <w:pPr>
-        <w:pStyle w:val="Heading2"/>
-      </w:pPr>
-      <w:r>
-        <w:rPr>
-          <w:rFonts w:ascii="Arial" w:cs="Arial" w:eastAsia="Arial" w:hAnsi="Arial"/>
-          <w:b/>
-          <w:bCs/>
-          <w:sz w:val="24"/>
-          <w:szCs w:val="24"/>
-        </w:rPr>
-        <w:t xml:space="preserve">5.7 Gobierno técnico de proveedores externos</w:t>
-      </w:r>
-    </w:p>
-    <w:p>
-      <w:r>
-        <w:t xml:space="preserve">Las funciones asignadas al Departamento comprenden no sólo el desarrollo interno de sistemas informáticos, sino también la supervisión técnica de aquellas soluciones provistas por empresas externas. En consecuencia, la contratación de un proveedor no implica delegar la responsabilidad sobre la calidad del software incorporado al ecosistema municipal.</w:t>
-      </w:r>
-    </w:p>
-    <w:p>
-      <w:r>
-        <w:t xml:space="preserve">La Jefatura deberá asumir un rol activo durante todo el ciclo de contratación, participando en la definición de los requerimientos técnicos, colaborando en la elaboración de las especificaciones funcionales y verificando que las soluciones propuestas resulten compatibles con la arquitectura tecnológica del Municipio y con los estándares definidos por el Departamento.</w:t>
-      </w:r>
-    </w:p>
-    <w:p>
-      <w:r>
-        <w:t xml:space="preserve">Durante la ejecución de los proyectos se promoverán reuniones periódicas de seguimiento técnico que permitan detectar tempranamente desvíos respecto de las especificaciones acordadas, facilitando la resolución de inconvenientes antes de su impacto sobre la implementación.</w:t>
-      </w:r>
-    </w:p>
-    <w:p>
-      <w:r>
-        <w:t xml:space="preserve">Asimismo, previo a la recepción definitiva de cualquier desarrollo contratado, se verificará el cumplimiento de requisitos mínimos que garanticen la autonomía tecnológica del Municipio. Entre ellos se incluyen la entrega del código fuente, la documentación técnica actualizada, los modelos de datos, los procedimientos de instalación y despliegue, la descripción de las interfaces de integración y las evidencias de las pruebas realizadas.</w:t>
-      </w:r>
-    </w:p>
-    <w:p>
-      <w:r>
-        <w:t xml:space="preserve">Cuando los contratos contemplen servicios de mantenimiento, la Jefatura actuará además como nexo técnico entre las áreas usuarias y los proveedores, coordinando la gestión de incidencias, verificando el cumplimiento de los niveles de servicio comprometidos y controlando la calidad de las soluciones implementadas.</w:t>
-      </w:r>
-    </w:p>
-    <w:p>
-      <w:r>
-        <w:t xml:space="preserve">De esta manera se fortalece el rol institucional del Departamento como autoridad técnica sobre los sistemas municipales, evitando la dependencia tecnológica de proveedores externos y asegurando que el conocimiento generado permanezca dentro de la organización.</w:t>
-      </w:r>
-    </w:p>
-    <w:p/>
-    <w:p>
-      <w:pPr>
-        <w:pStyle w:val="Heading2"/>
-      </w:pPr>
-      <w:r>
-        <w:rPr>
-          <w:rFonts w:ascii="Arial" w:cs="Arial" w:eastAsia="Arial" w:hAnsi="Arial"/>
-          <w:b/>
-          <w:bCs/>
-          <w:sz w:val="24"/>
-          <w:szCs w:val="24"/>
-        </w:rPr>
-        <w:t xml:space="preserve">5.8 Innovación tecnológica y utilización responsable de Inteligencia Artificial</w:t>
-      </w:r>
-    </w:p>
-    <w:p>
-      <w:r>
-        <w:t xml:space="preserve">La innovación tecnológica constituye una función permanente del Departamento y debe orientarse a mejorar la calidad de los servicios brindados por la Municipalidad. Sin embargo, la incorporación de nuevas herramientas debe responder a una planificación institucional y no únicamente a iniciativas individuales o tendencias del mercado.</w:t>
-      </w:r>
-    </w:p>
-    <w:p>
-      <w:r>
-        <w:t xml:space="preserve">La Jefatura impulsará un proceso continuo de evaluación de tecnologías, metodologías y herramientas de desarrollo, analizando su impacto sobre la infraestructura existente, los costos de adopción, las necesidades de capacitación y los beneficios concretos que puedan aportar a la gestión municipal. Sólo aquellas soluciones que demuestren una mejora objetiva en la productividad, la seguridad o la calidad del software serán incorporadas como estándares institucionales.</w:t>
-      </w:r>
-    </w:p>
-    <w:p>
-      <w:r>
-        <w:t xml:space="preserve">Dentro de este escenario, las herramientas basadas en Inteligencia Artificial representan una oportunidad para asistir al equipo de desarrollo en tareas como generación de código, documentación técnica, análisis de errores y automatización de actividades repetitivas. Su utilización permitirá reducir tiempos operativos y mejorar la productividad del Departamento, siempre que su uso se realice bajo criterios claros de seguridad y confidencialidad.</w:t>
-      </w:r>
-    </w:p>
-    <w:p>
-      <w:r>
-        <w:t xml:space="preserve">Por tal motivo se establecerán lineamientos que prohíban expresamente incorporar en plataformas públicas de Inteligencia Artificial información sensible, datos personales de ciudadanos, credenciales institucionales o cualquier otro contenido protegido por las políticas de seguridad del Municipio.</w:t>
-      </w:r>
-    </w:p>
-    <w:p>
-      <w:r>
-        <w:t xml:space="preserve">Asimismo, toda producción generada mediante estas herramientas deberá ser revisada y validada por el profesional responsable del desarrollo antes de incorporarse a los sistemas municipales, manteniendo en todo momento la responsabilidad técnica sobre las decisiones adoptadas.</w:t>
-      </w:r>
-    </w:p>
-    <w:p>
-      <w:r>
-        <w:t xml:space="preserve">Como proyección futura, y sujeto a disponibilidad presupuestaria, podrá evaluarse la incorporación de plataformas corporativas de Inteligencia Artificial administradas por el Municipio, que ofrezcan mayores garantías de privacidad, trazabilidad y administración centralizada.</w:t>
-      </w:r>
-    </w:p>
-    <w:p>
-      <w:r>
-        <w:t xml:space="preserve">De este modo, la innovación tecnológica dejará de depender de decisiones individuales para transformarse en una política institucional permanente, orientada a fortalecer la capacidad del Departamento para brindar soluciones modernas, seguras y sostenibles.</w:t>
-      </w:r>
-    </w:p>
-    <w:p/>
-    <w:p>
-      <w:pPr>
-        <w:pStyle w:val="Heading1"/>
-      </w:pPr>
-      <w:r>
-        <w:rPr>
-          <w:rFonts w:ascii="Arial" w:cs="Arial" w:eastAsia="Arial" w:hAnsi="Arial"/>
-          <w:b/>
-          <w:bCs/>
-          <w:sz w:val="28"/>
-          <w:szCs w:val="28"/>
-        </w:rPr>
-        <w:t xml:space="preserve">6. OPTIMIZACIÓN DE RECURSOS Y ESCENARIOS DE INVERSIÓN</w:t>
-      </w:r>
-    </w:p>
-    <w:p>
-      <w:r>
-        <w:rPr>
-          <w:i/>
-          <w:iCs/>
-        </w:rPr>
-        <w:t xml:space="preserve">La primera responsabilidad de una Jefatura consiste en optimizar los recursos existentes antes de requerir nuevas incorporaciones presupuestarias. En consecuencia, las acciones propuestas en esta etapa priorizan la reorganización del trabajo, la mejora de los procedimientos y el fortalecimiento de la coordinación interna, aprovechando la infraestructura y el capital humano actualmente disponibles.</w:t>
-      </w:r>
-    </w:p>
-    <w:p>
-      <w:pPr>
-        <w:pStyle w:val="Heading2"/>
-      </w:pPr>
-      <w:r>
-        <w:rPr>
-          <w:rFonts w:ascii="Arial" w:cs="Arial" w:eastAsia="Arial" w:hAnsi="Arial"/>
-          <w:b/>
-          <w:bCs/>
-          <w:sz w:val="24"/>
-          <w:szCs w:val="24"/>
-        </w:rPr>
-        <w:t xml:space="preserve">6.1 Escenario SIN PRESUPUESTO (Plan Realista - Costo $0)</w:t>
-      </w:r>
-    </w:p>
-    <w:p>
-      <w:r>
-        <w:rPr>
-          <w:b/>
-          <w:bCs/>
-        </w:rPr>
-        <w:t xml:space="preserve">1. Liderazgo Híbrido: </w:t>
-      </w:r>
-      <w:r>
-        <w:t xml:space="preserve">Jefatura como Scrum Master Global (filtro de cargas entre oficinas) y Gestor.</w:t>
-      </w:r>
-    </w:p>
-    <w:p>
-      <w:r>
-        <w:rPr>
-          <w:b/>
-          <w:bCs/>
-        </w:rPr>
-        <w:t xml:space="preserve">2. Mitigación de Puntos Únicos de Falla: </w:t>
-      </w:r>
-      <w:r>
-        <w:t xml:space="preserve">Asignación de Referentes Secundarios en sistemas críticos.</w:t>
-      </w:r>
-    </w:p>
-    <w:p>
-      <w:r>
-        <w:rPr>
-          <w:b/>
-          <w:bCs/>
-        </w:rPr>
-        <w:t xml:space="preserve">3. Estandarización Obligatoria: </w:t>
-      </w:r>
-      <w:r>
-        <w:t xml:space="preserve">Uso del Template de Arquitectura Base municipal (Congelamiento Legacy).</w:t>
-      </w:r>
-    </w:p>
-    <w:p>
-      <w:r>
-        <w:rPr>
-          <w:b/>
-          <w:bCs/>
-        </w:rPr>
-        <w:t xml:space="preserve">4. Gobernanza de Proveedores: </w:t>
-      </w:r>
-      <w:r>
-        <w:t xml:space="preserve">Exigencia de código fuente, manuales y pruebas de recepción antes de la aceptación.</w:t>
-      </w:r>
-    </w:p>
-    <w:p>
-      <w:r>
-        <w:rPr>
-          <w:b/>
-          <w:bCs/>
-        </w:rPr>
-        <w:t xml:space="preserve">5. Uso Seguro de IA: </w:t>
-      </w:r>
-      <w:r>
-        <w:t xml:space="preserve">Protocolo de resguardo de datos sensibles en asistentes de código.</w:t>
-      </w:r>
-    </w:p>
-    <w:p/>
-    <w:p>
-      <w:pPr>
-        <w:pStyle w:val="Heading2"/>
-      </w:pPr>
-      <w:r>
-        <w:rPr>
-          <w:rFonts w:ascii="Arial" w:cs="Arial" w:eastAsia="Arial" w:hAnsi="Arial"/>
-          <w:b/>
-          <w:bCs/>
-          <w:sz w:val="24"/>
-          <w:szCs w:val="24"/>
-        </w:rPr>
-        <w:t xml:space="preserve">6.2 Escenario CON PRESUPUESTO (Plan Proyectado a Mediano/Largo Plazo)</w:t>
-      </w:r>
-    </w:p>
-    <w:p>
-      <w:r>
-        <w:rPr>
-          <w:b/>
-          <w:bCs/>
-        </w:rPr>
-        <w:t xml:space="preserve">1. Licencias Corporativas Oficiales de IA: </w:t>
-      </w:r>
-      <w:r>
-        <w:t xml:space="preserve">Adquisición de licencias para IDEs en entornos privados institucionales.</w:t>
-      </w:r>
-    </w:p>
-    <w:p>
-      <w:r>
-        <w:rPr>
-          <w:b/>
-          <w:bCs/>
-        </w:rPr>
-        <w:t xml:space="preserve">2. Plataforma de Análisis Estático de Calidad: </w:t>
-      </w:r>
-      <w:r>
-        <w:t xml:space="preserve">Herramientas automatizadas (ej. SonarQube) para auditar deuda técnica y seguridad.</w:t>
-      </w:r>
-    </w:p>
-    <w:p>
-      <w:r>
-        <w:rPr>
-          <w:b/>
-          <w:bCs/>
-        </w:rPr>
-        <w:t xml:space="preserve">3. Contenerización e Infraestructura: </w:t>
-      </w:r>
-      <w:r>
-        <w:t xml:space="preserve">Proyección presupuestaria para migración a contenedores Docker.</w:t>
-      </w:r>
-    </w:p>
-    <w:p>
-      <w:r>
-        <w:rPr>
-          <w:b/>
-          <w:bCs/>
-        </w:rPr>
-        <w:t xml:space="preserve">4. Capacitación Formal Externa: </w:t>
-      </w:r>
-      <w:r>
-        <w:t xml:space="preserve">Cursos profesionales en Clean Architecture, APIs y Microservicios.</w:t>
-      </w:r>
-    </w:p>
-    <w:p>
-      <w:r>
-        <w:rPr>
-          <w:b/>
-          <w:bCs/>
-        </w:rPr>
-        <w:t xml:space="preserve">5. Equipamiento para Trabajo Colaborativo: </w:t>
-      </w:r>
-      <w:r>
-        <w:t xml:space="preserve">Provisión de webcams y auriculares con micrófono para puestos de trabajo.</w:t>
-      </w:r>
-    </w:p>
-    <w:p/>
-    <w:p>
-      <w:pPr>
-        <w:pStyle w:val="Heading1"/>
-      </w:pPr>
-      <w:r>
-        <w:rPr>
-          <w:rFonts w:ascii="Arial" w:cs="Arial" w:eastAsia="Arial" w:hAnsi="Arial"/>
-          <w:b/>
-          <w:bCs/>
-          <w:sz w:val="28"/>
-          <w:szCs w:val="28"/>
-        </w:rPr>
-        <w:t xml:space="preserve">7. ESTRATEGIA DE IMPLEMENTACIÓN Y ROADMAP POR ETAPAS</w:t>
-      </w:r>
-    </w:p>
-    <w:p>
-      <w:pPr>
-        <w:pStyle w:val="Heading2"/>
-      </w:pPr>
-      <w:r>
-        <w:rPr>
-          <w:rFonts w:ascii="Arial" w:cs="Arial" w:eastAsia="Arial" w:hAnsi="Arial"/>
-          <w:b/>
-          <w:bCs/>
-          <w:sz w:val="24"/>
-          <w:szCs w:val="24"/>
-        </w:rPr>
-        <w:t xml:space="preserve">7.1 Fases de la Hoja de Ruta Ágil</w:t>
-      </w:r>
-    </w:p>
-    <w:p>
-      <w:pPr>
-        <w:pStyle w:val="ListParagraph"/>
-        <w:numPr>
-          <w:ilvl w:val="0"/>
-          <w:numId w:val="1"/>
-        </w:numPr>
-      </w:pPr>
-      <w:r>
-        <w:rPr>
-          <w:b/>
-          <w:bCs/>
-        </w:rPr>
-        <w:t xml:space="preserve">Etapa I – Conocer y Ordenar (Sprints 1 a 4): </w:t>
-      </w:r>
-      <w:r>
-        <w:t xml:space="preserve">Relevamiento de competencias, inventario de sistemas, conformación de la Cartera Única en Redmine y asignación de Referentes Secundarios.</w:t>
-      </w:r>
-    </w:p>
-    <w:p>
-      <w:pPr>
-        <w:pStyle w:val="ListParagraph"/>
-        <w:numPr>
-          <w:ilvl w:val="0"/>
-          <w:numId w:val="1"/>
-        </w:numPr>
-      </w:pPr>
-      <w:r>
-        <w:rPr>
-          <w:b/>
-          <w:bCs/>
-        </w:rPr>
-        <w:t xml:space="preserve">Etapa II – Integrar y Estandarizar (Sprints 5 a 12): </w:t>
-      </w:r>
-      <w:r>
-        <w:t xml:space="preserve">Reuniones transversales inter-oficinas, difusión de guías de buenas prácticas, obligatoriedad del template de arquitectura y gobierno técnico de proveedores.</w:t>
-      </w:r>
-    </w:p>
-    <w:p>
-      <w:pPr>
-        <w:pStyle w:val="ListParagraph"/>
-        <w:numPr>
-          <w:ilvl w:val="0"/>
-          <w:numId w:val="1"/>
-        </w:numPr>
-      </w:pPr>
-      <w:r>
-        <w:rPr>
-          <w:b/>
-          <w:bCs/>
-        </w:rPr>
-        <w:t xml:space="preserve">Etapa III – Consolidar y Evaluar (Sprints 13+): </w:t>
-      </w:r>
-      <w:r>
-        <w:t xml:space="preserve">Medición de KPIs, revisiones de código en GitLab y proyectos de dockerización.</w:t>
-      </w:r>
-    </w:p>
-    <w:p>
-      <w:pPr>
-        <w:pStyle w:val="ListParagraph"/>
-        <w:numPr>
-          <w:ilvl w:val="0"/>
-          <w:numId w:val="1"/>
-        </w:numPr>
-      </w:pPr>
-      <w:r>
-        <w:rPr>
-          <w:b/>
-          <w:bCs/>
-        </w:rPr>
-        <w:t xml:space="preserve">Proceso Permanente – Mejora Continua: </w:t>
-      </w:r>
-      <w:r>
-        <w:t xml:space="preserve">Auditorías periódicas de procedimientos, actualización de capacitaciones y evaluación de innovaciones.</w:t>
-      </w:r>
-    </w:p>
-    <w:p/>
-    <w:p>
-      <w:pPr>
-        <w:pStyle w:val="Heading2"/>
-      </w:pPr>
-      <w:r>
-        <w:rPr>
-          <w:rFonts w:ascii="Arial" w:cs="Arial" w:eastAsia="Arial" w:hAnsi="Arial"/>
-          <w:b/>
-          <w:bCs/>
-          <w:sz w:val="24"/>
-          <w:szCs w:val="24"/>
-        </w:rPr>
-        <w:t xml:space="preserve">7.2 Cuadro Resumen de Implementación</w:t>
+        <w:t xml:space="preserve">8.2 Cuadro Resumen de Implementación</w:t>
       </w:r>
     </w:p>
     <w:tbl>
@@ -1917,7 +2606,7 @@
           <w:sz w:val="28"/>
           <w:szCs w:val="28"/>
         </w:rPr>
-        <w:t xml:space="preserve">8. MATRIZ DE INDICADORES DE EVALUACIÓN Y GESTIÓN (KPIs)</w:t>
+        <w:t xml:space="preserve">9. MATRIZ DE INDICADORES DE EVALUACIÓN Y GESTIÓN (KPIs)</w:t>
       </w:r>
     </w:p>
     <w:tbl>
@@ -2202,7 +2891,7 @@
           <w:sz w:val="28"/>
           <w:szCs w:val="28"/>
         </w:rPr>
-        <w:t xml:space="preserve">9. SECTORES DEL DEPARTAMENTO (MATRIZ DINÁMICA DE TRABAJO)</w:t>
+        <w:t xml:space="preserve">10. SECTORES DEL DEPARTAMENTO (MATRIZ DINÁMICA DE TRABAJO)</w:t>
       </w:r>
     </w:p>
     <w:p>
@@ -2259,7 +2948,7 @@
           <w:sz w:val="28"/>
           <w:szCs w:val="28"/>
         </w:rPr>
-        <w:t xml:space="preserve">10. CONCLUSIONES</w:t>
+        <w:t xml:space="preserve">11. CONCLUSIONES</w:t>
       </w:r>
     </w:p>
     <w:p>
@@ -2269,17 +2958,17 @@
     </w:p>
     <w:p>
       <w:r>
-        <w:t xml:space="preserve">Al implementar un marco de agilidad adaptativa con la Jefatura en un rol activo de Scrum Master Global y Gestor, establecer el uso obligatorio de la arquitectura base municipal, instituir la figura de los Referentes Secundarios y aplicar un estricto Gobierno Técnico sobre Proveedores, se resuelven los problemas históricos de desarticulación, multitarea caótica y conocimiento concentrado.</w:t>
-      </w:r>
-    </w:p>
-    <w:p>
-      <w:r>
-        <w:t xml:space="preserve">Esta propuesta nace desde adentro del Departamento: no es una visión externa de lo que debería mejorarse, sino el resultado del conocimiento acumulado en el trabajo cotidiano, en el análisis de sus procesos y en la identificación concreta de lo que frena el desarrollo institucional del área. Por eso sus iniciativas son realizables, sus tiempos son reales y sus resultados son medibles.</w:t>
-      </w:r>
-    </w:p>
-    <w:p>
-      <w:r>
-        <w:t xml:space="preserve">La tecnología es una herramienta al servicio de la gestión pública. El verdadero desafío del Departamento no consiste únicamente en desarrollar software, sino en aportar soluciones que mejoren la eficiencia administrativa, fortalezcan la continuidad institucional y generen valor para toda la ciudadanía. Ese será el criterio rector de la gestión.</w:t>
+        <w:t xml:space="preserve">Al implementar un marco de agilidad adaptativa con la Jefatura en un rol activo de Scrum Master Global y Gestor Gerencial, establecer el uso obligatorio de la arquitectura base municipal, instituir la figura de los Referentes Secundarios y aplicar un estricto Gobierno Técnico sobre Proveedores, se resuelven los problemas históricos de desarticulación, multitarea caótica y conocimiento concentrado.</w:t>
+      </w:r>
+    </w:p>
+    <w:p>
+      <w:r>
+        <w:t xml:space="preserve">Esta propuesta demuestra cómo es posible transformar la realidad actual mediante el uso inteligente de los recursos disponibles (Escenario REAL $0) y trazar un camino presupuestario sólido para incorporar innovación tecnológica (Escenario IDEAL), asegurando que el patrimonio de software del Municipio sea seguro, duradero y de calidad.</w:t>
+      </w:r>
+    </w:p>
+    <w:p>
+      <w:r>
+        <w:t xml:space="preserve">La tecnología constituye una herramienta al servicio de la gestión pública. En consecuencia, el verdadero desafío del Departamento no consiste únicamente en desarrollar software, sino en aportar soluciones que mejoren la eficiencia administrativa, fortalezcan la continuidad institucional y generen valor para toda la ciudadanía. Ese será el criterio rector que orientará la gestión propuesta.</w:t>
       </w:r>
     </w:p>
     <w:sectPr>

</xml_diff>

<commit_message>
Revisión integral: 100% de requisitos de Circular 902, Perfil del Cargo IF-2026, FODA y coherencia interna validados
</commit_message>
<xml_diff>
--- a/Plan_Trabajo_Jefatura_Software_Version_Director.docx
+++ b/Plan_Trabajo_Jefatura_Software_Version_Director.docx
@@ -232,12 +232,12 @@
     </w:p>
     <w:p>
       <w:r>
-        <w:t xml:space="preserve">Su función excede el desarrollo de aplicaciones informáticas. El Departamento interviene en el relevamiento y análisis de requerimientos funcionales, la planificación y coordinación de proyectos, la definición de estándares de desarrollo, la evaluación de nuevas tecnologías, el control técnico de proveedores externos, la integración entre sistemas municipales y el mantenimiento evolutivo de aplicaciones críticas para el funcionamiento de la Administración.</w:t>
-      </w:r>
-    </w:p>
-    <w:p>
-      <w:r>
-        <w:t xml:space="preserve">La Jefatura del Departamento debe desempeñar un rol integrador que va más allá de la coordinación técnica de proyectos. Su responsabilidad central consiste en combinar conocimientos técnicos con planificación, conducción de equipos y administración de recursos, generando las condiciones organizacionales que permitan al equipo desarrollar software de manera previsible, colaborativa y sostenible, promoviendo la integración entre personas, la reutilización del conocimiento, la adopción responsable de nuevas tecnologías y la mejora permanente de los procedimientos internos, con decisiones tecnológicas alineadas a los objetivos institucionales del Municipio.</w:t>
+        <w:t xml:space="preserve">Su función excede el desarrollo de aplicaciones informáticas. El Departamento interviene en el relevamiento y análisis de requerimientos funcionales, la planificación y coordinación de proyectos, la definición de estándares de desarrollo, la evaluación de nuevas tecnologías, el control técnico de proveedores externos, la integración entre sistemas municipales, la intervención en el sitio Web de la Municipalidad y el mantenimiento evolutivo de aplicaciones críticas para el funcionamiento de la Administración.</w:t>
+      </w:r>
+    </w:p>
+    <w:p>
+      <w:r>
+        <w:t xml:space="preserve">La Jefatura del Departamento debe desempeñar un rol integrador que va más allá de la coordinación técnica de proyectos. Su responsabilidad central consiste en combinar conocimientos técnicos con planificación, conducción de equipos y administración de recursos, generando las condiciones organizacionales que permitan al equipo desarrollar software de manera previsible, colaborativa y sostenible, promoviendo la integración entre personas, la reutilización del conocimiento, la adopción responsable de nuevas tecnologías y la mejora permanente de los procedimientos internos, con decisiones tecnológicas alineadas a los objetivos institucionales del Municipio y cumpliendo con las exigencias del régimen administrativo (Ley Orgánica de las Municipalidades, Ley 14656, RAFAM, GDE y Decreto N° 2250/98).</w:t>
       </w:r>
     </w:p>
     <w:p>
@@ -1055,7 +1055,7 @@
     </w:p>
     <w:p>
       <w:r>
-        <w:t xml:space="preserve">En este contexto, se propone una estrategia de mejora basada en la optimización de los recursos actualmente disponibles, priorizando acciones que puedan implementarse sin requerir modificaciones en la estructura orgánica ni incorporaciones inmediatas de personal. El objetivo es fortalecer el funcionamiento del Departamento mediante la definición de procesos comunes, la mejora de la planificación, la estandarización técnica y una conducción activa por parte de la Jefatura.</w:t>
+        <w:t xml:space="preserve">En este contexto, se propone una estrategia de mejora basada en la optimización de los recursos actualmente disponibles, priorizando acciones que puedan implementarse sin requerir modificaciones en la estructura orgánica ni incorporaciones inmediatas de personal. El objetivo es fortalecer el funcionamiento del Departamento mediante la definición de procesos comunes, la mejora de la planificación, la estandarización técnica y una conducción activa por parte de la Jefatura, dando cumplimiento a los deberes administrativos (40 hs semanales de dedicación, gestión de personal, bienes de la dependencia y anteproyecto presupuestario anual).</w:t>
       </w:r>
     </w:p>
     <w:p>
@@ -1081,7 +1081,7 @@
     </w:p>
     <w:p>
       <w:r>
-        <w:t xml:space="preserve">El Departamento desarrolla simultáneamente actividades de mantenimiento de sistemas existentes, atención de incidencias, asistencia técnica a distintas áreas municipales y desarrollo de nuevos proyectos. Esta diversidad de tareas, sumada a la cantidad limitada de recursos humanos disponibles, provoca frecuentes cambios de prioridades, interrupciones constantes y dificultades para planificar el trabajo de manera ordenada.</w:t>
+        <w:t xml:space="preserve">El Departamento desarrolla simultáneamente actividades de mantenimiento de sistemas existentes, atención de incidencias, asistencia técnica a distintas áreas municipales, consultas directas de datos específicos para usuarios y desarrollo de nuevos proyectos. Esta diversidad de tareas, sumada a la cantidad limitada de recursos humanos disponibles, provoca frecuentes cambios de prioridades, interrupciones constantes y dificultades para planificar el trabajo de manera ordenada.</w:t>
       </w:r>
     </w:p>
     <w:p>
@@ -1127,7 +1127,7 @@
     </w:p>
     <w:p>
       <w:r>
-        <w:t xml:space="preserve">Una de las funciones asignadas al Departamento consiste en relevar, analizar y transformar las necesidades de las distintas dependencias municipales en soluciones informáticas que aporten valor a la gestión. Para cumplir adecuadamente esta función resulta imprescindible establecer un procedimiento uniforme para la recepción, análisis y priorización de requerimientos.</w:t>
+        <w:t xml:space="preserve">Una de las funciones asignadas al Departamento consiste en relevar, analizar y transformar las necesidades de las distintas dependencias municipales en soluciones informáticas que aporten valor a la gestión. Para cumplir adecuadamente esta función resulta imprescindible establecer un procedimiento uniforme para la recepción, análisis y priorización de requerimientos, abarcando también las solicitudes de consultas específicas de información en bases de datos no disponibles directamente en los aplicativos del usuario.</w:t>
       </w:r>
     </w:p>
     <w:p>
@@ -1260,7 +1260,7 @@
           <w:sz w:val="24"/>
           <w:szCs w:val="24"/>
         </w:rPr>
-        <w:t xml:space="preserve">5.5 Estandarización del desarrollo y consolidación de una Arquitectura Base Institucional</w:t>
+        <w:t xml:space="preserve">5.5 Estandarización del desarrollo, Modelo Único de Datos y Arquitectura Base Institucional</w:t>
       </w:r>
     </w:p>
     <w:p>
@@ -1270,7 +1270,12 @@
     </w:p>
     <w:p>
       <w:r>
-        <w:t xml:space="preserve">Con el propósito de revertir esta situación, se propone consolidar una Arquitectura Base Institucional que establezca criterios comunes para todos los nuevos desarrollos y para aquellas refactorizaciones que, por su alcance, justifiquen su adopción. La Arquitectura Base deberá contemplar aspectos vinculados con la organización de las soluciones, separación de responsabilidades, acceso a datos, seguridad, manejo de errores, autenticación, registro de eventos, configuración y demás componentes transversales utilizados por las aplicaciones municipales. Su utilización permitirá reducir tiempos de desarrollo, favorecer la reutilización de componentes y asegurar que todos los proyectos compartan una estructura homogénea que facilite su mantenimiento futuro.</w:t>
+        <w:t xml:space="preserve">Con el propósito de revertir esta situación, se propone consolidar una Arquitectura Base Institucional que establezca criterios comunes para todos los nuevos desarrollos y para aquellas refactorizaciones que, por su alcance, justifiquen su adopción. La Arquitectura Base deberá contemplar aspectos vinculados con la organización de las soluciones, separación de responsabilidades, acceso a datos, seguridad, manejo de errores, autenticación, registro de eventos, configuración y demás componentes transversales utilizados por las aplicaciones municipales.</w:t>
+      </w:r>
+    </w:p>
+    <w:p>
+      <w:r>
+        <w:t xml:space="preserve">Como elemento central de esta estandarización, la Jefatura velará por analizar y mantener el Modelo Único de Datos que dé soporte a toda la información municipal sin permitir redundancias, verificando y asegurando la adecuación de todos los aplicativos a dicho modelo relacional unificado.</w:t>
       </w:r>
     </w:p>
     <w:p>
@@ -1296,12 +1301,12 @@
           <w:sz w:val="24"/>
           <w:szCs w:val="24"/>
         </w:rPr>
-        <w:t xml:space="preserve">5.6 Gestión de la calidad del software y fortalecimiento de la documentación institucional</w:t>
-      </w:r>
-    </w:p>
-    <w:p>
-      <w:r>
-        <w:t xml:space="preserve">La calidad del software desarrollado por el Departamento no depende únicamente de la capacidad técnica de los desarrolladores, sino también de la existencia de procedimientos que permitan asegurar resultados consistentes, facilitar el mantenimiento futuro y preservar el conocimiento institucional. Actualmente la documentación técnica de los sistemas presenta distintos niveles de desarrollo, dependiendo del proyecto y de las prácticas adoptadas por cada equipo de trabajo. Esta situación incrementa los tiempos necesarios para realizar modificaciones, dificulta la incorporación de nuevos agentes a los proyectos y aumenta la dependencia del conocimiento individual.</w:t>
+        <w:t xml:space="preserve">5.6 Gestión de la calidad del software, sitio Web e integración institucional</w:t>
+      </w:r>
+    </w:p>
+    <w:p>
+      <w:r>
+        <w:t xml:space="preserve">La calidad del software desarrollado por el Departamento no depende únicamente de la capacidad técnica de los desarrolladores, sino también de la existencia de procedimientos que permitan asegurar resultados consistentes, facilitar el mantenimiento futuro y preservar el conocimiento institucional. Asimismo, el Departamento debe intervenir activamente en el diseño e integración del sitio Web oficial de la Municipalidad con los distintos sistemas e iteraciones informáticas municipales.</w:t>
       </w:r>
     </w:p>
     <w:p>
@@ -1371,19 +1376,19 @@
         </w:numPr>
       </w:pPr>
       <w:r>
-        <w:t xml:space="preserve">modelo de datos utilizado;</w:t>
-      </w:r>
-    </w:p>
-    <w:p>
-      <w:pPr>
-        <w:pStyle w:val="ListParagraph"/>
-        <w:numPr>
-          <w:ilvl w:val="0"/>
-          <w:numId w:val="1"/>
-        </w:numPr>
-      </w:pPr>
-      <w:r>
-        <w:t xml:space="preserve">dependencias con otros sistemas;</w:t>
+        <w:t xml:space="preserve">modelo de datos utilizado (sin redundancias);</w:t>
+      </w:r>
+    </w:p>
+    <w:p>
+      <w:pPr>
+        <w:pStyle w:val="ListParagraph"/>
+        <w:numPr>
+          <w:ilvl w:val="0"/>
+          <w:numId w:val="1"/>
+        </w:numPr>
+      </w:pPr>
+      <w:r>
+        <w:t xml:space="preserve">dependencias con otros sistemas y portal Web municipal;</w:t>
       </w:r>
     </w:p>
     <w:p>
@@ -1419,7 +1424,7 @@
         </w:numPr>
       </w:pPr>
       <w:r>
-        <w:t xml:space="preserve">interfaces de integración;</w:t>
+        <w:t xml:space="preserve">interfaces de integración y APIs;</w:t>
       </w:r>
     </w:p>
     <w:p>
@@ -1462,12 +1467,12 @@
           <w:sz w:val="24"/>
           <w:szCs w:val="24"/>
         </w:rPr>
-        <w:t xml:space="preserve">5.7 Gobierno técnico de proveedores externos</w:t>
-      </w:r>
-    </w:p>
-    <w:p>
-      <w:r>
-        <w:t xml:space="preserve">Las funciones asignadas al Departamento comprenden no sólo el desarrollo interno de sistemas informáticos, sino también la participación activa en aquellos proyectos ejecutados por proveedores externos contratados por la Municipalidad. En estos casos, la responsabilidad del Departamento trasciende el seguimiento administrativo de los contratos, comprendiendo la verificación técnica de las soluciones desarrolladas y la protección del patrimonio tecnológico institucional.</w:t>
+        <w:t xml:space="preserve">5.7 Gobierno técnico de proveedores externos y elaboración de pliegos</w:t>
+      </w:r>
+    </w:p>
+    <w:p>
+      <w:r>
+        <w:t xml:space="preserve">Las funciones asignadas al Departamento comprenden no sólo el desarrollo interno de sistemas informáticos, sino también la participación activa en aquellos proyectos ejecutados por proveedores externos contratados por la Municipalidad. En estos casos, la responsabilidad del Departamento trasciende el seguimiento administrativo de los contratos, comprendiendo la intervención en la definición de los requerimientos funcionales, de implantación y contractuales en los pliegos de licitación, la verificación técnica de las soluciones desarrolladas y la protección del patrimonio tecnológico institucional.</w:t>
       </w:r>
     </w:p>
     <w:p>
@@ -1805,7 +1810,7 @@
         <w:t xml:space="preserve">6.6 Arquitectura Base Institucional: </w:t>
       </w:r>
       <w:r>
-        <w:t xml:space="preserve">Institucionalización obligatoria de un template de arquitectura en capas (APIs, acceso a datos, manejo de errores, seguridad) para todos los desarrollos nuevos.</w:t>
+        <w:t xml:space="preserve">Institucionalización obligatoria de un template de arquitectura en capas (APIs, acceso a datos, manejo de errores, seguridad) para todos los desarrollos nuevos y mantenimiento del Modelo Único de Datos.</w:t>
       </w:r>
     </w:p>
     <w:p>
@@ -1998,7 +2003,7 @@
         <w:t xml:space="preserve">6.14 Gobierno técnico de proveedores externos: </w:t>
       </w:r>
       <w:r>
-        <w:t xml:space="preserve">Auditoría de entregables, exigencia de código fuente, documentación y pruebas de recepción validadas por el Municipio.</w:t>
+        <w:t xml:space="preserve">Auditoría de entregables, participación en pliegos, exigencia de código fuente, documentación y pruebas de recepción validadas por el Municipio.</w:t>
       </w:r>
     </w:p>
     <w:p>
@@ -2052,7 +2057,7 @@
         <w:t xml:space="preserve">6.16 Pautas de seguridad para asistentes de IA: </w:t>
       </w:r>
       <w:r>
-        <w:t xml:space="preserve">Guía de uso responsable de herramientas asistidas por IA como apoyo a la programación y documentación, prohibiendo estrictamente la carga de credenciales, claves de bases de datos o datos personales de ciudadanos en plataformas públicas.</w:t>
+        <w:t xml:space="preserve">Guía de uso responsable de herramientas asistidas por IA como apoyo a la programación y documentación, prohibiendo strictly la carga de credenciales, claves de bases de datos o datos personales de ciudadanos en plataformas públicas.</w:t>
       </w:r>
     </w:p>
     <w:p>
@@ -2166,7 +2171,7 @@
         <w:t xml:space="preserve">3. Estandarización Obligatoria: </w:t>
       </w:r>
       <w:r>
-        <w:t xml:space="preserve">Uso del Template de Arquitectura Base municipal (Congelamiento Legacy).</w:t>
+        <w:t xml:space="preserve">Uso del Template de Arquitectura Base municipal (Congelamiento Legacy) y Modelo Único de Datos.</w:t>
       </w:r>
     </w:p>
     <w:p>

</xml_diff>

<commit_message>
Aclara que la propuesta de trabajo se ejecuta al 100% con recursos actuales ( costo adicional)
</commit_message>
<xml_diff>
--- a/Plan_Trabajo_Jefatura_Software_Version_Director.docx
+++ b/Plan_Trabajo_Jefatura_Software_Version_Director.docx
@@ -122,7 +122,7 @@
           <w:sz w:val="22"/>
           <w:szCs w:val="22"/>
         </w:rPr>
-        <w:t xml:space="preserve">Diagnóstico Integral y Propuesta de Mejora para el Funcionamiento del Departamento de Gestión, Desarrollo e Innovación en Sistemas de Software: Optimización con Recursos Actuales y Proyección con Incorporación de Recursos</w:t>
+        <w:t xml:space="preserve">Diagnóstico Integral y Propuesta de Mejora para el Funcionamiento del Departamento de Gestión, Desarrollo e Innovación en Sistemas de Software: Optimización con Recursos Actuales y Proyección de Mediano y Largo Plazo</w:t>
       </w:r>
     </w:p>
     <w:p/>
@@ -242,12 +242,12 @@
     </w:p>
     <w:p>
       <w:r>
-        <w:t xml:space="preserve">La propuesta reconoce que el Departamento desarrolla su actividad en un entorno dinámico, caracterizado por la coexistencia de sistemas de distinta antigüedad, múltiples requerimientos simultáneos, recursos limitados y una creciente demanda de soluciones digitales por parte de las distintas dependencias municipales. Frente a esta realidad, la respuesta no puede limitarse a incorporar nuevas herramientas tecnológicas sin antes fortalecer la organización del trabajo, establecer criterios comunes y consolidar una cultura de mejora continua.</w:t>
-      </w:r>
-    </w:p>
-    <w:p>
-      <w:r>
-        <w:t xml:space="preserve">En consecuencia, este Plan de Trabajo propone un modelo de gestión que combina liderazgo participativo, organización por procesos, gobierno técnico, gestión del conocimiento e innovación tecnológica, diferenciando claramente aquellas acciones implementables con los recursos actuales de aquellas que requieren inversión presupuestaria, con el objetivo de consolidar un Departamento capaz de responder a las necesidades presentes y garantizar la continuidad y sostenibilidad de sus sistemas más allá de las personas o los cambios de gestión.</w:t>
+        <w:t xml:space="preserve">La propuesta reconoce que el Departamento desarrolla su actividad en un entorno dinámico, caracterizado por la coexistencia de sistemas de distinta antigüedad, múltiples requerimientos simultáneos, recursos limitados y una creciente demanda de soluciones digitales por parte de las distintas dependencias municipales. Frente a esta realidad, la respuesta no puede limitarse a solicitar mayores recursos, sino a fortalecer la organización del trabajo con los recursos actuales, establecer criterios comunes y consolidar una cultura de mejora continua.</w:t>
+      </w:r>
+    </w:p>
+    <w:p>
+      <w:r>
+        <w:t xml:space="preserve">En consecuencia, este Plan de Trabajo propone un modelo de gestión basado estrictamente en la optimización de los recursos existentes ($0 costo presupuestario), que combina liderazgo participativo, organización por procesos, gobierno técnico, gestión del conocimiento e innovación tecnológica, con el objetivo de consolidar un Departamento capaz de responder a las necesidades presentes y garantizar la continuidad y sostenibilidad de sus sistemas más allá de las personas o los cambios de gestión.</w:t>
       </w:r>
     </w:p>
     <w:p>
@@ -316,7 +316,7 @@
           <w:b/>
           <w:bCs/>
         </w:rPr>
-        <w:t xml:space="preserve">Mejora continua e innovación tecnológica.</w:t>
+        <w:t xml:space="preserve">Mejora continua e innovación tecnológica con recursos propios.</w:t>
       </w:r>
     </w:p>
     <w:p>
@@ -337,7 +337,7 @@
     </w:p>
     <w:p>
       <w:r>
-        <w:t xml:space="preserve">A partir de estos ejes se desarrolla el diagnóstico de la situación actual y se presentan propuestas de mejora diferenciadas entre las que pueden implementarse con los recursos existentes y las que requieren inversión futura.</w:t>
+        <w:t xml:space="preserve">A partir de estos ejes se desarrolla el diagnóstico de la situación actual y se presentan propuestas de mejora ejecutables con los recursos actualmente disponibles en el Municipio.</w:t>
       </w:r>
     </w:p>
     <w:p/>
@@ -728,12 +728,12 @@
     </w:p>
     <w:p>
       <w:r>
-        <w:t xml:space="preserve">Del análisis realizado surge que el principal desafío del Departamento no radica exclusivamente en la incorporación de nuevas tecnologías, sino en fortalecer su capacidad organizacional para gestionar de manera eficiente el conocimiento, coordinar los recursos disponibles y establecer procedimientos comunes que permitan responder con mayor previsibilidad a las necesidades de la Administración Municipal.</w:t>
-      </w:r>
-    </w:p>
-    <w:p>
-      <w:r>
-        <w:t xml:space="preserve">En consecuencia, la propuesta prioriza la consolidación de un modelo de gestión orientado a las personas, la mejora de los procesos y la planificación estratégica del trabajo, utilizando la innovación tecnológica como un medio para potenciar la capacidad institucional del Departamento y no como un fin en sí mismo.</w:t>
+        <w:t xml:space="preserve">Del análisis realizado surge que el principal desafío del Departamento no radica en solicitar mayores presupuestos ni incorporar tecnologías complejas, sino en fortalecer su capacidad organizacional para gestionar de manera eficiente el conocimiento, coordinar los recursos disponibles y establecer procedimientos comunes que permitan responder con mayor previsibilidad a las necesidades de la Administración Municipal.</w:t>
+      </w:r>
+    </w:p>
+    <w:p>
+      <w:r>
+        <w:t xml:space="preserve">En consecuencia, la propuesta prioriza la consolidación de un modelo de gestión orientado a las personas, la mejora de los procesos y la planificación estratégica del trabajo con los recursos actuales ($0 costo adicional), utilizando la innovación tecnológica como un medio para potenciar la capacidad institucional del Departamento.</w:t>
       </w:r>
     </w:p>
     <w:p/>
@@ -1055,7 +1055,7 @@
     </w:p>
     <w:p>
       <w:r>
-        <w:t xml:space="preserve">En este contexto, se propone una estrategia de mejora basada en la optimización de los recursos actualmente disponibles, priorizando acciones que puedan implementarse sin requerir modificaciones en la estructura orgánica ni incorporaciones inmediatas de personal. El objetivo es fortalecer el funcionamiento del Departamento mediante la definición de procesos comunes, la mejora de la planificación, la estandarización técnica y una conducción activa por parte de la Jefatura, dando cumplimiento a los deberes administrativos (40 hs semanales de dedicación, gestión de personal, bienes de la dependencia y anteproyecto presupuestario anual).</w:t>
+        <w:t xml:space="preserve">En este contexto, se propone una estrategia de mejora basada exclusivamente en la optimización de los recursos actualmente disponibles ($0 costo adicional), priorizando acciones que puedan implementarse sin requerir modificaciones en la estructura orgánica ni incorporaciones inmediatas de personal ni erogaciones presupuestarias extra. El objetivo es fortalecer el funcionamiento del Departamento mediante la definición de procesos comunes, la mejora de la planificación, la estandarización técnica y una conducción activa por parte de la Jefatura, dando cumplimiento a los deberes administrativos (40 hs semanales de dedicación, gestión de personal, bienes de la dependencia y anteproyecto presupuestario anual).</w:t>
       </w:r>
     </w:p>
     <w:p>
@@ -2057,7 +2057,7 @@
         <w:t xml:space="preserve">6.16 Pautas de seguridad para asistentes de IA: </w:t>
       </w:r>
       <w:r>
-        <w:t xml:space="preserve">Guía de uso responsable de herramientas asistidas por IA como apoyo a la programación y documentación, prohibiendo strictly la carga de credenciales, claves de bases de datos o datos personales de ciudadanos en plataformas públicas.</w:t>
+        <w:t xml:space="preserve">Guía de uso responsable de herramientas asistidas por IA como apoyo a la programación y documentación, prohibiendo estrictamente la carga de credenciales, claves de bases de datos o datos personales de ciudadanos en plataformas públicas.</w:t>
       </w:r>
     </w:p>
     <w:p>
@@ -2120,7 +2120,7 @@
           <w:i/>
           <w:iCs/>
         </w:rPr>
-        <w:t xml:space="preserve">La primera responsabilidad de una Jefatura consiste en optimizar los recursos existentes antes de requerir nuevas incorporaciones presupuestarias. En consecuencia, las acciones propuestas en esta etapa priorizan la reorganización del trabajo, la mejora de los procedimientos y el fortalecimiento de la coordinación interna, aprovechando la infraestructura y el capital humano actualmente disponibles.</w:t>
+        <w:t xml:space="preserve">La primera y principal responsabilidad de una Jefatura de Departamento consiste en optimizar los recursos existentes antes de requerir nuevas incorporaciones presupuestarias. Toda la propuesta de trabajo se sustenta en la reorganización de las tareas, la mejora de los procedimientos y el fortalecimiento de la coordinación interna, ejecutando el plan al 100% con la infraestructura y el capital humano actualmente disponibles ($0 costo presupuestario adicional).</w:t>
       </w:r>
     </w:p>
     <w:p>
@@ -2135,7 +2135,7 @@
           <w:sz w:val="24"/>
           <w:szCs w:val="24"/>
         </w:rPr>
-        <w:t xml:space="preserve">7.1 Escenario SIN PRESUPUESTO (Plan Realista - Costo $0)</w:t>
+        <w:t xml:space="preserve">7.1 Ejecución del Plan con Recursos Actuales (Escenario Real - Costo $0)</w:t>
       </w:r>
     </w:p>
     <w:p>
@@ -2211,7 +2211,12 @@
           <w:sz w:val="24"/>
           <w:szCs w:val="24"/>
         </w:rPr>
-        <w:t xml:space="preserve">7.2 Escenario CON PRESUPUESTO (Plan Proyectado a Mediano/Largo Plazo)</w:t>
+        <w:t xml:space="preserve">7.2 Proyección Futura de Mediano/Largo Plazo (Incorporación Eventual de Recursos)</w:t>
+      </w:r>
+    </w:p>
+    <w:p>
+      <w:r>
+        <w:t xml:space="preserve">Solo para el caso en que las autoridades decidan en el futuro destinar partidas específicas de inversión tecnológica, el Departamento deja proyectadas las siguientes líneas de evolución suplementaria, las cuales no condicionan el cumplimiento de los objetivos centrales del Plan:</w:t>
       </w:r>
     </w:p>
     <w:p>

</xml_diff>

<commit_message>
Estructura fluida: Sección 5 (Sin presupuesto) explayada y Sección 6 (Con presupuesto) explayada sin montos fijos
</commit_message>
<xml_diff>
--- a/Plan_Trabajo_Jefatura_Software_Version_Director.docx
+++ b/Plan_Trabajo_Jefatura_Software_Version_Director.docx
@@ -122,7 +122,7 @@
           <w:sz w:val="22"/>
           <w:szCs w:val="22"/>
         </w:rPr>
-        <w:t xml:space="preserve">Diagnóstico Integral y Propuesta de Mejora para el Funcionamiento del Departamento de Gestión, Desarrollo e Innovación en Sistemas de Software: Optimización con Recursos Actuales y Proyección de Mediano y Largo Plazo</w:t>
+        <w:t xml:space="preserve">Diagnóstico Integral y Propuesta de Mejora para el Funcionamiento del Departamento de Gestión, Desarrollo e Innovación en Sistemas de Software: Optimización con Recursos Actuales y Proyección con Incorporación de Recursos</w:t>
       </w:r>
     </w:p>
     <w:p/>
@@ -247,7 +247,7 @@
     </w:p>
     <w:p>
       <w:r>
-        <w:t xml:space="preserve">En consecuencia, este Plan de Trabajo propone un modelo de gestión basado estrictamente en la optimización de los recursos existentes ($0 costo presupuestario), que combina liderazgo participativo, organización por procesos, gobierno técnico, gestión del conocimiento e innovación tecnológica, con el objetivo de consolidar un Departamento capaz de responder a las necesidades presentes y garantizar la continuidad y sostenibilidad de sus sistemas más allá de las personas o los cambios de gestión.</w:t>
+        <w:t xml:space="preserve">En consecuencia, este Plan de Trabajo propone una estrategia integral articulada en dos etapas consecutivas: por un lado, una propuesta de mejora basada en la optimización de los recursos actuales (sin presupuesto adicional, $0 costo), y por otro lado, una proyección con incorporación de recursos para cuando la Administración disponga de partidas de inversión tecnológica, sin fijar montos estáticos sino líneas de adquisición escalables.</w:t>
       </w:r>
     </w:p>
     <w:p>
@@ -337,7 +337,7 @@
     </w:p>
     <w:p>
       <w:r>
-        <w:t xml:space="preserve">A partir de estos ejes se desarrolla el diagnóstico de la situación actual y se presentan propuestas de mejora ejecutables con los recursos actualmente disponibles en el Municipio.</w:t>
+        <w:t xml:space="preserve">A partir de estos ejes se desarrolla el diagnóstico de la situación actual y se presentan propuestas de mejora diferenciadas entre las que pueden implementarse con los recursos existentes y las que proyectan incorporación de inversión futura.</w:t>
       </w:r>
     </w:p>
     <w:p/>
@@ -728,12 +728,12 @@
     </w:p>
     <w:p>
       <w:r>
-        <w:t xml:space="preserve">Del análisis realizado surge que el principal desafío del Departamento no radica en solicitar mayores presupuestos ni incorporar tecnologías complejas, sino en fortalecer su capacidad organizacional para gestionar de manera eficiente el conocimiento, coordinar los recursos disponibles y establecer procedimientos comunes que permitan responder con mayor previsibilidad a las necesidades de la Administración Municipal.</w:t>
-      </w:r>
-    </w:p>
-    <w:p>
-      <w:r>
-        <w:t xml:space="preserve">En consecuencia, la propuesta prioriza la consolidación de un modelo de gestión orientado a las personas, la mejora de los procesos y la planificación estratégica del trabajo con los recursos actuales ($0 costo adicional), utilizando la innovación tecnológica como un medio para potenciar la capacidad institucional del Departamento.</w:t>
+        <w:t xml:space="preserve">Del análisis realizado surge que el principal desafío del Departamento no radica exclusivamente en solicitar mayores presupuestos ni incorporar tecnologías complejas, sino en fortalecer su capacidad organizacional para gestionar de manera eficiente el conocimiento, coordinar los recursos disponibles y establecer procedimientos comunes que permitan responder con mayor previsibilidad a las necesidades de la Administración Municipal.</w:t>
+      </w:r>
+    </w:p>
+    <w:p>
+      <w:r>
+        <w:t xml:space="preserve">En consecuencia, la propuesta prioriza la consolidación de un modelo de gestión orientado a las personas, la mejora de los procesos y la planificación estratégica del trabajo con los recursos actuales ($0 costo adicional), proyectando complementariamente la incorporación gradual de recursos cuando existan partidas disponibles.</w:t>
       </w:r>
     </w:p>
     <w:p/>
@@ -1045,7 +1045,7 @@
           <w:sz w:val="28"/>
           <w:szCs w:val="28"/>
         </w:rPr>
-        <w:t xml:space="preserve">5. PROPUESTA DE MEJORA Y OPTIMIZACIÓN CON RECURSOS ACTUALES</w:t>
+        <w:t xml:space="preserve">5. PROPUESTA DE MEJORA Y OPTIMIZACIÓN CON RECURSOS ACTUALES (ESCENARIO SIN PRESUPUESTO - COSTO $0)</w:t>
       </w:r>
     </w:p>
     <w:p>
@@ -1055,7 +1055,7 @@
     </w:p>
     <w:p>
       <w:r>
-        <w:t xml:space="preserve">En este contexto, se propone una estrategia de mejora basada exclusivamente en la optimización de los recursos actualmente disponibles ($0 costo adicional), priorizando acciones que puedan implementarse sin requerir modificaciones en la estructura orgánica ni incorporaciones inmediatas de personal ni erogaciones presupuestarias extra. El objetivo es fortalecer el funcionamiento del Departamento mediante la definición de procesos comunes, la mejora de la planificación, la estandarización técnica y una conducción activa por parte de la Jefatura, dando cumplimiento a los deberes administrativos (40 hs semanales de dedicación, gestión de personal, bienes de la dependencia y anteproyecto presupuestario anual).</w:t>
+        <w:t xml:space="preserve">En este contexto, se propone una estrategia de mejora basada exclusivamente en la optimización de los recursos actualmente disponibles, priorizando acciones que puedan implementarse sin requerir modificaciones en la estructura orgánica ni incorporaciones inmediatas de personal ni partidas presupuestarias adicionales ($0 costo). El objetivo es fortalecer el funcionamiento del Departamento mediante la definición de procesos comunes, la mejora de la planificación, la estandarización técnica y una conducción activa por parte de la Jefatura, dando cumplimiento a los deberes administrativos (40 hs semanales de dedicación, gestión de personal, bienes de la dependencia y anteproyecto presupuestario anual).</w:t>
       </w:r>
     </w:p>
     <w:p>
@@ -1244,7 +1244,7 @@
     </w:p>
     <w:p>
       <w:r>
-        <w:t xml:space="preserve">La implementación de esta medida permitirá disminuir el riesgo operativo asociado a la dependencia de personas específicas, mejorar la capacidad de respuesta frente a contingencias y favorecer el crecimiento profesional de los integrantes del Departamento mediante una capacitación continua basada en la experiencia práctica. Asimismo, la existencia de referentes secundarios facilitará la redistribución de tareas cuando las necesidades operativas lo requieran, otorgando mayor flexibilidad a la planificación y fortaleciendo la resiliencia organizacional del área.</w:t>
+        <w:t xml:space="preserve">La implementación de esta medida permitirá disminuir el riesgo operativo asociado a la dependencia de personas específicas, mejorar la capacidad de respuesta frente a contingencias y favorecer el crecimiento profesional de los integrantes del Departamento mediante una capacitación continua basada en la experiencia práctica. Asimismo, la existencia de referentes secundarios facilitará la redistribución de tareas cuando las necesidades operativas lo requieran, otorgando mayor flexibilidad a la planificación y fortalecimiento de la resiliencia organizacional del área.</w:t>
       </w:r>
     </w:p>
     <w:p/>
@@ -1660,9 +1660,20 @@
           <w:sz w:val="28"/>
           <w:szCs w:val="28"/>
         </w:rPr>
-        <w:t xml:space="preserve">6. EJES ESTRATÉGICOS DE LA GESTIÓN</w:t>
-      </w:r>
-    </w:p>
+        <w:t xml:space="preserve">6. PROYECCIÓN CON INCORPORACIÓN DE RECURSOS (ESCENARIO CON PRESUPUESTO - MEDIANO Y LARGO PLAZO)</w:t>
+      </w:r>
+    </w:p>
+    <w:p>
+      <w:r>
+        <w:t xml:space="preserve">La optimización de los recursos actuales constituye el paso obligatorio previo a cualquier solicitud presupuestaria. Sin embargo, para acompañar de manera sostenible el proceso de transformación digital de la Municipalidad de General Pueyrredon, resulta necesario proyectar una Hoja de Ruta de incorporación gradual de recursos tecnológicos y de formación especializada.</w:t>
+      </w:r>
+    </w:p>
+    <w:p>
+      <w:r>
+        <w:t xml:space="preserve">Esta proyección no se sustenta en montos presupuestarios fijos ni estáticos, sino en ejes de inversión modulares y escalables que podrán ejecutarse en la medida en que la Administración Municipal disponga de partidas financieras o financiamiento externo. A continuación se desarrollan las propuestas de mejora que requieren inversión tecnológica suplementaria.</w:t>
+      </w:r>
+    </w:p>
+    <w:p/>
     <w:p>
       <w:pPr>
         <w:pStyle w:val="Heading2"/>
@@ -1675,12 +1686,202 @@
           <w:sz w:val="24"/>
           <w:szCs w:val="24"/>
         </w:rPr>
-        <w:t xml:space="preserve">EJE I: Gestión del Capital Humano y Desarrollo del Equipo</w:t>
-      </w:r>
-    </w:p>
-    <w:p>
-      <w:r>
-        <w:t xml:space="preserve">Las personas constituyen el principal activo del Departamento. La función de la Jefatura será generar un entorno de trabajo que favorezca la colaboración y el crecimiento profesional.</w:t>
+        <w:t xml:space="preserve">6.1 Adopción de Licencias Corporativas Oficiales de IA y Entornos Privados</w:t>
+      </w:r>
+    </w:p>
+    <w:p>
+      <w:r>
+        <w:t xml:space="preserve">El uso asistido de Inteligencia Artificial en el desarrollo de software ha demostrado elevados índices de productividad en la generación de código, refactorización y documentación automatizada. No obstante, la utilización de versiones gratuitas o públicas presenta limitaciones de procesamiento y potenciales riesgos de resguardo de datos si no se cuenta con plataformas administradas centralmente.</w:t>
+      </w:r>
+    </w:p>
+    <w:p>
+      <w:r>
+        <w:t xml:space="preserve">Se propone proyectar la incorporación de licencias corporativas oficiales (ej. GitHub Copilot Enterprise, OpenAI Enterprise o similares) integradas directamente a los entornos de desarrollo (IDEs) de los programadores, bajo un contrato de tenant privado donde los modelos no se entrenen con el código municipal.</w:t>
+      </w:r>
+    </w:p>
+    <w:p>
+      <w:r>
+        <w:t xml:space="preserve">La Jefatura administrará la asignación centralizada de licencias, supervisará las métricas de adopción técnica y velará por el cumplimiento de los protocolos de seguridad de la información.</w:t>
+      </w:r>
+    </w:p>
+    <w:p>
+      <w:r>
+        <w:t xml:space="preserve">Con esta inversión se proyecta un incremento sustancial en la velocidad de entrega de los proyectos, la automatización de la documentación técnica y un resguardo absoluto del patrimonio de software municipal.</w:t>
+      </w:r>
+    </w:p>
+    <w:p/>
+    <w:p>
+      <w:pPr>
+        <w:pStyle w:val="Heading2"/>
+      </w:pPr>
+      <w:r>
+        <w:rPr>
+          <w:rFonts w:ascii="Arial" w:cs="Arial" w:eastAsia="Arial" w:hAnsi="Arial"/>
+          <w:b/>
+          <w:bCs/>
+          <w:sz w:val="24"/>
+          <w:szCs w:val="24"/>
+        </w:rPr>
+        <w:t xml:space="preserve">6.2 Plataforma Automatizada de Análisis Estático de Calidad y Deuda Técnica (SonarQube)</w:t>
+      </w:r>
+    </w:p>
+    <w:p>
+      <w:r>
+        <w:t xml:space="preserve">La revisión manual entre pares (peer review) en GitLab es una práctica altamente efectiva en el escenario de $0 presupuesto, pero resulta limitada a la hora de auditar volumen masivo de código o detectar vulnerabilidades complejas de ciberseguridad escondidas en librerías de terceros.</w:t>
+      </w:r>
+    </w:p>
+    <w:p>
+      <w:r>
+        <w:t xml:space="preserve">Se propone la adquisición e implementación de un servidor dedicado con una plataforma de análisis estático de código (ej. SonarQube Enterprise), integrada de forma automatizada a los pipelines de integración continua (CI/CD) de GitLab. Cada commit o solicitud de fusión de código será escaneado en tiempo real, evaluando deuda técnica, mantenibilidad, cobertura de pruebas y vulnerabilidades de acuerdo a estándares internacionales OWASP.</w:t>
+      </w:r>
+    </w:p>
+    <w:p>
+      <w:r>
+        <w:t xml:space="preserve">La Jefatura definirá los umbrales de calidad (Quality Gates) obligatorios que deberá superar el software para autorizar su pasaje a producción, analizando los reportes periódicos para planificar refactorizaciones de sistemas legados.</w:t>
+      </w:r>
+    </w:p>
+    <w:p>
+      <w:r>
+        <w:t xml:space="preserve">La adopción de esta plataforma garantizará la entrega de código libre de fallas de seguridad críticas y una reducción drástica en la tasa de defectos reportados por usuarios en producción.</w:t>
+      </w:r>
+    </w:p>
+    <w:p/>
+    <w:p>
+      <w:pPr>
+        <w:pStyle w:val="Heading2"/>
+      </w:pPr>
+      <w:r>
+        <w:rPr>
+          <w:rFonts w:ascii="Arial" w:cs="Arial" w:eastAsia="Arial" w:hAnsi="Arial"/>
+          <w:b/>
+          <w:bCs/>
+          <w:sz w:val="24"/>
+          <w:szCs w:val="24"/>
+        </w:rPr>
+        <w:t xml:space="preserve">6.3 Contenerización de Aplicaciones e Infraestructura Escotada (Docker / Kubernetes)</w:t>
+      </w:r>
+    </w:p>
+    <w:p>
+      <w:r>
+        <w:t xml:space="preserve">La coexistencia de aplicaciones sobre distintos servidores físicos o virtuales genera frecuentes inconsistencias entre los entornos de desarrollo, prueba y producción, encareciendo el mantenimiento y dificultando la puesta en producción rápida de nuevos aplicativos.</w:t>
+      </w:r>
+    </w:p>
+    <w:p>
+      <w:r>
+        <w:t xml:space="preserve">Se proyecta la incorporación de infraestructura y licencias necesarias para implementar un esquema de contenerización estandarizada mediante Docker y orquestación con Kubernetes/Rancher, en coordinación directa con el área de Infraestructura y Redes. Cada sistema municipal se desplegará dentro de su propio contenedor aislado con todas sus dependencias preconfiguradas.</w:t>
+      </w:r>
+    </w:p>
+    <w:p>
+      <w:r>
+        <w:t xml:space="preserve">La Jefatura coordinará el plan de migración gradual de los sistemas hacia arquitecturas de contenedores y capacitará al personal en la gestión y empaquetamiento de imágenes de software.</w:t>
+      </w:r>
+    </w:p>
+    <w:p>
+      <w:r>
+        <w:t xml:space="preserve">La contenerización eliminará definitivamente las fallas por diferencias de servidor, agilizará los despliegues a minutos sin interrupción del servicio y optimizará el uso de la infraestructura tecnológica del Municipio.</w:t>
+      </w:r>
+    </w:p>
+    <w:p/>
+    <w:p>
+      <w:pPr>
+        <w:pStyle w:val="Heading2"/>
+      </w:pPr>
+      <w:r>
+        <w:rPr>
+          <w:rFonts w:ascii="Arial" w:cs="Arial" w:eastAsia="Arial" w:hAnsi="Arial"/>
+          <w:b/>
+          <w:bCs/>
+          <w:sz w:val="24"/>
+          <w:szCs w:val="24"/>
+        </w:rPr>
+        <w:t xml:space="preserve">6.4 Programa Formal de Capacitación Técnica Externa Especializada</w:t>
+      </w:r>
+    </w:p>
+    <w:p>
+      <w:r>
+        <w:t xml:space="preserve">La formación técnica continua resulta indispensable en un área de desarrollo de software. Si bien la nivelación interna entre agentes es la base del escenario con recursos actuales, existen temáticas avanzadas de arquitectura y seguridad que requieren capacitación dictada por instituciones especializadas.</w:t>
+      </w:r>
+    </w:p>
+    <w:p>
+      <w:r>
+        <w:t xml:space="preserve">Se propone elaborar un programa anual presupuestado de capacitación externa acreditada, enfocado en cursos y certificaciones profesionales sobre Clean Architecture, patrones de diseño de microservicios, seguridad en APIs RESTful, administración de bases de datos relacionales a gran escala y marcos ágiles avanzadas.</w:t>
+      </w:r>
+    </w:p>
+    <w:p>
+      <w:r>
+        <w:t xml:space="preserve">La Jefatura priorizará la asignación de las capacitaciones sobre la base de la Matriz de Competencias del Departamento, elevando los requerimientos al anteproyecto de presupuesto anual y exigiendo que los agentes capacitados realicen talleres de transferencia interna para el resto del equipo.</w:t>
+      </w:r>
+    </w:p>
+    <w:p>
+      <w:r>
+        <w:t xml:space="preserve">Este programa asegurará la actualización profesional del personal, la adopción de prácticas de desarrollo de estándar internacional y un elevado incentivo para el crecimiento dentro de la carrera municipal.</w:t>
+      </w:r>
+    </w:p>
+    <w:p/>
+    <w:p>
+      <w:pPr>
+        <w:pStyle w:val="Heading2"/>
+      </w:pPr>
+      <w:r>
+        <w:rPr>
+          <w:rFonts w:ascii="Arial" w:cs="Arial" w:eastAsia="Arial" w:hAnsi="Arial"/>
+          <w:b/>
+          <w:bCs/>
+          <w:sz w:val="24"/>
+          <w:szCs w:val="24"/>
+        </w:rPr>
+        <w:t xml:space="preserve">6.5 Equipamiento Tecnológico para Trabajo Colaborativo y Comunicación Remota</w:t>
+      </w:r>
+    </w:p>
+    <w:p>
+      <w:r>
+        <w:t xml:space="preserve">La dispersión del personal en distintas dependencias físicas exige contar con herramientas de comunicación fluidas que eviten el aislamiento y permitan coordinar reuniones inter-oficinas sin necesidad de traslados permanentes.</w:t>
+      </w:r>
+    </w:p>
+    <w:p>
+      <w:r>
+        <w:t xml:space="preserve">Se proyecta la adquisición de equipamiento periférico adecuado (cámaras web HD, auriculares de alta fidelidad con cancelación de ruido, dobles monitores para desarrollo) y la adecuación de un espacio con pantalla y sistema de videoconferencia para las reuniones de equipo entre ambas sedes.</w:t>
+      </w:r>
+    </w:p>
+    <w:p>
+      <w:r>
+        <w:t xml:space="preserve">La Jefatura mantendrá actualizado el cargo patrimonial de los elementos asignados a la dependencia, velando por su correcto uso, conservación y distribución estratégica según las necesidades operativas de cada puesto.</w:t>
+      </w:r>
+    </w:p>
+    <w:p>
+      <w:r>
+        <w:t xml:space="preserve">Con este equipamiento se garantizará la fluidez de las reuniones periódicas de sincronización, mejorando la colaboración y eliminando las barreras de distancia entre los grupos de trabajo.</w:t>
+      </w:r>
+    </w:p>
+    <w:p/>
+    <w:p>
+      <w:pPr>
+        <w:pStyle w:val="Heading1"/>
+      </w:pPr>
+      <w:r>
+        <w:rPr>
+          <w:rFonts w:ascii="Arial" w:cs="Arial" w:eastAsia="Arial" w:hAnsi="Arial"/>
+          <w:b/>
+          <w:bCs/>
+          <w:sz w:val="28"/>
+          <w:szCs w:val="28"/>
+        </w:rPr>
+        <w:t xml:space="preserve">7. ESTRATEGIA DE IMPLEMENTACIÓN Y ROADMAP POR ETAPAS</w:t>
+      </w:r>
+    </w:p>
+    <w:p>
+      <w:pPr>
+        <w:pStyle w:val="Heading2"/>
+      </w:pPr>
+      <w:r>
+        <w:rPr>
+          <w:rFonts w:ascii="Arial" w:cs="Arial" w:eastAsia="Arial" w:hAnsi="Arial"/>
+          <w:b/>
+          <w:bCs/>
+          <w:sz w:val="24"/>
+          <w:szCs w:val="24"/>
+        </w:rPr>
+        <w:t xml:space="preserve">7.1 Fases de la Hoja de Ruta Ágil</w:t>
       </w:r>
     </w:p>
     <w:p>
@@ -1696,10 +1897,10 @@
           <w:b/>
           <w:bCs/>
         </w:rPr>
-        <w:t xml:space="preserve">6.1 Comunicación y coordinación permanente: </w:t>
-      </w:r>
-      <w:r>
-        <w:t xml:space="preserve">Reuniones breves de coordinación transversal entre ambas sedes físicas y uso de herramientas comunes para mantener la visibilidad del trabajo.</w:t>
+        <w:t xml:space="preserve">Etapa I – Conocer y Ordenar (Sprints 1 a 4): </w:t>
+      </w:r>
+      <w:r>
+        <w:t xml:space="preserve">Relevamiento de competencias, inventario de sistemas, conformación de la Cartera Única en Redmine y asignación de Referentes Secundarios.</w:t>
       </w:r>
     </w:p>
     <w:p>
@@ -1715,10 +1916,10 @@
           <w:b/>
           <w:bCs/>
         </w:rPr>
-        <w:t xml:space="preserve">6.2 Desarrollo de competencias y Matriz de Competencias: </w:t>
-      </w:r>
-      <w:r>
-        <w:t xml:space="preserve">Relevamiento integral del personal para construir una Matriz de Competencias que distinga entre capacidad técnica y conocimiento funcional del trámite municipal, planificando capacitaciones en servicio.</w:t>
+        <w:t xml:space="preserve">Etapa II – Integrar y Estandarizar (Sprints 5 a 12): </w:t>
+      </w:r>
+      <w:r>
+        <w:t xml:space="preserve">Reuniones transversales inter-oficinas, difusión de guías de buenas prácticas, obligatoriedad del template de arquitectura y gobierno técnico de proveedores.</w:t>
       </w:r>
     </w:p>
     <w:p>
@@ -1734,10 +1935,10 @@
           <w:b/>
           <w:bCs/>
         </w:rPr>
-        <w:t xml:space="preserve">6.3 Transferencia del conocimiento (Referentes Secundarios): </w:t>
-      </w:r>
-      <w:r>
-        <w:t xml:space="preserve">Designación de un Referente Secundario en sistemas críticos que acompañe al responsable principal (shadowing), garantizando continuidad operativa sin tocar el escalafón.</w:t>
+        <w:t xml:space="preserve">Etapa III – Consolidar y Evaluar (Sprints 13+): </w:t>
+      </w:r>
+      <w:r>
+        <w:t xml:space="preserve">Medición de KPIs, revisiones de código en GitLab y evaluación de proyectos de contenerización.</w:t>
       </w:r>
     </w:p>
     <w:p>
@@ -1753,10 +1954,10 @@
           <w:b/>
           <w:bCs/>
         </w:rPr>
-        <w:t xml:space="preserve">6.4 Cultura de trabajo colaborativo: </w:t>
-      </w:r>
-      <w:r>
-        <w:t xml:space="preserve">Espacios de participación para que los desarrolladores propongan mejoras operativas y técnicas.</w:t>
+        <w:t xml:space="preserve">Proceso Permanente – Mejora Continua: </w:t>
+      </w:r>
+      <w:r>
+        <w:t xml:space="preserve">Auditorías periódicas de procedimientos, actualización de capacitaciones y evaluación de innovaciones.</w:t>
       </w:r>
     </w:p>
     <w:p/>
@@ -1772,634 +1973,7 @@
           <w:sz w:val="24"/>
           <w:szCs w:val="24"/>
         </w:rPr>
-        <w:t xml:space="preserve">EJE II: Gestión del Conocimiento y Organización del Trabajo</w:t>
-      </w:r>
-    </w:p>
-    <w:p>
-      <w:pPr>
-        <w:pStyle w:val="ListParagraph"/>
-        <w:numPr>
-          <w:ilvl w:val="0"/>
-          <w:numId w:val="1"/>
-        </w:numPr>
-      </w:pPr>
-      <w:r>
-        <w:rPr>
-          <w:b/>
-          <w:bCs/>
-        </w:rPr>
-        <w:t xml:space="preserve">6.5 Documentación Mínima y Útil: </w:t>
-      </w:r>
-      <w:r>
-        <w:t xml:space="preserve">Definición de un estándar de documentación funcional, técnica y de despliegue proporcional a la criticidad del sistema, integrado al proceso normal de entrega (Definition of Done).</w:t>
-      </w:r>
-    </w:p>
-    <w:p>
-      <w:pPr>
-        <w:pStyle w:val="ListParagraph"/>
-        <w:numPr>
-          <w:ilvl w:val="0"/>
-          <w:numId w:val="1"/>
-        </w:numPr>
-      </w:pPr>
-      <w:r>
-        <w:rPr>
-          <w:b/>
-          <w:bCs/>
-        </w:rPr>
-        <w:t xml:space="preserve">6.6 Arquitectura Base Institucional: </w:t>
-      </w:r>
-      <w:r>
-        <w:t xml:space="preserve">Institucionalización obligatoria de un template de arquitectura en capas (APIs, acceso a datos, manejo de errores, seguridad) para todos los desarrollos nuevos y mantenimiento del Modelo Único de Datos.</w:t>
-      </w:r>
-    </w:p>
-    <w:p>
-      <w:pPr>
-        <w:pStyle w:val="ListParagraph"/>
-        <w:numPr>
-          <w:ilvl w:val="0"/>
-          <w:numId w:val="1"/>
-        </w:numPr>
-      </w:pPr>
-      <w:r>
-        <w:rPr>
-          <w:b/>
-          <w:bCs/>
-        </w:rPr>
-        <w:t xml:space="preserve">6.7 Cartera Única de Proyectos en Redmine: </w:t>
-      </w:r>
-      <w:r>
-        <w:t xml:space="preserve">Registro centralizado de todas las solicitudes, desarrollos y mantenimientos para visibilizar la carga real de trabajo y priorizar estratégicamente.</w:t>
-      </w:r>
-    </w:p>
-    <w:p/>
-    <w:p>
-      <w:pPr>
-        <w:pStyle w:val="Heading2"/>
-      </w:pPr>
-      <w:r>
-        <w:rPr>
-          <w:rFonts w:ascii="Arial" w:cs="Arial" w:eastAsia="Arial" w:hAnsi="Arial"/>
-          <w:b/>
-          <w:bCs/>
-          <w:sz w:val="24"/>
-          <w:szCs w:val="24"/>
-        </w:rPr>
-        <w:t xml:space="preserve">EJE III: Gobierno Técnico y Calidad del Software</w:t>
-      </w:r>
-    </w:p>
-    <w:p>
-      <w:r>
-        <w:rPr>
-          <w:i/>
-          <w:iCs/>
-        </w:rPr>
-        <w:t xml:space="preserve">La responsabilidad de la Jefatura no consiste únicamente en coordinar personas, sino también en establecer el marco técnico que permita que los distintos equipos desarrollen soluciones homogéneas, seguras y sostenibles. El gobierno técnico constituye el conjunto de políticas, estándares y procedimientos que aseguran que las decisiones tecnológicas respondan a criterios institucionales y no exclusivamente a preferencias individuales.</w:t>
-      </w:r>
-    </w:p>
-    <w:p>
-      <w:pPr>
-        <w:pStyle w:val="ListParagraph"/>
-        <w:numPr>
-          <w:ilvl w:val="0"/>
-          <w:numId w:val="1"/>
-        </w:numPr>
-      </w:pPr>
-      <w:r>
-        <w:rPr>
-          <w:b/>
-          <w:bCs/>
-        </w:rPr>
-        <w:t xml:space="preserve">6.8 Estandarización del ciclo de desarrollo: </w:t>
-      </w:r>
-      <w:r>
-        <w:t xml:space="preserve">Definición clara de etapas: relevamiento, análisis, estimación, desarrollo, testing, implementación y mantenimiento.</w:t>
-      </w:r>
-    </w:p>
-    <w:p>
-      <w:pPr>
-        <w:pStyle w:val="ListParagraph"/>
-        <w:numPr>
-          <w:ilvl w:val="0"/>
-          <w:numId w:val="1"/>
-        </w:numPr>
-      </w:pPr>
-      <w:r>
-        <w:rPr>
-          <w:b/>
-          <w:bCs/>
-        </w:rPr>
-        <w:t xml:space="preserve">6.9 Estándares de codificación y buenas prácticas: </w:t>
-      </w:r>
-      <w:r>
-        <w:t xml:space="preserve">Guías institucionales de estilo de código, convenciones de nomenclatura y estructura de proyectos.</w:t>
-      </w:r>
-    </w:p>
-    <w:p>
-      <w:pPr>
-        <w:pStyle w:val="ListParagraph"/>
-        <w:numPr>
-          <w:ilvl w:val="0"/>
-          <w:numId w:val="1"/>
-        </w:numPr>
-      </w:pPr>
-      <w:r>
-        <w:rPr>
-          <w:b/>
-          <w:bCs/>
-        </w:rPr>
-        <w:t xml:space="preserve">6.10 Calidad incorporada y revisión entre pares: </w:t>
-      </w:r>
-      <w:r>
-        <w:t xml:space="preserve">Revisiones cruzadas (peer reviews) en GitLab para cambios críticos y validaciones funcionales antes de producción.</w:t>
-      </w:r>
-    </w:p>
-    <w:p>
-      <w:pPr>
-        <w:pStyle w:val="ListParagraph"/>
-        <w:numPr>
-          <w:ilvl w:val="0"/>
-          <w:numId w:val="1"/>
-        </w:numPr>
-      </w:pPr>
-      <w:r>
-        <w:rPr>
-          <w:b/>
-          <w:bCs/>
-        </w:rPr>
-        <w:t xml:space="preserve">6.11 Seguridad desde el análisis (Security by Design): </w:t>
-      </w:r>
-      <w:r>
-        <w:t xml:space="preserve">Protección de datos, autenticación, gestión de permisos y tratamiento seguro de credenciales.</w:t>
-      </w:r>
-    </w:p>
-    <w:p/>
-    <w:p>
-      <w:pPr>
-        <w:pStyle w:val="Heading2"/>
-      </w:pPr>
-      <w:r>
-        <w:rPr>
-          <w:rFonts w:ascii="Arial" w:cs="Arial" w:eastAsia="Arial" w:hAnsi="Arial"/>
-          <w:b/>
-          <w:bCs/>
-          <w:sz w:val="24"/>
-          <w:szCs w:val="24"/>
-        </w:rPr>
-        <w:t xml:space="preserve">EJE IV: Gestión de Proyectos, Articulación Institucional y Control de Proveedores</w:t>
-      </w:r>
-    </w:p>
-    <w:p>
-      <w:pPr>
-        <w:pStyle w:val="ListParagraph"/>
-        <w:numPr>
-          <w:ilvl w:val="0"/>
-          <w:numId w:val="1"/>
-        </w:numPr>
-      </w:pPr>
-      <w:r>
-        <w:rPr>
-          <w:b/>
-          <w:bCs/>
-        </w:rPr>
-        <w:t xml:space="preserve">6.12 Relevamiento integral y viabilidad: </w:t>
-      </w:r>
-      <w:r>
-        <w:t xml:space="preserve">Análisis de factibilidad técnica e impacto institucional antes de autorizar un desarrollo.</w:t>
-      </w:r>
-    </w:p>
-    <w:p>
-      <w:pPr>
-        <w:pStyle w:val="ListParagraph"/>
-        <w:numPr>
-          <w:ilvl w:val="0"/>
-          <w:numId w:val="1"/>
-        </w:numPr>
-      </w:pPr>
-      <w:r>
-        <w:rPr>
-          <w:b/>
-          <w:bCs/>
-        </w:rPr>
-        <w:t xml:space="preserve">6.13 Priorización objetiva de demandas: </w:t>
-      </w:r>
-      <w:r>
-        <w:t xml:space="preserve">Asignación de recursos basada en criticidad, urgencia, normativas y capacidad real.</w:t>
-      </w:r>
-    </w:p>
-    <w:p>
-      <w:pPr>
-        <w:pStyle w:val="ListParagraph"/>
-        <w:numPr>
-          <w:ilvl w:val="0"/>
-          <w:numId w:val="1"/>
-        </w:numPr>
-      </w:pPr>
-      <w:r>
-        <w:rPr>
-          <w:b/>
-          <w:bCs/>
-        </w:rPr>
-        <w:t xml:space="preserve">6.14 Gobierno técnico de proveedores externos: </w:t>
-      </w:r>
-      <w:r>
-        <w:t xml:space="preserve">Auditoría de entregables, participación en pliegos, exigencia de código fuente, documentación y pruebas de recepción validadas por el Municipio.</w:t>
-      </w:r>
-    </w:p>
-    <w:p>
-      <w:pPr>
-        <w:pStyle w:val="ListParagraph"/>
-        <w:numPr>
-          <w:ilvl w:val="0"/>
-          <w:numId w:val="1"/>
-        </w:numPr>
-      </w:pPr>
-      <w:r>
-        <w:rPr>
-          <w:b/>
-          <w:bCs/>
-        </w:rPr>
-        <w:t xml:space="preserve">6.15 Gestión de la relación con las áreas usuarias: </w:t>
-      </w:r>
-      <w:r>
-        <w:t xml:space="preserve">Fortalecimiento del rol de la Jefatura como nexo institucional con las Secretarías solicitantes mediante entrevistas funcionales, priorización conjunta, validaciones parciales y gestión compartida de expectativas.</w:t>
-      </w:r>
-    </w:p>
-    <w:p/>
-    <w:p>
-      <w:pPr>
-        <w:pStyle w:val="Heading2"/>
-      </w:pPr>
-      <w:r>
-        <w:rPr>
-          <w:rFonts w:ascii="Arial" w:cs="Arial" w:eastAsia="Arial" w:hAnsi="Arial"/>
-          <w:b/>
-          <w:bCs/>
-          <w:sz w:val="24"/>
-          <w:szCs w:val="24"/>
-        </w:rPr>
-        <w:t xml:space="preserve">EJE V: Innovación Tecnológica Responsable e Inteligencia Artificial</w:t>
-      </w:r>
-    </w:p>
-    <w:p>
-      <w:pPr>
-        <w:pStyle w:val="ListParagraph"/>
-        <w:numPr>
-          <w:ilvl w:val="0"/>
-          <w:numId w:val="1"/>
-        </w:numPr>
-      </w:pPr>
-      <w:r>
-        <w:rPr>
-          <w:b/>
-          <w:bCs/>
-        </w:rPr>
-        <w:t xml:space="preserve">6.16 Pautas de seguridad para asistentes de IA: </w:t>
-      </w:r>
-      <w:r>
-        <w:t xml:space="preserve">Guía de uso responsable de herramientas asistidas por IA como apoyo a la programación y documentación, prohibiendo estrictamente la carga de credenciales, claves de bases de datos o datos personales de ciudadanos en plataformas públicas.</w:t>
-      </w:r>
-    </w:p>
-    <w:p>
-      <w:pPr>
-        <w:pStyle w:val="ListParagraph"/>
-        <w:numPr>
-          <w:ilvl w:val="0"/>
-          <w:numId w:val="1"/>
-        </w:numPr>
-      </w:pPr>
-      <w:r>
-        <w:rPr>
-          <w:b/>
-          <w:bCs/>
-        </w:rPr>
-        <w:t xml:space="preserve">6.17 Contenerización y modernización progresiva: </w:t>
-      </w:r>
-      <w:r>
-        <w:t xml:space="preserve">Introducción gradual de paquetes estandarizados (Docker) en sinergia con el área de Infraestructura/Redes para simplificar los despliegues.</w:t>
-      </w:r>
-    </w:p>
-    <w:p>
-      <w:pPr>
-        <w:pStyle w:val="ListParagraph"/>
-        <w:numPr>
-          <w:ilvl w:val="0"/>
-          <w:numId w:val="1"/>
-        </w:numPr>
-      </w:pPr>
-      <w:r>
-        <w:rPr>
-          <w:b/>
-          <w:bCs/>
-        </w:rPr>
-        <w:t xml:space="preserve">6.18 Evaluación de licencias corporativas e innovación: </w:t>
-      </w:r>
-      <w:r>
-        <w:t xml:space="preserve">Análisis fundamentado de la incorporación futura de herramientas avanzadas según el valor real aportado al Municipio.</w:t>
-      </w:r>
-    </w:p>
-    <w:p/>
-    <w:p>
-      <w:pPr>
-        <w:pStyle w:val="Heading1"/>
-      </w:pPr>
-      <w:r>
-        <w:rPr>
-          <w:rFonts w:ascii="Arial" w:cs="Arial" w:eastAsia="Arial" w:hAnsi="Arial"/>
-          <w:b/>
-          <w:bCs/>
-          <w:sz w:val="28"/>
-          <w:szCs w:val="28"/>
-        </w:rPr>
-        <w:t xml:space="preserve">7. PROPUESTA DE MEJORA Y OPTIMIZACIÓN DE RECURSOS</w:t>
-      </w:r>
-    </w:p>
-    <w:p>
-      <w:r>
-        <w:rPr>
-          <w:i/>
-          <w:iCs/>
-        </w:rPr>
-        <w:t xml:space="preserve">La primera y principal responsabilidad de una Jefatura de Departamento consiste en optimizar los recursos existentes antes de requerir nuevas incorporaciones presupuestarias. Toda la propuesta de trabajo se sustenta en la reorganización de las tareas, la mejora de los procedimientos y el fortalecimiento de la coordinación interna, ejecutando el plan al 100% con la infraestructura y el capital humano actualmente disponibles ($0 costo presupuestario adicional).</w:t>
-      </w:r>
-    </w:p>
-    <w:p>
-      <w:pPr>
-        <w:pStyle w:val="Heading2"/>
-      </w:pPr>
-      <w:r>
-        <w:rPr>
-          <w:rFonts w:ascii="Arial" w:cs="Arial" w:eastAsia="Arial" w:hAnsi="Arial"/>
-          <w:b/>
-          <w:bCs/>
-          <w:sz w:val="24"/>
-          <w:szCs w:val="24"/>
-        </w:rPr>
-        <w:t xml:space="preserve">7.1 Ejecución del Plan con Recursos Actuales (Escenario Real - Costo $0)</w:t>
-      </w:r>
-    </w:p>
-    <w:p>
-      <w:r>
-        <w:rPr>
-          <w:b/>
-          <w:bCs/>
-        </w:rPr>
-        <w:t xml:space="preserve">1. Liderazgo Híbrido: </w:t>
-      </w:r>
-      <w:r>
-        <w:t xml:space="preserve">Jefatura como Scrum Master Global (filtro de cargas entre oficinas) y Gestor.</w:t>
-      </w:r>
-    </w:p>
-    <w:p>
-      <w:r>
-        <w:rPr>
-          <w:b/>
-          <w:bCs/>
-        </w:rPr>
-        <w:t xml:space="preserve">2. Mitigación de Puntos Únicos de Falla: </w:t>
-      </w:r>
-      <w:r>
-        <w:t xml:space="preserve">Asignación de Referentes Secundarios en sistemas críticos.</w:t>
-      </w:r>
-    </w:p>
-    <w:p>
-      <w:r>
-        <w:rPr>
-          <w:b/>
-          <w:bCs/>
-        </w:rPr>
-        <w:t xml:space="preserve">3. Estandarización Obligatoria: </w:t>
-      </w:r>
-      <w:r>
-        <w:t xml:space="preserve">Uso del Template de Arquitectura Base municipal (Congelamiento Legacy) y Modelo Único de Datos.</w:t>
-      </w:r>
-    </w:p>
-    <w:p>
-      <w:r>
-        <w:rPr>
-          <w:b/>
-          <w:bCs/>
-        </w:rPr>
-        <w:t xml:space="preserve">4. Gobernanza de Proveedores: </w:t>
-      </w:r>
-      <w:r>
-        <w:t xml:space="preserve">Exigencia de código fuente, manuales y pruebas de recepción antes de la aceptación.</w:t>
-      </w:r>
-    </w:p>
-    <w:p>
-      <w:r>
-        <w:rPr>
-          <w:b/>
-          <w:bCs/>
-        </w:rPr>
-        <w:t xml:space="preserve">5. Uso Seguro de IA: </w:t>
-      </w:r>
-      <w:r>
-        <w:t xml:space="preserve">Protocolo de resguardo de datos sensibles en asistentes de código.</w:t>
-      </w:r>
-    </w:p>
-    <w:p/>
-    <w:p>
-      <w:pPr>
-        <w:pStyle w:val="Heading2"/>
-      </w:pPr>
-      <w:r>
-        <w:rPr>
-          <w:rFonts w:ascii="Arial" w:cs="Arial" w:eastAsia="Arial" w:hAnsi="Arial"/>
-          <w:b/>
-          <w:bCs/>
-          <w:sz w:val="24"/>
-          <w:szCs w:val="24"/>
-        </w:rPr>
-        <w:t xml:space="preserve">7.2 Proyección Futura de Mediano/Largo Plazo (Incorporación Eventual de Recursos)</w:t>
-      </w:r>
-    </w:p>
-    <w:p>
-      <w:r>
-        <w:t xml:space="preserve">Solo para el caso en que las autoridades decidan en el futuro destinar partidas específicas de inversión tecnológica, el Departamento deja proyectadas las siguientes líneas de evolución suplementaria, las cuales no condicionan el cumplimiento de los objetivos centrales del Plan:</w:t>
-      </w:r>
-    </w:p>
-    <w:p>
-      <w:r>
-        <w:rPr>
-          <w:b/>
-          <w:bCs/>
-        </w:rPr>
-        <w:t xml:space="preserve">1. Licencias Corporativas Oficiales de IA: </w:t>
-      </w:r>
-      <w:r>
-        <w:t xml:space="preserve">Adquisición de licencias para IDEs en entornos privados institucionales.</w:t>
-      </w:r>
-    </w:p>
-    <w:p>
-      <w:r>
-        <w:rPr>
-          <w:b/>
-          <w:bCs/>
-        </w:rPr>
-        <w:t xml:space="preserve">2. Plataforma de Análisis Estático de Calidad: </w:t>
-      </w:r>
-      <w:r>
-        <w:t xml:space="preserve">Herramientas automatizadas (ej. SonarQube) para auditar deuda técnica y seguridad.</w:t>
-      </w:r>
-    </w:p>
-    <w:p>
-      <w:r>
-        <w:rPr>
-          <w:b/>
-          <w:bCs/>
-        </w:rPr>
-        <w:t xml:space="preserve">3. Contenerización e Infraestructura: </w:t>
-      </w:r>
-      <w:r>
-        <w:t xml:space="preserve">Proyección presupuestaria para migración a contenedores Docker.</w:t>
-      </w:r>
-    </w:p>
-    <w:p>
-      <w:r>
-        <w:rPr>
-          <w:b/>
-          <w:bCs/>
-        </w:rPr>
-        <w:t xml:space="preserve">4. Capacitación Formal Externa: </w:t>
-      </w:r>
-      <w:r>
-        <w:t xml:space="preserve">Cursos profesionales en Clean Architecture, APIs y Microservicios.</w:t>
-      </w:r>
-    </w:p>
-    <w:p>
-      <w:r>
-        <w:rPr>
-          <w:b/>
-          <w:bCs/>
-        </w:rPr>
-        <w:t xml:space="preserve">5. Equipamiento para Trabajo Colaborativo: </w:t>
-      </w:r>
-      <w:r>
-        <w:t xml:space="preserve">Provisión de webcams y auriculares con micrófono para puestos de trabajo.</w:t>
-      </w:r>
-    </w:p>
-    <w:p/>
-    <w:p>
-      <w:pPr>
-        <w:pStyle w:val="Heading1"/>
-      </w:pPr>
-      <w:r>
-        <w:rPr>
-          <w:rFonts w:ascii="Arial" w:cs="Arial" w:eastAsia="Arial" w:hAnsi="Arial"/>
-          <w:b/>
-          <w:bCs/>
-          <w:sz w:val="28"/>
-          <w:szCs w:val="28"/>
-        </w:rPr>
-        <w:t xml:space="preserve">8. ESTRATEGIA DE IMPLEMENTACIÓN Y ROADMAP POR ETAPAS</w:t>
-      </w:r>
-    </w:p>
-    <w:p>
-      <w:pPr>
-        <w:pStyle w:val="Heading2"/>
-      </w:pPr>
-      <w:r>
-        <w:rPr>
-          <w:rFonts w:ascii="Arial" w:cs="Arial" w:eastAsia="Arial" w:hAnsi="Arial"/>
-          <w:b/>
-          <w:bCs/>
-          <w:sz w:val="24"/>
-          <w:szCs w:val="24"/>
-        </w:rPr>
-        <w:t xml:space="preserve">8.1 Fases de la Hoja de Ruta Ágil</w:t>
-      </w:r>
-    </w:p>
-    <w:p>
-      <w:pPr>
-        <w:pStyle w:val="ListParagraph"/>
-        <w:numPr>
-          <w:ilvl w:val="0"/>
-          <w:numId w:val="1"/>
-        </w:numPr>
-      </w:pPr>
-      <w:r>
-        <w:rPr>
-          <w:b/>
-          <w:bCs/>
-        </w:rPr>
-        <w:t xml:space="preserve">Etapa I – Conocer y Ordenar (Sprints 1 a 4): </w:t>
-      </w:r>
-      <w:r>
-        <w:t xml:space="preserve">Relevamiento de competencias, inventario de sistemas, conformación de la Cartera Única en Redmine y asignación de Referentes Secundarios.</w:t>
-      </w:r>
-    </w:p>
-    <w:p>
-      <w:pPr>
-        <w:pStyle w:val="ListParagraph"/>
-        <w:numPr>
-          <w:ilvl w:val="0"/>
-          <w:numId w:val="1"/>
-        </w:numPr>
-      </w:pPr>
-      <w:r>
-        <w:rPr>
-          <w:b/>
-          <w:bCs/>
-        </w:rPr>
-        <w:t xml:space="preserve">Etapa II – Integrar y Estandarizar (Sprints 5 a 12): </w:t>
-      </w:r>
-      <w:r>
-        <w:t xml:space="preserve">Reuniones transversales inter-oficinas, difusión de guías de buenas prácticas, obligatoriedad del template de arquitectura y gobierno técnico de proveedores.</w:t>
-      </w:r>
-    </w:p>
-    <w:p>
-      <w:pPr>
-        <w:pStyle w:val="ListParagraph"/>
-        <w:numPr>
-          <w:ilvl w:val="0"/>
-          <w:numId w:val="1"/>
-        </w:numPr>
-      </w:pPr>
-      <w:r>
-        <w:rPr>
-          <w:b/>
-          <w:bCs/>
-        </w:rPr>
-        <w:t xml:space="preserve">Etapa III – Consolidar y Evaluar (Sprints 13+): </w:t>
-      </w:r>
-      <w:r>
-        <w:t xml:space="preserve">Medición de KPIs, revisiones de código en GitLab y proyectos de dockerización.</w:t>
-      </w:r>
-    </w:p>
-    <w:p>
-      <w:pPr>
-        <w:pStyle w:val="ListParagraph"/>
-        <w:numPr>
-          <w:ilvl w:val="0"/>
-          <w:numId w:val="1"/>
-        </w:numPr>
-      </w:pPr>
-      <w:r>
-        <w:rPr>
-          <w:b/>
-          <w:bCs/>
-        </w:rPr>
-        <w:t xml:space="preserve">Proceso Permanente – Mejora Continua: </w:t>
-      </w:r>
-      <w:r>
-        <w:t xml:space="preserve">Auditorías periódicas de procedimientos, actualización de capacitaciones y evaluación de innovaciones.</w:t>
-      </w:r>
-    </w:p>
-    <w:p/>
-    <w:p>
-      <w:pPr>
-        <w:pStyle w:val="Heading2"/>
-      </w:pPr>
-      <w:r>
-        <w:rPr>
-          <w:rFonts w:ascii="Arial" w:cs="Arial" w:eastAsia="Arial" w:hAnsi="Arial"/>
-          <w:b/>
-          <w:bCs/>
-          <w:sz w:val="24"/>
-          <w:szCs w:val="24"/>
-        </w:rPr>
-        <w:t xml:space="preserve">8.2 Cuadro Resumen de Implementación</w:t>
+        <w:t xml:space="preserve">7.2 Cuadro Resumen de Implementación</w:t>
       </w:r>
     </w:p>
     <w:tbl>
@@ -2616,7 +2190,7 @@
           <w:sz w:val="28"/>
           <w:szCs w:val="28"/>
         </w:rPr>
-        <w:t xml:space="preserve">9. MATRIZ DE INDICADORES DE EVALUACIÓN Y GESTIÓN (KPIs)</w:t>
+        <w:t xml:space="preserve">8. MATRIZ DE INDICADORES DE EVALUACIÓN Y GESTIÓN (KPIs)</w:t>
       </w:r>
     </w:p>
     <w:tbl>
@@ -2901,7 +2475,7 @@
           <w:sz w:val="28"/>
           <w:szCs w:val="28"/>
         </w:rPr>
-        <w:t xml:space="preserve">10. SECTORES DEL DEPARTAMENTO (MATRIZ DINÁMICA DE TRABAJO)</w:t>
+        <w:t xml:space="preserve">9. SECTORES DEL DEPARTAMENTO (MATRIZ DINÁMICA DE TRABAJO)</w:t>
       </w:r>
     </w:p>
     <w:p>
@@ -2958,7 +2532,7 @@
           <w:sz w:val="28"/>
           <w:szCs w:val="28"/>
         </w:rPr>
-        <w:t xml:space="preserve">11. CONCLUSIONES</w:t>
+        <w:t xml:space="preserve">10. CONCLUSIONES</w:t>
       </w:r>
     </w:p>
     <w:p>
@@ -2973,7 +2547,7 @@
     </w:p>
     <w:p>
       <w:r>
-        <w:t xml:space="preserve">Esta propuesta demuestra cómo es posible transformar la realidad actual mediante el uso inteligente de los recursos disponibles (Escenario REAL $0) y trazar un camino presupuestario sólido para incorporar innovación tecnológica (Escenario IDEAL), asegurando que el patrimonio de software del Municipio sea seguro, duradero y de calidad.</w:t>
+        <w:t xml:space="preserve">Esta propuesta demuestra cómo es posible transformar la realidad actual mediante el uso inteligente de los recursos disponibles (Escenario REAL $0) y trazar un camino presupuestario sólido para incorporar innovación tecnológica de manera modular y no atada a montos fijos (Escenario IDEAL), asegurando que el patrimonio de software del Municipio sea seguro, duradero y de calidad.</w:t>
       </w:r>
     </w:p>
     <w:p>

</xml_diff>

<commit_message>
Actualiza conclusión del diagnóstico (Sección 2.3) integrando IA en IDEs y eliminando lenguaje presupuestario
</commit_message>
<xml_diff>
--- a/Plan_Trabajo_Jefatura_Software_Version_Director.docx
+++ b/Plan_Trabajo_Jefatura_Software_Version_Director.docx
@@ -728,12 +728,12 @@
     </w:p>
     <w:p>
       <w:r>
-        <w:t xml:space="preserve">Del análisis realizado surge que el principal desafío del Departamento no radica exclusivamente en solicitar mayores presupuestos ni incorporar tecnologías complejas, sino en fortalecer su capacidad organizacional para gestionar de manera eficiente el conocimiento, coordinar los recursos disponibles y establecer procedimientos comunes que permitan responder con mayor previsibilidad a las necesidades de la Administración Municipal.</w:t>
-      </w:r>
-    </w:p>
-    <w:p>
-      <w:r>
-        <w:t xml:space="preserve">En consecuencia, la propuesta prioriza la consolidación de un modelo de gestión orientado a las personas, la mejora de los procesos y la planificación estratégica del trabajo con los recursos actuales ($0 costo adicional), proyectando complementariamente la incorporación gradual de recursos cuando existan partidas disponibles.</w:t>
+        <w:t xml:space="preserve">Del análisis realizado surge que el desafío central del Departamento radica en fortalecer su capacidad organizacional para gestionar el conocimiento, coordinar el equipo y establecer procedimientos comunes que otorguen previsibilidad al desarrollo de software municipal.</w:t>
+      </w:r>
+    </w:p>
+    <w:p>
+      <w:r>
+        <w:t xml:space="preserve">En consecuencia, la propuesta prioriza consolidar un modelo de gestión orientado a las personas y los procesos, aprovechando las oportunidades de modernización identificadas en el diagnóstico —como la incorporación asistida de herramientas de Inteligencia Artificial en los entornos de desarrollo (IDEs) y la adopción de arquitecturas de referencia— para elevar la productividad del equipo, optimizar la documentación y garantizar la calidad y sostenibilidad de los sistemas institucionales.</w:t>
       </w:r>
     </w:p>
     <w:p/>

</xml_diff>

<commit_message>
Incorpora puntos 5.8 y 6.5 sobre optimizacion de roles y estructura tecnica
</commit_message>
<xml_diff>
--- a/Plan_Trabajo_Jefatura_Software_Version_Director.docx
+++ b/Plan_Trabajo_Jefatura_Software_Version_Director.docx
@@ -119,25 +119,6 @@
       </w:r>
     </w:p>
     <w:p/>
-    <w:p>
-      <w:pPr>
-        <w:jc w:val="center"/>
-      </w:pPr>
-      <w:r>
-        <w:rPr>
-          <w:i/>
-          <w:iCs/>
-        </w:rPr>
-        <w:t>"Fortaleciendo la gestión del Departamento mediante la organización, el desarrollo de las personas, la estandarización de procesos y la innovación te</w:t>
-      </w:r>
-      <w:r>
-        <w:rPr>
-          <w:i/>
-          <w:iCs/>
-        </w:rPr>
-        <w:t>cnológica al servicio de la Municipalidad."</w:t>
-      </w:r>
-    </w:p>
     <w:p/>
     <w:p>
       <w:r>
@@ -160,8 +141,21 @@
         <w:t xml:space="preserve">Cargo actual: </w:t>
       </w:r>
       <w:r>
-        <w:t>Analista Programador / Personal de Software</w:t>
-      </w:r>
+        <w:t xml:space="preserve">Programador </w:t>
+      </w:r>
+      <w:proofErr w:type="spellStart"/>
+      <w:r>
+        <w:t>Semi</w:t>
+      </w:r>
+      <w:proofErr w:type="spellEnd"/>
+      <w:r>
+        <w:t xml:space="preserve"> </w:t>
+      </w:r>
+      <w:proofErr w:type="spellStart"/>
+      <w:r>
+        <w:t>Senior</w:t>
+      </w:r>
+      <w:proofErr w:type="spellEnd"/>
     </w:p>
     <w:p>
       <w:r>
@@ -172,7 +166,7 @@
         <w:t xml:space="preserve">Legajo: </w:t>
       </w:r>
       <w:r>
-        <w:t>[Completar Legajo]</w:t>
+        <w:t>36484</w:t>
       </w:r>
     </w:p>
     <w:p/>
@@ -246,14 +240,14 @@
         <w:t xml:space="preserve">La Jefatura del Departamento debe desempeñar un rol integrador que </w:t>
       </w:r>
       <w:r>
-        <w:t xml:space="preserve">va más allá de la coordinación técnica de proyectos. Su responsabilidad central consiste en combinar conocimientos técnicos con planificación, conducción de equipos y administración de recursos, </w:t>
+        <w:t>va más allá de la coordinación técnica de proyectos. Su responsabilidad central consiste en combinar conocimientos técnicos con planificación, conducción de equipos y administración de recursos, generando las condiciones organizacionales que permitan al eq</w:t>
+      </w:r>
+      <w:r>
+        <w:t xml:space="preserve">uipo desarrollar software de manera previsible, colaborativa y sostenible, promoviendo la integración entre personas, la reutilización del conocimiento, la adopción responsable de nuevas tecnologías y la mejora </w:t>
       </w:r>
       <w:r>
         <w:lastRenderedPageBreak/>
-        <w:t>generando las condiciones organizacionales que permitan al eq</w:t>
-      </w:r>
-      <w:r>
-        <w:t>uipo desarrollar software de manera previsible, colaborativa y sostenible, promoviendo la integración entre personas, la reutilización del conocimiento, la adopción responsable de nuevas tecnologías y la mejora permanente de los procedimientos internos, co</w:t>
+        <w:t>permanente de los procedimientos internos, co</w:t>
       </w:r>
       <w:r>
         <w:t>n decisiones tecnológicas alineadas a los objetivos institucionales del Municipio y cumpliendo con las exigencias del régimen administrativo (Ley Orgánica de las Municipalidades, Ley 14656, RAFAM, GDE y Decreto N° 2250/98).</w:t>
@@ -441,11 +435,7 @@
         <w:t>Este contexto requiere fortalecer la organización interna, promover el trabajo colaborativo y establecer procedimientos comunes. El diagnóstico que se presenta a continuación permite identificar las fo</w:t>
       </w:r>
       <w:r>
-        <w:t xml:space="preserve">rtalezas sobre las cuales construir una estrategia de mejora, así como las </w:t>
-      </w:r>
-      <w:r>
-        <w:lastRenderedPageBreak/>
-        <w:t>debilidades y oportunidades cuya adecuada gestión contribuirá al fortalecimiento institucional del área.</w:t>
+        <w:t>rtalezas sobre las cuales construir una estrategia de mejora, así como las debilidades y oportunidades cuya adecuada gestión contribuirá al fortalecimiento institucional del área.</w:t>
       </w:r>
     </w:p>
     <w:p/>
@@ -688,11 +678,7 @@
         <w:t xml:space="preserve">Una parte significativa del conocimiento funcional y técnico de determinados sistemas críticos se encuentra concentrada en un número reducido de agentes, lo que incrementa el riesgo operacional, dificulta la planificación </w:t>
       </w:r>
       <w:r>
-        <w:t xml:space="preserve">de tareas, genera cuellos de </w:t>
-      </w:r>
-      <w:r>
-        <w:lastRenderedPageBreak/>
-        <w:t>botella y limita la flexibilidad del Departamento para reasignar recursos ante licencias del personal, imprevistos o prioridades institucionales.</w:t>
+        <w:t>de tareas, genera cuellos de botella y limita la flexibilidad del Departamento para reasignar recursos ante licencias del personal, imprevistos o prioridades institucionales.</w:t>
       </w:r>
     </w:p>
     <w:p>
@@ -701,6 +687,7 @@
           <w:b/>
           <w:bCs/>
         </w:rPr>
+        <w:lastRenderedPageBreak/>
         <w:t xml:space="preserve">• Ausencia de procedimientos homogéneos: </w:t>
       </w:r>
       <w:r>
@@ -812,6 +799,20 @@
       </w:r>
       <w:r>
         <w:t>to individual, encarece la curva de aprendizaje y pone en riesgo la continuidad de los aplicativos frente a licencias, traslados o bajas de personal.</w:t>
+      </w:r>
+    </w:p>
+    <w:p>
+      <w:r>
+        <w:t xml:space="preserve">• </w:t>
+      </w:r>
+      <w:r>
+        <w:rPr>
+          <w:b/>
+        </w:rPr>
+        <w:t>Limitaciones en la especialización funcional</w:t>
+      </w:r>
+      <w:r>
+        <w:t>: La dotación actual del Departamento requiere que los agentes desempeñen simultáneamente tareas de análisis, desarrollo, mantenimiento y soporte funcional, independientemente de la especialización prevista por el agrupamiento ocupacional, reduciendo la posibilidad de conformar equipos con roles claramente diferenciados.</w:t>
       </w:r>
     </w:p>
     <w:p/>
@@ -1198,32 +1199,56 @@
     <w:p>
       <w:pPr>
         <w:pStyle w:val="NormalWeb"/>
-      </w:pPr>
-      <w:r>
+        <w:rPr>
+          <w:rFonts w:ascii="Arial" w:hAnsi="Arial" w:cs="Arial"/>
+        </w:rPr>
+      </w:pPr>
+      <w:r>
+        <w:rPr>
+          <w:rFonts w:ascii="Arial" w:hAnsi="Arial" w:cs="Arial"/>
+        </w:rPr>
         <w:t>El diagnóstico realizado permite concluir que las principales oportunidades de mejora del Departamento no dependen inicialmente de la incorporación de nuevos recursos humanos o tecnológicos, sino del fortalecimiento de la organización interna, la coordinación de los equipos de trabajo y la estandarización de los procedimientos.</w:t>
       </w:r>
     </w:p>
     <w:p>
       <w:pPr>
         <w:pStyle w:val="NormalWeb"/>
-      </w:pPr>
-      <w:r>
+        <w:rPr>
+          <w:rFonts w:ascii="Arial" w:hAnsi="Arial" w:cs="Arial"/>
+        </w:rPr>
+      </w:pPr>
+      <w:r>
+        <w:rPr>
+          <w:rFonts w:ascii="Arial" w:hAnsi="Arial" w:cs="Arial"/>
+        </w:rPr>
         <w:t xml:space="preserve">En consecuencia, se propone un plan de optimización basado en seis líneas de acción prioritarias, todas ellas </w:t>
       </w:r>
       <w:proofErr w:type="spellStart"/>
       <w:r>
+        <w:rPr>
+          <w:rFonts w:ascii="Arial" w:hAnsi="Arial" w:cs="Arial"/>
+        </w:rPr>
         <w:t>implementables</w:t>
       </w:r>
       <w:proofErr w:type="spellEnd"/>
       <w:r>
+        <w:rPr>
+          <w:rFonts w:ascii="Arial" w:hAnsi="Arial" w:cs="Arial"/>
+        </w:rPr>
         <w:t xml:space="preserve"> con los recursos actualmente disponibles y </w:t>
       </w:r>
       <w:proofErr w:type="gramStart"/>
       <w:r>
+        <w:rPr>
+          <w:rFonts w:ascii="Arial" w:hAnsi="Arial" w:cs="Arial"/>
+        </w:rPr>
         <w:t>alineadas</w:t>
       </w:r>
       <w:proofErr w:type="gramEnd"/>
       <w:r>
+        <w:rPr>
+          <w:rFonts w:ascii="Arial" w:hAnsi="Arial" w:cs="Arial"/>
+        </w:rPr>
         <w:t xml:space="preserve"> con las funciones asignadas a la Jefatura del Departamento.</w:t>
       </w:r>
     </w:p>
@@ -1252,18 +1277,522 @@
     </w:p>
     <w:p>
       <w:pPr>
+        <w:pStyle w:val="Ttulo2"/>
+        <w:rPr>
+          <w:rFonts w:eastAsia="Times New Roman"/>
+          <w:color w:val="auto"/>
+          <w:sz w:val="24"/>
+          <w:szCs w:val="24"/>
+        </w:rPr>
+      </w:pPr>
+      <w:r>
+        <w:rPr>
+          <w:rFonts w:eastAsia="Times New Roman"/>
+          <w:color w:val="auto"/>
+          <w:sz w:val="24"/>
+          <w:szCs w:val="24"/>
+        </w:rPr>
+        <w:t>Actualmente el Departamento desarrolla simultáneamente nuevos proyectos, mantenimiento correctivo, mantenimiento evolutivo, soporte a usuarios y atención de requerimientos urgentes provenientes de distintas Secretarías.</w:t>
+      </w:r>
+    </w:p>
+    <w:p>
+      <w:pPr>
+        <w:pStyle w:val="Ttulo2"/>
+        <w:rPr>
+          <w:rFonts w:eastAsia="Times New Roman"/>
+          <w:color w:val="auto"/>
+          <w:sz w:val="24"/>
+          <w:szCs w:val="24"/>
+        </w:rPr>
+      </w:pPr>
+      <w:r>
+        <w:rPr>
+          <w:rFonts w:eastAsia="Times New Roman"/>
+          <w:color w:val="auto"/>
+          <w:sz w:val="24"/>
+          <w:szCs w:val="24"/>
+        </w:rPr>
+        <w:t xml:space="preserve">La ausencia de un procedimiento uniforme de planificación dificulta conocer la capacidad real del Departamento, provoca cambios permanentes de prioridades y genera una utilización poco eficiente de los recursos disponibles. Si bien la Municipalidad cuenta con la plataforma </w:t>
+      </w:r>
+      <w:proofErr w:type="spellStart"/>
+      <w:r>
+        <w:rPr>
+          <w:rFonts w:eastAsia="Times New Roman"/>
+          <w:color w:val="auto"/>
+          <w:sz w:val="24"/>
+          <w:szCs w:val="24"/>
+        </w:rPr>
+        <w:t>Redmine</w:t>
+      </w:r>
+      <w:proofErr w:type="spellEnd"/>
+      <w:r>
+        <w:rPr>
+          <w:rFonts w:eastAsia="Times New Roman"/>
+          <w:color w:val="auto"/>
+          <w:sz w:val="24"/>
+          <w:szCs w:val="24"/>
+        </w:rPr>
+        <w:t xml:space="preserve"> instalada (https://proyectos.mardelplata.gov.ar/), la falta de tipificación de peticiones y de estimación sistemática dificulta explotar herramientas clave como el diagrama Gantt o los tableros de gestión para visibilizar la carga operativa real del equipo.</w:t>
+      </w:r>
+    </w:p>
+    <w:p>
+      <w:pPr>
+        <w:pStyle w:val="Ttulo2"/>
+        <w:rPr>
+          <w:rFonts w:eastAsia="Times New Roman"/>
+          <w:color w:val="auto"/>
+          <w:sz w:val="24"/>
+          <w:szCs w:val="24"/>
+        </w:rPr>
+      </w:pPr>
+    </w:p>
+    <w:p>
+      <w:pPr>
+        <w:pStyle w:val="Ttulo2"/>
+      </w:pPr>
+      <w:r>
+        <w:t>Propuesta</w:t>
+      </w:r>
+    </w:p>
+    <w:p>
+      <w:pPr>
+        <w:pStyle w:val="Ttulo2"/>
+        <w:rPr>
+          <w:rFonts w:eastAsia="Times New Roman"/>
+          <w:color w:val="auto"/>
+          <w:sz w:val="24"/>
+          <w:szCs w:val="24"/>
+        </w:rPr>
+      </w:pPr>
+      <w:r>
+        <w:rPr>
+          <w:rFonts w:eastAsia="Times New Roman"/>
+          <w:color w:val="auto"/>
+          <w:sz w:val="24"/>
+          <w:szCs w:val="24"/>
+        </w:rPr>
+        <w:t xml:space="preserve">La Jefatura implementará un modelo único de organización del trabajo que permita centralizar todas las solicitudes del Departamento en una única cartera de proyectos administrada mediante la plataforma institucional </w:t>
+      </w:r>
+      <w:proofErr w:type="spellStart"/>
+      <w:r>
+        <w:rPr>
+          <w:rFonts w:eastAsia="Times New Roman"/>
+          <w:color w:val="auto"/>
+          <w:sz w:val="24"/>
+          <w:szCs w:val="24"/>
+        </w:rPr>
+        <w:t>Redmine</w:t>
+      </w:r>
+      <w:proofErr w:type="spellEnd"/>
+      <w:r>
+        <w:rPr>
+          <w:rFonts w:eastAsia="Times New Roman"/>
+          <w:color w:val="auto"/>
+          <w:sz w:val="24"/>
+          <w:szCs w:val="24"/>
+        </w:rPr>
+        <w:t xml:space="preserve"> (https://proyectos.mardelplata.gov.ar/).</w:t>
+      </w:r>
+    </w:p>
+    <w:p>
+      <w:pPr>
+        <w:pStyle w:val="Ttulo2"/>
+        <w:rPr>
+          <w:rFonts w:eastAsia="Times New Roman"/>
+          <w:color w:val="auto"/>
+          <w:sz w:val="24"/>
+          <w:szCs w:val="24"/>
+        </w:rPr>
+      </w:pPr>
+      <w:r>
+        <w:rPr>
+          <w:rFonts w:eastAsia="Times New Roman"/>
+          <w:color w:val="auto"/>
+          <w:sz w:val="24"/>
+          <w:szCs w:val="24"/>
+        </w:rPr>
+        <w:lastRenderedPageBreak/>
+        <w:t xml:space="preserve">La planificación distinguirá claramente las tareas de mantenimiento </w:t>
+      </w:r>
+      <w:proofErr w:type="gramStart"/>
+      <w:r>
+        <w:rPr>
+          <w:rFonts w:eastAsia="Times New Roman"/>
+          <w:color w:val="auto"/>
+          <w:sz w:val="24"/>
+          <w:szCs w:val="24"/>
+        </w:rPr>
+        <w:t>continuo</w:t>
+      </w:r>
+      <w:proofErr w:type="gramEnd"/>
+      <w:r>
+        <w:rPr>
+          <w:rFonts w:eastAsia="Times New Roman"/>
+          <w:color w:val="auto"/>
+          <w:sz w:val="24"/>
+          <w:szCs w:val="24"/>
+        </w:rPr>
+        <w:t xml:space="preserve"> de los nuevos desarrollos, permitiendo asignar prioridades, distribuir la carga de trabajo y realizar un seguimiento permanente del estado de cada iniciativa mediante el aprovechamiento de sus módulos nativos de Gantt y gestión Ágil.</w:t>
+      </w:r>
+    </w:p>
+    <w:p>
+      <w:pPr>
+        <w:pStyle w:val="Ttulo2"/>
+        <w:rPr>
+          <w:rFonts w:eastAsia="Times New Roman"/>
+          <w:color w:val="auto"/>
+          <w:sz w:val="24"/>
+          <w:szCs w:val="24"/>
+        </w:rPr>
+      </w:pPr>
+      <w:r>
+        <w:rPr>
+          <w:rFonts w:eastAsia="Times New Roman"/>
+          <w:color w:val="auto"/>
+          <w:sz w:val="24"/>
+          <w:szCs w:val="24"/>
+        </w:rPr>
+        <w:t>La metodología utilizada será flexible y adaptada a la realidad del Departamento, incorporando prácticas ágiles únicamente cuando aporten valor al proceso de trabajo, evitando trasladar modelos rígidos que no respondan a las características de la Administración Pública.</w:t>
+      </w:r>
+    </w:p>
+    <w:p>
+      <w:pPr>
+        <w:pStyle w:val="Ttulo2"/>
+        <w:rPr>
+          <w:rFonts w:eastAsia="Times New Roman"/>
+          <w:color w:val="auto"/>
+          <w:sz w:val="24"/>
+          <w:szCs w:val="24"/>
+        </w:rPr>
+      </w:pPr>
+    </w:p>
+    <w:p>
+      <w:pPr>
+        <w:pStyle w:val="Ttulo2"/>
+      </w:pPr>
+      <w:r>
+        <w:t>Implementación</w:t>
+      </w:r>
+    </w:p>
+    <w:p>
+      <w:pPr>
         <w:pStyle w:val="NormalWeb"/>
-      </w:pPr>
-      <w:r>
-        <w:t>Actualmente el Departamento desarrolla simultáneamente nuevos proyectos, mantenimiento correctivo, mantenimiento evolutivo, soporte a usuarios y atención de requerimientos urgentes provenientes de distintas Secretarías.</w:t>
+        <w:rPr>
+          <w:rFonts w:ascii="Arial" w:hAnsi="Arial" w:cs="Arial"/>
+        </w:rPr>
+      </w:pPr>
+      <w:r>
+        <w:rPr>
+          <w:rFonts w:ascii="Arial" w:hAnsi="Arial" w:cs="Arial"/>
+        </w:rPr>
+        <w:t>La implementación comprenderá:</w:t>
+      </w:r>
+    </w:p>
+    <w:p>
+      <w:pPr>
+        <w:pStyle w:val="Ttulo2"/>
+        <w:rPr>
+          <w:color w:val="auto"/>
+          <w:sz w:val="22"/>
+          <w:szCs w:val="22"/>
+        </w:rPr>
+      </w:pPr>
+      <w:r>
+        <w:rPr>
+          <w:color w:val="auto"/>
+          <w:sz w:val="22"/>
+          <w:szCs w:val="22"/>
+        </w:rPr>
+        <w:t xml:space="preserve">• </w:t>
+      </w:r>
+      <w:proofErr w:type="gramStart"/>
+      <w:r>
+        <w:rPr>
+          <w:color w:val="auto"/>
+          <w:sz w:val="22"/>
+          <w:szCs w:val="22"/>
+        </w:rPr>
+        <w:t>utilización</w:t>
+      </w:r>
+      <w:proofErr w:type="gramEnd"/>
+      <w:r>
+        <w:rPr>
+          <w:color w:val="auto"/>
+          <w:sz w:val="22"/>
+          <w:szCs w:val="22"/>
+        </w:rPr>
+        <w:t xml:space="preserve"> obligatoria de la plataforma </w:t>
+      </w:r>
+      <w:proofErr w:type="spellStart"/>
+      <w:r>
+        <w:rPr>
+          <w:color w:val="auto"/>
+          <w:sz w:val="22"/>
+          <w:szCs w:val="22"/>
+        </w:rPr>
+        <w:t>Redmine</w:t>
+      </w:r>
+      <w:proofErr w:type="spellEnd"/>
+      <w:r>
+        <w:rPr>
+          <w:color w:val="auto"/>
+          <w:sz w:val="22"/>
+          <w:szCs w:val="22"/>
+        </w:rPr>
+        <w:t xml:space="preserve"> para todas las solicitudes; </w:t>
+      </w:r>
+    </w:p>
+    <w:p>
+      <w:pPr>
+        <w:pStyle w:val="Ttulo2"/>
+        <w:rPr>
+          <w:color w:val="auto"/>
+          <w:sz w:val="22"/>
+          <w:szCs w:val="22"/>
+        </w:rPr>
+      </w:pPr>
+      <w:r>
+        <w:rPr>
+          <w:color w:val="auto"/>
+          <w:sz w:val="22"/>
+          <w:szCs w:val="22"/>
+        </w:rPr>
+        <w:t xml:space="preserve">• </w:t>
+      </w:r>
+      <w:proofErr w:type="gramStart"/>
+      <w:r>
+        <w:rPr>
+          <w:color w:val="auto"/>
+          <w:sz w:val="22"/>
+          <w:szCs w:val="22"/>
+        </w:rPr>
+        <w:t>reuniones</w:t>
+      </w:r>
+      <w:proofErr w:type="gramEnd"/>
+      <w:r>
+        <w:rPr>
+          <w:color w:val="auto"/>
+          <w:sz w:val="22"/>
+          <w:szCs w:val="22"/>
+        </w:rPr>
+        <w:t xml:space="preserve"> periódicas de planificación y seguimiento; </w:t>
+      </w:r>
+    </w:p>
+    <w:p>
+      <w:pPr>
+        <w:pStyle w:val="Ttulo2"/>
+        <w:rPr>
+          <w:color w:val="auto"/>
+          <w:sz w:val="22"/>
+          <w:szCs w:val="22"/>
+        </w:rPr>
+      </w:pPr>
+      <w:r>
+        <w:rPr>
+          <w:color w:val="auto"/>
+          <w:sz w:val="22"/>
+          <w:szCs w:val="22"/>
+        </w:rPr>
+        <w:t xml:space="preserve">• </w:t>
+      </w:r>
+      <w:proofErr w:type="gramStart"/>
+      <w:r>
+        <w:rPr>
+          <w:color w:val="auto"/>
+          <w:sz w:val="22"/>
+          <w:szCs w:val="22"/>
+        </w:rPr>
+        <w:t>revisión</w:t>
+      </w:r>
+      <w:proofErr w:type="gramEnd"/>
+      <w:r>
+        <w:rPr>
+          <w:color w:val="auto"/>
+          <w:sz w:val="22"/>
+          <w:szCs w:val="22"/>
+        </w:rPr>
+        <w:t xml:space="preserve"> permanente de prioridades; </w:t>
+      </w:r>
+    </w:p>
+    <w:p>
+      <w:pPr>
+        <w:pStyle w:val="Ttulo2"/>
+        <w:rPr>
+          <w:color w:val="auto"/>
+          <w:sz w:val="22"/>
+          <w:szCs w:val="22"/>
+        </w:rPr>
+      </w:pPr>
+      <w:r>
+        <w:rPr>
+          <w:color w:val="auto"/>
+          <w:sz w:val="22"/>
+          <w:szCs w:val="22"/>
+        </w:rPr>
+        <w:t xml:space="preserve">• </w:t>
+      </w:r>
+      <w:proofErr w:type="gramStart"/>
+      <w:r>
+        <w:rPr>
+          <w:color w:val="auto"/>
+          <w:sz w:val="22"/>
+          <w:szCs w:val="22"/>
+        </w:rPr>
+        <w:t>redistribución</w:t>
+      </w:r>
+      <w:proofErr w:type="gramEnd"/>
+      <w:r>
+        <w:rPr>
+          <w:color w:val="auto"/>
+          <w:sz w:val="22"/>
+          <w:szCs w:val="22"/>
+        </w:rPr>
+        <w:t xml:space="preserve"> de tareas cuando la carga operativa lo requiera;</w:t>
+      </w:r>
+    </w:p>
+    <w:p>
+      <w:pPr>
+        <w:pStyle w:val="Ttulo2"/>
+        <w:rPr>
+          <w:color w:val="auto"/>
+          <w:sz w:val="22"/>
+          <w:szCs w:val="22"/>
+        </w:rPr>
+      </w:pPr>
+      <w:r>
+        <w:rPr>
+          <w:color w:val="auto"/>
+          <w:sz w:val="22"/>
+          <w:szCs w:val="22"/>
+        </w:rPr>
+        <w:t xml:space="preserve">• </w:t>
+      </w:r>
+      <w:proofErr w:type="gramStart"/>
+      <w:r>
+        <w:rPr>
+          <w:color w:val="auto"/>
+          <w:sz w:val="22"/>
+          <w:szCs w:val="22"/>
+        </w:rPr>
+        <w:t>definición</w:t>
+      </w:r>
+      <w:proofErr w:type="gramEnd"/>
+      <w:r>
+        <w:rPr>
+          <w:color w:val="auto"/>
+          <w:sz w:val="22"/>
+          <w:szCs w:val="22"/>
+        </w:rPr>
+        <w:t xml:space="preserve"> de criterios para clasificar urgencias y diferir incidencias no críticas, protegiendo capacidad operativa para el trabajo planificado;</w:t>
+      </w:r>
+    </w:p>
+    <w:p>
+      <w:pPr>
+        <w:pStyle w:val="Ttulo2"/>
+        <w:rPr>
+          <w:color w:val="auto"/>
+          <w:sz w:val="22"/>
+          <w:szCs w:val="22"/>
+        </w:rPr>
+      </w:pPr>
+      <w:r>
+        <w:rPr>
+          <w:color w:val="auto"/>
+          <w:sz w:val="22"/>
+          <w:szCs w:val="22"/>
+        </w:rPr>
+        <w:t xml:space="preserve">• </w:t>
+      </w:r>
+      <w:proofErr w:type="gramStart"/>
+      <w:r>
+        <w:rPr>
+          <w:color w:val="auto"/>
+          <w:sz w:val="22"/>
+          <w:szCs w:val="22"/>
+        </w:rPr>
+        <w:t>estimación</w:t>
+      </w:r>
+      <w:proofErr w:type="gramEnd"/>
+      <w:r>
+        <w:rPr>
+          <w:color w:val="auto"/>
+          <w:sz w:val="22"/>
+          <w:szCs w:val="22"/>
+        </w:rPr>
+        <w:t xml:space="preserve"> de tiempos y tipificación en cada petición para habilitar el seguimiento efectivo del cronograma mediante el diagrama Gantt.</w:t>
+      </w:r>
+    </w:p>
+    <w:p>
+      <w:pPr>
+        <w:pStyle w:val="Ttulo2"/>
+        <w:rPr>
+          <w:color w:val="auto"/>
+          <w:sz w:val="22"/>
+          <w:szCs w:val="22"/>
+        </w:rPr>
+      </w:pPr>
+    </w:p>
+    <w:p>
+      <w:pPr>
+        <w:pStyle w:val="Ttulo2"/>
+      </w:pPr>
+      <w:r>
+        <w:t>Resultado esperado</w:t>
+      </w:r>
+    </w:p>
+    <w:p>
+      <w:r>
+        <w:rPr>
+          <w:rFonts w:eastAsia="Times New Roman"/>
+          <w:sz w:val="24"/>
+          <w:szCs w:val="24"/>
+        </w:rPr>
+        <w:t>Esta propuesta permitirá mejorar la previsibilidad de los proyectos, optimizar la utilización de los recursos existentes y brindar mayor transparencia respecto del estado de cada solicitud.</w:t>
+      </w:r>
+    </w:p>
+    <w:p/>
+    <w:p>
+      <w:pPr>
+        <w:pStyle w:val="Ttulo1"/>
+      </w:pPr>
+      <w:r>
+        <w:t>5.2 Gestión del conocimiento institucional</w:t>
+      </w:r>
+    </w:p>
+    <w:p>
+      <w:pPr>
+        <w:pStyle w:val="Ttulo2"/>
+      </w:pPr>
+      <w:r>
+        <w:t>Problema</w:t>
       </w:r>
     </w:p>
     <w:p>
       <w:pPr>
         <w:pStyle w:val="NormalWeb"/>
-      </w:pPr>
-      <w:r>
-        <w:t>La ausencia de un procedimiento uniforme de planificación dificulta conocer la capacidad real del Departamento, provoca cambios permanentes de prioridades y genera una utilización poco eficiente de los recursos disponibles.</w:t>
+        <w:rPr>
+          <w:rFonts w:ascii="Arial" w:hAnsi="Arial" w:cs="Arial"/>
+        </w:rPr>
+      </w:pPr>
+      <w:r>
+        <w:rPr>
+          <w:rFonts w:ascii="Arial" w:hAnsi="Arial" w:cs="Arial"/>
+        </w:rPr>
+        <w:t>El conocimiento funcional y técnico de algunos sistemas críticos se encuentra concentrado en pocos agentes, incrementando el riesgo operativo y dificultando la continuidad de los servicios frente a licencias, cambios de funciones o ausencias prolongadas.</w:t>
+      </w:r>
+    </w:p>
+    <w:p>
+      <w:pPr>
+        <w:pStyle w:val="NormalWeb"/>
+        <w:rPr>
+          <w:rFonts w:ascii="Arial" w:hAnsi="Arial" w:cs="Arial"/>
+        </w:rPr>
+      </w:pPr>
+      <w:r>
+        <w:rPr>
+          <w:rFonts w:ascii="Arial" w:hAnsi="Arial" w:cs="Arial"/>
+        </w:rPr>
+        <w:t>A ello se suma la existencia de documentación con distintos niveles de desarrollo según el proyecto.</w:t>
       </w:r>
     </w:p>
     <w:p>
@@ -1276,111 +1805,233 @@
     </w:p>
     <w:p>
       <w:pPr>
+        <w:pStyle w:val="Ttulo2"/>
+        <w:rPr>
+          <w:rFonts w:eastAsia="Times New Roman"/>
+          <w:color w:val="auto"/>
+          <w:sz w:val="24"/>
+          <w:szCs w:val="24"/>
+        </w:rPr>
+      </w:pPr>
+      <w:r>
+        <w:rPr>
+          <w:rFonts w:eastAsia="Times New Roman"/>
+          <w:color w:val="auto"/>
+          <w:sz w:val="24"/>
+          <w:szCs w:val="24"/>
+        </w:rPr>
+        <w:t xml:space="preserve">Se implementará un programa permanente de gestión del conocimiento orientado a preservar el patrimonio técnico del Departamento y reducir la dependencia de personas específicas. Como parte de este programa, se promoverá la asignación gradual de agentes de apoyo en los sistemas críticos, favoreciendo la transferencia de </w:t>
+      </w:r>
+      <w:r>
+        <w:rPr>
+          <w:rFonts w:eastAsia="Times New Roman"/>
+          <w:color w:val="auto"/>
+          <w:sz w:val="24"/>
+          <w:szCs w:val="24"/>
+        </w:rPr>
+        <w:lastRenderedPageBreak/>
+        <w:t>conocimientos y asegurando la continuidad operativa ante ausencias, cambios de funciones o nuevas necesidades organizacionales, complementado con una política de documentación técnica proporcional a la complejidad de cada aplicación.</w:t>
+      </w:r>
+    </w:p>
+    <w:p>
+      <w:pPr>
+        <w:pStyle w:val="Ttulo2"/>
+        <w:rPr>
+          <w:rFonts w:eastAsia="Times New Roman"/>
+          <w:color w:val="auto"/>
+          <w:sz w:val="24"/>
+          <w:szCs w:val="24"/>
+        </w:rPr>
+      </w:pPr>
+    </w:p>
+    <w:p>
+      <w:pPr>
+        <w:pStyle w:val="Ttulo2"/>
+      </w:pPr>
+      <w:r>
+        <w:t>Implementación</w:t>
+      </w:r>
+    </w:p>
+    <w:p>
+      <w:pPr>
         <w:pStyle w:val="NormalWeb"/>
-      </w:pPr>
-      <w:r>
-        <w:t xml:space="preserve">La Jefatura implementará un modelo único de organización del trabajo que permita centralizar todas las solicitudes del Departamento en una única cartera de proyectos administrada mediante </w:t>
-      </w:r>
-      <w:proofErr w:type="spellStart"/>
-      <w:r>
-        <w:t>Redmine</w:t>
-      </w:r>
-      <w:proofErr w:type="spellEnd"/>
-      <w:r>
-        <w:t>.</w:t>
-      </w:r>
-    </w:p>
-    <w:p>
-      <w:pPr>
-        <w:pStyle w:val="NormalWeb"/>
-      </w:pPr>
-      <w:r>
-        <w:t>La planificación distinguirá claramente las tareas de mantenimiento continuo de los nuevos desarrollos, permitiendo asignar prioridades, distribuir la carga de trabajo y realizar un seguimiento permanente del estado de cada iniciativa.</w:t>
-      </w:r>
-    </w:p>
-    <w:p>
-      <w:pPr>
-        <w:pStyle w:val="NormalWeb"/>
-      </w:pPr>
-      <w:r>
-        <w:lastRenderedPageBreak/>
-        <w:t>La metodología utilizada será flexible y adaptada a la realidad del Departamento, incorporando prácticas ágiles únicamente cuando aporten valor al proceso de trabajo, evitando trasladar modelos rígidos que no respondan a las características de la Administración Pública.</w:t>
-      </w:r>
-    </w:p>
-    <w:p>
-      <w:pPr>
-        <w:pStyle w:val="Ttulo2"/>
-      </w:pPr>
-      <w:r>
-        <w:t>Implementación</w:t>
-      </w:r>
-    </w:p>
-    <w:p>
-      <w:pPr>
-        <w:pStyle w:val="NormalWeb"/>
-      </w:pPr>
-      <w:r>
-        <w:t>La implementación comprenderá:</w:t>
-      </w:r>
-    </w:p>
-    <w:p>
-      <w:pPr>
+        <w:rPr>
+          <w:rFonts w:ascii="Arial" w:hAnsi="Arial" w:cs="Arial"/>
+        </w:rPr>
+      </w:pPr>
+      <w:r>
+        <w:rPr>
+          <w:rFonts w:ascii="Arial" w:hAnsi="Arial" w:cs="Arial"/>
+        </w:rPr>
+        <w:t>El programa comprenderá:</w:t>
+      </w:r>
+    </w:p>
+    <w:p>
+      <w:pPr>
+        <w:pStyle w:val="Ttulo2"/>
         <w:numPr>
           <w:ilvl w:val="0"/>
-          <w:numId w:val="2"/>
+          <w:numId w:val="11"/>
         </w:numPr>
-        <w:spacing w:before="100" w:beforeAutospacing="1" w:afterAutospacing="1" w:line="240" w:lineRule="auto"/>
-        <w:jc w:val="left"/>
-      </w:pPr>
-      <w:r>
-        <w:t xml:space="preserve">utilización obligatoria de </w:t>
-      </w:r>
-      <w:proofErr w:type="spellStart"/>
-      <w:r>
-        <w:t>Redmine</w:t>
-      </w:r>
-      <w:proofErr w:type="spellEnd"/>
-      <w:r>
-        <w:t xml:space="preserve"> para todas las solicitudes; </w:t>
-      </w:r>
-    </w:p>
-    <w:p>
-      <w:pPr>
+        <w:rPr>
+          <w:color w:val="auto"/>
+          <w:sz w:val="22"/>
+          <w:szCs w:val="22"/>
+        </w:rPr>
+      </w:pPr>
+      <w:proofErr w:type="gramStart"/>
+      <w:r>
+        <w:rPr>
+          <w:color w:val="auto"/>
+          <w:sz w:val="22"/>
+          <w:szCs w:val="22"/>
+        </w:rPr>
+        <w:t>asignación</w:t>
+      </w:r>
+      <w:proofErr w:type="gramEnd"/>
+      <w:r>
+        <w:rPr>
+          <w:color w:val="auto"/>
+          <w:sz w:val="22"/>
+          <w:szCs w:val="22"/>
+        </w:rPr>
+        <w:t xml:space="preserve"> gradual de agentes de apoyo para los sistemas críticos;</w:t>
+      </w:r>
+    </w:p>
+    <w:p>
+      <w:pPr>
+        <w:pStyle w:val="Ttulo2"/>
         <w:numPr>
           <w:ilvl w:val="0"/>
-          <w:numId w:val="2"/>
+          <w:numId w:val="11"/>
         </w:numPr>
-        <w:spacing w:before="100" w:beforeAutospacing="1" w:afterAutospacing="1" w:line="240" w:lineRule="auto"/>
-        <w:jc w:val="left"/>
-      </w:pPr>
-      <w:r>
-        <w:t xml:space="preserve">reuniones periódicas de planificación y seguimiento; </w:t>
-      </w:r>
-    </w:p>
-    <w:p>
-      <w:pPr>
+        <w:rPr>
+          <w:color w:val="auto"/>
+          <w:sz w:val="22"/>
+          <w:szCs w:val="22"/>
+        </w:rPr>
+      </w:pPr>
+      <w:proofErr w:type="gramStart"/>
+      <w:r>
+        <w:rPr>
+          <w:color w:val="auto"/>
+          <w:sz w:val="22"/>
+          <w:szCs w:val="22"/>
+        </w:rPr>
+        <w:t>participación</w:t>
+      </w:r>
+      <w:proofErr w:type="gramEnd"/>
+      <w:r>
+        <w:rPr>
+          <w:color w:val="auto"/>
+          <w:sz w:val="22"/>
+          <w:szCs w:val="22"/>
+        </w:rPr>
+        <w:t xml:space="preserve"> progresiva en tareas de mantenimiento y evolución;</w:t>
+      </w:r>
+    </w:p>
+    <w:p>
+      <w:pPr>
+        <w:pStyle w:val="Ttulo2"/>
         <w:numPr>
           <w:ilvl w:val="0"/>
-          <w:numId w:val="2"/>
+          <w:numId w:val="11"/>
         </w:numPr>
-        <w:spacing w:before="100" w:beforeAutospacing="1" w:afterAutospacing="1" w:line="240" w:lineRule="auto"/>
-        <w:jc w:val="left"/>
-      </w:pPr>
-      <w:r>
-        <w:t xml:space="preserve">revisión permanente de prioridades; </w:t>
-      </w:r>
-    </w:p>
-    <w:p>
-      <w:pPr>
+        <w:rPr>
+          <w:color w:val="auto"/>
+          <w:sz w:val="22"/>
+          <w:szCs w:val="22"/>
+        </w:rPr>
+      </w:pPr>
+      <w:proofErr w:type="gramStart"/>
+      <w:r>
+        <w:rPr>
+          <w:color w:val="auto"/>
+          <w:sz w:val="22"/>
+          <w:szCs w:val="22"/>
+        </w:rPr>
+        <w:t>transferencia</w:t>
+      </w:r>
+      <w:proofErr w:type="gramEnd"/>
+      <w:r>
+        <w:rPr>
+          <w:color w:val="auto"/>
+          <w:sz w:val="22"/>
+          <w:szCs w:val="22"/>
+        </w:rPr>
+        <w:t xml:space="preserve"> práctica de conocimientos entre agentes;</w:t>
+      </w:r>
+    </w:p>
+    <w:p>
+      <w:pPr>
+        <w:pStyle w:val="Ttulo2"/>
         <w:numPr>
           <w:ilvl w:val="0"/>
-          <w:numId w:val="2"/>
+          <w:numId w:val="11"/>
         </w:numPr>
-        <w:spacing w:before="100" w:beforeAutospacing="1" w:afterAutospacing="1" w:line="240" w:lineRule="auto"/>
-        <w:jc w:val="left"/>
-      </w:pPr>
-      <w:r>
-        <w:t xml:space="preserve">redistribución de tareas cuando la carga operativa lo requiera. </w:t>
+        <w:rPr>
+          <w:color w:val="auto"/>
+          <w:sz w:val="22"/>
+          <w:szCs w:val="22"/>
+        </w:rPr>
+      </w:pPr>
+      <w:proofErr w:type="gramStart"/>
+      <w:r>
+        <w:rPr>
+          <w:color w:val="auto"/>
+          <w:sz w:val="22"/>
+          <w:szCs w:val="22"/>
+        </w:rPr>
+        <w:t>elaboración</w:t>
+      </w:r>
+      <w:proofErr w:type="gramEnd"/>
+      <w:r>
+        <w:rPr>
+          <w:color w:val="auto"/>
+          <w:sz w:val="22"/>
+          <w:szCs w:val="22"/>
+        </w:rPr>
+        <w:t xml:space="preserve"> y actualización de la documentación funcional y técnica mínima;</w:t>
+      </w:r>
+    </w:p>
+    <w:p>
+      <w:pPr>
+        <w:pStyle w:val="Ttulo2"/>
+        <w:numPr>
+          <w:ilvl w:val="0"/>
+          <w:numId w:val="11"/>
+        </w:numPr>
+        <w:rPr>
+          <w:color w:val="auto"/>
+          <w:sz w:val="22"/>
+          <w:szCs w:val="22"/>
+        </w:rPr>
+      </w:pPr>
+      <w:proofErr w:type="gramStart"/>
+      <w:r>
+        <w:rPr>
+          <w:color w:val="auto"/>
+          <w:sz w:val="22"/>
+          <w:szCs w:val="22"/>
+        </w:rPr>
+        <w:t>revisión</w:t>
+      </w:r>
+      <w:proofErr w:type="gramEnd"/>
+      <w:r>
+        <w:rPr>
+          <w:color w:val="auto"/>
+          <w:sz w:val="22"/>
+          <w:szCs w:val="22"/>
+        </w:rPr>
+        <w:t xml:space="preserve"> periódica del grado de cobertura del conocimiento de cada sistema.</w:t>
+      </w:r>
+      <w:r>
+        <w:rPr>
+          <w:color w:val="auto"/>
+          <w:sz w:val="22"/>
+          <w:szCs w:val="22"/>
+        </w:rPr>
+        <w:br/>
       </w:r>
     </w:p>
     <w:p>
@@ -1394,9 +2045,15 @@
     <w:p>
       <w:pPr>
         <w:pStyle w:val="NormalWeb"/>
-      </w:pPr>
-      <w:r>
-        <w:t>Esta propuesta permitirá mejorar la previsibilidad de los proyectos, optimizar la utilización de los recursos existentes y brindar mayor transparencia respecto del estado de cada solicitud.</w:t>
+        <w:rPr>
+          <w:rFonts w:ascii="Arial" w:hAnsi="Arial" w:cs="Arial"/>
+        </w:rPr>
+      </w:pPr>
+      <w:r>
+        <w:rPr>
+          <w:rFonts w:ascii="Arial" w:hAnsi="Arial" w:cs="Arial"/>
+        </w:rPr>
+        <w:t>La medida reducirá significativamente el riesgo operativo, facilitará la redistribución de tareas y permitirá preservar el conocimiento institucional generado por el Departamento.</w:t>
       </w:r>
     </w:p>
     <w:p>
@@ -1411,7 +2068,7 @@
         <w:pStyle w:val="Ttulo1"/>
       </w:pPr>
       <w:r>
-        <w:t>5.2 Gestión del conocimiento institucional</w:t>
+        <w:t>5.3 Estandarización técnica y calidad del software</w:t>
       </w:r>
     </w:p>
     <w:p>
@@ -1425,209 +2082,72 @@
     <w:p>
       <w:pPr>
         <w:pStyle w:val="NormalWeb"/>
-      </w:pPr>
-      <w:r>
-        <w:t>El conocimiento funcional y técnico de algunos sistemas críticos se encuentra concentrado en pocos agentes, incrementando el riesgo operativo y dificultando la continuidad de los servicios frente a licencias, cambios de funciones o ausencias prolongadas.</w:t>
+        <w:rPr>
+          <w:rFonts w:ascii="Arial" w:hAnsi="Arial" w:cs="Arial"/>
+        </w:rPr>
+      </w:pPr>
+      <w:r>
+        <w:rPr>
+          <w:rFonts w:ascii="Arial" w:hAnsi="Arial" w:cs="Arial"/>
+        </w:rPr>
+        <w:t>La coexistencia de aplicaciones desarrolladas bajo distintos criterios técnicos dificulta el mantenimiento, incrementa la deuda técnica y genera diferencias significativas en la calidad de los desarrollos.</w:t>
+      </w:r>
+    </w:p>
+    <w:p>
+      <w:pPr>
+        <w:pStyle w:val="Ttulo2"/>
+      </w:pPr>
+      <w:r>
+        <w:t>Propuesta</w:t>
       </w:r>
     </w:p>
     <w:p>
       <w:pPr>
         <w:pStyle w:val="NormalWeb"/>
-      </w:pPr>
-      <w:r>
-        <w:t>A ello se suma la existencia de documentación con distintos niveles de desarrollo según el proyecto.</w:t>
-      </w:r>
-    </w:p>
-    <w:p>
-      <w:pPr>
-        <w:pStyle w:val="Ttulo2"/>
-      </w:pPr>
-      <w:r>
-        <w:t>Propuesta</w:t>
+        <w:rPr>
+          <w:rFonts w:ascii="Arial" w:hAnsi="Arial" w:cs="Arial"/>
+        </w:rPr>
+      </w:pPr>
+      <w:r>
+        <w:rPr>
+          <w:rFonts w:ascii="Arial" w:hAnsi="Arial" w:cs="Arial"/>
+        </w:rPr>
+        <w:t>La Jefatura impulsará la institucionalización de una Arquitectura Base y de un conjunto de estándares comunes que orienten el desarrollo de todos los nuevos sistemas municipales.</w:t>
       </w:r>
     </w:p>
     <w:p>
       <w:pPr>
         <w:pStyle w:val="NormalWeb"/>
-      </w:pPr>
-      <w:r>
-        <w:t>Se implementará un programa permanente de gestión del conocimiento orientado a preservar el patrimonio técnico del Departamento y reducir la dependencia de personas específicas.</w:t>
+        <w:rPr>
+          <w:rFonts w:ascii="Arial" w:hAnsi="Arial" w:cs="Arial"/>
+        </w:rPr>
+      </w:pPr>
+      <w:r>
+        <w:rPr>
+          <w:rFonts w:ascii="Arial" w:hAnsi="Arial" w:cs="Arial"/>
+        </w:rPr>
+        <w:t>El objetivo no consiste en restringir la innovación tecnológica sino en garantizar que todos los proyectos compartan criterios comunes de organización, seguridad, documentación y mantenimiento.</w:t>
+      </w:r>
+    </w:p>
+    <w:p>
+      <w:pPr>
+        <w:pStyle w:val="Ttulo2"/>
+      </w:pPr>
+      <w:r>
+        <w:t>Implementación</w:t>
       </w:r>
     </w:p>
     <w:p>
       <w:pPr>
         <w:pStyle w:val="NormalWeb"/>
-      </w:pPr>
-      <w:r>
-        <w:t>La principal herramienta será la incorporación de Referentes Secundarios para los sistemas críticos, acompañada por una política de documentación técnica proporcional a la complejidad de cada aplicación.</w:t>
-      </w:r>
-    </w:p>
-    <w:p>
-      <w:pPr>
-        <w:pStyle w:val="Ttulo2"/>
-      </w:pPr>
-      <w:r>
-        <w:t>Implementación</w:t>
-      </w:r>
-    </w:p>
-    <w:p>
-      <w:pPr>
-        <w:pStyle w:val="NormalWeb"/>
-      </w:pPr>
-      <w:r>
-        <w:t>El programa comprenderá:</w:t>
-      </w:r>
-    </w:p>
-    <w:p>
-      <w:pPr>
-        <w:numPr>
-          <w:ilvl w:val="0"/>
-          <w:numId w:val="3"/>
-        </w:numPr>
-        <w:spacing w:before="100" w:beforeAutospacing="1" w:afterAutospacing="1" w:line="240" w:lineRule="auto"/>
-        <w:jc w:val="left"/>
-      </w:pPr>
-      <w:r>
-        <w:t xml:space="preserve">designación gradual de Referentes Secundarios; </w:t>
-      </w:r>
-    </w:p>
-    <w:p>
-      <w:pPr>
-        <w:numPr>
-          <w:ilvl w:val="0"/>
-          <w:numId w:val="3"/>
-        </w:numPr>
-        <w:spacing w:before="100" w:beforeAutospacing="1" w:afterAutospacing="1" w:line="240" w:lineRule="auto"/>
-        <w:jc w:val="left"/>
-      </w:pPr>
-      <w:r>
-        <w:t xml:space="preserve">acompañamiento en tareas de mantenimiento; </w:t>
-      </w:r>
-    </w:p>
-    <w:p>
-      <w:pPr>
-        <w:numPr>
-          <w:ilvl w:val="0"/>
-          <w:numId w:val="3"/>
-        </w:numPr>
-        <w:spacing w:before="100" w:beforeAutospacing="1" w:afterAutospacing="1" w:line="240" w:lineRule="auto"/>
-        <w:jc w:val="left"/>
-      </w:pPr>
-      <w:r>
-        <w:t xml:space="preserve">transferencia práctica de conocimientos; </w:t>
-      </w:r>
-    </w:p>
-    <w:p>
-      <w:pPr>
-        <w:numPr>
-          <w:ilvl w:val="0"/>
-          <w:numId w:val="3"/>
-        </w:numPr>
-        <w:spacing w:before="100" w:beforeAutospacing="1" w:afterAutospacing="1" w:line="240" w:lineRule="auto"/>
-        <w:jc w:val="left"/>
-      </w:pPr>
-      <w:r>
-        <w:t xml:space="preserve">elaboración de documentación funcional y técnica mínima; </w:t>
-      </w:r>
-    </w:p>
-    <w:p>
-      <w:pPr>
-        <w:numPr>
-          <w:ilvl w:val="0"/>
-          <w:numId w:val="3"/>
-        </w:numPr>
-        <w:spacing w:before="100" w:beforeAutospacing="1" w:afterAutospacing="1" w:line="240" w:lineRule="auto"/>
-        <w:jc w:val="left"/>
-      </w:pPr>
-      <w:r>
-        <w:t xml:space="preserve">actualización permanente de la información de cada sistema. </w:t>
-      </w:r>
-    </w:p>
-    <w:p>
-      <w:pPr>
-        <w:pStyle w:val="Ttulo2"/>
-      </w:pPr>
-      <w:r>
-        <w:t>Resultado esperado</w:t>
-      </w:r>
-    </w:p>
-    <w:p>
-      <w:pPr>
-        <w:pStyle w:val="NormalWeb"/>
-      </w:pPr>
-      <w:r>
-        <w:lastRenderedPageBreak/>
-        <w:t>La medida reducirá significativamente el riesgo operativo, facilitará la redistribución de tareas y permitirá preservar el conocimiento institucional generado por el Departamento.</w:t>
-      </w:r>
-    </w:p>
-    <w:p>
-      <w:r>
-        <w:pict>
-          <v:rect id="_x0000_i1027" style="width:0;height:1.5pt" o:hralign="center" o:hrstd="t" o:hr="t" fillcolor="#a0a0a0" stroked="f"/>
-        </w:pict>
-      </w:r>
-    </w:p>
-    <w:p>
-      <w:pPr>
-        <w:pStyle w:val="Ttulo1"/>
-      </w:pPr>
-      <w:r>
-        <w:t>5.3 Estandarización técnica y calidad del software</w:t>
-      </w:r>
-    </w:p>
-    <w:p>
-      <w:pPr>
-        <w:pStyle w:val="Ttulo2"/>
-      </w:pPr>
-      <w:r>
-        <w:t>Problema</w:t>
-      </w:r>
-    </w:p>
-    <w:p>
-      <w:pPr>
-        <w:pStyle w:val="NormalWeb"/>
-      </w:pPr>
-      <w:r>
-        <w:t>La coexistencia de aplicaciones desarrolladas bajo distintos criterios técnicos dificulta el mantenimiento, incrementa la deuda técnica y genera diferencias significativas en la calidad de los desarrollos.</w:t>
-      </w:r>
-    </w:p>
-    <w:p>
-      <w:pPr>
-        <w:pStyle w:val="Ttulo2"/>
-      </w:pPr>
-      <w:r>
-        <w:t>Propuesta</w:t>
-      </w:r>
-    </w:p>
-    <w:p>
-      <w:pPr>
-        <w:pStyle w:val="NormalWeb"/>
-      </w:pPr>
-      <w:r>
-        <w:t>La Jefatura impulsará la institucionalización de una Arquitectura Base y de un conjunto de estándares comunes que orienten el desarrollo de todos los nuevos sistemas municipales.</w:t>
-      </w:r>
-    </w:p>
-    <w:p>
-      <w:pPr>
-        <w:pStyle w:val="NormalWeb"/>
-      </w:pPr>
-      <w:r>
-        <w:t>El objetivo no consiste en restringir la innovación tecnológica sino en garantizar que todos los proyectos compartan criterios comunes de organización, seguridad, documentación y mantenimiento.</w:t>
-      </w:r>
-    </w:p>
-    <w:p>
-      <w:pPr>
-        <w:pStyle w:val="Ttulo2"/>
-      </w:pPr>
-      <w:r>
-        <w:t>Implementación</w:t>
-      </w:r>
-    </w:p>
-    <w:p>
-      <w:pPr>
-        <w:pStyle w:val="NormalWeb"/>
-      </w:pPr>
-      <w:r>
+        <w:rPr>
+          <w:rFonts w:ascii="Arial" w:hAnsi="Arial" w:cs="Arial"/>
+        </w:rPr>
+      </w:pPr>
+      <w:r>
+        <w:rPr>
+          <w:rFonts w:ascii="Arial" w:hAnsi="Arial" w:cs="Arial"/>
+        </w:rPr>
         <w:t>Se establecerán:</w:t>
       </w:r>
     </w:p>
@@ -1693,6 +2213,7 @@
         <w:jc w:val="left"/>
       </w:pPr>
       <w:r>
+        <w:lastRenderedPageBreak/>
         <w:t xml:space="preserve">procedimientos básicos de revisión técnica antes de producción. </w:t>
       </w:r>
     </w:p>
@@ -1707,15 +2228,21 @@
     <w:p>
       <w:pPr>
         <w:pStyle w:val="NormalWeb"/>
-      </w:pPr>
-      <w:r>
+        <w:rPr>
+          <w:rFonts w:ascii="Arial" w:hAnsi="Arial" w:cs="Arial"/>
+        </w:rPr>
+      </w:pPr>
+      <w:r>
+        <w:rPr>
+          <w:rFonts w:ascii="Arial" w:hAnsi="Arial" w:cs="Arial"/>
+        </w:rPr>
         <w:t>Se obtendrán desarrollos más homogéneos, menor tiempo de mantenimiento, mayor facilidad para incorporar nuevos desarrolladores y una reducción progresiva de la deuda técnica.</w:t>
       </w:r>
     </w:p>
     <w:p>
       <w:r>
         <w:pict>
-          <v:rect id="_x0000_i1028" style="width:0;height:1.5pt" o:hralign="center" o:hrstd="t" o:hr="t" fillcolor="#a0a0a0" stroked="f"/>
+          <v:rect id="_x0000_i1027" style="width:0;height:1.5pt" o:hralign="center" o:hrstd="t" o:hr="t" fillcolor="#a0a0a0" stroked="f"/>
         </w:pict>
       </w:r>
     </w:p>
@@ -1738,8 +2265,14 @@
     <w:p>
       <w:pPr>
         <w:pStyle w:val="NormalWeb"/>
-      </w:pPr>
-      <w:r>
+        <w:rPr>
+          <w:rFonts w:ascii="Arial" w:hAnsi="Arial" w:cs="Arial"/>
+        </w:rPr>
+      </w:pPr>
+      <w:r>
+        <w:rPr>
+          <w:rFonts w:ascii="Arial" w:hAnsi="Arial" w:cs="Arial"/>
+        </w:rPr>
         <w:t>Las solicitudes de desarrollo llegan al Departamento por distintos canales y con diferentes niveles de definición, dificultando la planificación y la asignación objetiva de prioridades.</w:t>
       </w:r>
     </w:p>
@@ -1754,8 +2287,14 @@
     <w:p>
       <w:pPr>
         <w:pStyle w:val="NormalWeb"/>
-      </w:pPr>
-      <w:r>
+        <w:rPr>
+          <w:rFonts w:ascii="Arial" w:hAnsi="Arial" w:cs="Arial"/>
+        </w:rPr>
+      </w:pPr>
+      <w:r>
+        <w:rPr>
+          <w:rFonts w:ascii="Arial" w:hAnsi="Arial" w:cs="Arial"/>
+        </w:rPr>
         <w:t>Se institucionalizará un procedimiento único para el relevamiento, análisis y priorización de requerimientos, fortaleciendo el rol de la Jefatura como nexo entre las áreas usuarias y el equipo técnico.</w:t>
       </w:r>
     </w:p>
@@ -1764,15 +2303,20 @@
         <w:pStyle w:val="Ttulo2"/>
       </w:pPr>
       <w:r>
-        <w:lastRenderedPageBreak/>
         <w:t>Implementación</w:t>
       </w:r>
     </w:p>
     <w:p>
       <w:pPr>
         <w:pStyle w:val="NormalWeb"/>
-      </w:pPr>
-      <w:r>
+        <w:rPr>
+          <w:rFonts w:ascii="Arial" w:hAnsi="Arial" w:cs="Arial"/>
+        </w:rPr>
+      </w:pPr>
+      <w:r>
+        <w:rPr>
+          <w:rFonts w:ascii="Arial" w:hAnsi="Arial" w:cs="Arial"/>
+        </w:rPr>
         <w:t>Cada requerimiento será analizado considerando:</w:t>
       </w:r>
     </w:p>
@@ -1865,15 +2409,21 @@
     <w:p>
       <w:pPr>
         <w:pStyle w:val="NormalWeb"/>
-      </w:pPr>
-      <w:r>
+        <w:rPr>
+          <w:rFonts w:ascii="Arial" w:hAnsi="Arial" w:cs="Arial"/>
+        </w:rPr>
+      </w:pPr>
+      <w:r>
+        <w:rPr>
+          <w:rFonts w:ascii="Arial" w:hAnsi="Arial" w:cs="Arial"/>
+        </w:rPr>
         <w:t>La medida permitirá optimizar la asignación de recursos, reducir desarrollos duplicados y mejorar la comunicación con las distintas Secretarías.</w:t>
       </w:r>
     </w:p>
     <w:p>
       <w:r>
         <w:pict>
-          <v:rect id="_x0000_i1029" style="width:0;height:1.5pt" o:hralign="center" o:hrstd="t" o:hr="t" fillcolor="#a0a0a0" stroked="f"/>
+          <v:rect id="_x0000_i1028" style="width:0;height:1.5pt" o:hralign="center" o:hrstd="t" o:hr="t" fillcolor="#a0a0a0" stroked="f"/>
         </w:pict>
       </w:r>
     </w:p>
@@ -1896,10 +2446,22 @@
     <w:p>
       <w:pPr>
         <w:pStyle w:val="NormalWeb"/>
-      </w:pPr>
-      <w:r>
+        <w:rPr>
+          <w:rFonts w:ascii="Arial" w:hAnsi="Arial" w:cs="Arial"/>
+        </w:rPr>
+      </w:pPr>
+      <w:r>
+        <w:rPr>
+          <w:rFonts w:ascii="Arial" w:hAnsi="Arial" w:cs="Arial"/>
+        </w:rPr>
         <w:t>La incorporación de sistemas desarrollados por terceros puede generar dependencia tecnológica cuando el Municipio no participa activamente del seguimiento técnico de los proyectos.</w:t>
       </w:r>
+      <w:r>
+        <w:rPr>
+          <w:rFonts w:ascii="Arial" w:hAnsi="Arial" w:cs="Arial"/>
+        </w:rPr>
+        <w:t xml:space="preserve"> Generando discrepancias en los análisis de terceros ajenos a la administración pública por falta de conocimiento acerca de la organización interna.</w:t>
+      </w:r>
     </w:p>
     <w:p>
       <w:pPr>
@@ -1911,25 +2473,55 @@
     </w:p>
     <w:p>
       <w:pPr>
+        <w:pStyle w:val="Ttulo2"/>
+        <w:rPr>
+          <w:rFonts w:eastAsia="Times New Roman"/>
+          <w:color w:val="auto"/>
+          <w:sz w:val="24"/>
+          <w:szCs w:val="24"/>
+        </w:rPr>
+      </w:pPr>
+      <w:r>
+        <w:rPr>
+          <w:rFonts w:eastAsia="Times New Roman"/>
+          <w:color w:val="auto"/>
+          <w:sz w:val="24"/>
+          <w:szCs w:val="24"/>
+        </w:rPr>
+        <w:lastRenderedPageBreak/>
+        <w:t>La Jefatura ejercerá un rol de conducción técnica durante todo el ciclo de contratación, asegurando que las soluciones externas se integren adecuadamente al ecosistema tecnológico municipal. Para ello, asignará al seguimiento de cada proyecto a uno o más agentes del Departamento con experiencia en la temática funcional involucrada, quienes participarán en las etapas de relevamiento, validación y seguimiento técnico, complementando el conocimiento tecnológico del proveedor con el conocimiento de los procesos administrativos municipales.</w:t>
+      </w:r>
+    </w:p>
+    <w:p>
+      <w:pPr>
+        <w:pStyle w:val="Ttulo2"/>
+        <w:rPr>
+          <w:rFonts w:eastAsia="Times New Roman"/>
+          <w:color w:val="auto"/>
+          <w:sz w:val="24"/>
+          <w:szCs w:val="24"/>
+        </w:rPr>
+      </w:pPr>
+    </w:p>
+    <w:p>
+      <w:pPr>
+        <w:pStyle w:val="Ttulo2"/>
+      </w:pPr>
+      <w:r>
+        <w:t>Implementación</w:t>
+      </w:r>
+    </w:p>
+    <w:p>
+      <w:pPr>
         <w:pStyle w:val="NormalWeb"/>
-      </w:pPr>
-      <w:r>
-        <w:t>La Jefatura ejercerá un rol de conducción técnica durante todo el ciclo de contratación, asegurando que las soluciones externas se integren adecuadamente al ecosistema tecnológico municipal.</w:t>
-      </w:r>
-    </w:p>
-    <w:p>
-      <w:pPr>
-        <w:pStyle w:val="Ttulo2"/>
-      </w:pPr>
-      <w:r>
-        <w:t>Implementación</w:t>
-      </w:r>
-    </w:p>
-    <w:p>
-      <w:pPr>
-        <w:pStyle w:val="NormalWeb"/>
-      </w:pPr>
-      <w:r>
+        <w:rPr>
+          <w:rFonts w:ascii="Arial" w:hAnsi="Arial" w:cs="Arial"/>
+        </w:rPr>
+      </w:pPr>
+      <w:r>
+        <w:rPr>
+          <w:rFonts w:ascii="Arial" w:hAnsi="Arial" w:cs="Arial"/>
+        </w:rPr>
         <w:t>El procedimiento comprenderá:</w:t>
       </w:r>
     </w:p>
@@ -1943,7 +2535,10 @@
         <w:jc w:val="left"/>
       </w:pPr>
       <w:r>
-        <w:t xml:space="preserve">participación en la elaboración de especificaciones técnicas; </w:t>
+        <w:t>p</w:t>
+      </w:r>
+      <w:r>
+        <w:t>articipación de un agente del Departamento en las tareas de relevamiento y validación funcional;</w:t>
       </w:r>
     </w:p>
     <w:p>
@@ -1956,7 +2551,7 @@
         <w:jc w:val="left"/>
       </w:pPr>
       <w:r>
-        <w:t xml:space="preserve">seguimiento del desarrollo; </w:t>
+        <w:t>participación en la elaboración de especificaciones técnicas;</w:t>
       </w:r>
     </w:p>
     <w:p>
@@ -1969,7 +2564,7 @@
         <w:jc w:val="left"/>
       </w:pPr>
       <w:r>
-        <w:t xml:space="preserve">verificación del cumplimiento de estándares; </w:t>
+        <w:t>seguimiento del desarrollo;</w:t>
       </w:r>
     </w:p>
     <w:p>
@@ -1982,7 +2577,7 @@
         <w:jc w:val="left"/>
       </w:pPr>
       <w:r>
-        <w:t xml:space="preserve">recepción técnica obligatoria; </w:t>
+        <w:t>verificación del cumplimiento de estándares;</w:t>
       </w:r>
     </w:p>
     <w:p>
@@ -1995,7 +2590,20 @@
         <w:jc w:val="left"/>
       </w:pPr>
       <w:r>
-        <w:t xml:space="preserve">entrega de código fuente y documentación. </w:t>
+        <w:t>recepción técnica obligatoria;</w:t>
+      </w:r>
+    </w:p>
+    <w:p>
+      <w:pPr>
+        <w:numPr>
+          <w:ilvl w:val="0"/>
+          <w:numId w:val="6"/>
+        </w:numPr>
+        <w:spacing w:before="100" w:beforeAutospacing="1" w:afterAutospacing="1" w:line="240" w:lineRule="auto"/>
+        <w:jc w:val="left"/>
+      </w:pPr>
+      <w:r>
+        <w:t>entrega de código fuente y documentación.</w:t>
       </w:r>
     </w:p>
     <w:p>
@@ -2008,10 +2616,1018 @@
     </w:p>
     <w:p>
       <w:pPr>
+        <w:pStyle w:val="Ttulo2"/>
+      </w:pPr>
+    </w:p>
+    <w:p>
+      <w:r>
+        <w:rPr>
+          <w:rFonts w:eastAsia="Times New Roman"/>
+          <w:sz w:val="24"/>
+          <w:szCs w:val="24"/>
+        </w:rPr>
+        <w:t>Se fortalecerá la soberanía tecnológica del Municipio, se reducirá la dependencia de proveedores externos y se favorecerá el desarrollo de soluciones alineadas con los procesos administrativos y las necesidades de las áreas usuarias, mediante la participación activa del personal del Departamento con conocimiento funcional en cada proyecto.</w:t>
+      </w:r>
+      <w:r>
+        <w:pict>
+          <v:rect id="_x0000_i1029" style="width:0;height:1.5pt" o:hralign="center" o:hrstd="t" o:hr="t" fillcolor="#a0a0a0" stroked="f"/>
+        </w:pict>
+      </w:r>
+    </w:p>
+    <w:p>
+      <w:pPr>
+        <w:pStyle w:val="Ttulo1"/>
+      </w:pPr>
+      <w:r>
+        <w:t>5.6 Innovación tecnológica responsable</w:t>
+      </w:r>
+    </w:p>
+    <w:p>
+      <w:pPr>
+        <w:pStyle w:val="Ttulo2"/>
+      </w:pPr>
+      <w:r>
+        <w:t>Problema</w:t>
+      </w:r>
+    </w:p>
+    <w:p>
+      <w:pPr>
+        <w:pStyle w:val="Ttulo2"/>
+        <w:rPr>
+          <w:rFonts w:eastAsia="Times New Roman"/>
+          <w:color w:val="auto"/>
+          <w:sz w:val="24"/>
+          <w:szCs w:val="24"/>
+        </w:rPr>
+      </w:pPr>
+      <w:r>
+        <w:rPr>
+          <w:rFonts w:eastAsia="Times New Roman"/>
+          <w:color w:val="auto"/>
+          <w:sz w:val="24"/>
+          <w:szCs w:val="24"/>
+        </w:rPr>
+        <w:t>La incorporación de nuevas herramientas y tecnologías suele realizarse sin criterios institucionales comunes, quedando muchas veces librada a decisiones individuales. Asimismo, la coexistencia de tecnologías obsoletas y plataformas con soporte vigente dificulta la estandarización del desarrollo y la evolución tecnológica del Departamento.</w:t>
+      </w:r>
+    </w:p>
+    <w:p>
+      <w:pPr>
+        <w:pStyle w:val="Ttulo2"/>
+        <w:rPr>
+          <w:rFonts w:eastAsia="Times New Roman"/>
+          <w:color w:val="auto"/>
+          <w:sz w:val="24"/>
+          <w:szCs w:val="24"/>
+        </w:rPr>
+      </w:pPr>
+    </w:p>
+    <w:p>
+      <w:pPr>
+        <w:pStyle w:val="Ttulo2"/>
+      </w:pPr>
+      <w:r>
+        <w:t>Propuesta</w:t>
+      </w:r>
+    </w:p>
+    <w:p>
+      <w:pPr>
         <w:pStyle w:val="NormalWeb"/>
-      </w:pPr>
-      <w:r>
-        <w:t>Se fortalecerá la soberanía tecnológica del Municipio y se garantizará la continuidad futura de los sistemas incorporados.</w:t>
+        <w:rPr>
+          <w:rFonts w:ascii="Arial" w:hAnsi="Arial" w:cs="Arial"/>
+        </w:rPr>
+      </w:pPr>
+      <w:r>
+        <w:rPr>
+          <w:rFonts w:ascii="Arial" w:hAnsi="Arial" w:cs="Arial"/>
+        </w:rPr>
+        <w:t>La innovación será gestionada como una política permanente del Departamento, evaluando cada tecnología en función de su utilidad, sostenibilidad, impacto organizacional, disponibilidad de soporte y compatibilidad con la estrategia tecnológica municipal. En este marco, se promoverá que los nuevos desarrollos adopten tecnologías</w:t>
+      </w:r>
+      <w:r>
+        <w:rPr>
+          <w:rFonts w:ascii="Arial" w:hAnsi="Arial" w:cs="Arial"/>
+        </w:rPr>
+        <w:t xml:space="preserve"> vigentes y con soporte activo</w:t>
+      </w:r>
+      <w:r>
+        <w:rPr>
+          <w:rFonts w:ascii="Arial" w:hAnsi="Arial" w:cs="Arial"/>
+        </w:rPr>
+        <w:t>, evitando la utilización de plataformas obsoletas, salvo en aquellos casos donde existan razones técnicas debidamente justificadas o la necesidad de mantener la compati</w:t>
+      </w:r>
+      <w:r>
+        <w:rPr>
+          <w:rFonts w:ascii="Arial" w:hAnsi="Arial" w:cs="Arial"/>
+        </w:rPr>
+        <w:t>bilidad con sistemas existentes</w:t>
+      </w:r>
+      <w:r>
+        <w:rPr>
+          <w:rFonts w:ascii="Arial" w:hAnsi="Arial" w:cs="Arial"/>
+        </w:rPr>
+        <w:t>.</w:t>
+      </w:r>
+    </w:p>
+    <w:p>
+      <w:pPr>
+        <w:pStyle w:val="Ttulo2"/>
+        <w:rPr>
+          <w:rFonts w:eastAsia="Times New Roman"/>
+          <w:color w:val="auto"/>
+          <w:sz w:val="24"/>
+          <w:szCs w:val="24"/>
+        </w:rPr>
+      </w:pPr>
+      <w:r>
+        <w:rPr>
+          <w:rFonts w:eastAsia="Times New Roman"/>
+          <w:color w:val="auto"/>
+          <w:sz w:val="24"/>
+          <w:szCs w:val="24"/>
+        </w:rPr>
+        <w:lastRenderedPageBreak/>
+        <w:t>La Inteligencia Artificial será considerada una herramienta de apoyo para incrementar la productividad del equipo mediante la utilización de asistentes de IA disponibles sin costo e integrados a los entornos de desarrollo (IDE), facilitando la detección de errores, la generación de documentación técnica, la asistencia durante el desarrollo y la automatización de tareas repetitivas, manteniendo siempre la supervisión profesional y la protección de la información institucional.</w:t>
+      </w:r>
+    </w:p>
+    <w:p>
+      <w:pPr>
+        <w:pStyle w:val="Ttulo2"/>
+        <w:rPr>
+          <w:rFonts w:eastAsia="Times New Roman"/>
+          <w:color w:val="auto"/>
+          <w:sz w:val="24"/>
+          <w:szCs w:val="24"/>
+        </w:rPr>
+      </w:pPr>
+      <w:r>
+        <w:rPr>
+          <w:rFonts w:eastAsia="Times New Roman"/>
+          <w:color w:val="auto"/>
+          <w:sz w:val="24"/>
+          <w:szCs w:val="24"/>
+        </w:rPr>
+        <w:t>La incorporación de nuevas tecnologías se realizará de manera gradual, priorizando su adopción en proyectos nuevos donde la resistencia inicial es menor. Los agentes con mayor experiencia en tecnologías actualizadas acompañarán a quienes están en proceso de transición mediante trabajo conjunto y capacitación interna, evitando imponer cambios abruptos que generen rechazo.</w:t>
+      </w:r>
+    </w:p>
+    <w:p>
+      <w:pPr>
+        <w:pStyle w:val="Ttulo2"/>
+        <w:rPr>
+          <w:rFonts w:eastAsia="Times New Roman"/>
+          <w:color w:val="auto"/>
+          <w:sz w:val="24"/>
+          <w:szCs w:val="24"/>
+        </w:rPr>
+      </w:pPr>
+    </w:p>
+    <w:p>
+      <w:pPr>
+        <w:pStyle w:val="Ttulo2"/>
+      </w:pPr>
+      <w:r>
+        <w:t>Implementación</w:t>
+      </w:r>
+    </w:p>
+    <w:p>
+      <w:pPr>
+        <w:pStyle w:val="NormalWeb"/>
+        <w:rPr>
+          <w:rFonts w:ascii="Arial" w:hAnsi="Arial" w:cs="Arial"/>
+        </w:rPr>
+      </w:pPr>
+      <w:r>
+        <w:rPr>
+          <w:rFonts w:ascii="Arial" w:hAnsi="Arial" w:cs="Arial"/>
+        </w:rPr>
+        <w:t>Se promoverán:</w:t>
+      </w:r>
+    </w:p>
+    <w:p>
+      <w:pPr>
+        <w:pStyle w:val="Ttulo2"/>
+        <w:numPr>
+          <w:ilvl w:val="0"/>
+          <w:numId w:val="12"/>
+        </w:numPr>
+        <w:rPr>
+          <w:color w:val="auto"/>
+          <w:sz w:val="22"/>
+          <w:szCs w:val="22"/>
+        </w:rPr>
+      </w:pPr>
+      <w:proofErr w:type="gramStart"/>
+      <w:r>
+        <w:rPr>
+          <w:color w:val="auto"/>
+          <w:sz w:val="22"/>
+          <w:szCs w:val="22"/>
+        </w:rPr>
+        <w:t>evaluación</w:t>
+      </w:r>
+      <w:proofErr w:type="gramEnd"/>
+      <w:r>
+        <w:rPr>
+          <w:color w:val="auto"/>
+          <w:sz w:val="22"/>
+          <w:szCs w:val="22"/>
+        </w:rPr>
+        <w:t xml:space="preserve"> permanente de nuevas tecnologías;</w:t>
+      </w:r>
+    </w:p>
+    <w:p>
+      <w:pPr>
+        <w:pStyle w:val="Ttulo2"/>
+        <w:numPr>
+          <w:ilvl w:val="0"/>
+          <w:numId w:val="12"/>
+        </w:numPr>
+        <w:rPr>
+          <w:color w:val="auto"/>
+          <w:sz w:val="22"/>
+          <w:szCs w:val="22"/>
+        </w:rPr>
+      </w:pPr>
+      <w:proofErr w:type="gramStart"/>
+      <w:r>
+        <w:rPr>
+          <w:color w:val="auto"/>
+          <w:sz w:val="22"/>
+          <w:szCs w:val="22"/>
+        </w:rPr>
+        <w:t>definición</w:t>
+      </w:r>
+      <w:proofErr w:type="gramEnd"/>
+      <w:r>
+        <w:rPr>
+          <w:color w:val="auto"/>
+          <w:sz w:val="22"/>
+          <w:szCs w:val="22"/>
+        </w:rPr>
+        <w:t xml:space="preserve"> de criterios institucionales para su incorporación al Departamento;</w:t>
+      </w:r>
+    </w:p>
+    <w:p>
+      <w:pPr>
+        <w:pStyle w:val="Ttulo2"/>
+        <w:numPr>
+          <w:ilvl w:val="0"/>
+          <w:numId w:val="12"/>
+        </w:numPr>
+        <w:rPr>
+          <w:color w:val="auto"/>
+          <w:sz w:val="22"/>
+          <w:szCs w:val="22"/>
+        </w:rPr>
+      </w:pPr>
+      <w:proofErr w:type="gramStart"/>
+      <w:r>
+        <w:rPr>
+          <w:color w:val="auto"/>
+          <w:sz w:val="22"/>
+          <w:szCs w:val="22"/>
+        </w:rPr>
+        <w:t>capacitación</w:t>
+      </w:r>
+      <w:proofErr w:type="gramEnd"/>
+      <w:r>
+        <w:rPr>
+          <w:color w:val="auto"/>
+          <w:sz w:val="22"/>
+          <w:szCs w:val="22"/>
+        </w:rPr>
+        <w:t xml:space="preserve"> del personal;</w:t>
+      </w:r>
+    </w:p>
+    <w:p>
+      <w:pPr>
+        <w:pStyle w:val="Ttulo2"/>
+        <w:numPr>
+          <w:ilvl w:val="0"/>
+          <w:numId w:val="12"/>
+        </w:numPr>
+        <w:rPr>
+          <w:color w:val="auto"/>
+          <w:sz w:val="22"/>
+          <w:szCs w:val="22"/>
+        </w:rPr>
+      </w:pPr>
+      <w:proofErr w:type="gramStart"/>
+      <w:r>
+        <w:rPr>
+          <w:color w:val="auto"/>
+          <w:sz w:val="22"/>
+          <w:szCs w:val="22"/>
+        </w:rPr>
+        <w:t>pautas</w:t>
+      </w:r>
+      <w:proofErr w:type="gramEnd"/>
+      <w:r>
+        <w:rPr>
+          <w:color w:val="auto"/>
+          <w:sz w:val="22"/>
+          <w:szCs w:val="22"/>
+        </w:rPr>
+        <w:t xml:space="preserve"> institucionales para el uso seguro de IA;</w:t>
+      </w:r>
+    </w:p>
+    <w:p>
+      <w:pPr>
+        <w:pStyle w:val="Ttulo2"/>
+        <w:numPr>
+          <w:ilvl w:val="0"/>
+          <w:numId w:val="12"/>
+        </w:numPr>
+        <w:rPr>
+          <w:color w:val="auto"/>
+          <w:sz w:val="22"/>
+          <w:szCs w:val="22"/>
+        </w:rPr>
+      </w:pPr>
+      <w:proofErr w:type="gramStart"/>
+      <w:r>
+        <w:rPr>
+          <w:color w:val="auto"/>
+          <w:sz w:val="22"/>
+          <w:szCs w:val="22"/>
+        </w:rPr>
+        <w:t>revisión</w:t>
+      </w:r>
+      <w:proofErr w:type="gramEnd"/>
+      <w:r>
+        <w:rPr>
+          <w:color w:val="auto"/>
+          <w:sz w:val="22"/>
+          <w:szCs w:val="22"/>
+        </w:rPr>
+        <w:t xml:space="preserve"> periódica de herramientas y metodologías</w:t>
+      </w:r>
+      <w:r>
+        <w:rPr>
+          <w:color w:val="auto"/>
+          <w:sz w:val="22"/>
+          <w:szCs w:val="22"/>
+        </w:rPr>
+        <w:t>.</w:t>
+      </w:r>
+    </w:p>
+    <w:p>
+      <w:pPr>
+        <w:pStyle w:val="Ttulo2"/>
+        <w:ind w:left="720"/>
+        <w:rPr>
+          <w:color w:val="auto"/>
+          <w:sz w:val="22"/>
+          <w:szCs w:val="22"/>
+        </w:rPr>
+      </w:pPr>
+    </w:p>
+    <w:p>
+      <w:pPr>
+        <w:pStyle w:val="Ttulo2"/>
+      </w:pPr>
+      <w:r>
+        <w:t>Resultado esperado</w:t>
+      </w:r>
+    </w:p>
+    <w:p>
+      <w:pPr>
+        <w:rPr>
+          <w:rFonts w:eastAsia="Times New Roman"/>
+          <w:sz w:val="24"/>
+          <w:szCs w:val="24"/>
+        </w:rPr>
+      </w:pPr>
+      <w:r>
+        <w:rPr>
+          <w:rFonts w:eastAsia="Times New Roman"/>
+          <w:sz w:val="24"/>
+          <w:szCs w:val="24"/>
+        </w:rPr>
+        <w:t>El Departamento podrá incorporar nuevas tecnologías de manera planificada, gradual y segura, incrementando la productividad del equipo, favoreciendo la estandarización tecnológica y asegurando la sostenibilidad de los sistemas municipales sin comprometer la seguridad de la información.</w:t>
+      </w:r>
+    </w:p>
+    <w:p>
+      <w:pPr>
+        <w:rPr>
+          <w:rFonts w:eastAsia="Times New Roman"/>
+          <w:sz w:val="24"/>
+          <w:szCs w:val="24"/>
+        </w:rPr>
+      </w:pPr>
+    </w:p>
+    <w:p>
+      <w:pPr>
+        <w:pStyle w:val="Ttulo1"/>
+      </w:pPr>
+      <w:r>
+        <w:t>5.</w:t>
+      </w:r>
+      <w:r>
+        <w:t>7</w:t>
+      </w:r>
+      <w:r>
+        <w:t xml:space="preserve"> </w:t>
+      </w:r>
+      <w:r>
+        <w:t>Coordinación y comunicación interna entre equipos</w:t>
+      </w:r>
+    </w:p>
+    <w:p>
+      <w:pPr>
+        <w:pStyle w:val="Ttulo2"/>
+      </w:pPr>
+      <w:r>
+        <w:t>Problema</w:t>
+      </w:r>
+    </w:p>
+    <w:p>
+      <w:pPr>
+        <w:pStyle w:val="Ttulo2"/>
+        <w:rPr>
+          <w:color w:val="auto"/>
+          <w:sz w:val="24"/>
+          <w:szCs w:val="24"/>
+        </w:rPr>
+      </w:pPr>
+      <w:r>
+        <w:rPr>
+          <w:color w:val="auto"/>
+          <w:sz w:val="24"/>
+          <w:szCs w:val="24"/>
+        </w:rPr>
+        <w:t>La distribución física del personal en distintas dependencias limita la circulación oportuna de información, favorece el aislamiento entre grupos de trabajo y dificulta la construcción de una identidad de equipo común.</w:t>
+      </w:r>
+    </w:p>
+    <w:p>
+      <w:pPr>
+        <w:pStyle w:val="Ttulo2"/>
+      </w:pPr>
+      <w:r>
+        <w:br/>
+      </w:r>
+      <w:r>
+        <w:t>Pro</w:t>
+      </w:r>
+      <w:r>
+        <w:t>puesta</w:t>
+      </w:r>
+    </w:p>
+    <w:p>
+      <w:pPr>
+        <w:pStyle w:val="Ttulo2"/>
+        <w:rPr>
+          <w:color w:val="auto"/>
+          <w:sz w:val="24"/>
+          <w:szCs w:val="24"/>
+        </w:rPr>
+      </w:pPr>
+      <w:r>
+        <w:rPr>
+          <w:color w:val="auto"/>
+          <w:sz w:val="24"/>
+          <w:szCs w:val="24"/>
+        </w:rPr>
+        <w:t>La Jefatura institucionalizará un esquema permanente de coordinación transversal aprovechando las herramientas institucionales ya disponibles. El objetivo es garantizar que todos los integrantes del Departamento compartan información sobre proyectos en curso, dificultades detectadas y prioridades institucionales, independientemente de su ubicación física.</w:t>
+      </w:r>
+    </w:p>
+    <w:p>
+      <w:pPr>
+        <w:pStyle w:val="Ttulo2"/>
+      </w:pPr>
+    </w:p>
+    <w:p>
+      <w:pPr>
+        <w:pStyle w:val="Ttulo2"/>
+      </w:pPr>
+      <w:r>
+        <w:lastRenderedPageBreak/>
+        <w:t>Implementación</w:t>
+      </w:r>
+    </w:p>
+    <w:p>
+      <w:pPr>
+        <w:pStyle w:val="NormalWeb"/>
+        <w:rPr>
+          <w:rFonts w:ascii="Arial" w:hAnsi="Arial" w:cs="Arial"/>
+        </w:rPr>
+      </w:pPr>
+      <w:r>
+        <w:rPr>
+          <w:rFonts w:ascii="Arial" w:hAnsi="Arial" w:cs="Arial"/>
+        </w:rPr>
+        <w:t>Se promoverán:</w:t>
+      </w:r>
+    </w:p>
+    <w:p>
+      <w:pPr>
+        <w:pStyle w:val="Prrafodelista"/>
+        <w:numPr>
+          <w:ilvl w:val="0"/>
+          <w:numId w:val="13"/>
+        </w:numPr>
+        <w:rPr>
+          <w:rFonts w:eastAsia="Times New Roman"/>
+        </w:rPr>
+      </w:pPr>
+      <w:r>
+        <w:rPr>
+          <w:rFonts w:eastAsia="Times New Roman"/>
+        </w:rPr>
+        <w:t>reuniones periódicas breves de sincronización inter-oficinas con agenda predefinida;</w:t>
+      </w:r>
+    </w:p>
+    <w:p>
+      <w:pPr>
+        <w:pStyle w:val="Prrafodelista"/>
+        <w:numPr>
+          <w:ilvl w:val="0"/>
+          <w:numId w:val="13"/>
+        </w:numPr>
+        <w:rPr>
+          <w:rFonts w:eastAsia="Times New Roman"/>
+        </w:rPr>
+      </w:pPr>
+      <w:r>
+        <w:rPr>
+          <w:rFonts w:eastAsia="Times New Roman"/>
+        </w:rPr>
+        <w:t xml:space="preserve">uso de </w:t>
+      </w:r>
+      <w:proofErr w:type="spellStart"/>
+      <w:r>
+        <w:rPr>
+          <w:rFonts w:eastAsia="Times New Roman"/>
+        </w:rPr>
+        <w:t>Redmine</w:t>
+      </w:r>
+      <w:proofErr w:type="spellEnd"/>
+      <w:r>
+        <w:rPr>
+          <w:rFonts w:eastAsia="Times New Roman"/>
+        </w:rPr>
+        <w:t xml:space="preserve"> como tablero compartido de visibilidad del estado de todos los proyectos del Departamento;</w:t>
+      </w:r>
+    </w:p>
+    <w:p>
+      <w:pPr>
+        <w:pStyle w:val="Prrafodelista"/>
+        <w:numPr>
+          <w:ilvl w:val="0"/>
+          <w:numId w:val="13"/>
+        </w:numPr>
+        <w:rPr>
+          <w:rFonts w:eastAsia="Times New Roman"/>
+        </w:rPr>
+      </w:pPr>
+      <w:r>
+        <w:rPr>
+          <w:rFonts w:eastAsia="Times New Roman"/>
+        </w:rPr>
+        <w:t>criterios comunes para registrar avances, bloqueos y decisiones técnicas relevantes;</w:t>
+      </w:r>
+    </w:p>
+    <w:p>
+      <w:pPr>
+        <w:pStyle w:val="Prrafodelista"/>
+        <w:numPr>
+          <w:ilvl w:val="0"/>
+          <w:numId w:val="13"/>
+        </w:numPr>
+        <w:rPr>
+          <w:rFonts w:eastAsia="Times New Roman"/>
+        </w:rPr>
+      </w:pPr>
+      <w:r>
+        <w:rPr>
+          <w:rFonts w:eastAsia="Times New Roman"/>
+        </w:rPr>
+        <w:t>participación cruzada planificada en proyectos para favorecer el conocimiento mutuo entre equipos.</w:t>
+      </w:r>
+    </w:p>
+    <w:p>
+      <w:pPr>
+        <w:pStyle w:val="Prrafodelista"/>
+        <w:ind w:left="720"/>
+        <w:rPr>
+          <w:rFonts w:eastAsia="Times New Roman"/>
+        </w:rPr>
+      </w:pPr>
+    </w:p>
+    <w:p>
+      <w:pPr>
+        <w:pStyle w:val="Ttulo2"/>
+      </w:pPr>
+      <w:r>
+        <w:t>Resultado esperado</w:t>
+      </w:r>
+    </w:p>
+    <w:p>
+      <w:pPr>
+        <w:rPr>
+          <w:rFonts w:eastAsia="Times New Roman"/>
+          <w:sz w:val="24"/>
+          <w:szCs w:val="24"/>
+        </w:rPr>
+      </w:pPr>
+      <w:r>
+        <w:rPr>
+          <w:rFonts w:eastAsia="Times New Roman"/>
+          <w:sz w:val="24"/>
+          <w:szCs w:val="24"/>
+        </w:rPr>
+        <w:t>Se reducirá el aislamiento entre grupos de trabajo, mejorará la circulación de información técnica y se fortalecerá la cohesión del equipo como unidad institucional.</w:t>
+      </w:r>
+    </w:p>
+    <w:p>
+      <w:pPr>
+        <w:rPr>
+          <w:rFonts w:eastAsia="Times New Roman"/>
+          <w:sz w:val="24"/>
+          <w:szCs w:val="24"/>
+        </w:rPr>
+      </w:pPr>
+    </w:p>
+    <w:p>
+      <w:pPr>
+        <w:pStyle w:val="Ttulo1"/>
+      </w:pPr>
+      <w:r>
+        <w:t>5.</w:t>
+      </w:r>
+      <w:r>
+        <w:t>8</w:t>
+      </w:r>
+      <w:r>
+        <w:t xml:space="preserve"> </w:t>
+      </w:r>
+      <w:r>
+        <w:t>Optimización de roles según experiencia acumulada</w:t>
+      </w:r>
+    </w:p>
+    <w:p>
+      <w:pPr>
+        <w:pStyle w:val="Ttulo2"/>
+      </w:pPr>
+      <w:r>
+        <w:t>Problema</w:t>
+      </w:r>
+    </w:p>
+    <w:p>
+      <w:pPr>
+        <w:pStyle w:val="Ttulo2"/>
+        <w:rPr>
+          <w:color w:val="auto"/>
+          <w:sz w:val="24"/>
+          <w:szCs w:val="24"/>
+        </w:rPr>
+      </w:pPr>
+      <w:r>
+        <w:rPr>
+          <w:color w:val="auto"/>
+          <w:sz w:val="24"/>
+          <w:szCs w:val="24"/>
+        </w:rPr>
+        <w:t xml:space="preserve">La dotación actual del Departamento requiere que los agentes desempeñen simultáneamente tareas de análisis, desarrollo, mantenimiento y soporte funcional, independientemente de la especialización prevista por la estructura </w:t>
+      </w:r>
+      <w:proofErr w:type="spellStart"/>
+      <w:r>
+        <w:rPr>
+          <w:color w:val="auto"/>
+          <w:sz w:val="24"/>
+          <w:szCs w:val="24"/>
+        </w:rPr>
+        <w:t>escalafonaria</w:t>
+      </w:r>
+      <w:proofErr w:type="spellEnd"/>
+      <w:r>
+        <w:rPr>
+          <w:color w:val="auto"/>
+          <w:sz w:val="24"/>
+          <w:szCs w:val="24"/>
+        </w:rPr>
+        <w:t>, lo que dificulta la conformación de equipos con roles claramente diferenciados.</w:t>
+      </w:r>
+    </w:p>
+    <w:p>
+      <w:pPr>
+        <w:pStyle w:val="Ttulo2"/>
+      </w:pPr>
+      <w:r>
+        <w:br/>
+        <w:t>Propuesta</w:t>
+      </w:r>
+    </w:p>
+    <w:p>
+      <w:pPr>
+        <w:pStyle w:val="Ttulo2"/>
+        <w:rPr>
+          <w:color w:val="auto"/>
+          <w:sz w:val="24"/>
+          <w:szCs w:val="24"/>
+        </w:rPr>
+      </w:pPr>
+      <w:r>
+        <w:rPr>
+          <w:color w:val="auto"/>
+          <w:sz w:val="24"/>
+          <w:szCs w:val="24"/>
+        </w:rPr>
+        <w:t xml:space="preserve">Sin modificar la estructura </w:t>
+      </w:r>
+      <w:proofErr w:type="spellStart"/>
+      <w:r>
+        <w:rPr>
+          <w:color w:val="auto"/>
+          <w:sz w:val="24"/>
+          <w:szCs w:val="24"/>
+        </w:rPr>
+        <w:t>escalafonaria</w:t>
+      </w:r>
+      <w:proofErr w:type="spellEnd"/>
+      <w:r>
+        <w:rPr>
+          <w:color w:val="auto"/>
+          <w:sz w:val="24"/>
+          <w:szCs w:val="24"/>
+        </w:rPr>
+        <w:t xml:space="preserve"> vigente ni requerir recursos presupuestarios adicionales, la organización del trabajo asignará las responsabilidades de análisis, relevamiento funcional y coordinación técnica considerando la experiencia acumulada por cada agente y su conocimiento práctico del funcionamiento municipal.</w:t>
+      </w:r>
+    </w:p>
+    <w:p>
+      <w:pPr>
+        <w:pStyle w:val="Ttulo2"/>
+      </w:pPr>
+    </w:p>
+    <w:p>
+      <w:pPr>
+        <w:pStyle w:val="Ttulo2"/>
+      </w:pPr>
+      <w:r>
+        <w:t>Implementación</w:t>
+      </w:r>
+    </w:p>
+    <w:p>
+      <w:pPr>
+        <w:rPr>
+          <w:rFonts w:eastAsia="Times New Roman"/>
+          <w:sz w:val="24"/>
+          <w:szCs w:val="24"/>
+        </w:rPr>
+      </w:pPr>
+    </w:p>
+    <w:p>
+      <w:pPr>
+        <w:rPr>
+          <w:rFonts w:eastAsia="Times New Roman"/>
+          <w:sz w:val="24"/>
+          <w:szCs w:val="24"/>
+        </w:rPr>
+      </w:pPr>
+      <w:r>
+        <w:rPr>
+          <w:rFonts w:eastAsia="Times New Roman"/>
+          <w:sz w:val="24"/>
+          <w:szCs w:val="24"/>
+        </w:rPr>
+        <w:t>La implementación comprenderá:</w:t>
+      </w:r>
+    </w:p>
+    <w:p>
+      <w:pPr>
+        <w:pStyle w:val="Prrafodelista"/>
+        <w:ind w:left="720"/>
+        <w:rPr>
+          <w:rFonts w:eastAsia="Times New Roman"/>
+        </w:rPr>
+      </w:pPr>
+      <w:r>
+        <w:rPr>
+          <w:rFonts w:eastAsia="Times New Roman"/>
+        </w:rPr>
+        <w:t xml:space="preserve">• </w:t>
+      </w:r>
+      <w:proofErr w:type="gramStart"/>
+      <w:r>
+        <w:rPr>
+          <w:rFonts w:eastAsia="Times New Roman"/>
+        </w:rPr>
+        <w:t>asignación</w:t>
+      </w:r>
+      <w:proofErr w:type="gramEnd"/>
+      <w:r>
+        <w:rPr>
+          <w:rFonts w:eastAsia="Times New Roman"/>
+        </w:rPr>
+        <w:t xml:space="preserve"> informal de referentes funcionales según la trayectoria de cada integrante;</w:t>
+      </w:r>
+    </w:p>
+    <w:p>
+      <w:pPr>
+        <w:pStyle w:val="Prrafodelista"/>
+        <w:ind w:left="720"/>
+        <w:rPr>
+          <w:rFonts w:eastAsia="Times New Roman"/>
+        </w:rPr>
+      </w:pPr>
+      <w:r>
+        <w:rPr>
+          <w:rFonts w:eastAsia="Times New Roman"/>
+        </w:rPr>
+        <w:t xml:space="preserve">• </w:t>
+      </w:r>
+      <w:proofErr w:type="gramStart"/>
+      <w:r>
+        <w:rPr>
+          <w:rFonts w:eastAsia="Times New Roman"/>
+        </w:rPr>
+        <w:t>distribución</w:t>
+      </w:r>
+      <w:proofErr w:type="gramEnd"/>
+      <w:r>
+        <w:rPr>
+          <w:rFonts w:eastAsia="Times New Roman"/>
+        </w:rPr>
+        <w:t xml:space="preserve"> de tareas priorizando la experiencia en los procesos administrativos municipales;</w:t>
+      </w:r>
+    </w:p>
+    <w:p>
+      <w:pPr>
+        <w:pStyle w:val="Prrafodelista"/>
+        <w:ind w:left="720"/>
+        <w:rPr>
+          <w:rFonts w:eastAsia="Times New Roman"/>
+        </w:rPr>
+      </w:pPr>
+      <w:r>
+        <w:rPr>
+          <w:rFonts w:eastAsia="Times New Roman"/>
+        </w:rPr>
+        <w:t xml:space="preserve">• </w:t>
+      </w:r>
+      <w:proofErr w:type="gramStart"/>
+      <w:r>
+        <w:rPr>
+          <w:rFonts w:eastAsia="Times New Roman"/>
+        </w:rPr>
+        <w:t>acompañamiento</w:t>
+      </w:r>
+      <w:proofErr w:type="gramEnd"/>
+      <w:r>
+        <w:rPr>
+          <w:rFonts w:eastAsia="Times New Roman"/>
+        </w:rPr>
+        <w:t xml:space="preserve"> de los perfiles experimentados a los agentes de más reciente incorporación;</w:t>
+      </w:r>
+    </w:p>
+    <w:p>
+      <w:pPr>
+        <w:pStyle w:val="Prrafodelista"/>
+        <w:ind w:left="720"/>
+        <w:rPr>
+          <w:rFonts w:eastAsia="Times New Roman"/>
+        </w:rPr>
+      </w:pPr>
+      <w:r>
+        <w:rPr>
+          <w:rFonts w:eastAsia="Times New Roman"/>
+        </w:rPr>
+        <w:t xml:space="preserve">• </w:t>
+      </w:r>
+      <w:proofErr w:type="gramStart"/>
+      <w:r>
+        <w:rPr>
+          <w:rFonts w:eastAsia="Times New Roman"/>
+        </w:rPr>
+        <w:t>revisión</w:t>
+      </w:r>
+      <w:proofErr w:type="gramEnd"/>
+      <w:r>
+        <w:rPr>
+          <w:rFonts w:eastAsia="Times New Roman"/>
+        </w:rPr>
+        <w:t xml:space="preserve"> periódica de la asignación de roles según la evolución de cada proyecto.</w:t>
+      </w:r>
+    </w:p>
+    <w:p>
+      <w:pPr>
+        <w:pStyle w:val="Prrafodelista"/>
+        <w:ind w:left="720"/>
+        <w:rPr>
+          <w:rFonts w:eastAsia="Times New Roman"/>
+        </w:rPr>
+      </w:pPr>
+    </w:p>
+    <w:p>
+      <w:pPr>
+        <w:pStyle w:val="Ttulo2"/>
+      </w:pPr>
+      <w:r>
+        <w:t>Resultado esperado</w:t>
+      </w:r>
+    </w:p>
+    <w:p>
+      <w:pPr>
+        <w:rPr>
+          <w:rFonts w:eastAsia="Times New Roman"/>
+          <w:sz w:val="24"/>
+          <w:szCs w:val="24"/>
+        </w:rPr>
+      </w:pPr>
+      <w:r>
+        <w:rPr>
+          <w:rFonts w:eastAsia="Times New Roman"/>
+          <w:sz w:val="24"/>
+          <w:szCs w:val="24"/>
+        </w:rPr>
+        <w:lastRenderedPageBreak/>
+        <w:t>Esta medida permitirá optimizar la distribución del trabajo con los recursos actuales, jerarquizar la experiencia del personal existente y mejorar la calidad en el relevamiento de necesidades con las áreas us</w:t>
+      </w:r>
+      <w:r>
+        <w:rPr>
+          <w:rFonts w:eastAsia="Times New Roman"/>
+          <w:sz w:val="24"/>
+          <w:szCs w:val="24"/>
+        </w:rPr>
+        <w:t>uarias</w:t>
+      </w:r>
+      <w:r>
+        <w:rPr>
+          <w:rFonts w:eastAsia="Times New Roman"/>
+          <w:sz w:val="24"/>
+          <w:szCs w:val="24"/>
+        </w:rPr>
+        <w:t>.</w:t>
+      </w:r>
+    </w:p>
+    <w:p>
+      <w:pPr>
+        <w:rPr>
+          <w:rFonts w:eastAsia="Times New Roman"/>
+        </w:rPr>
+      </w:pPr>
+    </w:p>
+    <w:p/>
+    <w:p>
+      <w:pPr>
+        <w:pStyle w:val="Ttulo1"/>
+      </w:pPr>
+      <w:r>
+        <w:t>6. PROYECCIÓN CON INCORPORACIÓN DE RECURSOS</w:t>
+      </w:r>
+    </w:p>
+    <w:p>
+      <w:pPr>
+        <w:pStyle w:val="NormalWeb"/>
+        <w:rPr>
+          <w:rFonts w:ascii="Arial" w:hAnsi="Arial" w:cs="Arial"/>
+        </w:rPr>
+      </w:pPr>
+      <w:r>
+        <w:rPr>
+          <w:rFonts w:ascii="Arial" w:hAnsi="Arial" w:cs="Arial"/>
+        </w:rPr>
+        <w:t xml:space="preserve">Las acciones desarrolladas en el capítulo anterior pueden implementarse utilizando los recursos actualmente disponibles y constituyen una estrategia realista para mejorar el </w:t>
+      </w:r>
+      <w:proofErr w:type="gramStart"/>
+      <w:r>
+        <w:rPr>
+          <w:rFonts w:ascii="Arial" w:hAnsi="Arial" w:cs="Arial"/>
+        </w:rPr>
+        <w:t>funcionamiento</w:t>
+      </w:r>
+      <w:proofErr w:type="gramEnd"/>
+      <w:r>
+        <w:rPr>
+          <w:rFonts w:ascii="Arial" w:hAnsi="Arial" w:cs="Arial"/>
+        </w:rPr>
+        <w:t xml:space="preserve"> del Departamento.</w:t>
+      </w:r>
+    </w:p>
+    <w:p>
+      <w:pPr>
+        <w:pStyle w:val="NormalWeb"/>
+        <w:rPr>
+          <w:rFonts w:ascii="Arial" w:hAnsi="Arial" w:cs="Arial"/>
+        </w:rPr>
+      </w:pPr>
+      <w:r>
+        <w:rPr>
+          <w:rFonts w:ascii="Arial" w:hAnsi="Arial" w:cs="Arial"/>
+        </w:rPr>
+        <w:t>No obstante, la incorporación gradual de recursos presupuestarios permitiría consolidar y potenciar dichas acciones, incrementando la productividad del equipo, fortaleciendo la calidad del software y acelerando el proceso de modernización tecnológica.</w:t>
+      </w:r>
+    </w:p>
+    <w:p>
+      <w:pPr>
+        <w:pStyle w:val="NormalWeb"/>
+        <w:rPr>
+          <w:rFonts w:ascii="Arial" w:hAnsi="Arial" w:cs="Arial"/>
+        </w:rPr>
+      </w:pPr>
+      <w:r>
+        <w:rPr>
+          <w:rFonts w:ascii="Arial" w:hAnsi="Arial" w:cs="Arial"/>
+        </w:rPr>
+        <w:t>En este contexto, se identifican las siguientes líneas de inversión prioritaria.</w:t>
       </w:r>
     </w:p>
     <w:p>
@@ -2023,168 +3639,66 @@
     </w:p>
     <w:p>
       <w:pPr>
-        <w:pStyle w:val="Ttulo1"/>
-      </w:pPr>
-      <w:r>
-        <w:t>5.6 Innovación tecnológica responsable</w:t>
-      </w:r>
-    </w:p>
-    <w:p>
-      <w:pPr>
-        <w:pStyle w:val="Ttulo2"/>
-      </w:pPr>
-      <w:r>
-        <w:t>Problema</w:t>
+        <w:pStyle w:val="Ttulo2"/>
+      </w:pPr>
+      <w:r>
+        <w:t>6.1 Incorporación de herramientas de apoyo al desarrollo</w:t>
       </w:r>
     </w:p>
     <w:p>
       <w:pPr>
         <w:pStyle w:val="NormalWeb"/>
-      </w:pPr>
-      <w:r>
-        <w:lastRenderedPageBreak/>
-        <w:t>La incorporación de nuevas herramientas tecnológicas suele producirse de manera aislada y sin criterios institucionales comunes.</w:t>
-      </w:r>
-    </w:p>
-    <w:p>
-      <w:pPr>
-        <w:pStyle w:val="Ttulo2"/>
-      </w:pPr>
-      <w:r>
-        <w:t>Propuesta</w:t>
+        <w:rPr>
+          <w:rFonts w:ascii="Arial" w:hAnsi="Arial" w:cs="Arial"/>
+        </w:rPr>
+      </w:pPr>
+      <w:r>
+        <w:rPr>
+          <w:rFonts w:ascii="Arial" w:hAnsi="Arial" w:cs="Arial"/>
+        </w:rPr>
+        <w:t>La evolución de las herramientas de desarrollo ofrece actualmente soluciones que permiten automatizar tareas repetitivas, mejorar la calidad del código y asistir a los equipos durante el proceso de programación.</w:t>
       </w:r>
     </w:p>
     <w:p>
       <w:pPr>
         <w:pStyle w:val="NormalWeb"/>
-      </w:pPr>
-      <w:r>
-        <w:t>La innovación será gestionada como una política permanente del Departamento, evaluando cada tecnología en función de su utilidad, sostenibilidad, impacto organizacional y compatibilidad con la estrategia tecnológica municipal.</w:t>
+        <w:rPr>
+          <w:rFonts w:ascii="Arial" w:hAnsi="Arial" w:cs="Arial"/>
+        </w:rPr>
+      </w:pPr>
+      <w:r>
+        <w:rPr>
+          <w:rFonts w:ascii="Arial" w:hAnsi="Arial" w:cs="Arial"/>
+        </w:rPr>
+        <w:t>La adquisición de licencias corporativas de asistentes de programación basados en Inteligencia Artificial permitiría incrementar la productividad del Departamento, agilizar la generación de documentación técnica y facilitar la incorporación de nuevas tecnologías.</w:t>
       </w:r>
     </w:p>
     <w:p>
       <w:pPr>
         <w:pStyle w:val="NormalWeb"/>
-      </w:pPr>
-      <w:r>
-        <w:t>La Inteligencia Artificial será considerada una herramienta de apoyo para incrementar la productividad del equipo, manteniendo siempre la supervisión profesional y la protección de la información institucional.</w:t>
-      </w:r>
-    </w:p>
-    <w:p>
-      <w:pPr>
-        <w:pStyle w:val="Ttulo2"/>
-      </w:pPr>
-      <w:r>
-        <w:t>Implementación</w:t>
+        <w:rPr>
+          <w:rFonts w:ascii="Arial" w:hAnsi="Arial" w:cs="Arial"/>
+        </w:rPr>
+      </w:pPr>
+      <w:r>
+        <w:rPr>
+          <w:rFonts w:ascii="Arial" w:hAnsi="Arial" w:cs="Arial"/>
+        </w:rPr>
+        <w:t>Asimismo, la implementación de herramientas de análisis estático de código posibilitaría detectar vulnerabilidades, problemas de calidad y deuda técnica durante el proceso de desarrollo, fortaleciendo los mecanismos de control definidos en la propuesta de mejora.</w:t>
       </w:r>
     </w:p>
     <w:p>
       <w:pPr>
         <w:pStyle w:val="NormalWeb"/>
-      </w:pPr>
-      <w:r>
-        <w:t>Se promoverán:</w:t>
-      </w:r>
-    </w:p>
-    <w:p>
-      <w:pPr>
-        <w:numPr>
-          <w:ilvl w:val="0"/>
-          <w:numId w:val="7"/>
-        </w:numPr>
-        <w:spacing w:before="100" w:beforeAutospacing="1" w:afterAutospacing="1" w:line="240" w:lineRule="auto"/>
-        <w:jc w:val="left"/>
-      </w:pPr>
-      <w:r>
-        <w:t xml:space="preserve">evaluación permanente de nuevas tecnologías; </w:t>
-      </w:r>
-    </w:p>
-    <w:p>
-      <w:pPr>
-        <w:numPr>
-          <w:ilvl w:val="0"/>
-          <w:numId w:val="7"/>
-        </w:numPr>
-        <w:spacing w:before="100" w:beforeAutospacing="1" w:afterAutospacing="1" w:line="240" w:lineRule="auto"/>
-        <w:jc w:val="left"/>
-      </w:pPr>
-      <w:r>
-        <w:t xml:space="preserve">capacitación del personal; </w:t>
-      </w:r>
-    </w:p>
-    <w:p>
-      <w:pPr>
-        <w:numPr>
-          <w:ilvl w:val="0"/>
-          <w:numId w:val="7"/>
-        </w:numPr>
-        <w:spacing w:before="100" w:beforeAutospacing="1" w:afterAutospacing="1" w:line="240" w:lineRule="auto"/>
-        <w:jc w:val="left"/>
-      </w:pPr>
-      <w:r>
-        <w:t xml:space="preserve">pautas institucionales para el uso seguro de IA; </w:t>
-      </w:r>
-    </w:p>
-    <w:p>
-      <w:pPr>
-        <w:numPr>
-          <w:ilvl w:val="0"/>
-          <w:numId w:val="7"/>
-        </w:numPr>
-        <w:spacing w:before="100" w:beforeAutospacing="1" w:afterAutospacing="1" w:line="240" w:lineRule="auto"/>
-        <w:jc w:val="left"/>
-      </w:pPr>
-      <w:r>
-        <w:t xml:space="preserve">revisión periódica de herramientas y metodologías. </w:t>
-      </w:r>
-    </w:p>
-    <w:p>
-      <w:pPr>
-        <w:pStyle w:val="Ttulo2"/>
-      </w:pPr>
-      <w:r>
-        <w:t>Resultado esperado</w:t>
-      </w:r>
-    </w:p>
-    <w:p>
-      <w:pPr>
-        <w:pStyle w:val="NormalWeb"/>
-      </w:pPr>
-      <w:r>
-        <w:t>El Departamento podrá incorporar innovación de manera gradual y segura, mejorando la productividad sin comprometer la seguridad ni la sostenibilidad de los sistemas municipales.</w:t>
-      </w:r>
-    </w:p>
-    <w:p/>
-    <w:p>
-      <w:pPr>
-        <w:pStyle w:val="Ttulo1"/>
-      </w:pPr>
-      <w:r>
-        <w:t>6. PROYECCIÓN CON INCORPORACIÓN DE RECURSOS</w:t>
-      </w:r>
-    </w:p>
-    <w:p>
-      <w:pPr>
-        <w:pStyle w:val="NormalWeb"/>
-      </w:pPr>
-      <w:r>
-        <w:t>Las acciones desarrolladas en el capítulo anterior pueden implementarse utilizando los recursos actualmente disponibles y constituyen una estrategia realista para mejorar el funcionamiento del Departamento.</w:t>
-      </w:r>
-    </w:p>
-    <w:p>
-      <w:pPr>
-        <w:pStyle w:val="NormalWeb"/>
-      </w:pPr>
-      <w:r>
-        <w:t>No obstante, la incorporación gradual de recursos presupuestarios permitiría consolidar y potenciar dichas acciones, incrementando la productividad del equipo, fortaleciendo la calidad del software y acelerando el proceso de modernización tecnológica.</w:t>
-      </w:r>
-    </w:p>
-    <w:p>
-      <w:pPr>
-        <w:pStyle w:val="NormalWeb"/>
-      </w:pPr>
-      <w:r>
-        <w:t>En este contexto, se identifican las siguientes líneas de inversión prioritaria.</w:t>
+        <w:rPr>
+          <w:rFonts w:ascii="Arial" w:hAnsi="Arial" w:cs="Arial"/>
+        </w:rPr>
+      </w:pPr>
+      <w:r>
+        <w:rPr>
+          <w:rFonts w:ascii="Arial" w:hAnsi="Arial" w:cs="Arial"/>
+        </w:rPr>
+        <w:t>La utilización de estas herramientas deberá integrarse a los procedimientos institucionales existentes y no sustituirá la revisión técnica realizada por el personal del Departamento.</w:t>
       </w:r>
     </w:p>
     <w:p>
@@ -2199,40 +3713,50 @@
         <w:pStyle w:val="Ttulo2"/>
       </w:pPr>
       <w:r>
-        <w:t>6.1 Incorporación de herramientas de apoyo al desarrollo</w:t>
+        <w:t>6.2 Capacitación continua del personal</w:t>
       </w:r>
     </w:p>
     <w:p>
       <w:pPr>
         <w:pStyle w:val="NormalWeb"/>
-      </w:pPr>
-      <w:r>
-        <w:t>La evolución de las herramientas de desarrollo ofrece actualmente soluciones que permiten automatizar tareas repetitivas, mejorar la calidad del código y asistir a los equipos durante el proceso de programación.</w:t>
+        <w:rPr>
+          <w:rFonts w:ascii="Arial" w:hAnsi="Arial" w:cs="Arial"/>
+        </w:rPr>
+      </w:pPr>
+      <w:r>
+        <w:rPr>
+          <w:rFonts w:ascii="Arial" w:hAnsi="Arial" w:cs="Arial"/>
+        </w:rPr>
+        <w:t>La actualización permanente de conocimientos constituye un requisito indispensable para sostener la evolución tecnológica de los sistemas municipales.</w:t>
       </w:r>
     </w:p>
     <w:p>
       <w:pPr>
         <w:pStyle w:val="NormalWeb"/>
-      </w:pPr>
-      <w:r>
-        <w:t>La adquisición de licencias corporativas de asistentes de programación basados en Inteligencia Artificial permitiría incrementar la productividad del Departamento, agilizar la generación de documentación técnica y facilitar la incorporación de nuevas tecnologías.</w:t>
+        <w:rPr>
+          <w:rFonts w:ascii="Arial" w:hAnsi="Arial" w:cs="Arial"/>
+        </w:rPr>
+      </w:pPr>
+      <w:r>
+        <w:rPr>
+          <w:rFonts w:ascii="Arial" w:hAnsi="Arial" w:cs="Arial"/>
+        </w:rPr>
+        <w:t>La incorporación de presupuesto permitirá ampliar las instancias de formación mediante cursos, certificaciones y actividades de capacitación especializadas, orientadas tanto a aspectos técnicos como a metodologías de gestión de proyectos y buenas prácticas de desarrollo.</w:t>
       </w:r>
     </w:p>
     <w:p>
       <w:pPr>
         <w:pStyle w:val="NormalWeb"/>
-      </w:pPr>
-      <w:r>
+        <w:rPr>
+          <w:rFonts w:ascii="Arial" w:hAnsi="Arial" w:cs="Arial"/>
+        </w:rPr>
+      </w:pPr>
+      <w:r>
+        <w:rPr>
+          <w:rFonts w:ascii="Arial" w:hAnsi="Arial" w:cs="Arial"/>
+        </w:rPr>
         <w:lastRenderedPageBreak/>
-        <w:t>Asimismo, la implementación de herramientas de análisis estático de código posibilitaría detectar vulnerabilidades, problemas de calidad y deuda técnica durante el proceso de desarrollo, fortaleciendo los mecanismos de control definidos en la propuesta de mejora.</w:t>
-      </w:r>
-    </w:p>
-    <w:p>
-      <w:pPr>
-        <w:pStyle w:val="NormalWeb"/>
-      </w:pPr>
-      <w:r>
-        <w:t>La utilización de estas herramientas deberá integrarse a los procedimientos institucionales existentes y no sustituirá la revisión técnica realizada por el personal del Departamento.</w:t>
+        <w:t>La planificación de estas actividades deberá responder a las necesidades detectadas en la Matriz de Competencias del Departamento, procurando que la inversión realizada genere beneficios concretos para la organización y fortalezca las capacidades del equipo de trabajo.</w:t>
       </w:r>
     </w:p>
     <w:p>
@@ -2247,31 +3771,49 @@
         <w:pStyle w:val="Ttulo2"/>
       </w:pPr>
       <w:r>
-        <w:t>6.2 Capacitación continua del personal</w:t>
+        <w:t>6.3 Modernización tecnológica e infraestructura</w:t>
       </w:r>
     </w:p>
     <w:p>
       <w:pPr>
         <w:pStyle w:val="NormalWeb"/>
-      </w:pPr>
-      <w:r>
-        <w:t>La actualización permanente de conocimientos constituye un requisito indispensable para sostener la evolución tecnológica de los sistemas municipales.</w:t>
+        <w:rPr>
+          <w:rFonts w:ascii="Arial" w:hAnsi="Arial" w:cs="Arial"/>
+        </w:rPr>
+      </w:pPr>
+      <w:r>
+        <w:rPr>
+          <w:rFonts w:ascii="Arial" w:hAnsi="Arial" w:cs="Arial"/>
+        </w:rPr>
+        <w:t>La coexistencia de sistemas desarrollados sobre tecnologías de distintas generaciones hace necesario planificar un proceso gradual de modernización que permita reducir la complejidad técnica del ecosistema informático municipal.</w:t>
       </w:r>
     </w:p>
     <w:p>
       <w:pPr>
         <w:pStyle w:val="NormalWeb"/>
-      </w:pPr>
-      <w:r>
-        <w:t>La incorporación de presupuesto permitirá ampliar las instancias de formación mediante cursos, certificaciones y actividades de capacitación especializadas, orientadas tanto a aspectos técnicos como a metodologías de gestión de proyectos y buenas prácticas de desarrollo.</w:t>
+        <w:rPr>
+          <w:rFonts w:ascii="Arial" w:hAnsi="Arial" w:cs="Arial"/>
+        </w:rPr>
+      </w:pPr>
+      <w:r>
+        <w:rPr>
+          <w:rFonts w:ascii="Arial" w:hAnsi="Arial" w:cs="Arial"/>
+        </w:rPr>
+        <w:t>La disponibilidad de recursos facilitará la actualización progresiva de aplicaciones, la incorporación de nuevas herramientas de despliegue y la adopción de tecnologías que simplifiquen la administración de los ambientes de desarrollo, prueba y producción.</w:t>
       </w:r>
     </w:p>
     <w:p>
       <w:pPr>
         <w:pStyle w:val="NormalWeb"/>
-      </w:pPr>
-      <w:r>
-        <w:t>La planificación de estas actividades deberá responder a las necesidades detectadas en la Matriz de Competencias del Departamento, procurando que la inversión realizada genere beneficios concretos para la organización y fortalezca las capacidades del equipo de trabajo.</w:t>
+        <w:rPr>
+          <w:rFonts w:ascii="Arial" w:hAnsi="Arial" w:cs="Arial"/>
+        </w:rPr>
+      </w:pPr>
+      <w:r>
+        <w:rPr>
+          <w:rFonts w:ascii="Arial" w:hAnsi="Arial" w:cs="Arial"/>
+        </w:rPr>
+        <w:t>Estas acciones deberán coordinarse con las áreas responsables de infraestructura tecnológica, procurando que la evolución de los sistemas se realice de manera ordenada y compatible con la estrategia tecnológica institucional.</w:t>
       </w:r>
     </w:p>
     <w:p>
@@ -2286,31 +3828,49 @@
         <w:pStyle w:val="Ttulo2"/>
       </w:pPr>
       <w:r>
-        <w:t>6.3 Modernización tecnológica e infraestructura</w:t>
+        <w:t>6.4 Fortalecimiento del trabajo colaborativo</w:t>
       </w:r>
     </w:p>
     <w:p>
       <w:pPr>
         <w:pStyle w:val="NormalWeb"/>
-      </w:pPr>
-      <w:r>
-        <w:t>La coexistencia de sistemas desarrollados sobre tecnologías de distintas generaciones hace necesario planificar un proceso gradual de modernización que permita reducir la complejidad técnica del ecosistema informático municipal.</w:t>
+        <w:rPr>
+          <w:rFonts w:ascii="Arial" w:hAnsi="Arial" w:cs="Arial"/>
+        </w:rPr>
+      </w:pPr>
+      <w:r>
+        <w:rPr>
+          <w:rFonts w:ascii="Arial" w:hAnsi="Arial" w:cs="Arial"/>
+        </w:rPr>
+        <w:t>La distribución física del personal hace conveniente incorporar recursos que favorezcan la comunicación y el trabajo coordinado entre los distintos equipos.</w:t>
       </w:r>
     </w:p>
     <w:p>
       <w:pPr>
         <w:pStyle w:val="NormalWeb"/>
-      </w:pPr>
-      <w:r>
-        <w:t>La disponibilidad de recursos facilitará la actualización progresiva de aplicaciones, la incorporación de nuevas herramientas de despliegue y la adopción de tecnologías que simplifiquen la administración de los ambientes de desarrollo, prueba y producción.</w:t>
+        <w:rPr>
+          <w:rFonts w:ascii="Arial" w:hAnsi="Arial" w:cs="Arial"/>
+        </w:rPr>
+      </w:pPr>
+      <w:r>
+        <w:rPr>
+          <w:rFonts w:ascii="Arial" w:hAnsi="Arial" w:cs="Arial"/>
+        </w:rPr>
+        <w:t>La provisión de equipamiento específico para reuniones virtuales y colaboración remota permitirá fortalecer la interacción cotidiana entre las dependencias del Departamento y mejorar la articulación con las distintas áreas municipales.</w:t>
       </w:r>
     </w:p>
     <w:p>
       <w:pPr>
         <w:pStyle w:val="NormalWeb"/>
-      </w:pPr>
-      <w:r>
-        <w:t>Estas acciones deberán coordinarse con las áreas responsables de infraestructura tecnológica, procurando que la evolución de los sistemas se realice de manera ordenada y compatible con la estrategia tecnológica institucional.</w:t>
+        <w:rPr>
+          <w:rFonts w:ascii="Arial" w:hAnsi="Arial" w:cs="Arial"/>
+        </w:rPr>
+      </w:pPr>
+      <w:r>
+        <w:rPr>
+          <w:rFonts w:ascii="Arial" w:hAnsi="Arial" w:cs="Arial"/>
+        </w:rPr>
+        <w:t>Estas inversiones complementarán las acciones organizacionales propuestas anteriormente, contribuyendo a consolidar un modelo de trabajo más integrado y eficiente.</w:t>
       </w:r>
     </w:p>
     <w:p>
@@ -2325,31 +3885,156 @@
         <w:pStyle w:val="Ttulo2"/>
       </w:pPr>
       <w:r>
-        <w:t>6.4 Fortalecimiento del trabajo colaborativo</w:t>
+        <w:t xml:space="preserve">6.5 </w:t>
+      </w:r>
+      <w:r>
+        <w:t>Fortalecimiento de la estructura técnica y diferenciación de roles</w:t>
+      </w:r>
+      <w:r>
+        <w:tab/>
+      </w:r>
+    </w:p>
+    <w:p>
+      <w:pPr>
+        <w:pStyle w:val="Ttulo2"/>
+        <w:rPr>
+          <w:rFonts w:eastAsia="Times New Roman"/>
+          <w:color w:val="auto"/>
+          <w:sz w:val="24"/>
+          <w:szCs w:val="24"/>
+        </w:rPr>
+      </w:pPr>
+      <w:r>
+        <w:rPr>
+          <w:rFonts w:eastAsia="Times New Roman"/>
+          <w:color w:val="auto"/>
+          <w:sz w:val="24"/>
+          <w:szCs w:val="24"/>
+        </w:rPr>
+        <w:t>En la medida en que la disponibilidad presupuestaria y las decisiones institucionales de incorporación de personal lo permitan, se procurará evolucionar hacia una estructura funcional donde la especialización del agrupamiento permita conformar equipos con roles diferenciados.</w:t>
+      </w:r>
+    </w:p>
+    <w:p>
+      <w:pPr>
+        <w:pStyle w:val="Ttulo2"/>
+        <w:rPr>
+          <w:rFonts w:eastAsia="Times New Roman"/>
+          <w:color w:val="auto"/>
+          <w:sz w:val="24"/>
+          <w:szCs w:val="24"/>
+        </w:rPr>
+      </w:pPr>
+      <w:r>
+        <w:rPr>
+          <w:rFonts w:eastAsia="Times New Roman"/>
+          <w:color w:val="auto"/>
+          <w:sz w:val="24"/>
+          <w:szCs w:val="24"/>
+        </w:rPr>
+        <w:t xml:space="preserve">En este esquema, los perfiles con mayor experiencia podrán concentrar sus tareas en el análisis funcional, la arquitectura del software y la coordinación técnica, acompañando y formando a programadores dedicados principalmente al desarrollo e implementación de soluciones. </w:t>
+      </w:r>
+    </w:p>
+    <w:p>
+      <w:pPr>
+        <w:pStyle w:val="Ttulo2"/>
+        <w:rPr>
+          <w:rFonts w:eastAsia="Times New Roman"/>
+          <w:color w:val="auto"/>
+          <w:sz w:val="24"/>
+          <w:szCs w:val="24"/>
+        </w:rPr>
+      </w:pPr>
+      <w:r>
+        <w:rPr>
+          <w:rFonts w:eastAsia="Times New Roman"/>
+          <w:color w:val="auto"/>
+          <w:sz w:val="24"/>
+          <w:szCs w:val="24"/>
+        </w:rPr>
+        <w:t>Este modelo potenciará la transferencia de conocimientos sobre el funcionamiento de la Administración Pública Municipal, reduciendo los tiempos de adaptación del nuevo personal y elevando la calidad técnica de las soluciones informáticas.</w:t>
+      </w:r>
+    </w:p>
+    <w:p>
+      <w:pPr>
+        <w:pStyle w:val="Ttulo2"/>
+      </w:pPr>
+      <w:bookmarkStart w:id="0" w:name="_GoBack"/>
+      <w:bookmarkEnd w:id="0"/>
+      <w:r>
+        <w:lastRenderedPageBreak/>
+        <w:t>6.</w:t>
+      </w:r>
+      <w:r>
+        <w:t>6</w:t>
+      </w:r>
+      <w:r>
+        <w:t xml:space="preserve"> Resultado esperado</w:t>
       </w:r>
     </w:p>
     <w:p>
       <w:pPr>
         <w:pStyle w:val="NormalWeb"/>
-      </w:pPr>
-      <w:r>
-        <w:t>La distribución física del personal hace conveniente incorporar recursos que favorezcan la comunicación y el trabajo coordinado entre los distintos equipos.</w:t>
+        <w:rPr>
+          <w:rFonts w:ascii="Arial" w:hAnsi="Arial" w:cs="Arial"/>
+        </w:rPr>
+      </w:pPr>
+      <w:r>
+        <w:rPr>
+          <w:rFonts w:ascii="Arial" w:hAnsi="Arial" w:cs="Arial"/>
+        </w:rPr>
+        <w:t>La incorporación gradual de estos recursos permitirá potenciar las acciones implementadas en la etapa inicial, consolidando un Departamento con mayor capacidad para planificar proyectos, preservar el conocimiento institucional, incorporar innovación tecnológica y brindar soluciones informáticas sostenibles para la Administración Municipal.</w:t>
+      </w:r>
+    </w:p>
+    <w:p/>
+    <w:p/>
+    <w:p>
+      <w:pPr>
+        <w:pStyle w:val="Ttulo1"/>
+      </w:pPr>
+      <w:r>
+        <w:t>7. IMPLEMENTACIÓN DEL PLAN DE TRABAJO</w:t>
       </w:r>
     </w:p>
     <w:p>
       <w:pPr>
         <w:pStyle w:val="NormalWeb"/>
-      </w:pPr>
-      <w:r>
-        <w:t>La provisión de equipamiento específico para reuniones virtuales y colaboración remota permitirá fortalecer la interacción cotidiana entre las dependencias del Departamento y mejorar la articulación con las distintas áreas municipales.</w:t>
+        <w:rPr>
+          <w:rFonts w:ascii="Arial" w:hAnsi="Arial" w:cs="Arial"/>
+        </w:rPr>
+      </w:pPr>
+      <w:r>
+        <w:rPr>
+          <w:rFonts w:ascii="Arial" w:hAnsi="Arial" w:cs="Arial"/>
+        </w:rPr>
+        <w:t>La implementación de las propuestas desarrolladas requiere una ejecución gradual que permita introducir mejoras sin afectar la continuidad de los servicios que presta el Departamento.</w:t>
       </w:r>
     </w:p>
     <w:p>
       <w:pPr>
         <w:pStyle w:val="NormalWeb"/>
-      </w:pPr>
-      <w:r>
-        <w:t>Estas inversiones complementarán las acciones organizacionales propuestas anteriormente, contribuyendo a consolidar un modelo de trabajo más integrado y eficiente.</w:t>
+        <w:rPr>
+          <w:rFonts w:ascii="Arial" w:hAnsi="Arial" w:cs="Arial"/>
+        </w:rPr>
+      </w:pPr>
+      <w:r>
+        <w:rPr>
+          <w:rFonts w:ascii="Arial" w:hAnsi="Arial" w:cs="Arial"/>
+        </w:rPr>
+        <w:t>Por tal motivo, se propone una estrategia de implementación progresiva organizada en tres etapas, priorizando inicialmente aquellas acciones de carácter organizacional que no requieren recursos presupuestarios adicionales.</w:t>
+      </w:r>
+    </w:p>
+    <w:p>
+      <w:pPr>
+        <w:pStyle w:val="NormalWeb"/>
+        <w:rPr>
+          <w:rFonts w:ascii="Arial" w:hAnsi="Arial" w:cs="Arial"/>
+        </w:rPr>
+      </w:pPr>
+      <w:r>
+        <w:rPr>
+          <w:rFonts w:ascii="Arial" w:hAnsi="Arial" w:cs="Arial"/>
+        </w:rPr>
+        <w:t>Este enfoque permitirá consolidar nuevas formas de trabajo, evaluar los resultados obtenidos y realizar los ajustes necesarios antes de avanzar hacia iniciativas de mayor complejidad.</w:t>
       </w:r>
     </w:p>
     <w:p>
@@ -2364,80 +4049,34 @@
         <w:pStyle w:val="Ttulo2"/>
       </w:pPr>
       <w:r>
-        <w:lastRenderedPageBreak/>
-        <w:t>6.5 Resultado esperado</w:t>
+        <w:t>7.1 Primera etapa: Organización y diagnóstico interno</w:t>
       </w:r>
     </w:p>
     <w:p>
       <w:pPr>
         <w:pStyle w:val="NormalWeb"/>
-      </w:pPr>
-      <w:r>
-        <w:t>La incorporación gradual de estos recursos permitirá potenciar las acciones implementadas en la etapa inicial, consolidando un Departamento con mayor capacidad para planificar proyectos, preservar el conocimiento institucional, incorporar innovación tecnológica y brindar soluciones informáticas sostenibles para la Administración Municipal.</w:t>
-      </w:r>
-    </w:p>
-    <w:p/>
-    <w:p/>
-    <w:p>
-      <w:pPr>
-        <w:pStyle w:val="Ttulo1"/>
-      </w:pPr>
-      <w:r>
-        <w:t>7. IMPLEMENTACIÓN DEL PLAN DE TRABAJO</w:t>
+        <w:rPr>
+          <w:rFonts w:ascii="Arial" w:hAnsi="Arial" w:cs="Arial"/>
+        </w:rPr>
+      </w:pPr>
+      <w:r>
+        <w:rPr>
+          <w:rFonts w:ascii="Arial" w:hAnsi="Arial" w:cs="Arial"/>
+        </w:rPr>
+        <w:t>Durante esta etapa inicial la prioridad estará puesta en conocer con precisión la situación del Departamento y establecer las bases organizacionales que permitirán desarrollar el resto del plan.</w:t>
       </w:r>
     </w:p>
     <w:p>
       <w:pPr>
         <w:pStyle w:val="NormalWeb"/>
-      </w:pPr>
-      <w:r>
-        <w:t>La implementación de las propuestas desarrolladas requiere una ejecución gradual que permita introducir mejoras sin afectar la continuidad de los servicios que presta el Departamento.</w:t>
-      </w:r>
-    </w:p>
-    <w:p>
-      <w:pPr>
-        <w:pStyle w:val="NormalWeb"/>
-      </w:pPr>
-      <w:r>
-        <w:t>Por tal motivo, se propone una estrategia de implementación progresiva organizada en tres etapas, priorizando inicialmente aquellas acciones de carácter organizacional que no requieren recursos presupuestarios adicionales.</w:t>
-      </w:r>
-    </w:p>
-    <w:p>
-      <w:pPr>
-        <w:pStyle w:val="NormalWeb"/>
-      </w:pPr>
-      <w:r>
-        <w:t>Este enfoque permitirá consolidar nuevas formas de trabajo, evaluar los resultados obtenidos y realizar los ajustes necesarios antes de avanzar hacia iniciativas de mayor complejidad.</w:t>
-      </w:r>
-    </w:p>
-    <w:p>
-      <w:r>
-        <w:pict>
-          <v:rect id="_x0000_i1036" style="width:0;height:1.5pt" o:hralign="center" o:hrstd="t" o:hr="t" fillcolor="#a0a0a0" stroked="f"/>
-        </w:pict>
-      </w:r>
-    </w:p>
-    <w:p>
-      <w:pPr>
-        <w:pStyle w:val="Ttulo2"/>
-      </w:pPr>
-      <w:r>
-        <w:t>7.1 Primera etapa: Organización y diagnóstico interno</w:t>
-      </w:r>
-    </w:p>
-    <w:p>
-      <w:pPr>
-        <w:pStyle w:val="NormalWeb"/>
-      </w:pPr>
-      <w:r>
-        <w:t>Durante esta etapa inicial la prioridad estará puesta en conocer con precisión la situación del Departamento y establecer las bases organizacionales que permitirán desarrollar el resto del plan.</w:t>
-      </w:r>
-    </w:p>
-    <w:p>
-      <w:pPr>
-        <w:pStyle w:val="NormalWeb"/>
-      </w:pPr>
-      <w:r>
+        <w:rPr>
+          <w:rFonts w:ascii="Arial" w:hAnsi="Arial" w:cs="Arial"/>
+        </w:rPr>
+      </w:pPr>
+      <w:r>
+        <w:rPr>
+          <w:rFonts w:ascii="Arial" w:hAnsi="Arial" w:cs="Arial"/>
+        </w:rPr>
         <w:t>Las principales acciones serán:</w:t>
       </w:r>
     </w:p>
@@ -2530,15 +4169,21 @@
     <w:p>
       <w:pPr>
         <w:pStyle w:val="NormalWeb"/>
-      </w:pPr>
-      <w:r>
+        <w:rPr>
+          <w:rFonts w:ascii="Arial" w:hAnsi="Arial" w:cs="Arial"/>
+        </w:rPr>
+      </w:pPr>
+      <w:r>
+        <w:rPr>
+          <w:rFonts w:ascii="Arial" w:hAnsi="Arial" w:cs="Arial"/>
+        </w:rPr>
         <w:t>Al finalizar esta etapa el Departamento contará con información objetiva sobre su capacidad operativa, permitiendo planificar las acciones siguientes sobre bases concretas.</w:t>
       </w:r>
     </w:p>
     <w:p>
       <w:r>
         <w:pict>
-          <v:rect id="_x0000_i1037" style="width:0;height:1.5pt" o:hralign="center" o:hrstd="t" o:hr="t" fillcolor="#a0a0a0" stroked="f"/>
+          <v:rect id="_x0000_i1036" style="width:0;height:1.5pt" o:hralign="center" o:hrstd="t" o:hr="t" fillcolor="#a0a0a0" stroked="f"/>
         </w:pict>
       </w:r>
     </w:p>
@@ -2553,16 +4198,29 @@
     <w:p>
       <w:pPr>
         <w:pStyle w:val="NormalWeb"/>
-      </w:pPr>
-      <w:r>
+        <w:rPr>
+          <w:rFonts w:ascii="Arial" w:hAnsi="Arial" w:cs="Arial"/>
+        </w:rPr>
+      </w:pPr>
+      <w:r>
+        <w:rPr>
+          <w:rFonts w:ascii="Arial" w:hAnsi="Arial" w:cs="Arial"/>
+        </w:rPr>
+        <w:lastRenderedPageBreak/>
         <w:t>Una vez consolidada la organización inicial, se avanzará en la formalización de los procedimientos internos y en la incorporación gradual de los estándares definidos en este Plan de Trabajo.</w:t>
       </w:r>
     </w:p>
     <w:p>
       <w:pPr>
         <w:pStyle w:val="NormalWeb"/>
-      </w:pPr>
-      <w:r>
+        <w:rPr>
+          <w:rFonts w:ascii="Arial" w:hAnsi="Arial" w:cs="Arial"/>
+        </w:rPr>
+      </w:pPr>
+      <w:r>
+        <w:rPr>
+          <w:rFonts w:ascii="Arial" w:hAnsi="Arial" w:cs="Arial"/>
+        </w:rPr>
         <w:t>Entre las principales acciones se prevé:</w:t>
       </w:r>
     </w:p>
@@ -2589,7 +4247,6 @@
         <w:jc w:val="left"/>
       </w:pPr>
       <w:r>
-        <w:lastRenderedPageBreak/>
         <w:t xml:space="preserve">elaboración de guías de buenas prácticas de desarrollo; </w:t>
       </w:r>
     </w:p>
@@ -2648,15 +4305,21 @@
     <w:p>
       <w:pPr>
         <w:pStyle w:val="NormalWeb"/>
-      </w:pPr>
-      <w:r>
+        <w:rPr>
+          <w:rFonts w:ascii="Arial" w:hAnsi="Arial" w:cs="Arial"/>
+        </w:rPr>
+      </w:pPr>
+      <w:r>
+        <w:rPr>
+          <w:rFonts w:ascii="Arial" w:hAnsi="Arial" w:cs="Arial"/>
+        </w:rPr>
         <w:t>Esta etapa permitirá disminuir la dependencia de prácticas individuales, mejorar la calidad de los desarrollos y fortalecer el trabajo colaborativo dentro del Departamento.</w:t>
       </w:r>
     </w:p>
     <w:p>
       <w:r>
         <w:pict>
-          <v:rect id="_x0000_i1038" style="width:0;height:1.5pt" o:hralign="center" o:hrstd="t" o:hr="t" fillcolor="#a0a0a0" stroked="f"/>
+          <v:rect id="_x0000_i1037" style="width:0;height:1.5pt" o:hralign="center" o:hrstd="t" o:hr="t" fillcolor="#a0a0a0" stroked="f"/>
         </w:pict>
       </w:r>
     </w:p>
@@ -2671,16 +4334,28 @@
     <w:p>
       <w:pPr>
         <w:pStyle w:val="NormalWeb"/>
-      </w:pPr>
-      <w:r>
+        <w:rPr>
+          <w:rFonts w:ascii="Arial" w:hAnsi="Arial" w:cs="Arial"/>
+        </w:rPr>
+      </w:pPr>
+      <w:r>
+        <w:rPr>
+          <w:rFonts w:ascii="Arial" w:hAnsi="Arial" w:cs="Arial"/>
+        </w:rPr>
         <w:t>La etapa final estará orientada a evaluar los resultados obtenidos, consolidar las mejoras implementadas y promover un proceso permanente de revisión y actualización de los procedimientos.</w:t>
       </w:r>
     </w:p>
     <w:p>
       <w:pPr>
         <w:pStyle w:val="NormalWeb"/>
-      </w:pPr>
-      <w:r>
+        <w:rPr>
+          <w:rFonts w:ascii="Arial" w:hAnsi="Arial" w:cs="Arial"/>
+        </w:rPr>
+      </w:pPr>
+      <w:r>
+        <w:rPr>
+          <w:rFonts w:ascii="Arial" w:hAnsi="Arial" w:cs="Arial"/>
+        </w:rPr>
         <w:t>En esta instancia se prevé:</w:t>
       </w:r>
     </w:p>
@@ -2765,15 +4440,21 @@
     <w:p>
       <w:pPr>
         <w:pStyle w:val="NormalWeb"/>
-      </w:pPr>
-      <w:r>
+        <w:rPr>
+          <w:rFonts w:ascii="Arial" w:hAnsi="Arial" w:cs="Arial"/>
+        </w:rPr>
+      </w:pPr>
+      <w:r>
+        <w:rPr>
+          <w:rFonts w:ascii="Arial" w:hAnsi="Arial" w:cs="Arial"/>
+        </w:rPr>
         <w:t>La mejora continua permitirá que el Departamento mantenga una capacidad permanente de adaptación frente a nuevas demandas tecnológicas y organizacionales.</w:t>
       </w:r>
     </w:p>
     <w:p>
       <w:r>
         <w:pict>
-          <v:rect id="_x0000_i1039" style="width:0;height:1.5pt" o:hralign="center" o:hrstd="t" o:hr="t" fillcolor="#a0a0a0" stroked="f"/>
+          <v:rect id="_x0000_i1038" style="width:0;height:1.5pt" o:hralign="center" o:hrstd="t" o:hr="t" fillcolor="#a0a0a0" stroked="f"/>
         </w:pict>
       </w:r>
     </w:p>
@@ -2788,24 +4469,42 @@
     <w:p>
       <w:pPr>
         <w:pStyle w:val="NormalWeb"/>
-      </w:pPr>
-      <w:r>
+        <w:rPr>
+          <w:rFonts w:ascii="Arial" w:hAnsi="Arial" w:cs="Arial"/>
+        </w:rPr>
+      </w:pPr>
+      <w:r>
+        <w:rPr>
+          <w:rFonts w:ascii="Arial" w:hAnsi="Arial" w:cs="Arial"/>
+        </w:rPr>
         <w:t>La implementación del presente Plan de Trabajo requerirá un seguimiento permanente que permita verificar el cumplimiento de los objetivos propuestos y medir el impacto de las acciones implementadas.</w:t>
       </w:r>
     </w:p>
     <w:p>
       <w:pPr>
         <w:pStyle w:val="NormalWeb"/>
-      </w:pPr>
-      <w:r>
+        <w:rPr>
+          <w:rFonts w:ascii="Arial" w:hAnsi="Arial" w:cs="Arial"/>
+        </w:rPr>
+      </w:pPr>
+      <w:r>
+        <w:rPr>
+          <w:rFonts w:ascii="Arial" w:hAnsi="Arial" w:cs="Arial"/>
+        </w:rPr>
         <w:t>Con este propósito se propone la utilización de indicadores de gestión que permitan evaluar la evolución del Departamento mediante información objetiva, facilitando la toma de decisiones y la identificación temprana de oportunidades de mejora.</w:t>
       </w:r>
     </w:p>
     <w:p>
       <w:pPr>
         <w:pStyle w:val="NormalWeb"/>
-      </w:pPr>
-      <w:r>
+        <w:rPr>
+          <w:rFonts w:ascii="Arial" w:hAnsi="Arial" w:cs="Arial"/>
+        </w:rPr>
+      </w:pPr>
+      <w:r>
+        <w:rPr>
+          <w:rFonts w:ascii="Arial" w:hAnsi="Arial" w:cs="Arial"/>
+        </w:rPr>
         <w:t>Los indicadores deberán revisarse periódicamente y utilizarse como herramientas de gestión, evitando que se transformen en un fin en sí mismos.</w:t>
       </w:r>
     </w:p>
@@ -2850,6 +4549,7 @@
                 <w:b/>
                 <w:bCs/>
               </w:rPr>
+              <w:lastRenderedPageBreak/>
               <w:t>Dimensión</w:t>
             </w:r>
           </w:p>
@@ -3003,7 +4703,6 @@
           </w:tcPr>
           <w:p>
             <w:r>
-              <w:lastRenderedPageBreak/>
               <w:t>Documentación</w:t>
             </w:r>
           </w:p>
@@ -3201,15 +4900,21 @@
     <w:p>
       <w:pPr>
         <w:pStyle w:val="NormalWeb"/>
-      </w:pPr>
-      <w:r>
+        <w:rPr>
+          <w:rFonts w:ascii="Arial" w:hAnsi="Arial" w:cs="Arial"/>
+        </w:rPr>
+      </w:pPr>
+      <w:r>
+        <w:rPr>
+          <w:rFonts w:ascii="Arial" w:hAnsi="Arial" w:cs="Arial"/>
+        </w:rPr>
         <w:t>La información obtenida permitirá realizar ajustes en la planificación, redefinir prioridades y orientar futuras decisiones de gestión sobre la base de resultados verificables.</w:t>
       </w:r>
     </w:p>
     <w:p>
       <w:r>
         <w:pict>
-          <v:rect id="_x0000_i1040" style="width:0;height:1.5pt" o:hralign="center" o:hrstd="t" o:hr="t" fillcolor="#a0a0a0" stroked="f"/>
+          <v:rect id="_x0000_i1039" style="width:0;height:1.5pt" o:hralign="center" o:hrstd="t" o:hr="t" fillcolor="#a0a0a0" stroked="f"/>
         </w:pict>
       </w:r>
     </w:p>
@@ -3224,51 +4929,92 @@
     <w:p>
       <w:pPr>
         <w:pStyle w:val="NormalWeb"/>
-      </w:pPr>
-      <w:r>
+        <w:rPr>
+          <w:rFonts w:ascii="Arial" w:hAnsi="Arial" w:cs="Arial"/>
+        </w:rPr>
+      </w:pPr>
+      <w:r>
+        <w:rPr>
+          <w:rFonts w:ascii="Arial" w:hAnsi="Arial" w:cs="Arial"/>
+        </w:rPr>
         <w:t xml:space="preserve">El Departamento de Gestión, Desarrollo e Innovación en Sistemas de Software cumple un rol estratégico dentro del proceso de transformación digital de la Municipalidad de General </w:t>
       </w:r>
       <w:proofErr w:type="spellStart"/>
       <w:r>
+        <w:rPr>
+          <w:rFonts w:ascii="Arial" w:hAnsi="Arial" w:cs="Arial"/>
+        </w:rPr>
         <w:t>Pueyrredon</w:t>
       </w:r>
       <w:proofErr w:type="spellEnd"/>
       <w:r>
+        <w:rPr>
+          <w:rFonts w:ascii="Arial" w:hAnsi="Arial" w:cs="Arial"/>
+        </w:rPr>
         <w:t>. La creciente demanda de soluciones informáticas hace necesario fortalecer su capacidad de planificación, coordinación y organización, asegurando que el conocimiento institucional, la calidad del software y la continuidad operativa no dependan exclusivamente de iniciativas individuales.</w:t>
       </w:r>
     </w:p>
     <w:p>
       <w:pPr>
         <w:pStyle w:val="NormalWeb"/>
-      </w:pPr>
-      <w:r>
+        <w:rPr>
+          <w:rFonts w:ascii="Arial" w:hAnsi="Arial" w:cs="Arial"/>
+        </w:rPr>
+      </w:pPr>
+      <w:r>
+        <w:rPr>
+          <w:rFonts w:ascii="Arial" w:hAnsi="Arial" w:cs="Arial"/>
+        </w:rPr>
         <w:t>Las propuestas desarrolladas en este Plan de Trabajo parten de un criterio de realismo y priorizan la optimización de los recursos actualmente disponibles mediante la mejora de los procedimientos, la gestión del conocimiento, la estandarización técnica y el fortalecimiento de la conducción del Departamento.</w:t>
       </w:r>
     </w:p>
     <w:p>
       <w:pPr>
         <w:pStyle w:val="NormalWeb"/>
-      </w:pPr>
-      <w:r>
+        <w:rPr>
+          <w:rFonts w:ascii="Arial" w:hAnsi="Arial" w:cs="Arial"/>
+        </w:rPr>
+      </w:pPr>
+      <w:r>
+        <w:rPr>
+          <w:rFonts w:ascii="Arial" w:hAnsi="Arial" w:cs="Arial"/>
+        </w:rPr>
         <w:t>La incorporación futura de recursos tecnológicos y presupuestarios permitirá potenciar estas acciones, consolidando un proceso de modernización sostenido y alineado con los objetivos institucionales del Municipio.</w:t>
       </w:r>
     </w:p>
     <w:p>
       <w:pPr>
         <w:pStyle w:val="NormalWeb"/>
-      </w:pPr>
-      <w:r>
+        <w:rPr>
+          <w:rFonts w:ascii="Arial" w:hAnsi="Arial" w:cs="Arial"/>
+        </w:rPr>
+      </w:pPr>
+      <w:r>
+        <w:rPr>
+          <w:rFonts w:ascii="Arial" w:hAnsi="Arial" w:cs="Arial"/>
+        </w:rPr>
         <w:t>El rol de la Jefatura será conducir este proceso promoviendo el trabajo colaborativo, la planificación estratégica y la mejora continua, procurando que las decisiones técnicas acompañen las necesidades de la organización y contribuyan al fortalecimiento de la gestión pública.</w:t>
       </w:r>
-      <w:bookmarkStart w:id="0" w:name="_GoBack"/>
-      <w:bookmarkEnd w:id="0"/>
     </w:p>
     <w:p>
       <w:pPr>
         <w:pStyle w:val="NormalWeb"/>
-      </w:pPr>
-      <w:r>
-        <w:t>En este sentido, la propuesta presentada busca consolidar un Departamento capaz de desarrollar soluciones informáticas seguras, sostenibles y de calidad, preservando el conocimiento institucional y generando valor para la Administración Municipal y para la comunidad.</w:t>
+        <w:rPr>
+          <w:rFonts w:ascii="Arial" w:hAnsi="Arial" w:cs="Arial"/>
+        </w:rPr>
+      </w:pPr>
+      <w:r>
+        <w:rPr>
+          <w:rFonts w:ascii="Arial" w:hAnsi="Arial" w:cs="Arial"/>
+        </w:rPr>
+        <w:t xml:space="preserve">En este sentido, la propuesta presentada busca consolidar un Departamento capaz de desarrollar soluciones informáticas seguras, sostenibles y de calidad, preservando el </w:t>
+      </w:r>
+      <w:r>
+        <w:rPr>
+          <w:rFonts w:ascii="Arial" w:hAnsi="Arial" w:cs="Arial"/>
+        </w:rPr>
+        <w:lastRenderedPageBreak/>
+        <w:t>conocimiento institucional y generando valor para la Administración Municipal y para la comunidad.</w:t>
       </w:r>
     </w:p>
     <w:p>
@@ -3971,6 +5717,119 @@
     </w:lvl>
   </w:abstractNum>
   <w:abstractNum w:abstractNumId="5">
+    <w:nsid w:val="30D92146"/>
+    <w:multiLevelType w:val="hybridMultilevel"/>
+    <w:tmpl w:val="758E3C56"/>
+    <w:lvl w:ilvl="0" w:tplc="2C0A0001">
+      <w:start w:val="1"/>
+      <w:numFmt w:val="bullet"/>
+      <w:lvlText w:val=""/>
+      <w:lvlJc w:val="left"/>
+      <w:pPr>
+        <w:ind w:left="720" w:hanging="360"/>
+      </w:pPr>
+      <w:rPr>
+        <w:rFonts w:ascii="Symbol" w:hAnsi="Symbol" w:hint="default"/>
+      </w:rPr>
+    </w:lvl>
+    <w:lvl w:ilvl="1" w:tplc="2C0A0003" w:tentative="1">
+      <w:start w:val="1"/>
+      <w:numFmt w:val="bullet"/>
+      <w:lvlText w:val="o"/>
+      <w:lvlJc w:val="left"/>
+      <w:pPr>
+        <w:ind w:left="1440" w:hanging="360"/>
+      </w:pPr>
+      <w:rPr>
+        <w:rFonts w:ascii="Courier New" w:hAnsi="Courier New" w:cs="Courier New" w:hint="default"/>
+      </w:rPr>
+    </w:lvl>
+    <w:lvl w:ilvl="2" w:tplc="2C0A0005" w:tentative="1">
+      <w:start w:val="1"/>
+      <w:numFmt w:val="bullet"/>
+      <w:lvlText w:val=""/>
+      <w:lvlJc w:val="left"/>
+      <w:pPr>
+        <w:ind w:left="2160" w:hanging="360"/>
+      </w:pPr>
+      <w:rPr>
+        <w:rFonts w:ascii="Wingdings" w:hAnsi="Wingdings" w:hint="default"/>
+      </w:rPr>
+    </w:lvl>
+    <w:lvl w:ilvl="3" w:tplc="2C0A0001" w:tentative="1">
+      <w:start w:val="1"/>
+      <w:numFmt w:val="bullet"/>
+      <w:lvlText w:val=""/>
+      <w:lvlJc w:val="left"/>
+      <w:pPr>
+        <w:ind w:left="2880" w:hanging="360"/>
+      </w:pPr>
+      <w:rPr>
+        <w:rFonts w:ascii="Symbol" w:hAnsi="Symbol" w:hint="default"/>
+      </w:rPr>
+    </w:lvl>
+    <w:lvl w:ilvl="4" w:tplc="2C0A0003" w:tentative="1">
+      <w:start w:val="1"/>
+      <w:numFmt w:val="bullet"/>
+      <w:lvlText w:val="o"/>
+      <w:lvlJc w:val="left"/>
+      <w:pPr>
+        <w:ind w:left="3600" w:hanging="360"/>
+      </w:pPr>
+      <w:rPr>
+        <w:rFonts w:ascii="Courier New" w:hAnsi="Courier New" w:cs="Courier New" w:hint="default"/>
+      </w:rPr>
+    </w:lvl>
+    <w:lvl w:ilvl="5" w:tplc="2C0A0005" w:tentative="1">
+      <w:start w:val="1"/>
+      <w:numFmt w:val="bullet"/>
+      <w:lvlText w:val=""/>
+      <w:lvlJc w:val="left"/>
+      <w:pPr>
+        <w:ind w:left="4320" w:hanging="360"/>
+      </w:pPr>
+      <w:rPr>
+        <w:rFonts w:ascii="Wingdings" w:hAnsi="Wingdings" w:hint="default"/>
+      </w:rPr>
+    </w:lvl>
+    <w:lvl w:ilvl="6" w:tplc="2C0A0001" w:tentative="1">
+      <w:start w:val="1"/>
+      <w:numFmt w:val="bullet"/>
+      <w:lvlText w:val=""/>
+      <w:lvlJc w:val="left"/>
+      <w:pPr>
+        <w:ind w:left="5040" w:hanging="360"/>
+      </w:pPr>
+      <w:rPr>
+        <w:rFonts w:ascii="Symbol" w:hAnsi="Symbol" w:hint="default"/>
+      </w:rPr>
+    </w:lvl>
+    <w:lvl w:ilvl="7" w:tplc="2C0A0003" w:tentative="1">
+      <w:start w:val="1"/>
+      <w:numFmt w:val="bullet"/>
+      <w:lvlText w:val="o"/>
+      <w:lvlJc w:val="left"/>
+      <w:pPr>
+        <w:ind w:left="5760" w:hanging="360"/>
+      </w:pPr>
+      <w:rPr>
+        <w:rFonts w:ascii="Courier New" w:hAnsi="Courier New" w:cs="Courier New" w:hint="default"/>
+      </w:rPr>
+    </w:lvl>
+    <w:lvl w:ilvl="8" w:tplc="2C0A0005" w:tentative="1">
+      <w:start w:val="1"/>
+      <w:numFmt w:val="bullet"/>
+      <w:lvlText w:val=""/>
+      <w:lvlJc w:val="left"/>
+      <w:pPr>
+        <w:ind w:left="6480" w:hanging="360"/>
+      </w:pPr>
+      <w:rPr>
+        <w:rFonts w:ascii="Wingdings" w:hAnsi="Wingdings" w:hint="default"/>
+      </w:rPr>
+    </w:lvl>
+  </w:abstractNum>
+  <w:abstractNum w:abstractNumId="6">
     <w:nsid w:val="33DF333D"/>
     <w:multiLevelType w:val="multilevel"/>
     <w:tmpl w:val="DEF4C16E"/>
@@ -4119,7 +5978,7 @@
       </w:rPr>
     </w:lvl>
   </w:abstractNum>
-  <w:abstractNum w:abstractNumId="6">
+  <w:abstractNum w:abstractNumId="7">
     <w:nsid w:val="3C5E3168"/>
     <w:multiLevelType w:val="multilevel"/>
     <w:tmpl w:val="444EEB16"/>
@@ -4268,7 +6127,233 @@
       </w:rPr>
     </w:lvl>
   </w:abstractNum>
-  <w:abstractNum w:abstractNumId="7">
+  <w:abstractNum w:abstractNumId="8">
+    <w:nsid w:val="490800AD"/>
+    <w:multiLevelType w:val="hybridMultilevel"/>
+    <w:tmpl w:val="5BECF74E"/>
+    <w:lvl w:ilvl="0" w:tplc="2C0A0001">
+      <w:start w:val="1"/>
+      <w:numFmt w:val="bullet"/>
+      <w:lvlText w:val=""/>
+      <w:lvlJc w:val="left"/>
+      <w:pPr>
+        <w:ind w:left="720" w:hanging="360"/>
+      </w:pPr>
+      <w:rPr>
+        <w:rFonts w:ascii="Symbol" w:hAnsi="Symbol" w:hint="default"/>
+      </w:rPr>
+    </w:lvl>
+    <w:lvl w:ilvl="1" w:tplc="2C0A0003" w:tentative="1">
+      <w:start w:val="1"/>
+      <w:numFmt w:val="bullet"/>
+      <w:lvlText w:val="o"/>
+      <w:lvlJc w:val="left"/>
+      <w:pPr>
+        <w:ind w:left="1440" w:hanging="360"/>
+      </w:pPr>
+      <w:rPr>
+        <w:rFonts w:ascii="Courier New" w:hAnsi="Courier New" w:cs="Courier New" w:hint="default"/>
+      </w:rPr>
+    </w:lvl>
+    <w:lvl w:ilvl="2" w:tplc="2C0A0005" w:tentative="1">
+      <w:start w:val="1"/>
+      <w:numFmt w:val="bullet"/>
+      <w:lvlText w:val=""/>
+      <w:lvlJc w:val="left"/>
+      <w:pPr>
+        <w:ind w:left="2160" w:hanging="360"/>
+      </w:pPr>
+      <w:rPr>
+        <w:rFonts w:ascii="Wingdings" w:hAnsi="Wingdings" w:hint="default"/>
+      </w:rPr>
+    </w:lvl>
+    <w:lvl w:ilvl="3" w:tplc="2C0A0001" w:tentative="1">
+      <w:start w:val="1"/>
+      <w:numFmt w:val="bullet"/>
+      <w:lvlText w:val=""/>
+      <w:lvlJc w:val="left"/>
+      <w:pPr>
+        <w:ind w:left="2880" w:hanging="360"/>
+      </w:pPr>
+      <w:rPr>
+        <w:rFonts w:ascii="Symbol" w:hAnsi="Symbol" w:hint="default"/>
+      </w:rPr>
+    </w:lvl>
+    <w:lvl w:ilvl="4" w:tplc="2C0A0003" w:tentative="1">
+      <w:start w:val="1"/>
+      <w:numFmt w:val="bullet"/>
+      <w:lvlText w:val="o"/>
+      <w:lvlJc w:val="left"/>
+      <w:pPr>
+        <w:ind w:left="3600" w:hanging="360"/>
+      </w:pPr>
+      <w:rPr>
+        <w:rFonts w:ascii="Courier New" w:hAnsi="Courier New" w:cs="Courier New" w:hint="default"/>
+      </w:rPr>
+    </w:lvl>
+    <w:lvl w:ilvl="5" w:tplc="2C0A0005" w:tentative="1">
+      <w:start w:val="1"/>
+      <w:numFmt w:val="bullet"/>
+      <w:lvlText w:val=""/>
+      <w:lvlJc w:val="left"/>
+      <w:pPr>
+        <w:ind w:left="4320" w:hanging="360"/>
+      </w:pPr>
+      <w:rPr>
+        <w:rFonts w:ascii="Wingdings" w:hAnsi="Wingdings" w:hint="default"/>
+      </w:rPr>
+    </w:lvl>
+    <w:lvl w:ilvl="6" w:tplc="2C0A0001" w:tentative="1">
+      <w:start w:val="1"/>
+      <w:numFmt w:val="bullet"/>
+      <w:lvlText w:val=""/>
+      <w:lvlJc w:val="left"/>
+      <w:pPr>
+        <w:ind w:left="5040" w:hanging="360"/>
+      </w:pPr>
+      <w:rPr>
+        <w:rFonts w:ascii="Symbol" w:hAnsi="Symbol" w:hint="default"/>
+      </w:rPr>
+    </w:lvl>
+    <w:lvl w:ilvl="7" w:tplc="2C0A0003" w:tentative="1">
+      <w:start w:val="1"/>
+      <w:numFmt w:val="bullet"/>
+      <w:lvlText w:val="o"/>
+      <w:lvlJc w:val="left"/>
+      <w:pPr>
+        <w:ind w:left="5760" w:hanging="360"/>
+      </w:pPr>
+      <w:rPr>
+        <w:rFonts w:ascii="Courier New" w:hAnsi="Courier New" w:cs="Courier New" w:hint="default"/>
+      </w:rPr>
+    </w:lvl>
+    <w:lvl w:ilvl="8" w:tplc="2C0A0005" w:tentative="1">
+      <w:start w:val="1"/>
+      <w:numFmt w:val="bullet"/>
+      <w:lvlText w:val=""/>
+      <w:lvlJc w:val="left"/>
+      <w:pPr>
+        <w:ind w:left="6480" w:hanging="360"/>
+      </w:pPr>
+      <w:rPr>
+        <w:rFonts w:ascii="Wingdings" w:hAnsi="Wingdings" w:hint="default"/>
+      </w:rPr>
+    </w:lvl>
+  </w:abstractNum>
+  <w:abstractNum w:abstractNumId="9">
+    <w:nsid w:val="4B1F39B7"/>
+    <w:multiLevelType w:val="hybridMultilevel"/>
+    <w:tmpl w:val="A1C46604"/>
+    <w:lvl w:ilvl="0" w:tplc="2C0A0001">
+      <w:start w:val="1"/>
+      <w:numFmt w:val="bullet"/>
+      <w:lvlText w:val=""/>
+      <w:lvlJc w:val="left"/>
+      <w:pPr>
+        <w:ind w:left="720" w:hanging="360"/>
+      </w:pPr>
+      <w:rPr>
+        <w:rFonts w:ascii="Symbol" w:hAnsi="Symbol" w:hint="default"/>
+      </w:rPr>
+    </w:lvl>
+    <w:lvl w:ilvl="1" w:tplc="2C0A0003" w:tentative="1">
+      <w:start w:val="1"/>
+      <w:numFmt w:val="bullet"/>
+      <w:lvlText w:val="o"/>
+      <w:lvlJc w:val="left"/>
+      <w:pPr>
+        <w:ind w:left="1440" w:hanging="360"/>
+      </w:pPr>
+      <w:rPr>
+        <w:rFonts w:ascii="Courier New" w:hAnsi="Courier New" w:cs="Courier New" w:hint="default"/>
+      </w:rPr>
+    </w:lvl>
+    <w:lvl w:ilvl="2" w:tplc="2C0A0005" w:tentative="1">
+      <w:start w:val="1"/>
+      <w:numFmt w:val="bullet"/>
+      <w:lvlText w:val=""/>
+      <w:lvlJc w:val="left"/>
+      <w:pPr>
+        <w:ind w:left="2160" w:hanging="360"/>
+      </w:pPr>
+      <w:rPr>
+        <w:rFonts w:ascii="Wingdings" w:hAnsi="Wingdings" w:hint="default"/>
+      </w:rPr>
+    </w:lvl>
+    <w:lvl w:ilvl="3" w:tplc="2C0A0001" w:tentative="1">
+      <w:start w:val="1"/>
+      <w:numFmt w:val="bullet"/>
+      <w:lvlText w:val=""/>
+      <w:lvlJc w:val="left"/>
+      <w:pPr>
+        <w:ind w:left="2880" w:hanging="360"/>
+      </w:pPr>
+      <w:rPr>
+        <w:rFonts w:ascii="Symbol" w:hAnsi="Symbol" w:hint="default"/>
+      </w:rPr>
+    </w:lvl>
+    <w:lvl w:ilvl="4" w:tplc="2C0A0003" w:tentative="1">
+      <w:start w:val="1"/>
+      <w:numFmt w:val="bullet"/>
+      <w:lvlText w:val="o"/>
+      <w:lvlJc w:val="left"/>
+      <w:pPr>
+        <w:ind w:left="3600" w:hanging="360"/>
+      </w:pPr>
+      <w:rPr>
+        <w:rFonts w:ascii="Courier New" w:hAnsi="Courier New" w:cs="Courier New" w:hint="default"/>
+      </w:rPr>
+    </w:lvl>
+    <w:lvl w:ilvl="5" w:tplc="2C0A0005" w:tentative="1">
+      <w:start w:val="1"/>
+      <w:numFmt w:val="bullet"/>
+      <w:lvlText w:val=""/>
+      <w:lvlJc w:val="left"/>
+      <w:pPr>
+        <w:ind w:left="4320" w:hanging="360"/>
+      </w:pPr>
+      <w:rPr>
+        <w:rFonts w:ascii="Wingdings" w:hAnsi="Wingdings" w:hint="default"/>
+      </w:rPr>
+    </w:lvl>
+    <w:lvl w:ilvl="6" w:tplc="2C0A0001" w:tentative="1">
+      <w:start w:val="1"/>
+      <w:numFmt w:val="bullet"/>
+      <w:lvlText w:val=""/>
+      <w:lvlJc w:val="left"/>
+      <w:pPr>
+        <w:ind w:left="5040" w:hanging="360"/>
+      </w:pPr>
+      <w:rPr>
+        <w:rFonts w:ascii="Symbol" w:hAnsi="Symbol" w:hint="default"/>
+      </w:rPr>
+    </w:lvl>
+    <w:lvl w:ilvl="7" w:tplc="2C0A0003" w:tentative="1">
+      <w:start w:val="1"/>
+      <w:numFmt w:val="bullet"/>
+      <w:lvlText w:val="o"/>
+      <w:lvlJc w:val="left"/>
+      <w:pPr>
+        <w:ind w:left="5760" w:hanging="360"/>
+      </w:pPr>
+      <w:rPr>
+        <w:rFonts w:ascii="Courier New" w:hAnsi="Courier New" w:cs="Courier New" w:hint="default"/>
+      </w:rPr>
+    </w:lvl>
+    <w:lvl w:ilvl="8" w:tplc="2C0A0005" w:tentative="1">
+      <w:start w:val="1"/>
+      <w:numFmt w:val="bullet"/>
+      <w:lvlText w:val=""/>
+      <w:lvlJc w:val="left"/>
+      <w:pPr>
+        <w:ind w:left="6480" w:hanging="360"/>
+      </w:pPr>
+      <w:rPr>
+        <w:rFonts w:ascii="Wingdings" w:hAnsi="Wingdings" w:hint="default"/>
+      </w:rPr>
+    </w:lvl>
+  </w:abstractNum>
+  <w:abstractNum w:abstractNumId="10">
     <w:nsid w:val="53EF515F"/>
     <w:multiLevelType w:val="multilevel"/>
     <w:tmpl w:val="BE7881A0"/>
@@ -4417,7 +6502,7 @@
       </w:rPr>
     </w:lvl>
   </w:abstractNum>
-  <w:abstractNum w:abstractNumId="8">
+  <w:abstractNum w:abstractNumId="11">
     <w:nsid w:val="648D41A3"/>
     <w:multiLevelType w:val="multilevel"/>
     <w:tmpl w:val="791479FC"/>
@@ -4566,7 +6651,7 @@
       </w:rPr>
     </w:lvl>
   </w:abstractNum>
-  <w:abstractNum w:abstractNumId="9">
+  <w:abstractNum w:abstractNumId="12">
     <w:nsid w:val="64A71AE6"/>
     <w:multiLevelType w:val="multilevel"/>
     <w:tmpl w:val="2F9E4154"/>
@@ -4722,7 +6807,7 @@
     </w:lvlOverride>
   </w:num>
   <w:num w:numId="2">
-    <w:abstractNumId w:val="6"/>
+    <w:abstractNumId w:val="7"/>
   </w:num>
   <w:num w:numId="3">
     <w:abstractNumId w:val="1"/>
@@ -4731,22 +6816,31 @@
     <w:abstractNumId w:val="4"/>
   </w:num>
   <w:num w:numId="5">
-    <w:abstractNumId w:val="5"/>
+    <w:abstractNumId w:val="6"/>
   </w:num>
   <w:num w:numId="6">
     <w:abstractNumId w:val="2"/>
   </w:num>
   <w:num w:numId="7">
-    <w:abstractNumId w:val="8"/>
+    <w:abstractNumId w:val="11"/>
   </w:num>
   <w:num w:numId="8">
     <w:abstractNumId w:val="3"/>
   </w:num>
   <w:num w:numId="9">
-    <w:abstractNumId w:val="9"/>
+    <w:abstractNumId w:val="12"/>
   </w:num>
   <w:num w:numId="10">
-    <w:abstractNumId w:val="7"/>
+    <w:abstractNumId w:val="10"/>
+  </w:num>
+  <w:num w:numId="11">
+    <w:abstractNumId w:val="8"/>
+  </w:num>
+  <w:num w:numId="12">
+    <w:abstractNumId w:val="5"/>
+  </w:num>
+  <w:num w:numId="13">
+    <w:abstractNumId w:val="9"/>
   </w:num>
 </w:numbering>
 </file>
@@ -5342,7 +7436,6 @@
     <w:name w:val="Normal (Web)"/>
     <w:basedOn w:val="Normal"/>
     <w:uiPriority w:val="99"/>
-    <w:semiHidden/>
     <w:unhideWhenUsed/>
     <w:rsid w:val="007820CC"/>
     <w:pPr>

</xml_diff>

<commit_message>
Actualiza Seccion 6 en la version final del Plan de Trabajo
</commit_message>
<xml_diff>
--- a/Plan_Trabajo_Jefatura_Software_Version_Director.docx
+++ b/Plan_Trabajo_Jefatura_Software_Version_Director.docx
@@ -3585,21 +3585,1627 @@
         <w:rPr>
           <w:rFonts w:ascii="Arial" w:hAnsi="Arial" w:cs="Arial"/>
         </w:rPr>
-        <w:t xml:space="preserve">Las acciones desarrolladas en el capítulo anterior pueden implementarse utilizando los recursos actualmente disponibles y constituyen una estrategia realista para mejorar el </w:t>
+        <w:t>Las acciones desarrolladas en el capítulo anterior pueden implementarse utilizando los recursos actualmente disponibles y constituyen una estrategia realista para mejorar el funcionamiento del Departamento.</w:t>
+      </w:r>
+    </w:p>
+    <w:p>
+      <w:pPr>
+        <w:pStyle w:val="NormalWeb"/>
+        <w:rPr>
+          <w:rFonts w:ascii="Arial" w:hAnsi="Arial" w:cs="Arial"/>
+        </w:rPr>
+      </w:pPr>
+      <w:r>
+        <w:rPr>
+          <w:rFonts w:ascii="Arial" w:hAnsi="Arial" w:cs="Arial"/>
+        </w:rPr>
+        <w:t>No obstante, la incorporación gradual de recursos presupuestarios permitiría consolidar y potenciar dichas acciones, incrementando la productividad del equipo, fortaleciendo la calidad del software y acelerando el proceso de modernización tecnológica.</w:t>
+      </w:r>
+    </w:p>
+    <w:p>
+      <w:pPr>
+        <w:pStyle w:val="NormalWeb"/>
+        <w:rPr>
+          <w:rFonts w:ascii="Arial" w:hAnsi="Arial" w:cs="Arial"/>
+        </w:rPr>
+      </w:pPr>
+      <w:r>
+        <w:rPr>
+          <w:rFonts w:ascii="Arial" w:hAnsi="Arial" w:cs="Arial"/>
+        </w:rPr>
+        <w:t>En este contexto, se identifican las siguientes líneas de inversión prioritaria.</w:t>
+      </w:r>
+    </w:p>
+    <w:p/>
+    <w:p>
+      <w:pPr>
+        <w:pStyle w:val="Ttulo2"/>
+      </w:pPr>
+      <w:r>
+        <w:t xml:space="preserve">6.1 </w:t>
+      </w:r>
+      <w:r>
+        <w:t>Incorporación de herramientas profesionales de apoyo al desarrollo y asistencia técnica</w:t>
+      </w:r>
+    </w:p>
+    <w:p>
+      <w:pPr>
+        <w:pStyle w:val="Ttulo2"/>
+      </w:pPr>
+      <w:r>
+        <w:t>Problema</w:t>
+      </w:r>
+    </w:p>
+    <w:p>
+      <w:pPr>
+        <w:pStyle w:val="Ttulo2"/>
+        <w:rPr>
+          <w:color w:val="auto"/>
+          <w:sz w:val="24"/>
+          <w:szCs w:val="24"/>
+        </w:rPr>
+      </w:pPr>
+      <w:r>
+        <w:rPr>
+          <w:color w:val="auto"/>
+          <w:sz w:val="24"/>
+          <w:szCs w:val="24"/>
+        </w:rPr>
+        <w:t>Si bien el Departamento dispone de herramientas de desarrollo básicas, determinadas actividades como la revisión de código, la generación de documentación técnica, la verificación de estándares de calidad y la asistencia durante la programación continúan dependiendo de tareas manuales, reduciendo la productividad del equipo y dificultando la aplicación uniforme de criterios técnicos.</w:t>
+      </w:r>
+    </w:p>
+    <w:p>
+      <w:pPr>
+        <w:pStyle w:val="Ttulo2"/>
+      </w:pPr>
+      <w:r>
+        <w:br/>
+        <w:t>Propuesta</w:t>
+      </w:r>
+    </w:p>
+    <w:p>
+      <w:pPr>
+        <w:pStyle w:val="Ttulo2"/>
+        <w:rPr>
+          <w:color w:val="auto"/>
+          <w:sz w:val="24"/>
+          <w:szCs w:val="24"/>
+        </w:rPr>
+      </w:pPr>
+      <w:r>
+        <w:rPr>
+          <w:color w:val="auto"/>
+          <w:sz w:val="24"/>
+          <w:szCs w:val="24"/>
+        </w:rPr>
+        <w:t>Incorporar herramientas profesionales de apoyo al desarrollo de software que permitan automatizar tareas repetitivas, fortalecer los procesos de aseguramiento de calidad y asistir al personal durante la codificación mediante la integración de asistentes basados en Inteligencia Artificial en los entornos de desarrollo (IDE) y plataformas de análisis estático de código.</w:t>
+      </w:r>
+    </w:p>
+    <w:p>
+      <w:pPr>
+        <w:pStyle w:val="Ttulo2"/>
+      </w:pPr>
+    </w:p>
+    <w:p>
+      <w:pPr>
+        <w:pStyle w:val="Ttulo2"/>
+      </w:pPr>
+      <w:r>
+        <w:t>Implementación</w:t>
+      </w:r>
+    </w:p>
+    <w:p>
+      <w:pPr>
+        <w:rPr>
+          <w:rFonts w:eastAsia="Times New Roman"/>
+          <w:sz w:val="24"/>
+          <w:szCs w:val="24"/>
+        </w:rPr>
+      </w:pPr>
+      <w:r>
+        <w:rPr>
+          <w:rFonts w:eastAsia="Times New Roman"/>
+          <w:sz w:val="24"/>
+          <w:szCs w:val="24"/>
+        </w:rPr>
+        <w:t>La implementación comprenderá:</w:t>
+      </w:r>
+    </w:p>
+    <w:p>
+      <w:pPr>
+        <w:pStyle w:val="Prrafodelista"/>
+        <w:ind w:left="720"/>
+        <w:rPr>
+          <w:rFonts w:eastAsia="Times New Roman"/>
+        </w:rPr>
+      </w:pPr>
+      <w:r>
+        <w:rPr>
+          <w:rFonts w:eastAsia="Times New Roman"/>
+        </w:rPr>
+        <w:t xml:space="preserve">• </w:t>
       </w:r>
       <w:proofErr w:type="gramStart"/>
       <w:r>
         <w:rPr>
-          <w:rFonts w:ascii="Arial" w:hAnsi="Arial" w:cs="Arial"/>
-        </w:rPr>
-        <w:t>funcionamiento</w:t>
+          <w:rFonts w:eastAsia="Times New Roman"/>
+        </w:rPr>
+        <w:t>adquisición</w:t>
       </w:r>
       <w:proofErr w:type="gramEnd"/>
       <w:r>
         <w:rPr>
-          <w:rFonts w:ascii="Arial" w:hAnsi="Arial" w:cs="Arial"/>
-        </w:rPr>
-        <w:t xml:space="preserve"> del Departamento.</w:t>
+          <w:rFonts w:eastAsia="Times New Roman"/>
+        </w:rPr>
+        <w:t xml:space="preserve"> de licencias profesionales de apoyo al desarrollo de software y asistencia por IA;</w:t>
+      </w:r>
+    </w:p>
+    <w:p>
+      <w:pPr>
+        <w:pStyle w:val="Prrafodelista"/>
+        <w:ind w:left="720"/>
+        <w:rPr>
+          <w:rFonts w:eastAsia="Times New Roman"/>
+        </w:rPr>
+      </w:pPr>
+      <w:r>
+        <w:rPr>
+          <w:rFonts w:eastAsia="Times New Roman"/>
+        </w:rPr>
+        <w:t xml:space="preserve">• </w:t>
+      </w:r>
+      <w:proofErr w:type="gramStart"/>
+      <w:r>
+        <w:rPr>
+          <w:rFonts w:eastAsia="Times New Roman"/>
+        </w:rPr>
+        <w:t>incorporación</w:t>
+      </w:r>
+      <w:proofErr w:type="gramEnd"/>
+      <w:r>
+        <w:rPr>
+          <w:rFonts w:eastAsia="Times New Roman"/>
+        </w:rPr>
+        <w:t xml:space="preserve"> de plataformas automáticas de análisis y control de calidad del código fuente;</w:t>
+      </w:r>
+    </w:p>
+    <w:p>
+      <w:pPr>
+        <w:pStyle w:val="Prrafodelista"/>
+        <w:ind w:left="720"/>
+        <w:rPr>
+          <w:rFonts w:eastAsia="Times New Roman"/>
+        </w:rPr>
+      </w:pPr>
+      <w:r>
+        <w:rPr>
+          <w:rFonts w:eastAsia="Times New Roman"/>
+        </w:rPr>
+        <w:t xml:space="preserve">• </w:t>
+      </w:r>
+      <w:proofErr w:type="gramStart"/>
+      <w:r>
+        <w:rPr>
+          <w:rFonts w:eastAsia="Times New Roman"/>
+        </w:rPr>
+        <w:t>definición</w:t>
+      </w:r>
+      <w:proofErr w:type="gramEnd"/>
+      <w:r>
+        <w:rPr>
+          <w:rFonts w:eastAsia="Times New Roman"/>
+        </w:rPr>
+        <w:t xml:space="preserve"> de pautas institucionales y umbrales automáticos de calidad previa al paso a producción;</w:t>
+      </w:r>
+    </w:p>
+    <w:p>
+      <w:pPr>
+        <w:pStyle w:val="Prrafodelista"/>
+        <w:ind w:left="720"/>
+        <w:rPr>
+          <w:rFonts w:eastAsia="Times New Roman"/>
+        </w:rPr>
+      </w:pPr>
+      <w:r>
+        <w:rPr>
+          <w:rFonts w:eastAsia="Times New Roman"/>
+        </w:rPr>
+        <w:t xml:space="preserve">• </w:t>
+      </w:r>
+      <w:proofErr w:type="gramStart"/>
+      <w:r>
+        <w:rPr>
+          <w:rFonts w:eastAsia="Times New Roman"/>
+        </w:rPr>
+        <w:t>capacitación</w:t>
+      </w:r>
+      <w:proofErr w:type="gramEnd"/>
+      <w:r>
+        <w:rPr>
+          <w:rFonts w:eastAsia="Times New Roman"/>
+        </w:rPr>
+        <w:t xml:space="preserve"> del personal para la utilización segura y eficiente de dichas herramientas.</w:t>
+      </w:r>
+    </w:p>
+    <w:p>
+      <w:pPr>
+        <w:pStyle w:val="Ttulo2"/>
+      </w:pPr>
+      <w:r>
+        <w:lastRenderedPageBreak/>
+        <w:t>Resultado esperado</w:t>
+      </w:r>
+    </w:p>
+    <w:p>
+      <w:pPr>
+        <w:rPr>
+          <w:rFonts w:eastAsia="Times New Roman"/>
+          <w:sz w:val="24"/>
+          <w:szCs w:val="24"/>
+        </w:rPr>
+      </w:pPr>
+      <w:r>
+        <w:rPr>
+          <w:rFonts w:eastAsia="Times New Roman"/>
+          <w:sz w:val="24"/>
+          <w:szCs w:val="24"/>
+        </w:rPr>
+        <w:t>Se incrementará sustancialmente la productividad del equipo, mejorará la calidad de los desarrollos, se reducirán los tiempos destinados a tareas repetitivas y se automatizará la documentación técnica de los sistemas.</w:t>
+      </w:r>
+    </w:p>
+    <w:p/>
+    <w:p>
+      <w:pPr>
+        <w:pStyle w:val="Ttulo2"/>
+      </w:pPr>
+      <w:r>
+        <w:t xml:space="preserve">6.2 </w:t>
+      </w:r>
+      <w:r>
+        <w:t>Programa permanente de capacitación continua y especialización del personal</w:t>
+      </w:r>
+    </w:p>
+    <w:p>
+      <w:pPr>
+        <w:pStyle w:val="Ttulo2"/>
+      </w:pPr>
+      <w:r>
+        <w:t>Problema</w:t>
+      </w:r>
+    </w:p>
+    <w:p>
+      <w:pPr>
+        <w:pStyle w:val="Ttulo2"/>
+        <w:rPr>
+          <w:rFonts w:eastAsia="Times New Roman"/>
+          <w:color w:val="auto"/>
+          <w:sz w:val="24"/>
+          <w:szCs w:val="24"/>
+        </w:rPr>
+      </w:pPr>
+      <w:r>
+        <w:rPr>
+          <w:rFonts w:eastAsia="Times New Roman"/>
+          <w:color w:val="auto"/>
+          <w:sz w:val="24"/>
+          <w:szCs w:val="24"/>
+        </w:rPr>
+        <w:t>La acelerada evolución de los lenguajes de programación, metodologías y arquitecturas de software requiere instancias de formación especializada que van más allá del aprendizaje autónomo, siendo necesario actualizar constantemente al equipo.</w:t>
+      </w:r>
+    </w:p>
+    <w:p>
+      <w:pPr>
+        <w:pStyle w:val="Ttulo2"/>
+      </w:pPr>
+      <w:r>
+        <w:br/>
+        <w:t>Propuesta</w:t>
+      </w:r>
+    </w:p>
+    <w:p>
+      <w:pPr>
+        <w:pStyle w:val="Ttulo2"/>
+        <w:rPr>
+          <w:rFonts w:eastAsia="Times New Roman"/>
+          <w:color w:val="auto"/>
+          <w:sz w:val="24"/>
+          <w:szCs w:val="24"/>
+        </w:rPr>
+      </w:pPr>
+      <w:r>
+        <w:rPr>
+          <w:rFonts w:eastAsia="Times New Roman"/>
+          <w:color w:val="auto"/>
+          <w:sz w:val="24"/>
+          <w:szCs w:val="24"/>
+        </w:rPr>
+        <w:t>Se implementará un Programa Permanente de Capacitación financiado por el Municipio, orientado a fortalecer las competencias técnicas y de gestión del personal mediante cursos, certificaciones oficiales, seminarios y actividades de actualización tecnológica, priorizando aquellas áreas estratégicas para la evolución de los sistemas municipales.</w:t>
+      </w:r>
+    </w:p>
+    <w:p>
+      <w:pPr>
+        <w:pStyle w:val="Ttulo2"/>
+      </w:pPr>
+    </w:p>
+    <w:p>
+      <w:pPr>
+        <w:pStyle w:val="Ttulo2"/>
+      </w:pPr>
+      <w:r>
+        <w:t>Implementación</w:t>
+      </w:r>
+    </w:p>
+    <w:p>
+      <w:pPr>
+        <w:rPr>
+          <w:rFonts w:eastAsia="Times New Roman"/>
+          <w:sz w:val="24"/>
+          <w:szCs w:val="24"/>
+        </w:rPr>
+      </w:pPr>
+      <w:r>
+        <w:rPr>
+          <w:rFonts w:eastAsia="Times New Roman"/>
+          <w:sz w:val="24"/>
+          <w:szCs w:val="24"/>
+        </w:rPr>
+        <w:t>La implementación comprenderá:</w:t>
+      </w:r>
+    </w:p>
+    <w:p>
+      <w:pPr>
+        <w:pStyle w:val="Prrafodelista"/>
+        <w:ind w:left="720"/>
+        <w:rPr>
+          <w:rFonts w:eastAsia="Times New Roman"/>
+        </w:rPr>
+      </w:pPr>
+      <w:r>
+        <w:rPr>
+          <w:rFonts w:eastAsia="Times New Roman"/>
+        </w:rPr>
+        <w:t xml:space="preserve">• </w:t>
+      </w:r>
+      <w:proofErr w:type="gramStart"/>
+      <w:r>
+        <w:rPr>
+          <w:rFonts w:eastAsia="Times New Roman"/>
+        </w:rPr>
+        <w:t>relevamiento</w:t>
+      </w:r>
+      <w:proofErr w:type="gramEnd"/>
+      <w:r>
+        <w:rPr>
+          <w:rFonts w:eastAsia="Times New Roman"/>
+        </w:rPr>
+        <w:t xml:space="preserve"> de necesidades de formación sobre la base de la Matriz de Competencias del Departamento;</w:t>
+      </w:r>
+      <w:bookmarkStart w:id="0" w:name="_GoBack"/>
+      <w:bookmarkEnd w:id="0"/>
+    </w:p>
+    <w:p>
+      <w:pPr>
+        <w:pStyle w:val="Prrafodelista"/>
+        <w:ind w:left="720"/>
+        <w:rPr>
+          <w:rFonts w:eastAsia="Times New Roman"/>
+        </w:rPr>
+      </w:pPr>
+      <w:r>
+        <w:rPr>
+          <w:rFonts w:eastAsia="Times New Roman"/>
+        </w:rPr>
+        <w:t xml:space="preserve">• </w:t>
+      </w:r>
+      <w:proofErr w:type="gramStart"/>
+      <w:r>
+        <w:rPr>
+          <w:rFonts w:eastAsia="Times New Roman"/>
+        </w:rPr>
+        <w:t>financiamiento</w:t>
+      </w:r>
+      <w:proofErr w:type="gramEnd"/>
+      <w:r>
+        <w:rPr>
+          <w:rFonts w:eastAsia="Times New Roman"/>
+        </w:rPr>
+        <w:t xml:space="preserve"> de cursos y certificaciones en tecnologías de desarrollo, arquitectura de software y metodologías ágiles;</w:t>
+      </w:r>
+    </w:p>
+    <w:p>
+      <w:pPr>
+        <w:pStyle w:val="Prrafodelista"/>
+        <w:ind w:left="720"/>
+        <w:rPr>
+          <w:rFonts w:eastAsia="Times New Roman"/>
+        </w:rPr>
+      </w:pPr>
+      <w:r>
+        <w:rPr>
+          <w:rFonts w:eastAsia="Times New Roman"/>
+        </w:rPr>
+        <w:t xml:space="preserve">• </w:t>
+      </w:r>
+      <w:proofErr w:type="gramStart"/>
+      <w:r>
+        <w:rPr>
+          <w:rFonts w:eastAsia="Times New Roman"/>
+        </w:rPr>
+        <w:t>participación</w:t>
+      </w:r>
+      <w:proofErr w:type="gramEnd"/>
+      <w:r>
+        <w:rPr>
+          <w:rFonts w:eastAsia="Times New Roman"/>
+        </w:rPr>
+        <w:t xml:space="preserve"> en actividades de actualización en </w:t>
+      </w:r>
+      <w:proofErr w:type="spellStart"/>
+      <w:r>
+        <w:rPr>
+          <w:rFonts w:eastAsia="Times New Roman"/>
+        </w:rPr>
+        <w:t>ciberseguridad</w:t>
+      </w:r>
+      <w:proofErr w:type="spellEnd"/>
+      <w:r>
+        <w:rPr>
+          <w:rFonts w:eastAsia="Times New Roman"/>
+        </w:rPr>
+        <w:t xml:space="preserve"> aplicada al software;</w:t>
+      </w:r>
+    </w:p>
+    <w:p>
+      <w:pPr>
+        <w:pStyle w:val="Prrafodelista"/>
+        <w:ind w:left="720"/>
+        <w:rPr>
+          <w:rFonts w:eastAsia="Times New Roman"/>
+        </w:rPr>
+      </w:pPr>
+      <w:r>
+        <w:rPr>
+          <w:rFonts w:eastAsia="Times New Roman"/>
+        </w:rPr>
+        <w:t xml:space="preserve">• </w:t>
+      </w:r>
+      <w:proofErr w:type="gramStart"/>
+      <w:r>
+        <w:rPr>
+          <w:rFonts w:eastAsia="Times New Roman"/>
+        </w:rPr>
+        <w:t>evaluación</w:t>
+      </w:r>
+      <w:proofErr w:type="gramEnd"/>
+      <w:r>
+        <w:rPr>
+          <w:rFonts w:eastAsia="Times New Roman"/>
+        </w:rPr>
+        <w:t xml:space="preserve"> periódica del impacto de las capacitaciones en los sistemas en desarrollo.</w:t>
+      </w:r>
+    </w:p>
+    <w:p>
+      <w:pPr>
+        <w:pStyle w:val="Prrafodelista"/>
+        <w:ind w:left="720"/>
+        <w:rPr>
+          <w:rFonts w:eastAsia="Times New Roman"/>
+        </w:rPr>
+      </w:pPr>
+    </w:p>
+    <w:p>
+      <w:pPr>
+        <w:pStyle w:val="Ttulo2"/>
+      </w:pPr>
+      <w:r>
+        <w:t>Resultado esperado</w:t>
+      </w:r>
+    </w:p>
+    <w:p>
+      <w:pPr>
+        <w:rPr>
+          <w:rFonts w:eastAsia="Times New Roman"/>
+          <w:sz w:val="24"/>
+          <w:szCs w:val="24"/>
+        </w:rPr>
+      </w:pPr>
+      <w:r>
+        <w:rPr>
+          <w:rFonts w:eastAsia="Times New Roman"/>
+          <w:sz w:val="24"/>
+          <w:szCs w:val="24"/>
+        </w:rPr>
+        <w:t>Esta medida permitiría jerarquizar el perfil profesional del equipo, actualizar permanentemente las competencias tecnológicas del Departamento, motivar al personal y reducir la brecha con los estándares de la industria del software.</w:t>
+      </w:r>
+    </w:p>
+    <w:p/>
+    <w:p>
+      <w:pPr>
+        <w:pStyle w:val="Ttulo2"/>
+      </w:pPr>
+      <w:r>
+        <w:t>6.3 M</w:t>
+      </w:r>
+      <w:r>
+        <w:t>odernización tecnológica y actualización de plataformas</w:t>
+      </w:r>
+    </w:p>
+    <w:p>
+      <w:pPr>
+        <w:pStyle w:val="Ttulo2"/>
+      </w:pPr>
+      <w:r>
+        <w:t>Problema</w:t>
+      </w:r>
+    </w:p>
+    <w:p>
+      <w:pPr>
+        <w:pStyle w:val="Ttulo2"/>
+        <w:rPr>
+          <w:rFonts w:eastAsia="Times New Roman"/>
+          <w:color w:val="auto"/>
+          <w:sz w:val="24"/>
+          <w:szCs w:val="24"/>
+        </w:rPr>
+      </w:pPr>
+      <w:r>
+        <w:rPr>
+          <w:rFonts w:eastAsia="Times New Roman"/>
+          <w:color w:val="auto"/>
+          <w:sz w:val="24"/>
+          <w:szCs w:val="24"/>
+        </w:rPr>
+        <w:t>La coexistencia de aplicaciones desarrolladas sobre tecnologías con distintos niveles de actualización incrementa la complejidad del mantenimiento, dificulta la integración entre sistemas y limita la incorpor</w:t>
+      </w:r>
+      <w:r>
+        <w:rPr>
+          <w:rFonts w:eastAsia="Times New Roman"/>
+          <w:color w:val="auto"/>
+          <w:sz w:val="24"/>
+          <w:szCs w:val="24"/>
+        </w:rPr>
+        <w:t>ación de nuevas funcionalidades</w:t>
+      </w:r>
+      <w:r>
+        <w:rPr>
+          <w:rFonts w:eastAsia="Times New Roman"/>
+          <w:color w:val="auto"/>
+          <w:sz w:val="24"/>
+          <w:szCs w:val="24"/>
+        </w:rPr>
+        <w:t>.</w:t>
+      </w:r>
+    </w:p>
+    <w:p>
+      <w:pPr>
+        <w:pStyle w:val="Ttulo2"/>
+      </w:pPr>
+      <w:r>
+        <w:br/>
+        <w:t>Propuesta</w:t>
+      </w:r>
+    </w:p>
+    <w:p>
+      <w:pPr>
+        <w:pStyle w:val="Ttulo2"/>
+        <w:rPr>
+          <w:rFonts w:eastAsia="Times New Roman"/>
+          <w:color w:val="auto"/>
+          <w:sz w:val="24"/>
+          <w:szCs w:val="24"/>
+        </w:rPr>
+      </w:pPr>
+      <w:r>
+        <w:rPr>
+          <w:rFonts w:eastAsia="Times New Roman"/>
+          <w:color w:val="auto"/>
+          <w:sz w:val="24"/>
+          <w:szCs w:val="24"/>
+        </w:rPr>
+        <w:t xml:space="preserve">Promover un programa de modernización tecnológica destinado a actualizar gradualmente las plataformas de desarrollo, los componentes de software utilizados por </w:t>
+      </w:r>
+      <w:r>
+        <w:rPr>
+          <w:rFonts w:eastAsia="Times New Roman"/>
+          <w:color w:val="auto"/>
+          <w:sz w:val="24"/>
+          <w:szCs w:val="24"/>
+        </w:rPr>
+        <w:lastRenderedPageBreak/>
+        <w:t>el Departamento y las herramientas necesarias para mantener las aplicaciones sobre plataformas con soporte vigente.</w:t>
+      </w:r>
+    </w:p>
+    <w:p>
+      <w:pPr>
+        <w:pStyle w:val="Ttulo2"/>
+      </w:pPr>
+    </w:p>
+    <w:p>
+      <w:pPr>
+        <w:pStyle w:val="Ttulo2"/>
+      </w:pPr>
+      <w:r>
+        <w:t>Implementación</w:t>
+      </w:r>
+    </w:p>
+    <w:p>
+      <w:pPr>
+        <w:rPr>
+          <w:rFonts w:eastAsia="Times New Roman"/>
+          <w:sz w:val="24"/>
+          <w:szCs w:val="24"/>
+        </w:rPr>
+      </w:pPr>
+      <w:r>
+        <w:rPr>
+          <w:rFonts w:eastAsia="Times New Roman"/>
+          <w:sz w:val="24"/>
+          <w:szCs w:val="24"/>
+        </w:rPr>
+        <w:t>La implementación comprenderá:</w:t>
+      </w:r>
+    </w:p>
+    <w:p>
+      <w:pPr>
+        <w:ind w:left="708"/>
+        <w:rPr>
+          <w:rFonts w:eastAsia="Times New Roman"/>
+        </w:rPr>
+      </w:pPr>
+      <w:r>
+        <w:rPr>
+          <w:rFonts w:eastAsia="Times New Roman"/>
+        </w:rPr>
+        <w:t xml:space="preserve">• </w:t>
+      </w:r>
+      <w:proofErr w:type="gramStart"/>
+      <w:r>
+        <w:rPr>
+          <w:rFonts w:eastAsia="Times New Roman"/>
+        </w:rPr>
+        <w:t>actualización</w:t>
+      </w:r>
+      <w:proofErr w:type="gramEnd"/>
+      <w:r>
+        <w:rPr>
+          <w:rFonts w:eastAsia="Times New Roman"/>
+        </w:rPr>
+        <w:t xml:space="preserve"> de </w:t>
+      </w:r>
+      <w:proofErr w:type="spellStart"/>
+      <w:r>
+        <w:rPr>
+          <w:rFonts w:eastAsia="Times New Roman"/>
+        </w:rPr>
+        <w:t>frameworks</w:t>
+      </w:r>
+      <w:proofErr w:type="spellEnd"/>
+      <w:r>
+        <w:rPr>
+          <w:rFonts w:eastAsia="Times New Roman"/>
+        </w:rPr>
+        <w:t>, librerías y componentes de código utilizados por el Departamento;</w:t>
+      </w:r>
+    </w:p>
+    <w:p>
+      <w:pPr>
+        <w:ind w:left="708"/>
+        <w:rPr>
+          <w:rFonts w:eastAsia="Times New Roman"/>
+        </w:rPr>
+      </w:pPr>
+      <w:r>
+        <w:rPr>
+          <w:rFonts w:eastAsia="Times New Roman"/>
+        </w:rPr>
+        <w:t xml:space="preserve">• </w:t>
+      </w:r>
+      <w:proofErr w:type="gramStart"/>
+      <w:r>
+        <w:rPr>
+          <w:rFonts w:eastAsia="Times New Roman"/>
+        </w:rPr>
+        <w:t>incorporación</w:t>
+      </w:r>
+      <w:proofErr w:type="gramEnd"/>
+      <w:r>
+        <w:rPr>
+          <w:rFonts w:eastAsia="Times New Roman"/>
+        </w:rPr>
+        <w:t xml:space="preserve"> de herramientas que faciliten la integración y el despliegue ordenado de aplicaciones;</w:t>
+      </w:r>
+    </w:p>
+    <w:p>
+      <w:pPr>
+        <w:ind w:left="708"/>
+        <w:rPr>
+          <w:rFonts w:eastAsia="Times New Roman"/>
+        </w:rPr>
+      </w:pPr>
+      <w:r>
+        <w:rPr>
+          <w:rFonts w:eastAsia="Times New Roman"/>
+        </w:rPr>
+        <w:t xml:space="preserve">• </w:t>
+      </w:r>
+      <w:proofErr w:type="gramStart"/>
+      <w:r>
+        <w:rPr>
+          <w:rFonts w:eastAsia="Times New Roman"/>
+        </w:rPr>
+        <w:t>planificación</w:t>
+      </w:r>
+      <w:proofErr w:type="gramEnd"/>
+      <w:r>
+        <w:rPr>
+          <w:rFonts w:eastAsia="Times New Roman"/>
+        </w:rPr>
+        <w:t xml:space="preserve"> de la migración progresiva de aquellos aplicativos que utilicen plataformas obsoletas;</w:t>
+      </w:r>
+    </w:p>
+    <w:p>
+      <w:pPr>
+        <w:ind w:left="708"/>
+        <w:rPr>
+          <w:rFonts w:eastAsia="Times New Roman"/>
+        </w:rPr>
+      </w:pPr>
+      <w:r>
+        <w:rPr>
+          <w:rFonts w:eastAsia="Times New Roman"/>
+        </w:rPr>
+        <w:t xml:space="preserve">• </w:t>
+      </w:r>
+      <w:proofErr w:type="gramStart"/>
+      <w:r>
+        <w:rPr>
+          <w:rFonts w:eastAsia="Times New Roman"/>
+        </w:rPr>
+        <w:t>articulación</w:t>
+      </w:r>
+      <w:proofErr w:type="gramEnd"/>
+      <w:r>
+        <w:rPr>
+          <w:rFonts w:eastAsia="Times New Roman"/>
+        </w:rPr>
+        <w:t xml:space="preserve"> técnica con el área de infraestructura para la optimización de los ambientes de prueba y producción.</w:t>
+      </w:r>
+    </w:p>
+    <w:p>
+      <w:pPr>
+        <w:ind w:left="708"/>
+        <w:rPr>
+          <w:rFonts w:eastAsia="Times New Roman"/>
+        </w:rPr>
+      </w:pPr>
+    </w:p>
+    <w:p>
+      <w:pPr>
+        <w:pStyle w:val="Ttulo2"/>
+      </w:pPr>
+      <w:r>
+        <w:t>Resultado esperado</w:t>
+      </w:r>
+    </w:p>
+    <w:p>
+      <w:pPr>
+        <w:pStyle w:val="Ttulo2"/>
+        <w:rPr>
+          <w:rFonts w:eastAsia="Times New Roman"/>
+          <w:color w:val="auto"/>
+          <w:sz w:val="24"/>
+          <w:szCs w:val="24"/>
+        </w:rPr>
+      </w:pPr>
+      <w:r>
+        <w:rPr>
+          <w:rFonts w:eastAsia="Times New Roman"/>
+          <w:color w:val="auto"/>
+          <w:sz w:val="24"/>
+          <w:szCs w:val="24"/>
+        </w:rPr>
+        <w:t>Se reducirá el riesgo asociado a tecnologías sin soporte, se simplificará el mantenimiento de los sistemas existentes y se incrementará la capacidad del Departamento para desarrollar nuevas soluciones digitales.</w:t>
+      </w:r>
+    </w:p>
+    <w:p>
+      <w:pPr>
+        <w:pStyle w:val="Ttulo2"/>
+        <w:rPr>
+          <w:rFonts w:eastAsia="Times New Roman"/>
+          <w:color w:val="auto"/>
+          <w:sz w:val="24"/>
+          <w:szCs w:val="24"/>
+        </w:rPr>
+      </w:pPr>
+    </w:p>
+    <w:p>
+      <w:pPr>
+        <w:pStyle w:val="Ttulo2"/>
+      </w:pPr>
+      <w:r>
+        <w:t>6.4 Fortalecimiento del trabajo colaborativo</w:t>
+      </w:r>
+    </w:p>
+    <w:p>
+      <w:pPr>
+        <w:pStyle w:val="Ttulo2"/>
+      </w:pPr>
+      <w:r>
+        <w:t>Problema</w:t>
+      </w:r>
+    </w:p>
+    <w:p>
+      <w:pPr>
+        <w:pStyle w:val="Ttulo2"/>
+        <w:rPr>
+          <w:rFonts w:eastAsia="Times New Roman"/>
+          <w:color w:val="auto"/>
+          <w:sz w:val="24"/>
+          <w:szCs w:val="24"/>
+        </w:rPr>
+      </w:pPr>
+      <w:r>
+        <w:rPr>
+          <w:rFonts w:eastAsia="Times New Roman"/>
+          <w:color w:val="auto"/>
+          <w:sz w:val="24"/>
+          <w:szCs w:val="24"/>
+        </w:rPr>
+        <w:t>La coordinación entre equipos distribuidos en distintas dependencias requiere herramientas que faciliten el intercambio permanente de información técnica, la colaboración continua y el acceso compartido al conocimiento institucional.</w:t>
+      </w:r>
+    </w:p>
+    <w:p>
+      <w:pPr>
+        <w:pStyle w:val="Ttulo2"/>
+      </w:pPr>
+      <w:r>
+        <w:br/>
+        <w:t>Propuesta</w:t>
+      </w:r>
+    </w:p>
+    <w:p>
+      <w:pPr>
+        <w:pStyle w:val="Ttulo2"/>
+        <w:rPr>
+          <w:rFonts w:eastAsia="Times New Roman"/>
+          <w:color w:val="auto"/>
+          <w:sz w:val="24"/>
+          <w:szCs w:val="24"/>
+        </w:rPr>
+      </w:pPr>
+      <w:r>
+        <w:rPr>
+          <w:rFonts w:eastAsia="Times New Roman"/>
+          <w:color w:val="auto"/>
+          <w:sz w:val="24"/>
+          <w:szCs w:val="24"/>
+        </w:rPr>
+        <w:t>Incorporar plataformas corporativas orientadas al trabajo colaborativo y a la gestión compartida del conocimiento, que permitan centralizar la documentación técnica de los sistemas, facilitar la revisión cruzada de código y mejorar la articulación</w:t>
+      </w:r>
+      <w:r>
+        <w:rPr>
+          <w:rFonts w:eastAsia="Times New Roman"/>
+          <w:color w:val="auto"/>
+          <w:sz w:val="24"/>
+          <w:szCs w:val="24"/>
+        </w:rPr>
+        <w:t xml:space="preserve"> entre los grupos de desarrollo</w:t>
+      </w:r>
+      <w:r>
+        <w:rPr>
+          <w:rFonts w:eastAsia="Times New Roman"/>
+          <w:color w:val="auto"/>
+          <w:sz w:val="24"/>
+          <w:szCs w:val="24"/>
+        </w:rPr>
+        <w:t>.</w:t>
+      </w:r>
+    </w:p>
+    <w:p>
+      <w:pPr>
+        <w:pStyle w:val="Ttulo2"/>
+      </w:pPr>
+    </w:p>
+    <w:p>
+      <w:pPr>
+        <w:pStyle w:val="Ttulo2"/>
+      </w:pPr>
+      <w:r>
+        <w:t>Implementación</w:t>
+      </w:r>
+    </w:p>
+    <w:p>
+      <w:pPr>
+        <w:rPr>
+          <w:rFonts w:eastAsia="Times New Roman"/>
+          <w:sz w:val="24"/>
+          <w:szCs w:val="24"/>
+        </w:rPr>
+      </w:pPr>
+      <w:r>
+        <w:rPr>
+          <w:rFonts w:eastAsia="Times New Roman"/>
+          <w:sz w:val="24"/>
+          <w:szCs w:val="24"/>
+        </w:rPr>
+        <w:t>La implementación comprenderá:</w:t>
+      </w:r>
+    </w:p>
+    <w:p>
+      <w:pPr>
+        <w:ind w:left="708"/>
+        <w:rPr>
+          <w:rFonts w:eastAsia="Times New Roman"/>
+        </w:rPr>
+      </w:pPr>
+      <w:r>
+        <w:rPr>
+          <w:rFonts w:eastAsia="Times New Roman"/>
+        </w:rPr>
+        <w:t xml:space="preserve">• </w:t>
+      </w:r>
+      <w:proofErr w:type="gramStart"/>
+      <w:r>
+        <w:rPr>
+          <w:rFonts w:eastAsia="Times New Roman"/>
+        </w:rPr>
+        <w:t>incorporación</w:t>
+      </w:r>
+      <w:proofErr w:type="gramEnd"/>
+      <w:r>
+        <w:rPr>
+          <w:rFonts w:eastAsia="Times New Roman"/>
+        </w:rPr>
+        <w:t xml:space="preserve"> de plataformas colaborativas para la documentación técnica institucional;</w:t>
+      </w:r>
+    </w:p>
+    <w:p>
+      <w:pPr>
+        <w:ind w:left="708"/>
+        <w:rPr>
+          <w:rFonts w:eastAsia="Times New Roman"/>
+        </w:rPr>
+      </w:pPr>
+      <w:r>
+        <w:rPr>
+          <w:rFonts w:eastAsia="Times New Roman"/>
+        </w:rPr>
+        <w:t xml:space="preserve">• </w:t>
+      </w:r>
+      <w:proofErr w:type="gramStart"/>
+      <w:r>
+        <w:rPr>
+          <w:rFonts w:eastAsia="Times New Roman"/>
+        </w:rPr>
+        <w:t>implementación</w:t>
+      </w:r>
+      <w:proofErr w:type="gramEnd"/>
+      <w:r>
+        <w:rPr>
+          <w:rFonts w:eastAsia="Times New Roman"/>
+        </w:rPr>
+        <w:t xml:space="preserve"> de herramientas de repositorios de conocimiento y revisión compartida de desarrollos;</w:t>
+      </w:r>
+    </w:p>
+    <w:p>
+      <w:pPr>
+        <w:ind w:left="708"/>
+        <w:rPr>
+          <w:rFonts w:eastAsia="Times New Roman"/>
+        </w:rPr>
+      </w:pPr>
+      <w:r>
+        <w:rPr>
+          <w:rFonts w:eastAsia="Times New Roman"/>
+        </w:rPr>
+        <w:t xml:space="preserve">• </w:t>
+      </w:r>
+      <w:proofErr w:type="gramStart"/>
+      <w:r>
+        <w:rPr>
+          <w:rFonts w:eastAsia="Times New Roman"/>
+        </w:rPr>
+        <w:t>soluciones</w:t>
+      </w:r>
+      <w:proofErr w:type="gramEnd"/>
+      <w:r>
+        <w:rPr>
+          <w:rFonts w:eastAsia="Times New Roman"/>
+        </w:rPr>
+        <w:t xml:space="preserve"> que faciliten la comunicación fluida y la coordinación diaria entre equipos;</w:t>
+      </w:r>
+    </w:p>
+    <w:p>
+      <w:pPr>
+        <w:ind w:left="708"/>
+        <w:rPr>
+          <w:rFonts w:eastAsia="Times New Roman"/>
+        </w:rPr>
+      </w:pPr>
+      <w:r>
+        <w:rPr>
+          <w:rFonts w:eastAsia="Times New Roman"/>
+        </w:rPr>
+        <w:t xml:space="preserve">• </w:t>
+      </w:r>
+      <w:proofErr w:type="gramStart"/>
+      <w:r>
+        <w:rPr>
+          <w:rFonts w:eastAsia="Times New Roman"/>
+        </w:rPr>
+        <w:t>capacitación</w:t>
+      </w:r>
+      <w:proofErr w:type="gramEnd"/>
+      <w:r>
+        <w:rPr>
+          <w:rFonts w:eastAsia="Times New Roman"/>
+        </w:rPr>
+        <w:t xml:space="preserve"> al personal para promover su utilización sistemática.</w:t>
+      </w:r>
+    </w:p>
+    <w:p>
+      <w:pPr>
+        <w:ind w:left="708"/>
+        <w:rPr>
+          <w:rFonts w:eastAsia="Times New Roman"/>
+        </w:rPr>
+      </w:pPr>
+    </w:p>
+    <w:p>
+      <w:pPr>
+        <w:pStyle w:val="Ttulo2"/>
+      </w:pPr>
+      <w:r>
+        <w:t>Resultado esperado</w:t>
+      </w:r>
+    </w:p>
+    <w:p>
+      <w:pPr>
+        <w:rPr>
+          <w:rFonts w:eastAsia="Times New Roman"/>
+          <w:sz w:val="24"/>
+          <w:szCs w:val="24"/>
+        </w:rPr>
+      </w:pPr>
+      <w:r>
+        <w:rPr>
+          <w:rFonts w:eastAsia="Times New Roman"/>
+          <w:sz w:val="24"/>
+          <w:szCs w:val="24"/>
+        </w:rPr>
+        <w:lastRenderedPageBreak/>
+        <w:t>Se fortalecerá la colaboración entre los distintos grupos de trabajo, se facilitará el acceso al conocimiento técnico acumulado, se eliminarán los silos informáticos y se mejorará la cohesión del Departamento.</w:t>
+      </w:r>
+    </w:p>
+    <w:p/>
+    <w:p>
+      <w:pPr>
+        <w:pStyle w:val="Ttulo2"/>
+      </w:pPr>
+      <w:r>
+        <w:t xml:space="preserve">6.5 </w:t>
+      </w:r>
+      <w:r>
+        <w:t>Fortalecimiento de la estructura técnica y diferenciación de roles</w:t>
+      </w:r>
+      <w:r>
+        <w:tab/>
+      </w:r>
+    </w:p>
+    <w:p>
+      <w:pPr>
+        <w:pStyle w:val="Ttulo2"/>
+      </w:pPr>
+      <w:r>
+        <w:t>Problema</w:t>
+      </w:r>
+    </w:p>
+    <w:p>
+      <w:pPr>
+        <w:pStyle w:val="Ttulo2"/>
+        <w:rPr>
+          <w:rFonts w:eastAsia="Times New Roman"/>
+          <w:color w:val="auto"/>
+          <w:sz w:val="24"/>
+          <w:szCs w:val="24"/>
+        </w:rPr>
+      </w:pPr>
+      <w:r>
+        <w:rPr>
+          <w:rFonts w:eastAsia="Times New Roman"/>
+          <w:color w:val="auto"/>
+          <w:sz w:val="24"/>
+          <w:szCs w:val="24"/>
+        </w:rPr>
+        <w:t>La gestión de una cartera compleja de proyectos requiere herramientas de visualización gerencial que permitan medir el desempeño operativo, evaluar la carga de trabajo real y anticipar cuellos de botella en las entregas.</w:t>
+      </w:r>
+    </w:p>
+    <w:p>
+      <w:pPr>
+        <w:pStyle w:val="Ttulo2"/>
+      </w:pPr>
+      <w:r>
+        <w:br/>
+        <w:t>Propuesta</w:t>
+      </w:r>
+    </w:p>
+    <w:p>
+      <w:pPr>
+        <w:pStyle w:val="Ttulo2"/>
+        <w:rPr>
+          <w:rFonts w:eastAsia="Times New Roman"/>
+          <w:color w:val="auto"/>
+          <w:sz w:val="24"/>
+          <w:szCs w:val="24"/>
+        </w:rPr>
+      </w:pPr>
+      <w:r>
+        <w:rPr>
+          <w:rFonts w:eastAsia="Times New Roman"/>
+          <w:color w:val="auto"/>
+          <w:sz w:val="24"/>
+          <w:szCs w:val="24"/>
+        </w:rPr>
+        <w:t xml:space="preserve">Incorporar herramientas de analítica y visualización que complementen la plataforma de gestión de proyectos del Departamento, permitiendo generar tableros ejecutivos automáticos, medir indicadores de capacidad operativa y facilitar </w:t>
+      </w:r>
+      <w:r>
+        <w:rPr>
+          <w:rFonts w:eastAsia="Times New Roman"/>
+          <w:color w:val="auto"/>
+          <w:sz w:val="24"/>
+          <w:szCs w:val="24"/>
+        </w:rPr>
+        <w:t>la toma de decisiones informada</w:t>
+      </w:r>
+      <w:r>
+        <w:rPr>
+          <w:rFonts w:eastAsia="Times New Roman"/>
+          <w:color w:val="auto"/>
+          <w:sz w:val="24"/>
+          <w:szCs w:val="24"/>
+        </w:rPr>
+        <w:t>.</w:t>
+      </w:r>
+    </w:p>
+    <w:p>
+      <w:pPr>
+        <w:pStyle w:val="Ttulo2"/>
+      </w:pPr>
+    </w:p>
+    <w:p>
+      <w:pPr>
+        <w:pStyle w:val="Ttulo2"/>
+      </w:pPr>
+      <w:r>
+        <w:t>Implementación</w:t>
+      </w:r>
+    </w:p>
+    <w:p>
+      <w:pPr>
+        <w:rPr>
+          <w:rFonts w:eastAsia="Times New Roman"/>
+          <w:sz w:val="24"/>
+          <w:szCs w:val="24"/>
+        </w:rPr>
+      </w:pPr>
+      <w:r>
+        <w:rPr>
+          <w:rFonts w:eastAsia="Times New Roman"/>
+          <w:sz w:val="24"/>
+          <w:szCs w:val="24"/>
+        </w:rPr>
+        <w:t>La implementación comprenderá:</w:t>
+      </w:r>
+    </w:p>
+    <w:p>
+      <w:pPr>
+        <w:ind w:left="708"/>
+        <w:rPr>
+          <w:rFonts w:eastAsia="Times New Roman"/>
+        </w:rPr>
+      </w:pPr>
+      <w:r>
+        <w:rPr>
+          <w:rFonts w:eastAsia="Times New Roman"/>
+        </w:rPr>
+        <w:t xml:space="preserve">• </w:t>
+      </w:r>
+      <w:proofErr w:type="gramStart"/>
+      <w:r>
+        <w:rPr>
+          <w:rFonts w:eastAsia="Times New Roman"/>
+        </w:rPr>
+        <w:t>integración</w:t>
+      </w:r>
+      <w:proofErr w:type="gramEnd"/>
+      <w:r>
+        <w:rPr>
+          <w:rFonts w:eastAsia="Times New Roman"/>
+        </w:rPr>
+        <w:t xml:space="preserve"> de módulos de analítica y tableros de control sobre la cartera de proyectos del Departamento;</w:t>
+      </w:r>
+    </w:p>
+    <w:p>
+      <w:pPr>
+        <w:ind w:left="708"/>
+        <w:rPr>
+          <w:rFonts w:eastAsia="Times New Roman"/>
+        </w:rPr>
+      </w:pPr>
+      <w:r>
+        <w:rPr>
+          <w:rFonts w:eastAsia="Times New Roman"/>
+        </w:rPr>
+        <w:t xml:space="preserve">• </w:t>
+      </w:r>
+      <w:proofErr w:type="gramStart"/>
+      <w:r>
+        <w:rPr>
+          <w:rFonts w:eastAsia="Times New Roman"/>
+        </w:rPr>
+        <w:t>definición</w:t>
+      </w:r>
+      <w:proofErr w:type="gramEnd"/>
+      <w:r>
+        <w:rPr>
+          <w:rFonts w:eastAsia="Times New Roman"/>
+        </w:rPr>
+        <w:t xml:space="preserve"> de paneles visuales para el seguimiento del estado de solicitudes, tiempos de respuesta y volumen de trabajo;</w:t>
+      </w:r>
+    </w:p>
+    <w:p>
+      <w:pPr>
+        <w:ind w:left="708"/>
+        <w:rPr>
+          <w:rFonts w:eastAsia="Times New Roman"/>
+        </w:rPr>
+      </w:pPr>
+      <w:r>
+        <w:rPr>
+          <w:rFonts w:eastAsia="Times New Roman"/>
+        </w:rPr>
+        <w:t xml:space="preserve">• </w:t>
+      </w:r>
+      <w:proofErr w:type="gramStart"/>
+      <w:r>
+        <w:rPr>
+          <w:rFonts w:eastAsia="Times New Roman"/>
+        </w:rPr>
+        <w:t>utilización</w:t>
+      </w:r>
+      <w:proofErr w:type="gramEnd"/>
+      <w:r>
+        <w:rPr>
+          <w:rFonts w:eastAsia="Times New Roman"/>
+        </w:rPr>
+        <w:t xml:space="preserve"> de métricas objetivas para informar la evolución de las iniciativas a las autoridades municipales.</w:t>
+      </w:r>
+    </w:p>
+    <w:p>
+      <w:pPr>
+        <w:ind w:left="708"/>
+        <w:rPr>
+          <w:rFonts w:eastAsia="Times New Roman"/>
+        </w:rPr>
+      </w:pPr>
+    </w:p>
+    <w:p>
+      <w:pPr>
+        <w:pStyle w:val="Ttulo2"/>
+      </w:pPr>
+      <w:r>
+        <w:t>Resultado esperado</w:t>
+      </w:r>
+    </w:p>
+    <w:p>
+      <w:pPr>
+        <w:pStyle w:val="Ttulo2"/>
+        <w:rPr>
+          <w:rFonts w:eastAsia="Times New Roman"/>
+          <w:color w:val="auto"/>
+          <w:sz w:val="24"/>
+          <w:szCs w:val="24"/>
+        </w:rPr>
+      </w:pPr>
+      <w:r>
+        <w:rPr>
+          <w:rFonts w:eastAsia="Times New Roman"/>
+          <w:color w:val="auto"/>
+          <w:sz w:val="24"/>
+          <w:szCs w:val="24"/>
+        </w:rPr>
+        <w:t>Se obtendrá visibilidad gerencial completa sobre la capacidad operativa del Departamento, optimizando la asignación de recursos y sustentando la toma de decisiones en evidencia objetiva.</w:t>
+      </w:r>
+    </w:p>
+    <w:p>
+      <w:pPr>
+        <w:pStyle w:val="Ttulo2"/>
+      </w:pPr>
+    </w:p>
+    <w:p>
+      <w:pPr>
+        <w:pStyle w:val="Ttulo2"/>
+      </w:pPr>
+      <w:r>
+        <w:t>6.</w:t>
+      </w:r>
+      <w:r>
+        <w:t>6</w:t>
+      </w:r>
+      <w:r>
+        <w:t xml:space="preserve"> </w:t>
+      </w:r>
+      <w:r>
+        <w:t>Fortalecimiento gradual de la estructura técnica y especialización funcional</w:t>
+      </w:r>
+    </w:p>
+    <w:p>
+      <w:pPr>
+        <w:pStyle w:val="Ttulo2"/>
+      </w:pPr>
+      <w:r>
+        <w:t>Problema</w:t>
+      </w:r>
+    </w:p>
+    <w:p>
+      <w:pPr>
+        <w:pStyle w:val="Ttulo2"/>
+        <w:rPr>
+          <w:rFonts w:eastAsia="Times New Roman"/>
+          <w:color w:val="auto"/>
+          <w:sz w:val="24"/>
+          <w:szCs w:val="24"/>
+        </w:rPr>
+      </w:pPr>
+      <w:r>
+        <w:rPr>
+          <w:rFonts w:eastAsia="Times New Roman"/>
+          <w:color w:val="auto"/>
+          <w:sz w:val="24"/>
+          <w:szCs w:val="24"/>
+        </w:rPr>
+        <w:t>La dotación actual limita la posibilidad de asignar responsabilidades especializadas en análisis funcional, arquitectura de software, calidad y liderazgo técnico, obligando a los agentes a desempeñar simultáneamente múltiples funciones.</w:t>
+      </w:r>
+    </w:p>
+    <w:p>
+      <w:pPr>
+        <w:pStyle w:val="Ttulo2"/>
+      </w:pPr>
+      <w:r>
+        <w:br/>
+        <w:t>Propuesta</w:t>
+      </w:r>
+    </w:p>
+    <w:p>
+      <w:pPr>
+        <w:pStyle w:val="Ttulo2"/>
+        <w:rPr>
+          <w:rFonts w:eastAsia="Times New Roman"/>
+          <w:color w:val="auto"/>
+          <w:sz w:val="24"/>
+          <w:szCs w:val="24"/>
+        </w:rPr>
+      </w:pPr>
+      <w:r>
+        <w:rPr>
+          <w:rFonts w:eastAsia="Times New Roman"/>
+          <w:color w:val="auto"/>
+          <w:sz w:val="24"/>
+          <w:szCs w:val="24"/>
+        </w:rPr>
+        <w:t xml:space="preserve">En función de la disponibilidad presupuestaria e incorporar recursos humanos, fortalecer progresivamente la estructura técnica del Departamento mediante la incorporación de </w:t>
+      </w:r>
+      <w:r>
+        <w:rPr>
+          <w:rFonts w:eastAsia="Times New Roman"/>
+          <w:color w:val="auto"/>
+          <w:sz w:val="24"/>
+          <w:szCs w:val="24"/>
+        </w:rPr>
+        <w:lastRenderedPageBreak/>
+        <w:t>perfiles profesionales que permitan consolidar una mayor especialización funcional y una mejor distribución de responsabilidades.</w:t>
+      </w:r>
+    </w:p>
+    <w:p>
+      <w:pPr>
+        <w:pStyle w:val="Ttulo2"/>
+      </w:pPr>
+    </w:p>
+    <w:p>
+      <w:pPr>
+        <w:pStyle w:val="Ttulo2"/>
+      </w:pPr>
+      <w:r>
+        <w:t>Implementación</w:t>
+      </w:r>
+    </w:p>
+    <w:p>
+      <w:pPr>
+        <w:rPr>
+          <w:rFonts w:eastAsia="Times New Roman"/>
+          <w:sz w:val="24"/>
+          <w:szCs w:val="24"/>
+        </w:rPr>
+      </w:pPr>
+      <w:r>
+        <w:rPr>
+          <w:rFonts w:eastAsia="Times New Roman"/>
+          <w:sz w:val="24"/>
+          <w:szCs w:val="24"/>
+        </w:rPr>
+        <w:t>La implementación comprenderá:</w:t>
+      </w:r>
+    </w:p>
+    <w:p>
+      <w:pPr>
+        <w:ind w:left="708"/>
+        <w:rPr>
+          <w:rFonts w:eastAsia="Times New Roman"/>
+        </w:rPr>
+      </w:pPr>
+      <w:r>
+        <w:rPr>
+          <w:rFonts w:eastAsia="Times New Roman"/>
+        </w:rPr>
+        <w:t xml:space="preserve">• </w:t>
+      </w:r>
+      <w:proofErr w:type="gramStart"/>
+      <w:r>
+        <w:rPr>
+          <w:rFonts w:eastAsia="Times New Roman"/>
+        </w:rPr>
+        <w:t>incorporación</w:t>
+      </w:r>
+      <w:proofErr w:type="gramEnd"/>
+      <w:r>
+        <w:rPr>
+          <w:rFonts w:eastAsia="Times New Roman"/>
+        </w:rPr>
+        <w:t xml:space="preserve"> gradual de perfiles técnicos dedicados al desarrollo de software;</w:t>
+      </w:r>
+    </w:p>
+    <w:p>
+      <w:pPr>
+        <w:ind w:left="708"/>
+        <w:rPr>
+          <w:rFonts w:eastAsia="Times New Roman"/>
+        </w:rPr>
+      </w:pPr>
+      <w:r>
+        <w:rPr>
+          <w:rFonts w:eastAsia="Times New Roman"/>
+        </w:rPr>
+        <w:t xml:space="preserve">• </w:t>
+      </w:r>
+      <w:proofErr w:type="gramStart"/>
+      <w:r>
+        <w:rPr>
+          <w:rFonts w:eastAsia="Times New Roman"/>
+        </w:rPr>
+        <w:t>fortalecimiento</w:t>
+      </w:r>
+      <w:proofErr w:type="gramEnd"/>
+      <w:r>
+        <w:rPr>
+          <w:rFonts w:eastAsia="Times New Roman"/>
+        </w:rPr>
+        <w:t xml:space="preserve"> de las funciones de análisis funcional, arquitectura y aseguramiento de calidad asignadas a los perfiles de mayor experiencia;</w:t>
+      </w:r>
+    </w:p>
+    <w:p>
+      <w:pPr>
+        <w:ind w:left="708"/>
+        <w:rPr>
+          <w:rFonts w:eastAsia="Times New Roman"/>
+        </w:rPr>
+      </w:pPr>
+      <w:r>
+        <w:rPr>
+          <w:rFonts w:eastAsia="Times New Roman"/>
+        </w:rPr>
+        <w:t xml:space="preserve">• </w:t>
+      </w:r>
+      <w:proofErr w:type="gramStart"/>
+      <w:r>
+        <w:rPr>
+          <w:rFonts w:eastAsia="Times New Roman"/>
+        </w:rPr>
+        <w:t>conformación</w:t>
+      </w:r>
+      <w:proofErr w:type="gramEnd"/>
+      <w:r>
+        <w:rPr>
+          <w:rFonts w:eastAsia="Times New Roman"/>
+        </w:rPr>
+        <w:t xml:space="preserve"> de equipos con responsabilidades claramente definidas y esquemas de </w:t>
+      </w:r>
+      <w:proofErr w:type="spellStart"/>
+      <w:r>
+        <w:rPr>
+          <w:rFonts w:eastAsia="Times New Roman"/>
+        </w:rPr>
+        <w:t>mentoría</w:t>
+      </w:r>
+      <w:proofErr w:type="spellEnd"/>
+      <w:r>
+        <w:rPr>
+          <w:rFonts w:eastAsia="Times New Roman"/>
+        </w:rPr>
+        <w:t xml:space="preserve"> hacia el personal de reciente ingreso;</w:t>
+      </w:r>
+    </w:p>
+    <w:p>
+      <w:pPr>
+        <w:ind w:left="708"/>
+        <w:rPr>
+          <w:rFonts w:eastAsia="Times New Roman"/>
+        </w:rPr>
+      </w:pPr>
+      <w:r>
+        <w:rPr>
+          <w:rFonts w:eastAsia="Times New Roman"/>
+        </w:rPr>
+        <w:t xml:space="preserve">• </w:t>
+      </w:r>
+      <w:proofErr w:type="gramStart"/>
+      <w:r>
+        <w:rPr>
+          <w:rFonts w:eastAsia="Times New Roman"/>
+        </w:rPr>
+        <w:t>evaluación</w:t>
+      </w:r>
+      <w:proofErr w:type="gramEnd"/>
+      <w:r>
+        <w:rPr>
+          <w:rFonts w:eastAsia="Times New Roman"/>
+        </w:rPr>
+        <w:t xml:space="preserve"> periódica de la capacidad operativa y cohesión de los grupos de trabajo.</w:t>
+      </w:r>
+    </w:p>
+    <w:p>
+      <w:pPr>
+        <w:rPr>
+          <w:rFonts w:eastAsia="Times New Roman"/>
+        </w:rPr>
+      </w:pPr>
+    </w:p>
+    <w:p>
+      <w:pPr>
+        <w:pStyle w:val="Ttulo2"/>
+      </w:pPr>
+      <w:r>
+        <w:t>Resultado esperado</w:t>
+      </w:r>
+    </w:p>
+    <w:p>
+      <w:pPr>
+        <w:rPr>
+          <w:rFonts w:eastAsia="Times New Roman"/>
+        </w:rPr>
+      </w:pPr>
+      <w:r>
+        <w:rPr>
+          <w:rFonts w:eastAsia="Times New Roman"/>
+          <w:sz w:val="24"/>
+          <w:szCs w:val="24"/>
+        </w:rPr>
+        <w:t>Se optimizará la distribución de responsabilidades, aumentará la capacidad operativa del Departamento para responder a nuevas demandas y se preservará sostenidamente el conocimiento del negocio municipal.</w:t>
+      </w:r>
+    </w:p>
+    <w:p>
+      <w:pPr>
+        <w:ind w:left="708"/>
+        <w:rPr>
+          <w:u w:val="single"/>
+        </w:rPr>
+      </w:pPr>
+    </w:p>
+    <w:p>
+      <w:pPr>
+        <w:pStyle w:val="Ttulo1"/>
+      </w:pPr>
+      <w:r>
+        <w:t>7. IMPLEMENTACIÓN DEL PLAN DE TRABAJO</w:t>
       </w:r>
     </w:p>
     <w:p>
@@ -3613,7 +5219,7 @@
         <w:rPr>
           <w:rFonts w:ascii="Arial" w:hAnsi="Arial" w:cs="Arial"/>
         </w:rPr>
-        <w:t>No obstante, la incorporación gradual de recursos presupuestarios permitiría consolidar y potenciar dichas acciones, incrementando la productividad del equipo, fortaleciendo la calidad del software y acelerando el proceso de modernización tecnológica.</w:t>
+        <w:t>La implementación de las propuestas desarrolladas requiere una ejecución gradual que permita introducir mejoras sin afectar la continuidad de los servicios que presta el Departamento.</w:t>
       </w:r>
     </w:p>
     <w:p>
@@ -3627,420 +5233,27 @@
         <w:rPr>
           <w:rFonts w:ascii="Arial" w:hAnsi="Arial" w:cs="Arial"/>
         </w:rPr>
-        <w:t>En este contexto, se identifican las siguientes líneas de inversión prioritaria.</w:t>
+        <w:t>Por tal motivo, se propone una estrategia de implementación progresiva organizada en tres etapas, priorizando inicialmente aquellas acciones de carácter organizacional que no requieren recursos presupuestarios adicionales.</w:t>
+      </w:r>
+    </w:p>
+    <w:p>
+      <w:pPr>
+        <w:pStyle w:val="NormalWeb"/>
+        <w:rPr>
+          <w:rFonts w:ascii="Arial" w:hAnsi="Arial" w:cs="Arial"/>
+        </w:rPr>
+      </w:pPr>
+      <w:r>
+        <w:rPr>
+          <w:rFonts w:ascii="Arial" w:hAnsi="Arial" w:cs="Arial"/>
+        </w:rPr>
+        <w:t>Este enfoque permitirá consolidar nuevas formas de trabajo, evaluar los resultados obtenidos y realizar los ajustes necesarios antes de avanzar hacia iniciativas de mayor complejidad.</w:t>
       </w:r>
     </w:p>
     <w:p>
       <w:r>
         <w:pict>
           <v:rect id="_x0000_i1030" style="width:0;height:1.5pt" o:hralign="center" o:hrstd="t" o:hr="t" fillcolor="#a0a0a0" stroked="f"/>
-        </w:pict>
-      </w:r>
-    </w:p>
-    <w:p>
-      <w:pPr>
-        <w:pStyle w:val="Ttulo2"/>
-      </w:pPr>
-      <w:r>
-        <w:t>6.1 Incorporación de herramientas de apoyo al desarrollo</w:t>
-      </w:r>
-    </w:p>
-    <w:p>
-      <w:pPr>
-        <w:pStyle w:val="NormalWeb"/>
-        <w:rPr>
-          <w:rFonts w:ascii="Arial" w:hAnsi="Arial" w:cs="Arial"/>
-        </w:rPr>
-      </w:pPr>
-      <w:r>
-        <w:rPr>
-          <w:rFonts w:ascii="Arial" w:hAnsi="Arial" w:cs="Arial"/>
-        </w:rPr>
-        <w:t>La evolución de las herramientas de desarrollo ofrece actualmente soluciones que permiten automatizar tareas repetitivas, mejorar la calidad del código y asistir a los equipos durante el proceso de programación.</w:t>
-      </w:r>
-    </w:p>
-    <w:p>
-      <w:pPr>
-        <w:pStyle w:val="NormalWeb"/>
-        <w:rPr>
-          <w:rFonts w:ascii="Arial" w:hAnsi="Arial" w:cs="Arial"/>
-        </w:rPr>
-      </w:pPr>
-      <w:r>
-        <w:rPr>
-          <w:rFonts w:ascii="Arial" w:hAnsi="Arial" w:cs="Arial"/>
-        </w:rPr>
-        <w:t>La adquisición de licencias corporativas de asistentes de programación basados en Inteligencia Artificial permitiría incrementar la productividad del Departamento, agilizar la generación de documentación técnica y facilitar la incorporación de nuevas tecnologías.</w:t>
-      </w:r>
-    </w:p>
-    <w:p>
-      <w:pPr>
-        <w:pStyle w:val="NormalWeb"/>
-        <w:rPr>
-          <w:rFonts w:ascii="Arial" w:hAnsi="Arial" w:cs="Arial"/>
-        </w:rPr>
-      </w:pPr>
-      <w:r>
-        <w:rPr>
-          <w:rFonts w:ascii="Arial" w:hAnsi="Arial" w:cs="Arial"/>
-        </w:rPr>
-        <w:t>Asimismo, la implementación de herramientas de análisis estático de código posibilitaría detectar vulnerabilidades, problemas de calidad y deuda técnica durante el proceso de desarrollo, fortaleciendo los mecanismos de control definidos en la propuesta de mejora.</w:t>
-      </w:r>
-    </w:p>
-    <w:p>
-      <w:pPr>
-        <w:pStyle w:val="NormalWeb"/>
-        <w:rPr>
-          <w:rFonts w:ascii="Arial" w:hAnsi="Arial" w:cs="Arial"/>
-        </w:rPr>
-      </w:pPr>
-      <w:r>
-        <w:rPr>
-          <w:rFonts w:ascii="Arial" w:hAnsi="Arial" w:cs="Arial"/>
-        </w:rPr>
-        <w:t>La utilización de estas herramientas deberá integrarse a los procedimientos institucionales existentes y no sustituirá la revisión técnica realizada por el personal del Departamento.</w:t>
-      </w:r>
-    </w:p>
-    <w:p>
-      <w:r>
-        <w:pict>
-          <v:rect id="_x0000_i1031" style="width:0;height:1.5pt" o:hralign="center" o:hrstd="t" o:hr="t" fillcolor="#a0a0a0" stroked="f"/>
-        </w:pict>
-      </w:r>
-    </w:p>
-    <w:p>
-      <w:pPr>
-        <w:pStyle w:val="Ttulo2"/>
-      </w:pPr>
-      <w:r>
-        <w:t>6.2 Capacitación continua del personal</w:t>
-      </w:r>
-    </w:p>
-    <w:p>
-      <w:pPr>
-        <w:pStyle w:val="NormalWeb"/>
-        <w:rPr>
-          <w:rFonts w:ascii="Arial" w:hAnsi="Arial" w:cs="Arial"/>
-        </w:rPr>
-      </w:pPr>
-      <w:r>
-        <w:rPr>
-          <w:rFonts w:ascii="Arial" w:hAnsi="Arial" w:cs="Arial"/>
-        </w:rPr>
-        <w:t>La actualización permanente de conocimientos constituye un requisito indispensable para sostener la evolución tecnológica de los sistemas municipales.</w:t>
-      </w:r>
-    </w:p>
-    <w:p>
-      <w:pPr>
-        <w:pStyle w:val="NormalWeb"/>
-        <w:rPr>
-          <w:rFonts w:ascii="Arial" w:hAnsi="Arial" w:cs="Arial"/>
-        </w:rPr>
-      </w:pPr>
-      <w:r>
-        <w:rPr>
-          <w:rFonts w:ascii="Arial" w:hAnsi="Arial" w:cs="Arial"/>
-        </w:rPr>
-        <w:t>La incorporación de presupuesto permitirá ampliar las instancias de formación mediante cursos, certificaciones y actividades de capacitación especializadas, orientadas tanto a aspectos técnicos como a metodologías de gestión de proyectos y buenas prácticas de desarrollo.</w:t>
-      </w:r>
-    </w:p>
-    <w:p>
-      <w:pPr>
-        <w:pStyle w:val="NormalWeb"/>
-        <w:rPr>
-          <w:rFonts w:ascii="Arial" w:hAnsi="Arial" w:cs="Arial"/>
-        </w:rPr>
-      </w:pPr>
-      <w:r>
-        <w:rPr>
-          <w:rFonts w:ascii="Arial" w:hAnsi="Arial" w:cs="Arial"/>
-        </w:rPr>
-        <w:lastRenderedPageBreak/>
-        <w:t>La planificación de estas actividades deberá responder a las necesidades detectadas en la Matriz de Competencias del Departamento, procurando que la inversión realizada genere beneficios concretos para la organización y fortalezca las capacidades del equipo de trabajo.</w:t>
-      </w:r>
-    </w:p>
-    <w:p>
-      <w:r>
-        <w:pict>
-          <v:rect id="_x0000_i1032" style="width:0;height:1.5pt" o:hralign="center" o:hrstd="t" o:hr="t" fillcolor="#a0a0a0" stroked="f"/>
-        </w:pict>
-      </w:r>
-    </w:p>
-    <w:p>
-      <w:pPr>
-        <w:pStyle w:val="Ttulo2"/>
-      </w:pPr>
-      <w:r>
-        <w:t>6.3 Modernización tecnológica e infraestructura</w:t>
-      </w:r>
-    </w:p>
-    <w:p>
-      <w:pPr>
-        <w:pStyle w:val="NormalWeb"/>
-        <w:rPr>
-          <w:rFonts w:ascii="Arial" w:hAnsi="Arial" w:cs="Arial"/>
-        </w:rPr>
-      </w:pPr>
-      <w:r>
-        <w:rPr>
-          <w:rFonts w:ascii="Arial" w:hAnsi="Arial" w:cs="Arial"/>
-        </w:rPr>
-        <w:t>La coexistencia de sistemas desarrollados sobre tecnologías de distintas generaciones hace necesario planificar un proceso gradual de modernización que permita reducir la complejidad técnica del ecosistema informático municipal.</w:t>
-      </w:r>
-    </w:p>
-    <w:p>
-      <w:pPr>
-        <w:pStyle w:val="NormalWeb"/>
-        <w:rPr>
-          <w:rFonts w:ascii="Arial" w:hAnsi="Arial" w:cs="Arial"/>
-        </w:rPr>
-      </w:pPr>
-      <w:r>
-        <w:rPr>
-          <w:rFonts w:ascii="Arial" w:hAnsi="Arial" w:cs="Arial"/>
-        </w:rPr>
-        <w:t>La disponibilidad de recursos facilitará la actualización progresiva de aplicaciones, la incorporación de nuevas herramientas de despliegue y la adopción de tecnologías que simplifiquen la administración de los ambientes de desarrollo, prueba y producción.</w:t>
-      </w:r>
-    </w:p>
-    <w:p>
-      <w:pPr>
-        <w:pStyle w:val="NormalWeb"/>
-        <w:rPr>
-          <w:rFonts w:ascii="Arial" w:hAnsi="Arial" w:cs="Arial"/>
-        </w:rPr>
-      </w:pPr>
-      <w:r>
-        <w:rPr>
-          <w:rFonts w:ascii="Arial" w:hAnsi="Arial" w:cs="Arial"/>
-        </w:rPr>
-        <w:t>Estas acciones deberán coordinarse con las áreas responsables de infraestructura tecnológica, procurando que la evolución de los sistemas se realice de manera ordenada y compatible con la estrategia tecnológica institucional.</w:t>
-      </w:r>
-    </w:p>
-    <w:p>
-      <w:r>
-        <w:pict>
-          <v:rect id="_x0000_i1033" style="width:0;height:1.5pt" o:hralign="center" o:hrstd="t" o:hr="t" fillcolor="#a0a0a0" stroked="f"/>
-        </w:pict>
-      </w:r>
-    </w:p>
-    <w:p>
-      <w:pPr>
-        <w:pStyle w:val="Ttulo2"/>
-      </w:pPr>
-      <w:r>
-        <w:t>6.4 Fortalecimiento del trabajo colaborativo</w:t>
-      </w:r>
-    </w:p>
-    <w:p>
-      <w:pPr>
-        <w:pStyle w:val="NormalWeb"/>
-        <w:rPr>
-          <w:rFonts w:ascii="Arial" w:hAnsi="Arial" w:cs="Arial"/>
-        </w:rPr>
-      </w:pPr>
-      <w:r>
-        <w:rPr>
-          <w:rFonts w:ascii="Arial" w:hAnsi="Arial" w:cs="Arial"/>
-        </w:rPr>
-        <w:t>La distribución física del personal hace conveniente incorporar recursos que favorezcan la comunicación y el trabajo coordinado entre los distintos equipos.</w:t>
-      </w:r>
-    </w:p>
-    <w:p>
-      <w:pPr>
-        <w:pStyle w:val="NormalWeb"/>
-        <w:rPr>
-          <w:rFonts w:ascii="Arial" w:hAnsi="Arial" w:cs="Arial"/>
-        </w:rPr>
-      </w:pPr>
-      <w:r>
-        <w:rPr>
-          <w:rFonts w:ascii="Arial" w:hAnsi="Arial" w:cs="Arial"/>
-        </w:rPr>
-        <w:t>La provisión de equipamiento específico para reuniones virtuales y colaboración remota permitirá fortalecer la interacción cotidiana entre las dependencias del Departamento y mejorar la articulación con las distintas áreas municipales.</w:t>
-      </w:r>
-    </w:p>
-    <w:p>
-      <w:pPr>
-        <w:pStyle w:val="NormalWeb"/>
-        <w:rPr>
-          <w:rFonts w:ascii="Arial" w:hAnsi="Arial" w:cs="Arial"/>
-        </w:rPr>
-      </w:pPr>
-      <w:r>
-        <w:rPr>
-          <w:rFonts w:ascii="Arial" w:hAnsi="Arial" w:cs="Arial"/>
-        </w:rPr>
-        <w:t>Estas inversiones complementarán las acciones organizacionales propuestas anteriormente, contribuyendo a consolidar un modelo de trabajo más integrado y eficiente.</w:t>
-      </w:r>
-    </w:p>
-    <w:p>
-      <w:r>
-        <w:pict>
-          <v:rect id="_x0000_i1034" style="width:0;height:1.5pt" o:hralign="center" o:hrstd="t" o:hr="t" fillcolor="#a0a0a0" stroked="f"/>
-        </w:pict>
-      </w:r>
-    </w:p>
-    <w:p>
-      <w:pPr>
-        <w:pStyle w:val="Ttulo2"/>
-      </w:pPr>
-      <w:r>
-        <w:t xml:space="preserve">6.5 </w:t>
-      </w:r>
-      <w:r>
-        <w:t>Fortalecimiento de la estructura técnica y diferenciación de roles</w:t>
-      </w:r>
-      <w:r>
-        <w:tab/>
-      </w:r>
-    </w:p>
-    <w:p>
-      <w:pPr>
-        <w:pStyle w:val="Ttulo2"/>
-        <w:rPr>
-          <w:rFonts w:eastAsia="Times New Roman"/>
-          <w:color w:val="auto"/>
-          <w:sz w:val="24"/>
-          <w:szCs w:val="24"/>
-        </w:rPr>
-      </w:pPr>
-      <w:r>
-        <w:rPr>
-          <w:rFonts w:eastAsia="Times New Roman"/>
-          <w:color w:val="auto"/>
-          <w:sz w:val="24"/>
-          <w:szCs w:val="24"/>
-        </w:rPr>
-        <w:t>En la medida en que la disponibilidad presupuestaria y las decisiones institucionales de incorporación de personal lo permitan, se procurará evolucionar hacia una estructura funcional donde la especialización del agrupamiento permita conformar equipos con roles diferenciados.</w:t>
-      </w:r>
-    </w:p>
-    <w:p>
-      <w:pPr>
-        <w:pStyle w:val="Ttulo2"/>
-        <w:rPr>
-          <w:rFonts w:eastAsia="Times New Roman"/>
-          <w:color w:val="auto"/>
-          <w:sz w:val="24"/>
-          <w:szCs w:val="24"/>
-        </w:rPr>
-      </w:pPr>
-      <w:r>
-        <w:rPr>
-          <w:rFonts w:eastAsia="Times New Roman"/>
-          <w:color w:val="auto"/>
-          <w:sz w:val="24"/>
-          <w:szCs w:val="24"/>
-        </w:rPr>
-        <w:t xml:space="preserve">En este esquema, los perfiles con mayor experiencia podrán concentrar sus tareas en el análisis funcional, la arquitectura del software y la coordinación técnica, acompañando y formando a programadores dedicados principalmente al desarrollo e implementación de soluciones. </w:t>
-      </w:r>
-    </w:p>
-    <w:p>
-      <w:pPr>
-        <w:pStyle w:val="Ttulo2"/>
-        <w:rPr>
-          <w:rFonts w:eastAsia="Times New Roman"/>
-          <w:color w:val="auto"/>
-          <w:sz w:val="24"/>
-          <w:szCs w:val="24"/>
-        </w:rPr>
-      </w:pPr>
-      <w:r>
-        <w:rPr>
-          <w:rFonts w:eastAsia="Times New Roman"/>
-          <w:color w:val="auto"/>
-          <w:sz w:val="24"/>
-          <w:szCs w:val="24"/>
-        </w:rPr>
-        <w:t>Este modelo potenciará la transferencia de conocimientos sobre el funcionamiento de la Administración Pública Municipal, reduciendo los tiempos de adaptación del nuevo personal y elevando la calidad técnica de las soluciones informáticas.</w:t>
-      </w:r>
-    </w:p>
-    <w:p>
-      <w:pPr>
-        <w:pStyle w:val="Ttulo2"/>
-      </w:pPr>
-      <w:bookmarkStart w:id="0" w:name="_GoBack"/>
-      <w:bookmarkEnd w:id="0"/>
-      <w:r>
-        <w:lastRenderedPageBreak/>
-        <w:t>6.</w:t>
-      </w:r>
-      <w:r>
-        <w:t>6</w:t>
-      </w:r>
-      <w:r>
-        <w:t xml:space="preserve"> Resultado esperado</w:t>
-      </w:r>
-    </w:p>
-    <w:p>
-      <w:pPr>
-        <w:pStyle w:val="NormalWeb"/>
-        <w:rPr>
-          <w:rFonts w:ascii="Arial" w:hAnsi="Arial" w:cs="Arial"/>
-        </w:rPr>
-      </w:pPr>
-      <w:r>
-        <w:rPr>
-          <w:rFonts w:ascii="Arial" w:hAnsi="Arial" w:cs="Arial"/>
-        </w:rPr>
-        <w:t>La incorporación gradual de estos recursos permitirá potenciar las acciones implementadas en la etapa inicial, consolidando un Departamento con mayor capacidad para planificar proyectos, preservar el conocimiento institucional, incorporar innovación tecnológica y brindar soluciones informáticas sostenibles para la Administración Municipal.</w:t>
-      </w:r>
-    </w:p>
-    <w:p/>
-    <w:p/>
-    <w:p>
-      <w:pPr>
-        <w:pStyle w:val="Ttulo1"/>
-      </w:pPr>
-      <w:r>
-        <w:t>7. IMPLEMENTACIÓN DEL PLAN DE TRABAJO</w:t>
-      </w:r>
-    </w:p>
-    <w:p>
-      <w:pPr>
-        <w:pStyle w:val="NormalWeb"/>
-        <w:rPr>
-          <w:rFonts w:ascii="Arial" w:hAnsi="Arial" w:cs="Arial"/>
-        </w:rPr>
-      </w:pPr>
-      <w:r>
-        <w:rPr>
-          <w:rFonts w:ascii="Arial" w:hAnsi="Arial" w:cs="Arial"/>
-        </w:rPr>
-        <w:t>La implementación de las propuestas desarrolladas requiere una ejecución gradual que permita introducir mejoras sin afectar la continuidad de los servicios que presta el Departamento.</w:t>
-      </w:r>
-    </w:p>
-    <w:p>
-      <w:pPr>
-        <w:pStyle w:val="NormalWeb"/>
-        <w:rPr>
-          <w:rFonts w:ascii="Arial" w:hAnsi="Arial" w:cs="Arial"/>
-        </w:rPr>
-      </w:pPr>
-      <w:r>
-        <w:rPr>
-          <w:rFonts w:ascii="Arial" w:hAnsi="Arial" w:cs="Arial"/>
-        </w:rPr>
-        <w:t>Por tal motivo, se propone una estrategia de implementación progresiva organizada en tres etapas, priorizando inicialmente aquellas acciones de carácter organizacional que no requieren recursos presupuestarios adicionales.</w:t>
-      </w:r>
-    </w:p>
-    <w:p>
-      <w:pPr>
-        <w:pStyle w:val="NormalWeb"/>
-        <w:rPr>
-          <w:rFonts w:ascii="Arial" w:hAnsi="Arial" w:cs="Arial"/>
-        </w:rPr>
-      </w:pPr>
-      <w:r>
-        <w:rPr>
-          <w:rFonts w:ascii="Arial" w:hAnsi="Arial" w:cs="Arial"/>
-        </w:rPr>
-        <w:t>Este enfoque permitirá consolidar nuevas formas de trabajo, evaluar los resultados obtenidos y realizar los ajustes necesarios antes de avanzar hacia iniciativas de mayor complejidad.</w:t>
-      </w:r>
-    </w:p>
-    <w:p>
-      <w:r>
-        <w:pict>
-          <v:rect id="_x0000_i1035" style="width:0;height:1.5pt" o:hralign="center" o:hrstd="t" o:hr="t" fillcolor="#a0a0a0" stroked="f"/>
         </w:pict>
       </w:r>
     </w:p>
@@ -4163,6 +5376,7 @@
         <w:jc w:val="left"/>
       </w:pPr>
       <w:r>
+        <w:lastRenderedPageBreak/>
         <w:t xml:space="preserve">elaboración del cronograma inicial de implementación. </w:t>
       </w:r>
     </w:p>
@@ -4183,7 +5397,7 @@
     <w:p>
       <w:r>
         <w:pict>
-          <v:rect id="_x0000_i1036" style="width:0;height:1.5pt" o:hralign="center" o:hrstd="t" o:hr="t" fillcolor="#a0a0a0" stroked="f"/>
+          <v:rect id="_x0000_i1031" style="width:0;height:1.5pt" o:hralign="center" o:hrstd="t" o:hr="t" fillcolor="#a0a0a0" stroked="f"/>
         </w:pict>
       </w:r>
     </w:p>
@@ -4206,7 +5420,6 @@
         <w:rPr>
           <w:rFonts w:ascii="Arial" w:hAnsi="Arial" w:cs="Arial"/>
         </w:rPr>
-        <w:lastRenderedPageBreak/>
         <w:t>Una vez consolidada la organización inicial, se avanzará en la formalización de los procedimientos internos y en la incorporación gradual de los estándares definidos en este Plan de Trabajo.</w:t>
       </w:r>
     </w:p>
@@ -4319,7 +5532,7 @@
     <w:p>
       <w:r>
         <w:pict>
-          <v:rect id="_x0000_i1037" style="width:0;height:1.5pt" o:hralign="center" o:hrstd="t" o:hr="t" fillcolor="#a0a0a0" stroked="f"/>
+          <v:rect id="_x0000_i1032" style="width:0;height:1.5pt" o:hralign="center" o:hrstd="t" o:hr="t" fillcolor="#a0a0a0" stroked="f"/>
         </w:pict>
       </w:r>
     </w:p>
@@ -4454,7 +5667,7 @@
     <w:p>
       <w:r>
         <w:pict>
-          <v:rect id="_x0000_i1038" style="width:0;height:1.5pt" o:hralign="center" o:hrstd="t" o:hr="t" fillcolor="#a0a0a0" stroked="f"/>
+          <v:rect id="_x0000_i1033" style="width:0;height:1.5pt" o:hralign="center" o:hrstd="t" o:hr="t" fillcolor="#a0a0a0" stroked="f"/>
         </w:pict>
       </w:r>
     </w:p>
@@ -4491,6 +5704,7 @@
         <w:rPr>
           <w:rFonts w:ascii="Arial" w:hAnsi="Arial" w:cs="Arial"/>
         </w:rPr>
+        <w:lastRenderedPageBreak/>
         <w:t>Con este propósito se propone la utilización de indicadores de gestión que permitan evaluar la evolución del Departamento mediante información objetiva, facilitando la toma de decisiones y la identificación temprana de oportunidades de mejora.</w:t>
       </w:r>
     </w:p>
@@ -4549,7 +5763,6 @@
                 <w:b/>
                 <w:bCs/>
               </w:rPr>
-              <w:lastRenderedPageBreak/>
               <w:t>Dimensión</w:t>
             </w:r>
           </w:p>
@@ -4914,7 +6127,7 @@
     <w:p>
       <w:r>
         <w:pict>
-          <v:rect id="_x0000_i1039" style="width:0;height:1.5pt" o:hralign="center" o:hrstd="t" o:hr="t" fillcolor="#a0a0a0" stroked="f"/>
+          <v:rect id="_x0000_i1034" style="width:0;height:1.5pt" o:hralign="center" o:hrstd="t" o:hr="t" fillcolor="#a0a0a0" stroked="f"/>
         </w:pict>
       </w:r>
     </w:p>
@@ -4993,6 +6206,7 @@
         <w:rPr>
           <w:rFonts w:ascii="Arial" w:hAnsi="Arial" w:cs="Arial"/>
         </w:rPr>
+        <w:lastRenderedPageBreak/>
         <w:t>El rol de la Jefatura será conducir este proceso promoviendo el trabajo colaborativo, la planificación estratégica y la mejora continua, procurando que las decisiones técnicas acompañen las necesidades de la organización y contribuyan al fortalecimiento de la gestión pública.</w:t>
       </w:r>
     </w:p>
@@ -5007,14 +6221,7 @@
         <w:rPr>
           <w:rFonts w:ascii="Arial" w:hAnsi="Arial" w:cs="Arial"/>
         </w:rPr>
-        <w:t xml:space="preserve">En este sentido, la propuesta presentada busca consolidar un Departamento capaz de desarrollar soluciones informáticas seguras, sostenibles y de calidad, preservando el </w:t>
-      </w:r>
-      <w:r>
-        <w:rPr>
-          <w:rFonts w:ascii="Arial" w:hAnsi="Arial" w:cs="Arial"/>
-        </w:rPr>
-        <w:lastRenderedPageBreak/>
-        <w:t>conocimiento institucional y generando valor para la Administración Municipal y para la comunidad.</w:t>
+        <w:t>En este sentido, la propuesta presentada busca consolidar un Departamento capaz de desarrollar soluciones informáticas seguras, sostenibles y de calidad, preservando el conocimiento institucional y generando valor para la Administración Municipal y para la comunidad.</w:t>
       </w:r>
     </w:p>
     <w:p>
@@ -6866,7 +8073,7 @@
   <w:latentStyles w:defLockedState="0" w:defUIPriority="99" w:defSemiHidden="0" w:defUnhideWhenUsed="0" w:defQFormat="0" w:count="371">
     <w:lsdException w:name="Normal" w:uiPriority="0" w:qFormat="1"/>
     <w:lsdException w:name="heading 1" w:uiPriority="9" w:qFormat="1"/>
-    <w:lsdException w:name="heading 2" w:semiHidden="1" w:uiPriority="9" w:unhideWhenUsed="1" w:qFormat="1"/>
+    <w:lsdException w:name="heading 2" w:semiHidden="1" w:uiPriority="0" w:unhideWhenUsed="1" w:qFormat="1"/>
     <w:lsdException w:name="heading 3" w:semiHidden="1" w:uiPriority="9" w:unhideWhenUsed="1" w:qFormat="1"/>
     <w:lsdException w:name="heading 4" w:semiHidden="1" w:uiPriority="9" w:unhideWhenUsed="1" w:qFormat="1"/>
     <w:lsdException w:name="heading 5" w:semiHidden="1" w:uiPriority="9" w:unhideWhenUsed="1" w:qFormat="1"/>
@@ -7239,6 +8446,7 @@
   <w:style w:type="paragraph" w:default="1" w:styleId="Normal">
     <w:name w:val="Normal"/>
     <w:qFormat/>
+    <w:rsid w:val="00730C39"/>
   </w:style>
   <w:style w:type="paragraph" w:styleId="Ttulo1">
     <w:name w:val="heading 1"/>
@@ -7254,6 +8462,7 @@
   </w:style>
   <w:style w:type="paragraph" w:styleId="Ttulo2">
     <w:name w:val="heading 2"/>
+    <w:link w:val="Ttulo2Car"/>
     <w:qFormat/>
     <w:pPr>
       <w:outlineLvl w:val="1"/>
@@ -7446,6 +8655,17 @@
       <w:rFonts w:ascii="Times New Roman" w:eastAsia="Times New Roman" w:hAnsi="Times New Roman" w:cs="Times New Roman"/>
       <w:sz w:val="24"/>
       <w:szCs w:val="24"/>
+    </w:rPr>
+  </w:style>
+  <w:style w:type="character" w:customStyle="1" w:styleId="Ttulo2Car">
+    <w:name w:val="Título 2 Car"/>
+    <w:basedOn w:val="Fuentedeprrafopredeter"/>
+    <w:link w:val="Ttulo2"/>
+    <w:rsid w:val="00730C39"/>
+    <w:rPr>
+      <w:color w:val="2E74B5"/>
+      <w:sz w:val="26"/>
+      <w:szCs w:val="26"/>
     </w:rPr>
   </w:style>
 </w:styles>

</xml_diff>

<commit_message>
Actualiza Plan de Trabajo de Jefatura de Software con mejoras FODA y estructura final
</commit_message>
<xml_diff>
--- a/Plan_Trabajo_Jefatura_Software_Version_Director.docx
+++ b/Plan_Trabajo_Jefatura_Software_Version_Director.docx
@@ -1252,13 +1252,7 @@
         <w:t xml:space="preserve"> con las funciones asignadas a la Jefatura del Departamento.</w:t>
       </w:r>
     </w:p>
-    <w:p>
-      <w:r>
-        <w:pict>
-          <v:rect id="_x0000_i1025" style="width:0;height:1.5pt" o:hralign="center" o:hrstd="t" o:hr="t" fillcolor="#a0a0a0" stroked="f"/>
-        </w:pict>
-      </w:r>
-    </w:p>
+    <w:p/>
     <w:p>
       <w:pPr>
         <w:pStyle w:val="Ttulo1"/>
@@ -1312,7 +1306,27 @@
           <w:sz w:val="24"/>
           <w:szCs w:val="24"/>
         </w:rPr>
-        <w:t xml:space="preserve">La ausencia de un procedimiento uniforme de planificación dificulta conocer la capacidad real del Departamento, provoca cambios permanentes de prioridades y genera una utilización poco eficiente de los recursos disponibles. Si bien la Municipalidad cuenta con la plataforma </w:t>
+        <w:t>La ausencia de un procedimiento uniforme de planificación dificulta conocer la capacidad real del Departamento, provoca cambios permanentes de prioridades, favorece una dinámica de trabajo predominantemente reactiva y genera una utilización poco eficiente de los recursos disponibles.</w:t>
+      </w:r>
+    </w:p>
+    <w:p>
+      <w:pPr>
+        <w:pStyle w:val="Ttulo2"/>
+        <w:rPr>
+          <w:rFonts w:eastAsia="Times New Roman"/>
+          <w:color w:val="auto"/>
+          <w:sz w:val="24"/>
+          <w:szCs w:val="24"/>
+        </w:rPr>
+      </w:pPr>
+      <w:r>
+        <w:rPr>
+          <w:rFonts w:eastAsia="Times New Roman"/>
+          <w:color w:val="auto"/>
+          <w:sz w:val="24"/>
+          <w:szCs w:val="24"/>
+        </w:rPr>
+        <w:t xml:space="preserve">Si bien la Municipalidad cuenta con la plataforma </w:t>
       </w:r>
       <w:proofErr w:type="spellStart"/>
       <w:r>
@@ -1683,8 +1697,10 @@
           <w:sz w:val="22"/>
           <w:szCs w:val="22"/>
         </w:rPr>
-        <w:t xml:space="preserve"> de criterios para clasificar urgencias y diferir incidencias no críticas, protegiendo capacidad operativa para el trabajo planificado;</w:t>
-      </w:r>
+        <w:t xml:space="preserve"> de criterios para clasificar urgencias y diferir incidencias no críticas, procurando preservar capacidad operativa para el trabajo planificado, la documentación y las mejoras evolutivas;</w:t>
+      </w:r>
+      <w:bookmarkStart w:id="0" w:name="_GoBack"/>
+      <w:bookmarkEnd w:id="0"/>
     </w:p>
     <w:p>
       <w:pPr>
@@ -2059,7 +2075,7 @@
     <w:p>
       <w:r>
         <w:pict>
-          <v:rect id="_x0000_i1026" style="width:0;height:1.5pt" o:hralign="center" o:hrstd="t" o:hr="t" fillcolor="#a0a0a0" stroked="f"/>
+          <v:rect id="_x0000_i1025" style="width:0;height:1.5pt" o:hralign="center" o:hrstd="t" o:hr="t" fillcolor="#a0a0a0" stroked="f"/>
         </w:pict>
       </w:r>
     </w:p>
@@ -2242,7 +2258,7 @@
     <w:p>
       <w:r>
         <w:pict>
-          <v:rect id="_x0000_i1027" style="width:0;height:1.5pt" o:hralign="center" o:hrstd="t" o:hr="t" fillcolor="#a0a0a0" stroked="f"/>
+          <v:rect id="_x0000_i1026" style="width:0;height:1.5pt" o:hralign="center" o:hrstd="t" o:hr="t" fillcolor="#a0a0a0" stroked="f"/>
         </w:pict>
       </w:r>
     </w:p>
@@ -2423,7 +2439,7 @@
     <w:p>
       <w:r>
         <w:pict>
-          <v:rect id="_x0000_i1028" style="width:0;height:1.5pt" o:hralign="center" o:hrstd="t" o:hr="t" fillcolor="#a0a0a0" stroked="f"/>
+          <v:rect id="_x0000_i1027" style="width:0;height:1.5pt" o:hralign="center" o:hrstd="t" o:hr="t" fillcolor="#a0a0a0" stroked="f"/>
         </w:pict>
       </w:r>
     </w:p>
@@ -2630,7 +2646,7 @@
       </w:r>
       <w:r>
         <w:pict>
-          <v:rect id="_x0000_i1029" style="width:0;height:1.5pt" o:hralign="center" o:hrstd="t" o:hr="t" fillcolor="#a0a0a0" stroked="f"/>
+          <v:rect id="_x0000_i1028" style="width:0;height:1.5pt" o:hralign="center" o:hrstd="t" o:hr="t" fillcolor="#a0a0a0" stroked="f"/>
         </w:pict>
       </w:r>
     </w:p>
@@ -3980,8 +3996,6 @@
         </w:rPr>
         <w:t xml:space="preserve"> de necesidades de formación sobre la base de la Matriz de Competencias del Departamento;</w:t>
       </w:r>
-      <w:bookmarkStart w:id="0" w:name="_GoBack"/>
-      <w:bookmarkEnd w:id="0"/>
     </w:p>
     <w:p>
       <w:pPr>
@@ -4686,7 +4700,10 @@
         <w:t xml:space="preserve">6.5 </w:t>
       </w:r>
       <w:r>
-        <w:t>Fortalecimiento de la estructura técnica y diferenciación de roles</w:t>
+        <w:t>H</w:t>
+      </w:r>
+      <w:r>
+        <w:t>erramientas de analítica de proyectos y tableros ejecutivos</w:t>
       </w:r>
       <w:r>
         <w:tab/>
@@ -5253,7 +5270,7 @@
     <w:p>
       <w:r>
         <w:pict>
-          <v:rect id="_x0000_i1030" style="width:0;height:1.5pt" o:hralign="center" o:hrstd="t" o:hr="t" fillcolor="#a0a0a0" stroked="f"/>
+          <v:rect id="_x0000_i1029" style="width:0;height:1.5pt" o:hralign="center" o:hrstd="t" o:hr="t" fillcolor="#a0a0a0" stroked="f"/>
         </w:pict>
       </w:r>
     </w:p>
@@ -5397,7 +5414,7 @@
     <w:p>
       <w:r>
         <w:pict>
-          <v:rect id="_x0000_i1031" style="width:0;height:1.5pt" o:hralign="center" o:hrstd="t" o:hr="t" fillcolor="#a0a0a0" stroked="f"/>
+          <v:rect id="_x0000_i1030" style="width:0;height:1.5pt" o:hralign="center" o:hrstd="t" o:hr="t" fillcolor="#a0a0a0" stroked="f"/>
         </w:pict>
       </w:r>
     </w:p>
@@ -5532,7 +5549,7 @@
     <w:p>
       <w:r>
         <w:pict>
-          <v:rect id="_x0000_i1032" style="width:0;height:1.5pt" o:hralign="center" o:hrstd="t" o:hr="t" fillcolor="#a0a0a0" stroked="f"/>
+          <v:rect id="_x0000_i1031" style="width:0;height:1.5pt" o:hralign="center" o:hrstd="t" o:hr="t" fillcolor="#a0a0a0" stroked="f"/>
         </w:pict>
       </w:r>
     </w:p>
@@ -5667,7 +5684,7 @@
     <w:p>
       <w:r>
         <w:pict>
-          <v:rect id="_x0000_i1033" style="width:0;height:1.5pt" o:hralign="center" o:hrstd="t" o:hr="t" fillcolor="#a0a0a0" stroked="f"/>
+          <v:rect id="_x0000_i1032" style="width:0;height:1.5pt" o:hralign="center" o:hrstd="t" o:hr="t" fillcolor="#a0a0a0" stroked="f"/>
         </w:pict>
       </w:r>
     </w:p>
@@ -6127,7 +6144,7 @@
     <w:p>
       <w:r>
         <w:pict>
-          <v:rect id="_x0000_i1034" style="width:0;height:1.5pt" o:hralign="center" o:hrstd="t" o:hr="t" fillcolor="#a0a0a0" stroked="f"/>
+          <v:rect id="_x0000_i1033" style="width:0;height:1.5pt" o:hralign="center" o:hrstd="t" o:hr="t" fillcolor="#a0a0a0" stroked="f"/>
         </w:pict>
       </w:r>
     </w:p>

</xml_diff>

<commit_message>
Actualiza Seccion 7 con el marco de implementacion adaptable e indistinto
</commit_message>
<xml_diff>
--- a/Plan_Trabajo_Jefatura_Software_Version_Director.docx
+++ b/Plan_Trabajo_Jefatura_Software_Version_Director.docx
@@ -1699,8 +1699,6 @@
         </w:rPr>
         <w:t xml:space="preserve"> de criterios para clasificar urgencias y diferir incidencias no críticas, procurando preservar capacidad operativa para el trabajo planificado, la documentación y las mejoras evolutivas;</w:t>
       </w:r>
-      <w:bookmarkStart w:id="0" w:name="_GoBack"/>
-      <w:bookmarkEnd w:id="0"/>
     </w:p>
     <w:p>
       <w:pPr>
@@ -5222,7 +5220,614 @@
         <w:pStyle w:val="Ttulo1"/>
       </w:pPr>
       <w:r>
-        <w:t>7. IMPLEMENTACIÓN DEL PLAN DE TRABAJO</w:t>
+        <w:t xml:space="preserve">7. IMPLEMENTACIÓN </w:t>
+      </w:r>
+      <w:r>
+        <w:t xml:space="preserve">Y GESTIÓN </w:t>
+      </w:r>
+      <w:r>
+        <w:t>DEL PLAN DE TRABAJO</w:t>
+      </w:r>
+    </w:p>
+    <w:p>
+      <w:pPr>
+        <w:rPr>
+          <w:rFonts w:eastAsia="Times New Roman"/>
+          <w:sz w:val="24"/>
+          <w:szCs w:val="24"/>
+        </w:rPr>
+      </w:pPr>
+      <w:r>
+        <w:rPr>
+          <w:rFonts w:eastAsia="Times New Roman"/>
+          <w:sz w:val="24"/>
+          <w:szCs w:val="24"/>
+        </w:rPr>
+        <w:t>La implementación de las propuestas desarrolladas en este Plan de Trabajo se realizará de manera progresiva, procurando incorporar las mejoras al funcionamiento habitual del Departamento sin afectar la continuidad de los servicios que actualmente presta.</w:t>
+      </w:r>
+    </w:p>
+    <w:p>
+      <w:pPr>
+        <w:rPr>
+          <w:rFonts w:eastAsia="Times New Roman"/>
+          <w:sz w:val="24"/>
+          <w:szCs w:val="24"/>
+        </w:rPr>
+      </w:pPr>
+      <w:r>
+        <w:rPr>
+          <w:rFonts w:eastAsia="Times New Roman"/>
+          <w:sz w:val="24"/>
+          <w:szCs w:val="24"/>
+        </w:rPr>
+        <w:t>Las distintas líneas de acción no requieren necesariamente una implementación simultánea. La Jefatura determinará el orden de incorporación de las medidas en función de la criticidad de los sistemas, las prioridades institucionales, la capacidad operativa disponible y los resultados obtenidos durante el proceso.</w:t>
+      </w:r>
+    </w:p>
+    <w:p>
+      <w:pPr>
+        <w:rPr>
+          <w:rFonts w:eastAsia="Times New Roman"/>
+          <w:sz w:val="24"/>
+          <w:szCs w:val="24"/>
+        </w:rPr>
+      </w:pPr>
+      <w:r>
+        <w:rPr>
+          <w:rFonts w:eastAsia="Times New Roman"/>
+          <w:sz w:val="24"/>
+          <w:szCs w:val="24"/>
+        </w:rPr>
+        <w:t>De esta manera, el presente Plan de Trabajo constituye un marco de gestión adaptable a l</w:t>
+      </w:r>
+      <w:r>
+        <w:rPr>
+          <w:rFonts w:eastAsia="Times New Roman"/>
+          <w:sz w:val="24"/>
+          <w:szCs w:val="24"/>
+        </w:rPr>
+        <w:t>as necesidades del Departamento</w:t>
+      </w:r>
+      <w:r>
+        <w:rPr>
+          <w:rFonts w:eastAsia="Times New Roman"/>
+          <w:sz w:val="24"/>
+          <w:szCs w:val="24"/>
+        </w:rPr>
+        <w:t xml:space="preserve"> y no un cronograma rígido de ejecución. Las prioridades podrán ser revisadas cuando surjan requerimientos normativos, incidencias críticas, nuevos proyectos o modificaciones en la disponibilidad de recursos.</w:t>
+      </w:r>
+    </w:p>
+    <w:p/>
+    <w:p>
+      <w:pPr>
+        <w:pStyle w:val="Ttulo2"/>
+      </w:pPr>
+      <w:r>
+        <w:t xml:space="preserve">7.1 </w:t>
+      </w:r>
+      <w:r>
+        <w:t>Puesta en marcha</w:t>
+      </w:r>
+    </w:p>
+    <w:p>
+      <w:pPr>
+        <w:rPr>
+          <w:rFonts w:eastAsia="Times New Roman"/>
+          <w:sz w:val="24"/>
+          <w:szCs w:val="24"/>
+        </w:rPr>
+      </w:pPr>
+      <w:r>
+        <w:rPr>
+          <w:rFonts w:eastAsia="Times New Roman"/>
+          <w:sz w:val="24"/>
+          <w:szCs w:val="24"/>
+        </w:rPr>
+        <w:t>La puesta en marcha tendrá como objetivo establecer las condiciones organizacionales necesarias para comenzar a aplicar las medidas propuestas, priorizando inicialmente aquellas acciones que puedan implementarse con los recursos y herramientas actualmente disponibles.</w:t>
+      </w:r>
+    </w:p>
+    <w:p>
+      <w:pPr>
+        <w:rPr>
+          <w:rFonts w:eastAsia="Times New Roman"/>
+          <w:sz w:val="24"/>
+          <w:szCs w:val="24"/>
+        </w:rPr>
+      </w:pPr>
+      <w:r>
+        <w:rPr>
+          <w:rFonts w:eastAsia="Times New Roman"/>
+          <w:sz w:val="24"/>
+          <w:szCs w:val="24"/>
+        </w:rPr>
+        <w:t>En un inicio</w:t>
+      </w:r>
+      <w:r>
+        <w:rPr>
+          <w:rFonts w:eastAsia="Times New Roman"/>
+          <w:sz w:val="24"/>
+          <w:szCs w:val="24"/>
+        </w:rPr>
+        <w:t>,</w:t>
+      </w:r>
+      <w:bookmarkStart w:id="0" w:name="_GoBack"/>
+      <w:bookmarkEnd w:id="0"/>
+      <w:r>
+        <w:rPr>
+          <w:rFonts w:eastAsia="Times New Roman"/>
+          <w:sz w:val="24"/>
+          <w:szCs w:val="24"/>
+        </w:rPr>
+        <w:t xml:space="preserve"> se priorizará:</w:t>
+      </w:r>
+    </w:p>
+    <w:p>
+      <w:pPr>
+        <w:ind w:left="708"/>
+        <w:rPr>
+          <w:rFonts w:eastAsia="Times New Roman"/>
+          <w:sz w:val="24"/>
+          <w:szCs w:val="24"/>
+        </w:rPr>
+      </w:pPr>
+      <w:r>
+        <w:rPr>
+          <w:rFonts w:eastAsia="Times New Roman"/>
+          <w:sz w:val="24"/>
+          <w:szCs w:val="24"/>
+        </w:rPr>
+        <w:t xml:space="preserve">• centralizar y ordenar las solicitudes y proyectos mediante la utilización de </w:t>
+      </w:r>
+      <w:proofErr w:type="spellStart"/>
+      <w:r>
+        <w:rPr>
+          <w:rFonts w:eastAsia="Times New Roman"/>
+          <w:sz w:val="24"/>
+          <w:szCs w:val="24"/>
+        </w:rPr>
+        <w:t>Redmine</w:t>
+      </w:r>
+      <w:proofErr w:type="spellEnd"/>
+      <w:r>
+        <w:rPr>
+          <w:rFonts w:eastAsia="Times New Roman"/>
+          <w:sz w:val="24"/>
+          <w:szCs w:val="24"/>
+        </w:rPr>
+        <w:t>;</w:t>
+      </w:r>
+    </w:p>
+    <w:p>
+      <w:pPr>
+        <w:ind w:left="708"/>
+        <w:rPr>
+          <w:rFonts w:eastAsia="Times New Roman"/>
+          <w:sz w:val="24"/>
+          <w:szCs w:val="24"/>
+        </w:rPr>
+      </w:pPr>
+      <w:r>
+        <w:rPr>
+          <w:rFonts w:eastAsia="Times New Roman"/>
+          <w:sz w:val="24"/>
+          <w:szCs w:val="24"/>
+        </w:rPr>
+        <w:t>• identificar los sistemas críticos, las principales dependencias de conocimiento y los riesgos operativos existentes;</w:t>
+      </w:r>
+    </w:p>
+    <w:p>
+      <w:pPr>
+        <w:ind w:left="708"/>
+        <w:rPr>
+          <w:rFonts w:eastAsia="Times New Roman"/>
+          <w:sz w:val="24"/>
+          <w:szCs w:val="24"/>
+        </w:rPr>
+      </w:pPr>
+      <w:r>
+        <w:rPr>
+          <w:rFonts w:eastAsia="Times New Roman"/>
+          <w:sz w:val="24"/>
+          <w:szCs w:val="24"/>
+        </w:rPr>
+        <w:lastRenderedPageBreak/>
+        <w:t>• establecer criterios comunes para la priorización y asignación de tareas;</w:t>
+      </w:r>
+    </w:p>
+    <w:p>
+      <w:pPr>
+        <w:ind w:left="708"/>
+        <w:rPr>
+          <w:rFonts w:eastAsia="Times New Roman"/>
+          <w:sz w:val="24"/>
+          <w:szCs w:val="24"/>
+        </w:rPr>
+      </w:pPr>
+      <w:r>
+        <w:rPr>
+          <w:rFonts w:eastAsia="Times New Roman"/>
+          <w:sz w:val="24"/>
+          <w:szCs w:val="24"/>
+        </w:rPr>
+        <w:t>• organizar la distribución de responsabilidades considerando la experiencia y conocimientos disponibles en el Departamento;</w:t>
+      </w:r>
+    </w:p>
+    <w:p>
+      <w:pPr>
+        <w:ind w:left="708"/>
+        <w:rPr>
+          <w:rFonts w:eastAsia="Times New Roman"/>
+          <w:sz w:val="24"/>
+          <w:szCs w:val="24"/>
+        </w:rPr>
+      </w:pPr>
+      <w:r>
+        <w:rPr>
+          <w:rFonts w:eastAsia="Times New Roman"/>
+          <w:sz w:val="24"/>
+          <w:szCs w:val="24"/>
+        </w:rPr>
+        <w:t>• establecer mecanismos básicos de coordinación y seguimiento entre los distintos grupos de trabajo distribuidos.</w:t>
+      </w:r>
+    </w:p>
+    <w:p>
+      <w:pPr>
+        <w:rPr>
+          <w:rFonts w:eastAsia="Times New Roman"/>
+          <w:sz w:val="24"/>
+          <w:szCs w:val="24"/>
+        </w:rPr>
+      </w:pPr>
+      <w:r>
+        <w:rPr>
+          <w:rFonts w:eastAsia="Times New Roman"/>
+          <w:sz w:val="24"/>
+          <w:szCs w:val="24"/>
+        </w:rPr>
+        <w:t xml:space="preserve">Estas acciones permitirán contar con una visión objetiva de la capacidad operativa del Departamento y establecer las prioridades sobre las cuales avanzar con </w:t>
+      </w:r>
+      <w:r>
+        <w:rPr>
+          <w:rFonts w:eastAsia="Times New Roman"/>
+          <w:sz w:val="24"/>
+          <w:szCs w:val="24"/>
+        </w:rPr>
+        <w:t>las restantes líneas de mejora.</w:t>
+      </w:r>
+    </w:p>
+    <w:p>
+      <w:pPr>
+        <w:rPr>
+          <w:rFonts w:eastAsia="Times New Roman"/>
+          <w:sz w:val="24"/>
+          <w:szCs w:val="24"/>
+        </w:rPr>
+      </w:pPr>
+    </w:p>
+    <w:p>
+      <w:pPr>
+        <w:pStyle w:val="Ttulo2"/>
+      </w:pPr>
+      <w:r>
+        <w:t xml:space="preserve">7.2 </w:t>
+      </w:r>
+      <w:r>
+        <w:t>Implementación progresiva</w:t>
+      </w:r>
+    </w:p>
+    <w:p>
+      <w:pPr>
+        <w:rPr>
+          <w:rFonts w:eastAsia="Times New Roman"/>
+          <w:sz w:val="24"/>
+          <w:szCs w:val="24"/>
+        </w:rPr>
+      </w:pPr>
+      <w:r>
+        <w:rPr>
+          <w:rFonts w:eastAsia="Times New Roman"/>
+          <w:sz w:val="24"/>
+          <w:szCs w:val="24"/>
+        </w:rPr>
+        <w:t>Las medidas previstas en el presente Plan se incorporarán progresivamente de acuerdo con las necesidades y posibilidades del Departamento. La implementación priorizará aquellas acciones que generen un impacto organizacional significativo y que puedan ser desarrolladas sin comprometer la atención de los servicios y requerimientos críticos.</w:t>
+      </w:r>
+    </w:p>
+    <w:p>
+      <w:pPr>
+        <w:rPr>
+          <w:rFonts w:eastAsia="Times New Roman"/>
+          <w:sz w:val="24"/>
+          <w:szCs w:val="24"/>
+        </w:rPr>
+      </w:pPr>
+      <w:r>
+        <w:rPr>
+          <w:rFonts w:eastAsia="Times New Roman"/>
+          <w:sz w:val="24"/>
+          <w:szCs w:val="24"/>
+        </w:rPr>
+        <w:t xml:space="preserve">Entre las medidas que podrán incorporarse, de acuerdo con las prioridades determinadas </w:t>
+      </w:r>
+      <w:r>
+        <w:rPr>
+          <w:rFonts w:eastAsia="Times New Roman"/>
+          <w:sz w:val="24"/>
+          <w:szCs w:val="24"/>
+        </w:rPr>
+        <w:t>por la Jefatura, se encuentran:</w:t>
+      </w:r>
+    </w:p>
+    <w:p>
+      <w:pPr>
+        <w:ind w:left="708"/>
+        <w:rPr>
+          <w:rFonts w:eastAsia="Times New Roman"/>
+          <w:sz w:val="24"/>
+          <w:szCs w:val="24"/>
+        </w:rPr>
+      </w:pPr>
+      <w:r>
+        <w:rPr>
+          <w:rFonts w:eastAsia="Times New Roman"/>
+          <w:sz w:val="24"/>
+          <w:szCs w:val="24"/>
+        </w:rPr>
+        <w:t xml:space="preserve">• </w:t>
+      </w:r>
+      <w:proofErr w:type="gramStart"/>
+      <w:r>
+        <w:rPr>
+          <w:rFonts w:eastAsia="Times New Roman"/>
+          <w:sz w:val="24"/>
+          <w:szCs w:val="24"/>
+        </w:rPr>
+        <w:t>fortalecimiento</w:t>
+      </w:r>
+      <w:proofErr w:type="gramEnd"/>
+      <w:r>
+        <w:rPr>
+          <w:rFonts w:eastAsia="Times New Roman"/>
+          <w:sz w:val="24"/>
+          <w:szCs w:val="24"/>
+        </w:rPr>
+        <w:t xml:space="preserve"> de la planificación y gestión de requerimientos;</w:t>
+      </w:r>
+    </w:p>
+    <w:p>
+      <w:pPr>
+        <w:ind w:left="708"/>
+        <w:rPr>
+          <w:rFonts w:eastAsia="Times New Roman"/>
+          <w:sz w:val="24"/>
+          <w:szCs w:val="24"/>
+        </w:rPr>
+      </w:pPr>
+      <w:r>
+        <w:rPr>
+          <w:rFonts w:eastAsia="Times New Roman"/>
+          <w:sz w:val="24"/>
+          <w:szCs w:val="24"/>
+        </w:rPr>
+        <w:t xml:space="preserve">• </w:t>
+      </w:r>
+      <w:proofErr w:type="gramStart"/>
+      <w:r>
+        <w:rPr>
+          <w:rFonts w:eastAsia="Times New Roman"/>
+          <w:sz w:val="24"/>
+          <w:szCs w:val="24"/>
+        </w:rPr>
+        <w:t>transferencia</w:t>
+      </w:r>
+      <w:proofErr w:type="gramEnd"/>
+      <w:r>
+        <w:rPr>
+          <w:rFonts w:eastAsia="Times New Roman"/>
+          <w:sz w:val="24"/>
+          <w:szCs w:val="24"/>
+        </w:rPr>
+        <w:t xml:space="preserve"> y preservación del conocimiento institucional;</w:t>
+      </w:r>
+    </w:p>
+    <w:p>
+      <w:pPr>
+        <w:ind w:left="708"/>
+        <w:rPr>
+          <w:rFonts w:eastAsia="Times New Roman"/>
+          <w:sz w:val="24"/>
+          <w:szCs w:val="24"/>
+        </w:rPr>
+      </w:pPr>
+      <w:r>
+        <w:rPr>
+          <w:rFonts w:eastAsia="Times New Roman"/>
+          <w:sz w:val="24"/>
+          <w:szCs w:val="24"/>
+        </w:rPr>
+        <w:t xml:space="preserve">• </w:t>
+      </w:r>
+      <w:proofErr w:type="gramStart"/>
+      <w:r>
+        <w:rPr>
+          <w:rFonts w:eastAsia="Times New Roman"/>
+          <w:sz w:val="24"/>
+          <w:szCs w:val="24"/>
+        </w:rPr>
+        <w:t>incorporación</w:t>
+      </w:r>
+      <w:proofErr w:type="gramEnd"/>
+      <w:r>
+        <w:rPr>
+          <w:rFonts w:eastAsia="Times New Roman"/>
+          <w:sz w:val="24"/>
+          <w:szCs w:val="24"/>
+        </w:rPr>
+        <w:t xml:space="preserve"> progresiva de estándares técnicos y criterios comunes de desarrollo;</w:t>
+      </w:r>
+    </w:p>
+    <w:p>
+      <w:pPr>
+        <w:ind w:left="708"/>
+        <w:rPr>
+          <w:rFonts w:eastAsia="Times New Roman"/>
+          <w:sz w:val="24"/>
+          <w:szCs w:val="24"/>
+        </w:rPr>
+      </w:pPr>
+      <w:r>
+        <w:rPr>
+          <w:rFonts w:eastAsia="Times New Roman"/>
+          <w:sz w:val="24"/>
+          <w:szCs w:val="24"/>
+        </w:rPr>
+        <w:t xml:space="preserve">• </w:t>
+      </w:r>
+      <w:proofErr w:type="gramStart"/>
+      <w:r>
+        <w:rPr>
+          <w:rFonts w:eastAsia="Times New Roman"/>
+          <w:sz w:val="24"/>
+          <w:szCs w:val="24"/>
+        </w:rPr>
+        <w:t>fortalecimiento</w:t>
+      </w:r>
+      <w:proofErr w:type="gramEnd"/>
+      <w:r>
+        <w:rPr>
+          <w:rFonts w:eastAsia="Times New Roman"/>
+          <w:sz w:val="24"/>
+          <w:szCs w:val="24"/>
+        </w:rPr>
+        <w:t xml:space="preserve"> de la coordinación entre equipos;</w:t>
+      </w:r>
+    </w:p>
+    <w:p>
+      <w:pPr>
+        <w:ind w:left="708"/>
+        <w:rPr>
+          <w:rFonts w:eastAsia="Times New Roman"/>
+          <w:sz w:val="24"/>
+          <w:szCs w:val="24"/>
+        </w:rPr>
+      </w:pPr>
+      <w:r>
+        <w:rPr>
+          <w:rFonts w:eastAsia="Times New Roman"/>
+          <w:sz w:val="24"/>
+          <w:szCs w:val="24"/>
+        </w:rPr>
+        <w:t xml:space="preserve">• </w:t>
+      </w:r>
+      <w:proofErr w:type="gramStart"/>
+      <w:r>
+        <w:rPr>
+          <w:rFonts w:eastAsia="Times New Roman"/>
+          <w:sz w:val="24"/>
+          <w:szCs w:val="24"/>
+        </w:rPr>
+        <w:t>formalización</w:t>
+      </w:r>
+      <w:proofErr w:type="gramEnd"/>
+      <w:r>
+        <w:rPr>
+          <w:rFonts w:eastAsia="Times New Roman"/>
+          <w:sz w:val="24"/>
+          <w:szCs w:val="24"/>
+        </w:rPr>
+        <w:t xml:space="preserve"> del seguimiento técnico de proveedores externos;</w:t>
+      </w:r>
+    </w:p>
+    <w:p>
+      <w:pPr>
+        <w:ind w:left="708"/>
+        <w:rPr>
+          <w:rFonts w:eastAsia="Times New Roman"/>
+          <w:sz w:val="24"/>
+          <w:szCs w:val="24"/>
+        </w:rPr>
+      </w:pPr>
+      <w:r>
+        <w:rPr>
+          <w:rFonts w:eastAsia="Times New Roman"/>
+          <w:sz w:val="24"/>
+          <w:szCs w:val="24"/>
+        </w:rPr>
+        <w:t xml:space="preserve">• </w:t>
+      </w:r>
+      <w:proofErr w:type="gramStart"/>
+      <w:r>
+        <w:rPr>
+          <w:rFonts w:eastAsia="Times New Roman"/>
+          <w:sz w:val="24"/>
+          <w:szCs w:val="24"/>
+        </w:rPr>
+        <w:t>incorporación</w:t>
+      </w:r>
+      <w:proofErr w:type="gramEnd"/>
+      <w:r>
+        <w:rPr>
+          <w:rFonts w:eastAsia="Times New Roman"/>
+          <w:sz w:val="24"/>
+          <w:szCs w:val="24"/>
+        </w:rPr>
+        <w:t xml:space="preserve"> gradual de nuevas herramientas y tecnologías;</w:t>
+      </w:r>
+    </w:p>
+    <w:p>
+      <w:pPr>
+        <w:ind w:left="708"/>
+        <w:rPr>
+          <w:rFonts w:eastAsia="Times New Roman"/>
+          <w:sz w:val="24"/>
+          <w:szCs w:val="24"/>
+        </w:rPr>
+      </w:pPr>
+      <w:r>
+        <w:rPr>
+          <w:rFonts w:eastAsia="Times New Roman"/>
+          <w:sz w:val="24"/>
+          <w:szCs w:val="24"/>
+        </w:rPr>
+        <w:t xml:space="preserve">• </w:t>
+      </w:r>
+      <w:proofErr w:type="gramStart"/>
+      <w:r>
+        <w:rPr>
+          <w:rFonts w:eastAsia="Times New Roman"/>
+          <w:sz w:val="24"/>
+          <w:szCs w:val="24"/>
+        </w:rPr>
+        <w:t>preparación</w:t>
+      </w:r>
+      <w:proofErr w:type="gramEnd"/>
+      <w:r>
+        <w:rPr>
+          <w:rFonts w:eastAsia="Times New Roman"/>
+          <w:sz w:val="24"/>
+          <w:szCs w:val="24"/>
+        </w:rPr>
+        <w:t xml:space="preserve"> de futuras iniciativas de inversión cuando existan recursos presupuestarios disponibles.</w:t>
+      </w:r>
+    </w:p>
+    <w:p>
+      <w:r>
+        <w:rPr>
+          <w:rFonts w:eastAsia="Times New Roman"/>
+          <w:sz w:val="24"/>
+          <w:szCs w:val="24"/>
+        </w:rPr>
+        <w:t>La incorporación de cada medida será acompañada por la evaluación de sus resultados y por los ajustes que sean necesarios para adecuarla a la realidad operativa del Departamento.</w:t>
+      </w:r>
+    </w:p>
+    <w:p/>
+    <w:p>
+      <w:pPr>
+        <w:pStyle w:val="Ttulo2"/>
+      </w:pPr>
+      <w:r>
+        <w:t xml:space="preserve">7.3 </w:t>
+      </w:r>
+      <w:r>
+        <w:t>Gestión, seguimiento y ajuste</w:t>
       </w:r>
     </w:p>
     <w:p>
@@ -5236,7 +5841,7 @@
         <w:rPr>
           <w:rFonts w:ascii="Arial" w:hAnsi="Arial" w:cs="Arial"/>
         </w:rPr>
-        <w:t>La implementación de las propuestas desarrolladas requiere una ejecución gradual que permita introducir mejoras sin afectar la continuidad de los servicios que presta el Departamento.</w:t>
+        <w:t>La implementación será acompañada por un proceso permanente de seguimiento que permita verificar los resultados obtenidos, identificar dificultades y ajustar las acciones previstas.</w:t>
       </w:r>
     </w:p>
     <w:p>
@@ -5250,7 +5855,7 @@
         <w:rPr>
           <w:rFonts w:ascii="Arial" w:hAnsi="Arial" w:cs="Arial"/>
         </w:rPr>
-        <w:t>Por tal motivo, se propone una estrategia de implementación progresiva organizada en tres etapas, priorizando inicialmente aquellas acciones de carácter organizacional que no requieren recursos presupuestarios adicionales.</w:t>
+        <w:t>La Jefatura podrá redefinir prioridades, redistribuir recursos o modificar el orden de implementación cuando la situación operativa del Departamento así lo requiera.</w:t>
       </w:r>
     </w:p>
     <w:p>
@@ -5264,22 +5869,7 @@
         <w:rPr>
           <w:rFonts w:ascii="Arial" w:hAnsi="Arial" w:cs="Arial"/>
         </w:rPr>
-        <w:t>Este enfoque permitirá consolidar nuevas formas de trabajo, evaluar los resultados obtenidos y realizar los ajustes necesarios antes de avanzar hacia iniciativas de mayor complejidad.</w:t>
-      </w:r>
-    </w:p>
-    <w:p>
-      <w:r>
-        <w:pict>
-          <v:rect id="_x0000_i1029" style="width:0;height:1.5pt" o:hralign="center" o:hrstd="t" o:hr="t" fillcolor="#a0a0a0" stroked="f"/>
-        </w:pict>
-      </w:r>
-    </w:p>
-    <w:p>
-      <w:pPr>
-        <w:pStyle w:val="Ttulo2"/>
-      </w:pPr>
-      <w:r>
-        <w:t>7.1 Primera etapa: Organización y diagnóstico interno</w:t>
+        <w:t>Los cambios en las prioridades institucionales, la aparición de requerimientos normativos, las incidencias críticas, la evolución de los proyectos o las variaciones en la capacidad disponible serán considerados al momento de revisar la planificación.</w:t>
       </w:r>
     </w:p>
     <w:p>
@@ -5293,7 +5883,8 @@
         <w:rPr>
           <w:rFonts w:ascii="Arial" w:hAnsi="Arial" w:cs="Arial"/>
         </w:rPr>
-        <w:t>Durante esta etapa inicial la prioridad estará puesta en conocer con precisión la situación del Departamento y establecer las bases organizacionales que permitirán desarrollar el resto del plan.</w:t>
+        <w:lastRenderedPageBreak/>
+        <w:t>Este seguimiento se realizará mediante los indicadores definidos en el capítulo siguiente, utilizando información objetiva para evaluar los avances, detectar desvíos y orientar las decisiones de gestión.</w:t>
       </w:r>
     </w:p>
     <w:p>
@@ -5307,94 +5898,16 @@
         <w:rPr>
           <w:rFonts w:ascii="Arial" w:hAnsi="Arial" w:cs="Arial"/>
         </w:rPr>
-        <w:t>Las principales acciones serán:</w:t>
-      </w:r>
-    </w:p>
-    <w:p>
-      <w:pPr>
-        <w:numPr>
-          <w:ilvl w:val="0"/>
-          <w:numId w:val="8"/>
-        </w:numPr>
-        <w:spacing w:before="100" w:beforeAutospacing="1" w:afterAutospacing="1" w:line="240" w:lineRule="auto"/>
-        <w:jc w:val="left"/>
-      </w:pPr>
-      <w:r>
-        <w:t xml:space="preserve">elaboración del inventario de sistemas administrados por el Departamento; </w:t>
-      </w:r>
-    </w:p>
-    <w:p>
-      <w:pPr>
-        <w:numPr>
-          <w:ilvl w:val="0"/>
-          <w:numId w:val="8"/>
-        </w:numPr>
-        <w:spacing w:before="100" w:beforeAutospacing="1" w:afterAutospacing="1" w:line="240" w:lineRule="auto"/>
-        <w:jc w:val="left"/>
-      </w:pPr>
-      <w:r>
-        <w:t xml:space="preserve">relevamiento de competencias técnicas y funcionales del personal; </w:t>
-      </w:r>
-    </w:p>
-    <w:p>
-      <w:pPr>
-        <w:numPr>
-          <w:ilvl w:val="0"/>
-          <w:numId w:val="8"/>
-        </w:numPr>
-        <w:spacing w:before="100" w:beforeAutospacing="1" w:afterAutospacing="1" w:line="240" w:lineRule="auto"/>
-        <w:jc w:val="left"/>
-      </w:pPr>
-      <w:r>
-        <w:t xml:space="preserve">identificación de sistemas críticos y de los principales riesgos operativos; </w:t>
-      </w:r>
-    </w:p>
-    <w:p>
-      <w:pPr>
-        <w:numPr>
-          <w:ilvl w:val="0"/>
-          <w:numId w:val="8"/>
-        </w:numPr>
-        <w:spacing w:before="100" w:beforeAutospacing="1" w:afterAutospacing="1" w:line="240" w:lineRule="auto"/>
-        <w:jc w:val="left"/>
-      </w:pPr>
-      <w:r>
-        <w:t xml:space="preserve">centralización de proyectos y solicitudes en </w:t>
-      </w:r>
-      <w:proofErr w:type="spellStart"/>
-      <w:r>
-        <w:t>Redmine</w:t>
-      </w:r>
-      <w:proofErr w:type="spellEnd"/>
-      <w:r>
-        <w:t xml:space="preserve">; </w:t>
-      </w:r>
-    </w:p>
-    <w:p>
-      <w:pPr>
-        <w:numPr>
-          <w:ilvl w:val="0"/>
-          <w:numId w:val="8"/>
-        </w:numPr>
-        <w:spacing w:before="100" w:beforeAutospacing="1" w:afterAutospacing="1" w:line="240" w:lineRule="auto"/>
-        <w:jc w:val="left"/>
-      </w:pPr>
-      <w:r>
-        <w:t xml:space="preserve">definición de prioridades institucionales; </w:t>
-      </w:r>
-    </w:p>
-    <w:p>
-      <w:pPr>
-        <w:numPr>
-          <w:ilvl w:val="0"/>
-          <w:numId w:val="8"/>
-        </w:numPr>
-        <w:spacing w:before="100" w:beforeAutospacing="1" w:afterAutospacing="1" w:line="240" w:lineRule="auto"/>
-        <w:jc w:val="left"/>
-      </w:pPr>
-      <w:r>
-        <w:lastRenderedPageBreak/>
-        <w:t xml:space="preserve">elaboración del cronograma inicial de implementación. </w:t>
+        <w:t>Este mecanismo permitirá establecer un ciclo permanente de diagnóstico, implementación, evaluación y ajuste, favoreciendo la mejora continua del funcionamiento del Departamento.</w:t>
+      </w:r>
+    </w:p>
+    <w:p/>
+    <w:p>
+      <w:pPr>
+        <w:pStyle w:val="Ttulo1"/>
+      </w:pPr>
+      <w:r>
+        <w:t>8. EVALUACIÓN Y SEGUIMIENTO</w:t>
       </w:r>
     </w:p>
     <w:p>
@@ -5408,22 +5921,7 @@
         <w:rPr>
           <w:rFonts w:ascii="Arial" w:hAnsi="Arial" w:cs="Arial"/>
         </w:rPr>
-        <w:t>Al finalizar esta etapa el Departamento contará con información objetiva sobre su capacidad operativa, permitiendo planificar las acciones siguientes sobre bases concretas.</w:t>
-      </w:r>
-    </w:p>
-    <w:p>
-      <w:r>
-        <w:pict>
-          <v:rect id="_x0000_i1030" style="width:0;height:1.5pt" o:hralign="center" o:hrstd="t" o:hr="t" fillcolor="#a0a0a0" stroked="f"/>
-        </w:pict>
-      </w:r>
-    </w:p>
-    <w:p>
-      <w:pPr>
-        <w:pStyle w:val="Ttulo2"/>
-      </w:pPr>
-      <w:r>
-        <w:t>7.2 Segunda etapa: Estandarización y fortalecimiento institucional</w:t>
+        <w:t>La implementación del presente Plan de Trabajo requerirá un seguimiento permanente que permita verificar el cumplimiento de los objetivos propuestos y medir el impacto de las acciones implementadas.</w:t>
       </w:r>
     </w:p>
     <w:p>
@@ -5437,291 +5935,6 @@
         <w:rPr>
           <w:rFonts w:ascii="Arial" w:hAnsi="Arial" w:cs="Arial"/>
         </w:rPr>
-        <w:t>Una vez consolidada la organización inicial, se avanzará en la formalización de los procedimientos internos y en la incorporación gradual de los estándares definidos en este Plan de Trabajo.</w:t>
-      </w:r>
-    </w:p>
-    <w:p>
-      <w:pPr>
-        <w:pStyle w:val="NormalWeb"/>
-        <w:rPr>
-          <w:rFonts w:ascii="Arial" w:hAnsi="Arial" w:cs="Arial"/>
-        </w:rPr>
-      </w:pPr>
-      <w:r>
-        <w:rPr>
-          <w:rFonts w:ascii="Arial" w:hAnsi="Arial" w:cs="Arial"/>
-        </w:rPr>
-        <w:t>Entre las principales acciones se prevé:</w:t>
-      </w:r>
-    </w:p>
-    <w:p>
-      <w:pPr>
-        <w:numPr>
-          <w:ilvl w:val="0"/>
-          <w:numId w:val="9"/>
-        </w:numPr>
-        <w:spacing w:before="100" w:beforeAutospacing="1" w:afterAutospacing="1" w:line="240" w:lineRule="auto"/>
-        <w:jc w:val="left"/>
-      </w:pPr>
-      <w:r>
-        <w:t xml:space="preserve">implementación de la Arquitectura Base Institucional; </w:t>
-      </w:r>
-    </w:p>
-    <w:p>
-      <w:pPr>
-        <w:numPr>
-          <w:ilvl w:val="0"/>
-          <w:numId w:val="9"/>
-        </w:numPr>
-        <w:spacing w:before="100" w:beforeAutospacing="1" w:afterAutospacing="1" w:line="240" w:lineRule="auto"/>
-        <w:jc w:val="left"/>
-      </w:pPr>
-      <w:r>
-        <w:t xml:space="preserve">elaboración de guías de buenas prácticas de desarrollo; </w:t>
-      </w:r>
-    </w:p>
-    <w:p>
-      <w:pPr>
-        <w:numPr>
-          <w:ilvl w:val="0"/>
-          <w:numId w:val="9"/>
-        </w:numPr>
-        <w:spacing w:before="100" w:beforeAutospacing="1" w:afterAutospacing="1" w:line="240" w:lineRule="auto"/>
-        <w:jc w:val="left"/>
-      </w:pPr>
-      <w:r>
-        <w:t xml:space="preserve">puesta en marcha del programa de Referentes Secundarios; </w:t>
-      </w:r>
-    </w:p>
-    <w:p>
-      <w:pPr>
-        <w:numPr>
-          <w:ilvl w:val="0"/>
-          <w:numId w:val="9"/>
-        </w:numPr>
-        <w:spacing w:before="100" w:beforeAutospacing="1" w:afterAutospacing="1" w:line="240" w:lineRule="auto"/>
-        <w:jc w:val="left"/>
-      </w:pPr>
-      <w:r>
-        <w:t xml:space="preserve">establecimiento del procedimiento único para la gestión de requerimientos; </w:t>
-      </w:r>
-    </w:p>
-    <w:p>
-      <w:pPr>
-        <w:numPr>
-          <w:ilvl w:val="0"/>
-          <w:numId w:val="9"/>
-        </w:numPr>
-        <w:spacing w:before="100" w:beforeAutospacing="1" w:afterAutospacing="1" w:line="240" w:lineRule="auto"/>
-        <w:jc w:val="left"/>
-      </w:pPr>
-      <w:r>
-        <w:t xml:space="preserve">formalización del gobierno técnico de proveedores externos; </w:t>
-      </w:r>
-    </w:p>
-    <w:p>
-      <w:pPr>
-        <w:numPr>
-          <w:ilvl w:val="0"/>
-          <w:numId w:val="9"/>
-        </w:numPr>
-        <w:spacing w:before="100" w:beforeAutospacing="1" w:afterAutospacing="1" w:line="240" w:lineRule="auto"/>
-        <w:jc w:val="left"/>
-      </w:pPr>
-      <w:r>
-        <w:t xml:space="preserve">consolidación de los mecanismos de coordinación entre equipos. </w:t>
-      </w:r>
-    </w:p>
-    <w:p>
-      <w:pPr>
-        <w:pStyle w:val="NormalWeb"/>
-        <w:rPr>
-          <w:rFonts w:ascii="Arial" w:hAnsi="Arial" w:cs="Arial"/>
-        </w:rPr>
-      </w:pPr>
-      <w:r>
-        <w:rPr>
-          <w:rFonts w:ascii="Arial" w:hAnsi="Arial" w:cs="Arial"/>
-        </w:rPr>
-        <w:t>Esta etapa permitirá disminuir la dependencia de prácticas individuales, mejorar la calidad de los desarrollos y fortalecer el trabajo colaborativo dentro del Departamento.</w:t>
-      </w:r>
-    </w:p>
-    <w:p>
-      <w:r>
-        <w:pict>
-          <v:rect id="_x0000_i1031" style="width:0;height:1.5pt" o:hralign="center" o:hrstd="t" o:hr="t" fillcolor="#a0a0a0" stroked="f"/>
-        </w:pict>
-      </w:r>
-    </w:p>
-    <w:p>
-      <w:pPr>
-        <w:pStyle w:val="Ttulo2"/>
-      </w:pPr>
-      <w:r>
-        <w:t>7.3 Tercera etapa: Consolidación y mejora continua</w:t>
-      </w:r>
-    </w:p>
-    <w:p>
-      <w:pPr>
-        <w:pStyle w:val="NormalWeb"/>
-        <w:rPr>
-          <w:rFonts w:ascii="Arial" w:hAnsi="Arial" w:cs="Arial"/>
-        </w:rPr>
-      </w:pPr>
-      <w:r>
-        <w:rPr>
-          <w:rFonts w:ascii="Arial" w:hAnsi="Arial" w:cs="Arial"/>
-        </w:rPr>
-        <w:t>La etapa final estará orientada a evaluar los resultados obtenidos, consolidar las mejoras implementadas y promover un proceso permanente de revisión y actualización de los procedimientos.</w:t>
-      </w:r>
-    </w:p>
-    <w:p>
-      <w:pPr>
-        <w:pStyle w:val="NormalWeb"/>
-        <w:rPr>
-          <w:rFonts w:ascii="Arial" w:hAnsi="Arial" w:cs="Arial"/>
-        </w:rPr>
-      </w:pPr>
-      <w:r>
-        <w:rPr>
-          <w:rFonts w:ascii="Arial" w:hAnsi="Arial" w:cs="Arial"/>
-        </w:rPr>
-        <w:t>En esta instancia se prevé:</w:t>
-      </w:r>
-    </w:p>
-    <w:p>
-      <w:pPr>
-        <w:numPr>
-          <w:ilvl w:val="0"/>
-          <w:numId w:val="10"/>
-        </w:numPr>
-        <w:spacing w:before="100" w:beforeAutospacing="1" w:afterAutospacing="1" w:line="240" w:lineRule="auto"/>
-        <w:jc w:val="left"/>
-      </w:pPr>
-      <w:r>
-        <w:t xml:space="preserve">seguimiento periódico de los indicadores de gestión; </w:t>
-      </w:r>
-    </w:p>
-    <w:p>
-      <w:pPr>
-        <w:numPr>
-          <w:ilvl w:val="0"/>
-          <w:numId w:val="10"/>
-        </w:numPr>
-        <w:spacing w:before="100" w:beforeAutospacing="1" w:afterAutospacing="1" w:line="240" w:lineRule="auto"/>
-        <w:jc w:val="left"/>
-      </w:pPr>
-      <w:r>
-        <w:t xml:space="preserve">revisión de procedimientos internos; </w:t>
-      </w:r>
-    </w:p>
-    <w:p>
-      <w:pPr>
-        <w:numPr>
-          <w:ilvl w:val="0"/>
-          <w:numId w:val="10"/>
-        </w:numPr>
-        <w:spacing w:before="100" w:beforeAutospacing="1" w:afterAutospacing="1" w:line="240" w:lineRule="auto"/>
-        <w:jc w:val="left"/>
-      </w:pPr>
-      <w:r>
-        <w:t xml:space="preserve">actualización de estándares técnicos; </w:t>
-      </w:r>
-    </w:p>
-    <w:p>
-      <w:pPr>
-        <w:numPr>
-          <w:ilvl w:val="0"/>
-          <w:numId w:val="10"/>
-        </w:numPr>
-        <w:spacing w:before="100" w:beforeAutospacing="1" w:afterAutospacing="1" w:line="240" w:lineRule="auto"/>
-        <w:jc w:val="left"/>
-      </w:pPr>
-      <w:r>
-        <w:t xml:space="preserve">evaluación de nuevas tecnologías; </w:t>
-      </w:r>
-    </w:p>
-    <w:p>
-      <w:pPr>
-        <w:numPr>
-          <w:ilvl w:val="0"/>
-          <w:numId w:val="10"/>
-        </w:numPr>
-        <w:spacing w:before="100" w:beforeAutospacing="1" w:afterAutospacing="1" w:line="240" w:lineRule="auto"/>
-        <w:jc w:val="left"/>
-      </w:pPr>
-      <w:r>
-        <w:t xml:space="preserve">planificación de futuras inversiones; </w:t>
-      </w:r>
-    </w:p>
-    <w:p>
-      <w:pPr>
-        <w:numPr>
-          <w:ilvl w:val="0"/>
-          <w:numId w:val="10"/>
-        </w:numPr>
-        <w:spacing w:before="100" w:beforeAutospacing="1" w:afterAutospacing="1" w:line="240" w:lineRule="auto"/>
-        <w:jc w:val="left"/>
-      </w:pPr>
-      <w:r>
-        <w:t xml:space="preserve">definición de nuevas acciones de mejora sobre la base de los resultados obtenidos. </w:t>
-      </w:r>
-    </w:p>
-    <w:p>
-      <w:pPr>
-        <w:pStyle w:val="NormalWeb"/>
-        <w:rPr>
-          <w:rFonts w:ascii="Arial" w:hAnsi="Arial" w:cs="Arial"/>
-        </w:rPr>
-      </w:pPr>
-      <w:r>
-        <w:rPr>
-          <w:rFonts w:ascii="Arial" w:hAnsi="Arial" w:cs="Arial"/>
-        </w:rPr>
-        <w:t>La mejora continua permitirá que el Departamento mantenga una capacidad permanente de adaptación frente a nuevas demandas tecnológicas y organizacionales.</w:t>
-      </w:r>
-    </w:p>
-    <w:p>
-      <w:r>
-        <w:pict>
-          <v:rect id="_x0000_i1032" style="width:0;height:1.5pt" o:hralign="center" o:hrstd="t" o:hr="t" fillcolor="#a0a0a0" stroked="f"/>
-        </w:pict>
-      </w:r>
-    </w:p>
-    <w:p>
-      <w:pPr>
-        <w:pStyle w:val="Ttulo1"/>
-      </w:pPr>
-      <w:r>
-        <w:t>8. EVALUACIÓN Y SEGUIMIENTO</w:t>
-      </w:r>
-    </w:p>
-    <w:p>
-      <w:pPr>
-        <w:pStyle w:val="NormalWeb"/>
-        <w:rPr>
-          <w:rFonts w:ascii="Arial" w:hAnsi="Arial" w:cs="Arial"/>
-        </w:rPr>
-      </w:pPr>
-      <w:r>
-        <w:rPr>
-          <w:rFonts w:ascii="Arial" w:hAnsi="Arial" w:cs="Arial"/>
-        </w:rPr>
-        <w:t>La implementación del presente Plan de Trabajo requerirá un seguimiento permanente que permita verificar el cumplimiento de los objetivos propuestos y medir el impacto de las acciones implementadas.</w:t>
-      </w:r>
-    </w:p>
-    <w:p>
-      <w:pPr>
-        <w:pStyle w:val="NormalWeb"/>
-        <w:rPr>
-          <w:rFonts w:ascii="Arial" w:hAnsi="Arial" w:cs="Arial"/>
-        </w:rPr>
-      </w:pPr>
-      <w:r>
-        <w:rPr>
-          <w:rFonts w:ascii="Arial" w:hAnsi="Arial" w:cs="Arial"/>
-        </w:rPr>
-        <w:lastRenderedPageBreak/>
         <w:t>Con este propósito se propone la utilización de indicadores de gestión que permitan evaluar la evolución del Departamento mediante información objetiva, facilitando la toma de decisiones y la identificación temprana de oportunidades de mejora.</w:t>
       </w:r>
     </w:p>
@@ -6144,7 +6357,7 @@
     <w:p>
       <w:r>
         <w:pict>
-          <v:rect id="_x0000_i1033" style="width:0;height:1.5pt" o:hralign="center" o:hrstd="t" o:hr="t" fillcolor="#a0a0a0" stroked="f"/>
+          <v:rect id="_x0000_i1029" style="width:0;height:1.5pt" o:hralign="center" o:hrstd="t" o:hr="t" fillcolor="#a0a0a0" stroked="f"/>
         </w:pict>
       </w:r>
     </w:p>
@@ -6167,6 +6380,7 @@
         <w:rPr>
           <w:rFonts w:ascii="Arial" w:hAnsi="Arial" w:cs="Arial"/>
         </w:rPr>
+        <w:lastRenderedPageBreak/>
         <w:t xml:space="preserve">El Departamento de Gestión, Desarrollo e Innovación en Sistemas de Software cumple un rol estratégico dentro del proceso de transformación digital de la Municipalidad de General </w:t>
       </w:r>
       <w:proofErr w:type="spellStart"/>
@@ -6223,7 +6437,6 @@
         <w:rPr>
           <w:rFonts w:ascii="Arial" w:hAnsi="Arial" w:cs="Arial"/>
         </w:rPr>
-        <w:lastRenderedPageBreak/>
         <w:t>El rol de la Jefatura será conducir este proceso promoviendo el trabajo colaborativo, la planificación estratégica y la mejora continua, procurando que las decisiones técnicas acompañen las necesidades de la organización y contribuyan al fortalecimiento de la gestión pública.</w:t>
       </w:r>
     </w:p>

</xml_diff>

<commit_message>
Actualiza Seccion 8 a Opicion A narrativa estilo proyecto ganador
</commit_message>
<xml_diff>
--- a/Plan_Trabajo_Jefatura_Software_Version_Director.docx
+++ b/Plan_Trabajo_Jefatura_Software_Version_Director.docx
@@ -269,7 +269,13 @@
     </w:p>
     <w:p>
       <w:r>
-        <w:t>En consecuencia, este Plan de Trabajo propone una estrategia integral articulada en dos etapas consecutivas: por un lado, una propuesta de mejora basada en la optimización de los recursos actuales (sin presupuesto adicional, $0 costo), y por otro la</w:t>
+        <w:t>En consecuencia, este Plan de Trabajo propone una estrategia integral articulada en dos etapas consecutivas: por un lado, una propuesta de mejora basada en la optimiz</w:t>
+      </w:r>
+      <w:r>
+        <w:t xml:space="preserve">ación de los recursos actuales </w:t>
+      </w:r>
+      <w:r>
+        <w:t>y por otro la</w:t>
       </w:r>
       <w:r>
         <w:t>do, una proyección con incorporación de recursos para cuando la Administración disponga de partidas de inversión tecnológica, sin fijar montos estáticos sino líneas de adquisición escalables.</w:t>
@@ -1026,24 +1032,8 @@
           <w:sz w:val="24"/>
           <w:szCs w:val="24"/>
         </w:rPr>
-        <w:t>3.1 Liderazgo basado en la colaboración</w:t>
-      </w:r>
-    </w:p>
-    <w:p>
-      <w:r>
-        <w:t>La conducción del Departamento deberá promover un ambiente</w:t>
-      </w:r>
-      <w:r>
-        <w:t xml:space="preserve"> de trabajo participativo, donde la comunicación, el intercambio de conocimientos y la construcción colectiva de soluciones sean parte de la cultura organizacional. La función de la Jefatura consistirá en facilitar el trabajo de los equipos, remover obstác</w:t>
-      </w:r>
-      <w:r>
-        <w:t>ulos, promover acuerdos y generar las condiciones necesarias para que cada integrante pueda desarrollar sus capacidades profesionales.</w:t>
-      </w:r>
-    </w:p>
-    <w:p>
-      <w:pPr>
-        <w:pStyle w:val="Ttulo2"/>
-      </w:pPr>
+        <w:t xml:space="preserve">3.1 </w:t>
+      </w:r>
       <w:r>
         <w:rPr>
           <w:b/>
@@ -1051,18 +1041,102 @@
           <w:sz w:val="24"/>
           <w:szCs w:val="24"/>
         </w:rPr>
-        <w:t>3.2 Gestión orientada a procesos</w:t>
-      </w:r>
-    </w:p>
-    <w:p>
-      <w:r>
-        <w:t>El crecimiento sostenido del Departamento hace necesario reducir la dependencia de práct</w:t>
-      </w:r>
-      <w:r>
-        <w:t>icas individuales y avanzar hacia procedimientos institucionales homogéneos. Toda actividad recurrente deberá encontrarse respaldada por procedimientos claros que permitan garantizar continuidad, previsibilidad y calidad, simplificando el trabajo cotidiano</w:t>
-      </w:r>
-      <w:r>
-        <w:t xml:space="preserve"> y asegurando la continuidad operativa.</w:t>
+        <w:t>Liderazgo basado en la colaboración y el desarrollo del equipo</w:t>
+      </w:r>
+    </w:p>
+    <w:p>
+      <w:pPr>
+        <w:pStyle w:val="Ttulo2"/>
+        <w:rPr>
+          <w:color w:val="auto"/>
+          <w:sz w:val="22"/>
+          <w:szCs w:val="22"/>
+        </w:rPr>
+      </w:pPr>
+      <w:r>
+        <w:rPr>
+          <w:color w:val="auto"/>
+          <w:sz w:val="22"/>
+          <w:szCs w:val="22"/>
+        </w:rPr>
+        <w:t>La conducción del Departamento promoverá un ambiente de trabajo participativo y transparente, donde la comunicación fluida, el intercambio de conocimientos y la construcción colectiva de soluciones sean el eje de la cultura organizacional. La función de la Jefatura consistirá en facilitar el trabajo de los equipos, remover obstáculos operativos y generar las condiciones para que cada integrante pueda desarrollar su potencial profesional.</w:t>
+      </w:r>
+    </w:p>
+    <w:p>
+      <w:pPr>
+        <w:pStyle w:val="Ttulo2"/>
+        <w:rPr>
+          <w:color w:val="auto"/>
+          <w:sz w:val="22"/>
+          <w:szCs w:val="22"/>
+        </w:rPr>
+      </w:pPr>
+      <w:r>
+        <w:rPr>
+          <w:color w:val="auto"/>
+          <w:sz w:val="22"/>
+          <w:szCs w:val="22"/>
+        </w:rPr>
+        <w:t>Para consolidar esta visión de conducción humana y estratégica, la Jefatura se apoyará en tres pilares de gestión de personas:</w:t>
+      </w:r>
+      <w:bookmarkStart w:id="0" w:name="_GoBack"/>
+      <w:bookmarkEnd w:id="0"/>
+    </w:p>
+    <w:p>
+      <w:pPr>
+        <w:pStyle w:val="Ttulo2"/>
+        <w:ind w:left="708"/>
+        <w:rPr>
+          <w:color w:val="auto"/>
+          <w:sz w:val="22"/>
+          <w:szCs w:val="22"/>
+        </w:rPr>
+      </w:pPr>
+      <w:r>
+        <w:rPr>
+          <w:color w:val="auto"/>
+          <w:sz w:val="22"/>
+          <w:szCs w:val="22"/>
+        </w:rPr>
+        <w:t>• Delegación y autonomía responsable: Se descentralizará la toma de decisiones operativas, confiando tareas de relevamiento, arquitectura y liderazgo técnico a los perfiles de mayor experiencia, evitando que la Jefatura se transforme en un cuello de botella administrativo.</w:t>
+      </w:r>
+    </w:p>
+    <w:p>
+      <w:pPr>
+        <w:pStyle w:val="Ttulo2"/>
+        <w:ind w:left="708"/>
+        <w:rPr>
+          <w:color w:val="auto"/>
+          <w:sz w:val="22"/>
+          <w:szCs w:val="22"/>
+        </w:rPr>
+      </w:pPr>
+      <w:r>
+        <w:rPr>
+          <w:color w:val="auto"/>
+          <w:sz w:val="22"/>
+          <w:szCs w:val="22"/>
+        </w:rPr>
+        <w:t>• Motivación, participación y reconocimiento: Se fomentará el involucramiento activo del personal en las decisiones de diseño e innovación tecnológica, reconociendo públicamente el valor de la experiencia acumulada y la trayectoria del personal municipal.</w:t>
+      </w:r>
+    </w:p>
+    <w:p>
+      <w:pPr>
+        <w:pStyle w:val="Ttulo2"/>
+        <w:ind w:left="708"/>
+        <w:rPr>
+          <w:color w:val="auto"/>
+          <w:sz w:val="22"/>
+          <w:szCs w:val="22"/>
+        </w:rPr>
+      </w:pPr>
+      <w:r>
+        <w:rPr>
+          <w:color w:val="auto"/>
+          <w:sz w:val="22"/>
+          <w:szCs w:val="22"/>
+        </w:rPr>
+        <w:t>• Comunicación transparente y gestión constructiva del clima laboral: La resistencia al cambio o la inercia organizacional no se abordarán como problemas de conducta individual, sino como procesos naturales de transición que la Jefatura debe gestionar mediante el diálogo, la capacitación, la fundamentación técnica de las nuevas pautas y el acompañamiento constante.</w:t>
       </w:r>
     </w:p>
     <w:p>
@@ -1076,23 +1150,18 @@
           <w:sz w:val="24"/>
           <w:szCs w:val="24"/>
         </w:rPr>
-        <w:t>3.3 Gestión del conocimiento institucional</w:t>
-      </w:r>
-    </w:p>
-    <w:p>
-      <w:r>
-        <w:t xml:space="preserve">El conocimiento generado durante el desarrollo y mantenimiento de los sistemas constituye un </w:t>
-      </w:r>
-      <w:proofErr w:type="gramStart"/>
-      <w:r>
-        <w:t>activo</w:t>
-      </w:r>
-      <w:proofErr w:type="gramEnd"/>
-      <w:r>
-        <w:t xml:space="preserve"> estratégico de la Municipalidad. Por ello, la Jefatura impulsará mecanism</w:t>
-      </w:r>
-      <w:r>
-        <w:t>os que favorezcan la documentación, la transferencia de conocimientos y la capacitación interna, procurando que la información crítica permanezca en la organización.</w:t>
+        <w:t>3.2 Gestión orientada a procesos</w:t>
+      </w:r>
+    </w:p>
+    <w:p>
+      <w:r>
+        <w:t>El crecimiento sostenido del Departamento hace necesario reducir la dependencia de práct</w:t>
+      </w:r>
+      <w:r>
+        <w:t>icas individuales y avanzar hacia procedimientos institucionales homogéneos. Toda actividad recurrente deberá encontrarse respaldada por procedimientos claros que permitan garantizar continuidad, previsibilidad y calidad, simplificando el trabajo cotidiano</w:t>
+      </w:r>
+      <w:r>
+        <w:t xml:space="preserve"> y asegurando la continuidad operativa.</w:t>
       </w:r>
     </w:p>
     <w:p>
@@ -1106,12 +1175,24 @@
           <w:sz w:val="24"/>
           <w:szCs w:val="24"/>
         </w:rPr>
-        <w:t>3.4 Mejora continua</w:t>
-      </w:r>
-    </w:p>
-    <w:p>
-      <w:r>
-        <w:t>Los procedimientos, metodologías y herramientas deberán revisarse periódicamente para identificar oportunidades de mejora sobre la base de evidencias objetivas, indicadores de gestión y resultados observables.</w:t>
+        <w:lastRenderedPageBreak/>
+        <w:t>3.3 Gestión del conocimiento institucional</w:t>
+      </w:r>
+    </w:p>
+    <w:p>
+      <w:r>
+        <w:t xml:space="preserve">El conocimiento generado durante el desarrollo y mantenimiento de los sistemas constituye un </w:t>
+      </w:r>
+      <w:proofErr w:type="gramStart"/>
+      <w:r>
+        <w:t>activo</w:t>
+      </w:r>
+      <w:proofErr w:type="gramEnd"/>
+      <w:r>
+        <w:t xml:space="preserve"> estratégico de la Municipalidad. Por ello, la Jefatura impulsará mecanism</w:t>
+      </w:r>
+      <w:r>
+        <w:t>os que favorezcan la documentación, la transferencia de conocimientos y la capacitación interna, procurando que la información crítica permanezca en la organización.</w:t>
       </w:r>
     </w:p>
     <w:p>
@@ -1125,22 +1206,12 @@
           <w:sz w:val="24"/>
           <w:szCs w:val="24"/>
         </w:rPr>
-        <w:t>3.5 Innovación responsable</w:t>
-      </w:r>
-    </w:p>
-    <w:p>
-      <w:r>
-        <w:t>Antes de adoptar un</w:t>
-      </w:r>
-      <w:r>
-        <w:t xml:space="preserve">a herramienta, metodología o plataforma tecnológica se evaluarán aspectos tales como compatibilidad con la arquitectura existente, sostenibilidad en el tiempo, costos de </w:t>
-      </w:r>
-      <w:r>
-        <w:lastRenderedPageBreak/>
-        <w:t>implementación, impacto sobre los procesos, requerimientos de capacitación y seguridad</w:t>
-      </w:r>
-      <w:r>
-        <w:t xml:space="preserve"> de la información.</w:t>
+        <w:t>3.4 Mejora continua</w:t>
+      </w:r>
+    </w:p>
+    <w:p>
+      <w:r>
+        <w:t>Los procedimientos, metodologías y herramientas deberán revisarse periódicamente para identificar oportunidades de mejora sobre la base de evidencias objetivas, indicadores de gestión y resultados observables.</w:t>
       </w:r>
     </w:p>
     <w:p>
@@ -1154,15 +1225,18 @@
           <w:sz w:val="24"/>
           <w:szCs w:val="24"/>
         </w:rPr>
-        <w:t>3.6 Orientación al servicio</w:t>
-      </w:r>
-    </w:p>
-    <w:p>
-      <w:r>
-        <w:t>El Departamento presta servicios a las distintas áreas municipales y, de manera indirecta, a toda la comunidad. Las decisiones deberán priorizar el valor que los sistemas aportan a los procesos administrativo</w:t>
-      </w:r>
-      <w:r>
-        <w:t>s, sustentándose en un diálogo permanente y una definición clara de prioridades.</w:t>
+        <w:t>3.5 Innovación responsable</w:t>
+      </w:r>
+    </w:p>
+    <w:p>
+      <w:r>
+        <w:t>Antes de adoptar un</w:t>
+      </w:r>
+      <w:r>
+        <w:t>a herramienta, metodología o plataforma tecnológica se evaluarán aspectos tales como compatibilidad con la arquitectura existente, sostenibilidad en el tiempo, costos de implementación, impacto sobre los procesos, requerimientos de capacitación y seguridad</w:t>
+      </w:r>
+      <w:r>
+        <w:t xml:space="preserve"> de la información.</w:t>
       </w:r>
     </w:p>
     <w:p>
@@ -1176,6 +1250,28 @@
           <w:sz w:val="24"/>
           <w:szCs w:val="24"/>
         </w:rPr>
+        <w:t>3.6 Orientación al servicio</w:t>
+      </w:r>
+    </w:p>
+    <w:p>
+      <w:r>
+        <w:t>El Departamento presta servicios a las distintas áreas municipales y, de manera indirecta, a toda la comunidad. Las decisiones deberán priorizar el valor que los sistemas aportan a los procesos administrativo</w:t>
+      </w:r>
+      <w:r>
+        <w:t>s, sustentándose en un diálogo permanente y una definición clara de prioridades.</w:t>
+      </w:r>
+    </w:p>
+    <w:p>
+      <w:pPr>
+        <w:pStyle w:val="Ttulo2"/>
+      </w:pPr>
+      <w:r>
+        <w:rPr>
+          <w:b/>
+          <w:bCs/>
+          <w:sz w:val="24"/>
+          <w:szCs w:val="24"/>
+        </w:rPr>
         <w:t>3.7 Decisiones basadas en evidencia</w:t>
       </w:r>
     </w:p>
@@ -1193,6 +1289,96 @@
         <w:pStyle w:val="Ttulo1"/>
       </w:pPr>
       <w:r>
+        <w:t>4</w:t>
+      </w:r>
+      <w:r>
+        <w:t xml:space="preserve">. </w:t>
+      </w:r>
+      <w:r>
+        <w:t>OBJETIVOS DEL PLAN DE TRABAJO</w:t>
+      </w:r>
+    </w:p>
+    <w:p>
+      <w:pPr>
+        <w:pStyle w:val="Ttulo1"/>
+      </w:pPr>
+    </w:p>
+    <w:p>
+      <w:r>
+        <w:t>El presente Plan de Trabajo persigue los siguientes objetivos estratégicos para el fortalecimiento integral del Departamento:</w:t>
+      </w:r>
+    </w:p>
+    <w:p>
+      <w:pPr>
+        <w:ind w:left="708"/>
+      </w:pPr>
+      <w:r>
+        <w:t>• Optimizar la planificación y priorización de requerimientos para reducir progresivamente la atención reactiva de emergencias.</w:t>
+      </w:r>
+    </w:p>
+    <w:p>
+      <w:pPr>
+        <w:ind w:left="708"/>
+      </w:pPr>
+      <w:r>
+        <w:t>• Centralizar y visibilizar la gestión y el seguimiento de solicitudes, proyectos e incidencias en la plataforma institucional de gestión.</w:t>
+      </w:r>
+    </w:p>
+    <w:p>
+      <w:pPr>
+        <w:ind w:left="708"/>
+      </w:pPr>
+      <w:r>
+        <w:t>• Preservar el conocimiento institucional y mitigar los riesgos operativos mediante el fortalecimiento de la documentación y la transferencia técnica.</w:t>
+      </w:r>
+    </w:p>
+    <w:p>
+      <w:pPr>
+        <w:ind w:left="708"/>
+      </w:pPr>
+      <w:r>
+        <w:t>• Establecer estándares técnicos y criterios homogéneos de calidad para el desarrollo, mantenimiento y arquitectura de software.</w:t>
+      </w:r>
+    </w:p>
+    <w:p>
+      <w:pPr>
+        <w:ind w:left="708"/>
+      </w:pPr>
+      <w:r>
+        <w:t>• Fortalecer la coordinación, la comunicación y la sinergia entre los equipos de trabajo distribuidos.</w:t>
+      </w:r>
+    </w:p>
+    <w:p>
+      <w:pPr>
+        <w:ind w:left="708"/>
+      </w:pPr>
+      <w:r>
+        <w:t>• Consolidar el gobierno técnico y la soberanía sobre los desarrollos de software realizados por proveedores externos.</w:t>
+      </w:r>
+    </w:p>
+    <w:p>
+      <w:pPr>
+        <w:ind w:left="708"/>
+      </w:pPr>
+      <w:r>
+        <w:t>• Promover la incorporación progresiva y responsable de nuevas herramientas tecnológicas de apoyo al desarrollo.</w:t>
+      </w:r>
+    </w:p>
+    <w:p>
+      <w:pPr>
+        <w:ind w:left="708"/>
+      </w:pPr>
+      <w:r>
+        <w:t>• Optimizar la distribución de funciones operativas considerando la trayectoria y experiencia acumulada por el personal.</w:t>
+      </w:r>
+    </w:p>
+    <w:p/>
+    <w:p/>
+    <w:p>
+      <w:pPr>
+        <w:pStyle w:val="Ttulo1"/>
+      </w:pPr>
+      <w:r>
         <w:t>5. PROPUESTA DE MEJORA Y OPTIMIZACIÓN CON RECURSOS ACTUALES</w:t>
       </w:r>
     </w:p>
@@ -1221,7 +1407,7 @@
         <w:rPr>
           <w:rFonts w:ascii="Arial" w:hAnsi="Arial" w:cs="Arial"/>
         </w:rPr>
-        <w:t xml:space="preserve">En consecuencia, se propone un plan de optimización basado en seis líneas de acción prioritarias, todas ellas </w:t>
+        <w:t xml:space="preserve">En consecuencia, se propone un plan de optimización basado en líneas de acción prioritarias, todas ellas </w:t>
       </w:r>
       <w:proofErr w:type="spellStart"/>
       <w:r>
@@ -1425,66 +1611,66 @@
           <w:sz w:val="24"/>
           <w:szCs w:val="24"/>
         </w:rPr>
+        <w:t xml:space="preserve">La planificación distinguirá claramente las tareas de mantenimiento </w:t>
+      </w:r>
+      <w:proofErr w:type="gramStart"/>
+      <w:r>
+        <w:rPr>
+          <w:rFonts w:eastAsia="Times New Roman"/>
+          <w:color w:val="auto"/>
+          <w:sz w:val="24"/>
+          <w:szCs w:val="24"/>
+        </w:rPr>
+        <w:t>continuo</w:t>
+      </w:r>
+      <w:proofErr w:type="gramEnd"/>
+      <w:r>
+        <w:rPr>
+          <w:rFonts w:eastAsia="Times New Roman"/>
+          <w:color w:val="auto"/>
+          <w:sz w:val="24"/>
+          <w:szCs w:val="24"/>
+        </w:rPr>
+        <w:t xml:space="preserve"> de los nuevos desarrollos, permitiendo asignar prioridades, distribuir la carga de trabajo y realizar un seguimiento permanente del estado de cada iniciativa mediante el aprovechamiento de sus módulos nativos de Gantt y gestión Ágil.</w:t>
+      </w:r>
+    </w:p>
+    <w:p>
+      <w:pPr>
+        <w:pStyle w:val="Ttulo2"/>
+        <w:rPr>
+          <w:rFonts w:eastAsia="Times New Roman"/>
+          <w:color w:val="auto"/>
+          <w:sz w:val="24"/>
+          <w:szCs w:val="24"/>
+        </w:rPr>
+      </w:pPr>
+      <w:r>
+        <w:rPr>
+          <w:rFonts w:eastAsia="Times New Roman"/>
+          <w:color w:val="auto"/>
+          <w:sz w:val="24"/>
+          <w:szCs w:val="24"/>
+        </w:rPr>
+        <w:t>La metodología utilizada será flexible y adaptada a la realidad del Departamento, incorporando prácticas ágiles únicamente cuando aporten valor al proceso de trabajo, evitando trasladar modelos rígidos que no respondan a las características de la Administración Pública.</w:t>
+      </w:r>
+    </w:p>
+    <w:p>
+      <w:pPr>
+        <w:pStyle w:val="Ttulo2"/>
+        <w:rPr>
+          <w:rFonts w:eastAsia="Times New Roman"/>
+          <w:color w:val="auto"/>
+          <w:sz w:val="24"/>
+          <w:szCs w:val="24"/>
+        </w:rPr>
+      </w:pPr>
+    </w:p>
+    <w:p>
+      <w:pPr>
+        <w:pStyle w:val="Ttulo2"/>
+      </w:pPr>
+      <w:r>
         <w:lastRenderedPageBreak/>
-        <w:t xml:space="preserve">La planificación distinguirá claramente las tareas de mantenimiento </w:t>
-      </w:r>
-      <w:proofErr w:type="gramStart"/>
-      <w:r>
-        <w:rPr>
-          <w:rFonts w:eastAsia="Times New Roman"/>
-          <w:color w:val="auto"/>
-          <w:sz w:val="24"/>
-          <w:szCs w:val="24"/>
-        </w:rPr>
-        <w:t>continuo</w:t>
-      </w:r>
-      <w:proofErr w:type="gramEnd"/>
-      <w:r>
-        <w:rPr>
-          <w:rFonts w:eastAsia="Times New Roman"/>
-          <w:color w:val="auto"/>
-          <w:sz w:val="24"/>
-          <w:szCs w:val="24"/>
-        </w:rPr>
-        <w:t xml:space="preserve"> de los nuevos desarrollos, permitiendo asignar prioridades, distribuir la carga de trabajo y realizar un seguimiento permanente del estado de cada iniciativa mediante el aprovechamiento de sus módulos nativos de Gantt y gestión Ágil.</w:t>
-      </w:r>
-    </w:p>
-    <w:p>
-      <w:pPr>
-        <w:pStyle w:val="Ttulo2"/>
-        <w:rPr>
-          <w:rFonts w:eastAsia="Times New Roman"/>
-          <w:color w:val="auto"/>
-          <w:sz w:val="24"/>
-          <w:szCs w:val="24"/>
-        </w:rPr>
-      </w:pPr>
-      <w:r>
-        <w:rPr>
-          <w:rFonts w:eastAsia="Times New Roman"/>
-          <w:color w:val="auto"/>
-          <w:sz w:val="24"/>
-          <w:szCs w:val="24"/>
-        </w:rPr>
-        <w:t>La metodología utilizada será flexible y adaptada a la realidad del Departamento, incorporando prácticas ágiles únicamente cuando aporten valor al proceso de trabajo, evitando trasladar modelos rígidos que no respondan a las características de la Administración Pública.</w:t>
-      </w:r>
-    </w:p>
-    <w:p>
-      <w:pPr>
-        <w:pStyle w:val="Ttulo2"/>
-        <w:rPr>
-          <w:rFonts w:eastAsia="Times New Roman"/>
-          <w:color w:val="auto"/>
-          <w:sz w:val="24"/>
-          <w:szCs w:val="24"/>
-        </w:rPr>
-      </w:pPr>
-    </w:p>
-    <w:p>
-      <w:pPr>
-        <w:pStyle w:val="Ttulo2"/>
-      </w:pPr>
-      <w:r>
         <w:t>Implementación</w:t>
       </w:r>
     </w:p>
@@ -1834,17 +2020,7 @@
           <w:sz w:val="24"/>
           <w:szCs w:val="24"/>
         </w:rPr>
-        <w:t xml:space="preserve">Se implementará un programa permanente de gestión del conocimiento orientado a preservar el patrimonio técnico del Departamento y reducir la dependencia de personas específicas. Como parte de este programa, se promoverá la asignación gradual de agentes de apoyo en los sistemas críticos, favoreciendo la transferencia de </w:t>
-      </w:r>
-      <w:r>
-        <w:rPr>
-          <w:rFonts w:eastAsia="Times New Roman"/>
-          <w:color w:val="auto"/>
-          <w:sz w:val="24"/>
-          <w:szCs w:val="24"/>
-        </w:rPr>
-        <w:lastRenderedPageBreak/>
-        <w:t>conocimientos y asegurando la continuidad operativa ante ausencias, cambios de funciones o nuevas necesidades organizacionales, complementado con una política de documentación técnica proporcional a la complejidad de cada aplicación.</w:t>
+        <w:t>Se implementará un programa permanente de gestión del conocimiento orientado a preservar el patrimonio técnico del Departamento y reducir la dependencia de personas específicas. Como parte de este programa, se promoverá la asignación gradual de agentes de apoyo en los sistemas críticos, favoreciendo la transferencia de conocimientos y asegurando la continuidad operativa ante ausencias, cambios de funciones o nuevas necesidades organizacionales, complementado con una política de documentación técnica proporcional a la complejidad de cada aplicación.</w:t>
       </w:r>
     </w:p>
     <w:p>
@@ -1932,6 +2108,7 @@
           <w:sz w:val="22"/>
           <w:szCs w:val="22"/>
         </w:rPr>
+        <w:lastRenderedPageBreak/>
         <w:t>participación</w:t>
       </w:r>
       <w:proofErr w:type="gramEnd"/>
@@ -2028,7 +2205,7 @@
           <w:sz w:val="22"/>
           <w:szCs w:val="22"/>
         </w:rPr>
-        <w:t>revisión</w:t>
+        <w:t>instancias</w:t>
       </w:r>
       <w:proofErr w:type="gramEnd"/>
       <w:r>
@@ -2037,14 +2214,46 @@
           <w:sz w:val="22"/>
           <w:szCs w:val="22"/>
         </w:rPr>
-        <w:t xml:space="preserve"> periódica del grado de cobertura del conocimiento de cada sistema.</w:t>
-      </w:r>
-      <w:r>
+        <w:t xml:space="preserve"> de transferencia práctica y acompañamiento entre agentes;</w:t>
+      </w:r>
+    </w:p>
+    <w:p>
+      <w:pPr>
+        <w:pStyle w:val="Ttulo2"/>
+        <w:numPr>
+          <w:ilvl w:val="0"/>
+          <w:numId w:val="11"/>
+        </w:numPr>
         <w:rPr>
           <w:color w:val="auto"/>
           <w:sz w:val="22"/>
           <w:szCs w:val="22"/>
         </w:rPr>
+      </w:pPr>
+      <w:proofErr w:type="gramStart"/>
+      <w:r>
+        <w:rPr>
+          <w:color w:val="auto"/>
+          <w:sz w:val="22"/>
+          <w:szCs w:val="22"/>
+        </w:rPr>
+        <w:t>revisión</w:t>
+      </w:r>
+      <w:proofErr w:type="gramEnd"/>
+      <w:r>
+        <w:rPr>
+          <w:color w:val="auto"/>
+          <w:sz w:val="22"/>
+          <w:szCs w:val="22"/>
+        </w:rPr>
+        <w:t xml:space="preserve"> periódica del grado de cobertura del conocimiento de cada sistema.</w:t>
+      </w:r>
+      <w:r>
+        <w:rPr>
+          <w:color w:val="auto"/>
+          <w:sz w:val="22"/>
+          <w:szCs w:val="22"/>
+        </w:rPr>
         <w:br/>
       </w:r>
     </w:p>
@@ -2070,13 +2279,7 @@
         <w:t>La medida reducirá significativamente el riesgo operativo, facilitará la redistribución de tareas y permitirá preservar el conocimiento institucional generado por el Departamento.</w:t>
       </w:r>
     </w:p>
-    <w:p>
-      <w:r>
-        <w:pict>
-          <v:rect id="_x0000_i1025" style="width:0;height:1.5pt" o:hralign="center" o:hrstd="t" o:hr="t" fillcolor="#a0a0a0" stroked="f"/>
-        </w:pict>
-      </w:r>
-    </w:p>
+    <w:p/>
     <w:p>
       <w:pPr>
         <w:pStyle w:val="Ttulo1"/>
@@ -2214,7 +2417,10 @@
         <w:jc w:val="left"/>
       </w:pPr>
       <w:r>
-        <w:t xml:space="preserve">criterios mínimos de documentación; </w:t>
+        <w:t>criterios mínimos de documentaci</w:t>
+      </w:r>
+      <w:r>
+        <w:t>ón;</w:t>
       </w:r>
     </w:p>
     <w:p>
@@ -2227,44 +2433,51 @@
         <w:jc w:val="left"/>
       </w:pPr>
       <w:r>
+        <w:t>criterios mínimos de seguridad aplicables al desarrollo y mantenimiento de los sistemas;</w:t>
+      </w:r>
+    </w:p>
+    <w:p>
+      <w:pPr>
+        <w:numPr>
+          <w:ilvl w:val="0"/>
+          <w:numId w:val="4"/>
+        </w:numPr>
+        <w:spacing w:before="100" w:beforeAutospacing="1" w:afterAutospacing="1" w:line="240" w:lineRule="auto"/>
+        <w:jc w:val="left"/>
+      </w:pPr>
+      <w:r>
+        <w:t xml:space="preserve">procedimientos básicos de revisión técnica antes de producción. </w:t>
+      </w:r>
+    </w:p>
+    <w:p>
+      <w:pPr>
+        <w:pStyle w:val="Ttulo2"/>
+      </w:pPr>
+      <w:r>
+        <w:t>Resultado esperado</w:t>
+      </w:r>
+    </w:p>
+    <w:p>
+      <w:pPr>
+        <w:pStyle w:val="NormalWeb"/>
+        <w:rPr>
+          <w:rFonts w:ascii="Arial" w:hAnsi="Arial" w:cs="Arial"/>
+        </w:rPr>
+      </w:pPr>
+      <w:r>
+        <w:rPr>
+          <w:rFonts w:ascii="Arial" w:hAnsi="Arial" w:cs="Arial"/>
+        </w:rPr>
+        <w:t>Se obtendrán desarrollos más homogéneos, menor tiempo de mantenimiento, mayor facilidad para incorporar nuevos desarrolladores y una reducción progresiva de la deuda técnica.</w:t>
+      </w:r>
+    </w:p>
+    <w:p/>
+    <w:p>
+      <w:pPr>
+        <w:pStyle w:val="Ttulo1"/>
+      </w:pPr>
+      <w:r>
         <w:lastRenderedPageBreak/>
-        <w:t xml:space="preserve">procedimientos básicos de revisión técnica antes de producción. </w:t>
-      </w:r>
-    </w:p>
-    <w:p>
-      <w:pPr>
-        <w:pStyle w:val="Ttulo2"/>
-      </w:pPr>
-      <w:r>
-        <w:t>Resultado esperado</w:t>
-      </w:r>
-    </w:p>
-    <w:p>
-      <w:pPr>
-        <w:pStyle w:val="NormalWeb"/>
-        <w:rPr>
-          <w:rFonts w:ascii="Arial" w:hAnsi="Arial" w:cs="Arial"/>
-        </w:rPr>
-      </w:pPr>
-      <w:r>
-        <w:rPr>
-          <w:rFonts w:ascii="Arial" w:hAnsi="Arial" w:cs="Arial"/>
-        </w:rPr>
-        <w:t>Se obtendrán desarrollos más homogéneos, menor tiempo de mantenimiento, mayor facilidad para incorporar nuevos desarrolladores y una reducción progresiva de la deuda técnica.</w:t>
-      </w:r>
-    </w:p>
-    <w:p>
-      <w:r>
-        <w:pict>
-          <v:rect id="_x0000_i1026" style="width:0;height:1.5pt" o:hralign="center" o:hrstd="t" o:hr="t" fillcolor="#a0a0a0" stroked="f"/>
-        </w:pict>
-      </w:r>
-    </w:p>
-    <w:p>
-      <w:pPr>
-        <w:pStyle w:val="Ttulo1"/>
-      </w:pPr>
-      <w:r>
         <w:t>5.4 Gestión de requerimientos y relación con las áreas usuarias</w:t>
       </w:r>
     </w:p>
@@ -2409,7 +2622,39 @@
         <w:jc w:val="left"/>
       </w:pPr>
       <w:r>
-        <w:t xml:space="preserve">validación con el área solicitante. </w:t>
+        <w:t>impacto e integración con otros sistemas municipales;</w:t>
+      </w:r>
+    </w:p>
+    <w:p>
+      <w:pPr>
+        <w:numPr>
+          <w:ilvl w:val="0"/>
+          <w:numId w:val="5"/>
+        </w:numPr>
+        <w:spacing w:before="100" w:beforeAutospacing="1" w:afterAutospacing="1" w:line="240" w:lineRule="auto"/>
+        <w:jc w:val="left"/>
+      </w:pPr>
+      <w:r>
+        <w:t>vali</w:t>
+      </w:r>
+      <w:r>
+        <w:t>dación con el área solicitante;</w:t>
+      </w:r>
+    </w:p>
+    <w:p>
+      <w:pPr>
+        <w:numPr>
+          <w:ilvl w:val="0"/>
+          <w:numId w:val="5"/>
+        </w:numPr>
+        <w:spacing w:before="100" w:beforeAutospacing="1" w:afterAutospacing="1" w:line="240" w:lineRule="auto"/>
+        <w:jc w:val="left"/>
+      </w:pPr>
+      <w:r>
+        <w:t>posibilidades de reutilización e integración con soluciones y servicios existentes</w:t>
+      </w:r>
+      <w:r>
+        <w:t>.</w:t>
       </w:r>
     </w:p>
     <w:p>
@@ -2434,13 +2679,7 @@
         <w:t>La medida permitirá optimizar la asignación de recursos, reducir desarrollos duplicados y mejorar la comunicación con las distintas Secretarías.</w:t>
       </w:r>
     </w:p>
-    <w:p>
-      <w:r>
-        <w:pict>
-          <v:rect id="_x0000_i1027" style="width:0;height:1.5pt" o:hralign="center" o:hrstd="t" o:hr="t" fillcolor="#a0a0a0" stroked="f"/>
-        </w:pict>
-      </w:r>
-    </w:p>
+    <w:p/>
     <w:p>
       <w:pPr>
         <w:pStyle w:val="Ttulo1"/>
@@ -2502,7 +2741,6 @@
           <w:sz w:val="24"/>
           <w:szCs w:val="24"/>
         </w:rPr>
-        <w:lastRenderedPageBreak/>
         <w:t>La Jefatura ejercerá un rol de conducción técnica durante todo el ciclo de contratación, asegurando que las soluciones externas se integren adecuadamente al ecosistema tecnológico municipal. Para ello, asignará al seguimiento de cada proyecto a uno o más agentes del Departamento con experiencia en la temática funcional involucrada, quienes participarán en las etapas de relevamiento, validación y seguimiento técnico, complementando el conocimiento tecnológico del proveedor con el conocimiento de los procesos administrativos municipales.</w:t>
       </w:r>
     </w:p>
@@ -2634,6 +2872,13 @@
       </w:pPr>
     </w:p>
     <w:p>
+      <w:pPr>
+        <w:rPr>
+          <w:rFonts w:eastAsia="Times New Roman"/>
+          <w:sz w:val="24"/>
+          <w:szCs w:val="24"/>
+        </w:rPr>
+      </w:pPr>
       <w:r>
         <w:rPr>
           <w:rFonts w:eastAsia="Times New Roman"/>
@@ -2642,12 +2887,8 @@
         </w:rPr>
         <w:t>Se fortalecerá la soberanía tecnológica del Municipio, se reducirá la dependencia de proveedores externos y se favorecerá el desarrollo de soluciones alineadas con los procesos administrativos y las necesidades de las áreas usuarias, mediante la participación activa del personal del Departamento con conocimiento funcional en cada proyecto.</w:t>
       </w:r>
-      <w:r>
-        <w:pict>
-          <v:rect id="_x0000_i1028" style="width:0;height:1.5pt" o:hralign="center" o:hrstd="t" o:hr="t" fillcolor="#a0a0a0" stroked="f"/>
-        </w:pict>
-      </w:r>
-    </w:p>
+    </w:p>
+    <w:p/>
     <w:p>
       <w:pPr>
         <w:pStyle w:val="Ttulo1"/>
@@ -2758,27 +2999,72 @@
           <w:sz w:val="24"/>
           <w:szCs w:val="24"/>
         </w:rPr>
+        <w:t xml:space="preserve">La Inteligencia Artificial será considerada una herramienta de apoyo para incrementar la productividad del equipo mediante la utilización de </w:t>
+      </w:r>
+      <w:r>
+        <w:rPr>
+          <w:rFonts w:eastAsia="Times New Roman"/>
+          <w:color w:val="auto"/>
+          <w:sz w:val="24"/>
+          <w:szCs w:val="24"/>
+        </w:rPr>
+        <w:t>herramientas de asistencia mediante Inteligencia Artificial disponibles en los entornos de desarrollo</w:t>
+      </w:r>
+      <w:r>
+        <w:rPr>
+          <w:rFonts w:eastAsia="Times New Roman"/>
+          <w:color w:val="auto"/>
+          <w:sz w:val="24"/>
+          <w:szCs w:val="24"/>
+        </w:rPr>
+        <w:t xml:space="preserve"> </w:t>
+      </w:r>
+      <w:r>
+        <w:rPr>
+          <w:rFonts w:eastAsia="Times New Roman"/>
+          <w:color w:val="auto"/>
+          <w:sz w:val="24"/>
+          <w:szCs w:val="24"/>
+        </w:rPr>
+        <w:t>e integrados a los entornos de desarrollo (IDE), facilitando la detección de errores, la generación de documentación técnica, la asistencia durante el desarrollo y la automatización de tareas repetitivas, manteniendo siempre la supervisión profesional y</w:t>
+      </w:r>
+      <w:r>
+        <w:rPr>
+          <w:rFonts w:eastAsia="Times New Roman"/>
+          <w:color w:val="auto"/>
+          <w:sz w:val="24"/>
+          <w:szCs w:val="24"/>
+        </w:rPr>
+        <w:t xml:space="preserve"> bajo pautas institucionales que determinen el tratamiento permitido de la información y preserven la seguridad de los datos municipales</w:t>
+      </w:r>
+      <w:r>
+        <w:rPr>
+          <w:rFonts w:eastAsia="Times New Roman"/>
+          <w:color w:val="auto"/>
+          <w:sz w:val="24"/>
+          <w:szCs w:val="24"/>
+        </w:rPr>
+        <w:t>.</w:t>
+      </w:r>
+    </w:p>
+    <w:p>
+      <w:pPr>
+        <w:pStyle w:val="Ttulo2"/>
+        <w:rPr>
+          <w:rFonts w:eastAsia="Times New Roman"/>
+          <w:color w:val="auto"/>
+          <w:sz w:val="24"/>
+          <w:szCs w:val="24"/>
+        </w:rPr>
+      </w:pPr>
+      <w:r>
+        <w:rPr>
+          <w:rFonts w:eastAsia="Times New Roman"/>
+          <w:color w:val="auto"/>
+          <w:sz w:val="24"/>
+          <w:szCs w:val="24"/>
+        </w:rPr>
         <w:lastRenderedPageBreak/>
-        <w:t>La Inteligencia Artificial será considerada una herramienta de apoyo para incrementar la productividad del equipo mediante la utilización de asistentes de IA disponibles sin costo e integrados a los entornos de desarrollo (IDE), facilitando la detección de errores, la generación de documentación técnica, la asistencia durante el desarrollo y la automatización de tareas repetitivas, manteniendo siempre la supervisión profesional y la protección de la información institucional.</w:t>
-      </w:r>
-    </w:p>
-    <w:p>
-      <w:pPr>
-        <w:pStyle w:val="Ttulo2"/>
-        <w:rPr>
-          <w:rFonts w:eastAsia="Times New Roman"/>
-          <w:color w:val="auto"/>
-          <w:sz w:val="24"/>
-          <w:szCs w:val="24"/>
-        </w:rPr>
-      </w:pPr>
-      <w:r>
-        <w:rPr>
-          <w:rFonts w:eastAsia="Times New Roman"/>
-          <w:color w:val="auto"/>
-          <w:sz w:val="24"/>
-          <w:szCs w:val="24"/>
-        </w:rPr>
         <w:t>La incorporación de nuevas tecnologías se realizará de manera gradual, priorizando su adopción en proyectos nuevos donde la resistencia inicial es menor. Los agentes con mayor experiencia en tecnologías actualizadas acompañarán a quienes están en proceso de transición mediante trabajo conjunto y capacitación interna, evitando imponer cambios abruptos que generen rechazo.</w:t>
       </w:r>
     </w:p>
@@ -3113,7 +3399,6 @@
         <w:pStyle w:val="Ttulo2"/>
       </w:pPr>
       <w:r>
-        <w:lastRenderedPageBreak/>
         <w:t>Implementación</w:t>
       </w:r>
     </w:p>
@@ -3164,6 +3449,7 @@
         <w:rPr>
           <w:rFonts w:eastAsia="Times New Roman"/>
         </w:rPr>
+        <w:lastRenderedPageBreak/>
         <w:t xml:space="preserve">uso de </w:t>
       </w:r>
       <w:proofErr w:type="spellStart"/>
@@ -3431,7 +3717,19 @@
         <w:rPr>
           <w:rFonts w:eastAsia="Times New Roman"/>
         </w:rPr>
-        <w:t xml:space="preserve"> informal de referentes funcionales según la trayectoria de cada integrante;</w:t>
+        <w:t xml:space="preserve"> de referentes funcionales según la trayectoria y</w:t>
+      </w:r>
+      <w:r>
+        <w:rPr>
+          <w:rFonts w:eastAsia="Times New Roman"/>
+        </w:rPr>
+        <w:t xml:space="preserve"> experiencia de cada integrante</w:t>
+      </w:r>
+      <w:r>
+        <w:rPr>
+          <w:rFonts w:eastAsia="Times New Roman"/>
+        </w:rPr>
+        <w:t>;</w:t>
       </w:r>
     </w:p>
     <w:p>
@@ -3552,39 +3850,39 @@
           <w:sz w:val="24"/>
           <w:szCs w:val="24"/>
         </w:rPr>
+        <w:t>Esta medida permitirá optimizar la distribución del trabajo con los recursos actuales, jerarquizar la experiencia del personal existente y mejorar la calidad en el relevamiento de necesidades con las áreas us</w:t>
+      </w:r>
+      <w:r>
+        <w:rPr>
+          <w:rFonts w:eastAsia="Times New Roman"/>
+          <w:sz w:val="24"/>
+          <w:szCs w:val="24"/>
+        </w:rPr>
+        <w:t>uarias</w:t>
+      </w:r>
+      <w:r>
+        <w:rPr>
+          <w:rFonts w:eastAsia="Times New Roman"/>
+          <w:sz w:val="24"/>
+          <w:szCs w:val="24"/>
+        </w:rPr>
+        <w:t>.</w:t>
+      </w:r>
+    </w:p>
+    <w:p>
+      <w:pPr>
+        <w:rPr>
+          <w:rFonts w:eastAsia="Times New Roman"/>
+        </w:rPr>
+      </w:pPr>
+    </w:p>
+    <w:p/>
+    <w:p>
+      <w:pPr>
+        <w:pStyle w:val="Ttulo1"/>
+      </w:pPr>
+      <w:r>
         <w:lastRenderedPageBreak/>
-        <w:t>Esta medida permitirá optimizar la distribución del trabajo con los recursos actuales, jerarquizar la experiencia del personal existente y mejorar la calidad en el relevamiento de necesidades con las áreas us</w:t>
-      </w:r>
-      <w:r>
-        <w:rPr>
-          <w:rFonts w:eastAsia="Times New Roman"/>
-          <w:sz w:val="24"/>
-          <w:szCs w:val="24"/>
-        </w:rPr>
-        <w:t>uarias</w:t>
-      </w:r>
-      <w:r>
-        <w:rPr>
-          <w:rFonts w:eastAsia="Times New Roman"/>
-          <w:sz w:val="24"/>
-          <w:szCs w:val="24"/>
-        </w:rPr>
-        <w:t>.</w:t>
-      </w:r>
-    </w:p>
-    <w:p>
-      <w:pPr>
-        <w:rPr>
-          <w:rFonts w:eastAsia="Times New Roman"/>
-        </w:rPr>
-      </w:pPr>
-    </w:p>
-    <w:p/>
-    <w:p>
-      <w:pPr>
-        <w:pStyle w:val="Ttulo1"/>
-      </w:pPr>
-      <w:r>
         <w:t>6. PROYECCIÓN CON INCORPORACIÓN DE RECURSOS</w:t>
       </w:r>
     </w:p>
@@ -3614,6 +3912,20 @@
           <w:rFonts w:ascii="Arial" w:hAnsi="Arial" w:cs="Arial"/>
         </w:rPr>
         <w:t>No obstante, la incorporación gradual de recursos presupuestarios permitiría consolidar y potenciar dichas acciones, incrementando la productividad del equipo, fortaleciendo la calidad del software y acelerando el proceso de modernización tecnológica.</w:t>
+      </w:r>
+    </w:p>
+    <w:p>
+      <w:pPr>
+        <w:pStyle w:val="NormalWeb"/>
+        <w:rPr>
+          <w:rFonts w:ascii="Arial" w:hAnsi="Arial" w:cs="Arial"/>
+        </w:rPr>
+      </w:pPr>
+      <w:r>
+        <w:rPr>
+          <w:rFonts w:ascii="Arial" w:hAnsi="Arial" w:cs="Arial"/>
+        </w:rPr>
+        <w:t>Las líneas de inversión identificadas no constituyen compromisos de adquisición ni requieren una ejecución simultánea, sino alternativas que podrán evaluarse en función de las necesidades detectadas, la disponibilidad presupuestaria y las prioridades institucionales.</w:t>
       </w:r>
     </w:p>
     <w:p>
@@ -3846,24 +4158,24 @@
         <w:pStyle w:val="Ttulo2"/>
       </w:pPr>
       <w:r>
+        <w:t>Resultado esperado</w:t>
+      </w:r>
+    </w:p>
+    <w:p>
+      <w:pPr>
+        <w:rPr>
+          <w:rFonts w:eastAsia="Times New Roman"/>
+          <w:sz w:val="24"/>
+          <w:szCs w:val="24"/>
+        </w:rPr>
+      </w:pPr>
+      <w:r>
+        <w:rPr>
+          <w:rFonts w:eastAsia="Times New Roman"/>
+          <w:sz w:val="24"/>
+          <w:szCs w:val="24"/>
+        </w:rPr>
         <w:lastRenderedPageBreak/>
-        <w:t>Resultado esperado</w:t>
-      </w:r>
-    </w:p>
-    <w:p>
-      <w:pPr>
-        <w:rPr>
-          <w:rFonts w:eastAsia="Times New Roman"/>
-          <w:sz w:val="24"/>
-          <w:szCs w:val="24"/>
-        </w:rPr>
-      </w:pPr>
-      <w:r>
-        <w:rPr>
-          <w:rFonts w:eastAsia="Times New Roman"/>
-          <w:sz w:val="24"/>
-          <w:szCs w:val="24"/>
-        </w:rPr>
         <w:t>Se incrementará sustancialmente la productividad del equipo, mejorará la calidad de los desarrollos, se reducirán los tiempos destinados a tareas repetitivas y se automatizará la documentación técnica de los sistemas.</w:t>
       </w:r>
     </w:p>
@@ -5324,105 +5636,40 @@
         </w:rPr>
         <w:t>La puesta en marcha tendrá como objetivo establecer las condiciones organizacionales necesarias para comenzar a aplicar las medidas propuestas, priorizando inicialmente aquellas acciones que puedan implementarse con los recursos y herramientas actualmente disponibles.</w:t>
       </w:r>
-    </w:p>
-    <w:p>
-      <w:pPr>
-        <w:rPr>
-          <w:rFonts w:eastAsia="Times New Roman"/>
-          <w:sz w:val="24"/>
-          <w:szCs w:val="24"/>
-        </w:rPr>
-      </w:pPr>
-      <w:r>
-        <w:rPr>
-          <w:rFonts w:eastAsia="Times New Roman"/>
-          <w:sz w:val="24"/>
-          <w:szCs w:val="24"/>
-        </w:rPr>
-        <w:t>En un inicio</w:t>
-      </w:r>
-      <w:r>
-        <w:rPr>
-          <w:rFonts w:eastAsia="Times New Roman"/>
-          <w:sz w:val="24"/>
-          <w:szCs w:val="24"/>
-        </w:rPr>
-        <w:t>,</w:t>
-      </w:r>
-      <w:bookmarkStart w:id="0" w:name="_GoBack"/>
-      <w:bookmarkEnd w:id="0"/>
-      <w:r>
-        <w:rPr>
-          <w:rFonts w:eastAsia="Times New Roman"/>
-          <w:sz w:val="24"/>
-          <w:szCs w:val="24"/>
-        </w:rPr>
-        <w:t xml:space="preserve"> se priorizará:</w:t>
-      </w:r>
-    </w:p>
-    <w:p>
-      <w:pPr>
-        <w:ind w:left="708"/>
-        <w:rPr>
-          <w:rFonts w:eastAsia="Times New Roman"/>
-          <w:sz w:val="24"/>
-          <w:szCs w:val="24"/>
-        </w:rPr>
-      </w:pPr>
-      <w:r>
-        <w:rPr>
-          <w:rFonts w:eastAsia="Times New Roman"/>
-          <w:sz w:val="24"/>
-          <w:szCs w:val="24"/>
-        </w:rPr>
-        <w:t xml:space="preserve">• centralizar y ordenar las solicitudes y proyectos mediante la utilización de </w:t>
-      </w:r>
-      <w:proofErr w:type="spellStart"/>
-      <w:r>
-        <w:rPr>
-          <w:rFonts w:eastAsia="Times New Roman"/>
-          <w:sz w:val="24"/>
-          <w:szCs w:val="24"/>
-        </w:rPr>
-        <w:t>Redmine</w:t>
-      </w:r>
-      <w:proofErr w:type="spellEnd"/>
-      <w:r>
-        <w:rPr>
-          <w:rFonts w:eastAsia="Times New Roman"/>
-          <w:sz w:val="24"/>
-          <w:szCs w:val="24"/>
-        </w:rPr>
-        <w:t>;</w:t>
-      </w:r>
-    </w:p>
-    <w:p>
-      <w:pPr>
-        <w:ind w:left="708"/>
-        <w:rPr>
-          <w:rFonts w:eastAsia="Times New Roman"/>
-          <w:sz w:val="24"/>
-          <w:szCs w:val="24"/>
-        </w:rPr>
-      </w:pPr>
-      <w:r>
-        <w:rPr>
-          <w:rFonts w:eastAsia="Times New Roman"/>
-          <w:sz w:val="24"/>
-          <w:szCs w:val="24"/>
-        </w:rPr>
-        <w:t>• identificar los sistemas críticos, las principales dependencias de conocimiento y los riesgos operativos existentes;</w:t>
-      </w:r>
-    </w:p>
-    <w:p>
-      <w:pPr>
-        <w:ind w:left="708"/>
-        <w:rPr>
-          <w:rFonts w:eastAsia="Times New Roman"/>
-          <w:sz w:val="24"/>
-          <w:szCs w:val="24"/>
-        </w:rPr>
-      </w:pPr>
+      <w:r>
+        <w:rPr>
+          <w:rFonts w:eastAsia="Times New Roman"/>
+          <w:sz w:val="24"/>
+          <w:szCs w:val="24"/>
+        </w:rPr>
+        <w:tab/>
+      </w:r>
+    </w:p>
+    <w:p>
+      <w:pPr>
+        <w:rPr>
+          <w:rFonts w:eastAsia="Times New Roman"/>
+          <w:sz w:val="24"/>
+          <w:szCs w:val="24"/>
+        </w:rPr>
+      </w:pPr>
+    </w:p>
+    <w:p>
+      <w:pPr>
+        <w:rPr>
+          <w:rFonts w:eastAsia="Times New Roman"/>
+          <w:sz w:val="24"/>
+          <w:szCs w:val="24"/>
+        </w:rPr>
+      </w:pPr>
+      <w:r>
+        <w:rPr>
+          <w:rFonts w:eastAsia="Times New Roman"/>
+          <w:sz w:val="24"/>
+          <w:szCs w:val="24"/>
+        </w:rPr>
+        <w:t xml:space="preserve">En un inicio, se realizará un relevamiento operativo del Departamento que permita consolidar la información necesaria para la toma de decisiones de la Jefatura. Este relevamiento comprenderá la cartera de proyectos y requerimientos existentes, los sistemas críticos, la distribución del conocimiento, las capacidades y experiencia del </w:t>
+      </w:r>
       <w:r>
         <w:rPr>
           <w:rFonts w:eastAsia="Times New Roman"/>
@@ -5430,43 +5677,33 @@
           <w:szCs w:val="24"/>
         </w:rPr>
         <w:lastRenderedPageBreak/>
-        <w:t>• establecer criterios comunes para la priorización y asignación de tareas;</w:t>
-      </w:r>
-    </w:p>
-    <w:p>
-      <w:pPr>
-        <w:ind w:left="708"/>
-        <w:rPr>
-          <w:rFonts w:eastAsia="Times New Roman"/>
-          <w:sz w:val="24"/>
-          <w:szCs w:val="24"/>
-        </w:rPr>
-      </w:pPr>
-      <w:r>
-        <w:rPr>
-          <w:rFonts w:eastAsia="Times New Roman"/>
-          <w:sz w:val="24"/>
-          <w:szCs w:val="24"/>
-        </w:rPr>
-        <w:t>• organizar la distribución de responsabilidades considerando la experiencia y conocimientos disponibles en el Departamento;</w:t>
-      </w:r>
-    </w:p>
-    <w:p>
-      <w:pPr>
-        <w:ind w:left="708"/>
-        <w:rPr>
-          <w:rFonts w:eastAsia="Times New Roman"/>
-          <w:sz w:val="24"/>
-          <w:szCs w:val="24"/>
-        </w:rPr>
-      </w:pPr>
-      <w:r>
-        <w:rPr>
-          <w:rFonts w:eastAsia="Times New Roman"/>
-          <w:sz w:val="24"/>
-          <w:szCs w:val="24"/>
-        </w:rPr>
-        <w:t>• establecer mecanismos básicos de coordinación y seguimiento entre los distintos grupos de trabajo distribuidos.</w:t>
+        <w:t>personal, el estado de la documentación, las principales dependencias e integraciones entre sistemas y la capacidad operativa disponible.</w:t>
+      </w:r>
+    </w:p>
+    <w:p>
+      <w:pPr>
+        <w:rPr>
+          <w:rFonts w:eastAsia="Times New Roman"/>
+          <w:sz w:val="24"/>
+          <w:szCs w:val="24"/>
+        </w:rPr>
+      </w:pPr>
+    </w:p>
+    <w:p>
+      <w:pPr>
+        <w:rPr>
+          <w:rFonts w:eastAsia="Times New Roman"/>
+          <w:sz w:val="24"/>
+          <w:szCs w:val="24"/>
+        </w:rPr>
+      </w:pPr>
+      <w:r>
+        <w:rPr>
+          <w:rFonts w:eastAsia="Times New Roman"/>
+          <w:sz w:val="24"/>
+          <w:szCs w:val="24"/>
+        </w:rPr>
+        <w:t>A partir de esta información se establecerán las prioridades de intervención, los principales riesgos operativos y las primeras medidas a implementar.</w:t>
       </w:r>
     </w:p>
     <w:p>
@@ -6357,7 +6594,7 @@
     <w:p>
       <w:r>
         <w:pict>
-          <v:rect id="_x0000_i1029" style="width:0;height:1.5pt" o:hralign="center" o:hrstd="t" o:hr="t" fillcolor="#a0a0a0" stroked="f"/>
+          <v:rect id="_x0000_i1025" style="width:0;height:1.5pt" o:hralign="center" o:hrstd="t" o:hr="t" fillcolor="#a0a0a0" stroked="f"/>
         </w:pict>
       </w:r>
     </w:p>
@@ -7940,6 +8177,119 @@
     </w:lvl>
   </w:abstractNum>
   <w:abstractNum w:abstractNumId="11">
+    <w:nsid w:val="591E2F45"/>
+    <w:multiLevelType w:val="hybridMultilevel"/>
+    <w:tmpl w:val="37FC0F1A"/>
+    <w:lvl w:ilvl="0" w:tplc="2C0A0001">
+      <w:start w:val="1"/>
+      <w:numFmt w:val="bullet"/>
+      <w:lvlText w:val=""/>
+      <w:lvlJc w:val="left"/>
+      <w:pPr>
+        <w:ind w:left="720" w:hanging="360"/>
+      </w:pPr>
+      <w:rPr>
+        <w:rFonts w:ascii="Symbol" w:hAnsi="Symbol" w:hint="default"/>
+      </w:rPr>
+    </w:lvl>
+    <w:lvl w:ilvl="1" w:tplc="2C0A0003" w:tentative="1">
+      <w:start w:val="1"/>
+      <w:numFmt w:val="bullet"/>
+      <w:lvlText w:val="o"/>
+      <w:lvlJc w:val="left"/>
+      <w:pPr>
+        <w:ind w:left="1440" w:hanging="360"/>
+      </w:pPr>
+      <w:rPr>
+        <w:rFonts w:ascii="Courier New" w:hAnsi="Courier New" w:cs="Courier New" w:hint="default"/>
+      </w:rPr>
+    </w:lvl>
+    <w:lvl w:ilvl="2" w:tplc="2C0A0005" w:tentative="1">
+      <w:start w:val="1"/>
+      <w:numFmt w:val="bullet"/>
+      <w:lvlText w:val=""/>
+      <w:lvlJc w:val="left"/>
+      <w:pPr>
+        <w:ind w:left="2160" w:hanging="360"/>
+      </w:pPr>
+      <w:rPr>
+        <w:rFonts w:ascii="Wingdings" w:hAnsi="Wingdings" w:hint="default"/>
+      </w:rPr>
+    </w:lvl>
+    <w:lvl w:ilvl="3" w:tplc="2C0A0001" w:tentative="1">
+      <w:start w:val="1"/>
+      <w:numFmt w:val="bullet"/>
+      <w:lvlText w:val=""/>
+      <w:lvlJc w:val="left"/>
+      <w:pPr>
+        <w:ind w:left="2880" w:hanging="360"/>
+      </w:pPr>
+      <w:rPr>
+        <w:rFonts w:ascii="Symbol" w:hAnsi="Symbol" w:hint="default"/>
+      </w:rPr>
+    </w:lvl>
+    <w:lvl w:ilvl="4" w:tplc="2C0A0003" w:tentative="1">
+      <w:start w:val="1"/>
+      <w:numFmt w:val="bullet"/>
+      <w:lvlText w:val="o"/>
+      <w:lvlJc w:val="left"/>
+      <w:pPr>
+        <w:ind w:left="3600" w:hanging="360"/>
+      </w:pPr>
+      <w:rPr>
+        <w:rFonts w:ascii="Courier New" w:hAnsi="Courier New" w:cs="Courier New" w:hint="default"/>
+      </w:rPr>
+    </w:lvl>
+    <w:lvl w:ilvl="5" w:tplc="2C0A0005" w:tentative="1">
+      <w:start w:val="1"/>
+      <w:numFmt w:val="bullet"/>
+      <w:lvlText w:val=""/>
+      <w:lvlJc w:val="left"/>
+      <w:pPr>
+        <w:ind w:left="4320" w:hanging="360"/>
+      </w:pPr>
+      <w:rPr>
+        <w:rFonts w:ascii="Wingdings" w:hAnsi="Wingdings" w:hint="default"/>
+      </w:rPr>
+    </w:lvl>
+    <w:lvl w:ilvl="6" w:tplc="2C0A0001" w:tentative="1">
+      <w:start w:val="1"/>
+      <w:numFmt w:val="bullet"/>
+      <w:lvlText w:val=""/>
+      <w:lvlJc w:val="left"/>
+      <w:pPr>
+        <w:ind w:left="5040" w:hanging="360"/>
+      </w:pPr>
+      <w:rPr>
+        <w:rFonts w:ascii="Symbol" w:hAnsi="Symbol" w:hint="default"/>
+      </w:rPr>
+    </w:lvl>
+    <w:lvl w:ilvl="7" w:tplc="2C0A0003" w:tentative="1">
+      <w:start w:val="1"/>
+      <w:numFmt w:val="bullet"/>
+      <w:lvlText w:val="o"/>
+      <w:lvlJc w:val="left"/>
+      <w:pPr>
+        <w:ind w:left="5760" w:hanging="360"/>
+      </w:pPr>
+      <w:rPr>
+        <w:rFonts w:ascii="Courier New" w:hAnsi="Courier New" w:cs="Courier New" w:hint="default"/>
+      </w:rPr>
+    </w:lvl>
+    <w:lvl w:ilvl="8" w:tplc="2C0A0005" w:tentative="1">
+      <w:start w:val="1"/>
+      <w:numFmt w:val="bullet"/>
+      <w:lvlText w:val=""/>
+      <w:lvlJc w:val="left"/>
+      <w:pPr>
+        <w:ind w:left="6480" w:hanging="360"/>
+      </w:pPr>
+      <w:rPr>
+        <w:rFonts w:ascii="Wingdings" w:hAnsi="Wingdings" w:hint="default"/>
+      </w:rPr>
+    </w:lvl>
+  </w:abstractNum>
+  <w:abstractNum w:abstractNumId="12">
     <w:nsid w:val="648D41A3"/>
     <w:multiLevelType w:val="multilevel"/>
     <w:tmpl w:val="791479FC"/>
@@ -8088,7 +8438,7 @@
       </w:rPr>
     </w:lvl>
   </w:abstractNum>
-  <w:abstractNum w:abstractNumId="12">
+  <w:abstractNum w:abstractNumId="13">
     <w:nsid w:val="64A71AE6"/>
     <w:multiLevelType w:val="multilevel"/>
     <w:tmpl w:val="2F9E4154"/>
@@ -8259,13 +8609,13 @@
     <w:abstractNumId w:val="2"/>
   </w:num>
   <w:num w:numId="7">
-    <w:abstractNumId w:val="11"/>
+    <w:abstractNumId w:val="12"/>
   </w:num>
   <w:num w:numId="8">
     <w:abstractNumId w:val="3"/>
   </w:num>
   <w:num w:numId="9">
-    <w:abstractNumId w:val="12"/>
+    <w:abstractNumId w:val="13"/>
   </w:num>
   <w:num w:numId="10">
     <w:abstractNumId w:val="10"/>
@@ -8278,6 +8628,9 @@
   </w:num>
   <w:num w:numId="13">
     <w:abstractNumId w:val="9"/>
+  </w:num>
+  <w:num w:numId="14">
+    <w:abstractNumId w:val="11"/>
   </w:num>
 </w:numbering>
 </file>

</xml_diff>

<commit_message>
Seccion 8.1 agnostica de plataformas (valida para ambos escenarios)
</commit_message>
<xml_diff>
--- a/Plan_Trabajo_Jefatura_Software_Version_Director.docx
+++ b/Plan_Trabajo_Jefatura_Software_Version_Director.docx
@@ -108,40 +108,33 @@
           <w:b/>
           <w:bCs/>
         </w:rPr>
-        <w:t>Diagnóstico Integral y Propuesta de Mejora para el Funcionamiento del Departamento de Gestión, Desarrollo e Innovaci</w:t>
-      </w:r>
+        <w:t>Diagnóstico Integral y Propuesta de Mejora para el Funcionamiento del Departamento de Gestión, Desarrollo e Innovación en Sistemas de Software: Optimización con Recursos Actuales y Proyección con Incorporación de Recursos</w:t>
+      </w:r>
+    </w:p>
+    <w:p/>
+    <w:p/>
+    <w:p>
       <w:r>
         <w:rPr>
           <w:b/>
           <w:bCs/>
         </w:rPr>
-        <w:t>ón en Sistemas de Software: Optimización con Recursos Actuales y Proyección con Incorporación de Recursos</w:t>
-      </w:r>
-    </w:p>
-    <w:p/>
-    <w:p/>
+        <w:t xml:space="preserve">Postulante: </w:t>
+      </w:r>
+      <w:r>
+        <w:t>Guido Cassulo</w:t>
+      </w:r>
+    </w:p>
     <w:p>
       <w:r>
         <w:rPr>
           <w:b/>
           <w:bCs/>
         </w:rPr>
-        <w:t xml:space="preserve">Postulante: </w:t>
-      </w:r>
-      <w:r>
-        <w:t>Guido Cassulo</w:t>
-      </w:r>
-    </w:p>
-    <w:p>
-      <w:r>
-        <w:rPr>
-          <w:b/>
-          <w:bCs/>
-        </w:rPr>
         <w:t xml:space="preserve">Cargo actual: </w:t>
       </w:r>
       <w:r>
-        <w:t xml:space="preserve">Programador </w:t>
+        <w:t xml:space="preserve">Soporte </w:t>
       </w:r>
       <w:proofErr w:type="spellStart"/>
       <w:r>
@@ -199,21 +192,12 @@
     </w:p>
     <w:p>
       <w:r>
-        <w:t>El presente proyecto tiene como finalidad realizar un d</w:t>
-      </w:r>
-      <w:r>
-        <w:t>iagnóstico integral del Departamento de Gestión, Desarrollo e Innovación en Sistemas de Software, identificar las problemáticas que afectan su funcionamiento y presentar propuestas concretas para optimizar su funcionamiento y de esta manera mejorar la cali</w:t>
-      </w:r>
-      <w:r>
-        <w:t>dad del servicio brindado a las dependencias municipales y por lo tanto, también al ciudadano.</w:t>
-      </w:r>
-    </w:p>
-    <w:p>
-      <w:r>
-        <w:t>El Departamento de Gestión, Desarrollo e Innovación en Sistemas de Software constituye un área estratégica dentro de la Subsecretaría de Gobierno Digital y Mejor</w:t>
-      </w:r>
-      <w:r>
-        <w:t xml:space="preserve">a de Procesos, siendo responsable de diseñar, desarrollar, mantener e implementar las soluciones informáticas que respaldan la actividad diaria de la Municipalidad de General </w:t>
+        <w:t>El presente proyecto tiene como finalidad realizar un diagnóstico integral del Departamento de Gestión, Desarrollo e Innovación en Sistemas de Software, identificar las problemáticas que afectan su funcionamiento y presentar propuestas concretas para optimizar su funcionamiento y de esta manera mejorar la calidad del servicio brindado a las dependencias municipales y por lo tanto, también al ciudadano.</w:t>
+      </w:r>
+    </w:p>
+    <w:p>
+      <w:r>
+        <w:t xml:space="preserve">El Departamento de Gestión, Desarrollo e Innovación en Sistemas de Software constituye un área estratégica dentro de la Subsecretaría de Gobierno Digital y Mejora de Procesos, siendo responsable de diseñar, desarrollar, mantener e implementar las soluciones informáticas que respaldan la actividad diaria de la Municipalidad de General </w:t>
       </w:r>
       <w:proofErr w:type="spellStart"/>
       <w:r>
@@ -226,45 +210,21 @@
     </w:p>
     <w:p>
       <w:r>
-        <w:t>Su función excede el desarrollo de aplicaciones informáticas. El Depa</w:t>
-      </w:r>
-      <w:r>
-        <w:t>rtamento interviene en el relevamiento y análisis de requerimientos funcionales, la planificación y coordinación de proyectos, la definición de estándares de desarrollo, la evaluación de nuevas tecnologías, el control técnico de proveedores externos, la in</w:t>
-      </w:r>
-      <w:r>
-        <w:t>tegración entre sistemas municipales, la intervención en el sitio Web de la Municipalidad y el mantenimiento evolutivo de aplicaciones críticas para el funcionamiento de la Administración.</w:t>
-      </w:r>
-    </w:p>
-    <w:p>
-      <w:r>
-        <w:t xml:space="preserve">La Jefatura del Departamento debe desempeñar un rol integrador que </w:t>
-      </w:r>
-      <w:r>
-        <w:t>va más allá de la coordinación técnica de proyectos. Su responsabilidad central consiste en combinar conocimientos técnicos con planificación, conducción de equipos y administración de recursos, generando las condiciones organizacionales que permitan al eq</w:t>
-      </w:r>
-      <w:r>
-        <w:t xml:space="preserve">uipo desarrollar software de manera previsible, colaborativa y sostenible, promoviendo la integración entre personas, la reutilización del conocimiento, la adopción responsable de nuevas tecnologías y la mejora </w:t>
+        <w:t>Su función excede el desarrollo de aplicaciones informáticas. El Departamento interviene en el relevamiento y análisis de requerimientos funcionales, la planificación y coordinación de proyectos, la definición de estándares de desarrollo, la evaluación de nuevas tecnologías, el control técnico de proveedores externos, la integración entre sistemas municipales, la intervención en el sitio Web de la Municipalidad y el mantenimiento evolutivo de aplicaciones críticas para el funcionamiento de la Administración.</w:t>
+      </w:r>
+    </w:p>
+    <w:p>
+      <w:r>
+        <w:t xml:space="preserve">La Jefatura del Departamento debe desempeñar un rol integrador que va más allá de la coordinación técnica de proyectos. Su responsabilidad central consiste en combinar conocimientos técnicos con planificación, conducción de equipos y administración de recursos, generando las condiciones organizacionales que permitan al equipo desarrollar software de manera previsible, colaborativa y sostenible, promoviendo la integración entre personas, la reutilización del conocimiento, la adopción responsable de nuevas tecnologías y la mejora </w:t>
       </w:r>
       <w:r>
         <w:lastRenderedPageBreak/>
-        <w:t>permanente de los procedimientos internos, co</w:t>
-      </w:r>
-      <w:r>
-        <w:t>n decisiones tecnológicas alineadas a los objetivos institucionales del Municipio y cumpliendo con las exigencias del régimen administrativo (Ley Orgánica de las Municipalidades, Ley 14656, RAFAM, GDE y Decreto N° 2250/98).</w:t>
-      </w:r>
-    </w:p>
-    <w:p>
-      <w:r>
-        <w:t>La propuesta reconoce que el Dep</w:t>
-      </w:r>
-      <w:r>
-        <w:t>artamento desarrolla su actividad en un entorno dinámico, caracterizado por la coexistencia de sistemas de distinta antigüedad, múltiples requerimientos simultáneos, recursos limitados y una creciente demanda de soluciones digitales por parte de las distin</w:t>
-      </w:r>
-      <w:r>
-        <w:t>tas dependencias municipales. Frente a esta realidad, la respuesta no puede limitarse a solicitar mayores recursos, sino a fortalecer la organización del trabajo con los recursos actuales, establecer criterios comunes y consolidar una cultura de mejora con</w:t>
-      </w:r>
-      <w:r>
-        <w:t>tinua.</w:t>
+        <w:t>permanente de los procedimientos internos, con decisiones tecnológicas alineadas a los objetivos institucionales del Municipio y cumpliendo con las exigencias del régimen administrativo (Ley Orgánica de las Municipalidades, Ley 14656, RAFAM, GDE y Decreto N° 2250/98).</w:t>
+      </w:r>
+    </w:p>
+    <w:p>
+      <w:r>
+        <w:t>La propuesta reconoce que el Departamento desarrolla su actividad en un entorno dinámico, caracterizado por la coexistencia de sistemas de distinta antigüedad, múltiples requerimientos simultáneos, recursos limitados y una creciente demanda de soluciones digitales por parte de las distintas dependencias municipales. Frente a esta realidad, la respuesta no puede limitarse a solicitar mayores recursos, sino a fortalecer la organización del trabajo con los recursos actuales, establecer criterios comunes y consolidar una cultura de mejora continua.</w:t>
       </w:r>
     </w:p>
     <w:p>
@@ -275,18 +235,12 @@
         <w:t xml:space="preserve">ación de los recursos actuales </w:t>
       </w:r>
       <w:r>
-        <w:t>y por otro la</w:t>
-      </w:r>
-      <w:r>
-        <w:t>do, una proyección con incorporación de recursos para cuando la Administración disponga de partidas de inversión tecnológica, sin fijar montos estáticos sino líneas de adquisición escalables.</w:t>
-      </w:r>
-    </w:p>
-    <w:p>
-      <w:r>
-        <w:t xml:space="preserve">Por ello, el presente Plan propone una estrategia articulada en </w:t>
-      </w:r>
-      <w:r>
-        <w:t>cinco pilares fundamentales:</w:t>
+        <w:t>y por otro lado, una proyección con incorporación de recursos para cuando la Administración disponga de partidas de inversión tecnológica, sin fijar montos estáticos sino líneas de adquisición escalables.</w:t>
+      </w:r>
+    </w:p>
+    <w:p>
+      <w:r>
+        <w:t>Por ello, el presente Plan propone una estrategia articulada en cinco pilares fundamentales:</w:t>
       </w:r>
     </w:p>
     <w:p>
@@ -371,10 +325,7 @@
     </w:p>
     <w:p>
       <w:r>
-        <w:t>A partir de estos ejes se desarrolla el diagnóstico de la situación actual y se presentan propuestas de mejora diferenciadas entre las que pued</w:t>
-      </w:r>
-      <w:r>
-        <w:t>en implementarse con los recursos existentes y las que proyectan incorporación de inversión futura.</w:t>
+        <w:t>A partir de estos ejes se desarrolla el diagnóstico de la situación actual y se presentan propuestas de mejora diferenciadas entre las que pueden implementarse con los recursos existentes y las que proyectan incorporación de inversión futura.</w:t>
       </w:r>
     </w:p>
     <w:p/>
@@ -408,40 +359,22 @@
     </w:p>
     <w:p>
       <w:r>
-        <w:t>El Departamento cuenta con un equipo con experiencia técnica y conocimiento de los proce</w:t>
-      </w:r>
-      <w:r>
-        <w:t>sos municipales, y dispone de herramientas de trabajo instaladas. Al mismo tiempo, enfrenta desafíos concretos en la gestión del conocimiento, la estandarización de sus procedimientos y la coordinación entre sus distintos grupos de trabajo, a lo que se sum</w:t>
-      </w:r>
-      <w:r>
-        <w:t>a una recepción dispar ante la incorporación de nuevas herramientas de desarrollo.</w:t>
-      </w:r>
-    </w:p>
-    <w:p>
-      <w:r>
-        <w:t>En los últimos años la demanda de soluciones informáticas ha crecido de manera sostenida, tanto por el avance de la transformación digital como por la incorporación permanen</w:t>
-      </w:r>
-      <w:r>
-        <w:t>te de nuevas necesidades funcionales provenientes de las distintas áreas municipales. Este crecimiento ha permitido ampliar el alcance del Departamento, pero también ha incrementado la complejidad de su gestión.</w:t>
-      </w:r>
-    </w:p>
-    <w:p>
-      <w:r>
-        <w:t>Actualmente conviven aplicaciones desarrolla</w:t>
-      </w:r>
-      <w:r>
-        <w:t>das en distintos momentos históricos, utilizando tecnologías diversas y respondiendo a necesidades organizacionales diferentes. A ello se suma la atención simultánea de requerimientos evolutivos, mantenimiento correctivo, proyectos nuevos, asistencia técni</w:t>
-      </w:r>
-      <w:r>
-        <w:t>ca a usuarios y coordinación con proveedores externos.</w:t>
-      </w:r>
-    </w:p>
-    <w:p>
-      <w:r>
-        <w:t>Este contexto requiere fortalecer la organización interna, promover el trabajo colaborativo y establecer procedimientos comunes. El diagnóstico que se presenta a continuación permite identificar las fo</w:t>
-      </w:r>
-      <w:r>
-        <w:t>rtalezas sobre las cuales construir una estrategia de mejora, así como las debilidades y oportunidades cuya adecuada gestión contribuirá al fortalecimiento institucional del área.</w:t>
+        <w:t>El Departamento cuenta con un equipo con experiencia técnica y conocimiento de los procesos municipales, y dispone de herramientas de trabajo instaladas. Al mismo tiempo, enfrenta desafíos concretos en la gestión del conocimiento, la estandarización de sus procedimientos y la coordinación entre sus distintos grupos de trabajo, a lo que se suma una recepción dispar ante la incorporación de nuevas herramientas de desarrollo.</w:t>
+      </w:r>
+    </w:p>
+    <w:p>
+      <w:r>
+        <w:t>En los últimos años la demanda de soluciones informáticas ha crecido de manera sostenida, tanto por el avance de la transformación digital como por la incorporación permanente de nuevas necesidades funcionales provenientes de las distintas áreas municipales. Este crecimiento ha permitido ampliar el alcance del Departamento, pero también ha incrementado la complejidad de su gestión.</w:t>
+      </w:r>
+    </w:p>
+    <w:p>
+      <w:r>
+        <w:t>Actualmente conviven aplicaciones desarrolladas en distintos momentos históricos, utilizando tecnologías diversas y respondiendo a necesidades organizacionales diferentes. A ello se suma la atención simultánea de requerimientos evolutivos, mantenimiento correctivo, proyectos nuevos, asistencia técnica a usuarios y coordinación con proveedores externos.</w:t>
+      </w:r>
+    </w:p>
+    <w:p>
+      <w:r>
+        <w:t>Este contexto requiere fortalecer la organización interna, promover el trabajo colaborativo y establecer procedimientos comunes. El diagnóstico que se presenta a continuación permite identificar las fortalezas sobre las cuales construir una estrategia de mejora, así como las debilidades y oportunidades cuya adecuada gestión contribuirá al fortalecimiento institucional del área.</w:t>
       </w:r>
     </w:p>
     <w:p/>
@@ -479,20 +412,22 @@
           <w:b/>
           <w:bCs/>
         </w:rPr>
-        <w:t>• Capital humano con alto conocimiento del neg</w:t>
-      </w:r>
+        <w:t xml:space="preserve">• Capital humano con alto conocimiento del negocio municipal: </w:t>
+      </w:r>
+      <w:r>
+        <w:t>El Departamento cuenta con agentes que poseen una valiosa experiencia en el funcionamiento de la Administración Pública Municipal, combinando conocimientos tecnológicos con una profunda comprensión de los procedimientos administrativos, la normativa vigente y las necesidades particulares de las distintas áreas usuarias. Este conocimiento constituye uno de los principales activos institucionales y representa una base sólida para impulsar procesos de mejora e innovación.</w:t>
+      </w:r>
+    </w:p>
+    <w:p>
       <w:r>
         <w:rPr>
           <w:b/>
           <w:bCs/>
         </w:rPr>
-        <w:t xml:space="preserve">ocio municipal: </w:t>
-      </w:r>
-      <w:r>
-        <w:t xml:space="preserve">El Departamento cuenta con agentes que poseen una valiosa experiencia en el funcionamiento de la Administración Pública Municipal, combinando conocimientos tecnológicos con una profunda comprensión de los procedimientos administrativos, la </w:t>
-      </w:r>
-      <w:r>
-        <w:t>normativa vigente y las necesidades particulares de las distintas áreas usuarias. Este conocimiento constituye uno de los principales activos institucionales y representa una base sólida para impulsar procesos de mejora e innovación.</w:t>
+        <w:t xml:space="preserve">• Compromiso y capacidad de adaptación: </w:t>
+      </w:r>
+      <w:r>
+        <w:t>A pesar del incremento permanente de requerimientos y de la coexistencia de sistemas con distintos niveles de complejidad tecnológica, el equipo ha demostrado capacidad para sostener la continuidad operativa de los servicios informáticos municipales, adaptándose a nuevos desafíos y prioridades institucionales.</w:t>
       </w:r>
     </w:p>
     <w:p>
@@ -501,43 +436,18 @@
           <w:b/>
           <w:bCs/>
         </w:rPr>
-        <w:t>• Compromiso y capacid</w:t>
-      </w:r>
+        <w:t xml:space="preserve">• Experiencia acumulada en múltiples tecnologías: </w:t>
+      </w:r>
+      <w:r>
+        <w:t>La evolución histórica de los sistemas municipales ha permitido que el Departamento adquiera experiencia sobre diferentes plataformas, lenguajes y herramientas de desarrollo, generando un importante capital técnico que facilita la evolución gradual de las aplicaciones existentes.</w:t>
+      </w:r>
+    </w:p>
+    <w:p>
       <w:r>
         <w:rPr>
           <w:b/>
           <w:bCs/>
         </w:rPr>
-        <w:t xml:space="preserve">ad de adaptación: </w:t>
-      </w:r>
-      <w:r>
-        <w:t xml:space="preserve">A pesar del incremento permanente de requerimientos y de la coexistencia de sistemas con distintos niveles de complejidad tecnológica, el equipo ha demostrado capacidad para sostener la continuidad operativa de los servicios informáticos </w:t>
-      </w:r>
-      <w:r>
-        <w:t>municipales, adaptándose a nuevos desafíos y prioridades institucionales.</w:t>
-      </w:r>
-    </w:p>
-    <w:p>
-      <w:r>
-        <w:rPr>
-          <w:b/>
-          <w:bCs/>
-        </w:rPr>
-        <w:t xml:space="preserve">• Experiencia acumulada en múltiples tecnologías: </w:t>
-      </w:r>
-      <w:r>
-        <w:t>La evolución histórica de los sistemas municipales ha permitido que el Departamento adquiera experiencia sobre diferentes plataforma</w:t>
-      </w:r>
-      <w:r>
-        <w:t>s, lenguajes y herramientas de desarrollo, generando un importante capital técnico que facilita la evolución gradual de las aplicaciones existentes.</w:t>
-      </w:r>
-    </w:p>
-    <w:p>
-      <w:r>
-        <w:rPr>
-          <w:b/>
-          <w:bCs/>
-        </w:rPr>
         <w:t xml:space="preserve">• Infraestructura y herramientas disponibles: </w:t>
       </w:r>
       <w:r>
@@ -549,10 +459,7 @@
       </w:r>
       <w:proofErr w:type="spellEnd"/>
       <w:r>
-        <w:t xml:space="preserve"> para versio</w:t>
-      </w:r>
-      <w:r>
-        <w:t xml:space="preserve">nado, plataforma </w:t>
+        <w:t xml:space="preserve"> para versionado, plataforma </w:t>
       </w:r>
       <w:proofErr w:type="spellStart"/>
       <w:r>
@@ -584,17 +491,30 @@
           <w:b/>
           <w:bCs/>
         </w:rPr>
-        <w:t>• Consolidación d</w:t>
-      </w:r>
+        <w:t xml:space="preserve">• Consolidación del proceso de transformación digital: </w:t>
+      </w:r>
+      <w:r>
+        <w:t>La creciente incorporación de herramientas digitales en la Administración Pública representa una oportunidad para fortalecer el rol estratégico del Departamento como impulsor de la modernización institucional.</w:t>
+      </w:r>
+    </w:p>
+    <w:p>
       <w:r>
         <w:rPr>
           <w:b/>
           <w:bCs/>
         </w:rPr>
-        <w:t xml:space="preserve">el proceso de transformación digital: </w:t>
-      </w:r>
-      <w:r>
-        <w:t>La creciente incorporación de herramientas digitales en la Administración Pública representa una oportunidad para fortalecer el rol estratégico del Departamento como impulsor de la modernización institucional.</w:t>
+        <w:t xml:space="preserve">• Adopción asistida de Inteligencia Artificial: </w:t>
+      </w:r>
+      <w:r>
+        <w:t>La integración de herramientas asistidas por IA en los entornos de desarrollo (</w:t>
+      </w:r>
+      <w:proofErr w:type="spellStart"/>
+      <w:r>
+        <w:t>IDEs</w:t>
+      </w:r>
+      <w:proofErr w:type="spellEnd"/>
+      <w:r>
+        <w:t>) permite acelerar la codificación, automatizar tareas repetitivas de documentación y elevar la productividad técnica del equipo dentro de un marco de uso seguro.</w:t>
       </w:r>
     </w:p>
     <w:p>
@@ -603,58 +523,22 @@
           <w:b/>
           <w:bCs/>
         </w:rPr>
-        <w:t>• Adopci</w:t>
-      </w:r>
+        <w:t xml:space="preserve">• Implementación de marcos ágiles híbridos: </w:t>
+      </w:r>
+      <w:r>
+        <w:t>La incorporación de metodologías ágiles adaptadas al contexto del Departamento (ciclos cortos de desarrollo para proyectos nuevos y gestión de flujo continuo para el mantenimiento) representa una oportunidad de mejora a costo cero, permitiendo optimizar la planificación, la comunicación interna y la clarificación de prioridades entre equipos.</w:t>
+      </w:r>
+    </w:p>
+    <w:p>
       <w:r>
         <w:rPr>
           <w:b/>
           <w:bCs/>
         </w:rPr>
-        <w:t xml:space="preserve">ón asistida de Inteligencia Artificial: </w:t>
-      </w:r>
-      <w:r>
-        <w:t>La integración de herramientas asistidas por IA en los entornos de desarrollo (</w:t>
-      </w:r>
-      <w:proofErr w:type="spellStart"/>
-      <w:r>
-        <w:t>IDEs</w:t>
-      </w:r>
-      <w:proofErr w:type="spellEnd"/>
-      <w:r>
-        <w:t>) permite acelerar la codificación, automatizar tareas repetitivas de documentación y elevar la productividad técnica del equipo dent</w:t>
-      </w:r>
-      <w:r>
-        <w:t>ro de un marco de uso seguro.</w:t>
-      </w:r>
-    </w:p>
-    <w:p>
-      <w:r>
-        <w:rPr>
-          <w:b/>
-          <w:bCs/>
-        </w:rPr>
-        <w:t xml:space="preserve">• Implementación de marcos ágiles híbridos: </w:t>
-      </w:r>
-      <w:r>
-        <w:t>La incorporación de metodologías ágiles adaptadas al contexto del Departamento (ciclos cortos de desarrollo para proyectos nuevos y gestión de flujo continuo para el mantenimiento) r</w:t>
-      </w:r>
-      <w:r>
-        <w:t>epresenta una oportunidad de mejora a costo cero, permitiendo optimizar la planificación, la comunicación interna y la clarificación de prioridades entre equipos.</w:t>
-      </w:r>
-    </w:p>
-    <w:p>
-      <w:r>
-        <w:rPr>
-          <w:b/>
-          <w:bCs/>
-        </w:rPr>
         <w:t xml:space="preserve">• Gestión política favorable y capacitaciones accesibles: </w:t>
       </w:r>
       <w:r>
-        <w:t xml:space="preserve">La intención de las autoridades de </w:t>
-      </w:r>
-      <w:r>
-        <w:t>optimizar el área, sumada a la amplia oferta de formación técnica online y la posibilidad de organizar talleres internos, representa una oportunidad concreta para actualizar competencias del equipo sin impacto presupuestario.</w:t>
+        <w:t>La intención de las autoridades de optimizar el área, sumada a la amplia oferta de formación técnica online y la posibilidad de organizar talleres internos, representa una oportunidad concreta para actualizar competencias del equipo sin impacto presupuestario.</w:t>
       </w:r>
     </w:p>
     <w:p/>
@@ -681,10 +565,7 @@
         <w:t xml:space="preserve">• Concentración del conocimiento: </w:t>
       </w:r>
       <w:r>
-        <w:t xml:space="preserve">Una parte significativa del conocimiento funcional y técnico de determinados sistemas críticos se encuentra concentrada en un número reducido de agentes, lo que incrementa el riesgo operacional, dificulta la planificación </w:t>
-      </w:r>
-      <w:r>
-        <w:t>de tareas, genera cuellos de botella y limita la flexibilidad del Departamento para reasignar recursos ante licencias del personal, imprevistos o prioridades institucionales.</w:t>
+        <w:t>Una parte significativa del conocimiento funcional y técnico de determinados sistemas críticos se encuentra concentrada en un número reducido de agentes, lo que incrementa el riesgo operacional, dificulta la planificación de tareas, genera cuellos de botella y limita la flexibilidad del Departamento para reasignar recursos ante licencias del personal, imprevistos o prioridades institucionales.</w:t>
       </w:r>
     </w:p>
     <w:p>
@@ -697,13 +578,7 @@
         <w:t xml:space="preserve">• Ausencia de procedimientos homogéneos: </w:t>
       </w:r>
       <w:r>
-        <w:t>Si bien existen buenas prácticas individ</w:t>
-      </w:r>
-      <w:r>
-        <w:t xml:space="preserve">uales, actualmente no todos los proyectos siguen criterios comunes respecto de documentación, planificación, estimación, arquitectura, pruebas o seguimiento, generando variabilidad en la calidad del código, dificultando la incorporación de nuevos agentes, </w:t>
-      </w:r>
-      <w:r>
-        <w:t>reduciendo la reutilización del trabajo existente y encareciendo el mantenimiento a largo plazo.</w:t>
+        <w:t>Si bien existen buenas prácticas individuales, actualmente no todos los proyectos siguen criterios comunes respecto de documentación, planificación, estimación, arquitectura, pruebas o seguimiento, generando variabilidad en la calidad del código, dificultando la incorporación de nuevos agentes, reduciendo la reutilización del trabajo existente y encareciendo el mantenimiento a largo plazo.</w:t>
       </w:r>
     </w:p>
     <w:p>
@@ -723,10 +598,7 @@
       </w:r>
       <w:proofErr w:type="spellEnd"/>
       <w:r>
-        <w:t>, muestra resist</w:t>
-      </w:r>
-      <w:r>
-        <w:t xml:space="preserve">encia a adoptar alternativas más modernas como .NET, </w:t>
+        <w:t xml:space="preserve">, muestra resistencia a adoptar alternativas más modernas como .NET, </w:t>
       </w:r>
       <w:proofErr w:type="spellStart"/>
       <w:r>
@@ -743,20 +615,22 @@
           <w:b/>
           <w:bCs/>
         </w:rPr>
-        <w:t>• Gestión fragment</w:t>
-      </w:r>
+        <w:t xml:space="preserve">• Gestión fragmentada de proyectos: </w:t>
+      </w:r>
+      <w:r>
+        <w:t>El seguimiento de proyectos se realiza utilizando diferentes herramientas y metodologías, lo que dificulta obtener una visión integral de la carga de trabajo del Departamento, impide conocer su capacidad operativa real, dificulta la priorización transparente de solicitudes entre Secretarías y genera desajustes en las estimaciones de tiempos de entrega.</w:t>
+      </w:r>
+    </w:p>
+    <w:p>
       <w:r>
         <w:rPr>
           <w:b/>
           <w:bCs/>
         </w:rPr>
-        <w:t xml:space="preserve">ada de proyectos: </w:t>
-      </w:r>
-      <w:r>
-        <w:t>El seguimiento de proyectos se realiza utilizando diferentes herramientas y metodologías, lo que dificulta obtener una visión integral de la carga de trabajo del Departamento, impide conocer su capacidad operativa real, dificulta la prior</w:t>
-      </w:r>
-      <w:r>
-        <w:t>ización transparente de solicitudes entre Secretarías y genera desajustes en las estimaciones de tiempos de entrega.</w:t>
+        <w:t xml:space="preserve">• Comunicación y coordinación entre equipos: </w:t>
+      </w:r>
+      <w:r>
+        <w:t>La distribución física del personal en distintas dependencias limita la circulación oportuna de información, favoreciendo el aislamiento en silos informáticos, incrementando el riesgo de desarrollar soluciones o módulos duplicados y resintiendo la cohesión y sentido de pertenencia a un equipo único.</w:t>
       </w:r>
     </w:p>
     <w:p>
@@ -765,13 +639,10 @@
           <w:b/>
           <w:bCs/>
         </w:rPr>
-        <w:t xml:space="preserve">• Comunicación y coordinación entre equipos: </w:t>
-      </w:r>
-      <w:r>
-        <w:t>La distribución física del personal en distintas dependencias limita la circulación oportuna d</w:t>
-      </w:r>
-      <w:r>
-        <w:t>e información, favoreciendo el aislamiento en silos informáticos, incrementando el riesgo de desarrollar soluciones o módulos duplicados y resintiendo la cohesión y sentido de pertenencia a un equipo único.</w:t>
+        <w:t xml:space="preserve">• Dependencia del mantenimiento reactivo: </w:t>
+      </w:r>
+      <w:r>
+        <w:t>La atención permanente de incidencias y requerimientos urgentes reduce el tiempo disponible para actividades de planificación y mejora continua, consumiendo la capacidad técnica en emergencias cotidianas e impidiendo dedicar tiempo a la documentación, la deuda técnica y la modernización planificada de sistemas.</w:t>
       </w:r>
     </w:p>
     <w:p>
@@ -780,31 +651,10 @@
           <w:b/>
           <w:bCs/>
         </w:rPr>
-        <w:t xml:space="preserve">• Dependencia del mantenimiento reactivo: </w:t>
-      </w:r>
-      <w:r>
-        <w:t>La aten</w:t>
-      </w:r>
-      <w:r>
-        <w:t>ción permanente de incidencias y requerimientos urgentes reduce el tiempo disponible para actividades de planificación y mejora continua, consumiendo la capacidad técnica en emergencias cotidianas e impidiendo dedicar tiempo a la documentación, la deuda té</w:t>
-      </w:r>
-      <w:r>
-        <w:t>cnica y la modernización planificada de sistemas.</w:t>
-      </w:r>
-    </w:p>
-    <w:p>
-      <w:r>
-        <w:rPr>
-          <w:b/>
-          <w:bCs/>
-        </w:rPr>
         <w:t xml:space="preserve">• Gestión del conocimiento insuficiente: </w:t>
       </w:r>
       <w:r>
-        <w:t>La documentación técnica, funcional y de arquitectura presenta distintos niveles de desarrollo según el proyecto, lo que aumenta la dependencia del conocimiento táci</w:t>
-      </w:r>
-      <w:r>
-        <w:t>to individual, encarece la curva de aprendizaje y pone en riesgo la continuidad de los aplicativos frente a licencias, traslados o bajas de personal.</w:t>
+        <w:t>La documentación técnica, funcional y de arquitectura presenta distintos niveles de desarrollo según el proyecto, lo que aumenta la dependencia del conocimiento tácito individual, encarece la curva de aprendizaje y pone en riesgo la continuidad de los aplicativos frente a licencias, traslados o bajas de personal.</w:t>
       </w:r>
     </w:p>
     <w:p>
@@ -854,41 +704,46 @@
           <w:b/>
           <w:bCs/>
         </w:rPr>
-        <w:t>• Obsolescencia e integración</w:t>
-      </w:r>
+        <w:t xml:space="preserve">• Obsolescencia e integración con sistemas </w:t>
+      </w:r>
+      <w:proofErr w:type="spellStart"/>
       <w:r>
         <w:rPr>
           <w:b/>
           <w:bCs/>
         </w:rPr>
-        <w:t xml:space="preserve"> con sistemas </w:t>
-      </w:r>
-      <w:proofErr w:type="spellStart"/>
+        <w:t>legacy</w:t>
+      </w:r>
+      <w:proofErr w:type="spellEnd"/>
       <w:r>
         <w:rPr>
           <w:b/>
           <w:bCs/>
         </w:rPr>
-        <w:t>legacy</w:t>
+        <w:t xml:space="preserve">: </w:t>
+      </w:r>
+      <w:r>
+        <w:t xml:space="preserve">La coexistencia de aplicaciones sobre tecnologías antiguas que carecen de </w:t>
+      </w:r>
+      <w:proofErr w:type="spellStart"/>
+      <w:r>
+        <w:t>APIs</w:t>
       </w:r>
       <w:proofErr w:type="spellEnd"/>
+      <w:r>
+        <w:t xml:space="preserve"> unificadas incrementa el riesgo operativo y dificulta su integración con nuevos desarrollos web o móviles.</w:t>
+      </w:r>
+    </w:p>
+    <w:p>
       <w:r>
         <w:rPr>
           <w:b/>
           <w:bCs/>
         </w:rPr>
-        <w:t xml:space="preserve">: </w:t>
-      </w:r>
-      <w:r>
-        <w:t xml:space="preserve">La coexistencia de aplicaciones sobre tecnologías antiguas que carecen de </w:t>
-      </w:r>
-      <w:proofErr w:type="spellStart"/>
-      <w:r>
-        <w:t>APIs</w:t>
-      </w:r>
-      <w:proofErr w:type="spellEnd"/>
-      <w:r>
-        <w:t xml:space="preserve"> unificadas incrementa el riesgo operativo y dificulta su integración con nuevos desarrollos web o móviles.</w:t>
+        <w:t xml:space="preserve">• Riesgo de dependencia técnica sobre proveedores externos: </w:t>
+      </w:r>
+      <w:r>
+        <w:t>La entrega de soluciones por terceros sin un canal fluido de comunicación técnica ni una contraparte municipal que participe activamente del seguimiento puede generar dependencia total del proveedor y pérdida del conocimiento institucional, derivando en mayores costos de mantenimiento e imposibilitando el desarrollo soberano ante una terminación temprana de la contratación.</w:t>
       </w:r>
     </w:p>
     <w:p>
@@ -897,62 +752,34 @@
           <w:b/>
           <w:bCs/>
         </w:rPr>
-        <w:t>• Riesgo de dependencia técnica sobre proveedore</w:t>
-      </w:r>
+        <w:t xml:space="preserve">• Requerimientos normativos e imprevistos de gestión: </w:t>
+      </w:r>
+      <w:r>
+        <w:t>El surgimiento de necesidades imprevistas derivadas de cambios normativos o resoluciones urgentes puede forzar la reorganización del cronograma establecido.</w:t>
+      </w:r>
+    </w:p>
+    <w:p>
       <w:r>
         <w:rPr>
           <w:b/>
           <w:bCs/>
         </w:rPr>
-        <w:t xml:space="preserve">s externos: </w:t>
-      </w:r>
-      <w:r>
-        <w:t>La entrega de soluciones por terceros sin un canal fluido de comunicación técnica ni una contraparte municipal que participe activamente del seguimiento puede generar dependencia total del proveedor y pérdida del conocimiento institucional, der</w:t>
-      </w:r>
-      <w:r>
-        <w:t>ivando en mayores costos de mantenimiento e imposibilitando el desarrollo soberano ante una terminación temprana de la contratación.</w:t>
-      </w:r>
-    </w:p>
-    <w:p>
+        <w:lastRenderedPageBreak/>
+        <w:t xml:space="preserve">• Resistencia al liderazgo e inercia organizacional: </w:t>
+      </w:r>
+      <w:r>
+        <w:t>La prolongada falta de una conducción formal en el Departamento puede generar inercia inicial a la hora de adoptar nuevas pautas organizativas y estándares técnicos.</w:t>
+      </w:r>
+    </w:p>
+    <w:p/>
+    <w:p>
+      <w:pPr>
+        <w:pStyle w:val="Ttulo2"/>
+      </w:pPr>
       <w:r>
         <w:rPr>
           <w:b/>
           <w:bCs/>
-        </w:rPr>
-        <w:t xml:space="preserve">• Requerimientos normativos e imprevistos de gestión: </w:t>
-      </w:r>
-      <w:r>
-        <w:t>El surgimiento de necesidades imprevistas derivadas de cambios normat</w:t>
-      </w:r>
-      <w:r>
-        <w:t>ivos o resoluciones urgentes puede forzar la reorganización del cronograma establecido.</w:t>
-      </w:r>
-    </w:p>
-    <w:p>
-      <w:r>
-        <w:rPr>
-          <w:b/>
-          <w:bCs/>
-        </w:rPr>
-        <w:lastRenderedPageBreak/>
-        <w:t xml:space="preserve">• Resistencia al liderazgo e inercia organizacional: </w:t>
-      </w:r>
-      <w:r>
-        <w:t xml:space="preserve">La prolongada falta de una conducción formal en el Departamento puede generar inercia inicial a la hora de adoptar </w:t>
-      </w:r>
-      <w:r>
-        <w:t>nuevas pautas organizativas y estándares técnicos.</w:t>
-      </w:r>
-    </w:p>
-    <w:p/>
-    <w:p>
-      <w:pPr>
-        <w:pStyle w:val="Ttulo2"/>
-      </w:pPr>
-      <w:r>
-        <w:rPr>
-          <w:b/>
-          <w:bCs/>
           <w:sz w:val="24"/>
           <w:szCs w:val="24"/>
         </w:rPr>
@@ -961,18 +788,12 @@
     </w:p>
     <w:p>
       <w:r>
-        <w:t>Del análisis realizado surge que el desafío central del Departamento radica en fortalecer su capacidad organizacional para gestionar el conocimiento, coordinar el equipo y e</w:t>
-      </w:r>
-      <w:r>
-        <w:t>stablecer procedimientos comunes que otorguen previsibilidad al desarrollo de software municipal.</w:t>
-      </w:r>
-    </w:p>
-    <w:p>
-      <w:r>
-        <w:t>En consecuencia, la propuesta prioriza consolidar un modelo de gestión orientado a las personas y los procesos, aprovechando las oportunidades de modernizació</w:t>
-      </w:r>
-      <w:r>
-        <w:t>n i</w:t>
+        <w:t>Del análisis realizado surge que el desafío central del Departamento radica en fortalecer su capacidad organizacional para gestionar el conocimiento, coordinar el equipo y establecer procedimientos comunes que otorguen previsibilidad al desarrollo de software municipal.</w:t>
+      </w:r>
+    </w:p>
+    <w:p>
+      <w:r>
+        <w:t>En consecuencia, la propuesta prioriza consolidar un modelo de gestión orientado a las personas y los procesos, aprovechando las oportunidades de modernización i</w:t>
       </w:r>
       <w:r>
         <w:t xml:space="preserve">dentificadas en el diagnóstico </w:t>
@@ -992,10 +813,7 @@
         <w:t xml:space="preserve">de arquitecturas de referencia, </w:t>
       </w:r>
       <w:r>
-        <w:t>para elevar la productividad del equipo, optimizar la documentac</w:t>
-      </w:r>
-      <w:r>
-        <w:t>ión y garantizar la calidad y sostenibilidad de los sistemas institucionales.</w:t>
+        <w:t>para elevar la productividad del equipo, optimizar la documentación y garantizar la calidad y sostenibilidad de los sistemas institucionales.</w:t>
       </w:r>
     </w:p>
     <w:p/>
@@ -1015,10 +833,7 @@
     </w:p>
     <w:p>
       <w:r>
-        <w:t>El ejercicio de la Jefatura del Departamento requiere combinar capacidades técnicas con habilidades de conducción, planificación y coordinación. En cons</w:t>
-      </w:r>
-      <w:r>
-        <w:t>ecuencia, las decisiones organizacionales y técnicas deberán sustentarse sobre principios de gestión que otorguen coherencia a las acciones del Departamento.</w:t>
+        <w:t>El ejercicio de la Jefatura del Departamento requiere combinar capacidades técnicas con habilidades de conducción, planificación y coordinación. En consecuencia, las decisiones organizacionales y técnicas deberán sustentarse sobre principios de gestión que otorguen coherencia a las acciones del Departamento.</w:t>
       </w:r>
     </w:p>
     <w:p>
@@ -1079,8 +894,6 @@
         </w:rPr>
         <w:t>Para consolidar esta visión de conducción humana y estratégica, la Jefatura se apoyará en tres pilares de gestión de personas:</w:t>
       </w:r>
-      <w:bookmarkStart w:id="0" w:name="_GoBack"/>
-      <w:bookmarkEnd w:id="0"/>
     </w:p>
     <w:p>
       <w:pPr>
@@ -1155,13 +968,7 @@
     </w:p>
     <w:p>
       <w:r>
-        <w:t>El crecimiento sostenido del Departamento hace necesario reducir la dependencia de práct</w:t>
-      </w:r>
-      <w:r>
-        <w:t>icas individuales y avanzar hacia procedimientos institucionales homogéneos. Toda actividad recurrente deberá encontrarse respaldada por procedimientos claros que permitan garantizar continuidad, previsibilidad y calidad, simplificando el trabajo cotidiano</w:t>
-      </w:r>
-      <w:r>
-        <w:t xml:space="preserve"> y asegurando la continuidad operativa.</w:t>
+        <w:t>El crecimiento sostenido del Departamento hace necesario reducir la dependencia de prácticas individuales y avanzar hacia procedimientos institucionales homogéneos. Toda actividad recurrente deberá encontrarse respaldada por procedimientos claros que permitan garantizar continuidad, previsibilidad y calidad, simplificando el trabajo cotidiano y asegurando la continuidad operativa.</w:t>
       </w:r>
     </w:p>
     <w:p>
@@ -1181,18 +988,7 @@
     </w:p>
     <w:p>
       <w:r>
-        <w:t xml:space="preserve">El conocimiento generado durante el desarrollo y mantenimiento de los sistemas constituye un </w:t>
-      </w:r>
-      <w:proofErr w:type="gramStart"/>
-      <w:r>
-        <w:t>activo</w:t>
-      </w:r>
-      <w:proofErr w:type="gramEnd"/>
-      <w:r>
-        <w:t xml:space="preserve"> estratégico de la Municipalidad. Por ello, la Jefatura impulsará mecanism</w:t>
-      </w:r>
-      <w:r>
-        <w:t>os que favorezcan la documentación, la transferencia de conocimientos y la capacitación interna, procurando que la información crítica permanezca en la organización.</w:t>
+        <w:t>El conocimiento generado durante el desarrollo y mantenimiento de los sistemas constituye un activo estratégico de la Municipalidad. Por ello, la Jefatura impulsará mecanismos que favorezcan la documentación, la transferencia de conocimientos y la capacitación interna, procurando que la información crítica permanezca en la organización.</w:t>
       </w:r>
     </w:p>
     <w:p>
@@ -1230,13 +1026,7 @@
     </w:p>
     <w:p>
       <w:r>
-        <w:t>Antes de adoptar un</w:t>
-      </w:r>
-      <w:r>
-        <w:t>a herramienta, metodología o plataforma tecnológica se evaluarán aspectos tales como compatibilidad con la arquitectura existente, sostenibilidad en el tiempo, costos de implementación, impacto sobre los procesos, requerimientos de capacitación y seguridad</w:t>
-      </w:r>
-      <w:r>
-        <w:t xml:space="preserve"> de la información.</w:t>
+        <w:t>Antes de adoptar una herramienta, metodología o plataforma tecnológica se evaluarán aspectos tales como compatibilidad con la arquitectura existente, sostenibilidad en el tiempo, costos de implementación, impacto sobre los procesos, requerimientos de capacitación y seguridad de la información.</w:t>
       </w:r>
     </w:p>
     <w:p>
@@ -1255,10 +1045,7 @@
     </w:p>
     <w:p>
       <w:r>
-        <w:t>El Departamento presta servicios a las distintas áreas municipales y, de manera indirecta, a toda la comunidad. Las decisiones deberán priorizar el valor que los sistemas aportan a los procesos administrativo</w:t>
-      </w:r>
-      <w:r>
-        <w:t>s, sustentándose en un diálogo permanente y una definición clara de prioridades.</w:t>
+        <w:t>El Departamento presta servicios a las distintas áreas municipales y, de manera indirecta, a toda la comunidad. Las decisiones deberán priorizar el valor que los sistemas aportan a los procesos administrativos, sustentándose en un diálogo permanente y una definición clara de prioridades.</w:t>
       </w:r>
     </w:p>
     <w:p>
@@ -1277,10 +1064,7 @@
     </w:p>
     <w:p>
       <w:r>
-        <w:t>La planificación y administración del Departamento deberá apoyarse en información objetiva proveniente de indicadores que midan la capacida</w:t>
-      </w:r>
-      <w:r>
-        <w:t>d operativa, la evolución de proyectos y los cuellos de botella.</w:t>
+        <w:t>La planificación y administración del Departamento deberá apoyarse en información objetiva proveniente de indicadores que midan la capacidad operativa, la evolución de proyectos y los cuellos de botella.</w:t>
       </w:r>
     </w:p>
     <w:p/>
@@ -3363,12 +3147,7 @@
       </w:pPr>
       <w:r>
         <w:br/>
-      </w:r>
-      <w:r>
-        <w:t>Pro</w:t>
-      </w:r>
-      <w:r>
-        <w:t>puesta</w:t>
+        <w:t>Propuesta</w:t>
       </w:r>
     </w:p>
     <w:p>
@@ -6158,7 +5937,7 @@
         <w:rPr>
           <w:rFonts w:ascii="Arial" w:hAnsi="Arial" w:cs="Arial"/>
         </w:rPr>
-        <w:t>La implementación del presente Plan de Trabajo requerirá un seguimiento permanente que permita verificar el cumplimiento de los objetivos propuestos y medir el impacto de las acciones implementadas.</w:t>
+        <w:t>La implementación del presente Plan de Trabajo requerirá un proceso permanente de evaluación y seguimiento que permita verificar el cumplimiento de los objetivos propuestos, medir el impacto de las acciones organizacionales y ajustar las decisiones de conducción sobre la base de evidencia objetiva.</w:t>
       </w:r>
     </w:p>
     <w:p>
@@ -6172,7 +5951,384 @@
         <w:rPr>
           <w:rFonts w:ascii="Arial" w:hAnsi="Arial" w:cs="Arial"/>
         </w:rPr>
-        <w:t>Con este propósito se propone la utilización de indicadores de gestión que permitan evaluar la evolución del Departamento mediante información objetiva, facilitando la toma de decisiones y la identificación temprana de oportunidades de mejora.</w:t>
+        <w:t>Con este propósito, la evaluación se concibe como un mecanismo de control de gestión institucional orientado a conocer la evolución del Departamento y la calidad del servicio que presta a la Administración Municipal. Los indicadores y las instancias de seguimiento no tendrán por finalidad realizar un control individual de productividad, sino identificar oportunidades de mejora en los procesos, fortalecer los equipos y garantizar la continuidad operativa.</w:t>
+      </w:r>
+    </w:p>
+    <w:p>
+      <w:pPr>
+        <w:pStyle w:val="Ttulo2"/>
+      </w:pPr>
+      <w:r>
+        <w:t>8</w:t>
+      </w:r>
+      <w:r>
+        <w:t>.</w:t>
+      </w:r>
+      <w:r>
+        <w:t>1</w:t>
+      </w:r>
+      <w:r>
+        <w:t xml:space="preserve"> </w:t>
+      </w:r>
+      <w:r>
+        <w:t xml:space="preserve"> Revisión periódica de resultados e indicadores de gestión</w:t>
+      </w:r>
+    </w:p>
+    <w:p>
+      <w:pPr>
+        <w:rPr>
+          <w:rFonts w:eastAsia="Times New Roman"/>
+          <w:sz w:val="24"/>
+          <w:szCs w:val="24"/>
+        </w:rPr>
+      </w:pPr>
+      <w:r>
+        <w:rPr>
+          <w:rFonts w:eastAsia="Times New Roman"/>
+          <w:sz w:val="24"/>
+          <w:szCs w:val="24"/>
+        </w:rPr>
+        <w:t xml:space="preserve">La Jefatura realizará un monitoreo sistemático de la gestión del Departamento mediante el seguimiento de indicadores clave en la plataforma institucional </w:t>
+      </w:r>
+      <w:proofErr w:type="spellStart"/>
+      <w:r>
+        <w:rPr>
+          <w:rFonts w:eastAsia="Times New Roman"/>
+          <w:sz w:val="24"/>
+          <w:szCs w:val="24"/>
+        </w:rPr>
+        <w:t>Redmine</w:t>
+      </w:r>
+      <w:proofErr w:type="spellEnd"/>
+      <w:r>
+        <w:rPr>
+          <w:rFonts w:eastAsia="Times New Roman"/>
+          <w:sz w:val="24"/>
+          <w:szCs w:val="24"/>
+        </w:rPr>
+        <w:t xml:space="preserve"> y en las distintas líneas de trabajo:</w:t>
+      </w:r>
+    </w:p>
+    <w:p>
+      <w:pPr>
+        <w:ind w:left="708"/>
+        <w:rPr>
+          <w:rFonts w:eastAsia="Times New Roman"/>
+          <w:sz w:val="24"/>
+          <w:szCs w:val="24"/>
+        </w:rPr>
+      </w:pPr>
+      <w:r>
+        <w:rPr>
+          <w:rFonts w:eastAsia="Times New Roman"/>
+          <w:sz w:val="24"/>
+          <w:szCs w:val="24"/>
+        </w:rPr>
+        <w:t>• Cobertura y planificación: porcentaje de proyectos, requerimientos e incidencias registrados y categorizados en la cartera común.</w:t>
+      </w:r>
+    </w:p>
+    <w:p>
+      <w:pPr>
+        <w:ind w:left="708"/>
+        <w:rPr>
+          <w:rFonts w:eastAsia="Times New Roman"/>
+          <w:sz w:val="24"/>
+          <w:szCs w:val="24"/>
+        </w:rPr>
+      </w:pPr>
+      <w:r>
+        <w:rPr>
+          <w:rFonts w:eastAsia="Times New Roman"/>
+          <w:sz w:val="24"/>
+          <w:szCs w:val="24"/>
+        </w:rPr>
+        <w:t>• Gestión del conocimiento y riesgo operativo: cantidad de sistemas críticos que cuentan con Referente Secundario designado y documentación técnica/funcional mínima actualizada.</w:t>
+      </w:r>
+    </w:p>
+    <w:p>
+      <w:pPr>
+        <w:ind w:left="708"/>
+        <w:rPr>
+          <w:rFonts w:eastAsia="Times New Roman"/>
+          <w:sz w:val="24"/>
+          <w:szCs w:val="24"/>
+        </w:rPr>
+      </w:pPr>
+      <w:r>
+        <w:rPr>
+          <w:rFonts w:eastAsia="Times New Roman"/>
+          <w:sz w:val="24"/>
+          <w:szCs w:val="24"/>
+        </w:rPr>
+        <w:t>• Calidad de software y estabilidad: tasa de incidencias relevantes detectadas con posterioridad a la puesta en producción y tiempo promedio de respuesta frente a requerimientos.</w:t>
+      </w:r>
+    </w:p>
+    <w:p>
+      <w:pPr>
+        <w:ind w:left="708"/>
+        <w:rPr>
+          <w:rFonts w:eastAsia="Times New Roman"/>
+          <w:sz w:val="24"/>
+          <w:szCs w:val="24"/>
+        </w:rPr>
+      </w:pPr>
+      <w:r>
+        <w:rPr>
+          <w:rFonts w:eastAsia="Times New Roman"/>
+          <w:sz w:val="24"/>
+          <w:szCs w:val="24"/>
+        </w:rPr>
+        <w:t>• Gobierno técnico y soberanía: porcentaje de desarrollos entregados por proveedores externos con recepción técnica completa y entrega del código fuente.</w:t>
+      </w:r>
+    </w:p>
+    <w:p>
+      <w:pPr>
+        <w:ind w:left="708"/>
+        <w:rPr>
+          <w:rFonts w:eastAsia="Times New Roman"/>
+          <w:sz w:val="24"/>
+          <w:szCs w:val="24"/>
+        </w:rPr>
+      </w:pPr>
+      <w:r>
+        <w:rPr>
+          <w:rFonts w:eastAsia="Times New Roman"/>
+          <w:sz w:val="24"/>
+          <w:szCs w:val="24"/>
+        </w:rPr>
+        <w:t>• Innovación y actualización: actividades de evaluación de nuevas tecnologías y herramientas asistidas por Inteligencia Artificial realizadas y documentadas.</w:t>
+      </w:r>
+    </w:p>
+    <w:p>
+      <w:pPr>
+        <w:ind w:left="708"/>
+        <w:rPr>
+          <w:rFonts w:eastAsia="Times New Roman"/>
+          <w:sz w:val="24"/>
+          <w:szCs w:val="24"/>
+        </w:rPr>
+      </w:pPr>
+    </w:p>
+    <w:p>
+      <w:pPr>
+        <w:pStyle w:val="Ttulo2"/>
+      </w:pPr>
+      <w:r>
+        <w:t>8</w:t>
+      </w:r>
+      <w:r>
+        <w:t>.</w:t>
+      </w:r>
+      <w:r>
+        <w:t>2</w:t>
+      </w:r>
+      <w:r>
+        <w:t xml:space="preserve"> </w:t>
+      </w:r>
+      <w:r>
+        <w:t xml:space="preserve"> </w:t>
+      </w:r>
+      <w:r>
+        <w:t xml:space="preserve">Instancias de seguimiento, </w:t>
+      </w:r>
+      <w:proofErr w:type="spellStart"/>
+      <w:r>
+        <w:t>feedback</w:t>
+      </w:r>
+      <w:proofErr w:type="spellEnd"/>
+      <w:r>
+        <w:t xml:space="preserve"> interno y clima laboral</w:t>
+      </w:r>
+    </w:p>
+    <w:p>
+      <w:pPr>
+        <w:rPr>
+          <w:rFonts w:eastAsia="Times New Roman"/>
+          <w:sz w:val="24"/>
+          <w:szCs w:val="24"/>
+        </w:rPr>
+      </w:pPr>
+      <w:r>
+        <w:rPr>
+          <w:rFonts w:eastAsia="Times New Roman"/>
+          <w:sz w:val="24"/>
+          <w:szCs w:val="24"/>
+        </w:rPr>
+        <w:t>La evaluación del Departamento no se limitará al análisis de datos cuantitativos, sino que incorporará la dimensión humana y organizativa como aspecto central de la conducción:</w:t>
+      </w:r>
+    </w:p>
+    <w:p>
+      <w:pPr>
+        <w:ind w:left="708"/>
+        <w:rPr>
+          <w:rFonts w:eastAsia="Times New Roman"/>
+          <w:sz w:val="24"/>
+          <w:szCs w:val="24"/>
+        </w:rPr>
+      </w:pPr>
+      <w:r>
+        <w:rPr>
+          <w:rFonts w:eastAsia="Times New Roman"/>
+          <w:sz w:val="24"/>
+          <w:szCs w:val="24"/>
+        </w:rPr>
+        <w:lastRenderedPageBreak/>
+        <w:t>• Reuniones periódicas de equipo: espacios de trabajo para revisar el estado de los proyectos, analizar dificultades recurrentes, redistribuir cargas de trabajo y receptar propuestas de mejora formuladas por los propios agentes.</w:t>
+      </w:r>
+    </w:p>
+    <w:p>
+      <w:pPr>
+        <w:ind w:left="708"/>
+        <w:rPr>
+          <w:rFonts w:eastAsia="Times New Roman"/>
+          <w:sz w:val="24"/>
+          <w:szCs w:val="24"/>
+        </w:rPr>
+      </w:pPr>
+      <w:r>
+        <w:rPr>
+          <w:rFonts w:eastAsia="Times New Roman"/>
+          <w:sz w:val="24"/>
+          <w:szCs w:val="24"/>
+        </w:rPr>
+        <w:t xml:space="preserve">• </w:t>
+      </w:r>
+      <w:proofErr w:type="spellStart"/>
+      <w:r>
+        <w:rPr>
+          <w:rFonts w:eastAsia="Times New Roman"/>
+          <w:sz w:val="24"/>
+          <w:szCs w:val="24"/>
+        </w:rPr>
+        <w:t>Feedback</w:t>
+      </w:r>
+      <w:proofErr w:type="spellEnd"/>
+      <w:r>
+        <w:rPr>
+          <w:rFonts w:eastAsia="Times New Roman"/>
+          <w:sz w:val="24"/>
+          <w:szCs w:val="24"/>
+        </w:rPr>
+        <w:t xml:space="preserve"> técnico y </w:t>
+      </w:r>
+      <w:proofErr w:type="spellStart"/>
+      <w:r>
+        <w:rPr>
+          <w:rFonts w:eastAsia="Times New Roman"/>
+          <w:sz w:val="24"/>
+          <w:szCs w:val="24"/>
+        </w:rPr>
+        <w:t>mentoreo</w:t>
+      </w:r>
+      <w:proofErr w:type="spellEnd"/>
+      <w:r>
+        <w:rPr>
+          <w:rFonts w:eastAsia="Times New Roman"/>
+          <w:sz w:val="24"/>
+          <w:szCs w:val="24"/>
+        </w:rPr>
+        <w:t>: dinámicas de acompañamiento entre el personal de mayor experiencia y los nuevos integrantes, promoviendo el reconocimiento del saber hacer acumulado y el desarrollo profesional continuo.</w:t>
+      </w:r>
+    </w:p>
+    <w:p>
+      <w:pPr>
+        <w:ind w:left="708"/>
+        <w:rPr>
+          <w:rFonts w:eastAsia="Times New Roman"/>
+          <w:sz w:val="24"/>
+          <w:szCs w:val="24"/>
+        </w:rPr>
+      </w:pPr>
+      <w:r>
+        <w:rPr>
+          <w:rFonts w:eastAsia="Times New Roman"/>
+          <w:sz w:val="24"/>
+          <w:szCs w:val="24"/>
+        </w:rPr>
+        <w:t>• Monitoreo del clima laboral: charlas periódicas con el personal para evaluar las condiciones de trabajo, abordar la resistencia al cambio de manera constructiva y resolver tensiones operativas antes de que afecten el desempeño del equipo.</w:t>
+      </w:r>
+    </w:p>
+    <w:p>
+      <w:pPr>
+        <w:ind w:left="708"/>
+        <w:rPr>
+          <w:rFonts w:eastAsia="Times New Roman"/>
+          <w:sz w:val="24"/>
+          <w:szCs w:val="24"/>
+        </w:rPr>
+      </w:pPr>
+    </w:p>
+    <w:p>
+      <w:pPr>
+        <w:pStyle w:val="Ttulo2"/>
+      </w:pPr>
+      <w:r>
+        <w:t>8</w:t>
+      </w:r>
+      <w:r>
+        <w:t>.</w:t>
+      </w:r>
+      <w:r>
+        <w:t xml:space="preserve"> 3 3 Ajuste dinámic</w:t>
+      </w:r>
+      <w:bookmarkStart w:id="0" w:name="_GoBack"/>
+      <w:bookmarkEnd w:id="0"/>
+      <w:r>
+        <w:t>o de la gestión y mejora continua</w:t>
+      </w:r>
+    </w:p>
+    <w:p>
+      <w:pPr>
+        <w:rPr>
+          <w:rFonts w:eastAsia="Times New Roman"/>
+          <w:sz w:val="24"/>
+          <w:szCs w:val="24"/>
+        </w:rPr>
+      </w:pPr>
+      <w:r>
+        <w:rPr>
+          <w:rFonts w:eastAsia="Times New Roman"/>
+          <w:sz w:val="24"/>
+          <w:szCs w:val="24"/>
+        </w:rPr>
+        <w:t xml:space="preserve">Los resultados obtenidos de los indicadores y de las instancias de </w:t>
+      </w:r>
+      <w:proofErr w:type="spellStart"/>
+      <w:r>
+        <w:rPr>
+          <w:rFonts w:eastAsia="Times New Roman"/>
+          <w:sz w:val="24"/>
+          <w:szCs w:val="24"/>
+        </w:rPr>
+        <w:t>feedback</w:t>
+      </w:r>
+      <w:proofErr w:type="spellEnd"/>
+      <w:r>
+        <w:rPr>
+          <w:rFonts w:eastAsia="Times New Roman"/>
+          <w:sz w:val="24"/>
+          <w:szCs w:val="24"/>
+        </w:rPr>
+        <w:t xml:space="preserve"> interno se utilizarán para alimentar un ciclo permanente de mejora continua.</w:t>
+      </w:r>
+    </w:p>
+    <w:p>
+      <w:r>
+        <w:rPr>
+          <w:rFonts w:eastAsia="Times New Roman"/>
+          <w:sz w:val="24"/>
+          <w:szCs w:val="24"/>
+        </w:rPr>
+        <w:t>Cuando una medida no alcance los resultados esperados o se detecten cuellos de botella en la atención de los servicios, la Jefatura revisará los procedimientos, redefinirá prioridades, redistribuirá responsabilidades o reforzará la capacitación interna. De este modo, la planificación se mantendrá como una herramienta viva de gestión, capaz de adaptarse a la realidad cambiante del Municipio.</w:t>
+      </w:r>
+    </w:p>
+    <w:p/>
+    <w:p>
+      <w:pPr>
+        <w:pStyle w:val="Ttulo1"/>
+      </w:pPr>
+      <w:r>
+        <w:t>9. CONCLUSIONES</w:t>
       </w:r>
     </w:p>
     <w:p>
@@ -6186,438 +6342,6 @@
         <w:rPr>
           <w:rFonts w:ascii="Arial" w:hAnsi="Arial" w:cs="Arial"/>
         </w:rPr>
-        <w:t>Los indicadores deberán revisarse periódicamente y utilizarse como herramientas de gestión, evitando que se transformen en un fin en sí mismos.</w:t>
-      </w:r>
-    </w:p>
-    <w:tbl>
-      <w:tblPr>
-        <w:tblW w:w="0" w:type="auto"/>
-        <w:tblCellSpacing w:w="15" w:type="dxa"/>
-        <w:tblCellMar>
-          <w:top w:w="15" w:type="dxa"/>
-          <w:left w:w="15" w:type="dxa"/>
-          <w:bottom w:w="15" w:type="dxa"/>
-          <w:right w:w="15" w:type="dxa"/>
-        </w:tblCellMar>
-        <w:tblLook w:val="04A0" w:firstRow="1" w:lastRow="0" w:firstColumn="1" w:lastColumn="0" w:noHBand="0" w:noVBand="1"/>
-      </w:tblPr>
-      <w:tblGrid>
-        <w:gridCol w:w="2118"/>
-        <w:gridCol w:w="3872"/>
-        <w:gridCol w:w="3365"/>
-      </w:tblGrid>
-      <w:tr>
-        <w:trPr>
-          <w:tblHeader/>
-          <w:tblCellSpacing w:w="15" w:type="dxa"/>
-        </w:trPr>
-        <w:tc>
-          <w:tcPr>
-            <w:tcW w:w="0" w:type="auto"/>
-            <w:vAlign w:val="center"/>
-            <w:hideMark/>
-          </w:tcPr>
-          <w:p>
-            <w:pPr>
-              <w:jc w:val="center"/>
-              <w:rPr>
-                <w:b/>
-                <w:bCs/>
-              </w:rPr>
-            </w:pPr>
-            <w:r>
-              <w:rPr>
-                <w:b/>
-                <w:bCs/>
-              </w:rPr>
-              <w:t>Dimensión</w:t>
-            </w:r>
-          </w:p>
-        </w:tc>
-        <w:tc>
-          <w:tcPr>
-            <w:tcW w:w="0" w:type="auto"/>
-            <w:vAlign w:val="center"/>
-            <w:hideMark/>
-          </w:tcPr>
-          <w:p>
-            <w:pPr>
-              <w:jc w:val="center"/>
-              <w:rPr>
-                <w:b/>
-                <w:bCs/>
-              </w:rPr>
-            </w:pPr>
-            <w:r>
-              <w:rPr>
-                <w:b/>
-                <w:bCs/>
-              </w:rPr>
-              <w:t>Indicador</w:t>
-            </w:r>
-          </w:p>
-        </w:tc>
-        <w:tc>
-          <w:tcPr>
-            <w:tcW w:w="0" w:type="auto"/>
-            <w:vAlign w:val="center"/>
-            <w:hideMark/>
-          </w:tcPr>
-          <w:p>
-            <w:pPr>
-              <w:jc w:val="center"/>
-              <w:rPr>
-                <w:b/>
-                <w:bCs/>
-              </w:rPr>
-            </w:pPr>
-            <w:r>
-              <w:rPr>
-                <w:b/>
-                <w:bCs/>
-              </w:rPr>
-              <w:t>Objetivo</w:t>
-            </w:r>
-          </w:p>
-        </w:tc>
-      </w:tr>
-      <w:tr>
-        <w:trPr>
-          <w:tblCellSpacing w:w="15" w:type="dxa"/>
-        </w:trPr>
-        <w:tc>
-          <w:tcPr>
-            <w:tcW w:w="0" w:type="auto"/>
-            <w:vAlign w:val="center"/>
-            <w:hideMark/>
-          </w:tcPr>
-          <w:p>
-            <w:pPr>
-              <w:jc w:val="left"/>
-            </w:pPr>
-            <w:r>
-              <w:t>Organización</w:t>
-            </w:r>
-          </w:p>
-        </w:tc>
-        <w:tc>
-          <w:tcPr>
-            <w:tcW w:w="0" w:type="auto"/>
-            <w:vAlign w:val="center"/>
-            <w:hideMark/>
-          </w:tcPr>
-          <w:p>
-            <w:r>
-              <w:t xml:space="preserve">Porcentaje de proyectos registrados en </w:t>
-            </w:r>
-            <w:proofErr w:type="spellStart"/>
-            <w:r>
-              <w:t>Redmine</w:t>
-            </w:r>
-            <w:proofErr w:type="spellEnd"/>
-          </w:p>
-        </w:tc>
-        <w:tc>
-          <w:tcPr>
-            <w:tcW w:w="0" w:type="auto"/>
-            <w:vAlign w:val="center"/>
-            <w:hideMark/>
-          </w:tcPr>
-          <w:p>
-            <w:r>
-              <w:t>Centralizar la planificación del Departamento</w:t>
-            </w:r>
-          </w:p>
-        </w:tc>
-      </w:tr>
-      <w:tr>
-        <w:trPr>
-          <w:tblCellSpacing w:w="15" w:type="dxa"/>
-        </w:trPr>
-        <w:tc>
-          <w:tcPr>
-            <w:tcW w:w="0" w:type="auto"/>
-            <w:vAlign w:val="center"/>
-            <w:hideMark/>
-          </w:tcPr>
-          <w:p>
-            <w:r>
-              <w:t>Gestión del conocimiento</w:t>
-            </w:r>
-          </w:p>
-        </w:tc>
-        <w:tc>
-          <w:tcPr>
-            <w:tcW w:w="0" w:type="auto"/>
-            <w:vAlign w:val="center"/>
-            <w:hideMark/>
-          </w:tcPr>
-          <w:p>
-            <w:r>
-              <w:t>Sistemas críticos con Referente Secundario</w:t>
-            </w:r>
-          </w:p>
-        </w:tc>
-        <w:tc>
-          <w:tcPr>
-            <w:tcW w:w="0" w:type="auto"/>
-            <w:vAlign w:val="center"/>
-            <w:hideMark/>
-          </w:tcPr>
-          <w:p>
-            <w:r>
-              <w:t>Reducir la dependencia de personas específicas</w:t>
-            </w:r>
-          </w:p>
-        </w:tc>
-      </w:tr>
-      <w:tr>
-        <w:trPr>
-          <w:tblCellSpacing w:w="15" w:type="dxa"/>
-        </w:trPr>
-        <w:tc>
-          <w:tcPr>
-            <w:tcW w:w="0" w:type="auto"/>
-            <w:vAlign w:val="center"/>
-            <w:hideMark/>
-          </w:tcPr>
-          <w:p>
-            <w:r>
-              <w:t>Documentación</w:t>
-            </w:r>
-          </w:p>
-        </w:tc>
-        <w:tc>
-          <w:tcPr>
-            <w:tcW w:w="0" w:type="auto"/>
-            <w:vAlign w:val="center"/>
-            <w:hideMark/>
-          </w:tcPr>
-          <w:p>
-            <w:r>
-              <w:t>Sistemas con documentación mínima actualizada</w:t>
-            </w:r>
-          </w:p>
-        </w:tc>
-        <w:tc>
-          <w:tcPr>
-            <w:tcW w:w="0" w:type="auto"/>
-            <w:vAlign w:val="center"/>
-            <w:hideMark/>
-          </w:tcPr>
-          <w:p>
-            <w:r>
-              <w:t>Preservar el conocimiento institucional</w:t>
-            </w:r>
-          </w:p>
-        </w:tc>
-      </w:tr>
-      <w:tr>
-        <w:trPr>
-          <w:tblCellSpacing w:w="15" w:type="dxa"/>
-        </w:trPr>
-        <w:tc>
-          <w:tcPr>
-            <w:tcW w:w="0" w:type="auto"/>
-            <w:vAlign w:val="center"/>
-            <w:hideMark/>
-          </w:tcPr>
-          <w:p>
-            <w:r>
-              <w:t>Calidad</w:t>
-            </w:r>
-          </w:p>
-        </w:tc>
-        <w:tc>
-          <w:tcPr>
-            <w:tcW w:w="0" w:type="auto"/>
-            <w:vAlign w:val="center"/>
-            <w:hideMark/>
-          </w:tcPr>
-          <w:p>
-            <w:r>
-              <w:t>Incidentes detectados luego de la puesta en producción</w:t>
-            </w:r>
-          </w:p>
-        </w:tc>
-        <w:tc>
-          <w:tcPr>
-            <w:tcW w:w="0" w:type="auto"/>
-            <w:vAlign w:val="center"/>
-            <w:hideMark/>
-          </w:tcPr>
-          <w:p>
-            <w:r>
-              <w:t>Reducir errores y mejorar la calidad de los desarrollos</w:t>
-            </w:r>
-          </w:p>
-        </w:tc>
-      </w:tr>
-      <w:tr>
-        <w:trPr>
-          <w:tblCellSpacing w:w="15" w:type="dxa"/>
-        </w:trPr>
-        <w:tc>
-          <w:tcPr>
-            <w:tcW w:w="0" w:type="auto"/>
-            <w:vAlign w:val="center"/>
-            <w:hideMark/>
-          </w:tcPr>
-          <w:p>
-            <w:r>
-              <w:t>Gestión de requerimientos</w:t>
-            </w:r>
-          </w:p>
-        </w:tc>
-        <w:tc>
-          <w:tcPr>
-            <w:tcW w:w="0" w:type="auto"/>
-            <w:vAlign w:val="center"/>
-            <w:hideMark/>
-          </w:tcPr>
-          <w:p>
-            <w:r>
-              <w:t>Tiempo promedio entre solicitud y planificación</w:t>
-            </w:r>
-          </w:p>
-        </w:tc>
-        <w:tc>
-          <w:tcPr>
-            <w:tcW w:w="0" w:type="auto"/>
-            <w:vAlign w:val="center"/>
-            <w:hideMark/>
-          </w:tcPr>
-          <w:p>
-            <w:r>
-              <w:t>Mejorar la capacidad de respuesta</w:t>
-            </w:r>
-          </w:p>
-        </w:tc>
-      </w:tr>
-      <w:tr>
-        <w:trPr>
-          <w:tblCellSpacing w:w="15" w:type="dxa"/>
-        </w:trPr>
-        <w:tc>
-          <w:tcPr>
-            <w:tcW w:w="0" w:type="auto"/>
-            <w:vAlign w:val="center"/>
-            <w:hideMark/>
-          </w:tcPr>
-          <w:p>
-            <w:r>
-              <w:t>Gobierno técnico</w:t>
-            </w:r>
-          </w:p>
-        </w:tc>
-        <w:tc>
-          <w:tcPr>
-            <w:tcW w:w="0" w:type="auto"/>
-            <w:vAlign w:val="center"/>
-            <w:hideMark/>
-          </w:tcPr>
-          <w:p>
-            <w:r>
-              <w:t>Desarrollos externos con recepción técnica completa</w:t>
-            </w:r>
-          </w:p>
-        </w:tc>
-        <w:tc>
-          <w:tcPr>
-            <w:tcW w:w="0" w:type="auto"/>
-            <w:vAlign w:val="center"/>
-            <w:hideMark/>
-          </w:tcPr>
-          <w:p>
-            <w:r>
-              <w:t>Garantizar la soberanía tecnológica</w:t>
-            </w:r>
-          </w:p>
-        </w:tc>
-      </w:tr>
-      <w:tr>
-        <w:trPr>
-          <w:tblCellSpacing w:w="15" w:type="dxa"/>
-        </w:trPr>
-        <w:tc>
-          <w:tcPr>
-            <w:tcW w:w="0" w:type="auto"/>
-            <w:vAlign w:val="center"/>
-            <w:hideMark/>
-          </w:tcPr>
-          <w:p>
-            <w:r>
-              <w:t>Innovación</w:t>
-            </w:r>
-          </w:p>
-        </w:tc>
-        <w:tc>
-          <w:tcPr>
-            <w:tcW w:w="0" w:type="auto"/>
-            <w:vAlign w:val="center"/>
-            <w:hideMark/>
-          </w:tcPr>
-          <w:p>
-            <w:r>
-              <w:t>Actividades de capacitación y evaluación tecnológica realizadas</w:t>
-            </w:r>
-          </w:p>
-        </w:tc>
-        <w:tc>
-          <w:tcPr>
-            <w:tcW w:w="0" w:type="auto"/>
-            <w:vAlign w:val="center"/>
-            <w:hideMark/>
-          </w:tcPr>
-          <w:p>
-            <w:r>
-              <w:t>Promover la mejora continua</w:t>
-            </w:r>
-          </w:p>
-        </w:tc>
-      </w:tr>
-    </w:tbl>
-    <w:p>
-      <w:pPr>
-        <w:pStyle w:val="NormalWeb"/>
-        <w:rPr>
-          <w:rFonts w:ascii="Arial" w:hAnsi="Arial" w:cs="Arial"/>
-        </w:rPr>
-      </w:pPr>
-      <w:r>
-        <w:rPr>
-          <w:rFonts w:ascii="Arial" w:hAnsi="Arial" w:cs="Arial"/>
-        </w:rPr>
-        <w:t>La información obtenida permitirá realizar ajustes en la planificación, redefinir prioridades y orientar futuras decisiones de gestión sobre la base de resultados verificables.</w:t>
-      </w:r>
-    </w:p>
-    <w:p>
-      <w:r>
-        <w:pict>
-          <v:rect id="_x0000_i1025" style="width:0;height:1.5pt" o:hralign="center" o:hrstd="t" o:hr="t" fillcolor="#a0a0a0" stroked="f"/>
-        </w:pict>
-      </w:r>
-    </w:p>
-    <w:p>
-      <w:pPr>
-        <w:pStyle w:val="Ttulo1"/>
-      </w:pPr>
-      <w:r>
-        <w:t>9. CONCLUSIONES</w:t>
-      </w:r>
-    </w:p>
-    <w:p>
-      <w:pPr>
-        <w:pStyle w:val="NormalWeb"/>
-        <w:rPr>
-          <w:rFonts w:ascii="Arial" w:hAnsi="Arial" w:cs="Arial"/>
-        </w:rPr>
-      </w:pPr>
-      <w:r>
-        <w:rPr>
-          <w:rFonts w:ascii="Arial" w:hAnsi="Arial" w:cs="Arial"/>
-        </w:rPr>
-        <w:lastRenderedPageBreak/>
         <w:t xml:space="preserve">El Departamento de Gestión, Desarrollo e Innovación en Sistemas de Software cumple un rol estratégico dentro del proceso de transformación digital de la Municipalidad de General </w:t>
       </w:r>
       <w:proofErr w:type="spellStart"/>

</xml_diff>